<commit_message>
event listbox support drag
</commit_message>
<xml_diff>
--- a/Supplementary/文档/FA2SP HDM Edition说明文档.docx
+++ b/Supplementary/文档/FA2SP HDM Edition说明文档.docx
@@ -911,7 +911,31 @@
         <w:rPr>
           <w:rFonts w:ascii="Times New Roman" w:eastAsia="宋体" w:hAnsi="Times New Roman" w:cs="Times New Roman" w:hint="eastAsia"/>
         </w:rPr>
-        <w:t>触发编辑器的行为列表选中的行为支持拖拽移动或拷贝至多开编辑器中</w:t>
+        <w:t>触发编辑器的</w:t>
+      </w:r>
+      <w:r>
+        <w:rPr>
+          <w:rFonts w:ascii="Times New Roman" w:eastAsia="宋体" w:hAnsi="Times New Roman" w:cs="Times New Roman" w:hint="eastAsia"/>
+        </w:rPr>
+        <w:t>事件和行为</w:t>
+      </w:r>
+      <w:r>
+        <w:rPr>
+          <w:rFonts w:ascii="Times New Roman" w:eastAsia="宋体" w:hAnsi="Times New Roman" w:cs="Times New Roman" w:hint="eastAsia"/>
+        </w:rPr>
+        <w:t>列表支持</w:t>
+      </w:r>
+      <w:r>
+        <w:rPr>
+          <w:rFonts w:ascii="Times New Roman" w:eastAsia="宋体" w:hAnsi="Times New Roman" w:cs="Times New Roman" w:hint="eastAsia"/>
+        </w:rPr>
+        <w:t>将选中项</w:t>
+      </w:r>
+      <w:r>
+        <w:rPr>
+          <w:rFonts w:ascii="Times New Roman" w:eastAsia="宋体" w:hAnsi="Times New Roman" w:cs="Times New Roman" w:hint="eastAsia"/>
+        </w:rPr>
+        <w:t>拖拽移动或拷贝至多开编辑器中</w:t>
       </w:r>
     </w:p>
     <w:p>
@@ -930,6 +954,24 @@
           <w:rFonts w:ascii="Times New Roman" w:eastAsia="宋体" w:hAnsi="Times New Roman" w:cs="Times New Roman" w:hint="eastAsia"/>
         </w:rPr>
         <w:lastRenderedPageBreak/>
+        <w:t>触发编辑器的事件列表支持多选</w:t>
+      </w:r>
+    </w:p>
+    <w:p>
+      <w:pPr>
+        <w:pStyle w:val="a9"/>
+        <w:numPr>
+          <w:ilvl w:val="0"/>
+          <w:numId w:val="11"/>
+        </w:numPr>
+        <w:rPr>
+          <w:rFonts w:ascii="Times New Roman" w:eastAsia="宋体" w:hAnsi="Times New Roman" w:cs="Times New Roman"/>
+        </w:rPr>
+      </w:pPr>
+      <w:r>
+        <w:rPr>
+          <w:rFonts w:ascii="Times New Roman" w:eastAsia="宋体" w:hAnsi="Times New Roman" w:cs="Times New Roman" w:hint="eastAsia"/>
+        </w:rPr>
         <w:t>支持使用椭圆绘制范围属性，详见</w:t>
       </w:r>
       <w:r>
@@ -1872,6 +1914,7 @@
         <w:rPr>
           <w:rFonts w:ascii="Times New Roman" w:eastAsia="宋体" w:hAnsi="Times New Roman" w:cs="Times New Roman" w:hint="eastAsia"/>
         </w:rPr>
+        <w:lastRenderedPageBreak/>
         <w:t>支持</w:t>
       </w:r>
       <w:r>
@@ -1902,7 +1945,6 @@
         <w:rPr>
           <w:rFonts w:ascii="Times New Roman" w:eastAsia="宋体" w:hAnsi="Times New Roman" w:cs="Times New Roman" w:hint="eastAsia"/>
         </w:rPr>
-        <w:lastRenderedPageBreak/>
         <w:t>对无图像地形对象和污染显示文本</w:t>
       </w:r>
     </w:p>
@@ -2967,6 +3009,7 @@
         <w:rPr>
           <w:rFonts w:ascii="Times New Roman" w:eastAsia="宋体" w:hAnsi="Times New Roman" w:cs="Times New Roman" w:hint="eastAsia"/>
         </w:rPr>
+        <w:lastRenderedPageBreak/>
         <w:t>JumpJet</w:t>
       </w:r>
       <w:r>
@@ -2991,7 +3034,6 @@
         <w:rPr>
           <w:rFonts w:ascii="Times New Roman" w:eastAsia="宋体" w:hAnsi="Times New Roman" w:cs="Times New Roman" w:hint="eastAsia"/>
         </w:rPr>
-        <w:lastRenderedPageBreak/>
         <w:t>支持渲染体素的炮塔和炮管阴影，并读取</w:t>
       </w:r>
       <w:r>
@@ -4066,6 +4108,7 @@
         <w:rPr>
           <w:rFonts w:ascii="Times New Roman" w:eastAsia="宋体" w:hAnsi="Times New Roman" w:cs="Times New Roman" w:hint="eastAsia"/>
         </w:rPr>
+        <w:lastRenderedPageBreak/>
         <w:t>微调了地图渲染器的边缘坐标</w:t>
       </w:r>
     </w:p>
@@ -4084,7 +4127,6 @@
         <w:rPr>
           <w:rFonts w:ascii="Times New Roman" w:eastAsia="宋体" w:hAnsi="Times New Roman" w:cs="Times New Roman" w:hint="eastAsia"/>
         </w:rPr>
-        <w:lastRenderedPageBreak/>
         <w:t>修复了军衔图层不能隐藏的</w:t>
       </w:r>
       <w:r>
@@ -5093,6 +5135,7 @@
         <w:rPr>
           <w:rFonts w:ascii="Times New Roman" w:eastAsia="宋体" w:hAnsi="Times New Roman" w:cs="Times New Roman" w:hint="eastAsia"/>
         </w:rPr>
+        <w:lastRenderedPageBreak/>
         <w:t>支持翻译任意</w:t>
       </w:r>
       <w:r>
@@ -5129,7 +5172,6 @@
         <w:rPr>
           <w:rFonts w:ascii="Times New Roman" w:eastAsia="宋体" w:hAnsi="Times New Roman" w:cs="Times New Roman" w:hint="eastAsia"/>
         </w:rPr>
-        <w:lastRenderedPageBreak/>
         <w:t>支持多语言切换，添加了英文版。所有可以在</w:t>
       </w:r>
       <w:r>
@@ -6305,6 +6347,7 @@
         <w:rPr>
           <w:rFonts w:ascii="Times New Roman" w:eastAsia="宋体" w:hAnsi="Times New Roman" w:cs="Times New Roman" w:hint="eastAsia"/>
         </w:rPr>
+        <w:lastRenderedPageBreak/>
         <w:t>支持破损建筑的火焰效果显示</w:t>
       </w:r>
     </w:p>
@@ -6323,7 +6366,6 @@
         <w:rPr>
           <w:rFonts w:ascii="Times New Roman" w:eastAsia="宋体" w:hAnsi="Times New Roman" w:cs="Times New Roman" w:hint="eastAsia"/>
         </w:rPr>
-        <w:lastRenderedPageBreak/>
         <w:t>新增地图渲染器功能，可以渲染全图</w:t>
       </w:r>
       <w:r>
@@ -7498,14 +7540,8 @@
         <w:rPr>
           <w:rFonts w:ascii="Times New Roman" w:eastAsia="宋体" w:hAnsi="Times New Roman" w:cs="Times New Roman" w:hint="eastAsia"/>
         </w:rPr>
-        <w:t>作战小队编辑器新增跳转按钮，可以跳转至对应的特遣部队、脚本、标签（实</w:t>
-      </w:r>
-      <w:r>
-        <w:rPr>
-          <w:rFonts w:ascii="Times New Roman" w:eastAsia="宋体" w:hAnsi="Times New Roman" w:cs="Times New Roman" w:hint="eastAsia"/>
-        </w:rPr>
         <w:lastRenderedPageBreak/>
-        <w:t>际为寻找对应触发）</w:t>
+        <w:t>作战小队编辑器新增跳转按钮，可以跳转至对应的特遣部队、脚本、标签（实际为寻找对应触发）</w:t>
       </w:r>
     </w:p>
     <w:p>
@@ -8489,6 +8525,7 @@
         <w:rPr>
           <w:rFonts w:ascii="Times New Roman" w:eastAsia="宋体" w:hAnsi="Times New Roman" w:cs="Times New Roman" w:hint="eastAsia"/>
         </w:rPr>
+        <w:lastRenderedPageBreak/>
         <w:t>修复调整地图大小后隧道位置错误的</w:t>
       </w:r>
       <w:r>
@@ -8513,7 +8550,6 @@
         <w:rPr>
           <w:rFonts w:ascii="Times New Roman" w:eastAsia="宋体" w:hAnsi="Times New Roman" w:cs="Times New Roman" w:hint="eastAsia"/>
         </w:rPr>
-        <w:lastRenderedPageBreak/>
         <w:t>修复了在开启输入法和部分情况下在地图界面按</w:t>
       </w:r>
       <w:r>
@@ -9576,6 +9612,7 @@
         <w:rPr>
           <w:rFonts w:ascii="Times New Roman" w:eastAsia="宋体" w:hAnsi="Times New Roman" w:cs="Times New Roman" w:hint="eastAsia"/>
         </w:rPr>
+        <w:lastRenderedPageBreak/>
         <w:t>修复在摆放过建筑后改变地图大小时弹框的</w:t>
       </w:r>
       <w:r>
@@ -9600,7 +9637,6 @@
         <w:rPr>
           <w:rFonts w:ascii="Times New Roman" w:eastAsia="宋体" w:hAnsi="Times New Roman" w:cs="Times New Roman" w:hint="eastAsia"/>
         </w:rPr>
-        <w:lastRenderedPageBreak/>
         <w:t>新增</w:t>
       </w:r>
       <w:r>
@@ -10705,6 +10741,7 @@
         <w:rPr>
           <w:rFonts w:ascii="Times New Roman" w:eastAsia="宋体" w:hAnsi="Times New Roman" w:cs="Times New Roman" w:hint="eastAsia"/>
         </w:rPr>
+        <w:lastRenderedPageBreak/>
         <w:t>支持建筑动画的</w:t>
       </w:r>
       <w:r>
@@ -10753,14 +10790,7 @@
         <w:rPr>
           <w:rFonts w:ascii="Times New Roman" w:eastAsia="宋体" w:hAnsi="Times New Roman" w:cs="Times New Roman" w:hint="eastAsia"/>
         </w:rPr>
-        <w:t>深度</w:t>
-      </w:r>
-      <w:r>
-        <w:rPr>
-          <w:rFonts w:ascii="Times New Roman" w:eastAsia="宋体" w:hAnsi="Times New Roman" w:cs="Times New Roman" w:hint="eastAsia"/>
-        </w:rPr>
-        <w:lastRenderedPageBreak/>
-        <w:t>调整</w:t>
+        <w:t>深度调整</w:t>
       </w:r>
     </w:p>
     <w:p>
@@ -11754,6 +11784,7 @@
         <w:rPr>
           <w:rFonts w:ascii="Times New Roman" w:eastAsia="宋体" w:hAnsi="Times New Roman" w:cs="Times New Roman" w:hint="eastAsia"/>
         </w:rPr>
+        <w:lastRenderedPageBreak/>
         <w:t>优化地形浏览器渲染，减少部分地形的黑边</w:t>
       </w:r>
     </w:p>
@@ -11772,7 +11803,6 @@
         <w:rPr>
           <w:rFonts w:ascii="Times New Roman" w:eastAsia="宋体" w:hAnsi="Times New Roman" w:cs="Times New Roman" w:hint="eastAsia"/>
         </w:rPr>
-        <w:lastRenderedPageBreak/>
         <w:t>修复部分情况下物品浏览器取消选择仍会错误选中界面顶端选项的</w:t>
       </w:r>
       <w:r>
@@ -12732,6 +12762,7 @@
         <w:rPr>
           <w:rFonts w:ascii="Times New Roman" w:eastAsia="宋体" w:hAnsi="Times New Roman" w:cs="Times New Roman" w:hint="eastAsia"/>
         </w:rPr>
+        <w:lastRenderedPageBreak/>
         <w:t>粘贴选项新增“粘贴区域描边”，可以控制是否显示描边</w:t>
       </w:r>
     </w:p>
@@ -12750,7 +12781,6 @@
         <w:rPr>
           <w:rFonts w:ascii="Times New Roman" w:eastAsia="宋体" w:hAnsi="Times New Roman" w:cs="Times New Roman" w:hint="eastAsia"/>
         </w:rPr>
-        <w:lastRenderedPageBreak/>
         <w:t>多选模式支持正矩形添加和删除</w:t>
       </w:r>
     </w:p>
@@ -13736,6 +13766,7 @@
         <w:rPr>
           <w:rFonts w:ascii="Times New Roman" w:eastAsia="宋体" w:hAnsi="Times New Roman" w:cs="Times New Roman" w:hint="eastAsia"/>
         </w:rPr>
+        <w:lastRenderedPageBreak/>
         <w:t>CSF</w:t>
       </w:r>
       <w:r>
@@ -13760,7 +13791,6 @@
         <w:rPr>
           <w:rFonts w:ascii="Times New Roman" w:eastAsia="宋体" w:hAnsi="Times New Roman" w:cs="Times New Roman" w:hint="eastAsia"/>
         </w:rPr>
-        <w:lastRenderedPageBreak/>
         <w:t>恢复在某些地形下被屏蔽的高架木桥桥墩废墟</w:t>
       </w:r>
     </w:p>
@@ -14661,6 +14691,7 @@
         <w:rPr>
           <w:rFonts w:ascii="Times New Roman" w:eastAsia="宋体" w:hAnsi="Times New Roman" w:cs="Times New Roman" w:hint="eastAsia"/>
         </w:rPr>
+        <w:lastRenderedPageBreak/>
         <w:t>修复了当建筑位置位于地图外时崩溃的</w:t>
       </w:r>
       <w:r>
@@ -14685,7 +14716,6 @@
         <w:rPr>
           <w:rFonts w:ascii="Times New Roman" w:eastAsia="宋体" w:hAnsi="Times New Roman" w:cs="Times New Roman" w:hint="eastAsia"/>
         </w:rPr>
-        <w:lastRenderedPageBreak/>
         <w:t>修复了使用</w:t>
       </w:r>
       <w:r>
@@ -15664,6 +15694,7 @@
         <w:rPr>
           <w:rFonts w:ascii="Times New Roman" w:eastAsia="宋体" w:hAnsi="Times New Roman" w:cs="Times New Roman" w:hint="eastAsia"/>
         </w:rPr>
+        <w:lastRenderedPageBreak/>
         <w:t>修复由地形自定义色盘导致的部分地形显示</w:t>
       </w:r>
       <w:r>
@@ -15696,7 +15727,6 @@
           <w:sz w:val="28"/>
           <w:szCs w:val="32"/>
         </w:rPr>
-        <w:lastRenderedPageBreak/>
         <w:t>1.0.5 (2025.02.24)</w:t>
       </w:r>
     </w:p>
@@ -16685,13 +16715,13 @@
         <w:rPr>
           <w:rFonts w:ascii="Times New Roman" w:eastAsia="宋体" w:hAnsi="Times New Roman" w:cs="Times New Roman" w:hint="eastAsia"/>
         </w:rPr>
+        <w:lastRenderedPageBreak/>
         <w:t>修复了在开启自动海岸的情况下，放置地形会导致笔刷边缘区域进行不必要的</w:t>
       </w:r>
       <w:r>
         <w:rPr>
           <w:rFonts w:ascii="Times New Roman" w:eastAsia="宋体" w:hAnsi="Times New Roman" w:cs="Times New Roman" w:hint="eastAsia"/>
         </w:rPr>
-        <w:lastRenderedPageBreak/>
         <w:t>LAT</w:t>
       </w:r>
       <w:r>
@@ -17810,6 +17840,7 @@
         <w:rPr>
           <w:rFonts w:ascii="Times New Roman" w:eastAsia="宋体" w:hAnsi="Times New Roman" w:cs="Times New Roman" w:hint="eastAsia"/>
         </w:rPr>
+        <w:lastRenderedPageBreak/>
         <w:t>新增两项工具脚本函数：</w:t>
       </w:r>
       <w:r>
@@ -17834,14 +17865,7 @@
         <w:rPr>
           <w:rFonts w:ascii="Times New Roman" w:eastAsia="宋体" w:hAnsi="Times New Roman" w:cs="Times New Roman" w:hint="eastAsia"/>
         </w:rPr>
-        <w:t>，用于路径点</w:t>
-      </w:r>
-      <w:r>
-        <w:rPr>
-          <w:rFonts w:ascii="Times New Roman" w:eastAsia="宋体" w:hAnsi="Times New Roman" w:cs="Times New Roman" w:hint="eastAsia"/>
-        </w:rPr>
-        <w:lastRenderedPageBreak/>
-        <w:t>与数字互转，详见</w:t>
+        <w:t>，用于路径点与数字互转，详见</w:t>
       </w:r>
       <w:r>
         <w:rPr>

</xml_diff>

<commit_message>
add Techno property brush
</commit_message>
<xml_diff>
--- a/Supplementary/文档/FA2SP HDM Edition说明文档.docx
+++ b/Supplementary/文档/FA2SP HDM Edition说明文档.docx
@@ -174,7 +174,7 @@
           <w:rFonts w:ascii="宋体" w:eastAsia="宋体" w:hAnsi="宋体" w:hint="eastAsia"/>
           <w:sz w:val="24"/>
         </w:rPr>
-        <w:t>3</w:t>
+        <w:t>4</w:t>
       </w:r>
     </w:p>
     <w:p>
@@ -246,7 +246,7 @@
           <w:sz w:val="28"/>
           <w:szCs w:val="32"/>
         </w:rPr>
-        <w:t>3</w:t>
+        <w:t>4</w:t>
       </w:r>
       <w:r>
         <w:rPr>
@@ -735,6 +735,24 @@
         <w:pStyle w:val="a9"/>
         <w:numPr>
           <w:ilvl w:val="0"/>
+          <w:numId w:val="11"/>
+        </w:numPr>
+        <w:rPr>
+          <w:rFonts w:ascii="Times New Roman" w:eastAsia="宋体" w:hAnsi="Times New Roman" w:cs="Times New Roman"/>
+        </w:rPr>
+      </w:pPr>
+      <w:r>
+        <w:rPr>
+          <w:rFonts w:ascii="Times New Roman" w:eastAsia="宋体" w:hAnsi="Times New Roman" w:cs="Times New Roman" w:hint="eastAsia"/>
+        </w:rPr>
+        <w:t>添加通用格式刷工具，可以同时修改所有科技类型的属性</w:t>
+      </w:r>
+    </w:p>
+    <w:p>
+      <w:pPr>
+        <w:pStyle w:val="a9"/>
+        <w:numPr>
+          <w:ilvl w:val="0"/>
           <w:numId w:val="10"/>
         </w:numPr>
         <w:rPr>
@@ -947,6 +965,7 @@
         <w:rPr>
           <w:rFonts w:ascii="Times New Roman" w:eastAsia="宋体" w:hAnsi="Times New Roman" w:cs="Times New Roman" w:hint="eastAsia"/>
         </w:rPr>
+        <w:lastRenderedPageBreak/>
         <w:t>优化摆放单位时预览的性能</w:t>
       </w:r>
     </w:p>
@@ -965,7 +984,6 @@
         <w:rPr>
           <w:rFonts w:ascii="Times New Roman" w:eastAsia="宋体" w:hAnsi="Times New Roman" w:cs="Times New Roman" w:hint="eastAsia"/>
         </w:rPr>
-        <w:lastRenderedPageBreak/>
         <w:t>修复设置路径点颜色失效的</w:t>
       </w:r>
       <w:r>
@@ -1986,7 +2004,14 @@
         <w:rPr>
           <w:rFonts w:ascii="Times New Roman" w:eastAsia="宋体" w:hAnsi="Times New Roman" w:cs="Times New Roman" w:hint="eastAsia"/>
         </w:rPr>
-        <w:t>，单击绿点可以为地图上的单位设置标签</w:t>
+        <w:t>，单击绿</w:t>
+      </w:r>
+      <w:r>
+        <w:rPr>
+          <w:rFonts w:ascii="Times New Roman" w:eastAsia="宋体" w:hAnsi="Times New Roman" w:cs="Times New Roman" w:hint="eastAsia"/>
+        </w:rPr>
+        <w:lastRenderedPageBreak/>
+        <w:t>点可以为地图上的单位设置标签</w:t>
       </w:r>
     </w:p>
     <w:p>
@@ -2004,7 +2029,6 @@
         <w:rPr>
           <w:rFonts w:ascii="Times New Roman" w:eastAsia="宋体" w:hAnsi="Times New Roman" w:cs="Times New Roman" w:hint="eastAsia"/>
         </w:rPr>
-        <w:lastRenderedPageBreak/>
         <w:t>作战小队、特遣部队、动作脚本编辑器支持通过拖拽</w:t>
       </w:r>
       <w:r>
@@ -3013,6 +3037,7 @@
         <w:rPr>
           <w:rFonts w:ascii="Times New Roman" w:eastAsia="宋体" w:hAnsi="Times New Roman" w:cs="Times New Roman" w:hint="eastAsia"/>
         </w:rPr>
+        <w:lastRenderedPageBreak/>
         <w:t>支持对覆盖物进行分类，详见</w:t>
       </w:r>
       <w:r>
@@ -3037,7 +3062,6 @@
         <w:rPr>
           <w:rFonts w:ascii="Times New Roman" w:eastAsia="宋体" w:hAnsi="Times New Roman" w:cs="Times New Roman" w:hint="eastAsia"/>
         </w:rPr>
-        <w:lastRenderedPageBreak/>
         <w:t>放置铁路时，仅在物品浏览器</w:t>
       </w:r>
       <w:r>
@@ -4092,6 +4116,7 @@
         <w:rPr>
           <w:rFonts w:ascii="Times New Roman" w:eastAsia="宋体" w:hAnsi="Times New Roman" w:cs="Times New Roman" w:hint="eastAsia"/>
         </w:rPr>
+        <w:lastRenderedPageBreak/>
         <w:t>复制粘贴所使用的</w:t>
       </w:r>
       <w:r>
@@ -4110,7 +4135,6 @@
         <w:rPr>
           <w:rFonts w:ascii="Times New Roman" w:eastAsia="宋体" w:hAnsi="Times New Roman" w:cs="Times New Roman" w:hint="eastAsia"/>
         </w:rPr>
-        <w:lastRenderedPageBreak/>
         <w:t>Urb2UbnTileRules</w:t>
       </w:r>
       <w:r>
@@ -5171,6 +5195,7 @@
         <w:rPr>
           <w:rFonts w:ascii="Times New Roman" w:eastAsia="宋体" w:hAnsi="Times New Roman" w:cs="Times New Roman" w:hint="eastAsia"/>
         </w:rPr>
+        <w:lastRenderedPageBreak/>
         <w:t>修复了</w:t>
       </w:r>
       <w:r>
@@ -5213,7 +5238,6 @@
         <w:rPr>
           <w:rFonts w:ascii="Times New Roman" w:eastAsia="宋体" w:hAnsi="Times New Roman" w:cs="Times New Roman" w:hint="eastAsia"/>
         </w:rPr>
-        <w:lastRenderedPageBreak/>
         <w:t>支持在</w:t>
       </w:r>
       <w:r>
@@ -38599,7 +38623,7 @@
         <v:path o:extrusionok="f" gradientshapeok="t" o:connecttype="rect"/>
         <o:lock v:ext="edit" aspectratio="t"/>
       </v:shapetype>
-      <v:shape id="_x0000_i1028" type="#_x0000_t75" style="width:11.25pt;height:11.25pt" o:bullet="t">
+      <v:shape id="_x0000_i1030" type="#_x0000_t75" style="width:11.25pt;height:11.25pt" o:bullet="t">
         <v:imagedata r:id="rId1" o:title="mso9A9A"/>
       </v:shape>
     </w:pict>

</xml_diff>

<commit_message>
FA setting inis support plus-equal
</commit_message>
<xml_diff>
--- a/Supplementary/文档/FA2SP HDM Edition说明文档.docx
+++ b/Supplementary/文档/FA2SP HDM Edition说明文档.docx
@@ -174,7 +174,7 @@
           <w:rFonts w:ascii="宋体" w:eastAsia="宋体" w:hAnsi="宋体" w:hint="eastAsia"/>
           <w:sz w:val="24"/>
         </w:rPr>
-        <w:t>7</w:t>
+        <w:t>8</w:t>
       </w:r>
     </w:p>
     <w:p>
@@ -246,7 +246,7 @@
           <w:sz w:val="28"/>
           <w:szCs w:val="32"/>
         </w:rPr>
-        <w:t>7</w:t>
+        <w:t>8</w:t>
       </w:r>
       <w:r>
         <w:rPr>
@@ -819,6 +819,78 @@
         <w:pStyle w:val="a9"/>
         <w:numPr>
           <w:ilvl w:val="0"/>
+          <w:numId w:val="11"/>
+        </w:numPr>
+        <w:rPr>
+          <w:rFonts w:ascii="Times New Roman" w:eastAsia="宋体" w:hAnsi="Times New Roman" w:cs="Times New Roman"/>
+        </w:rPr>
+      </w:pPr>
+      <w:r>
+        <w:rPr>
+          <w:rFonts w:ascii="Times New Roman" w:eastAsia="宋体" w:hAnsi="Times New Roman" w:cs="Times New Roman" w:hint="eastAsia"/>
+        </w:rPr>
+        <w:t>FAData.ini</w:t>
+      </w:r>
+      <w:r>
+        <w:rPr>
+          <w:rFonts w:ascii="Times New Roman" w:eastAsia="宋体" w:hAnsi="Times New Roman" w:cs="Times New Roman" w:hint="eastAsia"/>
+        </w:rPr>
+        <w:t>、</w:t>
+      </w:r>
+      <w:r>
+        <w:rPr>
+          <w:rFonts w:ascii="Times New Roman" w:eastAsia="宋体" w:hAnsi="Times New Roman" w:cs="Times New Roman" w:hint="eastAsia"/>
+        </w:rPr>
+        <w:t>FALanguage.ini</w:t>
+      </w:r>
+      <w:r>
+        <w:rPr>
+          <w:rFonts w:ascii="Times New Roman" w:eastAsia="宋体" w:hAnsi="Times New Roman" w:cs="Times New Roman" w:hint="eastAsia"/>
+        </w:rPr>
+        <w:t>支持使用</w:t>
+      </w:r>
+      <w:r>
+        <w:rPr>
+          <w:rFonts w:ascii="Times New Roman" w:eastAsia="宋体" w:hAnsi="Times New Roman" w:cs="Times New Roman" w:hint="eastAsia"/>
+        </w:rPr>
+        <w:t>+=</w:t>
+      </w:r>
+      <w:r>
+        <w:rPr>
+          <w:rFonts w:ascii="Times New Roman" w:eastAsia="宋体" w:hAnsi="Times New Roman" w:cs="Times New Roman" w:hint="eastAsia"/>
+        </w:rPr>
+        <w:t>填写注册表小节（如</w:t>
+      </w:r>
+      <w:r>
+        <w:rPr>
+          <w:rFonts w:ascii="Times New Roman" w:eastAsia="宋体" w:hAnsi="Times New Roman" w:cs="Times New Roman" w:hint="eastAsia"/>
+        </w:rPr>
+        <w:t>[</w:t>
+      </w:r>
+      <w:r>
+        <w:rPr>
+          <w:rFonts w:ascii="Times New Roman" w:eastAsia="宋体" w:hAnsi="Times New Roman" w:cs="Times New Roman" w:hint="eastAsia"/>
+        </w:rPr>
+        <w:t>IgnoreRA2</w:t>
+      </w:r>
+      <w:r>
+        <w:rPr>
+          <w:rFonts w:ascii="Times New Roman" w:eastAsia="宋体" w:hAnsi="Times New Roman" w:cs="Times New Roman" w:hint="eastAsia"/>
+        </w:rPr>
+        <w:t>]</w:t>
+      </w:r>
+      <w:r>
+        <w:rPr>
+          <w:rFonts w:ascii="Times New Roman" w:eastAsia="宋体" w:hAnsi="Times New Roman" w:cs="Times New Roman" w:hint="eastAsia"/>
+        </w:rPr>
+        <w:t>）</w:t>
+      </w:r>
+    </w:p>
+    <w:p>
+      <w:pPr>
+        <w:pStyle w:val="a9"/>
+        <w:numPr>
+          <w:ilvl w:val="0"/>
           <w:numId w:val="10"/>
         </w:numPr>
         <w:rPr>
@@ -965,6 +1037,7 @@
         <w:rPr>
           <w:rFonts w:ascii="Times New Roman" w:eastAsia="宋体" w:hAnsi="Times New Roman" w:cs="Times New Roman" w:hint="eastAsia"/>
         </w:rPr>
+        <w:lastRenderedPageBreak/>
         <w:t>为基地节点渲染自定义军衔</w:t>
       </w:r>
     </w:p>
@@ -983,7 +1056,6 @@
         <w:rPr>
           <w:rFonts w:ascii="Times New Roman" w:eastAsia="宋体" w:hAnsi="Times New Roman" w:cs="Times New Roman" w:hint="eastAsia"/>
         </w:rPr>
-        <w:lastRenderedPageBreak/>
         <w:t>支持将地图文件关联至启动器，直接打开地图；支持将地图拖拽至启动器打开，详见</w:t>
       </w:r>
       <w:r>
@@ -1980,6 +2052,7 @@
         <w:rPr>
           <w:rFonts w:ascii="Times New Roman" w:eastAsia="宋体" w:hAnsi="Times New Roman" w:cs="Times New Roman" w:hint="eastAsia"/>
         </w:rPr>
+        <w:lastRenderedPageBreak/>
         <w:t>InGameDisplay.RemapableOverlay</w:t>
       </w:r>
     </w:p>
@@ -1998,7 +2071,6 @@
         <w:rPr>
           <w:rFonts w:ascii="Times New Roman" w:eastAsia="宋体" w:hAnsi="Times New Roman" w:cs="Times New Roman" w:hint="eastAsia"/>
         </w:rPr>
-        <w:lastRenderedPageBreak/>
         <w:t>恢复心灵终结中被错误隐藏的部分地形组</w:t>
       </w:r>
     </w:p>
@@ -2959,6 +3031,7 @@
         <w:rPr>
           <w:rFonts w:ascii="Times New Roman" w:eastAsia="宋体" w:hAnsi="Times New Roman" w:cs="Times New Roman" w:hint="eastAsia"/>
         </w:rPr>
+        <w:lastRenderedPageBreak/>
         <w:t>物品浏览器</w:t>
       </w:r>
       <w:r>
@@ -2983,14 +3056,7 @@
         <w:rPr>
           <w:rFonts w:ascii="Times New Roman" w:eastAsia="宋体" w:hAnsi="Times New Roman" w:cs="Times New Roman" w:hint="eastAsia"/>
         </w:rPr>
-        <w:t>水晶不能将矿石放在斜坡上（不影响地形浏览器中的</w:t>
-      </w:r>
-      <w:r>
-        <w:rPr>
-          <w:rFonts w:ascii="Times New Roman" w:eastAsia="宋体" w:hAnsi="Times New Roman" w:cs="Times New Roman" w:hint="eastAsia"/>
-        </w:rPr>
-        <w:lastRenderedPageBreak/>
-        <w:t>摆放）</w:t>
+        <w:t>水晶不能将矿石放在斜坡上（不影响地形浏览器中的摆放）</w:t>
       </w:r>
     </w:p>
     <w:p>
@@ -4074,6 +4140,7 @@
         <w:rPr>
           <w:rFonts w:ascii="Times New Roman" w:eastAsia="宋体" w:hAnsi="Times New Roman" w:cs="Times New Roman" w:hint="eastAsia"/>
         </w:rPr>
+        <w:lastRenderedPageBreak/>
         <w:t>修复地形生成器的显示范围比划定范围宽一格的</w:t>
       </w:r>
       <w:r>
@@ -4098,7 +4165,6 @@
         <w:rPr>
           <w:rFonts w:ascii="Times New Roman" w:eastAsia="宋体" w:hAnsi="Times New Roman" w:cs="Times New Roman" w:hint="eastAsia"/>
         </w:rPr>
-        <w:lastRenderedPageBreak/>
         <w:t>支持自定义加载嵌套</w:t>
       </w:r>
       <w:r>
@@ -5159,6 +5225,7 @@
         <w:rPr>
           <w:rFonts w:ascii="Times New Roman" w:eastAsia="宋体" w:hAnsi="Times New Roman" w:cs="Times New Roman" w:hint="eastAsia"/>
         </w:rPr>
+        <w:lastRenderedPageBreak/>
         <w:t>粘贴功能支持按</w:t>
       </w:r>
       <w:r>
@@ -5189,7 +5256,6 @@
         <w:rPr>
           <w:rFonts w:ascii="Times New Roman" w:eastAsia="宋体" w:hAnsi="Times New Roman" w:cs="Times New Roman" w:hint="eastAsia"/>
         </w:rPr>
-        <w:lastRenderedPageBreak/>
         <w:t>优化地形与阴影的覆盖关系，使渲染更接近游戏内效果</w:t>
       </w:r>
     </w:p>

</xml_diff>

<commit_message>
fix flatten ground in edges
</commit_message>
<xml_diff>
--- a/Supplementary/文档/FA2SP HDM Edition说明文档.docx
+++ b/Supplementary/文档/FA2SP HDM Edition说明文档.docx
@@ -174,7 +174,7 @@
           <w:rFonts w:ascii="宋体" w:eastAsia="宋体" w:hAnsi="宋体" w:hint="eastAsia"/>
           <w:sz w:val="24"/>
         </w:rPr>
-        <w:t>8</w:t>
+        <w:t>9</w:t>
       </w:r>
     </w:p>
     <w:p>
@@ -246,7 +246,7 @@
           <w:sz w:val="28"/>
           <w:szCs w:val="32"/>
         </w:rPr>
-        <w:t>8</w:t>
+        <w:t>9</w:t>
       </w:r>
       <w:r>
         <w:rPr>
@@ -891,6 +891,48 @@
         <w:pStyle w:val="a9"/>
         <w:numPr>
           <w:ilvl w:val="0"/>
+          <w:numId w:val="11"/>
+        </w:numPr>
+        <w:rPr>
+          <w:rFonts w:ascii="Times New Roman" w:eastAsia="宋体" w:hAnsi="Times New Roman" w:cs="Times New Roman"/>
+        </w:rPr>
+      </w:pPr>
+      <w:r>
+        <w:rPr>
+          <w:rFonts w:ascii="Times New Roman" w:eastAsia="宋体" w:hAnsi="Times New Roman" w:cs="Times New Roman" w:hint="eastAsia"/>
+        </w:rPr>
+        <w:t>修复在地图边缘</w:t>
+      </w:r>
+      <w:r>
+        <w:rPr>
+          <w:rFonts w:ascii="Times New Roman" w:eastAsia="宋体" w:hAnsi="Times New Roman" w:cs="Times New Roman" w:hint="eastAsia"/>
+        </w:rPr>
+        <w:t>平坦地形</w:t>
+      </w:r>
+      <w:r>
+        <w:rPr>
+          <w:rFonts w:ascii="Times New Roman" w:eastAsia="宋体" w:hAnsi="Times New Roman" w:cs="Times New Roman" w:hint="eastAsia"/>
+        </w:rPr>
+        <w:t>时</w:t>
+      </w:r>
+      <w:r>
+        <w:rPr>
+          <w:rFonts w:ascii="Times New Roman" w:eastAsia="宋体" w:hAnsi="Times New Roman" w:cs="Times New Roman" w:hint="eastAsia"/>
+        </w:rPr>
+        <w:t>会绕过悬崖的</w:t>
+      </w:r>
+      <w:r>
+        <w:rPr>
+          <w:rFonts w:ascii="Times New Roman" w:eastAsia="宋体" w:hAnsi="Times New Roman" w:cs="Times New Roman" w:hint="eastAsia"/>
+        </w:rPr>
+        <w:t>bug</w:t>
+      </w:r>
+    </w:p>
+    <w:p>
+      <w:pPr>
+        <w:pStyle w:val="a9"/>
+        <w:numPr>
+          <w:ilvl w:val="0"/>
           <w:numId w:val="10"/>
         </w:numPr>
         <w:rPr>
@@ -1013,6 +1055,7 @@
         <w:rPr>
           <w:rFonts w:ascii="Times New Roman" w:eastAsia="宋体" w:hAnsi="Times New Roman" w:cs="Times New Roman" w:hint="eastAsia"/>
         </w:rPr>
+        <w:lastRenderedPageBreak/>
         <w:t>修复附加单位绑定在建筑炮塔上时，无法跟随旋转的</w:t>
       </w:r>
       <w:r>
@@ -1037,7 +1080,6 @@
         <w:rPr>
           <w:rFonts w:ascii="Times New Roman" w:eastAsia="宋体" w:hAnsi="Times New Roman" w:cs="Times New Roman" w:hint="eastAsia"/>
         </w:rPr>
-        <w:lastRenderedPageBreak/>
         <w:t>为基地节点渲染自定义军衔</w:t>
       </w:r>
     </w:p>
@@ -2022,6 +2064,7 @@
         <w:rPr>
           <w:rFonts w:ascii="Times New Roman" w:eastAsia="宋体" w:hAnsi="Times New Roman" w:cs="Times New Roman" w:hint="eastAsia"/>
         </w:rPr>
+        <w:lastRenderedPageBreak/>
         <w:t>围墙覆盖物支持</w:t>
       </w:r>
       <w:r>
@@ -2052,7 +2095,6 @@
         <w:rPr>
           <w:rFonts w:ascii="Times New Roman" w:eastAsia="宋体" w:hAnsi="Times New Roman" w:cs="Times New Roman" w:hint="eastAsia"/>
         </w:rPr>
-        <w:lastRenderedPageBreak/>
         <w:t>InGameDisplay.RemapableOverlay</w:t>
       </w:r>
     </w:p>
@@ -3001,6 +3043,7 @@
         <w:rPr>
           <w:rFonts w:ascii="Times New Roman" w:eastAsia="宋体" w:hAnsi="Times New Roman" w:cs="Times New Roman" w:hint="eastAsia"/>
         </w:rPr>
+        <w:lastRenderedPageBreak/>
         <w:t>小队变更时会即时刷新</w:t>
       </w:r>
       <w:r>
@@ -3031,7 +3074,6 @@
         <w:rPr>
           <w:rFonts w:ascii="Times New Roman" w:eastAsia="宋体" w:hAnsi="Times New Roman" w:cs="Times New Roman" w:hint="eastAsia"/>
         </w:rPr>
-        <w:lastRenderedPageBreak/>
         <w:t>物品浏览器</w:t>
       </w:r>
       <w:r>
@@ -4122,6 +4164,7 @@
         <w:rPr>
           <w:rFonts w:ascii="Times New Roman" w:eastAsia="宋体" w:hAnsi="Times New Roman" w:cs="Times New Roman" w:hint="eastAsia"/>
         </w:rPr>
+        <w:lastRenderedPageBreak/>
         <w:t>污染现在能正确被阴影遮挡</w:t>
       </w:r>
     </w:p>
@@ -4140,7 +4183,6 @@
         <w:rPr>
           <w:rFonts w:ascii="Times New Roman" w:eastAsia="宋体" w:hAnsi="Times New Roman" w:cs="Times New Roman" w:hint="eastAsia"/>
         </w:rPr>
-        <w:lastRenderedPageBreak/>
         <w:t>修复地形生成器的显示范围比划定范围宽一格的</w:t>
       </w:r>
       <w:r>
@@ -5189,6 +5231,7 @@
         <w:rPr>
           <w:rFonts w:ascii="Times New Roman" w:eastAsia="宋体" w:hAnsi="Times New Roman" w:cs="Times New Roman" w:hint="eastAsia"/>
         </w:rPr>
+        <w:lastRenderedPageBreak/>
         <w:t>修复了单位“在桥梁上”为</w:t>
       </w:r>
       <w:r>
@@ -5225,7 +5268,6 @@
         <w:rPr>
           <w:rFonts w:ascii="Times New Roman" w:eastAsia="宋体" w:hAnsi="Times New Roman" w:cs="Times New Roman" w:hint="eastAsia"/>
         </w:rPr>
-        <w:lastRenderedPageBreak/>
         <w:t>粘贴功能支持按</w:t>
       </w:r>
       <w:r>
@@ -6298,6 +6340,7 @@
         <w:rPr>
           <w:rFonts w:ascii="Times New Roman" w:eastAsia="宋体" w:hAnsi="Times New Roman" w:cs="Times New Roman" w:hint="eastAsia"/>
         </w:rPr>
+        <w:lastRenderedPageBreak/>
         <w:t>修复触发编辑器填写的参数为触发时不能正确截断空格的</w:t>
       </w:r>
       <w:r>
@@ -6330,7 +6373,6 @@
           <w:sz w:val="28"/>
           <w:szCs w:val="32"/>
         </w:rPr>
-        <w:lastRenderedPageBreak/>
         <w:t>1.2.4 (2025.11.02)</w:t>
       </w:r>
     </w:p>
@@ -7470,14 +7512,8 @@
         <w:rPr>
           <w:rFonts w:ascii="Times New Roman" w:eastAsia="宋体" w:hAnsi="Times New Roman" w:cs="Times New Roman" w:hint="eastAsia"/>
         </w:rPr>
-        <w:t>擦除覆盖物不会导致附近的围墙变为完好状态，会保持当前破损状态（但仍</w:t>
-      </w:r>
-      <w:r>
-        <w:rPr>
-          <w:rFonts w:ascii="Times New Roman" w:eastAsia="宋体" w:hAnsi="Times New Roman" w:cs="Times New Roman" w:hint="eastAsia"/>
-        </w:rPr>
         <w:lastRenderedPageBreak/>
-        <w:t>然会重新计算连接方式）</w:t>
+        <w:t>擦除覆盖物不会导致附近的围墙变为完好状态，会保持当前破损状态（但仍然会重新计算连接方式）</w:t>
       </w:r>
     </w:p>
     <w:p>
@@ -38807,7 +38843,7 @@
         <v:path o:extrusionok="f" gradientshapeok="t" o:connecttype="rect"/>
         <o:lock v:ext="edit" aspectratio="t"/>
       </v:shapetype>
-      <v:shape id="_x0000_i1029" type="#_x0000_t75" style="width:11.4pt;height:11.4pt" o:bullet="t">
+      <v:shape id="_x0000_i1031" type="#_x0000_t75" style="width:11.4pt;height:11.4pt" o:bullet="t">
         <v:imagedata r:id="rId1" o:title="mso9A9A"/>
       </v:shape>
     </w:pict>

</xml_diff>

<commit_message>
fix modify ore bug
</commit_message>
<xml_diff>
--- a/Supplementary/文档/FA2SP HDM Edition说明文档.docx
+++ b/Supplementary/文档/FA2SP HDM Edition说明文档.docx
@@ -1204,6 +1204,54 @@
         <w:pStyle w:val="a9"/>
         <w:numPr>
           <w:ilvl w:val="0"/>
+          <w:numId w:val="11"/>
+        </w:numPr>
+        <w:rPr>
+          <w:rFonts w:ascii="Times New Roman" w:eastAsia="宋体" w:hAnsi="Times New Roman" w:cs="Times New Roman"/>
+        </w:rPr>
+      </w:pPr>
+      <w:r>
+        <w:rPr>
+          <w:rFonts w:ascii="Times New Roman" w:eastAsia="宋体" w:hAnsi="Times New Roman" w:cs="Times New Roman" w:hint="eastAsia"/>
+        </w:rPr>
+        <w:t>修复地形浏览器</w:t>
+      </w:r>
+      <w:r>
+        <w:rPr>
+          <w:rFonts w:ascii="Times New Roman" w:eastAsia="宋体" w:hAnsi="Times New Roman" w:cs="Times New Roman" w:hint="eastAsia"/>
+        </w:rPr>
+        <w:t>-&gt;</w:t>
+      </w:r>
+      <w:r>
+        <w:rPr>
+          <w:rFonts w:ascii="Times New Roman" w:eastAsia="宋体" w:hAnsi="Times New Roman" w:cs="Times New Roman" w:hint="eastAsia"/>
+        </w:rPr>
+        <w:t>增加</w:t>
+      </w:r>
+      <w:r>
+        <w:rPr>
+          <w:rFonts w:ascii="Times New Roman" w:eastAsia="宋体" w:hAnsi="Times New Roman" w:cs="Times New Roman" w:hint="eastAsia"/>
+        </w:rPr>
+        <w:t>/</w:t>
+      </w:r>
+      <w:r>
+        <w:rPr>
+          <w:rFonts w:ascii="Times New Roman" w:eastAsia="宋体" w:hAnsi="Times New Roman" w:cs="Times New Roman" w:hint="eastAsia"/>
+        </w:rPr>
+        <w:t>减少矿石导致资源总量计算误差的</w:t>
+      </w:r>
+      <w:r>
+        <w:rPr>
+          <w:rFonts w:ascii="Times New Roman" w:eastAsia="宋体" w:hAnsi="Times New Roman" w:cs="Times New Roman" w:hint="eastAsia"/>
+        </w:rPr>
+        <w:t>bug</w:t>
+      </w:r>
+    </w:p>
+    <w:p>
+      <w:pPr>
+        <w:pStyle w:val="a9"/>
+        <w:numPr>
+          <w:ilvl w:val="0"/>
           <w:numId w:val="10"/>
         </w:numPr>
         <w:rPr>
@@ -1974,6 +2022,7 @@
         <w:rPr>
           <w:rFonts w:ascii="Times New Roman" w:eastAsia="宋体" w:hAnsi="Times New Roman" w:cs="Times New Roman" w:hint="eastAsia"/>
         </w:rPr>
+        <w:lastRenderedPageBreak/>
         <w:t>支持使用椭圆绘制范围属性，详见</w:t>
       </w:r>
       <w:r>
@@ -2006,7 +2055,6 @@
           <w:sz w:val="28"/>
           <w:szCs w:val="32"/>
         </w:rPr>
-        <w:lastRenderedPageBreak/>
         <w:t>1.3.5 (2026.0</w:t>
       </w:r>
       <w:r>
@@ -2947,6 +2995,7 @@
         <w:rPr>
           <w:rFonts w:ascii="Times New Roman" w:eastAsia="宋体" w:hAnsi="Times New Roman" w:cs="Times New Roman" w:hint="eastAsia"/>
         </w:rPr>
+        <w:lastRenderedPageBreak/>
         <w:t>对无图像地形对象和污染显示文本</w:t>
       </w:r>
     </w:p>
@@ -2965,7 +3014,6 @@
         <w:rPr>
           <w:rFonts w:ascii="Times New Roman" w:eastAsia="宋体" w:hAnsi="Times New Roman" w:cs="Times New Roman" w:hint="eastAsia"/>
         </w:rPr>
-        <w:lastRenderedPageBreak/>
         <w:t>修复擦除覆盖物时，若围墙仅剩一格，无法正确调整连接关系的</w:t>
       </w:r>
       <w:r>
@@ -4036,6 +4084,7 @@
         <w:rPr>
           <w:rFonts w:ascii="Times New Roman" w:eastAsia="宋体" w:hAnsi="Times New Roman" w:cs="Times New Roman" w:hint="eastAsia"/>
         </w:rPr>
+        <w:lastRenderedPageBreak/>
         <w:t>支持渲染体素的炮塔和炮管阴影，并读取</w:t>
       </w:r>
       <w:r>
@@ -4066,7 +4115,6 @@
         <w:rPr>
           <w:rFonts w:ascii="Times New Roman" w:eastAsia="宋体" w:hAnsi="Times New Roman" w:cs="Times New Roman" w:hint="eastAsia"/>
         </w:rPr>
-        <w:lastRenderedPageBreak/>
         <w:t>TurretShadow</w:t>
       </w:r>
       <w:r>
@@ -5129,6 +5177,7 @@
         <w:rPr>
           <w:rFonts w:ascii="Times New Roman" w:eastAsia="宋体" w:hAnsi="Times New Roman" w:cs="Times New Roman" w:hint="eastAsia"/>
         </w:rPr>
+        <w:lastRenderedPageBreak/>
         <w:t>修复了军衔图层不能隐藏的</w:t>
       </w:r>
       <w:r>
@@ -5153,7 +5202,6 @@
         <w:rPr>
           <w:rFonts w:ascii="Times New Roman" w:eastAsia="宋体" w:hAnsi="Times New Roman" w:cs="Times New Roman" w:hint="eastAsia"/>
         </w:rPr>
-        <w:lastRenderedPageBreak/>
         <w:t>仅当基地节点与相同建筑重叠时，才会在关闭建筑轮廓的情况下显示轮廓</w:t>
       </w:r>
     </w:p>
@@ -6174,6 +6222,7 @@
         <w:rPr>
           <w:rFonts w:ascii="Times New Roman" w:eastAsia="宋体" w:hAnsi="Times New Roman" w:cs="Times New Roman" w:hint="eastAsia"/>
         </w:rPr>
+        <w:lastRenderedPageBreak/>
         <w:t>支持多语言切换，添加了英文版。所有可以在</w:t>
       </w:r>
       <w:r>
@@ -6204,14 +6253,7 @@
         <w:rPr>
           <w:rFonts w:ascii="Times New Roman" w:eastAsia="宋体" w:hAnsi="Times New Roman" w:cs="Times New Roman" w:hint="eastAsia"/>
         </w:rPr>
-        <w:t>和</w:t>
-      </w:r>
-      <w:r>
-        <w:rPr>
-          <w:rFonts w:ascii="Times New Roman" w:eastAsia="宋体" w:hAnsi="Times New Roman" w:cs="Times New Roman" w:hint="eastAsia"/>
-        </w:rPr>
-        <w:lastRenderedPageBreak/>
-        <w:t>键</w:t>
+        <w:t>和键</w:t>
       </w:r>
       <w:r>
         <w:rPr>
@@ -7374,6 +7416,7 @@
         <w:rPr>
           <w:rFonts w:ascii="Times New Roman" w:eastAsia="宋体" w:hAnsi="Times New Roman" w:cs="Times New Roman" w:hint="eastAsia"/>
         </w:rPr>
+        <w:lastRenderedPageBreak/>
         <w:t>新增地图渲染器功能，可以渲染全图</w:t>
       </w:r>
       <w:r>
@@ -7398,7 +7441,6 @@
         <w:rPr>
           <w:rFonts w:ascii="Times New Roman" w:eastAsia="宋体" w:hAnsi="Times New Roman" w:cs="Times New Roman" w:hint="eastAsia"/>
         </w:rPr>
-        <w:lastRenderedPageBreak/>
         <w:t>修补主程序，支持最高</w:t>
       </w:r>
       <w:r>
@@ -8549,7 +8591,14 @@
         <w:rPr>
           <w:rFonts w:ascii="Times New Roman" w:eastAsia="宋体" w:hAnsi="Times New Roman" w:cs="Times New Roman" w:hint="eastAsia"/>
         </w:rPr>
-        <w:t>作战小队编辑器新增跳转按钮，可以跳转至对应的特遣部队、脚本、标签（实际为寻找对应触发）</w:t>
+        <w:t>作战小队编辑器新增跳转按钮，可以跳转至对应的特遣部队、脚本、标签（实</w:t>
+      </w:r>
+      <w:r>
+        <w:rPr>
+          <w:rFonts w:ascii="Times New Roman" w:eastAsia="宋体" w:hAnsi="Times New Roman" w:cs="Times New Roman" w:hint="eastAsia"/>
+        </w:rPr>
+        <w:lastRenderedPageBreak/>
+        <w:t>际为寻找对应触发）</w:t>
       </w:r>
     </w:p>
     <w:p>
@@ -8567,7 +8616,6 @@
         <w:rPr>
           <w:rFonts w:ascii="Times New Roman" w:eastAsia="宋体" w:hAnsi="Times New Roman" w:cs="Times New Roman" w:hint="eastAsia"/>
         </w:rPr>
-        <w:lastRenderedPageBreak/>
         <w:t>修复物品浏览器的标签文本错误换行的</w:t>
       </w:r>
       <w:r>
@@ -9558,6 +9606,7 @@
         <w:rPr>
           <w:rFonts w:ascii="Times New Roman" w:eastAsia="宋体" w:hAnsi="Times New Roman" w:cs="Times New Roman" w:hint="eastAsia"/>
         </w:rPr>
+        <w:lastRenderedPageBreak/>
         <w:t>修复了在开启输入法和部分情况下在地图界面按</w:t>
       </w:r>
       <w:r>
@@ -9618,7 +9667,6 @@
         <w:rPr>
           <w:rFonts w:ascii="Times New Roman" w:eastAsia="宋体" w:hAnsi="Times New Roman" w:cs="Times New Roman" w:hint="eastAsia"/>
         </w:rPr>
-        <w:lastRenderedPageBreak/>
         <w:t>修复了新城市下使用绘制悬崖后部工具时，按</w:t>
       </w:r>
       <w:r>
@@ -10645,6 +10693,7 @@
         <w:rPr>
           <w:rFonts w:ascii="Times New Roman" w:eastAsia="宋体" w:hAnsi="Times New Roman" w:cs="Times New Roman" w:hint="eastAsia"/>
         </w:rPr>
+        <w:lastRenderedPageBreak/>
         <w:t>新增</w:t>
       </w:r>
       <w:r>
@@ -10681,7 +10730,6 @@
         <w:rPr>
           <w:rFonts w:ascii="Times New Roman" w:eastAsia="宋体" w:hAnsi="Times New Roman" w:cs="Times New Roman" w:hint="eastAsia"/>
         </w:rPr>
-        <w:lastRenderedPageBreak/>
         <w:t>修复建筑部分位于地图外时，建筑本体可能不能显示的</w:t>
       </w:r>
       <w:r>
@@ -11798,7 +11846,14 @@
         <w:rPr>
           <w:rFonts w:ascii="Times New Roman" w:eastAsia="宋体" w:hAnsi="Times New Roman" w:cs="Times New Roman" w:hint="eastAsia"/>
         </w:rPr>
-        <w:t>深度调整</w:t>
+        <w:t>深度</w:t>
+      </w:r>
+      <w:r>
+        <w:rPr>
+          <w:rFonts w:ascii="Times New Roman" w:eastAsia="宋体" w:hAnsi="Times New Roman" w:cs="Times New Roman" w:hint="eastAsia"/>
+        </w:rPr>
+        <w:lastRenderedPageBreak/>
+        <w:t>调整</w:t>
       </w:r>
     </w:p>
     <w:p>
@@ -11816,7 +11871,6 @@
         <w:rPr>
           <w:rFonts w:ascii="Times New Roman" w:eastAsia="宋体" w:hAnsi="Times New Roman" w:cs="Times New Roman" w:hint="eastAsia"/>
         </w:rPr>
-        <w:lastRenderedPageBreak/>
         <w:t>绘制连接地形支持铁路</w:t>
       </w:r>
     </w:p>
@@ -12811,6 +12865,7 @@
         <w:rPr>
           <w:rFonts w:ascii="Times New Roman" w:eastAsia="宋体" w:hAnsi="Times New Roman" w:cs="Times New Roman" w:hint="eastAsia"/>
         </w:rPr>
+        <w:lastRenderedPageBreak/>
         <w:t>修复部分情况下物品浏览器取消选择仍会错误选中界面顶端选项的</w:t>
       </w:r>
       <w:r>
@@ -12835,7 +12890,6 @@
         <w:rPr>
           <w:rFonts w:ascii="Times New Roman" w:eastAsia="宋体" w:hAnsi="Times New Roman" w:cs="Times New Roman" w:hint="eastAsia"/>
         </w:rPr>
-        <w:lastRenderedPageBreak/>
         <w:t>优化绘制连接地形的性能与内存占用</w:t>
       </w:r>
     </w:p>
@@ -13789,6 +13843,7 @@
         <w:rPr>
           <w:rFonts w:ascii="Times New Roman" w:eastAsia="宋体" w:hAnsi="Times New Roman" w:cs="Times New Roman" w:hint="eastAsia"/>
         </w:rPr>
+        <w:lastRenderedPageBreak/>
         <w:t>多选模式支持正矩形添加和删除</w:t>
       </w:r>
     </w:p>
@@ -13807,7 +13862,6 @@
         <w:rPr>
           <w:rFonts w:ascii="Times New Roman" w:eastAsia="宋体" w:hAnsi="Times New Roman" w:cs="Times New Roman" w:hint="eastAsia"/>
         </w:rPr>
-        <w:lastRenderedPageBreak/>
         <w:t>物品浏览器支持查看预览图</w:t>
       </w:r>
       <w:r>
@@ -14799,6 +14853,7 @@
         <w:rPr>
           <w:rFonts w:ascii="Times New Roman" w:eastAsia="宋体" w:hAnsi="Times New Roman" w:cs="Times New Roman" w:hint="eastAsia"/>
         </w:rPr>
+        <w:lastRenderedPageBreak/>
         <w:t>恢复在某些地形下被屏蔽的高架木桥桥墩废墟</w:t>
       </w:r>
     </w:p>
@@ -14817,7 +14872,6 @@
         <w:rPr>
           <w:rFonts w:ascii="Times New Roman" w:eastAsia="宋体" w:hAnsi="Times New Roman" w:cs="Times New Roman" w:hint="eastAsia"/>
         </w:rPr>
-        <w:lastRenderedPageBreak/>
         <w:t>修复下拉菜单部分情况下选择失效的</w:t>
       </w:r>
       <w:r>
@@ -15724,6 +15778,7 @@
         <w:rPr>
           <w:rFonts w:ascii="Times New Roman" w:eastAsia="宋体" w:hAnsi="Times New Roman" w:cs="Times New Roman" w:hint="eastAsia"/>
         </w:rPr>
+        <w:lastRenderedPageBreak/>
         <w:t>修复了使用</w:t>
       </w:r>
       <w:r>
@@ -15760,7 +15815,6 @@
         <w:rPr>
           <w:rFonts w:ascii="Times New Roman" w:eastAsia="宋体" w:hAnsi="Times New Roman" w:cs="Times New Roman" w:hint="eastAsia"/>
         </w:rPr>
-        <w:lastRenderedPageBreak/>
         <w:t>修复了光照沙盒开启时，内存占用异常增高的</w:t>
       </w:r>
       <w:r>
@@ -39255,7 +39309,7 @@
         <v:path o:extrusionok="f" gradientshapeok="t" o:connecttype="rect"/>
         <o:lock v:ext="edit" aspectratio="t"/>
       </v:shapetype>
-      <v:shape id="_x0000_i1029" type="#_x0000_t75" style="width:11.4pt;height:11.4pt" o:bullet="t">
+      <v:shape id="_x0000_i1030" type="#_x0000_t75" style="width:11.4pt;height:11.4pt" o:bullet="t">
         <v:imagedata r:id="rId1" o:title="mso9A9A"/>
       </v:shape>
     </w:pict>

</xml_diff>

<commit_message>
auto reload images when Image= changed
improve debug output
</commit_message>
<xml_diff>
--- a/Supplementary/文档/FA2SP HDM Edition说明文档.docx
+++ b/Supplementary/文档/FA2SP HDM Edition说明文档.docx
@@ -174,7 +174,7 @@
           <w:rFonts w:ascii="宋体" w:eastAsia="宋体" w:hAnsi="宋体" w:hint="eastAsia"/>
           <w:sz w:val="24"/>
         </w:rPr>
-        <w:t>1</w:t>
+        <w:t>2</w:t>
       </w:r>
     </w:p>
     <w:p>
@@ -246,7 +246,7 @@
           <w:sz w:val="28"/>
           <w:szCs w:val="32"/>
         </w:rPr>
-        <w:t>1</w:t>
+        <w:t>2</w:t>
       </w:r>
       <w:r>
         <w:rPr>
@@ -1252,6 +1252,48 @@
         <w:pStyle w:val="a9"/>
         <w:numPr>
           <w:ilvl w:val="0"/>
+          <w:numId w:val="11"/>
+        </w:numPr>
+        <w:rPr>
+          <w:rFonts w:ascii="Times New Roman" w:eastAsia="宋体" w:hAnsi="Times New Roman" w:cs="Times New Roman"/>
+        </w:rPr>
+      </w:pPr>
+      <w:r>
+        <w:rPr>
+          <w:rFonts w:ascii="Times New Roman" w:eastAsia="宋体" w:hAnsi="Times New Roman" w:cs="Times New Roman" w:hint="eastAsia"/>
+        </w:rPr>
+        <w:t>在</w:t>
+      </w:r>
+      <w:r>
+        <w:rPr>
+          <w:rFonts w:ascii="Times New Roman" w:eastAsia="宋体" w:hAnsi="Times New Roman" w:cs="Times New Roman" w:hint="eastAsia"/>
+        </w:rPr>
+        <w:t>ini</w:t>
+      </w:r>
+      <w:r>
+        <w:rPr>
+          <w:rFonts w:ascii="Times New Roman" w:eastAsia="宋体" w:hAnsi="Times New Roman" w:cs="Times New Roman" w:hint="eastAsia"/>
+        </w:rPr>
+        <w:t>编辑器内修改单位的</w:t>
+      </w:r>
+      <w:r>
+        <w:rPr>
+          <w:rFonts w:ascii="Times New Roman" w:eastAsia="宋体" w:hAnsi="Times New Roman" w:cs="Times New Roman" w:hint="eastAsia"/>
+        </w:rPr>
+        <w:t>Image</w:t>
+      </w:r>
+      <w:r>
+        <w:rPr>
+          <w:rFonts w:ascii="Times New Roman" w:eastAsia="宋体" w:hAnsi="Times New Roman" w:cs="Times New Roman" w:hint="eastAsia"/>
+        </w:rPr>
+        <w:t>后，会自动重新载入素材</w:t>
+      </w:r>
+    </w:p>
+    <w:p>
+      <w:pPr>
+        <w:pStyle w:val="a9"/>
+        <w:numPr>
+          <w:ilvl w:val="0"/>
           <w:numId w:val="10"/>
         </w:numPr>
         <w:rPr>
@@ -2004,6 +2046,7 @@
         <w:rPr>
           <w:rFonts w:ascii="Times New Roman" w:eastAsia="宋体" w:hAnsi="Times New Roman" w:cs="Times New Roman" w:hint="eastAsia"/>
         </w:rPr>
+        <w:lastRenderedPageBreak/>
         <w:t>触发编辑器的事件列表支持多选</w:t>
       </w:r>
     </w:p>
@@ -2022,7 +2065,6 @@
         <w:rPr>
           <w:rFonts w:ascii="Times New Roman" w:eastAsia="宋体" w:hAnsi="Times New Roman" w:cs="Times New Roman" w:hint="eastAsia"/>
         </w:rPr>
-        <w:lastRenderedPageBreak/>
         <w:t>支持使用椭圆绘制范围属性，详见</w:t>
       </w:r>
       <w:r>
@@ -2965,6 +3007,7 @@
         <w:rPr>
           <w:rFonts w:ascii="Times New Roman" w:eastAsia="宋体" w:hAnsi="Times New Roman" w:cs="Times New Roman" w:hint="eastAsia"/>
         </w:rPr>
+        <w:lastRenderedPageBreak/>
         <w:t>支持</w:t>
       </w:r>
       <w:r>
@@ -2995,7 +3038,6 @@
         <w:rPr>
           <w:rFonts w:ascii="Times New Roman" w:eastAsia="宋体" w:hAnsi="Times New Roman" w:cs="Times New Roman" w:hint="eastAsia"/>
         </w:rPr>
-        <w:lastRenderedPageBreak/>
         <w:t>对无图像地形对象和污染显示文本</w:t>
       </w:r>
     </w:p>
@@ -4060,6 +4102,7 @@
         <w:rPr>
           <w:rFonts w:ascii="Times New Roman" w:eastAsia="宋体" w:hAnsi="Times New Roman" w:cs="Times New Roman" w:hint="eastAsia"/>
         </w:rPr>
+        <w:lastRenderedPageBreak/>
         <w:t>JumpJet</w:t>
       </w:r>
       <w:r>
@@ -4084,7 +4127,6 @@
         <w:rPr>
           <w:rFonts w:ascii="Times New Roman" w:eastAsia="宋体" w:hAnsi="Times New Roman" w:cs="Times New Roman" w:hint="eastAsia"/>
         </w:rPr>
-        <w:lastRenderedPageBreak/>
         <w:t>支持渲染体素的炮塔和炮管阴影，并读取</w:t>
       </w:r>
       <w:r>
@@ -5159,6 +5201,7 @@
         <w:rPr>
           <w:rFonts w:ascii="Times New Roman" w:eastAsia="宋体" w:hAnsi="Times New Roman" w:cs="Times New Roman" w:hint="eastAsia"/>
         </w:rPr>
+        <w:lastRenderedPageBreak/>
         <w:t>微调了地图渲染器的边缘坐标</w:t>
       </w:r>
     </w:p>
@@ -5177,7 +5220,6 @@
         <w:rPr>
           <w:rFonts w:ascii="Times New Roman" w:eastAsia="宋体" w:hAnsi="Times New Roman" w:cs="Times New Roman" w:hint="eastAsia"/>
         </w:rPr>
-        <w:lastRenderedPageBreak/>
         <w:t>修复了军衔图层不能隐藏的</w:t>
       </w:r>
       <w:r>
@@ -6186,6 +6228,7 @@
         <w:rPr>
           <w:rFonts w:ascii="Times New Roman" w:eastAsia="宋体" w:hAnsi="Times New Roman" w:cs="Times New Roman" w:hint="eastAsia"/>
         </w:rPr>
+        <w:lastRenderedPageBreak/>
         <w:t>支持翻译任意</w:t>
       </w:r>
       <w:r>
@@ -6222,7 +6265,6 @@
         <w:rPr>
           <w:rFonts w:ascii="Times New Roman" w:eastAsia="宋体" w:hAnsi="Times New Roman" w:cs="Times New Roman" w:hint="eastAsia"/>
         </w:rPr>
-        <w:lastRenderedPageBreak/>
         <w:t>支持多语言切换，添加了英文版。所有可以在</w:t>
       </w:r>
       <w:r>
@@ -7398,6 +7440,7 @@
         <w:rPr>
           <w:rFonts w:ascii="Times New Roman" w:eastAsia="宋体" w:hAnsi="Times New Roman" w:cs="Times New Roman" w:hint="eastAsia"/>
         </w:rPr>
+        <w:lastRenderedPageBreak/>
         <w:t>支持破损建筑的火焰效果显示</w:t>
       </w:r>
     </w:p>
@@ -7416,7 +7459,6 @@
         <w:rPr>
           <w:rFonts w:ascii="Times New Roman" w:eastAsia="宋体" w:hAnsi="Times New Roman" w:cs="Times New Roman" w:hint="eastAsia"/>
         </w:rPr>
-        <w:lastRenderedPageBreak/>
         <w:t>新增地图渲染器功能，可以渲染全图</w:t>
       </w:r>
       <w:r>
@@ -8591,14 +8633,8 @@
         <w:rPr>
           <w:rFonts w:ascii="Times New Roman" w:eastAsia="宋体" w:hAnsi="Times New Roman" w:cs="Times New Roman" w:hint="eastAsia"/>
         </w:rPr>
-        <w:t>作战小队编辑器新增跳转按钮，可以跳转至对应的特遣部队、脚本、标签（实</w:t>
-      </w:r>
-      <w:r>
-        <w:rPr>
-          <w:rFonts w:ascii="Times New Roman" w:eastAsia="宋体" w:hAnsi="Times New Roman" w:cs="Times New Roman" w:hint="eastAsia"/>
-        </w:rPr>
         <w:lastRenderedPageBreak/>
-        <w:t>际为寻找对应触发）</w:t>
+        <w:t>作战小队编辑器新增跳转按钮，可以跳转至对应的特遣部队、脚本、标签（实际为寻找对应触发）</w:t>
       </w:r>
     </w:p>
     <w:p>
@@ -9582,6 +9618,7 @@
         <w:rPr>
           <w:rFonts w:ascii="Times New Roman" w:eastAsia="宋体" w:hAnsi="Times New Roman" w:cs="Times New Roman" w:hint="eastAsia"/>
         </w:rPr>
+        <w:lastRenderedPageBreak/>
         <w:t>修复调整地图大小后隧道位置错误的</w:t>
       </w:r>
       <w:r>
@@ -9606,7 +9643,6 @@
         <w:rPr>
           <w:rFonts w:ascii="Times New Roman" w:eastAsia="宋体" w:hAnsi="Times New Roman" w:cs="Times New Roman" w:hint="eastAsia"/>
         </w:rPr>
-        <w:lastRenderedPageBreak/>
         <w:t>修复了在开启输入法和部分情况下在地图界面按</w:t>
       </w:r>
       <w:r>
@@ -10669,6 +10705,7 @@
         <w:rPr>
           <w:rFonts w:ascii="Times New Roman" w:eastAsia="宋体" w:hAnsi="Times New Roman" w:cs="Times New Roman" w:hint="eastAsia"/>
         </w:rPr>
+        <w:lastRenderedPageBreak/>
         <w:t>修复在摆放过建筑后改变地图大小时弹框的</w:t>
       </w:r>
       <w:r>
@@ -10693,7 +10730,6 @@
         <w:rPr>
           <w:rFonts w:ascii="Times New Roman" w:eastAsia="宋体" w:hAnsi="Times New Roman" w:cs="Times New Roman" w:hint="eastAsia"/>
         </w:rPr>
-        <w:lastRenderedPageBreak/>
         <w:t>新增</w:t>
       </w:r>
       <w:r>
@@ -11798,6 +11834,7 @@
         <w:rPr>
           <w:rFonts w:ascii="Times New Roman" w:eastAsia="宋体" w:hAnsi="Times New Roman" w:cs="Times New Roman" w:hint="eastAsia"/>
         </w:rPr>
+        <w:lastRenderedPageBreak/>
         <w:t>支持建筑动画的</w:t>
       </w:r>
       <w:r>
@@ -11846,14 +11883,7 @@
         <w:rPr>
           <w:rFonts w:ascii="Times New Roman" w:eastAsia="宋体" w:hAnsi="Times New Roman" w:cs="Times New Roman" w:hint="eastAsia"/>
         </w:rPr>
-        <w:t>深度</w:t>
-      </w:r>
-      <w:r>
-        <w:rPr>
-          <w:rFonts w:ascii="Times New Roman" w:eastAsia="宋体" w:hAnsi="Times New Roman" w:cs="Times New Roman" w:hint="eastAsia"/>
-        </w:rPr>
-        <w:lastRenderedPageBreak/>
-        <w:t>调整</w:t>
+        <w:t>深度调整</w:t>
       </w:r>
     </w:p>
     <w:p>
@@ -12847,6 +12877,7 @@
         <w:rPr>
           <w:rFonts w:ascii="Times New Roman" w:eastAsia="宋体" w:hAnsi="Times New Roman" w:cs="Times New Roman" w:hint="eastAsia"/>
         </w:rPr>
+        <w:lastRenderedPageBreak/>
         <w:t>优化地形浏览器渲染，减少部分地形的黑边</w:t>
       </w:r>
     </w:p>
@@ -12865,7 +12896,6 @@
         <w:rPr>
           <w:rFonts w:ascii="Times New Roman" w:eastAsia="宋体" w:hAnsi="Times New Roman" w:cs="Times New Roman" w:hint="eastAsia"/>
         </w:rPr>
-        <w:lastRenderedPageBreak/>
         <w:t>修复部分情况下物品浏览器取消选择仍会错误选中界面顶端选项的</w:t>
       </w:r>
       <w:r>
@@ -13825,6 +13855,7 @@
         <w:rPr>
           <w:rFonts w:ascii="Times New Roman" w:eastAsia="宋体" w:hAnsi="Times New Roman" w:cs="Times New Roman" w:hint="eastAsia"/>
         </w:rPr>
+        <w:lastRenderedPageBreak/>
         <w:t>粘贴选项新增“粘贴区域描边”，可以控制是否显示描边</w:t>
       </w:r>
     </w:p>
@@ -13843,7 +13874,6 @@
         <w:rPr>
           <w:rFonts w:ascii="Times New Roman" w:eastAsia="宋体" w:hAnsi="Times New Roman" w:cs="Times New Roman" w:hint="eastAsia"/>
         </w:rPr>
-        <w:lastRenderedPageBreak/>
         <w:t>多选模式支持正矩形添加和删除</w:t>
       </w:r>
     </w:p>
@@ -14829,6 +14859,7 @@
         <w:rPr>
           <w:rFonts w:ascii="Times New Roman" w:eastAsia="宋体" w:hAnsi="Times New Roman" w:cs="Times New Roman" w:hint="eastAsia"/>
         </w:rPr>
+        <w:lastRenderedPageBreak/>
         <w:t>CSF</w:t>
       </w:r>
       <w:r>
@@ -14853,7 +14884,6 @@
         <w:rPr>
           <w:rFonts w:ascii="Times New Roman" w:eastAsia="宋体" w:hAnsi="Times New Roman" w:cs="Times New Roman" w:hint="eastAsia"/>
         </w:rPr>
-        <w:lastRenderedPageBreak/>
         <w:t>恢复在某些地形下被屏蔽的高架木桥桥墩废墟</w:t>
       </w:r>
     </w:p>
@@ -15754,6 +15784,7 @@
         <w:rPr>
           <w:rFonts w:ascii="Times New Roman" w:eastAsia="宋体" w:hAnsi="Times New Roman" w:cs="Times New Roman" w:hint="eastAsia"/>
         </w:rPr>
+        <w:lastRenderedPageBreak/>
         <w:t>修复了当建筑位置位于地图外时崩溃的</w:t>
       </w:r>
       <w:r>
@@ -15778,7 +15809,6 @@
         <w:rPr>
           <w:rFonts w:ascii="Times New Roman" w:eastAsia="宋体" w:hAnsi="Times New Roman" w:cs="Times New Roman" w:hint="eastAsia"/>
         </w:rPr>
-        <w:lastRenderedPageBreak/>
         <w:t>修复了使用</w:t>
       </w:r>
       <w:r>
@@ -16757,6 +16787,7 @@
         <w:rPr>
           <w:rFonts w:ascii="Times New Roman" w:eastAsia="宋体" w:hAnsi="Times New Roman" w:cs="Times New Roman" w:hint="eastAsia"/>
         </w:rPr>
+        <w:lastRenderedPageBreak/>
         <w:t>修复由地形自定义色盘导致的部分地形显示</w:t>
       </w:r>
       <w:r>
@@ -16789,7 +16820,6 @@
           <w:sz w:val="28"/>
           <w:szCs w:val="32"/>
         </w:rPr>
-        <w:lastRenderedPageBreak/>
         <w:t>1.0.5 (2025.02.24)</w:t>
       </w:r>
     </w:p>
@@ -17778,13 +17808,13 @@
         <w:rPr>
           <w:rFonts w:ascii="Times New Roman" w:eastAsia="宋体" w:hAnsi="Times New Roman" w:cs="Times New Roman" w:hint="eastAsia"/>
         </w:rPr>
+        <w:lastRenderedPageBreak/>
         <w:t>修复了在开启自动海岸的情况下，放置地形会导致笔刷边缘区域进行不必要的</w:t>
       </w:r>
       <w:r>
         <w:rPr>
           <w:rFonts w:ascii="Times New Roman" w:eastAsia="宋体" w:hAnsi="Times New Roman" w:cs="Times New Roman" w:hint="eastAsia"/>
         </w:rPr>
-        <w:lastRenderedPageBreak/>
         <w:t>LAT</w:t>
       </w:r>
       <w:r>
@@ -18903,6 +18933,7 @@
         <w:rPr>
           <w:rFonts w:ascii="Times New Roman" w:eastAsia="宋体" w:hAnsi="Times New Roman" w:cs="Times New Roman" w:hint="eastAsia"/>
         </w:rPr>
+        <w:lastRenderedPageBreak/>
         <w:t>新增两项工具脚本函数：</w:t>
       </w:r>
       <w:r>
@@ -18927,14 +18958,7 @@
         <w:rPr>
           <w:rFonts w:ascii="Times New Roman" w:eastAsia="宋体" w:hAnsi="Times New Roman" w:cs="Times New Roman" w:hint="eastAsia"/>
         </w:rPr>
-        <w:t>，用于路径点</w:t>
-      </w:r>
-      <w:r>
-        <w:rPr>
-          <w:rFonts w:ascii="Times New Roman" w:eastAsia="宋体" w:hAnsi="Times New Roman" w:cs="Times New Roman" w:hint="eastAsia"/>
-        </w:rPr>
-        <w:lastRenderedPageBreak/>
-        <w:t>与数字互转，详见</w:t>
+        <w:t>，用于路径点与数字互转，详见</w:t>
       </w:r>
       <w:r>
         <w:rPr>

</xml_diff>

<commit_message>
building alphaimage supports multi-frames
</commit_message>
<xml_diff>
--- a/Supplementary/文档/FA2SP HDM Edition说明文档.docx
+++ b/Supplementary/文档/FA2SP HDM Edition说明文档.docx
@@ -1336,6 +1336,36 @@
         <w:pStyle w:val="a9"/>
         <w:numPr>
           <w:ilvl w:val="0"/>
+          <w:numId w:val="11"/>
+        </w:numPr>
+        <w:rPr>
+          <w:rFonts w:ascii="Times New Roman" w:eastAsia="宋体" w:hAnsi="Times New Roman" w:cs="Times New Roman"/>
+        </w:rPr>
+      </w:pPr>
+      <w:r>
+        <w:rPr>
+          <w:rFonts w:ascii="Times New Roman" w:eastAsia="宋体" w:hAnsi="Times New Roman" w:cs="Times New Roman" w:hint="eastAsia"/>
+        </w:rPr>
+        <w:t>建筑</w:t>
+      </w:r>
+      <w:r>
+        <w:rPr>
+          <w:rFonts w:ascii="Times New Roman" w:eastAsia="宋体" w:hAnsi="Times New Roman" w:cs="Times New Roman" w:hint="eastAsia"/>
+        </w:rPr>
+        <w:t>AlphaImage</w:t>
+      </w:r>
+      <w:r>
+        <w:rPr>
+          <w:rFonts w:ascii="Times New Roman" w:eastAsia="宋体" w:hAnsi="Times New Roman" w:cs="Times New Roman" w:hint="eastAsia"/>
+        </w:rPr>
+        <w:t>支持跟随炮塔旋转</w:t>
+      </w:r>
+    </w:p>
+    <w:p>
+      <w:pPr>
+        <w:pStyle w:val="a9"/>
+        <w:numPr>
+          <w:ilvl w:val="0"/>
           <w:numId w:val="10"/>
         </w:numPr>
         <w:rPr>
@@ -2028,6 +2058,7 @@
         <w:rPr>
           <w:rFonts w:ascii="Times New Roman" w:eastAsia="宋体" w:hAnsi="Times New Roman" w:cs="Times New Roman" w:hint="eastAsia"/>
         </w:rPr>
+        <w:lastRenderedPageBreak/>
         <w:t>编辑器的拖拽绿点移动到有效目标时，会为目标显示绿色高亮</w:t>
       </w:r>
     </w:p>
@@ -2046,7 +2077,6 @@
         <w:rPr>
           <w:rFonts w:ascii="Times New Roman" w:eastAsia="宋体" w:hAnsi="Times New Roman" w:cs="Times New Roman" w:hint="eastAsia"/>
         </w:rPr>
-        <w:lastRenderedPageBreak/>
         <w:t>触发编辑器的</w:t>
       </w:r>
       <w:r>
@@ -3001,6 +3031,7 @@
         <w:rPr>
           <w:rFonts w:ascii="Times New Roman" w:eastAsia="宋体" w:hAnsi="Times New Roman" w:cs="Times New Roman" w:hint="eastAsia"/>
         </w:rPr>
+        <w:lastRenderedPageBreak/>
         <w:t>TheaterInfo</w:t>
       </w:r>
       <w:r>
@@ -3025,7 +3056,6 @@
         <w:rPr>
           <w:rFonts w:ascii="Times New Roman" w:eastAsia="宋体" w:hAnsi="Times New Roman" w:cs="Times New Roman" w:hint="eastAsia"/>
         </w:rPr>
-        <w:lastRenderedPageBreak/>
         <w:t>支持为无图像单位显示缺省图像，详见</w:t>
       </w:r>
       <w:r>
@@ -4120,13 +4150,13 @@
         <w:rPr>
           <w:rFonts w:ascii="Times New Roman" w:eastAsia="宋体" w:hAnsi="Times New Roman" w:cs="Times New Roman" w:hint="eastAsia"/>
         </w:rPr>
+        <w:lastRenderedPageBreak/>
         <w:t>体素的阴影可以选择绘制在体素底部或地面上，详见</w:t>
       </w:r>
       <w:r>
         <w:rPr>
           <w:rFonts w:ascii="Times New Roman" w:eastAsia="宋体" w:hAnsi="Times New Roman" w:cs="Times New Roman" w:hint="eastAsia"/>
         </w:rPr>
-        <w:lastRenderedPageBreak/>
         <w:t>InGameDisplay.Shadow.OnGround</w:t>
       </w:r>
     </w:p>
@@ -5201,6 +5231,7 @@
         <w:rPr>
           <w:rFonts w:ascii="Times New Roman" w:eastAsia="宋体" w:hAnsi="Times New Roman" w:cs="Times New Roman" w:hint="eastAsia"/>
         </w:rPr>
+        <w:lastRenderedPageBreak/>
         <w:t>多选模式、地形生成器的范围标记会跟随边缘单元格高度改变</w:t>
       </w:r>
     </w:p>
@@ -5219,7 +5250,6 @@
         <w:rPr>
           <w:rFonts w:ascii="Times New Roman" w:eastAsia="宋体" w:hAnsi="Times New Roman" w:cs="Times New Roman" w:hint="eastAsia"/>
         </w:rPr>
-        <w:lastRenderedPageBreak/>
         <w:t>修复了部分情况下无法加载建筑火焰的</w:t>
       </w:r>
       <w:r>
@@ -6216,6 +6246,7 @@
         <w:rPr>
           <w:rFonts w:ascii="Times New Roman" w:eastAsia="宋体" w:hAnsi="Times New Roman" w:cs="Times New Roman" w:hint="eastAsia"/>
         </w:rPr>
+        <w:lastRenderedPageBreak/>
         <w:t>在地图内触发的重新加载不会清空已加载的素材，减少重新加载后的卡顿</w:t>
       </w:r>
     </w:p>
@@ -6234,7 +6265,6 @@
         <w:rPr>
           <w:rFonts w:ascii="Times New Roman" w:eastAsia="宋体" w:hAnsi="Times New Roman" w:cs="Times New Roman" w:hint="eastAsia"/>
         </w:rPr>
-        <w:lastRenderedPageBreak/>
         <w:t>修复语言设置只支持</w:t>
       </w:r>
       <w:r>
@@ -7392,7 +7422,14 @@
         <w:rPr>
           <w:rFonts w:ascii="Times New Roman" w:eastAsia="宋体" w:hAnsi="Times New Roman" w:cs="Times New Roman" w:hint="eastAsia"/>
         </w:rPr>
-        <w:t>串参数，详见</w:t>
+        <w:t>串参数，详</w:t>
+      </w:r>
+      <w:r>
+        <w:rPr>
+          <w:rFonts w:ascii="Times New Roman" w:eastAsia="宋体" w:hAnsi="Times New Roman" w:cs="Times New Roman" w:hint="eastAsia"/>
+        </w:rPr>
+        <w:lastRenderedPageBreak/>
+        <w:t>见</w:t>
       </w:r>
       <w:r>
         <w:rPr>
@@ -7434,7 +7471,6 @@
         <w:rPr>
           <w:rFonts w:ascii="Times New Roman" w:eastAsia="宋体" w:hAnsi="Times New Roman" w:cs="Times New Roman" w:hint="eastAsia"/>
         </w:rPr>
-        <w:lastRenderedPageBreak/>
         <w:t>修复抬升</w:t>
       </w:r>
       <w:r>
@@ -8591,6 +8627,7 @@
         <w:rPr>
           <w:rFonts w:ascii="Times New Roman" w:eastAsia="宋体" w:hAnsi="Times New Roman" w:cs="Times New Roman" w:hint="eastAsia"/>
         </w:rPr>
+        <w:lastRenderedPageBreak/>
         <w:t>修复新增框架模式的自定义色盘兼容性问题</w:t>
       </w:r>
     </w:p>
@@ -8609,7 +8646,6 @@
         <w:rPr>
           <w:rFonts w:ascii="Times New Roman" w:eastAsia="宋体" w:hAnsi="Times New Roman" w:cs="Times New Roman" w:hint="eastAsia"/>
         </w:rPr>
-        <w:lastRenderedPageBreak/>
         <w:t>新增</w:t>
       </w:r>
       <w:r>
@@ -9612,6 +9648,7 @@
         <w:rPr>
           <w:rFonts w:ascii="Times New Roman" w:eastAsia="宋体" w:hAnsi="Times New Roman" w:cs="Times New Roman" w:hint="eastAsia"/>
         </w:rPr>
+        <w:lastRenderedPageBreak/>
         <w:t>绘制连接地形可以将鼠标移动到地图边界外，更方便靠近边界的绘制</w:t>
       </w:r>
     </w:p>
@@ -9630,7 +9667,6 @@
         <w:rPr>
           <w:rFonts w:ascii="Times New Roman" w:eastAsia="宋体" w:hAnsi="Times New Roman" w:cs="Times New Roman" w:hint="eastAsia"/>
         </w:rPr>
-        <w:lastRenderedPageBreak/>
         <w:t>优化</w:t>
       </w:r>
       <w:r>
@@ -10705,6 +10741,7 @@
         <w:rPr>
           <w:rFonts w:ascii="Times New Roman" w:eastAsia="宋体" w:hAnsi="Times New Roman" w:cs="Times New Roman" w:hint="eastAsia"/>
         </w:rPr>
+        <w:lastRenderedPageBreak/>
         <w:t>bug</w:t>
       </w:r>
     </w:p>
@@ -10723,7 +10760,6 @@
         <w:rPr>
           <w:rFonts w:ascii="Times New Roman" w:eastAsia="宋体" w:hAnsi="Times New Roman" w:cs="Times New Roman" w:hint="eastAsia"/>
         </w:rPr>
-        <w:lastRenderedPageBreak/>
         <w:t>修复改变地图大小时基地节点、污染可能错位的</w:t>
       </w:r>
       <w:r>
@@ -11816,6 +11852,7 @@
         <w:rPr>
           <w:rFonts w:ascii="Times New Roman" w:eastAsia="宋体" w:hAnsi="Times New Roman" w:cs="Times New Roman" w:hint="eastAsia"/>
         </w:rPr>
+        <w:lastRenderedPageBreak/>
         <w:t>修复当地图边界超出地图范围时，细蓝线会偏移的</w:t>
       </w:r>
       <w:r>
@@ -11840,7 +11877,6 @@
         <w:rPr>
           <w:rFonts w:ascii="Times New Roman" w:eastAsia="宋体" w:hAnsi="Times New Roman" w:cs="Times New Roman" w:hint="eastAsia"/>
         </w:rPr>
-        <w:lastRenderedPageBreak/>
         <w:t>支持自定义</w:t>
       </w:r>
       <w:r>
@@ -12865,6 +12901,7 @@
         <w:rPr>
           <w:rFonts w:ascii="Times New Roman" w:eastAsia="宋体" w:hAnsi="Times New Roman" w:cs="Times New Roman" w:hint="eastAsia"/>
         </w:rPr>
+        <w:lastRenderedPageBreak/>
         <w:t>优化复制粘贴性能，支持跨进程显示区域描边</w:t>
       </w:r>
     </w:p>
@@ -12883,7 +12920,6 @@
         <w:rPr>
           <w:rFonts w:ascii="Times New Roman" w:eastAsia="宋体" w:hAnsi="Times New Roman" w:cs="Times New Roman" w:hint="eastAsia"/>
         </w:rPr>
-        <w:lastRenderedPageBreak/>
         <w:t>修复地形浏览器显示</w:t>
       </w:r>
       <w:r>
@@ -13831,6 +13867,7 @@
         <w:rPr>
           <w:rFonts w:ascii="Times New Roman" w:eastAsia="宋体" w:hAnsi="Times New Roman" w:cs="Times New Roman" w:hint="eastAsia"/>
         </w:rPr>
+        <w:lastRenderedPageBreak/>
         <w:t>触发条件与行为参数支持根据其它参数值改变，例如</w:t>
       </w:r>
       <w:r>
@@ -13849,14 +13886,7 @@
         <w:rPr>
           <w:rFonts w:ascii="Times New Roman" w:eastAsia="宋体" w:hAnsi="Times New Roman" w:cs="Times New Roman" w:hint="eastAsia"/>
         </w:rPr>
-        <w:t>变量间计</w:t>
-      </w:r>
-      <w:r>
-        <w:rPr>
-          <w:rFonts w:ascii="Times New Roman" w:eastAsia="宋体" w:hAnsi="Times New Roman" w:cs="Times New Roman" w:hint="eastAsia"/>
-        </w:rPr>
-        <w:lastRenderedPageBreak/>
-        <w:t>算</w:t>
+        <w:t>变量间计算</w:t>
       </w:r>
       <w:r>
         <w:rPr>
@@ -14865,6 +14895,7 @@
         <w:rPr>
           <w:rFonts w:ascii="Times New Roman" w:eastAsia="宋体" w:hAnsi="Times New Roman" w:cs="Times New Roman" w:hint="eastAsia"/>
         </w:rPr>
+        <w:lastRenderedPageBreak/>
         <w:t>将</w:t>
       </w:r>
       <w:r>
@@ -14889,14 +14920,7 @@
         <w:rPr>
           <w:rFonts w:ascii="Times New Roman" w:eastAsia="宋体" w:hAnsi="Times New Roman" w:cs="Times New Roman" w:hint="eastAsia"/>
         </w:rPr>
-        <w:t>，固定在栈上分</w:t>
-      </w:r>
-      <w:r>
-        <w:rPr>
-          <w:rFonts w:ascii="Times New Roman" w:eastAsia="宋体" w:hAnsi="Times New Roman" w:cs="Times New Roman" w:hint="eastAsia"/>
-        </w:rPr>
-        <w:lastRenderedPageBreak/>
-        <w:t>配内存，可以在提升稳定性的同时避免过大的内存开销</w:t>
+        <w:t>，固定在栈上分配内存，可以在提升稳定性的同时避免过大的内存开销</w:t>
       </w:r>
     </w:p>
     <w:p>
@@ -15772,6 +15796,7 @@
         <w:rPr>
           <w:rFonts w:ascii="Times New Roman" w:eastAsia="宋体" w:hAnsi="Times New Roman" w:cs="Times New Roman" w:hint="eastAsia"/>
         </w:rPr>
+        <w:lastRenderedPageBreak/>
         <w:t>增强了自动海岸对其他地形的覆盖控制，</w:t>
       </w:r>
       <w:r>
@@ -15808,7 +15833,6 @@
         <w:rPr>
           <w:rFonts w:ascii="Times New Roman" w:eastAsia="宋体" w:hAnsi="Times New Roman" w:cs="Times New Roman" w:hint="eastAsia"/>
         </w:rPr>
-        <w:lastRenderedPageBreak/>
         <w:t>创建新地图</w:t>
       </w:r>
       <w:r>
@@ -16793,6 +16817,7 @@
         <w:rPr>
           <w:rFonts w:ascii="Times New Roman" w:eastAsia="宋体" w:hAnsi="Times New Roman" w:cs="Times New Roman" w:hint="eastAsia"/>
         </w:rPr>
+        <w:lastRenderedPageBreak/>
         <w:t>新增</w:t>
       </w:r>
       <w:r>
@@ -16811,14 +16836,7 @@
         <w:rPr>
           <w:rFonts w:ascii="Times New Roman" w:eastAsia="宋体" w:hAnsi="Times New Roman" w:cs="Times New Roman" w:hint="eastAsia"/>
         </w:rPr>
-        <w:t>在放置地形、生成海岸、抬升地表、粘贴地</w:t>
-      </w:r>
-      <w:r>
-        <w:rPr>
-          <w:rFonts w:ascii="Times New Roman" w:eastAsia="宋体" w:hAnsi="Times New Roman" w:cs="Times New Roman" w:hint="eastAsia"/>
-        </w:rPr>
-        <w:lastRenderedPageBreak/>
-        <w:t>形时</w:t>
+        <w:t>在放置地形、生成海岸、抬升地表、粘贴地形时</w:t>
       </w:r>
       <w:r>
         <w:rPr>
@@ -39534,7 +39552,7 @@
         <v:path o:extrusionok="f" gradientshapeok="t" o:connecttype="rect"/>
         <o:lock v:ext="edit" aspectratio="t"/>
       </v:shapetype>
-      <v:shape id="_x0000_i1034" type="#_x0000_t75" style="width:11.4pt;height:11.4pt" o:bullet="t">
+      <v:shape id="_x0000_i1030" type="#_x0000_t75" style="width:11.4pt;height:11.4pt" o:bullet="t">
         <v:imagedata r:id="rId1" o:title="mso9A9A"/>
       </v:shape>
     </w:pict>

</xml_diff>

<commit_message>
all techno support EditorCategory
</commit_message>
<xml_diff>
--- a/Supplementary/文档/FA2SP HDM Edition说明文档.docx
+++ b/Supplementary/文档/FA2SP HDM Edition说明文档.docx
@@ -1470,7 +1470,7 @@
           <w:kern w:val="0"/>
           <w14:ligatures w14:val="none"/>
         </w:rPr>
-        <w:t>地形对象、覆盖物、污染支持在</w:t>
+        <w:t>科技类型、</w:t>
       </w:r>
       <w:r>
         <w:rPr>
@@ -1478,7 +1478,7 @@
           <w:kern w:val="0"/>
           <w14:ligatures w14:val="none"/>
         </w:rPr>
-        <w:t>rules</w:t>
+        <w:t>地形对象、覆盖物、污染支持在</w:t>
       </w:r>
       <w:r>
         <w:rPr>
@@ -1486,7 +1486,7 @@
           <w:kern w:val="0"/>
           <w14:ligatures w14:val="none"/>
         </w:rPr>
-        <w:t>中填写</w:t>
+        <w:t>rules</w:t>
       </w:r>
       <w:r>
         <w:rPr>
@@ -1494,7 +1494,7 @@
           <w:kern w:val="0"/>
           <w14:ligatures w14:val="none"/>
         </w:rPr>
-        <w:t>EditorCategory</w:t>
+        <w:t>中填写</w:t>
       </w:r>
       <w:r>
         <w:rPr>
@@ -1502,7 +1502,7 @@
           <w:kern w:val="0"/>
           <w14:ligatures w14:val="none"/>
         </w:rPr>
-        <w:t>=key</w:t>
+        <w:t>EditorCategory</w:t>
       </w:r>
       <w:r>
         <w:rPr>
@@ -1510,7 +1510,7 @@
           <w:kern w:val="0"/>
           <w14:ligatures w14:val="none"/>
         </w:rPr>
-        <w:t>在物品浏览器中进行分类，其中</w:t>
+        <w:t>=</w:t>
       </w:r>
       <w:r>
         <w:rPr>
@@ -1518,7 +1518,7 @@
           <w:kern w:val="0"/>
           <w14:ligatures w14:val="none"/>
         </w:rPr>
-        <w:t>key</w:t>
+        <w:t>value</w:t>
       </w:r>
       <w:r>
         <w:rPr>
@@ -1526,7 +1526,7 @@
           <w:kern w:val="0"/>
           <w14:ligatures w14:val="none"/>
         </w:rPr>
-        <w:t>可以在</w:t>
+        <w:t>在物品浏览器中进行分类，其中</w:t>
       </w:r>
       <w:r>
         <w:rPr>
@@ -1534,7 +1534,7 @@
           <w:kern w:val="0"/>
           <w14:ligatures w14:val="none"/>
         </w:rPr>
-        <w:t>FALanguage.ini</w:t>
+        <w:t>key</w:t>
       </w:r>
       <w:r>
         <w:rPr>
@@ -1542,7 +1542,7 @@
           <w:kern w:val="0"/>
           <w14:ligatures w14:val="none"/>
         </w:rPr>
-        <w:t>中进行翻译，此标签与</w:t>
+        <w:t>可以在</w:t>
       </w:r>
       <w:r>
         <w:rPr>
@@ -1550,7 +1550,7 @@
           <w:kern w:val="0"/>
           <w14:ligatures w14:val="none"/>
         </w:rPr>
-        <w:t>WAE</w:t>
+        <w:t>FALanguage.ini</w:t>
       </w:r>
       <w:r>
         <w:rPr>
@@ -1558,27 +1558,15 @@
           <w:kern w:val="0"/>
           <w14:ligatures w14:val="none"/>
         </w:rPr>
-        <w:t>兼容</w:t>
-      </w:r>
-    </w:p>
-    <w:p>
-      <w:pPr>
-        <w:pStyle w:val="a9"/>
-        <w:numPr>
-          <w:ilvl w:val="0"/>
-          <w:numId w:val="11"/>
-        </w:numPr>
-        <w:rPr>
-          <w:rFonts w:ascii="Times New Roman" w:eastAsia="宋体" w:hAnsi="Times New Roman" w:cs="Times New Roman"/>
-        </w:rPr>
-      </w:pPr>
+        <w:t>中进行翻译，此标签与</w:t>
+      </w:r>
       <w:r>
         <w:rPr>
           <w:rFonts w:ascii="Times New Roman" w:eastAsia="宋体" w:hAnsi="Times New Roman" w:cs="Times New Roman" w:hint="eastAsia"/>
           <w:kern w:val="0"/>
           <w14:ligatures w14:val="none"/>
         </w:rPr>
-        <w:t>修复部分情况下物品浏览器选项的名称与实际单位不符的</w:t>
+        <w:t>WAE</w:t>
       </w:r>
       <w:r>
         <w:rPr>
@@ -1586,29 +1574,23 @@
           <w:kern w:val="0"/>
           <w14:ligatures w14:val="none"/>
         </w:rPr>
-        <w:t>bug</w:t>
-      </w:r>
-    </w:p>
-    <w:p>
-      <w:pPr>
-        <w:pStyle w:val="a9"/>
-        <w:numPr>
-          <w:ilvl w:val="0"/>
-          <w:numId w:val="11"/>
-        </w:numPr>
-        <w:rPr>
-          <w:rFonts w:ascii="Times New Roman" w:eastAsia="宋体" w:hAnsi="Times New Roman" w:cs="Times New Roman"/>
+        <w:t>兼容</w:t>
+      </w:r>
+      <w:r>
+        <w:rPr>
+          <w:rFonts w:ascii="Times New Roman" w:eastAsia="宋体" w:hAnsi="Times New Roman" w:cs="Times New Roman" w:hint="eastAsia"/>
           <w:kern w:val="0"/>
           <w14:ligatures w14:val="none"/>
         </w:rPr>
-      </w:pPr>
+        <w:t>；当</w:t>
+      </w:r>
       <w:r>
         <w:rPr>
           <w:rFonts w:ascii="Times New Roman" w:eastAsia="宋体" w:hAnsi="Times New Roman" w:cs="Times New Roman" w:hint="eastAsia"/>
           <w:kern w:val="0"/>
           <w14:ligatures w14:val="none"/>
         </w:rPr>
-        <w:t>支持设置覆盖物数据的最大值，详见</w:t>
+        <w:t>value</w:t>
       </w:r>
       <w:r>
         <w:rPr>
@@ -1616,29 +1598,23 @@
           <w:kern w:val="0"/>
           <w14:ligatures w14:val="none"/>
         </w:rPr>
-        <w:t>OverlayDataLimit</w:t>
-      </w:r>
-    </w:p>
-    <w:p>
-      <w:pPr>
-        <w:pStyle w:val="a9"/>
-        <w:numPr>
-          <w:ilvl w:val="0"/>
-          <w:numId w:val="11"/>
-        </w:numPr>
-        <w:rPr>
-          <w:rFonts w:ascii="Times New Roman" w:eastAsia="宋体" w:hAnsi="Times New Roman" w:cs="Times New Roman"/>
+        <w:t>与</w:t>
+      </w:r>
+      <w:r>
+        <w:rPr>
+          <w:rFonts w:ascii="Times New Roman" w:eastAsia="宋体" w:hAnsi="Times New Roman" w:cs="Times New Roman" w:hint="eastAsia"/>
           <w:kern w:val="0"/>
           <w14:ligatures w14:val="none"/>
         </w:rPr>
-      </w:pPr>
+        <w:t>FAData.ini-&gt;[</w:t>
+      </w:r>
       <w:r>
         <w:rPr>
           <w:rFonts w:ascii="Times New Roman" w:eastAsia="宋体" w:hAnsi="Times New Roman" w:cs="Times New Roman" w:hint="eastAsia"/>
           <w:kern w:val="0"/>
           <w14:ligatures w14:val="none"/>
         </w:rPr>
-        <w:t>修复</w:t>
+        <w:t>English-Sides</w:t>
       </w:r>
       <w:r>
         <w:rPr>
@@ -1646,7 +1622,7 @@
           <w:kern w:val="0"/>
           <w14:ligatures w14:val="none"/>
         </w:rPr>
-        <w:t>phobos</w:t>
+        <w:t>]</w:t>
       </w:r>
       <w:r>
         <w:rPr>
@@ -1654,7 +1630,7 @@
           <w:kern w:val="0"/>
           <w14:ligatures w14:val="none"/>
         </w:rPr>
-        <w:t>继承的部分问题</w:t>
+        <w:t>中的值相同时，会进行合并</w:t>
       </w:r>
     </w:p>
     <w:p>
@@ -1666,16 +1642,112 @@
         </w:numPr>
         <w:rPr>
           <w:rFonts w:ascii="Times New Roman" w:eastAsia="宋体" w:hAnsi="Times New Roman" w:cs="Times New Roman"/>
+        </w:rPr>
+      </w:pPr>
+      <w:r>
+        <w:rPr>
+          <w:rFonts w:ascii="Times New Roman" w:eastAsia="宋体" w:hAnsi="Times New Roman" w:cs="Times New Roman" w:hint="eastAsia"/>
           <w:kern w:val="0"/>
           <w14:ligatures w14:val="none"/>
         </w:rPr>
-      </w:pPr>
+        <w:t>修复部分情况下物品浏览器选项的名称与实际单位不符的</w:t>
+      </w:r>
       <w:r>
         <w:rPr>
           <w:rFonts w:ascii="Times New Roman" w:eastAsia="宋体" w:hAnsi="Times New Roman" w:cs="Times New Roman" w:hint="eastAsia"/>
           <w:kern w:val="0"/>
           <w14:ligatures w14:val="none"/>
         </w:rPr>
+        <w:t>bug</w:t>
+      </w:r>
+    </w:p>
+    <w:p>
+      <w:pPr>
+        <w:pStyle w:val="a9"/>
+        <w:numPr>
+          <w:ilvl w:val="0"/>
+          <w:numId w:val="11"/>
+        </w:numPr>
+        <w:rPr>
+          <w:rFonts w:ascii="Times New Roman" w:eastAsia="宋体" w:hAnsi="Times New Roman" w:cs="Times New Roman"/>
+          <w:kern w:val="0"/>
+          <w14:ligatures w14:val="none"/>
+        </w:rPr>
+      </w:pPr>
+      <w:r>
+        <w:rPr>
+          <w:rFonts w:ascii="Times New Roman" w:eastAsia="宋体" w:hAnsi="Times New Roman" w:cs="Times New Roman" w:hint="eastAsia"/>
+          <w:kern w:val="0"/>
+          <w14:ligatures w14:val="none"/>
+        </w:rPr>
+        <w:t>支持设置覆盖物数据的最大值，详见</w:t>
+      </w:r>
+      <w:r>
+        <w:rPr>
+          <w:rFonts w:ascii="Times New Roman" w:eastAsia="宋体" w:hAnsi="Times New Roman" w:cs="Times New Roman" w:hint="eastAsia"/>
+          <w:kern w:val="0"/>
+          <w14:ligatures w14:val="none"/>
+        </w:rPr>
+        <w:t>OverlayDataLimit</w:t>
+      </w:r>
+    </w:p>
+    <w:p>
+      <w:pPr>
+        <w:pStyle w:val="a9"/>
+        <w:numPr>
+          <w:ilvl w:val="0"/>
+          <w:numId w:val="11"/>
+        </w:numPr>
+        <w:rPr>
+          <w:rFonts w:ascii="Times New Roman" w:eastAsia="宋体" w:hAnsi="Times New Roman" w:cs="Times New Roman"/>
+          <w:kern w:val="0"/>
+          <w14:ligatures w14:val="none"/>
+        </w:rPr>
+      </w:pPr>
+      <w:r>
+        <w:rPr>
+          <w:rFonts w:ascii="Times New Roman" w:eastAsia="宋体" w:hAnsi="Times New Roman" w:cs="Times New Roman" w:hint="eastAsia"/>
+          <w:kern w:val="0"/>
+          <w14:ligatures w14:val="none"/>
+        </w:rPr>
+        <w:t>修复</w:t>
+      </w:r>
+      <w:r>
+        <w:rPr>
+          <w:rFonts w:ascii="Times New Roman" w:eastAsia="宋体" w:hAnsi="Times New Roman" w:cs="Times New Roman" w:hint="eastAsia"/>
+          <w:kern w:val="0"/>
+          <w14:ligatures w14:val="none"/>
+        </w:rPr>
+        <w:t>phobos</w:t>
+      </w:r>
+      <w:r>
+        <w:rPr>
+          <w:rFonts w:ascii="Times New Roman" w:eastAsia="宋体" w:hAnsi="Times New Roman" w:cs="Times New Roman" w:hint="eastAsia"/>
+          <w:kern w:val="0"/>
+          <w14:ligatures w14:val="none"/>
+        </w:rPr>
+        <w:t>继承的部分问题</w:t>
+      </w:r>
+    </w:p>
+    <w:p>
+      <w:pPr>
+        <w:pStyle w:val="a9"/>
+        <w:numPr>
+          <w:ilvl w:val="0"/>
+          <w:numId w:val="11"/>
+        </w:numPr>
+        <w:rPr>
+          <w:rFonts w:ascii="Times New Roman" w:eastAsia="宋体" w:hAnsi="Times New Roman" w:cs="Times New Roman"/>
+          <w:kern w:val="0"/>
+          <w14:ligatures w14:val="none"/>
+        </w:rPr>
+      </w:pPr>
+      <w:r>
+        <w:rPr>
+          <w:rFonts w:ascii="Times New Roman" w:eastAsia="宋体" w:hAnsi="Times New Roman" w:cs="Times New Roman" w:hint="eastAsia"/>
+          <w:kern w:val="0"/>
+          <w14:ligatures w14:val="none"/>
+        </w:rPr>
         <w:t>当单位本体不可见时，仍然支持绘制附加单位</w:t>
       </w:r>
     </w:p>
@@ -2022,6 +2094,7 @@
         <w:rPr>
           <w:rFonts w:ascii="Times New Roman" w:eastAsia="宋体" w:hAnsi="Times New Roman" w:cs="Times New Roman" w:hint="eastAsia"/>
         </w:rPr>
+        <w:lastRenderedPageBreak/>
         <w:t>支持半透明的建筑动画</w:t>
       </w:r>
     </w:p>
@@ -2040,7 +2113,6 @@
         <w:rPr>
           <w:rFonts w:ascii="Times New Roman" w:eastAsia="宋体" w:hAnsi="Times New Roman" w:cs="Times New Roman" w:hint="eastAsia"/>
         </w:rPr>
-        <w:lastRenderedPageBreak/>
         <w:t>修复当显示缺省图像开启时，对没有影子帧的单位显示缺省阴影的</w:t>
       </w:r>
       <w:r>
@@ -3043,6 +3115,7 @@
         <w:rPr>
           <w:rFonts w:ascii="Times New Roman" w:eastAsia="宋体" w:hAnsi="Times New Roman" w:cs="Times New Roman" w:hint="eastAsia"/>
         </w:rPr>
+        <w:lastRenderedPageBreak/>
         <w:t>优化单元标记和路径点的渲染效率</w:t>
       </w:r>
     </w:p>
@@ -3061,7 +3134,6 @@
         <w:rPr>
           <w:rFonts w:ascii="Times New Roman" w:eastAsia="宋体" w:hAnsi="Times New Roman" w:cs="Times New Roman" w:hint="eastAsia"/>
         </w:rPr>
-        <w:lastRenderedPageBreak/>
         <w:t>支持车辆单位的额外炮塔和额外炮管</w:t>
       </w:r>
     </w:p>
@@ -4124,6 +4196,7 @@
         <w:rPr>
           <w:rFonts w:ascii="Times New Roman" w:eastAsia="宋体" w:hAnsi="Times New Roman" w:cs="Times New Roman" w:hint="eastAsia"/>
         </w:rPr>
+        <w:lastRenderedPageBreak/>
         <w:t>新增</w:t>
       </w:r>
       <w:r>
@@ -4162,7 +4235,6 @@
           <w:sz w:val="28"/>
           <w:szCs w:val="32"/>
         </w:rPr>
-        <w:lastRenderedPageBreak/>
         <w:t>1.3.3 (2025.12.</w:t>
       </w:r>
       <w:r>
@@ -5213,6 +5285,7 @@
         <w:rPr>
           <w:rFonts w:ascii="Times New Roman" w:eastAsia="宋体" w:hAnsi="Times New Roman" w:cs="Times New Roman" w:hint="eastAsia"/>
         </w:rPr>
+        <w:lastRenderedPageBreak/>
         <w:t>修复当地图上存在</w:t>
       </w:r>
       <w:r>
@@ -5243,7 +5316,6 @@
         <w:rPr>
           <w:rFonts w:ascii="Times New Roman" w:eastAsia="宋体" w:hAnsi="Times New Roman" w:cs="Times New Roman" w:hint="eastAsia"/>
         </w:rPr>
-        <w:lastRenderedPageBreak/>
         <w:t>bug</w:t>
       </w:r>
     </w:p>
@@ -6294,6 +6366,7 @@
         <w:rPr>
           <w:rFonts w:ascii="Times New Roman" w:eastAsia="宋体" w:hAnsi="Times New Roman" w:cs="Times New Roman" w:hint="eastAsia"/>
         </w:rPr>
+        <w:lastRenderedPageBreak/>
         <w:t>“</w:t>
       </w:r>
       <w:r>
@@ -6306,14 +6379,7 @@
         <w:rPr>
           <w:rFonts w:ascii="Times New Roman" w:eastAsia="宋体" w:hAnsi="Times New Roman" w:cs="Times New Roman" w:hint="eastAsia"/>
         </w:rPr>
-        <w:t>”覆盖物为了兼容旧地编，进行了额外的偏移，在</w:t>
-      </w:r>
-      <w:r>
-        <w:rPr>
-          <w:rFonts w:ascii="Times New Roman" w:eastAsia="宋体" w:hAnsi="Times New Roman" w:cs="Times New Roman" w:hint="eastAsia"/>
-        </w:rPr>
-        <w:lastRenderedPageBreak/>
-        <w:t>修复后反而会偏移。</w:t>
+        <w:t>”覆盖物为了兼容旧地编，进行了额外的偏移，在修复后反而会偏移。</w:t>
       </w:r>
       <w:r>
         <w:rPr>
@@ -7381,6 +7447,7 @@
         <w:rPr>
           <w:rFonts w:ascii="Times New Roman" w:eastAsia="宋体" w:hAnsi="Times New Roman" w:cs="Times New Roman" w:hint="eastAsia"/>
         </w:rPr>
+        <w:lastRenderedPageBreak/>
         <w:t>新增触发注释窗口，可以为触发、小队、脚本、特遣、</w:t>
       </w:r>
       <w:r>
@@ -7405,14 +7472,7 @@
         <w:rPr>
           <w:rFonts w:ascii="Times New Roman" w:eastAsia="宋体" w:hAnsi="Times New Roman" w:cs="Times New Roman" w:hint="eastAsia"/>
         </w:rPr>
-        <w:t>添加注</w:t>
-      </w:r>
-      <w:r>
-        <w:rPr>
-          <w:rFonts w:ascii="Times New Roman" w:eastAsia="宋体" w:hAnsi="Times New Roman" w:cs="Times New Roman" w:hint="eastAsia"/>
-        </w:rPr>
-        <w:lastRenderedPageBreak/>
-        <w:t>释</w:t>
+        <w:t>添加注释</w:t>
       </w:r>
     </w:p>
     <w:p>
@@ -8569,6 +8629,7 @@
         <w:rPr>
           <w:rFonts w:ascii="Times New Roman" w:eastAsia="宋体" w:hAnsi="Times New Roman" w:cs="Times New Roman" w:hint="eastAsia"/>
         </w:rPr>
+        <w:lastRenderedPageBreak/>
         <w:t>修复了</w:t>
       </w:r>
       <w:r>
@@ -8605,7 +8666,6 @@
         <w:rPr>
           <w:rFonts w:ascii="Times New Roman" w:eastAsia="宋体" w:hAnsi="Times New Roman" w:cs="Times New Roman" w:hint="eastAsia"/>
         </w:rPr>
-        <w:lastRenderedPageBreak/>
         <w:t>支持</w:t>
       </w:r>
       <w:r>
@@ -9696,6 +9756,7 @@
         <w:rPr>
           <w:rFonts w:ascii="Times New Roman" w:eastAsia="宋体" w:hAnsi="Times New Roman" w:cs="Times New Roman" w:hint="eastAsia"/>
         </w:rPr>
+        <w:lastRenderedPageBreak/>
         <w:t>优化建筑动画读取逻辑，尊重动画的</w:t>
       </w:r>
       <w:r>
@@ -9726,14 +9787,980 @@
         <w:rPr>
           <w:rFonts w:ascii="Times New Roman" w:eastAsia="宋体" w:hAnsi="Times New Roman" w:cs="Times New Roman" w:hint="eastAsia"/>
         </w:rPr>
+        <w:t>Lua</w:t>
+      </w:r>
+      <w:r>
+        <w:rPr>
+          <w:rFonts w:ascii="Times New Roman" w:eastAsia="宋体" w:hAnsi="Times New Roman" w:cs="Times New Roman" w:hint="eastAsia"/>
+        </w:rPr>
+        <w:t>脚本终端支持搜索脚本文件</w:t>
+      </w:r>
+    </w:p>
+    <w:p>
+      <w:pPr>
+        <w:pStyle w:val="a9"/>
+        <w:numPr>
+          <w:ilvl w:val="0"/>
+          <w:numId w:val="31"/>
+        </w:numPr>
+        <w:rPr>
+          <w:rFonts w:ascii="Times New Roman" w:eastAsia="宋体" w:hAnsi="Times New Roman" w:cs="Times New Roman"/>
+        </w:rPr>
+      </w:pPr>
+      <w:r>
+        <w:rPr>
+          <w:rFonts w:ascii="Times New Roman" w:eastAsia="宋体" w:hAnsi="Times New Roman" w:cs="Times New Roman" w:hint="eastAsia"/>
+        </w:rPr>
+        <w:t>微调地图边界细蓝线的位置</w:t>
+      </w:r>
+    </w:p>
+    <w:p>
+      <w:pPr>
+        <w:pStyle w:val="a9"/>
+        <w:numPr>
+          <w:ilvl w:val="0"/>
+          <w:numId w:val="31"/>
+        </w:numPr>
+        <w:rPr>
+          <w:rFonts w:ascii="Times New Roman" w:eastAsia="宋体" w:hAnsi="Times New Roman" w:cs="Times New Roman"/>
+        </w:rPr>
+      </w:pPr>
+      <w:r>
+        <w:rPr>
+          <w:rFonts w:ascii="Times New Roman" w:eastAsia="宋体" w:hAnsi="Times New Roman" w:cs="Times New Roman" w:hint="eastAsia"/>
+        </w:rPr>
+        <w:t>修复了</w:t>
+      </w:r>
+      <w:r>
+        <w:rPr>
+          <w:rFonts w:ascii="Times New Roman" w:eastAsia="宋体" w:hAnsi="Times New Roman" w:cs="Times New Roman" w:hint="eastAsia"/>
+        </w:rPr>
+        <w:t>Vxl</w:t>
+      </w:r>
+      <w:r>
+        <w:rPr>
+          <w:rFonts w:ascii="Times New Roman" w:eastAsia="宋体" w:hAnsi="Times New Roman" w:cs="Times New Roman" w:hint="eastAsia"/>
+        </w:rPr>
+        <w:t>车辆</w:t>
+      </w:r>
+      <w:r>
+        <w:rPr>
+          <w:rFonts w:ascii="Times New Roman" w:eastAsia="宋体" w:hAnsi="Times New Roman" w:cs="Times New Roman" w:hint="eastAsia"/>
+        </w:rPr>
+        <w:t>Noshadow=yes</w:t>
+      </w:r>
+      <w:r>
+        <w:rPr>
+          <w:rFonts w:ascii="Times New Roman" w:eastAsia="宋体" w:hAnsi="Times New Roman" w:cs="Times New Roman" w:hint="eastAsia"/>
+        </w:rPr>
+        <w:t>时仍会显示阴影的</w:t>
+      </w:r>
+      <w:r>
+        <w:rPr>
+          <w:rFonts w:ascii="Times New Roman" w:eastAsia="宋体" w:hAnsi="Times New Roman" w:cs="Times New Roman" w:hint="eastAsia"/>
+        </w:rPr>
+        <w:t>bug</w:t>
+      </w:r>
+    </w:p>
+    <w:p>
+      <w:pPr>
+        <w:pStyle w:val="a9"/>
+        <w:numPr>
+          <w:ilvl w:val="0"/>
+          <w:numId w:val="31"/>
+        </w:numPr>
+        <w:rPr>
+          <w:rFonts w:ascii="Times New Roman" w:eastAsia="宋体" w:hAnsi="Times New Roman" w:cs="Times New Roman"/>
+        </w:rPr>
+      </w:pPr>
+      <w:r>
+        <w:rPr>
+          <w:rFonts w:ascii="Times New Roman" w:eastAsia="宋体" w:hAnsi="Times New Roman" w:cs="Times New Roman" w:hint="eastAsia"/>
+        </w:rPr>
+        <w:t>修复部分情况下绘制连接地形上升、下降段高度错误的</w:t>
+      </w:r>
+      <w:r>
+        <w:rPr>
+          <w:rFonts w:ascii="Times New Roman" w:eastAsia="宋体" w:hAnsi="Times New Roman" w:cs="Times New Roman" w:hint="eastAsia"/>
+        </w:rPr>
+        <w:t>bug</w:t>
+      </w:r>
+    </w:p>
+    <w:p>
+      <w:pPr>
+        <w:pStyle w:val="a9"/>
+        <w:numPr>
+          <w:ilvl w:val="0"/>
+          <w:numId w:val="31"/>
+        </w:numPr>
+        <w:rPr>
+          <w:rFonts w:ascii="Times New Roman" w:eastAsia="宋体" w:hAnsi="Times New Roman" w:cs="Times New Roman"/>
+        </w:rPr>
+      </w:pPr>
+      <w:r>
+        <w:rPr>
+          <w:rFonts w:ascii="Times New Roman" w:eastAsia="宋体" w:hAnsi="Times New Roman" w:cs="Times New Roman" w:hint="eastAsia"/>
+        </w:rPr>
+        <w:t>优化光照沙盒切换时的性能</w:t>
+      </w:r>
+    </w:p>
+    <w:p>
+      <w:pPr>
+        <w:pStyle w:val="a9"/>
+        <w:numPr>
+          <w:ilvl w:val="0"/>
+          <w:numId w:val="31"/>
+        </w:numPr>
+        <w:rPr>
+          <w:rFonts w:ascii="Times New Roman" w:eastAsia="宋体" w:hAnsi="Times New Roman" w:cs="Times New Roman"/>
+        </w:rPr>
+      </w:pPr>
+      <w:r>
+        <w:rPr>
+          <w:rFonts w:ascii="Times New Roman" w:eastAsia="宋体" w:hAnsi="Times New Roman" w:cs="Times New Roman" w:hint="eastAsia"/>
+        </w:rPr>
+        <w:t>新增</w:t>
+      </w:r>
+      <w:r>
+        <w:rPr>
+          <w:rFonts w:ascii="Times New Roman" w:eastAsia="宋体" w:hAnsi="Times New Roman" w:cs="Times New Roman" w:hint="eastAsia"/>
+        </w:rPr>
+        <w:t>LightingPreview</w:t>
+      </w:r>
+      <w:r>
+        <w:rPr>
+          <w:rFonts w:ascii="Times New Roman" w:eastAsia="宋体" w:hAnsi="Times New Roman" w:cs="Times New Roman" w:hint="eastAsia"/>
+        </w:rPr>
+        <w:t>.</w:t>
+      </w:r>
+      <w:r>
+        <w:rPr>
+          <w:rFonts w:ascii="Times New Roman" w:eastAsia="宋体" w:hAnsi="Times New Roman" w:cs="Times New Roman" w:hint="eastAsia"/>
+        </w:rPr>
+        <w:t>Tint</w:t>
+      </w:r>
+      <w:r>
+        <w:rPr>
+          <w:rFonts w:ascii="Times New Roman" w:eastAsia="宋体" w:hAnsi="Times New Roman" w:cs="Times New Roman" w:hint="eastAsia"/>
+        </w:rPr>
+        <w:t>TileSetBrowserView</w:t>
+      </w:r>
+      <w:r>
+        <w:rPr>
+          <w:rFonts w:ascii="Times New Roman" w:eastAsia="宋体" w:hAnsi="Times New Roman" w:cs="Times New Roman" w:hint="eastAsia"/>
+        </w:rPr>
+        <w:t>，控制是否按光照沙盒渲染地形浏览器图像</w:t>
+      </w:r>
+    </w:p>
+    <w:p>
+      <w:pPr>
+        <w:pStyle w:val="a9"/>
+        <w:numPr>
+          <w:ilvl w:val="0"/>
+          <w:numId w:val="31"/>
+        </w:numPr>
+        <w:rPr>
+          <w:rFonts w:ascii="Times New Roman" w:eastAsia="宋体" w:hAnsi="Times New Roman" w:cs="Times New Roman"/>
+        </w:rPr>
+      </w:pPr>
+      <w:r>
+        <w:rPr>
+          <w:rFonts w:ascii="Times New Roman" w:eastAsia="宋体" w:hAnsi="Times New Roman" w:cs="Times New Roman" w:hint="eastAsia"/>
+        </w:rPr>
+        <w:t>新增距离标尺，可以记录当前鼠标位置距离上次按下左键位置的距离，记录历史数量见</w:t>
+      </w:r>
+      <w:r>
+        <w:rPr>
+          <w:rFonts w:ascii="Times New Roman" w:eastAsia="宋体" w:hAnsi="Times New Roman" w:cs="Times New Roman" w:hint="eastAsia"/>
+        </w:rPr>
+        <w:t>DistanceRuler.Records</w:t>
+      </w:r>
+    </w:p>
+    <w:p>
+      <w:pPr>
+        <w:pStyle w:val="a9"/>
+        <w:numPr>
+          <w:ilvl w:val="0"/>
+          <w:numId w:val="31"/>
+        </w:numPr>
+        <w:rPr>
+          <w:rFonts w:ascii="Times New Roman" w:eastAsia="宋体" w:hAnsi="Times New Roman" w:cs="Times New Roman"/>
+        </w:rPr>
+      </w:pPr>
+      <w:r>
+        <w:rPr>
+          <w:rFonts w:ascii="Times New Roman" w:eastAsia="宋体" w:hAnsi="Times New Roman" w:cs="Times New Roman" w:hint="eastAsia"/>
+        </w:rPr>
+        <w:t>微调新建地图时可视边界数值</w:t>
+      </w:r>
+    </w:p>
+    <w:p>
+      <w:pPr>
+        <w:pStyle w:val="a9"/>
+        <w:numPr>
+          <w:ilvl w:val="0"/>
+          <w:numId w:val="31"/>
+        </w:numPr>
+        <w:rPr>
+          <w:rFonts w:ascii="Times New Roman" w:eastAsia="宋体" w:hAnsi="Times New Roman" w:cs="Times New Roman"/>
+        </w:rPr>
+      </w:pPr>
+      <w:r>
+        <w:rPr>
+          <w:rFonts w:ascii="Times New Roman" w:eastAsia="宋体" w:hAnsi="Times New Roman" w:cs="Times New Roman" w:hint="eastAsia"/>
+        </w:rPr>
+        <w:t>修复平坦地形工具无法平坦地图边缘斜坡的</w:t>
+      </w:r>
+      <w:r>
+        <w:rPr>
+          <w:rFonts w:ascii="Times New Roman" w:eastAsia="宋体" w:hAnsi="Times New Roman" w:cs="Times New Roman" w:hint="eastAsia"/>
+        </w:rPr>
+        <w:t>bug</w:t>
+      </w:r>
+    </w:p>
+    <w:p>
+      <w:pPr>
+        <w:pStyle w:val="a9"/>
+        <w:numPr>
+          <w:ilvl w:val="0"/>
+          <w:numId w:val="31"/>
+        </w:numPr>
+        <w:rPr>
+          <w:rFonts w:ascii="Times New Roman" w:eastAsia="宋体" w:hAnsi="Times New Roman" w:cs="Times New Roman"/>
+        </w:rPr>
+      </w:pPr>
+      <w:r>
+        <w:rPr>
+          <w:rFonts w:ascii="Times New Roman" w:eastAsia="宋体" w:hAnsi="Times New Roman" w:cs="Times New Roman" w:hint="eastAsia"/>
+        </w:rPr>
+        <w:t>绘制连接地形可以将鼠标移动到地图边界外，更方便靠近边界的绘制</w:t>
+      </w:r>
+    </w:p>
+    <w:p>
+      <w:pPr>
+        <w:pStyle w:val="a9"/>
+        <w:numPr>
+          <w:ilvl w:val="0"/>
+          <w:numId w:val="31"/>
+        </w:numPr>
+        <w:rPr>
+          <w:rFonts w:ascii="Times New Roman" w:eastAsia="宋体" w:hAnsi="Times New Roman" w:cs="Times New Roman"/>
+        </w:rPr>
+      </w:pPr>
+      <w:r>
+        <w:rPr>
+          <w:rFonts w:ascii="Times New Roman" w:eastAsia="宋体" w:hAnsi="Times New Roman" w:cs="Times New Roman" w:hint="eastAsia"/>
+        </w:rPr>
+        <w:t>优化</w:t>
+      </w:r>
+      <w:r>
+        <w:rPr>
+          <w:rFonts w:ascii="Times New Roman" w:eastAsia="宋体" w:hAnsi="Times New Roman" w:cs="Times New Roman" w:hint="eastAsia"/>
+        </w:rPr>
+        <w:t>IsoMapPack5</w:t>
+      </w:r>
+      <w:r>
+        <w:rPr>
+          <w:rFonts w:ascii="Times New Roman" w:eastAsia="宋体" w:hAnsi="Times New Roman" w:cs="Times New Roman" w:hint="eastAsia"/>
+        </w:rPr>
+        <w:t>压缩，减少地图体积，减少游戏内大地图地形异常的可能</w:t>
+      </w:r>
+    </w:p>
+    <w:p>
+      <w:pPr>
+        <w:pStyle w:val="a9"/>
+        <w:numPr>
+          <w:ilvl w:val="0"/>
+          <w:numId w:val="31"/>
+        </w:numPr>
+        <w:rPr>
+          <w:rFonts w:ascii="Times New Roman" w:eastAsia="宋体" w:hAnsi="Times New Roman" w:cs="Times New Roman"/>
+        </w:rPr>
+      </w:pPr>
+      <w:r>
+        <w:rPr>
+          <w:rFonts w:ascii="Times New Roman" w:eastAsia="宋体" w:hAnsi="Times New Roman" w:cs="Times New Roman" w:hint="eastAsia"/>
+        </w:rPr>
+        <w:t>修复调整地图大小后隧道位置错误的</w:t>
+      </w:r>
+      <w:r>
+        <w:rPr>
+          <w:rFonts w:ascii="Times New Roman" w:eastAsia="宋体" w:hAnsi="Times New Roman" w:cs="Times New Roman" w:hint="eastAsia"/>
+        </w:rPr>
+        <w:t>bug</w:t>
+      </w:r>
+    </w:p>
+    <w:p>
+      <w:pPr>
+        <w:pStyle w:val="a9"/>
+        <w:numPr>
+          <w:ilvl w:val="0"/>
+          <w:numId w:val="31"/>
+        </w:numPr>
+        <w:rPr>
+          <w:rFonts w:ascii="Times New Roman" w:eastAsia="宋体" w:hAnsi="Times New Roman" w:cs="Times New Roman"/>
+        </w:rPr>
+      </w:pPr>
+      <w:r>
+        <w:rPr>
+          <w:rFonts w:ascii="Times New Roman" w:eastAsia="宋体" w:hAnsi="Times New Roman" w:cs="Times New Roman" w:hint="eastAsia"/>
+        </w:rPr>
+        <w:t>修复了在开启输入法和部分情况下在地图界面按</w:t>
+      </w:r>
+      <w:r>
+        <w:rPr>
+          <w:rFonts w:ascii="Times New Roman" w:eastAsia="宋体" w:hAnsi="Times New Roman" w:cs="Times New Roman" w:hint="eastAsia"/>
+        </w:rPr>
+        <w:t>D</w:t>
+      </w:r>
+      <w:r>
+        <w:rPr>
+          <w:rFonts w:ascii="Times New Roman" w:eastAsia="宋体" w:hAnsi="Times New Roman" w:cs="Times New Roman" w:hint="eastAsia"/>
+        </w:rPr>
+        <w:t>、</w:t>
+      </w:r>
+      <w:r>
+        <w:rPr>
+          <w:rFonts w:ascii="Times New Roman" w:eastAsia="宋体" w:hAnsi="Times New Roman" w:cs="Times New Roman" w:hint="eastAsia"/>
+        </w:rPr>
+        <w:t>[</w:t>
+      </w:r>
+      <w:r>
+        <w:rPr>
+          <w:rFonts w:ascii="Times New Roman" w:eastAsia="宋体" w:hAnsi="Times New Roman" w:cs="Times New Roman" w:hint="eastAsia"/>
+        </w:rPr>
+        <w:t>、</w:t>
+      </w:r>
+      <w:r>
+        <w:rPr>
+          <w:rFonts w:ascii="Times New Roman" w:eastAsia="宋体" w:hAnsi="Times New Roman" w:cs="Times New Roman" w:hint="eastAsia"/>
+        </w:rPr>
+        <w:t>]</w:t>
+      </w:r>
+      <w:r>
+        <w:rPr>
+          <w:rFonts w:ascii="Times New Roman" w:eastAsia="宋体" w:hAnsi="Times New Roman" w:cs="Times New Roman" w:hint="eastAsia"/>
+        </w:rPr>
+        <w:t>键无效的</w:t>
+      </w:r>
+      <w:r>
+        <w:rPr>
+          <w:rFonts w:ascii="Times New Roman" w:eastAsia="宋体" w:hAnsi="Times New Roman" w:cs="Times New Roman" w:hint="eastAsia"/>
+        </w:rPr>
+        <w:t>bug</w:t>
+      </w:r>
+    </w:p>
+    <w:p>
+      <w:pPr>
+        <w:pStyle w:val="a9"/>
+        <w:numPr>
+          <w:ilvl w:val="0"/>
+          <w:numId w:val="31"/>
+        </w:numPr>
+        <w:rPr>
+          <w:rFonts w:ascii="Times New Roman" w:eastAsia="宋体" w:hAnsi="Times New Roman" w:cs="Times New Roman"/>
+        </w:rPr>
+      </w:pPr>
+      <w:r>
+        <w:rPr>
+          <w:rFonts w:ascii="Times New Roman" w:eastAsia="宋体" w:hAnsi="Times New Roman" w:cs="Times New Roman" w:hint="eastAsia"/>
+        </w:rPr>
+        <w:t>修复了新城市下使用绘制悬崖后部工具时，按</w:t>
+      </w:r>
+      <w:r>
+        <w:rPr>
+          <w:rFonts w:ascii="Times New Roman" w:eastAsia="宋体" w:hAnsi="Times New Roman" w:cs="Times New Roman" w:hint="eastAsia"/>
+        </w:rPr>
+        <w:t>A</w:t>
+      </w:r>
+      <w:r>
+        <w:rPr>
+          <w:rFonts w:ascii="Times New Roman" w:eastAsia="宋体" w:hAnsi="Times New Roman" w:cs="Times New Roman" w:hint="eastAsia"/>
+        </w:rPr>
+        <w:t>键无法切换悬崖类型的</w:t>
+      </w:r>
+      <w:r>
+        <w:rPr>
+          <w:rFonts w:ascii="Times New Roman" w:eastAsia="宋体" w:hAnsi="Times New Roman" w:cs="Times New Roman" w:hint="eastAsia"/>
+        </w:rPr>
+        <w:t>bug</w:t>
+      </w:r>
+    </w:p>
+    <w:p>
+      <w:pPr>
+        <w:pStyle w:val="a9"/>
+        <w:numPr>
+          <w:ilvl w:val="0"/>
+          <w:numId w:val="31"/>
+        </w:numPr>
+        <w:rPr>
+          <w:rFonts w:ascii="Times New Roman" w:eastAsia="宋体" w:hAnsi="Times New Roman" w:cs="Times New Roman"/>
+        </w:rPr>
+      </w:pPr>
+      <w:r>
+        <w:rPr>
+          <w:rFonts w:ascii="Times New Roman" w:eastAsia="宋体" w:hAnsi="Times New Roman" w:cs="Times New Roman" w:hint="eastAsia"/>
+        </w:rPr>
+        <w:t>增强绘制悬崖工具，可以在不同地图类型的</w:t>
+      </w:r>
+      <w:r>
+        <w:rPr>
+          <w:rFonts w:ascii="Times New Roman" w:eastAsia="宋体" w:hAnsi="Times New Roman" w:cs="Times New Roman" w:hint="eastAsia"/>
+        </w:rPr>
+        <w:t>[TheaterInfo]</w:t>
+      </w:r>
+      <w:r>
+        <w:rPr>
+          <w:rFonts w:ascii="Times New Roman" w:eastAsia="宋体" w:hAnsi="Times New Roman" w:cs="Times New Roman" w:hint="eastAsia"/>
+        </w:rPr>
+        <w:t>（如</w:t>
+      </w:r>
+      <w:r>
+        <w:rPr>
+          <w:rFonts w:ascii="Times New Roman" w:eastAsia="宋体" w:hAnsi="Times New Roman" w:cs="Times New Roman" w:hint="eastAsia"/>
+        </w:rPr>
+        <w:t>[SnowInfo]</w:t>
+      </w:r>
+      <w:r>
+        <w:rPr>
+          <w:rFonts w:ascii="Times New Roman" w:eastAsia="宋体" w:hAnsi="Times New Roman" w:cs="Times New Roman" w:hint="eastAsia"/>
+        </w:rPr>
+        <w:t>）中填写</w:t>
+      </w:r>
+      <w:r>
+        <w:rPr>
+          <w:rFonts w:ascii="Times New Roman" w:eastAsia="宋体" w:hAnsi="Times New Roman" w:cs="Times New Roman" w:hint="eastAsia"/>
+        </w:rPr>
+        <w:t>Cliffs2</w:t>
+      </w:r>
+      <w:r>
+        <w:rPr>
+          <w:rFonts w:ascii="Times New Roman" w:eastAsia="宋体" w:hAnsi="Times New Roman" w:cs="Times New Roman" w:hint="eastAsia"/>
+        </w:rPr>
+        <w:t>、</w:t>
+      </w:r>
+      <w:r>
+        <w:rPr>
+          <w:rFonts w:ascii="Times New Roman" w:eastAsia="宋体" w:hAnsi="Times New Roman" w:cs="Times New Roman" w:hint="eastAsia"/>
+        </w:rPr>
+        <w:t>CliffsWater2</w:t>
+      </w:r>
+      <w:r>
+        <w:rPr>
+          <w:rFonts w:ascii="Times New Roman" w:eastAsia="宋体" w:hAnsi="Times New Roman" w:cs="Times New Roman" w:hint="eastAsia"/>
+        </w:rPr>
+        <w:t>以支持悬崖类型切换；在存在月球悬崖时，支持绘制月球悬崖</w:t>
+      </w:r>
+    </w:p>
+    <w:p>
+      <w:pPr>
+        <w:pStyle w:val="a9"/>
+        <w:numPr>
+          <w:ilvl w:val="0"/>
+          <w:numId w:val="31"/>
+        </w:numPr>
+        <w:rPr>
+          <w:rFonts w:ascii="Times New Roman" w:eastAsia="宋体" w:hAnsi="Times New Roman" w:cs="Times New Roman"/>
+        </w:rPr>
+      </w:pPr>
+      <w:r>
+        <w:rPr>
+          <w:rFonts w:ascii="Times New Roman" w:eastAsia="宋体" w:hAnsi="Times New Roman" w:cs="Times New Roman" w:hint="eastAsia"/>
+        </w:rPr>
+        <w:t>支持</w:t>
+      </w:r>
+      <w:r>
+        <w:rPr>
+          <w:rFonts w:ascii="Times New Roman" w:eastAsia="宋体" w:hAnsi="Times New Roman" w:cs="Times New Roman" w:hint="eastAsia"/>
+        </w:rPr>
+        <w:t>32</w:t>
+      </w:r>
+      <w:r>
+        <w:rPr>
+          <w:rFonts w:ascii="Times New Roman" w:eastAsia="宋体" w:hAnsi="Times New Roman" w:cs="Times New Roman" w:hint="eastAsia"/>
+        </w:rPr>
+        <w:t>向面向</w:t>
+      </w:r>
+      <w:r>
+        <w:rPr>
+          <w:rFonts w:ascii="Times New Roman" w:eastAsia="宋体" w:hAnsi="Times New Roman" w:cs="Times New Roman" w:hint="eastAsia"/>
+        </w:rPr>
+        <w:t>与拖拽</w:t>
+      </w:r>
+      <w:r>
+        <w:rPr>
+          <w:rFonts w:ascii="Times New Roman" w:eastAsia="宋体" w:hAnsi="Times New Roman" w:cs="Times New Roman" w:hint="eastAsia"/>
+        </w:rPr>
+        <w:t>，详见</w:t>
+      </w:r>
+      <w:r>
+        <w:rPr>
+          <w:rFonts w:ascii="Times New Roman" w:eastAsia="宋体" w:hAnsi="Times New Roman" w:cs="Times New Roman" w:hint="eastAsia"/>
+        </w:rPr>
+        <w:t>ExtFacings</w:t>
+      </w:r>
+      <w:r>
+        <w:rPr>
+          <w:rFonts w:ascii="Times New Roman" w:eastAsia="宋体" w:hAnsi="Times New Roman" w:cs="Times New Roman" w:hint="eastAsia"/>
+        </w:rPr>
+        <w:t>与</w:t>
+      </w:r>
+      <w:r>
+        <w:rPr>
+          <w:rFonts w:ascii="Times New Roman" w:eastAsia="宋体" w:hAnsi="Times New Roman" w:cs="Times New Roman" w:hint="eastAsia"/>
+        </w:rPr>
+        <w:t>ExtFacings.Drag</w:t>
+      </w:r>
+    </w:p>
+    <w:p>
+      <w:pPr>
+        <w:pStyle w:val="a9"/>
+        <w:numPr>
+          <w:ilvl w:val="0"/>
+          <w:numId w:val="31"/>
+        </w:numPr>
+        <w:rPr>
+          <w:rFonts w:ascii="Times New Roman" w:eastAsia="宋体" w:hAnsi="Times New Roman" w:cs="Times New Roman"/>
+        </w:rPr>
+      </w:pPr>
+      <w:r>
+        <w:rPr>
+          <w:rFonts w:ascii="Times New Roman" w:eastAsia="宋体" w:hAnsi="Times New Roman" w:cs="Times New Roman" w:hint="eastAsia"/>
+        </w:rPr>
+        <w:t>重写部分字符串类型，优化字符串加载稳定性</w:t>
+      </w:r>
+    </w:p>
+    <w:p>
+      <w:pPr>
+        <w:pStyle w:val="a9"/>
+        <w:numPr>
+          <w:ilvl w:val="0"/>
+          <w:numId w:val="31"/>
+        </w:numPr>
+        <w:rPr>
+          <w:rFonts w:ascii="Times New Roman" w:eastAsia="宋体" w:hAnsi="Times New Roman" w:cs="Times New Roman"/>
+        </w:rPr>
+      </w:pPr>
+      <w:r>
+        <w:rPr>
+          <w:rFonts w:ascii="Times New Roman" w:eastAsia="宋体" w:hAnsi="Times New Roman" w:cs="Times New Roman" w:hint="eastAsia"/>
+        </w:rPr>
+        <w:t>优化抬升</w:t>
+      </w:r>
+      <w:r>
+        <w:rPr>
+          <w:rFonts w:ascii="Times New Roman" w:eastAsia="宋体" w:hAnsi="Times New Roman" w:cs="Times New Roman" w:hint="eastAsia"/>
+        </w:rPr>
+        <w:t>/</w:t>
+      </w:r>
+      <w:r>
+        <w:rPr>
+          <w:rFonts w:ascii="Times New Roman" w:eastAsia="宋体" w:hAnsi="Times New Roman" w:cs="Times New Roman" w:hint="eastAsia"/>
+        </w:rPr>
+        <w:t>降低地表算法，不会出现异常的大范围变动</w:t>
+      </w:r>
+    </w:p>
+    <w:p>
+      <w:pPr>
+        <w:pStyle w:val="a9"/>
+        <w:numPr>
+          <w:ilvl w:val="0"/>
+          <w:numId w:val="31"/>
+        </w:numPr>
+        <w:rPr>
+          <w:rFonts w:ascii="Times New Roman" w:eastAsia="宋体" w:hAnsi="Times New Roman" w:cs="Times New Roman"/>
+        </w:rPr>
+      </w:pPr>
+      <w:r>
+        <w:rPr>
+          <w:rFonts w:ascii="Times New Roman" w:eastAsia="宋体" w:hAnsi="Times New Roman" w:cs="Times New Roman" w:hint="eastAsia"/>
+        </w:rPr>
+        <w:t>FA2sp.log</w:t>
+      </w:r>
+      <w:r>
+        <w:rPr>
+          <w:rFonts w:ascii="Times New Roman" w:eastAsia="宋体" w:hAnsi="Times New Roman" w:cs="Times New Roman" w:hint="eastAsia"/>
+        </w:rPr>
+        <w:t>使用</w:t>
+      </w:r>
+      <w:r>
+        <w:rPr>
+          <w:rFonts w:ascii="Times New Roman" w:eastAsia="宋体" w:hAnsi="Times New Roman" w:cs="Times New Roman" w:hint="eastAsia"/>
+        </w:rPr>
+        <w:t>UTF8</w:t>
+      </w:r>
+      <w:r>
+        <w:rPr>
+          <w:rFonts w:ascii="Times New Roman" w:eastAsia="宋体" w:hAnsi="Times New Roman" w:cs="Times New Roman" w:hint="eastAsia"/>
+        </w:rPr>
+        <w:t>编码</w:t>
+      </w:r>
+    </w:p>
+    <w:p>
+      <w:pPr>
+        <w:pStyle w:val="a9"/>
+        <w:numPr>
+          <w:ilvl w:val="0"/>
+          <w:numId w:val="31"/>
+        </w:numPr>
+        <w:rPr>
+          <w:rFonts w:ascii="Times New Roman" w:eastAsia="宋体" w:hAnsi="Times New Roman" w:cs="Times New Roman"/>
+        </w:rPr>
+      </w:pPr>
+      <w:r>
+        <w:rPr>
+          <w:rFonts w:ascii="Times New Roman" w:eastAsia="宋体" w:hAnsi="Times New Roman" w:cs="Times New Roman" w:hint="eastAsia"/>
+        </w:rPr>
+        <w:t>保存地图时可以维持已有的</w:t>
+      </w:r>
+      <w:r>
+        <w:rPr>
+          <w:rFonts w:ascii="Times New Roman" w:eastAsia="宋体" w:hAnsi="Times New Roman" w:cs="Times New Roman" w:hint="eastAsia"/>
+        </w:rPr>
+        <w:t>ini</w:t>
+      </w:r>
+      <w:r>
+        <w:rPr>
+          <w:rFonts w:ascii="Times New Roman" w:eastAsia="宋体" w:hAnsi="Times New Roman" w:cs="Times New Roman" w:hint="eastAsia"/>
+        </w:rPr>
+        <w:t>小节顺序，详见</w:t>
+      </w:r>
+      <w:r>
+        <w:rPr>
+          <w:rFonts w:ascii="Times New Roman" w:eastAsia="宋体" w:hAnsi="Times New Roman" w:cs="Times New Roman" w:hint="eastAsia"/>
+        </w:rPr>
+        <w:t>SaveMap.PreserveINISorting</w:t>
+      </w:r>
+    </w:p>
+    <w:p>
+      <w:pPr>
+        <w:pStyle w:val="a9"/>
+        <w:numPr>
+          <w:ilvl w:val="0"/>
+          <w:numId w:val="31"/>
+        </w:numPr>
+        <w:rPr>
+          <w:rFonts w:ascii="Times New Roman" w:eastAsia="宋体" w:hAnsi="Times New Roman" w:cs="Times New Roman"/>
+        </w:rPr>
+      </w:pPr>
+      <w:r>
+        <w:rPr>
+          <w:rFonts w:ascii="Times New Roman" w:eastAsia="宋体" w:hAnsi="Times New Roman" w:cs="Times New Roman" w:hint="eastAsia"/>
+        </w:rPr>
+        <w:t>重写撤销重做系统，所有撤销动作均支持完整重做</w:t>
+      </w:r>
+    </w:p>
+    <w:p>
+      <w:pPr>
+        <w:pStyle w:val="a9"/>
+        <w:numPr>
+          <w:ilvl w:val="0"/>
+          <w:numId w:val="31"/>
+        </w:numPr>
+        <w:rPr>
+          <w:rFonts w:ascii="Times New Roman" w:eastAsia="宋体" w:hAnsi="Times New Roman" w:cs="Times New Roman"/>
+        </w:rPr>
+      </w:pPr>
+      <w:r>
+        <w:rPr>
+          <w:rFonts w:ascii="Times New Roman" w:eastAsia="宋体" w:hAnsi="Times New Roman" w:cs="Times New Roman" w:hint="eastAsia"/>
+        </w:rPr>
+        <w:t>撤销重做系统能够记录游戏对象的修改历史，详见</w:t>
+      </w:r>
+      <w:r>
+        <w:rPr>
+          <w:rFonts w:ascii="Times New Roman" w:eastAsia="宋体" w:hAnsi="Times New Roman" w:cs="Times New Roman" w:hint="eastAsia"/>
+        </w:rPr>
+        <w:t>UndoRedo.RecordObjects</w:t>
+      </w:r>
+    </w:p>
+    <w:p>
+      <w:pPr>
+        <w:pStyle w:val="a9"/>
+        <w:numPr>
+          <w:ilvl w:val="0"/>
+          <w:numId w:val="31"/>
+        </w:numPr>
+        <w:rPr>
+          <w:rFonts w:ascii="Times New Roman" w:eastAsia="宋体" w:hAnsi="Times New Roman" w:cs="Times New Roman"/>
+        </w:rPr>
+      </w:pPr>
+      <w:r>
+        <w:rPr>
+          <w:rFonts w:ascii="Times New Roman" w:eastAsia="宋体" w:hAnsi="Times New Roman" w:cs="Times New Roman" w:hint="eastAsia"/>
+        </w:rPr>
+        <w:t>支持设置</w:t>
+      </w:r>
+      <w:r>
+        <w:rPr>
+          <w:rFonts w:ascii="Times New Roman" w:eastAsia="宋体" w:hAnsi="Times New Roman" w:cs="Times New Roman" w:hint="eastAsia"/>
+        </w:rPr>
+        <w:t>RubblePalette</w:t>
+      </w:r>
+      <w:r>
+        <w:rPr>
+          <w:rFonts w:ascii="Times New Roman" w:eastAsia="宋体" w:hAnsi="Times New Roman" w:cs="Times New Roman" w:hint="eastAsia"/>
+        </w:rPr>
+        <w:t>=</w:t>
+      </w:r>
+      <w:r>
+        <w:rPr>
+          <w:rFonts w:ascii="Times New Roman" w:eastAsia="宋体" w:hAnsi="Times New Roman" w:cs="Times New Roman" w:hint="eastAsia"/>
+        </w:rPr>
+        <w:t>指定建筑废墟色盘</w:t>
+      </w:r>
+    </w:p>
+    <w:p>
+      <w:pPr>
+        <w:pStyle w:val="a9"/>
+        <w:numPr>
+          <w:ilvl w:val="0"/>
+          <w:numId w:val="31"/>
+        </w:numPr>
+        <w:rPr>
+          <w:rFonts w:ascii="Times New Roman" w:eastAsia="宋体" w:hAnsi="Times New Roman" w:cs="Times New Roman"/>
+        </w:rPr>
+      </w:pPr>
+      <w:r>
+        <w:rPr>
+          <w:rFonts w:ascii="Times New Roman" w:eastAsia="宋体" w:hAnsi="Times New Roman" w:cs="Times New Roman" w:hint="eastAsia"/>
+        </w:rPr>
+        <w:t>提升稳定性</w:t>
+      </w:r>
+    </w:p>
+    <w:p>
+      <w:pPr>
+        <w:pStyle w:val="a9"/>
+        <w:numPr>
+          <w:ilvl w:val="0"/>
+          <w:numId w:val="31"/>
+        </w:numPr>
+        <w:rPr>
+          <w:rFonts w:ascii="Times New Roman" w:eastAsia="宋体" w:hAnsi="Times New Roman" w:cs="Times New Roman"/>
+        </w:rPr>
+      </w:pPr>
+      <w:r>
+        <w:rPr>
+          <w:rFonts w:ascii="Times New Roman" w:eastAsia="宋体" w:hAnsi="Times New Roman" w:cs="Times New Roman" w:hint="eastAsia"/>
+        </w:rPr>
+        <w:t>优化素材图像内存占用</w:t>
+      </w:r>
+    </w:p>
+    <w:p>
+      <w:pPr>
+        <w:pStyle w:val="a9"/>
+        <w:numPr>
+          <w:ilvl w:val="0"/>
+          <w:numId w:val="31"/>
+        </w:numPr>
+        <w:rPr>
+          <w:rFonts w:ascii="Times New Roman" w:eastAsia="宋体" w:hAnsi="Times New Roman" w:cs="Times New Roman"/>
+        </w:rPr>
+      </w:pPr>
+      <w:r>
+        <w:rPr>
+          <w:rFonts w:ascii="Times New Roman" w:eastAsia="宋体" w:hAnsi="Times New Roman" w:cs="Times New Roman" w:hint="eastAsia"/>
+        </w:rPr>
+        <w:t>重写</w:t>
+      </w:r>
+      <w:r>
+        <w:rPr>
+          <w:rFonts w:ascii="Times New Roman" w:eastAsia="宋体" w:hAnsi="Times New Roman" w:cs="Times New Roman" w:hint="eastAsia"/>
+        </w:rPr>
+        <w:t>mix</w:t>
+      </w:r>
+      <w:r>
+        <w:rPr>
+          <w:rFonts w:ascii="Times New Roman" w:eastAsia="宋体" w:hAnsi="Times New Roman" w:cs="Times New Roman" w:hint="eastAsia"/>
+        </w:rPr>
+        <w:t>加载逻辑，修复加载中的内存泄漏</w:t>
+      </w:r>
+      <w:r>
+        <w:rPr>
+          <w:rFonts w:ascii="Times New Roman" w:eastAsia="宋体" w:hAnsi="Times New Roman" w:cs="Times New Roman" w:hint="eastAsia"/>
+        </w:rPr>
+        <w:t>，详见</w:t>
+      </w:r>
+      <w:r>
+        <w:rPr>
+          <w:rFonts w:ascii="Times New Roman" w:eastAsia="宋体" w:hAnsi="Times New Roman" w:cs="Times New Roman" w:hint="eastAsia"/>
+        </w:rPr>
+        <w:t>ExtMixLoader</w:t>
+      </w:r>
+    </w:p>
+    <w:p>
+      <w:pPr>
+        <w:pStyle w:val="a9"/>
+        <w:numPr>
+          <w:ilvl w:val="0"/>
+          <w:numId w:val="31"/>
+        </w:numPr>
+        <w:rPr>
+          <w:rFonts w:ascii="Times New Roman" w:eastAsia="宋体" w:hAnsi="Times New Roman" w:cs="Times New Roman"/>
+        </w:rPr>
+      </w:pPr>
+      <w:r>
+        <w:rPr>
+          <w:rFonts w:ascii="Times New Roman" w:eastAsia="宋体" w:hAnsi="Times New Roman" w:cs="Times New Roman" w:hint="eastAsia"/>
+        </w:rPr>
+        <w:t>新增</w:t>
+      </w:r>
+      <w:r>
+        <w:rPr>
+          <w:rFonts w:ascii="Times New Roman" w:eastAsia="宋体" w:hAnsi="Times New Roman" w:cs="Times New Roman" w:hint="eastAsia"/>
+        </w:rPr>
+        <w:t>DDrawScalingBilinear.OnlyShrink</w:t>
+      </w:r>
+      <w:r>
+        <w:rPr>
+          <w:rFonts w:ascii="Times New Roman" w:eastAsia="宋体" w:hAnsi="Times New Roman" w:cs="Times New Roman" w:hint="eastAsia"/>
+        </w:rPr>
+        <w:t>，支持仅在缩小时使用双线性插值，放大时硬边缘放大</w:t>
+      </w:r>
+    </w:p>
+    <w:p>
+      <w:pPr>
+        <w:pStyle w:val="a9"/>
+        <w:numPr>
+          <w:ilvl w:val="0"/>
+          <w:numId w:val="31"/>
+        </w:numPr>
+        <w:rPr>
+          <w:rFonts w:ascii="Times New Roman" w:eastAsia="宋体" w:hAnsi="Times New Roman" w:cs="Times New Roman"/>
+        </w:rPr>
+      </w:pPr>
+      <w:r>
+        <w:rPr>
+          <w:rFonts w:ascii="Times New Roman" w:eastAsia="宋体" w:hAnsi="Times New Roman" w:cs="Times New Roman" w:hint="eastAsia"/>
+        </w:rPr>
+        <w:t>优化绘图性能</w:t>
+      </w:r>
+    </w:p>
+    <w:p>
+      <w:pPr>
+        <w:pStyle w:val="a9"/>
+        <w:numPr>
+          <w:ilvl w:val="0"/>
+          <w:numId w:val="31"/>
+        </w:numPr>
+        <w:rPr>
+          <w:rFonts w:ascii="Times New Roman" w:eastAsia="宋体" w:hAnsi="Times New Roman" w:cs="Times New Roman"/>
+        </w:rPr>
+      </w:pPr>
+      <w:r>
+        <w:rPr>
+          <w:rFonts w:ascii="Times New Roman" w:eastAsia="宋体" w:hAnsi="Times New Roman" w:cs="Times New Roman" w:hint="eastAsia"/>
+        </w:rPr>
+        <w:t>重写</w:t>
+      </w:r>
+      <w:r>
+        <w:rPr>
+          <w:rFonts w:ascii="Times New Roman" w:eastAsia="宋体" w:hAnsi="Times New Roman" w:cs="Times New Roman" w:hint="eastAsia"/>
+        </w:rPr>
+        <w:t>ini</w:t>
+      </w:r>
+      <w:r>
+        <w:rPr>
+          <w:rFonts w:ascii="Times New Roman" w:eastAsia="宋体" w:hAnsi="Times New Roman" w:cs="Times New Roman" w:hint="eastAsia"/>
+        </w:rPr>
+        <w:t>加载逻辑，加载</w:t>
+      </w:r>
+      <w:r>
+        <w:rPr>
+          <w:rFonts w:ascii="Times New Roman" w:eastAsia="宋体" w:hAnsi="Times New Roman" w:cs="Times New Roman" w:hint="eastAsia"/>
+        </w:rPr>
+        <w:t>ini</w:t>
+      </w:r>
+      <w:r>
+        <w:rPr>
+          <w:rFonts w:ascii="Times New Roman" w:eastAsia="宋体" w:hAnsi="Times New Roman" w:cs="Times New Roman" w:hint="eastAsia"/>
+        </w:rPr>
+        <w:t>不会再释放至游戏目录，新建国家等操作可以即时生效</w:t>
+      </w:r>
+    </w:p>
+    <w:p>
+      <w:pPr>
+        <w:pStyle w:val="a9"/>
+        <w:numPr>
+          <w:ilvl w:val="0"/>
+          <w:numId w:val="31"/>
+        </w:numPr>
+        <w:rPr>
+          <w:rFonts w:ascii="Times New Roman" w:eastAsia="宋体" w:hAnsi="Times New Roman" w:cs="Times New Roman"/>
+        </w:rPr>
+      </w:pPr>
+      <w:r>
+        <w:rPr>
+          <w:rFonts w:ascii="Times New Roman" w:eastAsia="宋体" w:hAnsi="Times New Roman" w:cs="Times New Roman" w:hint="eastAsia"/>
+        </w:rPr>
+        <w:t>ini [#include]</w:t>
+      </w:r>
+      <w:r>
+        <w:rPr>
+          <w:rFonts w:ascii="Times New Roman" w:eastAsia="宋体" w:hAnsi="Times New Roman" w:cs="Times New Roman" w:hint="eastAsia"/>
+        </w:rPr>
+        <w:t>逻辑现遵循</w:t>
+      </w:r>
+      <w:r>
+        <w:rPr>
+          <w:rFonts w:ascii="Times New Roman" w:eastAsia="宋体" w:hAnsi="Times New Roman" w:cs="Times New Roman" w:hint="eastAsia"/>
+        </w:rPr>
+        <w:t>ares</w:t>
+      </w:r>
+      <w:r>
+        <w:rPr>
+          <w:rFonts w:ascii="Times New Roman" w:eastAsia="宋体" w:hAnsi="Times New Roman" w:cs="Times New Roman" w:hint="eastAsia"/>
+        </w:rPr>
+        <w:t>规则，为广度优先遍历而非深度优先遍历</w:t>
+      </w:r>
+    </w:p>
+    <w:p>
+      <w:pPr>
+        <w:pStyle w:val="a9"/>
+        <w:numPr>
+          <w:ilvl w:val="0"/>
+          <w:numId w:val="31"/>
+        </w:numPr>
+        <w:rPr>
+          <w:rFonts w:ascii="Times New Roman" w:eastAsia="宋体" w:hAnsi="Times New Roman" w:cs="Times New Roman"/>
+        </w:rPr>
+      </w:pPr>
+      <w:r>
+        <w:rPr>
+          <w:rFonts w:ascii="Times New Roman" w:eastAsia="宋体" w:hAnsi="Times New Roman" w:cs="Times New Roman" w:hint="eastAsia"/>
+        </w:rPr>
+        <w:t>修复了触发编辑器的参数在部分情况下没有正确刷新的</w:t>
+      </w:r>
+      <w:r>
+        <w:rPr>
+          <w:rFonts w:ascii="Times New Roman" w:eastAsia="宋体" w:hAnsi="Times New Roman" w:cs="Times New Roman" w:hint="eastAsia"/>
+        </w:rPr>
+        <w:t>bug</w:t>
+      </w:r>
+    </w:p>
+    <w:p>
+      <w:pPr>
+        <w:pStyle w:val="a9"/>
+        <w:numPr>
+          <w:ilvl w:val="0"/>
+          <w:numId w:val="31"/>
+        </w:numPr>
+        <w:rPr>
+          <w:rFonts w:ascii="Times New Roman" w:eastAsia="宋体" w:hAnsi="Times New Roman" w:cs="Times New Roman"/>
+        </w:rPr>
+      </w:pPr>
+      <w:r>
+        <w:rPr>
+          <w:rFonts w:ascii="Times New Roman" w:eastAsia="宋体" w:hAnsi="Times New Roman" w:cs="Times New Roman" w:hint="eastAsia"/>
+        </w:rPr>
         <w:lastRenderedPageBreak/>
-        <w:t>Lua</w:t>
-      </w:r>
-      <w:r>
-        <w:rPr>
-          <w:rFonts w:ascii="Times New Roman" w:eastAsia="宋体" w:hAnsi="Times New Roman" w:cs="Times New Roman" w:hint="eastAsia"/>
-        </w:rPr>
-        <w:t>脚本终端支持搜索脚本文件</w:t>
+        <w:t>支持拖拽面向的实时预览，详见</w:t>
+      </w:r>
+      <w:r>
+        <w:rPr>
+          <w:rFonts w:ascii="Times New Roman" w:eastAsia="宋体" w:hAnsi="Times New Roman" w:cs="Times New Roman" w:hint="eastAsia"/>
+        </w:rPr>
+        <w:t>ExtFacings.DragPreview</w:t>
       </w:r>
     </w:p>
     <w:p>
@@ -9751,973 +10778,6 @@
         <w:rPr>
           <w:rFonts w:ascii="Times New Roman" w:eastAsia="宋体" w:hAnsi="Times New Roman" w:cs="Times New Roman" w:hint="eastAsia"/>
         </w:rPr>
-        <w:t>微调地图边界细蓝线的位置</w:t>
-      </w:r>
-    </w:p>
-    <w:p>
-      <w:pPr>
-        <w:pStyle w:val="a9"/>
-        <w:numPr>
-          <w:ilvl w:val="0"/>
-          <w:numId w:val="31"/>
-        </w:numPr>
-        <w:rPr>
-          <w:rFonts w:ascii="Times New Roman" w:eastAsia="宋体" w:hAnsi="Times New Roman" w:cs="Times New Roman"/>
-        </w:rPr>
-      </w:pPr>
-      <w:r>
-        <w:rPr>
-          <w:rFonts w:ascii="Times New Roman" w:eastAsia="宋体" w:hAnsi="Times New Roman" w:cs="Times New Roman" w:hint="eastAsia"/>
-        </w:rPr>
-        <w:t>修复了</w:t>
-      </w:r>
-      <w:r>
-        <w:rPr>
-          <w:rFonts w:ascii="Times New Roman" w:eastAsia="宋体" w:hAnsi="Times New Roman" w:cs="Times New Roman" w:hint="eastAsia"/>
-        </w:rPr>
-        <w:t>Vxl</w:t>
-      </w:r>
-      <w:r>
-        <w:rPr>
-          <w:rFonts w:ascii="Times New Roman" w:eastAsia="宋体" w:hAnsi="Times New Roman" w:cs="Times New Roman" w:hint="eastAsia"/>
-        </w:rPr>
-        <w:t>车辆</w:t>
-      </w:r>
-      <w:r>
-        <w:rPr>
-          <w:rFonts w:ascii="Times New Roman" w:eastAsia="宋体" w:hAnsi="Times New Roman" w:cs="Times New Roman" w:hint="eastAsia"/>
-        </w:rPr>
-        <w:t>Noshadow=yes</w:t>
-      </w:r>
-      <w:r>
-        <w:rPr>
-          <w:rFonts w:ascii="Times New Roman" w:eastAsia="宋体" w:hAnsi="Times New Roman" w:cs="Times New Roman" w:hint="eastAsia"/>
-        </w:rPr>
-        <w:t>时仍会显示阴影的</w:t>
-      </w:r>
-      <w:r>
-        <w:rPr>
-          <w:rFonts w:ascii="Times New Roman" w:eastAsia="宋体" w:hAnsi="Times New Roman" w:cs="Times New Roman" w:hint="eastAsia"/>
-        </w:rPr>
-        <w:t>bug</w:t>
-      </w:r>
-    </w:p>
-    <w:p>
-      <w:pPr>
-        <w:pStyle w:val="a9"/>
-        <w:numPr>
-          <w:ilvl w:val="0"/>
-          <w:numId w:val="31"/>
-        </w:numPr>
-        <w:rPr>
-          <w:rFonts w:ascii="Times New Roman" w:eastAsia="宋体" w:hAnsi="Times New Roman" w:cs="Times New Roman"/>
-        </w:rPr>
-      </w:pPr>
-      <w:r>
-        <w:rPr>
-          <w:rFonts w:ascii="Times New Roman" w:eastAsia="宋体" w:hAnsi="Times New Roman" w:cs="Times New Roman" w:hint="eastAsia"/>
-        </w:rPr>
-        <w:t>修复部分情况下绘制连接地形上升、下降段高度错误的</w:t>
-      </w:r>
-      <w:r>
-        <w:rPr>
-          <w:rFonts w:ascii="Times New Roman" w:eastAsia="宋体" w:hAnsi="Times New Roman" w:cs="Times New Roman" w:hint="eastAsia"/>
-        </w:rPr>
-        <w:t>bug</w:t>
-      </w:r>
-    </w:p>
-    <w:p>
-      <w:pPr>
-        <w:pStyle w:val="a9"/>
-        <w:numPr>
-          <w:ilvl w:val="0"/>
-          <w:numId w:val="31"/>
-        </w:numPr>
-        <w:rPr>
-          <w:rFonts w:ascii="Times New Roman" w:eastAsia="宋体" w:hAnsi="Times New Roman" w:cs="Times New Roman"/>
-        </w:rPr>
-      </w:pPr>
-      <w:r>
-        <w:rPr>
-          <w:rFonts w:ascii="Times New Roman" w:eastAsia="宋体" w:hAnsi="Times New Roman" w:cs="Times New Roman" w:hint="eastAsia"/>
-        </w:rPr>
-        <w:t>优化光照沙盒切换时的性能</w:t>
-      </w:r>
-    </w:p>
-    <w:p>
-      <w:pPr>
-        <w:pStyle w:val="a9"/>
-        <w:numPr>
-          <w:ilvl w:val="0"/>
-          <w:numId w:val="31"/>
-        </w:numPr>
-        <w:rPr>
-          <w:rFonts w:ascii="Times New Roman" w:eastAsia="宋体" w:hAnsi="Times New Roman" w:cs="Times New Roman"/>
-        </w:rPr>
-      </w:pPr>
-      <w:r>
-        <w:rPr>
-          <w:rFonts w:ascii="Times New Roman" w:eastAsia="宋体" w:hAnsi="Times New Roman" w:cs="Times New Roman" w:hint="eastAsia"/>
-        </w:rPr>
-        <w:t>新增</w:t>
-      </w:r>
-      <w:r>
-        <w:rPr>
-          <w:rFonts w:ascii="Times New Roman" w:eastAsia="宋体" w:hAnsi="Times New Roman" w:cs="Times New Roman" w:hint="eastAsia"/>
-        </w:rPr>
-        <w:t>LightingPreview</w:t>
-      </w:r>
-      <w:r>
-        <w:rPr>
-          <w:rFonts w:ascii="Times New Roman" w:eastAsia="宋体" w:hAnsi="Times New Roman" w:cs="Times New Roman" w:hint="eastAsia"/>
-        </w:rPr>
-        <w:t>.</w:t>
-      </w:r>
-      <w:r>
-        <w:rPr>
-          <w:rFonts w:ascii="Times New Roman" w:eastAsia="宋体" w:hAnsi="Times New Roman" w:cs="Times New Roman" w:hint="eastAsia"/>
-        </w:rPr>
-        <w:t>Tint</w:t>
-      </w:r>
-      <w:r>
-        <w:rPr>
-          <w:rFonts w:ascii="Times New Roman" w:eastAsia="宋体" w:hAnsi="Times New Roman" w:cs="Times New Roman" w:hint="eastAsia"/>
-        </w:rPr>
-        <w:t>TileSetBrowserView</w:t>
-      </w:r>
-      <w:r>
-        <w:rPr>
-          <w:rFonts w:ascii="Times New Roman" w:eastAsia="宋体" w:hAnsi="Times New Roman" w:cs="Times New Roman" w:hint="eastAsia"/>
-        </w:rPr>
-        <w:t>，控制是否按光照沙盒渲染地形浏览器图像</w:t>
-      </w:r>
-    </w:p>
-    <w:p>
-      <w:pPr>
-        <w:pStyle w:val="a9"/>
-        <w:numPr>
-          <w:ilvl w:val="0"/>
-          <w:numId w:val="31"/>
-        </w:numPr>
-        <w:rPr>
-          <w:rFonts w:ascii="Times New Roman" w:eastAsia="宋体" w:hAnsi="Times New Roman" w:cs="Times New Roman"/>
-        </w:rPr>
-      </w:pPr>
-      <w:r>
-        <w:rPr>
-          <w:rFonts w:ascii="Times New Roman" w:eastAsia="宋体" w:hAnsi="Times New Roman" w:cs="Times New Roman" w:hint="eastAsia"/>
-        </w:rPr>
-        <w:t>新增距离标尺，可以记录当前鼠标位置距离上次按下左键位置的距离，记录历史数量见</w:t>
-      </w:r>
-      <w:r>
-        <w:rPr>
-          <w:rFonts w:ascii="Times New Roman" w:eastAsia="宋体" w:hAnsi="Times New Roman" w:cs="Times New Roman" w:hint="eastAsia"/>
-        </w:rPr>
-        <w:t>DistanceRuler.Records</w:t>
-      </w:r>
-    </w:p>
-    <w:p>
-      <w:pPr>
-        <w:pStyle w:val="a9"/>
-        <w:numPr>
-          <w:ilvl w:val="0"/>
-          <w:numId w:val="31"/>
-        </w:numPr>
-        <w:rPr>
-          <w:rFonts w:ascii="Times New Roman" w:eastAsia="宋体" w:hAnsi="Times New Roman" w:cs="Times New Roman"/>
-        </w:rPr>
-      </w:pPr>
-      <w:r>
-        <w:rPr>
-          <w:rFonts w:ascii="Times New Roman" w:eastAsia="宋体" w:hAnsi="Times New Roman" w:cs="Times New Roman" w:hint="eastAsia"/>
-        </w:rPr>
-        <w:t>微调新建地图时可视边界数值</w:t>
-      </w:r>
-    </w:p>
-    <w:p>
-      <w:pPr>
-        <w:pStyle w:val="a9"/>
-        <w:numPr>
-          <w:ilvl w:val="0"/>
-          <w:numId w:val="31"/>
-        </w:numPr>
-        <w:rPr>
-          <w:rFonts w:ascii="Times New Roman" w:eastAsia="宋体" w:hAnsi="Times New Roman" w:cs="Times New Roman"/>
-        </w:rPr>
-      </w:pPr>
-      <w:r>
-        <w:rPr>
-          <w:rFonts w:ascii="Times New Roman" w:eastAsia="宋体" w:hAnsi="Times New Roman" w:cs="Times New Roman" w:hint="eastAsia"/>
-        </w:rPr>
-        <w:t>修复平坦地形工具无法平坦地图边缘斜坡的</w:t>
-      </w:r>
-      <w:r>
-        <w:rPr>
-          <w:rFonts w:ascii="Times New Roman" w:eastAsia="宋体" w:hAnsi="Times New Roman" w:cs="Times New Roman" w:hint="eastAsia"/>
-        </w:rPr>
-        <w:t>bug</w:t>
-      </w:r>
-    </w:p>
-    <w:p>
-      <w:pPr>
-        <w:pStyle w:val="a9"/>
-        <w:numPr>
-          <w:ilvl w:val="0"/>
-          <w:numId w:val="31"/>
-        </w:numPr>
-        <w:rPr>
-          <w:rFonts w:ascii="Times New Roman" w:eastAsia="宋体" w:hAnsi="Times New Roman" w:cs="Times New Roman"/>
-        </w:rPr>
-      </w:pPr>
-      <w:r>
-        <w:rPr>
-          <w:rFonts w:ascii="Times New Roman" w:eastAsia="宋体" w:hAnsi="Times New Roman" w:cs="Times New Roman" w:hint="eastAsia"/>
-        </w:rPr>
-        <w:t>绘制连接地形可以将鼠标移动到地图边界外，更方便靠近边界的绘制</w:t>
-      </w:r>
-    </w:p>
-    <w:p>
-      <w:pPr>
-        <w:pStyle w:val="a9"/>
-        <w:numPr>
-          <w:ilvl w:val="0"/>
-          <w:numId w:val="31"/>
-        </w:numPr>
-        <w:rPr>
-          <w:rFonts w:ascii="Times New Roman" w:eastAsia="宋体" w:hAnsi="Times New Roman" w:cs="Times New Roman"/>
-        </w:rPr>
-      </w:pPr>
-      <w:r>
-        <w:rPr>
-          <w:rFonts w:ascii="Times New Roman" w:eastAsia="宋体" w:hAnsi="Times New Roman" w:cs="Times New Roman" w:hint="eastAsia"/>
-        </w:rPr>
-        <w:t>优化</w:t>
-      </w:r>
-      <w:r>
-        <w:rPr>
-          <w:rFonts w:ascii="Times New Roman" w:eastAsia="宋体" w:hAnsi="Times New Roman" w:cs="Times New Roman" w:hint="eastAsia"/>
-        </w:rPr>
-        <w:t>IsoMapPack5</w:t>
-      </w:r>
-      <w:r>
-        <w:rPr>
-          <w:rFonts w:ascii="Times New Roman" w:eastAsia="宋体" w:hAnsi="Times New Roman" w:cs="Times New Roman" w:hint="eastAsia"/>
-        </w:rPr>
-        <w:t>压缩，减少地图体积，减少游戏内大地图地形异常的可能</w:t>
-      </w:r>
-    </w:p>
-    <w:p>
-      <w:pPr>
-        <w:pStyle w:val="a9"/>
-        <w:numPr>
-          <w:ilvl w:val="0"/>
-          <w:numId w:val="31"/>
-        </w:numPr>
-        <w:rPr>
-          <w:rFonts w:ascii="Times New Roman" w:eastAsia="宋体" w:hAnsi="Times New Roman" w:cs="Times New Roman"/>
-        </w:rPr>
-      </w:pPr>
-      <w:r>
-        <w:rPr>
-          <w:rFonts w:ascii="Times New Roman" w:eastAsia="宋体" w:hAnsi="Times New Roman" w:cs="Times New Roman" w:hint="eastAsia"/>
-        </w:rPr>
-        <w:t>修复调整地图大小后隧道位置错误的</w:t>
-      </w:r>
-      <w:r>
-        <w:rPr>
-          <w:rFonts w:ascii="Times New Roman" w:eastAsia="宋体" w:hAnsi="Times New Roman" w:cs="Times New Roman" w:hint="eastAsia"/>
-        </w:rPr>
-        <w:t>bug</w:t>
-      </w:r>
-    </w:p>
-    <w:p>
-      <w:pPr>
-        <w:pStyle w:val="a9"/>
-        <w:numPr>
-          <w:ilvl w:val="0"/>
-          <w:numId w:val="31"/>
-        </w:numPr>
-        <w:rPr>
-          <w:rFonts w:ascii="Times New Roman" w:eastAsia="宋体" w:hAnsi="Times New Roman" w:cs="Times New Roman"/>
-        </w:rPr>
-      </w:pPr>
-      <w:r>
-        <w:rPr>
-          <w:rFonts w:ascii="Times New Roman" w:eastAsia="宋体" w:hAnsi="Times New Roman" w:cs="Times New Roman" w:hint="eastAsia"/>
-        </w:rPr>
-        <w:t>修复了在开启输入法和部分情况下在地图界面按</w:t>
-      </w:r>
-      <w:r>
-        <w:rPr>
-          <w:rFonts w:ascii="Times New Roman" w:eastAsia="宋体" w:hAnsi="Times New Roman" w:cs="Times New Roman" w:hint="eastAsia"/>
-        </w:rPr>
-        <w:t>D</w:t>
-      </w:r>
-      <w:r>
-        <w:rPr>
-          <w:rFonts w:ascii="Times New Roman" w:eastAsia="宋体" w:hAnsi="Times New Roman" w:cs="Times New Roman" w:hint="eastAsia"/>
-        </w:rPr>
-        <w:t>、</w:t>
-      </w:r>
-      <w:r>
-        <w:rPr>
-          <w:rFonts w:ascii="Times New Roman" w:eastAsia="宋体" w:hAnsi="Times New Roman" w:cs="Times New Roman" w:hint="eastAsia"/>
-        </w:rPr>
-        <w:t>[</w:t>
-      </w:r>
-      <w:r>
-        <w:rPr>
-          <w:rFonts w:ascii="Times New Roman" w:eastAsia="宋体" w:hAnsi="Times New Roman" w:cs="Times New Roman" w:hint="eastAsia"/>
-        </w:rPr>
-        <w:t>、</w:t>
-      </w:r>
-      <w:r>
-        <w:rPr>
-          <w:rFonts w:ascii="Times New Roman" w:eastAsia="宋体" w:hAnsi="Times New Roman" w:cs="Times New Roman" w:hint="eastAsia"/>
-        </w:rPr>
-        <w:t>]</w:t>
-      </w:r>
-      <w:r>
-        <w:rPr>
-          <w:rFonts w:ascii="Times New Roman" w:eastAsia="宋体" w:hAnsi="Times New Roman" w:cs="Times New Roman" w:hint="eastAsia"/>
-        </w:rPr>
-        <w:t>键无效的</w:t>
-      </w:r>
-      <w:r>
-        <w:rPr>
-          <w:rFonts w:ascii="Times New Roman" w:eastAsia="宋体" w:hAnsi="Times New Roman" w:cs="Times New Roman" w:hint="eastAsia"/>
-        </w:rPr>
-        <w:t>bug</w:t>
-      </w:r>
-    </w:p>
-    <w:p>
-      <w:pPr>
-        <w:pStyle w:val="a9"/>
-        <w:numPr>
-          <w:ilvl w:val="0"/>
-          <w:numId w:val="31"/>
-        </w:numPr>
-        <w:rPr>
-          <w:rFonts w:ascii="Times New Roman" w:eastAsia="宋体" w:hAnsi="Times New Roman" w:cs="Times New Roman"/>
-        </w:rPr>
-      </w:pPr>
-      <w:r>
-        <w:rPr>
-          <w:rFonts w:ascii="Times New Roman" w:eastAsia="宋体" w:hAnsi="Times New Roman" w:cs="Times New Roman" w:hint="eastAsia"/>
-        </w:rPr>
-        <w:t>修复了新城市下使用绘制悬崖后部工具时，按</w:t>
-      </w:r>
-      <w:r>
-        <w:rPr>
-          <w:rFonts w:ascii="Times New Roman" w:eastAsia="宋体" w:hAnsi="Times New Roman" w:cs="Times New Roman" w:hint="eastAsia"/>
-        </w:rPr>
-        <w:t>A</w:t>
-      </w:r>
-      <w:r>
-        <w:rPr>
-          <w:rFonts w:ascii="Times New Roman" w:eastAsia="宋体" w:hAnsi="Times New Roman" w:cs="Times New Roman" w:hint="eastAsia"/>
-        </w:rPr>
-        <w:t>键无法切换悬崖类型的</w:t>
-      </w:r>
-      <w:r>
-        <w:rPr>
-          <w:rFonts w:ascii="Times New Roman" w:eastAsia="宋体" w:hAnsi="Times New Roman" w:cs="Times New Roman" w:hint="eastAsia"/>
-        </w:rPr>
-        <w:t>bug</w:t>
-      </w:r>
-    </w:p>
-    <w:p>
-      <w:pPr>
-        <w:pStyle w:val="a9"/>
-        <w:numPr>
-          <w:ilvl w:val="0"/>
-          <w:numId w:val="31"/>
-        </w:numPr>
-        <w:rPr>
-          <w:rFonts w:ascii="Times New Roman" w:eastAsia="宋体" w:hAnsi="Times New Roman" w:cs="Times New Roman"/>
-        </w:rPr>
-      </w:pPr>
-      <w:r>
-        <w:rPr>
-          <w:rFonts w:ascii="Times New Roman" w:eastAsia="宋体" w:hAnsi="Times New Roman" w:cs="Times New Roman" w:hint="eastAsia"/>
-        </w:rPr>
-        <w:t>增强绘制悬崖工具，可以在不同地图类型的</w:t>
-      </w:r>
-      <w:r>
-        <w:rPr>
-          <w:rFonts w:ascii="Times New Roman" w:eastAsia="宋体" w:hAnsi="Times New Roman" w:cs="Times New Roman" w:hint="eastAsia"/>
-        </w:rPr>
-        <w:t>[TheaterInfo]</w:t>
-      </w:r>
-      <w:r>
-        <w:rPr>
-          <w:rFonts w:ascii="Times New Roman" w:eastAsia="宋体" w:hAnsi="Times New Roman" w:cs="Times New Roman" w:hint="eastAsia"/>
-        </w:rPr>
-        <w:t>（如</w:t>
-      </w:r>
-      <w:r>
-        <w:rPr>
-          <w:rFonts w:ascii="Times New Roman" w:eastAsia="宋体" w:hAnsi="Times New Roman" w:cs="Times New Roman" w:hint="eastAsia"/>
-        </w:rPr>
-        <w:t>[SnowInfo]</w:t>
-      </w:r>
-      <w:r>
-        <w:rPr>
-          <w:rFonts w:ascii="Times New Roman" w:eastAsia="宋体" w:hAnsi="Times New Roman" w:cs="Times New Roman" w:hint="eastAsia"/>
-        </w:rPr>
-        <w:t>）中填写</w:t>
-      </w:r>
-      <w:r>
-        <w:rPr>
-          <w:rFonts w:ascii="Times New Roman" w:eastAsia="宋体" w:hAnsi="Times New Roman" w:cs="Times New Roman" w:hint="eastAsia"/>
-        </w:rPr>
-        <w:t>Cliffs2</w:t>
-      </w:r>
-      <w:r>
-        <w:rPr>
-          <w:rFonts w:ascii="Times New Roman" w:eastAsia="宋体" w:hAnsi="Times New Roman" w:cs="Times New Roman" w:hint="eastAsia"/>
-        </w:rPr>
-        <w:t>、</w:t>
-      </w:r>
-      <w:r>
-        <w:rPr>
-          <w:rFonts w:ascii="Times New Roman" w:eastAsia="宋体" w:hAnsi="Times New Roman" w:cs="Times New Roman" w:hint="eastAsia"/>
-        </w:rPr>
-        <w:t>CliffsWater2</w:t>
-      </w:r>
-      <w:r>
-        <w:rPr>
-          <w:rFonts w:ascii="Times New Roman" w:eastAsia="宋体" w:hAnsi="Times New Roman" w:cs="Times New Roman" w:hint="eastAsia"/>
-        </w:rPr>
-        <w:t>以支持悬崖类型切换；在存在月球悬崖时，支持绘制月球悬崖</w:t>
-      </w:r>
-    </w:p>
-    <w:p>
-      <w:pPr>
-        <w:pStyle w:val="a9"/>
-        <w:numPr>
-          <w:ilvl w:val="0"/>
-          <w:numId w:val="31"/>
-        </w:numPr>
-        <w:rPr>
-          <w:rFonts w:ascii="Times New Roman" w:eastAsia="宋体" w:hAnsi="Times New Roman" w:cs="Times New Roman"/>
-        </w:rPr>
-      </w:pPr>
-      <w:r>
-        <w:rPr>
-          <w:rFonts w:ascii="Times New Roman" w:eastAsia="宋体" w:hAnsi="Times New Roman" w:cs="Times New Roman" w:hint="eastAsia"/>
-        </w:rPr>
-        <w:t>支持</w:t>
-      </w:r>
-      <w:r>
-        <w:rPr>
-          <w:rFonts w:ascii="Times New Roman" w:eastAsia="宋体" w:hAnsi="Times New Roman" w:cs="Times New Roman" w:hint="eastAsia"/>
-        </w:rPr>
-        <w:t>32</w:t>
-      </w:r>
-      <w:r>
-        <w:rPr>
-          <w:rFonts w:ascii="Times New Roman" w:eastAsia="宋体" w:hAnsi="Times New Roman" w:cs="Times New Roman" w:hint="eastAsia"/>
-        </w:rPr>
-        <w:t>向面向</w:t>
-      </w:r>
-      <w:r>
-        <w:rPr>
-          <w:rFonts w:ascii="Times New Roman" w:eastAsia="宋体" w:hAnsi="Times New Roman" w:cs="Times New Roman" w:hint="eastAsia"/>
-        </w:rPr>
-        <w:t>与拖拽</w:t>
-      </w:r>
-      <w:r>
-        <w:rPr>
-          <w:rFonts w:ascii="Times New Roman" w:eastAsia="宋体" w:hAnsi="Times New Roman" w:cs="Times New Roman" w:hint="eastAsia"/>
-        </w:rPr>
-        <w:t>，详见</w:t>
-      </w:r>
-      <w:r>
-        <w:rPr>
-          <w:rFonts w:ascii="Times New Roman" w:eastAsia="宋体" w:hAnsi="Times New Roman" w:cs="Times New Roman" w:hint="eastAsia"/>
-        </w:rPr>
-        <w:t>ExtFacings</w:t>
-      </w:r>
-      <w:r>
-        <w:rPr>
-          <w:rFonts w:ascii="Times New Roman" w:eastAsia="宋体" w:hAnsi="Times New Roman" w:cs="Times New Roman" w:hint="eastAsia"/>
-        </w:rPr>
-        <w:t>与</w:t>
-      </w:r>
-      <w:r>
-        <w:rPr>
-          <w:rFonts w:ascii="Times New Roman" w:eastAsia="宋体" w:hAnsi="Times New Roman" w:cs="Times New Roman" w:hint="eastAsia"/>
-        </w:rPr>
-        <w:t>ExtFacings.Drag</w:t>
-      </w:r>
-    </w:p>
-    <w:p>
-      <w:pPr>
-        <w:pStyle w:val="a9"/>
-        <w:numPr>
-          <w:ilvl w:val="0"/>
-          <w:numId w:val="31"/>
-        </w:numPr>
-        <w:rPr>
-          <w:rFonts w:ascii="Times New Roman" w:eastAsia="宋体" w:hAnsi="Times New Roman" w:cs="Times New Roman"/>
-        </w:rPr>
-      </w:pPr>
-      <w:r>
-        <w:rPr>
-          <w:rFonts w:ascii="Times New Roman" w:eastAsia="宋体" w:hAnsi="Times New Roman" w:cs="Times New Roman" w:hint="eastAsia"/>
-        </w:rPr>
-        <w:t>重写部分字符串类型，优化字符串加载稳定性</w:t>
-      </w:r>
-    </w:p>
-    <w:p>
-      <w:pPr>
-        <w:pStyle w:val="a9"/>
-        <w:numPr>
-          <w:ilvl w:val="0"/>
-          <w:numId w:val="31"/>
-        </w:numPr>
-        <w:rPr>
-          <w:rFonts w:ascii="Times New Roman" w:eastAsia="宋体" w:hAnsi="Times New Roman" w:cs="Times New Roman"/>
-        </w:rPr>
-      </w:pPr>
-      <w:r>
-        <w:rPr>
-          <w:rFonts w:ascii="Times New Roman" w:eastAsia="宋体" w:hAnsi="Times New Roman" w:cs="Times New Roman" w:hint="eastAsia"/>
-        </w:rPr>
-        <w:t>优化抬升</w:t>
-      </w:r>
-      <w:r>
-        <w:rPr>
-          <w:rFonts w:ascii="Times New Roman" w:eastAsia="宋体" w:hAnsi="Times New Roman" w:cs="Times New Roman" w:hint="eastAsia"/>
-        </w:rPr>
-        <w:t>/</w:t>
-      </w:r>
-      <w:r>
-        <w:rPr>
-          <w:rFonts w:ascii="Times New Roman" w:eastAsia="宋体" w:hAnsi="Times New Roman" w:cs="Times New Roman" w:hint="eastAsia"/>
-        </w:rPr>
-        <w:t>降低地表算法，不会出现异常的大范围变动</w:t>
-      </w:r>
-    </w:p>
-    <w:p>
-      <w:pPr>
-        <w:pStyle w:val="a9"/>
-        <w:numPr>
-          <w:ilvl w:val="0"/>
-          <w:numId w:val="31"/>
-        </w:numPr>
-        <w:rPr>
-          <w:rFonts w:ascii="Times New Roman" w:eastAsia="宋体" w:hAnsi="Times New Roman" w:cs="Times New Roman"/>
-        </w:rPr>
-      </w:pPr>
-      <w:r>
-        <w:rPr>
-          <w:rFonts w:ascii="Times New Roman" w:eastAsia="宋体" w:hAnsi="Times New Roman" w:cs="Times New Roman" w:hint="eastAsia"/>
-        </w:rPr>
-        <w:t>FA2sp.log</w:t>
-      </w:r>
-      <w:r>
-        <w:rPr>
-          <w:rFonts w:ascii="Times New Roman" w:eastAsia="宋体" w:hAnsi="Times New Roman" w:cs="Times New Roman" w:hint="eastAsia"/>
-        </w:rPr>
-        <w:t>使用</w:t>
-      </w:r>
-      <w:r>
-        <w:rPr>
-          <w:rFonts w:ascii="Times New Roman" w:eastAsia="宋体" w:hAnsi="Times New Roman" w:cs="Times New Roman" w:hint="eastAsia"/>
-        </w:rPr>
-        <w:t>UTF8</w:t>
-      </w:r>
-      <w:r>
-        <w:rPr>
-          <w:rFonts w:ascii="Times New Roman" w:eastAsia="宋体" w:hAnsi="Times New Roman" w:cs="Times New Roman" w:hint="eastAsia"/>
-        </w:rPr>
-        <w:t>编码</w:t>
-      </w:r>
-    </w:p>
-    <w:p>
-      <w:pPr>
-        <w:pStyle w:val="a9"/>
-        <w:numPr>
-          <w:ilvl w:val="0"/>
-          <w:numId w:val="31"/>
-        </w:numPr>
-        <w:rPr>
-          <w:rFonts w:ascii="Times New Roman" w:eastAsia="宋体" w:hAnsi="Times New Roman" w:cs="Times New Roman"/>
-        </w:rPr>
-      </w:pPr>
-      <w:r>
-        <w:rPr>
-          <w:rFonts w:ascii="Times New Roman" w:eastAsia="宋体" w:hAnsi="Times New Roman" w:cs="Times New Roman" w:hint="eastAsia"/>
-        </w:rPr>
-        <w:t>保存地图时可以维持已有的</w:t>
-      </w:r>
-      <w:r>
-        <w:rPr>
-          <w:rFonts w:ascii="Times New Roman" w:eastAsia="宋体" w:hAnsi="Times New Roman" w:cs="Times New Roman" w:hint="eastAsia"/>
-        </w:rPr>
-        <w:t>ini</w:t>
-      </w:r>
-      <w:r>
-        <w:rPr>
-          <w:rFonts w:ascii="Times New Roman" w:eastAsia="宋体" w:hAnsi="Times New Roman" w:cs="Times New Roman" w:hint="eastAsia"/>
-        </w:rPr>
-        <w:t>小节顺序，详见</w:t>
-      </w:r>
-      <w:r>
-        <w:rPr>
-          <w:rFonts w:ascii="Times New Roman" w:eastAsia="宋体" w:hAnsi="Times New Roman" w:cs="Times New Roman" w:hint="eastAsia"/>
-        </w:rPr>
-        <w:t>SaveMap.PreserveINISorting</w:t>
-      </w:r>
-    </w:p>
-    <w:p>
-      <w:pPr>
-        <w:pStyle w:val="a9"/>
-        <w:numPr>
-          <w:ilvl w:val="0"/>
-          <w:numId w:val="31"/>
-        </w:numPr>
-        <w:rPr>
-          <w:rFonts w:ascii="Times New Roman" w:eastAsia="宋体" w:hAnsi="Times New Roman" w:cs="Times New Roman"/>
-        </w:rPr>
-      </w:pPr>
-      <w:r>
-        <w:rPr>
-          <w:rFonts w:ascii="Times New Roman" w:eastAsia="宋体" w:hAnsi="Times New Roman" w:cs="Times New Roman" w:hint="eastAsia"/>
-        </w:rPr>
-        <w:t>重写撤销重做系统，所有撤销动作均支持完整重做</w:t>
-      </w:r>
-    </w:p>
-    <w:p>
-      <w:pPr>
-        <w:pStyle w:val="a9"/>
-        <w:numPr>
-          <w:ilvl w:val="0"/>
-          <w:numId w:val="31"/>
-        </w:numPr>
-        <w:rPr>
-          <w:rFonts w:ascii="Times New Roman" w:eastAsia="宋体" w:hAnsi="Times New Roman" w:cs="Times New Roman"/>
-        </w:rPr>
-      </w:pPr>
-      <w:r>
-        <w:rPr>
-          <w:rFonts w:ascii="Times New Roman" w:eastAsia="宋体" w:hAnsi="Times New Roman" w:cs="Times New Roman" w:hint="eastAsia"/>
-        </w:rPr>
-        <w:t>撤销重做系统能够记录游戏对象的修改历史，详见</w:t>
-      </w:r>
-      <w:r>
-        <w:rPr>
-          <w:rFonts w:ascii="Times New Roman" w:eastAsia="宋体" w:hAnsi="Times New Roman" w:cs="Times New Roman" w:hint="eastAsia"/>
-        </w:rPr>
-        <w:t>UndoRedo.RecordObjects</w:t>
-      </w:r>
-    </w:p>
-    <w:p>
-      <w:pPr>
-        <w:pStyle w:val="a9"/>
-        <w:numPr>
-          <w:ilvl w:val="0"/>
-          <w:numId w:val="31"/>
-        </w:numPr>
-        <w:rPr>
-          <w:rFonts w:ascii="Times New Roman" w:eastAsia="宋体" w:hAnsi="Times New Roman" w:cs="Times New Roman"/>
-        </w:rPr>
-      </w:pPr>
-      <w:r>
-        <w:rPr>
-          <w:rFonts w:ascii="Times New Roman" w:eastAsia="宋体" w:hAnsi="Times New Roman" w:cs="Times New Roman" w:hint="eastAsia"/>
-        </w:rPr>
-        <w:t>支持设置</w:t>
-      </w:r>
-      <w:r>
-        <w:rPr>
-          <w:rFonts w:ascii="Times New Roman" w:eastAsia="宋体" w:hAnsi="Times New Roman" w:cs="Times New Roman" w:hint="eastAsia"/>
-        </w:rPr>
-        <w:t>RubblePalette</w:t>
-      </w:r>
-      <w:r>
-        <w:rPr>
-          <w:rFonts w:ascii="Times New Roman" w:eastAsia="宋体" w:hAnsi="Times New Roman" w:cs="Times New Roman" w:hint="eastAsia"/>
-        </w:rPr>
-        <w:t>=</w:t>
-      </w:r>
-      <w:r>
-        <w:rPr>
-          <w:rFonts w:ascii="Times New Roman" w:eastAsia="宋体" w:hAnsi="Times New Roman" w:cs="Times New Roman" w:hint="eastAsia"/>
-        </w:rPr>
-        <w:t>指定建筑废墟色盘</w:t>
-      </w:r>
-    </w:p>
-    <w:p>
-      <w:pPr>
-        <w:pStyle w:val="a9"/>
-        <w:numPr>
-          <w:ilvl w:val="0"/>
-          <w:numId w:val="31"/>
-        </w:numPr>
-        <w:rPr>
-          <w:rFonts w:ascii="Times New Roman" w:eastAsia="宋体" w:hAnsi="Times New Roman" w:cs="Times New Roman"/>
-        </w:rPr>
-      </w:pPr>
-      <w:r>
-        <w:rPr>
-          <w:rFonts w:ascii="Times New Roman" w:eastAsia="宋体" w:hAnsi="Times New Roman" w:cs="Times New Roman" w:hint="eastAsia"/>
-        </w:rPr>
-        <w:t>提升稳定性</w:t>
-      </w:r>
-    </w:p>
-    <w:p>
-      <w:pPr>
-        <w:pStyle w:val="a9"/>
-        <w:numPr>
-          <w:ilvl w:val="0"/>
-          <w:numId w:val="31"/>
-        </w:numPr>
-        <w:rPr>
-          <w:rFonts w:ascii="Times New Roman" w:eastAsia="宋体" w:hAnsi="Times New Roman" w:cs="Times New Roman"/>
-        </w:rPr>
-      </w:pPr>
-      <w:r>
-        <w:rPr>
-          <w:rFonts w:ascii="Times New Roman" w:eastAsia="宋体" w:hAnsi="Times New Roman" w:cs="Times New Roman" w:hint="eastAsia"/>
-        </w:rPr>
-        <w:t>优化素材图像内存占用</w:t>
-      </w:r>
-    </w:p>
-    <w:p>
-      <w:pPr>
-        <w:pStyle w:val="a9"/>
-        <w:numPr>
-          <w:ilvl w:val="0"/>
-          <w:numId w:val="31"/>
-        </w:numPr>
-        <w:rPr>
-          <w:rFonts w:ascii="Times New Roman" w:eastAsia="宋体" w:hAnsi="Times New Roman" w:cs="Times New Roman"/>
-        </w:rPr>
-      </w:pPr>
-      <w:r>
-        <w:rPr>
-          <w:rFonts w:ascii="Times New Roman" w:eastAsia="宋体" w:hAnsi="Times New Roman" w:cs="Times New Roman" w:hint="eastAsia"/>
-        </w:rPr>
-        <w:t>重写</w:t>
-      </w:r>
-      <w:r>
-        <w:rPr>
-          <w:rFonts w:ascii="Times New Roman" w:eastAsia="宋体" w:hAnsi="Times New Roman" w:cs="Times New Roman" w:hint="eastAsia"/>
-        </w:rPr>
-        <w:t>mix</w:t>
-      </w:r>
-      <w:r>
-        <w:rPr>
-          <w:rFonts w:ascii="Times New Roman" w:eastAsia="宋体" w:hAnsi="Times New Roman" w:cs="Times New Roman" w:hint="eastAsia"/>
-        </w:rPr>
-        <w:t>加载逻辑，修复加载中的内存泄漏</w:t>
-      </w:r>
-      <w:r>
-        <w:rPr>
-          <w:rFonts w:ascii="Times New Roman" w:eastAsia="宋体" w:hAnsi="Times New Roman" w:cs="Times New Roman" w:hint="eastAsia"/>
-        </w:rPr>
-        <w:t>，详见</w:t>
-      </w:r>
-      <w:r>
-        <w:rPr>
-          <w:rFonts w:ascii="Times New Roman" w:eastAsia="宋体" w:hAnsi="Times New Roman" w:cs="Times New Roman" w:hint="eastAsia"/>
-        </w:rPr>
-        <w:t>ExtMixLoader</w:t>
-      </w:r>
-    </w:p>
-    <w:p>
-      <w:pPr>
-        <w:pStyle w:val="a9"/>
-        <w:numPr>
-          <w:ilvl w:val="0"/>
-          <w:numId w:val="31"/>
-        </w:numPr>
-        <w:rPr>
-          <w:rFonts w:ascii="Times New Roman" w:eastAsia="宋体" w:hAnsi="Times New Roman" w:cs="Times New Roman"/>
-        </w:rPr>
-      </w:pPr>
-      <w:r>
-        <w:rPr>
-          <w:rFonts w:ascii="Times New Roman" w:eastAsia="宋体" w:hAnsi="Times New Roman" w:cs="Times New Roman" w:hint="eastAsia"/>
-        </w:rPr>
-        <w:t>新增</w:t>
-      </w:r>
-      <w:r>
-        <w:rPr>
-          <w:rFonts w:ascii="Times New Roman" w:eastAsia="宋体" w:hAnsi="Times New Roman" w:cs="Times New Roman" w:hint="eastAsia"/>
-        </w:rPr>
-        <w:t>DDrawScalingBilinear.OnlyShrink</w:t>
-      </w:r>
-      <w:r>
-        <w:rPr>
-          <w:rFonts w:ascii="Times New Roman" w:eastAsia="宋体" w:hAnsi="Times New Roman" w:cs="Times New Roman" w:hint="eastAsia"/>
-        </w:rPr>
-        <w:t>，支持仅在缩小时使用双线性插值，放大时硬边缘放大</w:t>
-      </w:r>
-    </w:p>
-    <w:p>
-      <w:pPr>
-        <w:pStyle w:val="a9"/>
-        <w:numPr>
-          <w:ilvl w:val="0"/>
-          <w:numId w:val="31"/>
-        </w:numPr>
-        <w:rPr>
-          <w:rFonts w:ascii="Times New Roman" w:eastAsia="宋体" w:hAnsi="Times New Roman" w:cs="Times New Roman"/>
-        </w:rPr>
-      </w:pPr>
-      <w:r>
-        <w:rPr>
-          <w:rFonts w:ascii="Times New Roman" w:eastAsia="宋体" w:hAnsi="Times New Roman" w:cs="Times New Roman" w:hint="eastAsia"/>
-        </w:rPr>
-        <w:t>优化绘图性能</w:t>
-      </w:r>
-    </w:p>
-    <w:p>
-      <w:pPr>
-        <w:pStyle w:val="a9"/>
-        <w:numPr>
-          <w:ilvl w:val="0"/>
-          <w:numId w:val="31"/>
-        </w:numPr>
-        <w:rPr>
-          <w:rFonts w:ascii="Times New Roman" w:eastAsia="宋体" w:hAnsi="Times New Roman" w:cs="Times New Roman"/>
-        </w:rPr>
-      </w:pPr>
-      <w:r>
-        <w:rPr>
-          <w:rFonts w:ascii="Times New Roman" w:eastAsia="宋体" w:hAnsi="Times New Roman" w:cs="Times New Roman" w:hint="eastAsia"/>
-        </w:rPr>
-        <w:t>重写</w:t>
-      </w:r>
-      <w:r>
-        <w:rPr>
-          <w:rFonts w:ascii="Times New Roman" w:eastAsia="宋体" w:hAnsi="Times New Roman" w:cs="Times New Roman" w:hint="eastAsia"/>
-        </w:rPr>
-        <w:t>ini</w:t>
-      </w:r>
-      <w:r>
-        <w:rPr>
-          <w:rFonts w:ascii="Times New Roman" w:eastAsia="宋体" w:hAnsi="Times New Roman" w:cs="Times New Roman" w:hint="eastAsia"/>
-        </w:rPr>
-        <w:t>加载逻辑，加载</w:t>
-      </w:r>
-      <w:r>
-        <w:rPr>
-          <w:rFonts w:ascii="Times New Roman" w:eastAsia="宋体" w:hAnsi="Times New Roman" w:cs="Times New Roman" w:hint="eastAsia"/>
-        </w:rPr>
-        <w:t>ini</w:t>
-      </w:r>
-      <w:r>
-        <w:rPr>
-          <w:rFonts w:ascii="Times New Roman" w:eastAsia="宋体" w:hAnsi="Times New Roman" w:cs="Times New Roman" w:hint="eastAsia"/>
-        </w:rPr>
-        <w:t>不会再释放至游戏目录，新建国家等操作可以即时生效</w:t>
-      </w:r>
-    </w:p>
-    <w:p>
-      <w:pPr>
-        <w:pStyle w:val="a9"/>
-        <w:numPr>
-          <w:ilvl w:val="0"/>
-          <w:numId w:val="31"/>
-        </w:numPr>
-        <w:rPr>
-          <w:rFonts w:ascii="Times New Roman" w:eastAsia="宋体" w:hAnsi="Times New Roman" w:cs="Times New Roman"/>
-        </w:rPr>
-      </w:pPr>
-      <w:r>
-        <w:rPr>
-          <w:rFonts w:ascii="Times New Roman" w:eastAsia="宋体" w:hAnsi="Times New Roman" w:cs="Times New Roman" w:hint="eastAsia"/>
-        </w:rPr>
-        <w:t>ini [#include]</w:t>
-      </w:r>
-      <w:r>
-        <w:rPr>
-          <w:rFonts w:ascii="Times New Roman" w:eastAsia="宋体" w:hAnsi="Times New Roman" w:cs="Times New Roman" w:hint="eastAsia"/>
-        </w:rPr>
-        <w:t>逻辑现遵循</w:t>
-      </w:r>
-      <w:r>
-        <w:rPr>
-          <w:rFonts w:ascii="Times New Roman" w:eastAsia="宋体" w:hAnsi="Times New Roman" w:cs="Times New Roman" w:hint="eastAsia"/>
-        </w:rPr>
-        <w:t>ares</w:t>
-      </w:r>
-      <w:r>
-        <w:rPr>
-          <w:rFonts w:ascii="Times New Roman" w:eastAsia="宋体" w:hAnsi="Times New Roman" w:cs="Times New Roman" w:hint="eastAsia"/>
-        </w:rPr>
-        <w:t>规则，为广度优先遍历而非深度优先遍历</w:t>
-      </w:r>
-    </w:p>
-    <w:p>
-      <w:pPr>
-        <w:pStyle w:val="a9"/>
-        <w:numPr>
-          <w:ilvl w:val="0"/>
-          <w:numId w:val="31"/>
-        </w:numPr>
-        <w:rPr>
-          <w:rFonts w:ascii="Times New Roman" w:eastAsia="宋体" w:hAnsi="Times New Roman" w:cs="Times New Roman"/>
-        </w:rPr>
-      </w:pPr>
-      <w:r>
-        <w:rPr>
-          <w:rFonts w:ascii="Times New Roman" w:eastAsia="宋体" w:hAnsi="Times New Roman" w:cs="Times New Roman" w:hint="eastAsia"/>
-        </w:rPr>
-        <w:t>修复了触发编辑器的参数在部分情况下没有正确刷新的</w:t>
-      </w:r>
-      <w:r>
-        <w:rPr>
-          <w:rFonts w:ascii="Times New Roman" w:eastAsia="宋体" w:hAnsi="Times New Roman" w:cs="Times New Roman" w:hint="eastAsia"/>
-        </w:rPr>
-        <w:t>bug</w:t>
-      </w:r>
-    </w:p>
-    <w:p>
-      <w:pPr>
-        <w:pStyle w:val="a9"/>
-        <w:numPr>
-          <w:ilvl w:val="0"/>
-          <w:numId w:val="31"/>
-        </w:numPr>
-        <w:rPr>
-          <w:rFonts w:ascii="Times New Roman" w:eastAsia="宋体" w:hAnsi="Times New Roman" w:cs="Times New Roman"/>
-        </w:rPr>
-      </w:pPr>
-      <w:r>
-        <w:rPr>
-          <w:rFonts w:ascii="Times New Roman" w:eastAsia="宋体" w:hAnsi="Times New Roman" w:cs="Times New Roman" w:hint="eastAsia"/>
-        </w:rPr>
-        <w:t>支持拖拽面向的实时预览，详见</w:t>
-      </w:r>
-      <w:r>
-        <w:rPr>
-          <w:rFonts w:ascii="Times New Roman" w:eastAsia="宋体" w:hAnsi="Times New Roman" w:cs="Times New Roman" w:hint="eastAsia"/>
-        </w:rPr>
-        <w:t>ExtFacings.DragPreview</w:t>
-      </w:r>
-    </w:p>
-    <w:p>
-      <w:pPr>
-        <w:pStyle w:val="a9"/>
-        <w:numPr>
-          <w:ilvl w:val="0"/>
-          <w:numId w:val="31"/>
-        </w:numPr>
-        <w:rPr>
-          <w:rFonts w:ascii="Times New Roman" w:eastAsia="宋体" w:hAnsi="Times New Roman" w:cs="Times New Roman"/>
-        </w:rPr>
-      </w:pPr>
-      <w:r>
-        <w:rPr>
-          <w:rFonts w:ascii="Times New Roman" w:eastAsia="宋体" w:hAnsi="Times New Roman" w:cs="Times New Roman" w:hint="eastAsia"/>
-        </w:rPr>
-        <w:lastRenderedPageBreak/>
         <w:t>支持</w:t>
       </w:r>
       <w:r>
@@ -11738,7 +11798,14 @@
         <w:rPr>
           <w:rFonts w:ascii="Times New Roman" w:eastAsia="宋体" w:hAnsi="Times New Roman" w:cs="Times New Roman" w:hint="eastAsia"/>
         </w:rPr>
-        <w:t>键点击单元格时，会拾取单元格的地形块；若同时按住</w:t>
+        <w:t>键点击单元格时，会拾取单元格的地</w:t>
+      </w:r>
+      <w:r>
+        <w:rPr>
+          <w:rFonts w:ascii="Times New Roman" w:eastAsia="宋体" w:hAnsi="Times New Roman" w:cs="Times New Roman" w:hint="eastAsia"/>
+        </w:rPr>
+        <w:lastRenderedPageBreak/>
+        <w:t>形块；若同时按住</w:t>
       </w:r>
       <w:r>
         <w:rPr>
@@ -11768,7 +11835,6 @@
         <w:rPr>
           <w:rFonts w:ascii="Times New Roman" w:eastAsia="宋体" w:hAnsi="Times New Roman" w:cs="Times New Roman" w:hint="eastAsia"/>
         </w:rPr>
-        <w:lastRenderedPageBreak/>
         <w:t>全局搜索的“地图”选项支持搜索单位的关联标签</w:t>
       </w:r>
     </w:p>
@@ -12851,6 +12917,7 @@
         <w:rPr>
           <w:rFonts w:ascii="Times New Roman" w:eastAsia="宋体" w:hAnsi="Times New Roman" w:cs="Times New Roman" w:hint="eastAsia"/>
         </w:rPr>
+        <w:lastRenderedPageBreak/>
         <w:t>修复</w:t>
       </w:r>
       <w:r>
@@ -12887,7 +12954,6 @@
         <w:rPr>
           <w:rFonts w:ascii="Times New Roman" w:eastAsia="宋体" w:hAnsi="Times New Roman" w:cs="Times New Roman" w:hint="eastAsia"/>
         </w:rPr>
-        <w:lastRenderedPageBreak/>
         <w:t>支持在开启平面显示时隐藏</w:t>
       </w:r>
       <w:r>
@@ -13866,14 +13932,8 @@
         <w:rPr>
           <w:rFonts w:ascii="Times New Roman" w:eastAsia="宋体" w:hAnsi="Times New Roman" w:cs="Times New Roman" w:hint="eastAsia"/>
         </w:rPr>
-        <w:t>多选模式新增自定义添加与删除，可以在多个选项中自选条件，删除同类与同</w:t>
-      </w:r>
-      <w:r>
-        <w:rPr>
-          <w:rFonts w:ascii="Times New Roman" w:eastAsia="宋体" w:hAnsi="Times New Roman" w:cs="Times New Roman" w:hint="eastAsia"/>
-        </w:rPr>
         <w:lastRenderedPageBreak/>
-        <w:t>类相连添加和删除</w:t>
+        <w:t>多选模式新增自定义添加与删除，可以在多个选项中自选条件，删除同类与同类相连添加和删除</w:t>
       </w:r>
     </w:p>
     <w:p>
@@ -14891,6 +14951,7 @@
         <w:rPr>
           <w:rFonts w:ascii="Times New Roman" w:eastAsia="宋体" w:hAnsi="Times New Roman" w:cs="Times New Roman" w:hint="eastAsia"/>
         </w:rPr>
+        <w:lastRenderedPageBreak/>
         <w:t>修复了地形对象、污染重叠后再拖走不能正常显示的</w:t>
       </w:r>
       <w:r>
@@ -14915,7 +14976,6 @@
         <w:rPr>
           <w:rFonts w:ascii="Times New Roman" w:eastAsia="宋体" w:hAnsi="Times New Roman" w:cs="Times New Roman" w:hint="eastAsia"/>
         </w:rPr>
-        <w:lastRenderedPageBreak/>
         <w:t>多选模式添加同类相连多选功能，仅会选择相邻的同类地形；添加隐藏多选单元格功能</w:t>
       </w:r>
     </w:p>
@@ -15866,6 +15926,7 @@
         <w:rPr>
           <w:rFonts w:ascii="Times New Roman" w:eastAsia="宋体" w:hAnsi="Times New Roman" w:cs="Times New Roman" w:hint="eastAsia"/>
         </w:rPr>
+        <w:lastRenderedPageBreak/>
         <w:t>修复了部分情况下路径点</w:t>
       </w:r>
       <w:r>
@@ -15902,7 +15963,6 @@
         <w:rPr>
           <w:rFonts w:ascii="Times New Roman" w:eastAsia="宋体" w:hAnsi="Times New Roman" w:cs="Times New Roman" w:hint="eastAsia"/>
         </w:rPr>
-        <w:lastRenderedPageBreak/>
         <w:t>优化了灯光建筑较多时，光照沙盒模式的性能</w:t>
       </w:r>
     </w:p>
@@ -16811,6 +16871,7 @@
         <w:rPr>
           <w:rFonts w:ascii="Times New Roman" w:eastAsia="宋体" w:hAnsi="Times New Roman" w:cs="Times New Roman" w:hint="eastAsia"/>
         </w:rPr>
+        <w:lastRenderedPageBreak/>
         <w:t>支持直接读取</w:t>
       </w:r>
       <w:r>
@@ -16841,7 +16902,6 @@
         <w:rPr>
           <w:rFonts w:ascii="Times New Roman" w:eastAsia="宋体" w:hAnsi="Times New Roman" w:cs="Times New Roman" w:hint="eastAsia"/>
         </w:rPr>
-        <w:lastRenderedPageBreak/>
         <w:t>优化对象绘制次序，减少了建筑物不正常遮挡现象</w:t>
       </w:r>
     </w:p>
@@ -40284,7 +40344,7 @@
         <v:path o:extrusionok="f" gradientshapeok="t" o:connecttype="rect"/>
         <o:lock v:ext="edit" aspectratio="t"/>
       </v:shapetype>
-      <v:shape id="_x0000_i1035" type="#_x0000_t75" style="width:11.4pt;height:11.4pt" o:bullet="t">
+      <v:shape id="_x0000_i1033" type="#_x0000_t75" style="width:11.4pt;height:11.4pt" o:bullet="t">
         <v:imagedata r:id="rId1" o:title="mso9A9A"/>
       </v:shape>
     </w:pict>

</xml_diff>

<commit_message>
support BarrelAnimIsVoxel & VoxelBarrelFile
</commit_message>
<xml_diff>
--- a/Supplementary/文档/FA2SP HDM Edition说明文档.docx
+++ b/Supplementary/文档/FA2SP HDM Edition说明文档.docx
@@ -2100,6 +2100,68 @@
         <w:pStyle w:val="a9"/>
         <w:numPr>
           <w:ilvl w:val="0"/>
+          <w:numId w:val="11"/>
+        </w:numPr>
+        <w:rPr>
+          <w:rFonts w:ascii="Times New Roman" w:eastAsia="宋体" w:hAnsi="Times New Roman" w:cs="Times New Roman"/>
+          <w:kern w:val="0"/>
+          <w14:ligatures w14:val="none"/>
+        </w:rPr>
+      </w:pPr>
+      <w:r>
+        <w:rPr>
+          <w:rFonts w:ascii="Times New Roman" w:eastAsia="宋体" w:hAnsi="Times New Roman" w:cs="Times New Roman" w:hint="eastAsia"/>
+          <w:kern w:val="0"/>
+          <w14:ligatures w14:val="none"/>
+        </w:rPr>
+        <w:t>支持为</w:t>
+      </w:r>
+      <w:r>
+        <w:rPr>
+          <w:rFonts w:ascii="Times New Roman" w:eastAsia="宋体" w:hAnsi="Times New Roman" w:cs="Times New Roman" w:hint="eastAsia"/>
+          <w:kern w:val="0"/>
+          <w14:ligatures w14:val="none"/>
+        </w:rPr>
+        <w:t>BarrelAnimIsVoxel</w:t>
+      </w:r>
+      <w:r>
+        <w:rPr>
+          <w:rFonts w:ascii="Times New Roman" w:eastAsia="宋体" w:hAnsi="Times New Roman" w:cs="Times New Roman" w:hint="eastAsia"/>
+          <w:kern w:val="0"/>
+          <w14:ligatures w14:val="none"/>
+        </w:rPr>
+        <w:t>=yes</w:t>
+      </w:r>
+      <w:r>
+        <w:rPr>
+          <w:rFonts w:ascii="Times New Roman" w:eastAsia="宋体" w:hAnsi="Times New Roman" w:cs="Times New Roman" w:hint="eastAsia"/>
+          <w:kern w:val="0"/>
+          <w14:ligatures w14:val="none"/>
+        </w:rPr>
+        <w:t>且</w:t>
+      </w:r>
+      <w:r>
+        <w:rPr>
+          <w:rFonts w:ascii="Times New Roman" w:eastAsia="宋体" w:hAnsi="Times New Roman" w:cs="Times New Roman" w:hint="eastAsia"/>
+          <w:kern w:val="0"/>
+          <w14:ligatures w14:val="none"/>
+        </w:rPr>
+        <w:t>TurretAnimIsVoxel=false</w:t>
+      </w:r>
+      <w:r>
+        <w:rPr>
+          <w:rFonts w:ascii="Times New Roman" w:eastAsia="宋体" w:hAnsi="Times New Roman" w:cs="Times New Roman" w:hint="eastAsia"/>
+          <w:kern w:val="0"/>
+          <w14:ligatures w14:val="none"/>
+        </w:rPr>
+        <w:t>的建筑加载炮管</w:t>
+      </w:r>
+    </w:p>
+    <w:p>
+      <w:pPr>
+        <w:pStyle w:val="a9"/>
+        <w:numPr>
+          <w:ilvl w:val="0"/>
           <w:numId w:val="10"/>
         </w:numPr>
         <w:rPr>
@@ -2186,6 +2248,7 @@
         <w:rPr>
           <w:rFonts w:ascii="Times New Roman" w:eastAsia="宋体" w:hAnsi="Times New Roman" w:cs="Times New Roman" w:hint="eastAsia"/>
         </w:rPr>
+        <w:lastRenderedPageBreak/>
         <w:t>修复</w:t>
       </w:r>
       <w:r>
@@ -2222,7 +2285,6 @@
         <w:rPr>
           <w:rFonts w:ascii="Times New Roman" w:eastAsia="宋体" w:hAnsi="Times New Roman" w:cs="Times New Roman" w:hint="eastAsia"/>
         </w:rPr>
-        <w:lastRenderedPageBreak/>
         <w:t>修复附加单位绑定在建筑炮塔上时，无法跟随旋转的</w:t>
       </w:r>
       <w:r>
@@ -3195,6 +3257,7 @@
         <w:rPr>
           <w:rFonts w:ascii="Times New Roman" w:eastAsia="宋体" w:hAnsi="Times New Roman" w:cs="Times New Roman" w:hint="eastAsia"/>
         </w:rPr>
+        <w:lastRenderedPageBreak/>
         <w:t>修复部分</w:t>
       </w:r>
       <w:r>
@@ -3231,7 +3294,6 @@
         <w:rPr>
           <w:rFonts w:ascii="Times New Roman" w:eastAsia="宋体" w:hAnsi="Times New Roman" w:cs="Times New Roman" w:hint="eastAsia"/>
         </w:rPr>
-        <w:lastRenderedPageBreak/>
         <w:t>围墙覆盖物支持</w:t>
       </w:r>
       <w:r>
@@ -4180,6 +4242,7 @@
         <w:rPr>
           <w:rFonts w:ascii="Times New Roman" w:eastAsia="宋体" w:hAnsi="Times New Roman" w:cs="Times New Roman" w:hint="eastAsia"/>
         </w:rPr>
+        <w:lastRenderedPageBreak/>
         <w:t>物品浏览器</w:t>
       </w:r>
       <w:r>
@@ -4210,7 +4273,6 @@
         <w:rPr>
           <w:rFonts w:ascii="Times New Roman" w:eastAsia="宋体" w:hAnsi="Times New Roman" w:cs="Times New Roman" w:hint="eastAsia"/>
         </w:rPr>
-        <w:lastRenderedPageBreak/>
         <w:t>小队变更时会即时刷新</w:t>
       </w:r>
       <w:r>
@@ -5271,6 +5333,7 @@
         <w:rPr>
           <w:rFonts w:ascii="Times New Roman" w:eastAsia="宋体" w:hAnsi="Times New Roman" w:cs="Times New Roman" w:hint="eastAsia"/>
         </w:rPr>
+        <w:lastRenderedPageBreak/>
         <w:t>支持自定义拼接地形组</w:t>
       </w:r>
       <w:r>
@@ -5331,7 +5394,6 @@
         <w:rPr>
           <w:rFonts w:ascii="Times New Roman" w:eastAsia="宋体" w:hAnsi="Times New Roman" w:cs="Times New Roman" w:hint="eastAsia"/>
         </w:rPr>
-        <w:lastRenderedPageBreak/>
         <w:t>污染现在能正确被阴影遮挡</w:t>
       </w:r>
     </w:p>
@@ -6380,6 +6442,7 @@
         <w:rPr>
           <w:rFonts w:ascii="Times New Roman" w:eastAsia="宋体" w:hAnsi="Times New Roman" w:cs="Times New Roman" w:hint="eastAsia"/>
         </w:rPr>
+        <w:lastRenderedPageBreak/>
         <w:t>微调各游戏对象渲染位置，匹配游戏内效果</w:t>
       </w:r>
     </w:p>
@@ -6398,7 +6461,6 @@
         <w:rPr>
           <w:rFonts w:ascii="Times New Roman" w:eastAsia="宋体" w:hAnsi="Times New Roman" w:cs="Times New Roman" w:hint="eastAsia"/>
         </w:rPr>
-        <w:lastRenderedPageBreak/>
         <w:t>修复了单位“在桥梁上”为</w:t>
       </w:r>
       <w:r>
@@ -7477,6 +7539,7 @@
         <w:rPr>
           <w:rFonts w:ascii="Times New Roman" w:eastAsia="宋体" w:hAnsi="Times New Roman" w:cs="Times New Roman" w:hint="eastAsia"/>
         </w:rPr>
+        <w:lastRenderedPageBreak/>
         <w:t>ObjectBrowser.Ore.RandomPlacement</w:t>
       </w:r>
       <w:r>
@@ -7507,7 +7570,6 @@
         <w:rPr>
           <w:rFonts w:ascii="Times New Roman" w:eastAsia="宋体" w:hAnsi="Times New Roman" w:cs="Times New Roman" w:hint="eastAsia"/>
         </w:rPr>
-        <w:lastRenderedPageBreak/>
         <w:t>修复触发编辑器填写的参数为触发时不能正确截断空格的</w:t>
       </w:r>
       <w:r>
@@ -8655,6 +8717,7 @@
         <w:rPr>
           <w:rFonts w:ascii="Times New Roman" w:eastAsia="宋体" w:hAnsi="Times New Roman" w:cs="Times New Roman" w:hint="eastAsia"/>
         </w:rPr>
+        <w:lastRenderedPageBreak/>
         <w:t>修复了预览覆盖物时可能导致原有覆盖物被修改的</w:t>
       </w:r>
       <w:r>
@@ -8679,7 +8742,6 @@
         <w:rPr>
           <w:rFonts w:ascii="Times New Roman" w:eastAsia="宋体" w:hAnsi="Times New Roman" w:cs="Times New Roman" w:hint="eastAsia"/>
         </w:rPr>
-        <w:lastRenderedPageBreak/>
         <w:t>擦除覆盖物不会导致附近的围墙变为完好状态，会保持当前破损状态（但仍然会重新计算连接方式）</w:t>
       </w:r>
     </w:p>
@@ -9764,7 +9826,14 @@
         <w:rPr>
           <w:rFonts w:ascii="Times New Roman" w:eastAsia="宋体" w:hAnsi="Times New Roman" w:cs="Times New Roman" w:hint="eastAsia"/>
         </w:rPr>
-        <w:t>仅支持围墙自定义色盘）</w:t>
+        <w:t>仅支持围墙</w:t>
+      </w:r>
+      <w:r>
+        <w:rPr>
+          <w:rFonts w:ascii="Times New Roman" w:eastAsia="宋体" w:hAnsi="Times New Roman" w:cs="Times New Roman" w:hint="eastAsia"/>
+        </w:rPr>
+        <w:lastRenderedPageBreak/>
+        <w:t>自定义色盘）</w:t>
       </w:r>
     </w:p>
     <w:p>
@@ -9790,7 +9859,6 @@
           <w:sz w:val="28"/>
           <w:szCs w:val="32"/>
         </w:rPr>
-        <w:lastRenderedPageBreak/>
         <w:t>1.2.0 (2025.09.05)</w:t>
       </w:r>
     </w:p>
@@ -10833,6 +10901,7 @@
         <w:rPr>
           <w:rFonts w:ascii="Times New Roman" w:eastAsia="宋体" w:hAnsi="Times New Roman" w:cs="Times New Roman" w:hint="eastAsia"/>
         </w:rPr>
+        <w:lastRenderedPageBreak/>
         <w:t>支持设置</w:t>
       </w:r>
       <w:r>
@@ -10869,7 +10938,6 @@
         <w:rPr>
           <w:rFonts w:ascii="Times New Roman" w:eastAsia="宋体" w:hAnsi="Times New Roman" w:cs="Times New Roman" w:hint="eastAsia"/>
         </w:rPr>
-        <w:lastRenderedPageBreak/>
         <w:t>提升稳定性</w:t>
       </w:r>
     </w:p>
@@ -11842,7 +11910,14 @@
         <w:rPr>
           <w:rFonts w:ascii="Times New Roman" w:eastAsia="宋体" w:hAnsi="Times New Roman" w:cs="Times New Roman" w:hint="eastAsia"/>
         </w:rPr>
-        <w:t>，可以在小地图中显示可视地图边界，新增获取地图边界的</w:t>
+        <w:t>，可以在小地图中显示可视地图边界，新增获</w:t>
+      </w:r>
+      <w:r>
+        <w:rPr>
+          <w:rFonts w:ascii="Times New Roman" w:eastAsia="宋体" w:hAnsi="Times New Roman" w:cs="Times New Roman" w:hint="eastAsia"/>
+        </w:rPr>
+        <w:lastRenderedPageBreak/>
+        <w:t>取地图边界的</w:t>
       </w:r>
       <w:r>
         <w:rPr>
@@ -11872,7 +11947,6 @@
         <w:rPr>
           <w:rFonts w:ascii="Times New Roman" w:eastAsia="宋体" w:hAnsi="Times New Roman" w:cs="Times New Roman" w:hint="eastAsia"/>
         </w:rPr>
-        <w:lastRenderedPageBreak/>
         <w:t>修复开启</w:t>
       </w:r>
       <w:r>

</xml_diff>

<commit_message>
distance toolbox supports resize map
</commit_message>
<xml_diff>
--- a/Supplementary/文档/FA2SP HDM Edition说明文档.docx
+++ b/Supplementary/文档/FA2SP HDM Edition说明文档.docx
@@ -384,6 +384,12 @@
           <w:rFonts w:ascii="Times New Roman" w:eastAsia="宋体" w:hAnsi="Times New Roman" w:cs="Times New Roman" w:hint="eastAsia"/>
         </w:rPr>
         <w:t>距离工具箱支持放置圆形</w:t>
+      </w:r>
+      <w:r>
+        <w:rPr>
+          <w:rFonts w:ascii="Times New Roman" w:eastAsia="宋体" w:hAnsi="Times New Roman" w:cs="Times New Roman" w:hint="eastAsia"/>
+        </w:rPr>
+        <w:t>，修改地图大小时支持跟随</w:t>
       </w:r>
     </w:p>
     <w:p>

</xml_diff>

<commit_message>
change default trigger country to neutral
</commit_message>
<xml_diff>
--- a/Supplementary/文档/FA2SP HDM Edition说明文档.docx
+++ b/Supplementary/文档/FA2SP HDM Edition说明文档.docx
@@ -528,19 +528,13 @@
         <w:rPr>
           <w:rFonts w:ascii="Times New Roman" w:eastAsia="宋体" w:hAnsi="Times New Roman" w:cs="Times New Roman" w:hint="eastAsia"/>
         </w:rPr>
-        <w:t>当开启</w:t>
-      </w:r>
-      <w:r>
-        <w:rPr>
-          <w:rFonts w:ascii="Times New Roman" w:eastAsia="宋体" w:hAnsi="Times New Roman" w:cs="Times New Roman" w:hint="eastAsia"/>
-        </w:rPr>
-        <w:t>PlayerAtXForTriggers</w:t>
-      </w:r>
-      <w:r>
-        <w:rPr>
-          <w:rFonts w:ascii="Times New Roman" w:eastAsia="宋体" w:hAnsi="Times New Roman" w:cs="Times New Roman" w:hint="eastAsia"/>
-        </w:rPr>
-        <w:t>时，对应的所属方会显示在最下方而不是最上方</w:t>
+        <w:t>触发编辑器的默认国家变更为</w:t>
+      </w:r>
+      <w:r>
+        <w:rPr>
+          <w:rFonts w:ascii="Times New Roman" w:eastAsia="宋体" w:hAnsi="Times New Roman" w:cs="Times New Roman" w:hint="eastAsia"/>
+        </w:rPr>
+        <w:t>Neutral</w:t>
       </w:r>
     </w:p>
     <w:p>
@@ -611,7 +605,7 @@
           <w:numId w:val="11"/>
         </w:numPr>
         <w:rPr>
-          <w:rFonts w:ascii="Times New Roman" w:eastAsia="宋体" w:hAnsi="Times New Roman" w:cs="Times New Roman"/>
+          <w:rFonts w:ascii="Times New Roman" w:eastAsia="宋体" w:hAnsi="Times New Roman" w:cs="Times New Roman" w:hint="eastAsia"/>
         </w:rPr>
       </w:pPr>
       <w:r>
@@ -42207,7 +42201,7 @@
         <v:path o:extrusionok="f" gradientshapeok="t" o:connecttype="rect"/>
         <o:lock v:ext="edit" aspectratio="t"/>
       </v:shapetype>
-      <v:shape id="_x0000_i1030" type="#_x0000_t75" style="width:11.65pt;height:11.65pt" o:bullet="t">
+      <v:shape id="_x0000_i1032" type="#_x0000_t75" style="width:11.65pt;height:11.65pt" o:bullet="t">
         <v:imagedata r:id="rId1" o:title="mso9A9A"/>
       </v:shape>
     </w:pict>

</xml_diff>

<commit_message>
fix terrain generator loading crash when tileset exceeds
</commit_message>
<xml_diff>
--- a/Supplementary/文档/FA2SP HDM Edition说明文档.docx
+++ b/Supplementary/文档/FA2SP HDM Edition说明文档.docx
@@ -720,6 +720,30 @@
         <w:pStyle w:val="a9"/>
         <w:numPr>
           <w:ilvl w:val="0"/>
+          <w:numId w:val="11"/>
+        </w:numPr>
+        <w:rPr>
+          <w:rFonts w:ascii="Times New Roman" w:eastAsia="宋体" w:hAnsi="Times New Roman" w:cs="Times New Roman"/>
+        </w:rPr>
+      </w:pPr>
+      <w:r>
+        <w:rPr>
+          <w:rFonts w:ascii="Times New Roman" w:eastAsia="宋体" w:hAnsi="Times New Roman" w:cs="Times New Roman" w:hint="eastAsia"/>
+        </w:rPr>
+        <w:t>修复部分情况下启动地形生成器时崩溃的</w:t>
+      </w:r>
+      <w:r>
+        <w:rPr>
+          <w:rFonts w:ascii="Times New Roman" w:eastAsia="宋体" w:hAnsi="Times New Roman" w:cs="Times New Roman" w:hint="eastAsia"/>
+        </w:rPr>
+        <w:t>bug</w:t>
+      </w:r>
+    </w:p>
+    <w:p>
+      <w:pPr>
+        <w:pStyle w:val="a9"/>
+        <w:numPr>
+          <w:ilvl w:val="0"/>
           <w:numId w:val="10"/>
         </w:numPr>
         <w:rPr>
@@ -862,6 +886,7 @@
         <w:rPr>
           <w:rFonts w:ascii="Times New Roman" w:eastAsia="宋体" w:hAnsi="Times New Roman" w:cs="Times New Roman" w:hint="eastAsia"/>
         </w:rPr>
+        <w:lastRenderedPageBreak/>
         <w:t>触发批量编辑器的拖拽高亮可以正确显示在目标单元格上</w:t>
       </w:r>
     </w:p>
@@ -880,7 +905,6 @@
         <w:rPr>
           <w:rFonts w:ascii="Times New Roman" w:eastAsia="宋体" w:hAnsi="Times New Roman" w:cs="Times New Roman" w:hint="eastAsia"/>
         </w:rPr>
-        <w:lastRenderedPageBreak/>
         <w:t>修复当拖拽小绿点或触发事件、行为时，若突然失去焦点，会导致拖拽预览始终显示的</w:t>
       </w:r>
       <w:r>
@@ -1928,6 +1952,7 @@
         <w:rPr>
           <w:rFonts w:ascii="Times New Roman" w:eastAsia="宋体" w:hAnsi="Times New Roman" w:cs="Times New Roman" w:hint="eastAsia"/>
         </w:rPr>
+        <w:lastRenderedPageBreak/>
         <w:t>减少不必要的文件加载检查，加快加载速度</w:t>
       </w:r>
     </w:p>
@@ -1946,7 +1971,6 @@
         <w:rPr>
           <w:rFonts w:ascii="Times New Roman" w:eastAsia="宋体" w:hAnsi="Times New Roman" w:cs="Times New Roman" w:hint="eastAsia"/>
         </w:rPr>
-        <w:lastRenderedPageBreak/>
         <w:t>支持自定义气候类型的素材文件后缀和</w:t>
       </w:r>
       <w:r>
@@ -3099,6 +3123,7 @@
         <w:rPr>
           <w:rFonts w:ascii="Times New Roman" w:eastAsia="宋体" w:hAnsi="Times New Roman" w:cs="Times New Roman" w:hint="eastAsia"/>
         </w:rPr>
+        <w:lastRenderedPageBreak/>
         <w:t>优化建筑与建筑动画色盘不同时色彩显示的表现</w:t>
       </w:r>
     </w:p>
@@ -3117,7 +3142,6 @@
         <w:rPr>
           <w:rFonts w:ascii="Times New Roman" w:eastAsia="宋体" w:hAnsi="Times New Roman" w:cs="Times New Roman" w:hint="eastAsia"/>
         </w:rPr>
-        <w:lastRenderedPageBreak/>
         <w:t>优化建筑</w:t>
       </w:r>
       <w:r>
@@ -4132,6 +4156,7 @@
         <w:rPr>
           <w:rFonts w:ascii="Times New Roman" w:eastAsia="宋体" w:hAnsi="Times New Roman" w:cs="Times New Roman" w:hint="eastAsia"/>
         </w:rPr>
+        <w:lastRenderedPageBreak/>
         <w:t>优化高架桥阴影渲染</w:t>
       </w:r>
     </w:p>
@@ -4150,7 +4175,6 @@
         <w:rPr>
           <w:rFonts w:ascii="Times New Roman" w:eastAsia="宋体" w:hAnsi="Times New Roman" w:cs="Times New Roman" w:hint="eastAsia"/>
         </w:rPr>
-        <w:lastRenderedPageBreak/>
         <w:t>使用格式刷时会显示被修改的属性</w:t>
       </w:r>
     </w:p>
@@ -5177,6 +5201,7 @@
         <w:rPr>
           <w:rFonts w:ascii="Times New Roman" w:eastAsia="宋体" w:hAnsi="Times New Roman" w:cs="Times New Roman" w:hint="eastAsia"/>
         </w:rPr>
+        <w:lastRenderedPageBreak/>
         <w:t>移除</w:t>
       </w:r>
       <w:r>
@@ -5219,7 +5244,6 @@
         <w:rPr>
           <w:rFonts w:ascii="Times New Roman" w:eastAsia="宋体" w:hAnsi="Times New Roman" w:cs="Times New Roman"/>
         </w:rPr>
-        <w:lastRenderedPageBreak/>
         <w:t>L</w:t>
       </w:r>
       <w:r>

</xml_diff>

<commit_message>
fix lamp in undo redo
</commit_message>
<xml_diff>
--- a/Supplementary/文档/FA2SP HDM Edition说明文档.docx
+++ b/Supplementary/文档/FA2SP HDM Edition说明文档.docx
@@ -440,6 +440,30 @@
         <w:pStyle w:val="a9"/>
         <w:numPr>
           <w:ilvl w:val="0"/>
+          <w:numId w:val="11"/>
+        </w:numPr>
+        <w:rPr>
+          <w:rFonts w:ascii="Times New Roman" w:eastAsia="宋体" w:hAnsi="Times New Roman" w:cs="Times New Roman"/>
+        </w:rPr>
+      </w:pPr>
+      <w:r>
+        <w:rPr>
+          <w:rFonts w:ascii="Times New Roman" w:eastAsia="宋体" w:hAnsi="Times New Roman" w:cs="Times New Roman" w:hint="eastAsia"/>
+        </w:rPr>
+        <w:t>修复撤销重做时没有更新灯光建筑的</w:t>
+      </w:r>
+      <w:r>
+        <w:rPr>
+          <w:rFonts w:ascii="Times New Roman" w:eastAsia="宋体" w:hAnsi="Times New Roman" w:cs="Times New Roman" w:hint="eastAsia"/>
+        </w:rPr>
+        <w:t>bug</w:t>
+      </w:r>
+    </w:p>
+    <w:p>
+      <w:pPr>
+        <w:pStyle w:val="a9"/>
+        <w:numPr>
+          <w:ilvl w:val="0"/>
           <w:numId w:val="10"/>
         </w:numPr>
         <w:rPr>
@@ -878,6 +902,7 @@
         <w:rPr>
           <w:rFonts w:ascii="Times New Roman" w:eastAsia="宋体" w:hAnsi="Times New Roman" w:cs="Times New Roman" w:hint="eastAsia"/>
         </w:rPr>
+        <w:lastRenderedPageBreak/>
         <w:t>优化高架桥的遮挡表现</w:t>
       </w:r>
     </w:p>
@@ -896,7 +921,6 @@
         <w:rPr>
           <w:rFonts w:ascii="Times New Roman" w:eastAsia="宋体" w:hAnsi="Times New Roman" w:cs="Times New Roman" w:hint="eastAsia"/>
         </w:rPr>
-        <w:lastRenderedPageBreak/>
         <w:t>绘制连接地形时，初始高度会减去当前地形的内部高度</w:t>
       </w:r>
     </w:p>
@@ -1902,6 +1926,7 @@
         <w:rPr>
           <w:rFonts w:ascii="Times New Roman" w:eastAsia="宋体" w:hAnsi="Times New Roman" w:cs="Times New Roman" w:hint="eastAsia"/>
         </w:rPr>
+        <w:lastRenderedPageBreak/>
         <w:t>支持摆放泰伯利亚蔓孔怪物与藤蔓，详见</w:t>
       </w:r>
       <w:r>
@@ -1926,7 +1951,6 @@
         <w:rPr>
           <w:rFonts w:ascii="Times New Roman" w:eastAsia="宋体" w:hAnsi="Times New Roman" w:cs="Times New Roman" w:hint="eastAsia"/>
         </w:rPr>
-        <w:lastRenderedPageBreak/>
         <w:t>可以在</w:t>
       </w:r>
       <w:r>
@@ -3187,6 +3211,7 @@
         <w:rPr>
           <w:rFonts w:ascii="Times New Roman" w:eastAsia="宋体" w:hAnsi="Times New Roman" w:cs="Times New Roman" w:hint="eastAsia"/>
         </w:rPr>
+        <w:lastRenderedPageBreak/>
         <w:t>修复附加单位绑定在建筑炮塔上时，无法跟随旋转的</w:t>
       </w:r>
       <w:r>
@@ -3211,7 +3236,6 @@
         <w:rPr>
           <w:rFonts w:ascii="Times New Roman" w:eastAsia="宋体" w:hAnsi="Times New Roman" w:cs="Times New Roman" w:hint="eastAsia"/>
         </w:rPr>
-        <w:lastRenderedPageBreak/>
         <w:t>为基地节点渲染自定义军衔</w:t>
       </w:r>
     </w:p>
@@ -4196,6 +4220,7 @@
         <w:rPr>
           <w:rFonts w:ascii="Times New Roman" w:eastAsia="宋体" w:hAnsi="Times New Roman" w:cs="Times New Roman" w:hint="eastAsia"/>
         </w:rPr>
+        <w:lastRenderedPageBreak/>
         <w:t>围墙覆盖物支持</w:t>
       </w:r>
       <w:r>
@@ -4226,7 +4251,6 @@
         <w:rPr>
           <w:rFonts w:ascii="Times New Roman" w:eastAsia="宋体" w:hAnsi="Times New Roman" w:cs="Times New Roman" w:hint="eastAsia"/>
         </w:rPr>
-        <w:lastRenderedPageBreak/>
         <w:t>InGameDisplay.RemapableOverlay</w:t>
       </w:r>
     </w:p>
@@ -5175,6 +5199,7 @@
         <w:rPr>
           <w:rFonts w:ascii="Times New Roman" w:eastAsia="宋体" w:hAnsi="Times New Roman" w:cs="Times New Roman" w:hint="eastAsia"/>
         </w:rPr>
+        <w:lastRenderedPageBreak/>
         <w:t>小队变更时会即时刷新</w:t>
       </w:r>
       <w:r>
@@ -5205,7 +5230,6 @@
         <w:rPr>
           <w:rFonts w:ascii="Times New Roman" w:eastAsia="宋体" w:hAnsi="Times New Roman" w:cs="Times New Roman" w:hint="eastAsia"/>
         </w:rPr>
-        <w:lastRenderedPageBreak/>
         <w:t>物品浏览器</w:t>
       </w:r>
       <w:r>
@@ -6296,6 +6320,7 @@
         <w:rPr>
           <w:rFonts w:ascii="Times New Roman" w:eastAsia="宋体" w:hAnsi="Times New Roman" w:cs="Times New Roman" w:hint="eastAsia"/>
         </w:rPr>
+        <w:lastRenderedPageBreak/>
         <w:t>污染现在能正确被阴影遮挡</w:t>
       </w:r>
     </w:p>
@@ -6314,7 +6339,6 @@
         <w:rPr>
           <w:rFonts w:ascii="Times New Roman" w:eastAsia="宋体" w:hAnsi="Times New Roman" w:cs="Times New Roman" w:hint="eastAsia"/>
         </w:rPr>
-        <w:lastRenderedPageBreak/>
         <w:t>修复地形生成器的显示范围比划定范围宽一格的</w:t>
       </w:r>
       <w:r>
@@ -7363,6 +7387,7 @@
         <w:rPr>
           <w:rFonts w:ascii="Times New Roman" w:eastAsia="宋体" w:hAnsi="Times New Roman" w:cs="Times New Roman" w:hint="eastAsia"/>
         </w:rPr>
+        <w:lastRenderedPageBreak/>
         <w:t>修复了单位“在桥梁上”为</w:t>
       </w:r>
       <w:r>
@@ -7399,7 +7424,6 @@
         <w:rPr>
           <w:rFonts w:ascii="Times New Roman" w:eastAsia="宋体" w:hAnsi="Times New Roman" w:cs="Times New Roman" w:hint="eastAsia"/>
         </w:rPr>
-        <w:lastRenderedPageBreak/>
         <w:t>粘贴功能支持按</w:t>
       </w:r>
       <w:r>
@@ -8472,6 +8496,7 @@
         <w:rPr>
           <w:rFonts w:ascii="Times New Roman" w:eastAsia="宋体" w:hAnsi="Times New Roman" w:cs="Times New Roman" w:hint="eastAsia"/>
         </w:rPr>
+        <w:lastRenderedPageBreak/>
         <w:t>修复触发编辑器填写的参数为触发时不能正确截断空格的</w:t>
       </w:r>
       <w:r>
@@ -8504,7 +8529,6 @@
           <w:sz w:val="28"/>
           <w:szCs w:val="32"/>
         </w:rPr>
-        <w:lastRenderedPageBreak/>
         <w:t>1.2.4 (2025.11.02)</w:t>
       </w:r>
     </w:p>
@@ -9644,14 +9668,8 @@
         <w:rPr>
           <w:rFonts w:ascii="Times New Roman" w:eastAsia="宋体" w:hAnsi="Times New Roman" w:cs="Times New Roman" w:hint="eastAsia"/>
         </w:rPr>
-        <w:t>擦除覆盖物不会导致附近的围墙变为完好状态，会保持当前破损状态（但仍</w:t>
-      </w:r>
-      <w:r>
-        <w:rPr>
-          <w:rFonts w:ascii="Times New Roman" w:eastAsia="宋体" w:hAnsi="Times New Roman" w:cs="Times New Roman" w:hint="eastAsia"/>
-        </w:rPr>
         <w:lastRenderedPageBreak/>
-        <w:t>然会重新计算连接方式）</w:t>
+        <w:t>擦除覆盖物不会导致附近的围墙变为完好状态，会保持当前破损状态（但仍然会重新计算连接方式）</w:t>
       </w:r>
     </w:p>
     <w:p>
@@ -42634,7 +42652,7 @@
         <v:path o:extrusionok="f" gradientshapeok="t" o:connecttype="rect"/>
         <o:lock v:ext="edit" aspectratio="t"/>
       </v:shapetype>
-      <v:shape id="_x0000_i1031" type="#_x0000_t75" style="width:11.65pt;height:11.65pt" o:bullet="t">
+      <v:shape id="_x0000_i1030" type="#_x0000_t75" style="width:11.65pt;height:11.65pt" o:bullet="t">
         <v:imagedata r:id="rId1" o:title="mso9A9A"/>
       </v:shape>
     </w:pict>

</xml_diff>

<commit_message>
optimize data get in main drawing loop
</commit_message>
<xml_diff>
--- a/Supplementary/文档/FA2SP HDM Edition说明文档.docx
+++ b/Supplementary/文档/FA2SP HDM Edition说明文档.docx
@@ -464,6 +464,24 @@
         <w:pStyle w:val="a9"/>
         <w:numPr>
           <w:ilvl w:val="0"/>
+          <w:numId w:val="11"/>
+        </w:numPr>
+        <w:rPr>
+          <w:rFonts w:ascii="Times New Roman" w:eastAsia="宋体" w:hAnsi="Times New Roman" w:cs="Times New Roman"/>
+        </w:rPr>
+      </w:pPr>
+      <w:r>
+        <w:rPr>
+          <w:rFonts w:ascii="Times New Roman" w:eastAsia="宋体" w:hAnsi="Times New Roman" w:cs="Times New Roman" w:hint="eastAsia"/>
+        </w:rPr>
+        <w:t>优化绘图效率</w:t>
+      </w:r>
+    </w:p>
+    <w:p>
+      <w:pPr>
+        <w:pStyle w:val="a9"/>
+        <w:numPr>
+          <w:ilvl w:val="0"/>
           <w:numId w:val="10"/>
         </w:numPr>
         <w:rPr>
@@ -878,6 +896,7 @@
         <w:rPr>
           <w:rFonts w:ascii="Times New Roman" w:eastAsia="宋体" w:hAnsi="Times New Roman" w:cs="Times New Roman" w:hint="eastAsia"/>
         </w:rPr>
+        <w:lastRenderedPageBreak/>
         <w:t>修复部分情况下地图下边缘的单元格无法触及的</w:t>
       </w:r>
       <w:r>
@@ -902,7 +921,6 @@
         <w:rPr>
           <w:rFonts w:ascii="Times New Roman" w:eastAsia="宋体" w:hAnsi="Times New Roman" w:cs="Times New Roman" w:hint="eastAsia"/>
         </w:rPr>
-        <w:lastRenderedPageBreak/>
         <w:t>优化高架桥的遮挡表现</w:t>
       </w:r>
     </w:p>
@@ -1908,6 +1926,7 @@
         <w:rPr>
           <w:rFonts w:ascii="Times New Roman" w:eastAsia="宋体" w:hAnsi="Times New Roman" w:cs="Times New Roman" w:hint="eastAsia"/>
         </w:rPr>
+        <w:lastRenderedPageBreak/>
         <w:t>将部分需要重新加载地图的偏好设置改为仅需要重新加载物品浏览器</w:t>
       </w:r>
     </w:p>
@@ -1926,7 +1945,6 @@
         <w:rPr>
           <w:rFonts w:ascii="Times New Roman" w:eastAsia="宋体" w:hAnsi="Times New Roman" w:cs="Times New Roman" w:hint="eastAsia"/>
         </w:rPr>
-        <w:lastRenderedPageBreak/>
         <w:t>支持摆放泰伯利亚蔓孔怪物与藤蔓，详见</w:t>
       </w:r>
       <w:r>
@@ -3175,6 +3193,7 @@
         <w:rPr>
           <w:rFonts w:ascii="Times New Roman" w:eastAsia="宋体" w:hAnsi="Times New Roman" w:cs="Times New Roman" w:hint="eastAsia"/>
         </w:rPr>
+        <w:lastRenderedPageBreak/>
         <w:t>修复</w:t>
       </w:r>
       <w:r>
@@ -3211,7 +3230,6 @@
         <w:rPr>
           <w:rFonts w:ascii="Times New Roman" w:eastAsia="宋体" w:hAnsi="Times New Roman" w:cs="Times New Roman" w:hint="eastAsia"/>
         </w:rPr>
-        <w:lastRenderedPageBreak/>
         <w:t>修复附加单位绑定在建筑炮塔上时，无法跟随旋转的</w:t>
       </w:r>
       <w:r>
@@ -4184,6 +4202,7 @@
         <w:rPr>
           <w:rFonts w:ascii="Times New Roman" w:eastAsia="宋体" w:hAnsi="Times New Roman" w:cs="Times New Roman" w:hint="eastAsia"/>
         </w:rPr>
+        <w:lastRenderedPageBreak/>
         <w:t>修复部分</w:t>
       </w:r>
       <w:r>
@@ -4220,7 +4239,6 @@
         <w:rPr>
           <w:rFonts w:ascii="Times New Roman" w:eastAsia="宋体" w:hAnsi="Times New Roman" w:cs="Times New Roman" w:hint="eastAsia"/>
         </w:rPr>
-        <w:lastRenderedPageBreak/>
         <w:t>围墙覆盖物支持</w:t>
       </w:r>
       <w:r>
@@ -5169,6 +5187,7 @@
         <w:rPr>
           <w:rFonts w:ascii="Times New Roman" w:eastAsia="宋体" w:hAnsi="Times New Roman" w:cs="Times New Roman" w:hint="eastAsia"/>
         </w:rPr>
+        <w:lastRenderedPageBreak/>
         <w:t>物品浏览器</w:t>
       </w:r>
       <w:r>
@@ -5199,7 +5218,6 @@
         <w:rPr>
           <w:rFonts w:ascii="Times New Roman" w:eastAsia="宋体" w:hAnsi="Times New Roman" w:cs="Times New Roman" w:hint="eastAsia"/>
         </w:rPr>
-        <w:lastRenderedPageBreak/>
         <w:t>小队变更时会即时刷新</w:t>
       </w:r>
       <w:r>
@@ -6260,6 +6278,7 @@
         <w:rPr>
           <w:rFonts w:ascii="Times New Roman" w:eastAsia="宋体" w:hAnsi="Times New Roman" w:cs="Times New Roman" w:hint="eastAsia"/>
         </w:rPr>
+        <w:lastRenderedPageBreak/>
         <w:t>支持自定义拼接地形组</w:t>
       </w:r>
       <w:r>
@@ -6320,7 +6339,6 @@
         <w:rPr>
           <w:rFonts w:ascii="Times New Roman" w:eastAsia="宋体" w:hAnsi="Times New Roman" w:cs="Times New Roman" w:hint="eastAsia"/>
         </w:rPr>
-        <w:lastRenderedPageBreak/>
         <w:t>污染现在能正确被阴影遮挡</w:t>
       </w:r>
     </w:p>
@@ -7369,6 +7387,7 @@
         <w:rPr>
           <w:rFonts w:ascii="Times New Roman" w:eastAsia="宋体" w:hAnsi="Times New Roman" w:cs="Times New Roman" w:hint="eastAsia"/>
         </w:rPr>
+        <w:lastRenderedPageBreak/>
         <w:t>微调各游戏对象渲染位置，匹配游戏内效果</w:t>
       </w:r>
     </w:p>
@@ -7387,7 +7406,6 @@
         <w:rPr>
           <w:rFonts w:ascii="Times New Roman" w:eastAsia="宋体" w:hAnsi="Times New Roman" w:cs="Times New Roman" w:hint="eastAsia"/>
         </w:rPr>
-        <w:lastRenderedPageBreak/>
         <w:t>修复了单位“在桥梁上”为</w:t>
       </w:r>
       <w:r>
@@ -8466,6 +8484,7 @@
         <w:rPr>
           <w:rFonts w:ascii="Times New Roman" w:eastAsia="宋体" w:hAnsi="Times New Roman" w:cs="Times New Roman" w:hint="eastAsia"/>
         </w:rPr>
+        <w:lastRenderedPageBreak/>
         <w:t>ObjectBrowser.Ore.RandomPlacement</w:t>
       </w:r>
       <w:r>
@@ -8496,7 +8515,6 @@
         <w:rPr>
           <w:rFonts w:ascii="Times New Roman" w:eastAsia="宋体" w:hAnsi="Times New Roman" w:cs="Times New Roman" w:hint="eastAsia"/>
         </w:rPr>
-        <w:lastRenderedPageBreak/>
         <w:t>修复触发编辑器填写的参数为触发时不能正确截断空格的</w:t>
       </w:r>
       <w:r>
@@ -9644,6 +9662,7 @@
         <w:rPr>
           <w:rFonts w:ascii="Times New Roman" w:eastAsia="宋体" w:hAnsi="Times New Roman" w:cs="Times New Roman" w:hint="eastAsia"/>
         </w:rPr>
+        <w:lastRenderedPageBreak/>
         <w:t>修复了预览覆盖物时可能导致原有覆盖物被修改的</w:t>
       </w:r>
       <w:r>
@@ -9668,7 +9687,6 @@
         <w:rPr>
           <w:rFonts w:ascii="Times New Roman" w:eastAsia="宋体" w:hAnsi="Times New Roman" w:cs="Times New Roman" w:hint="eastAsia"/>
         </w:rPr>
-        <w:lastRenderedPageBreak/>
         <w:t>擦除覆盖物不会导致附近的围墙变为完好状态，会保持当前破损状态（但仍然会重新计算连接方式）</w:t>
       </w:r>
     </w:p>
@@ -10753,7 +10771,14 @@
         <w:rPr>
           <w:rFonts w:ascii="Times New Roman" w:eastAsia="宋体" w:hAnsi="Times New Roman" w:cs="Times New Roman" w:hint="eastAsia"/>
         </w:rPr>
-        <w:t>仅支持围墙自定义色盘）</w:t>
+        <w:t>仅支持围墙</w:t>
+      </w:r>
+      <w:r>
+        <w:rPr>
+          <w:rFonts w:ascii="Times New Roman" w:eastAsia="宋体" w:hAnsi="Times New Roman" w:cs="Times New Roman" w:hint="eastAsia"/>
+        </w:rPr>
+        <w:lastRenderedPageBreak/>
+        <w:t>自定义色盘）</w:t>
       </w:r>
     </w:p>
     <w:p>
@@ -10779,7 +10804,6 @@
           <w:sz w:val="28"/>
           <w:szCs w:val="32"/>
         </w:rPr>
-        <w:lastRenderedPageBreak/>
         <w:t>1.2.0 (2025.09.05)</w:t>
       </w:r>
     </w:p>
@@ -11822,6 +11846,7 @@
         <w:rPr>
           <w:rFonts w:ascii="Times New Roman" w:eastAsia="宋体" w:hAnsi="Times New Roman" w:cs="Times New Roman" w:hint="eastAsia"/>
         </w:rPr>
+        <w:lastRenderedPageBreak/>
         <w:t>支持设置</w:t>
       </w:r>
       <w:r>
@@ -11858,7 +11883,6 @@
         <w:rPr>
           <w:rFonts w:ascii="Times New Roman" w:eastAsia="宋体" w:hAnsi="Times New Roman" w:cs="Times New Roman" w:hint="eastAsia"/>
         </w:rPr>
-        <w:lastRenderedPageBreak/>
         <w:t>提升稳定性</w:t>
       </w:r>
     </w:p>
@@ -12831,7 +12855,14 @@
         <w:rPr>
           <w:rFonts w:ascii="Times New Roman" w:eastAsia="宋体" w:hAnsi="Times New Roman" w:cs="Times New Roman" w:hint="eastAsia"/>
         </w:rPr>
-        <w:t>，可以在小地图中显示可视地图边界，新增获取地图边界的</w:t>
+        <w:t>，可以在小地图中显示可视地图边界，新增获</w:t>
+      </w:r>
+      <w:r>
+        <w:rPr>
+          <w:rFonts w:ascii="Times New Roman" w:eastAsia="宋体" w:hAnsi="Times New Roman" w:cs="Times New Roman" w:hint="eastAsia"/>
+        </w:rPr>
+        <w:lastRenderedPageBreak/>
+        <w:t>取地图边界的</w:t>
       </w:r>
       <w:r>
         <w:rPr>
@@ -12861,7 +12892,6 @@
         <w:rPr>
           <w:rFonts w:ascii="Times New Roman" w:eastAsia="宋体" w:hAnsi="Times New Roman" w:cs="Times New Roman" w:hint="eastAsia"/>
         </w:rPr>
-        <w:lastRenderedPageBreak/>
         <w:t>修复开启</w:t>
       </w:r>
       <w:r>
@@ -42652,7 +42682,7 @@
         <v:path o:extrusionok="f" gradientshapeok="t" o:connecttype="rect"/>
         <o:lock v:ext="edit" aspectratio="t"/>
       </v:shapetype>
-      <v:shape id="_x0000_i1030" type="#_x0000_t75" style="width:11.65pt;height:11.65pt" o:bullet="t">
+      <v:shape id="_x0000_i1028" type="#_x0000_t75" style="width:11.65pt;height:11.65pt" o:bullet="t">
         <v:imagedata r:id="rId1" o:title="mso9A9A"/>
       </v:shape>
     </w:pict>

</xml_diff>

<commit_message>
optimize voxel render performance
adapt for a weird ares include feature
</commit_message>
<xml_diff>
--- a/Supplementary/文档/FA2SP HDM Edition说明文档.docx
+++ b/Supplementary/文档/FA2SP HDM Edition说明文档.docx
@@ -624,6 +624,36 @@
         <w:pStyle w:val="a9"/>
         <w:numPr>
           <w:ilvl w:val="0"/>
+          <w:numId w:val="11"/>
+        </w:numPr>
+        <w:rPr>
+          <w:rFonts w:ascii="Times New Roman" w:eastAsia="宋体" w:hAnsi="Times New Roman" w:cs="Times New Roman"/>
+        </w:rPr>
+      </w:pPr>
+      <w:r>
+        <w:rPr>
+          <w:rFonts w:ascii="Times New Roman" w:eastAsia="宋体" w:hAnsi="Times New Roman" w:cs="Times New Roman" w:hint="eastAsia"/>
+        </w:rPr>
+        <w:t>优化</w:t>
+      </w:r>
+      <w:r>
+        <w:rPr>
+          <w:rFonts w:ascii="Times New Roman" w:eastAsia="宋体" w:hAnsi="Times New Roman" w:cs="Times New Roman" w:hint="eastAsia"/>
+        </w:rPr>
+        <w:t>VXL</w:t>
+      </w:r>
+      <w:r>
+        <w:rPr>
+          <w:rFonts w:ascii="Times New Roman" w:eastAsia="宋体" w:hAnsi="Times New Roman" w:cs="Times New Roman" w:hint="eastAsia"/>
+        </w:rPr>
+        <w:t>单位渲染时间</w:t>
+      </w:r>
+    </w:p>
+    <w:p>
+      <w:pPr>
+        <w:pStyle w:val="a9"/>
+        <w:numPr>
+          <w:ilvl w:val="0"/>
           <w:numId w:val="10"/>
         </w:numPr>
         <w:rPr>
@@ -834,7 +864,14 @@
         <w:rPr>
           <w:rFonts w:ascii="Times New Roman" w:eastAsia="宋体" w:hAnsi="Times New Roman" w:cs="Times New Roman" w:hint="eastAsia"/>
         </w:rPr>
-        <w:t>，支持撤销重做</w:t>
+        <w:t>，支持撤</w:t>
+      </w:r>
+      <w:r>
+        <w:rPr>
+          <w:rFonts w:ascii="Times New Roman" w:eastAsia="宋体" w:hAnsi="Times New Roman" w:cs="Times New Roman" w:hint="eastAsia"/>
+        </w:rPr>
+        <w:lastRenderedPageBreak/>
+        <w:t>销重做</w:t>
       </w:r>
     </w:p>
     <w:p>
@@ -852,7 +889,6 @@
         <w:rPr>
           <w:rFonts w:ascii="Times New Roman" w:eastAsia="宋体" w:hAnsi="Times New Roman" w:cs="Times New Roman" w:hint="eastAsia"/>
         </w:rPr>
-        <w:lastRenderedPageBreak/>
         <w:t>优化更改地图大小工具的效率</w:t>
       </w:r>
     </w:p>
@@ -1780,6 +1816,7 @@
         <w:rPr>
           <w:rFonts w:ascii="Times New Roman" w:eastAsia="宋体" w:hAnsi="Times New Roman" w:cs="Times New Roman" w:hint="eastAsia"/>
         </w:rPr>
+        <w:lastRenderedPageBreak/>
         <w:t>修复当建筑多个动画互相无限循环时导致崩溃的</w:t>
       </w:r>
       <w:r>
@@ -1804,7 +1841,6 @@
         <w:rPr>
           <w:rFonts w:ascii="Times New Roman" w:eastAsia="宋体" w:hAnsi="Times New Roman" w:cs="Times New Roman" w:hint="eastAsia"/>
         </w:rPr>
-        <w:lastRenderedPageBreak/>
         <w:t>新增禁止自动连接围墙选项，可以在摆放和擦除围墙时不自动修改连接</w:t>
       </w:r>
     </w:p>
@@ -2959,6 +2995,7 @@
           <w:kern w:val="0"/>
           <w14:ligatures w14:val="none"/>
         </w:rPr>
+        <w:lastRenderedPageBreak/>
         <w:t>当放置覆盖物进行预览时，不会改变扫过区域的矿石价值</w:t>
       </w:r>
     </w:p>
@@ -2981,7 +3018,6 @@
           <w:kern w:val="0"/>
           <w14:ligatures w14:val="none"/>
         </w:rPr>
-        <w:lastRenderedPageBreak/>
         <w:t>脚本编辑器的脚本序号从</w:t>
       </w:r>
       <w:r>
@@ -4052,6 +4088,7 @@
           <w:sz w:val="28"/>
           <w:szCs w:val="32"/>
         </w:rPr>
+        <w:lastRenderedPageBreak/>
         <w:t>1.3.5 (2026.0</w:t>
       </w:r>
       <w:r>
@@ -4110,907 +4147,907 @@
         <w:rPr>
           <w:rFonts w:ascii="Times New Roman" w:eastAsia="宋体" w:hAnsi="Times New Roman" w:cs="Times New Roman" w:hint="eastAsia"/>
         </w:rPr>
+        <w:t>修复自定义面积建筑的渲染遮挡问题</w:t>
+      </w:r>
+    </w:p>
+    <w:p>
+      <w:pPr>
+        <w:pStyle w:val="a9"/>
+        <w:numPr>
+          <w:ilvl w:val="0"/>
+          <w:numId w:val="43"/>
+        </w:numPr>
+        <w:rPr>
+          <w:rFonts w:ascii="Times New Roman" w:eastAsia="宋体" w:hAnsi="Times New Roman" w:cs="Times New Roman"/>
+        </w:rPr>
+      </w:pPr>
+      <w:r>
+        <w:rPr>
+          <w:rFonts w:ascii="Times New Roman" w:eastAsia="宋体" w:hAnsi="Times New Roman" w:cs="Times New Roman" w:hint="eastAsia"/>
+        </w:rPr>
+        <w:t>修复删除地图</w:t>
+      </w:r>
+      <w:r>
+        <w:rPr>
+          <w:rFonts w:ascii="Times New Roman" w:eastAsia="宋体" w:hAnsi="Times New Roman" w:cs="Times New Roman" w:hint="eastAsia"/>
+        </w:rPr>
+        <w:t>include</w:t>
+      </w:r>
+      <w:r>
+        <w:rPr>
+          <w:rFonts w:ascii="Times New Roman" w:eastAsia="宋体" w:hAnsi="Times New Roman" w:cs="Times New Roman" w:hint="eastAsia"/>
+        </w:rPr>
+        <w:t>小节后不能正确保存部分</w:t>
+      </w:r>
+      <w:r>
+        <w:rPr>
+          <w:rFonts w:ascii="Times New Roman" w:eastAsia="宋体" w:hAnsi="Times New Roman" w:cs="Times New Roman" w:hint="eastAsia"/>
+        </w:rPr>
+        <w:t>ini</w:t>
+      </w:r>
+      <w:r>
+        <w:rPr>
+          <w:rFonts w:ascii="Times New Roman" w:eastAsia="宋体" w:hAnsi="Times New Roman" w:cs="Times New Roman" w:hint="eastAsia"/>
+        </w:rPr>
+        <w:t>小节的</w:t>
+      </w:r>
+      <w:r>
+        <w:rPr>
+          <w:rFonts w:ascii="Times New Roman" w:eastAsia="宋体" w:hAnsi="Times New Roman" w:cs="Times New Roman" w:hint="eastAsia"/>
+        </w:rPr>
+        <w:t>bug</w:t>
+      </w:r>
+      <w:r>
+        <w:rPr>
+          <w:rFonts w:ascii="Times New Roman" w:eastAsia="宋体" w:hAnsi="Times New Roman" w:cs="Times New Roman" w:hint="eastAsia"/>
+        </w:rPr>
+        <w:t>。</w:t>
+      </w:r>
+      <w:r>
+        <w:rPr>
+          <w:rFonts w:ascii="Times New Roman" w:eastAsia="宋体" w:hAnsi="Times New Roman" w:cs="Times New Roman" w:hint="eastAsia"/>
+        </w:rPr>
+        <w:t>注意，地图</w:t>
+      </w:r>
+      <w:r>
+        <w:rPr>
+          <w:rFonts w:ascii="Times New Roman" w:eastAsia="宋体" w:hAnsi="Times New Roman" w:cs="Times New Roman" w:hint="eastAsia"/>
+        </w:rPr>
+        <w:t>include</w:t>
+      </w:r>
+      <w:r>
+        <w:rPr>
+          <w:rFonts w:ascii="Times New Roman" w:eastAsia="宋体" w:hAnsi="Times New Roman" w:cs="Times New Roman" w:hint="eastAsia"/>
+        </w:rPr>
+        <w:t>支持仍属于实验性功能，不建议使用</w:t>
+      </w:r>
+      <w:r>
+        <w:rPr>
+          <w:rFonts w:ascii="Times New Roman" w:eastAsia="宋体" w:hAnsi="Times New Roman" w:cs="Times New Roman" w:hint="eastAsia"/>
+        </w:rPr>
+        <w:t>；由于技术限制，保存时并不能固定已有的</w:t>
+      </w:r>
+      <w:r>
+        <w:rPr>
+          <w:rFonts w:ascii="Times New Roman" w:eastAsia="宋体" w:hAnsi="Times New Roman" w:cs="Times New Roman" w:hint="eastAsia"/>
+        </w:rPr>
+        <w:t>include</w:t>
+      </w:r>
+      <w:r>
+        <w:rPr>
+          <w:rFonts w:ascii="Times New Roman" w:eastAsia="宋体" w:hAnsi="Times New Roman" w:cs="Times New Roman" w:hint="eastAsia"/>
+        </w:rPr>
+        <w:t>顺序</w:t>
+      </w:r>
+    </w:p>
+    <w:p>
+      <w:pPr>
+        <w:pStyle w:val="a9"/>
+        <w:numPr>
+          <w:ilvl w:val="0"/>
+          <w:numId w:val="43"/>
+        </w:numPr>
+        <w:rPr>
+          <w:rFonts w:ascii="Times New Roman" w:eastAsia="宋体" w:hAnsi="Times New Roman" w:cs="Times New Roman"/>
+        </w:rPr>
+      </w:pPr>
+      <w:r>
+        <w:rPr>
+          <w:rFonts w:ascii="Times New Roman" w:eastAsia="宋体" w:hAnsi="Times New Roman" w:cs="Times New Roman" w:hint="eastAsia"/>
+        </w:rPr>
+        <w:t>小队变更时会即时刷新触发编辑器对应菜单</w:t>
+      </w:r>
+    </w:p>
+    <w:p>
+      <w:pPr>
+        <w:pStyle w:val="a9"/>
+        <w:numPr>
+          <w:ilvl w:val="0"/>
+          <w:numId w:val="43"/>
+        </w:numPr>
+        <w:rPr>
+          <w:rFonts w:ascii="Times New Roman" w:eastAsia="宋体" w:hAnsi="Times New Roman" w:cs="Times New Roman"/>
+        </w:rPr>
+      </w:pPr>
+      <w:r>
+        <w:rPr>
+          <w:rFonts w:ascii="Times New Roman" w:eastAsia="宋体" w:hAnsi="Times New Roman" w:cs="Times New Roman" w:hint="eastAsia"/>
+        </w:rPr>
+        <w:t>新增选项</w:t>
+      </w:r>
+      <w:r>
+        <w:rPr>
+          <w:rFonts w:ascii="Times New Roman" w:eastAsia="宋体" w:hAnsi="Times New Roman" w:cs="Times New Roman" w:hint="eastAsia"/>
+        </w:rPr>
+        <w:t>SaveMap.KeepComments</w:t>
+      </w:r>
+      <w:r>
+        <w:rPr>
+          <w:rFonts w:ascii="Times New Roman" w:eastAsia="宋体" w:hAnsi="Times New Roman" w:cs="Times New Roman" w:hint="eastAsia"/>
+        </w:rPr>
+        <w:t>，在保存地图时可以保留注释</w:t>
+      </w:r>
+      <w:r>
+        <w:rPr>
+          <w:rFonts w:ascii="Times New Roman" w:eastAsia="宋体" w:hAnsi="Times New Roman" w:cs="Times New Roman" w:hint="eastAsia"/>
+        </w:rPr>
+        <w:t>，</w:t>
+      </w:r>
+      <w:r>
+        <w:rPr>
+          <w:rFonts w:ascii="Times New Roman" w:eastAsia="宋体" w:hAnsi="Times New Roman" w:cs="Times New Roman" w:hint="eastAsia"/>
+        </w:rPr>
+        <w:t>ini</w:t>
+      </w:r>
+      <w:r>
+        <w:rPr>
+          <w:rFonts w:ascii="Times New Roman" w:eastAsia="宋体" w:hAnsi="Times New Roman" w:cs="Times New Roman" w:hint="eastAsia"/>
+        </w:rPr>
+        <w:t>编辑器中可以保留并显示注释</w:t>
+      </w:r>
+    </w:p>
+    <w:p>
+      <w:pPr>
+        <w:pStyle w:val="a9"/>
+        <w:numPr>
+          <w:ilvl w:val="0"/>
+          <w:numId w:val="43"/>
+        </w:numPr>
+        <w:rPr>
+          <w:rFonts w:ascii="Times New Roman" w:eastAsia="宋体" w:hAnsi="Times New Roman" w:cs="Times New Roman"/>
+        </w:rPr>
+      </w:pPr>
+      <w:r>
+        <w:rPr>
+          <w:rFonts w:ascii="Times New Roman" w:eastAsia="宋体" w:hAnsi="Times New Roman" w:cs="Times New Roman" w:hint="eastAsia"/>
+        </w:rPr>
+        <w:t>在触发编辑器中为无标签的重复类型添加说明文本</w:t>
+      </w:r>
+    </w:p>
+    <w:p>
+      <w:pPr>
+        <w:pStyle w:val="a9"/>
+        <w:numPr>
+          <w:ilvl w:val="0"/>
+          <w:numId w:val="43"/>
+        </w:numPr>
+        <w:rPr>
+          <w:rFonts w:ascii="Times New Roman" w:eastAsia="宋体" w:hAnsi="Times New Roman" w:cs="Times New Roman"/>
+        </w:rPr>
+      </w:pPr>
+      <w:r>
+        <w:rPr>
+          <w:rFonts w:ascii="Times New Roman" w:eastAsia="宋体" w:hAnsi="Times New Roman" w:cs="Times New Roman" w:hint="eastAsia"/>
+        </w:rPr>
+        <w:t>新增加载</w:t>
+      </w:r>
+      <w:r>
+        <w:rPr>
+          <w:rFonts w:ascii="Times New Roman" w:eastAsia="宋体" w:hAnsi="Times New Roman" w:cs="Times New Roman" w:hint="eastAsia"/>
+        </w:rPr>
+        <w:t>/</w:t>
+      </w:r>
+      <w:r>
+        <w:rPr>
+          <w:rFonts w:ascii="Times New Roman" w:eastAsia="宋体" w:hAnsi="Times New Roman" w:cs="Times New Roman" w:hint="eastAsia"/>
+        </w:rPr>
+        <w:t>保存文件的</w:t>
+      </w:r>
+      <w:r>
+        <w:rPr>
+          <w:rFonts w:ascii="Times New Roman" w:eastAsia="宋体" w:hAnsi="Times New Roman" w:cs="Times New Roman" w:hint="eastAsia"/>
+        </w:rPr>
+        <w:t>lua</w:t>
+      </w:r>
+      <w:r>
+        <w:rPr>
+          <w:rFonts w:ascii="Times New Roman" w:eastAsia="宋体" w:hAnsi="Times New Roman" w:cs="Times New Roman" w:hint="eastAsia"/>
+        </w:rPr>
+        <w:t>脚本函数</w:t>
+      </w:r>
+    </w:p>
+    <w:p>
+      <w:pPr>
+        <w:pStyle w:val="a9"/>
+        <w:numPr>
+          <w:ilvl w:val="0"/>
+          <w:numId w:val="43"/>
+        </w:numPr>
+        <w:rPr>
+          <w:rFonts w:ascii="Times New Roman" w:eastAsia="宋体" w:hAnsi="Times New Roman" w:cs="Times New Roman"/>
+        </w:rPr>
+      </w:pPr>
+      <w:r>
+        <w:rPr>
+          <w:rFonts w:ascii="Times New Roman" w:eastAsia="宋体" w:hAnsi="Times New Roman" w:cs="Times New Roman" w:hint="eastAsia"/>
+        </w:rPr>
+        <w:t>修复部分</w:t>
+      </w:r>
+      <w:r>
+        <w:rPr>
+          <w:rFonts w:ascii="Times New Roman" w:eastAsia="宋体" w:hAnsi="Times New Roman" w:cs="Times New Roman" w:hint="eastAsia"/>
+        </w:rPr>
+        <w:t>lua</w:t>
+      </w:r>
+      <w:r>
+        <w:rPr>
+          <w:rFonts w:ascii="Times New Roman" w:eastAsia="宋体" w:hAnsi="Times New Roman" w:cs="Times New Roman" w:hint="eastAsia"/>
+        </w:rPr>
+        <w:t>脚本的</w:t>
+      </w:r>
+      <w:r>
+        <w:rPr>
+          <w:rFonts w:ascii="Times New Roman" w:eastAsia="宋体" w:hAnsi="Times New Roman" w:cs="Times New Roman" w:hint="eastAsia"/>
+        </w:rPr>
+        <w:t>bug</w:t>
+      </w:r>
+    </w:p>
+    <w:p>
+      <w:pPr>
+        <w:pStyle w:val="a9"/>
+        <w:numPr>
+          <w:ilvl w:val="0"/>
+          <w:numId w:val="43"/>
+        </w:numPr>
+        <w:rPr>
+          <w:rFonts w:ascii="Times New Roman" w:eastAsia="宋体" w:hAnsi="Times New Roman" w:cs="Times New Roman"/>
+        </w:rPr>
+      </w:pPr>
+      <w:r>
+        <w:rPr>
+          <w:rFonts w:ascii="Times New Roman" w:eastAsia="宋体" w:hAnsi="Times New Roman" w:cs="Times New Roman" w:hint="eastAsia"/>
+        </w:rPr>
+        <w:t>围墙覆盖物支持</w:t>
+      </w:r>
+      <w:r>
+        <w:rPr>
+          <w:rFonts w:ascii="Times New Roman" w:eastAsia="宋体" w:hAnsi="Times New Roman" w:cs="Times New Roman" w:hint="eastAsia"/>
+        </w:rPr>
+        <w:t>根据最近的建筑</w:t>
+      </w:r>
+      <w:r>
+        <w:rPr>
+          <w:rFonts w:ascii="Times New Roman" w:eastAsia="宋体" w:hAnsi="Times New Roman" w:cs="Times New Roman" w:hint="eastAsia"/>
+        </w:rPr>
+        <w:t>显示所属色</w:t>
+      </w:r>
+      <w:r>
+        <w:rPr>
+          <w:rFonts w:ascii="Times New Roman" w:eastAsia="宋体" w:hAnsi="Times New Roman" w:cs="Times New Roman" w:hint="eastAsia"/>
+        </w:rPr>
+        <w:t>（并不能完全还原游戏）</w:t>
+      </w:r>
+      <w:r>
+        <w:rPr>
+          <w:rFonts w:ascii="Times New Roman" w:eastAsia="宋体" w:hAnsi="Times New Roman" w:cs="Times New Roman" w:hint="eastAsia"/>
+        </w:rPr>
+        <w:t>，详见</w:t>
+      </w:r>
+      <w:r>
+        <w:rPr>
+          <w:rFonts w:ascii="Times New Roman" w:eastAsia="宋体" w:hAnsi="Times New Roman" w:cs="Times New Roman" w:hint="eastAsia"/>
+        </w:rPr>
+        <w:t>InGameDisplay.RemapableOverlay</w:t>
+      </w:r>
+    </w:p>
+    <w:p>
+      <w:pPr>
+        <w:pStyle w:val="a9"/>
+        <w:numPr>
+          <w:ilvl w:val="0"/>
+          <w:numId w:val="43"/>
+        </w:numPr>
+        <w:rPr>
+          <w:rFonts w:ascii="Times New Roman" w:eastAsia="宋体" w:hAnsi="Times New Roman" w:cs="Times New Roman"/>
+        </w:rPr>
+      </w:pPr>
+      <w:r>
+        <w:rPr>
+          <w:rFonts w:ascii="Times New Roman" w:eastAsia="宋体" w:hAnsi="Times New Roman" w:cs="Times New Roman" w:hint="eastAsia"/>
+        </w:rPr>
+        <w:t>恢复心灵终结中被错误隐藏的部分地形组</w:t>
+      </w:r>
+    </w:p>
+    <w:p>
+      <w:pPr>
+        <w:pStyle w:val="a9"/>
+        <w:numPr>
+          <w:ilvl w:val="0"/>
+          <w:numId w:val="43"/>
+        </w:numPr>
+        <w:rPr>
+          <w:rFonts w:ascii="Times New Roman" w:eastAsia="宋体" w:hAnsi="Times New Roman" w:cs="Times New Roman"/>
+        </w:rPr>
+      </w:pPr>
+      <w:r>
+        <w:rPr>
+          <w:rFonts w:ascii="Times New Roman" w:eastAsia="宋体" w:hAnsi="Times New Roman" w:cs="Times New Roman" w:hint="eastAsia"/>
+        </w:rPr>
+        <w:t>支持直接向建筑上放置加载物</w:t>
+      </w:r>
+      <w:r>
+        <w:rPr>
+          <w:rFonts w:ascii="Times New Roman" w:eastAsia="宋体" w:hAnsi="Times New Roman" w:cs="Times New Roman" w:hint="eastAsia"/>
+        </w:rPr>
+        <w:t>，详见</w:t>
+      </w:r>
+      <w:r>
+        <w:rPr>
+          <w:rFonts w:ascii="Times New Roman" w:eastAsia="宋体" w:hAnsi="Times New Roman" w:cs="Times New Roman" w:hint="eastAsia"/>
+        </w:rPr>
+        <w:t>PlaceStructure.PlaceUpgrade</w:t>
+      </w:r>
+    </w:p>
+    <w:p>
+      <w:pPr>
+        <w:pStyle w:val="a9"/>
+        <w:numPr>
+          <w:ilvl w:val="0"/>
+          <w:numId w:val="43"/>
+        </w:numPr>
+        <w:rPr>
+          <w:rFonts w:ascii="Times New Roman" w:eastAsia="宋体" w:hAnsi="Times New Roman" w:cs="Times New Roman"/>
+        </w:rPr>
+      </w:pPr>
+      <w:r>
+        <w:rPr>
+          <w:rFonts w:ascii="Times New Roman" w:eastAsia="宋体" w:hAnsi="Times New Roman" w:cs="Times New Roman" w:hint="eastAsia"/>
+        </w:rPr>
+        <w:t>触发编辑器支持</w:t>
+      </w:r>
+      <w:r>
+        <w:rPr>
+          <w:rFonts w:ascii="Times New Roman" w:eastAsia="宋体" w:hAnsi="Times New Roman" w:cs="Times New Roman" w:hint="eastAsia"/>
+        </w:rPr>
+        <w:t>多</w:t>
+      </w:r>
+      <w:r>
+        <w:rPr>
+          <w:rFonts w:ascii="Times New Roman" w:eastAsia="宋体" w:hAnsi="Times New Roman" w:cs="Times New Roman" w:hint="eastAsia"/>
+        </w:rPr>
+        <w:t>开</w:t>
+      </w:r>
+      <w:r>
+        <w:rPr>
+          <w:rFonts w:ascii="Times New Roman" w:eastAsia="宋体" w:hAnsi="Times New Roman" w:cs="Times New Roman" w:hint="eastAsia"/>
+        </w:rPr>
+        <w:t>，支持通过拖拽触发编辑器上的绿点设置参数</w:t>
+      </w:r>
+      <w:r>
+        <w:rPr>
+          <w:rFonts w:ascii="Times New Roman" w:eastAsia="宋体" w:hAnsi="Times New Roman" w:cs="Times New Roman" w:hint="eastAsia"/>
+        </w:rPr>
+        <w:t>，单击绿点可以为地图上的单位设置标签</w:t>
+      </w:r>
+    </w:p>
+    <w:p>
+      <w:pPr>
+        <w:pStyle w:val="a9"/>
+        <w:numPr>
+          <w:ilvl w:val="0"/>
+          <w:numId w:val="43"/>
+        </w:numPr>
+        <w:rPr>
+          <w:rFonts w:ascii="Times New Roman" w:eastAsia="宋体" w:hAnsi="Times New Roman" w:cs="Times New Roman"/>
+        </w:rPr>
+      </w:pPr>
+      <w:r>
+        <w:rPr>
+          <w:rFonts w:ascii="Times New Roman" w:eastAsia="宋体" w:hAnsi="Times New Roman" w:cs="Times New Roman" w:hint="eastAsia"/>
+        </w:rPr>
+        <w:t>作战小队、特遣部队、动作脚本编辑器支持通过拖拽</w:t>
+      </w:r>
+      <w:r>
+        <w:rPr>
+          <w:rFonts w:ascii="Times New Roman" w:eastAsia="宋体" w:hAnsi="Times New Roman" w:cs="Times New Roman" w:hint="eastAsia"/>
+        </w:rPr>
+        <w:t>绿点</w:t>
+      </w:r>
+      <w:r>
+        <w:rPr>
+          <w:rFonts w:ascii="Times New Roman" w:eastAsia="宋体" w:hAnsi="Times New Roman" w:cs="Times New Roman" w:hint="eastAsia"/>
+        </w:rPr>
+        <w:t>设置参数</w:t>
+      </w:r>
+    </w:p>
+    <w:p>
+      <w:pPr>
+        <w:pStyle w:val="a9"/>
+        <w:numPr>
+          <w:ilvl w:val="0"/>
+          <w:numId w:val="43"/>
+        </w:numPr>
+        <w:rPr>
+          <w:rFonts w:ascii="Times New Roman" w:eastAsia="宋体" w:hAnsi="Times New Roman" w:cs="Times New Roman"/>
+        </w:rPr>
+      </w:pPr>
+      <w:r>
+        <w:rPr>
+          <w:rFonts w:ascii="Times New Roman" w:eastAsia="宋体" w:hAnsi="Times New Roman" w:cs="Times New Roman" w:hint="eastAsia"/>
+        </w:rPr>
+        <w:t>修复当地形浏览器位于覆盖物视图时，切换框架模式会导致视图切换至地形的</w:t>
+      </w:r>
+      <w:r>
+        <w:rPr>
+          <w:rFonts w:ascii="Times New Roman" w:eastAsia="宋体" w:hAnsi="Times New Roman" w:cs="Times New Roman" w:hint="eastAsia"/>
+        </w:rPr>
+        <w:t>bug</w:t>
+      </w:r>
+    </w:p>
+    <w:p>
+      <w:pPr>
+        <w:pStyle w:val="a9"/>
+        <w:numPr>
+          <w:ilvl w:val="0"/>
+          <w:numId w:val="43"/>
+        </w:numPr>
+        <w:rPr>
+          <w:rFonts w:ascii="Times New Roman" w:eastAsia="宋体" w:hAnsi="Times New Roman" w:cs="Times New Roman"/>
+        </w:rPr>
+      </w:pPr>
+      <w:r>
+        <w:rPr>
+          <w:rFonts w:ascii="Times New Roman" w:eastAsia="宋体" w:hAnsi="Times New Roman" w:cs="Times New Roman" w:hint="eastAsia"/>
+        </w:rPr>
+        <w:t>优化高架桥阴影渲染</w:t>
+      </w:r>
+    </w:p>
+    <w:p>
+      <w:pPr>
+        <w:pStyle w:val="a9"/>
+        <w:numPr>
+          <w:ilvl w:val="0"/>
+          <w:numId w:val="43"/>
+        </w:numPr>
+        <w:rPr>
+          <w:rFonts w:ascii="Times New Roman" w:eastAsia="宋体" w:hAnsi="Times New Roman" w:cs="Times New Roman"/>
+        </w:rPr>
+      </w:pPr>
+      <w:r>
+        <w:rPr>
+          <w:rFonts w:ascii="Times New Roman" w:eastAsia="宋体" w:hAnsi="Times New Roman" w:cs="Times New Roman" w:hint="eastAsia"/>
+        </w:rPr>
+        <w:t>使用格式刷时会显示被修改的属性</w:t>
+      </w:r>
+    </w:p>
+    <w:p>
+      <w:pPr>
+        <w:pStyle w:val="a9"/>
+        <w:numPr>
+          <w:ilvl w:val="0"/>
+          <w:numId w:val="43"/>
+        </w:numPr>
+        <w:rPr>
+          <w:rFonts w:ascii="Times New Roman" w:eastAsia="宋体" w:hAnsi="Times New Roman" w:cs="Times New Roman"/>
+        </w:rPr>
+      </w:pPr>
+      <w:r>
+        <w:rPr>
+          <w:rFonts w:ascii="Times New Roman" w:eastAsia="宋体" w:hAnsi="Times New Roman" w:cs="Times New Roman" w:hint="eastAsia"/>
+        </w:rPr>
+        <w:t>优化单元标记和路径点的渲染效率</w:t>
+      </w:r>
+    </w:p>
+    <w:p>
+      <w:pPr>
+        <w:pStyle w:val="a9"/>
+        <w:numPr>
+          <w:ilvl w:val="0"/>
+          <w:numId w:val="43"/>
+        </w:numPr>
+        <w:rPr>
+          <w:rFonts w:ascii="Times New Roman" w:eastAsia="宋体" w:hAnsi="Times New Roman" w:cs="Times New Roman"/>
+        </w:rPr>
+      </w:pPr>
+      <w:r>
+        <w:rPr>
+          <w:rFonts w:ascii="Times New Roman" w:eastAsia="宋体" w:hAnsi="Times New Roman" w:cs="Times New Roman" w:hint="eastAsia"/>
+        </w:rPr>
+        <w:t>支持车辆单位的额外炮塔和额外炮管</w:t>
+      </w:r>
+    </w:p>
+    <w:p>
+      <w:pPr>
+        <w:pStyle w:val="a9"/>
+        <w:numPr>
+          <w:ilvl w:val="0"/>
+          <w:numId w:val="43"/>
+        </w:numPr>
+        <w:rPr>
+          <w:rFonts w:ascii="Times New Roman" w:eastAsia="宋体" w:hAnsi="Times New Roman" w:cs="Times New Roman"/>
+        </w:rPr>
+      </w:pPr>
+      <w:r>
+        <w:rPr>
+          <w:rFonts w:ascii="Times New Roman" w:eastAsia="宋体" w:hAnsi="Times New Roman" w:cs="Times New Roman"/>
+        </w:rPr>
+        <w:t>I</w:t>
+      </w:r>
+      <w:r>
+        <w:rPr>
+          <w:rFonts w:ascii="Times New Roman" w:eastAsia="宋体" w:hAnsi="Times New Roman" w:cs="Times New Roman" w:hint="eastAsia"/>
+        </w:rPr>
+        <w:t>ni</w:t>
+      </w:r>
+      <w:r>
+        <w:rPr>
+          <w:rFonts w:ascii="Times New Roman" w:eastAsia="宋体" w:hAnsi="Times New Roman" w:cs="Times New Roman" w:hint="eastAsia"/>
+        </w:rPr>
+        <w:t>编辑器和</w:t>
+      </w:r>
+      <w:r>
+        <w:rPr>
+          <w:rFonts w:ascii="Times New Roman" w:eastAsia="宋体" w:hAnsi="Times New Roman" w:cs="Times New Roman" w:hint="eastAsia"/>
+        </w:rPr>
+        <w:t>lua</w:t>
+      </w:r>
+      <w:r>
+        <w:rPr>
+          <w:rFonts w:ascii="Times New Roman" w:eastAsia="宋体" w:hAnsi="Times New Roman" w:cs="Times New Roman" w:hint="eastAsia"/>
+        </w:rPr>
+        <w:t>脚本输入窗口引入</w:t>
+      </w:r>
+      <w:r>
+        <w:rPr>
+          <w:rFonts w:ascii="Times New Roman" w:eastAsia="宋体" w:hAnsi="Times New Roman" w:cs="Times New Roman" w:hint="eastAsia"/>
+        </w:rPr>
+        <w:t>Scintilla</w:t>
+      </w:r>
+      <w:r>
+        <w:rPr>
+          <w:rFonts w:ascii="Times New Roman" w:eastAsia="宋体" w:hAnsi="Times New Roman" w:cs="Times New Roman" w:hint="eastAsia"/>
+        </w:rPr>
+        <w:t>引擎（</w:t>
+      </w:r>
+      <w:r>
+        <w:rPr>
+          <w:rFonts w:ascii="Times New Roman" w:eastAsia="宋体" w:hAnsi="Times New Roman" w:cs="Times New Roman" w:hint="eastAsia"/>
+        </w:rPr>
+        <w:t>notepad++</w:t>
+      </w:r>
+      <w:r>
+        <w:rPr>
+          <w:rFonts w:ascii="Times New Roman" w:eastAsia="宋体" w:hAnsi="Times New Roman" w:cs="Times New Roman" w:hint="eastAsia"/>
+        </w:rPr>
+        <w:t>同款），支持语法高亮</w:t>
+      </w:r>
+      <w:r>
+        <w:rPr>
+          <w:rFonts w:ascii="Times New Roman" w:eastAsia="宋体" w:hAnsi="Times New Roman" w:cs="Times New Roman" w:hint="eastAsia"/>
+        </w:rPr>
+        <w:t>、行数显示、矩形选择等特性</w:t>
+      </w:r>
+    </w:p>
+    <w:p>
+      <w:pPr>
+        <w:pStyle w:val="a9"/>
+        <w:numPr>
+          <w:ilvl w:val="0"/>
+          <w:numId w:val="43"/>
+        </w:numPr>
+        <w:rPr>
+          <w:rFonts w:ascii="Times New Roman" w:eastAsia="宋体" w:hAnsi="Times New Roman" w:cs="Times New Roman"/>
+        </w:rPr>
+      </w:pPr>
+      <w:r>
+        <w:rPr>
+          <w:rFonts w:ascii="Times New Roman" w:eastAsia="宋体" w:hAnsi="Times New Roman" w:cs="Times New Roman" w:hint="eastAsia"/>
+        </w:rPr>
+        <w:t>修复触发资源重载后，自定义地形组崩溃的</w:t>
+      </w:r>
+      <w:r>
+        <w:rPr>
+          <w:rFonts w:ascii="Times New Roman" w:eastAsia="宋体" w:hAnsi="Times New Roman" w:cs="Times New Roman" w:hint="eastAsia"/>
+        </w:rPr>
+        <w:t>bug</w:t>
+      </w:r>
+    </w:p>
+    <w:p>
+      <w:pPr>
+        <w:pStyle w:val="a9"/>
+        <w:numPr>
+          <w:ilvl w:val="0"/>
+          <w:numId w:val="43"/>
+        </w:numPr>
+        <w:rPr>
+          <w:rFonts w:ascii="Times New Roman" w:eastAsia="宋体" w:hAnsi="Times New Roman" w:cs="Times New Roman"/>
+        </w:rPr>
+      </w:pPr>
+      <w:r>
+        <w:rPr>
+          <w:rFonts w:ascii="Times New Roman" w:eastAsia="宋体" w:hAnsi="Times New Roman" w:cs="Times New Roman" w:hint="eastAsia"/>
+        </w:rPr>
+        <w:t>触发编辑器的行为列表支持多选，新增“上移”“下移”与“拆分”按钮，可以将选中的行为上下移动或拆分出新触发</w:t>
+      </w:r>
+    </w:p>
+    <w:p>
+      <w:pPr>
+        <w:pStyle w:val="a9"/>
+        <w:numPr>
+          <w:ilvl w:val="0"/>
+          <w:numId w:val="43"/>
+        </w:numPr>
+        <w:rPr>
+          <w:rFonts w:ascii="Times New Roman" w:eastAsia="宋体" w:hAnsi="Times New Roman" w:cs="Times New Roman"/>
+        </w:rPr>
+      </w:pPr>
+      <w:r>
+        <w:rPr>
+          <w:rFonts w:ascii="Times New Roman" w:eastAsia="宋体" w:hAnsi="Times New Roman" w:cs="Times New Roman" w:hint="eastAsia"/>
+        </w:rPr>
+        <w:t>支持通过按住</w:t>
+      </w:r>
+      <w:r>
+        <w:rPr>
+          <w:rFonts w:ascii="Times New Roman" w:eastAsia="宋体" w:hAnsi="Times New Roman" w:cs="Times New Roman" w:hint="eastAsia"/>
+        </w:rPr>
+        <w:t>alt</w:t>
+      </w:r>
+      <w:r>
+        <w:rPr>
+          <w:rFonts w:ascii="Times New Roman" w:eastAsia="宋体" w:hAnsi="Times New Roman" w:cs="Times New Roman" w:hint="eastAsia"/>
+        </w:rPr>
+        <w:t>键直线放置单元标记</w:t>
+      </w:r>
+    </w:p>
+    <w:p>
+      <w:pPr>
+        <w:pStyle w:val="a9"/>
+        <w:numPr>
+          <w:ilvl w:val="0"/>
+          <w:numId w:val="43"/>
+        </w:numPr>
+        <w:rPr>
+          <w:rFonts w:ascii="Times New Roman" w:eastAsia="宋体" w:hAnsi="Times New Roman" w:cs="Times New Roman"/>
+        </w:rPr>
+      </w:pPr>
+      <w:r>
+        <w:rPr>
+          <w:rFonts w:ascii="Times New Roman" w:eastAsia="宋体" w:hAnsi="Times New Roman" w:cs="Times New Roman" w:hint="eastAsia"/>
+        </w:rPr>
+        <w:t>支持通过设置附加命令行参数直接打开地图，格式为</w:t>
+      </w:r>
+      <w:r>
+        <w:rPr>
+          <w:rFonts w:ascii="Times New Roman" w:eastAsia="宋体" w:hAnsi="Times New Roman" w:cs="Times New Roman" w:hint="eastAsia"/>
+        </w:rPr>
+        <w:t xml:space="preserve">-o </w:t>
+      </w:r>
+      <w:r>
+        <w:rPr>
+          <w:rFonts w:ascii="Times New Roman" w:eastAsia="宋体" w:hAnsi="Times New Roman" w:cs="Times New Roman"/>
+        </w:rPr>
+        <w:t>“</w:t>
+      </w:r>
+      <w:r>
+        <w:rPr>
+          <w:rFonts w:ascii="Times New Roman" w:eastAsia="宋体" w:hAnsi="Times New Roman" w:cs="Times New Roman" w:hint="eastAsia"/>
+        </w:rPr>
+        <w:t>地图路径</w:t>
+      </w:r>
+      <w:r>
+        <w:rPr>
+          <w:rFonts w:ascii="Times New Roman" w:eastAsia="宋体" w:hAnsi="Times New Roman" w:cs="Times New Roman"/>
+        </w:rPr>
+        <w:t>”</w:t>
+      </w:r>
+      <w:r>
+        <w:rPr>
+          <w:rFonts w:ascii="Times New Roman" w:eastAsia="宋体" w:hAnsi="Times New Roman" w:cs="Times New Roman" w:hint="eastAsia"/>
+        </w:rPr>
+        <w:t>或</w:t>
+      </w:r>
+      <w:r>
+        <w:rPr>
+          <w:rFonts w:ascii="Times New Roman" w:eastAsia="宋体" w:hAnsi="Times New Roman" w:cs="Times New Roman" w:hint="eastAsia"/>
+        </w:rPr>
+        <w:t xml:space="preserve">--open </w:t>
+      </w:r>
+      <w:r>
+        <w:rPr>
+          <w:rFonts w:ascii="Times New Roman" w:eastAsia="宋体" w:hAnsi="Times New Roman" w:cs="Times New Roman"/>
+        </w:rPr>
+        <w:t>“</w:t>
+      </w:r>
+      <w:r>
+        <w:rPr>
+          <w:rFonts w:ascii="Times New Roman" w:eastAsia="宋体" w:hAnsi="Times New Roman" w:cs="Times New Roman" w:hint="eastAsia"/>
+        </w:rPr>
+        <w:t>地图路径</w:t>
+      </w:r>
+      <w:r>
+        <w:rPr>
+          <w:rFonts w:ascii="Times New Roman" w:eastAsia="宋体" w:hAnsi="Times New Roman" w:cs="Times New Roman"/>
+        </w:rPr>
+        <w:t>”</w:t>
+      </w:r>
+      <w:r>
+        <w:rPr>
+          <w:rFonts w:ascii="Times New Roman" w:eastAsia="宋体" w:hAnsi="Times New Roman" w:cs="Times New Roman" w:hint="eastAsia"/>
+        </w:rPr>
+        <w:t>，命令行参数可以填写在</w:t>
+      </w:r>
+      <w:r>
+        <w:rPr>
+          <w:rFonts w:ascii="Times New Roman" w:eastAsia="宋体" w:hAnsi="Times New Roman" w:cs="Times New Roman" w:hint="eastAsia"/>
+        </w:rPr>
+        <w:t>FA2spLaunch.exe</w:t>
+      </w:r>
+      <w:r>
+        <w:rPr>
+          <w:rFonts w:ascii="Times New Roman" w:eastAsia="宋体" w:hAnsi="Times New Roman" w:cs="Times New Roman" w:hint="eastAsia"/>
+        </w:rPr>
+        <w:t>后方，或者</w:t>
+      </w:r>
+      <w:r>
+        <w:rPr>
+          <w:rFonts w:ascii="Times New Roman" w:eastAsia="宋体" w:hAnsi="Times New Roman" w:cs="Times New Roman" w:hint="eastAsia"/>
+        </w:rPr>
+        <w:t>RunFA2sp.bat</w:t>
+      </w:r>
+      <w:r>
+        <w:rPr>
+          <w:rFonts w:ascii="Times New Roman" w:eastAsia="宋体" w:hAnsi="Times New Roman" w:cs="Times New Roman" w:hint="eastAsia"/>
+        </w:rPr>
+        <w:t>内</w:t>
+      </w:r>
+    </w:p>
+    <w:p>
+      <w:pPr>
+        <w:pStyle w:val="a9"/>
+        <w:numPr>
+          <w:ilvl w:val="0"/>
+          <w:numId w:val="43"/>
+        </w:numPr>
+        <w:rPr>
+          <w:rFonts w:ascii="Times New Roman" w:eastAsia="宋体" w:hAnsi="Times New Roman" w:cs="Times New Roman"/>
+        </w:rPr>
+      </w:pPr>
+      <w:r>
+        <w:rPr>
+          <w:rFonts w:ascii="Times New Roman" w:eastAsia="宋体" w:hAnsi="Times New Roman" w:cs="Times New Roman" w:hint="eastAsia"/>
+        </w:rPr>
+        <w:t>修复当使用放置于地图行为时，对应的标签被删除后仍能摆放单元标记的</w:t>
+      </w:r>
+      <w:r>
+        <w:rPr>
+          <w:rFonts w:ascii="Times New Roman" w:eastAsia="宋体" w:hAnsi="Times New Roman" w:cs="Times New Roman" w:hint="eastAsia"/>
+        </w:rPr>
+        <w:t>bug</w:t>
+      </w:r>
+    </w:p>
+    <w:p>
+      <w:pPr>
+        <w:pStyle w:val="a9"/>
+        <w:numPr>
+          <w:ilvl w:val="0"/>
+          <w:numId w:val="43"/>
+        </w:numPr>
+        <w:rPr>
+          <w:rFonts w:ascii="Times New Roman" w:eastAsia="宋体" w:hAnsi="Times New Roman" w:cs="Times New Roman"/>
+        </w:rPr>
+      </w:pPr>
+      <w:r>
+        <w:rPr>
+          <w:rFonts w:ascii="Times New Roman" w:eastAsia="宋体" w:hAnsi="Times New Roman" w:cs="Times New Roman" w:hint="eastAsia"/>
+        </w:rPr>
+        <w:t>TheaterInfo</w:t>
+      </w:r>
+      <w:r>
+        <w:rPr>
+          <w:rFonts w:ascii="Times New Roman" w:eastAsia="宋体" w:hAnsi="Times New Roman" w:cs="Times New Roman" w:hint="eastAsia"/>
+        </w:rPr>
+        <w:t>内的自定义斜坡类型支持指定地形组下的特定地形块</w:t>
+      </w:r>
+    </w:p>
+    <w:p>
+      <w:pPr>
+        <w:pStyle w:val="a9"/>
+        <w:numPr>
+          <w:ilvl w:val="0"/>
+          <w:numId w:val="43"/>
+        </w:numPr>
+        <w:rPr>
+          <w:rFonts w:ascii="Times New Roman" w:eastAsia="宋体" w:hAnsi="Times New Roman" w:cs="Times New Roman"/>
+        </w:rPr>
+      </w:pPr>
+      <w:r>
+        <w:rPr>
+          <w:rFonts w:ascii="Times New Roman" w:eastAsia="宋体" w:hAnsi="Times New Roman" w:cs="Times New Roman" w:hint="eastAsia"/>
+        </w:rPr>
+        <w:t>支持为无图像单位显示缺省图像，详见</w:t>
+      </w:r>
+      <w:r>
+        <w:rPr>
+          <w:rFonts w:ascii="Times New Roman" w:eastAsia="宋体" w:hAnsi="Times New Roman" w:cs="Times New Roman" w:hint="eastAsia"/>
+        </w:rPr>
+        <w:t>UseDefaultUnitImage</w:t>
+      </w:r>
+    </w:p>
+    <w:p>
+      <w:pPr>
+        <w:pStyle w:val="a9"/>
+        <w:numPr>
+          <w:ilvl w:val="0"/>
+          <w:numId w:val="43"/>
+        </w:numPr>
+        <w:rPr>
+          <w:rFonts w:ascii="Times New Roman" w:eastAsia="宋体" w:hAnsi="Times New Roman" w:cs="Times New Roman"/>
+        </w:rPr>
+      </w:pPr>
+      <w:r>
+        <w:rPr>
+          <w:rFonts w:ascii="Times New Roman" w:eastAsia="宋体" w:hAnsi="Times New Roman" w:cs="Times New Roman" w:hint="eastAsia"/>
+        </w:rPr>
+        <w:t>支持</w:t>
+      </w:r>
+      <w:r>
+        <w:rPr>
+          <w:rFonts w:ascii="Times New Roman" w:eastAsia="宋体" w:hAnsi="Times New Roman" w:cs="Times New Roman" w:hint="eastAsia"/>
+        </w:rPr>
+        <w:t>ares</w:t>
+      </w:r>
+      <w:r>
+        <w:rPr>
+          <w:rFonts w:ascii="Times New Roman" w:eastAsia="宋体" w:hAnsi="Times New Roman" w:cs="Times New Roman" w:hint="eastAsia"/>
+        </w:rPr>
+        <w:t>的自定义军衔</w:t>
+      </w:r>
+    </w:p>
+    <w:p>
+      <w:pPr>
+        <w:pStyle w:val="a9"/>
+        <w:numPr>
+          <w:ilvl w:val="0"/>
+          <w:numId w:val="43"/>
+        </w:numPr>
+        <w:rPr>
+          <w:rFonts w:ascii="Times New Roman" w:eastAsia="宋体" w:hAnsi="Times New Roman" w:cs="Times New Roman"/>
+        </w:rPr>
+      </w:pPr>
+      <w:r>
+        <w:rPr>
+          <w:rFonts w:ascii="Times New Roman" w:eastAsia="宋体" w:hAnsi="Times New Roman" w:cs="Times New Roman" w:hint="eastAsia"/>
+        </w:rPr>
+        <w:t>对无图像地形对象和污染显示文本</w:t>
+      </w:r>
+    </w:p>
+    <w:p>
+      <w:pPr>
+        <w:pStyle w:val="a9"/>
+        <w:numPr>
+          <w:ilvl w:val="0"/>
+          <w:numId w:val="43"/>
+        </w:numPr>
+        <w:rPr>
+          <w:rFonts w:ascii="Times New Roman" w:eastAsia="宋体" w:hAnsi="Times New Roman" w:cs="Times New Roman"/>
+        </w:rPr>
+      </w:pPr>
+      <w:r>
+        <w:rPr>
+          <w:rFonts w:ascii="Times New Roman" w:eastAsia="宋体" w:hAnsi="Times New Roman" w:cs="Times New Roman" w:hint="eastAsia"/>
+        </w:rPr>
         <w:lastRenderedPageBreak/>
-        <w:t>修复自定义面积建筑的渲染遮挡问题</w:t>
-      </w:r>
-    </w:p>
-    <w:p>
-      <w:pPr>
-        <w:pStyle w:val="a9"/>
-        <w:numPr>
-          <w:ilvl w:val="0"/>
-          <w:numId w:val="43"/>
-        </w:numPr>
-        <w:rPr>
-          <w:rFonts w:ascii="Times New Roman" w:eastAsia="宋体" w:hAnsi="Times New Roman" w:cs="Times New Roman"/>
-        </w:rPr>
-      </w:pPr>
-      <w:r>
-        <w:rPr>
-          <w:rFonts w:ascii="Times New Roman" w:eastAsia="宋体" w:hAnsi="Times New Roman" w:cs="Times New Roman" w:hint="eastAsia"/>
-        </w:rPr>
-        <w:t>修复删除地图</w:t>
-      </w:r>
-      <w:r>
-        <w:rPr>
-          <w:rFonts w:ascii="Times New Roman" w:eastAsia="宋体" w:hAnsi="Times New Roman" w:cs="Times New Roman" w:hint="eastAsia"/>
-        </w:rPr>
-        <w:t>include</w:t>
-      </w:r>
-      <w:r>
-        <w:rPr>
-          <w:rFonts w:ascii="Times New Roman" w:eastAsia="宋体" w:hAnsi="Times New Roman" w:cs="Times New Roman" w:hint="eastAsia"/>
-        </w:rPr>
-        <w:t>小节后不能正确保存部分</w:t>
-      </w:r>
-      <w:r>
-        <w:rPr>
-          <w:rFonts w:ascii="Times New Roman" w:eastAsia="宋体" w:hAnsi="Times New Roman" w:cs="Times New Roman" w:hint="eastAsia"/>
-        </w:rPr>
-        <w:t>ini</w:t>
-      </w:r>
-      <w:r>
-        <w:rPr>
-          <w:rFonts w:ascii="Times New Roman" w:eastAsia="宋体" w:hAnsi="Times New Roman" w:cs="Times New Roman" w:hint="eastAsia"/>
-        </w:rPr>
-        <w:t>小节的</w:t>
-      </w:r>
-      <w:r>
-        <w:rPr>
-          <w:rFonts w:ascii="Times New Roman" w:eastAsia="宋体" w:hAnsi="Times New Roman" w:cs="Times New Roman" w:hint="eastAsia"/>
-        </w:rPr>
-        <w:t>bug</w:t>
-      </w:r>
-      <w:r>
-        <w:rPr>
-          <w:rFonts w:ascii="Times New Roman" w:eastAsia="宋体" w:hAnsi="Times New Roman" w:cs="Times New Roman" w:hint="eastAsia"/>
-        </w:rPr>
-        <w:t>。</w:t>
-      </w:r>
-      <w:r>
-        <w:rPr>
-          <w:rFonts w:ascii="Times New Roman" w:eastAsia="宋体" w:hAnsi="Times New Roman" w:cs="Times New Roman" w:hint="eastAsia"/>
-        </w:rPr>
-        <w:t>注意，地图</w:t>
-      </w:r>
-      <w:r>
-        <w:rPr>
-          <w:rFonts w:ascii="Times New Roman" w:eastAsia="宋体" w:hAnsi="Times New Roman" w:cs="Times New Roman" w:hint="eastAsia"/>
-        </w:rPr>
-        <w:t>include</w:t>
-      </w:r>
-      <w:r>
-        <w:rPr>
-          <w:rFonts w:ascii="Times New Roman" w:eastAsia="宋体" w:hAnsi="Times New Roman" w:cs="Times New Roman" w:hint="eastAsia"/>
-        </w:rPr>
-        <w:t>支持仍属于实验性功能，不建议使用</w:t>
-      </w:r>
-      <w:r>
-        <w:rPr>
-          <w:rFonts w:ascii="Times New Roman" w:eastAsia="宋体" w:hAnsi="Times New Roman" w:cs="Times New Roman" w:hint="eastAsia"/>
-        </w:rPr>
-        <w:t>；由于技术限制，保存时并不能固定已有的</w:t>
-      </w:r>
-      <w:r>
-        <w:rPr>
-          <w:rFonts w:ascii="Times New Roman" w:eastAsia="宋体" w:hAnsi="Times New Roman" w:cs="Times New Roman" w:hint="eastAsia"/>
-        </w:rPr>
-        <w:t>include</w:t>
-      </w:r>
-      <w:r>
-        <w:rPr>
-          <w:rFonts w:ascii="Times New Roman" w:eastAsia="宋体" w:hAnsi="Times New Roman" w:cs="Times New Roman" w:hint="eastAsia"/>
-        </w:rPr>
-        <w:t>顺序</w:t>
-      </w:r>
-    </w:p>
-    <w:p>
-      <w:pPr>
-        <w:pStyle w:val="a9"/>
-        <w:numPr>
-          <w:ilvl w:val="0"/>
-          <w:numId w:val="43"/>
-        </w:numPr>
-        <w:rPr>
-          <w:rFonts w:ascii="Times New Roman" w:eastAsia="宋体" w:hAnsi="Times New Roman" w:cs="Times New Roman"/>
-        </w:rPr>
-      </w:pPr>
-      <w:r>
-        <w:rPr>
-          <w:rFonts w:ascii="Times New Roman" w:eastAsia="宋体" w:hAnsi="Times New Roman" w:cs="Times New Roman" w:hint="eastAsia"/>
-        </w:rPr>
-        <w:t>小队变更时会即时刷新触发编辑器对应菜单</w:t>
-      </w:r>
-    </w:p>
-    <w:p>
-      <w:pPr>
-        <w:pStyle w:val="a9"/>
-        <w:numPr>
-          <w:ilvl w:val="0"/>
-          <w:numId w:val="43"/>
-        </w:numPr>
-        <w:rPr>
-          <w:rFonts w:ascii="Times New Roman" w:eastAsia="宋体" w:hAnsi="Times New Roman" w:cs="Times New Roman"/>
-        </w:rPr>
-      </w:pPr>
-      <w:r>
-        <w:rPr>
-          <w:rFonts w:ascii="Times New Roman" w:eastAsia="宋体" w:hAnsi="Times New Roman" w:cs="Times New Roman" w:hint="eastAsia"/>
-        </w:rPr>
-        <w:t>新增选项</w:t>
-      </w:r>
-      <w:r>
-        <w:rPr>
-          <w:rFonts w:ascii="Times New Roman" w:eastAsia="宋体" w:hAnsi="Times New Roman" w:cs="Times New Roman" w:hint="eastAsia"/>
-        </w:rPr>
-        <w:t>SaveMap.KeepComments</w:t>
-      </w:r>
-      <w:r>
-        <w:rPr>
-          <w:rFonts w:ascii="Times New Roman" w:eastAsia="宋体" w:hAnsi="Times New Roman" w:cs="Times New Roman" w:hint="eastAsia"/>
-        </w:rPr>
-        <w:t>，在保存地图时可以保留注释</w:t>
-      </w:r>
-      <w:r>
-        <w:rPr>
-          <w:rFonts w:ascii="Times New Roman" w:eastAsia="宋体" w:hAnsi="Times New Roman" w:cs="Times New Roman" w:hint="eastAsia"/>
-        </w:rPr>
-        <w:t>，</w:t>
-      </w:r>
-      <w:r>
-        <w:rPr>
-          <w:rFonts w:ascii="Times New Roman" w:eastAsia="宋体" w:hAnsi="Times New Roman" w:cs="Times New Roman" w:hint="eastAsia"/>
-        </w:rPr>
-        <w:t>ini</w:t>
-      </w:r>
-      <w:r>
-        <w:rPr>
-          <w:rFonts w:ascii="Times New Roman" w:eastAsia="宋体" w:hAnsi="Times New Roman" w:cs="Times New Roman" w:hint="eastAsia"/>
-        </w:rPr>
-        <w:t>编辑器中可以保留并显示注释</w:t>
-      </w:r>
-    </w:p>
-    <w:p>
-      <w:pPr>
-        <w:pStyle w:val="a9"/>
-        <w:numPr>
-          <w:ilvl w:val="0"/>
-          <w:numId w:val="43"/>
-        </w:numPr>
-        <w:rPr>
-          <w:rFonts w:ascii="Times New Roman" w:eastAsia="宋体" w:hAnsi="Times New Roman" w:cs="Times New Roman"/>
-        </w:rPr>
-      </w:pPr>
-      <w:r>
-        <w:rPr>
-          <w:rFonts w:ascii="Times New Roman" w:eastAsia="宋体" w:hAnsi="Times New Roman" w:cs="Times New Roman" w:hint="eastAsia"/>
-        </w:rPr>
-        <w:t>在触发编辑器中为无标签的重复类型添加说明文本</w:t>
-      </w:r>
-    </w:p>
-    <w:p>
-      <w:pPr>
-        <w:pStyle w:val="a9"/>
-        <w:numPr>
-          <w:ilvl w:val="0"/>
-          <w:numId w:val="43"/>
-        </w:numPr>
-        <w:rPr>
-          <w:rFonts w:ascii="Times New Roman" w:eastAsia="宋体" w:hAnsi="Times New Roman" w:cs="Times New Roman"/>
-        </w:rPr>
-      </w:pPr>
-      <w:r>
-        <w:rPr>
-          <w:rFonts w:ascii="Times New Roman" w:eastAsia="宋体" w:hAnsi="Times New Roman" w:cs="Times New Roman" w:hint="eastAsia"/>
-        </w:rPr>
-        <w:t>新增加载</w:t>
-      </w:r>
-      <w:r>
-        <w:rPr>
-          <w:rFonts w:ascii="Times New Roman" w:eastAsia="宋体" w:hAnsi="Times New Roman" w:cs="Times New Roman" w:hint="eastAsia"/>
-        </w:rPr>
-        <w:t>/</w:t>
-      </w:r>
-      <w:r>
-        <w:rPr>
-          <w:rFonts w:ascii="Times New Roman" w:eastAsia="宋体" w:hAnsi="Times New Roman" w:cs="Times New Roman" w:hint="eastAsia"/>
-        </w:rPr>
-        <w:t>保存文件的</w:t>
-      </w:r>
-      <w:r>
-        <w:rPr>
-          <w:rFonts w:ascii="Times New Roman" w:eastAsia="宋体" w:hAnsi="Times New Roman" w:cs="Times New Roman" w:hint="eastAsia"/>
-        </w:rPr>
-        <w:t>lua</w:t>
-      </w:r>
-      <w:r>
-        <w:rPr>
-          <w:rFonts w:ascii="Times New Roman" w:eastAsia="宋体" w:hAnsi="Times New Roman" w:cs="Times New Roman" w:hint="eastAsia"/>
-        </w:rPr>
-        <w:t>脚本函数</w:t>
-      </w:r>
-    </w:p>
-    <w:p>
-      <w:pPr>
-        <w:pStyle w:val="a9"/>
-        <w:numPr>
-          <w:ilvl w:val="0"/>
-          <w:numId w:val="43"/>
-        </w:numPr>
-        <w:rPr>
-          <w:rFonts w:ascii="Times New Roman" w:eastAsia="宋体" w:hAnsi="Times New Roman" w:cs="Times New Roman"/>
-        </w:rPr>
-      </w:pPr>
-      <w:r>
-        <w:rPr>
-          <w:rFonts w:ascii="Times New Roman" w:eastAsia="宋体" w:hAnsi="Times New Roman" w:cs="Times New Roman" w:hint="eastAsia"/>
-        </w:rPr>
-        <w:t>修复部分</w:t>
-      </w:r>
-      <w:r>
-        <w:rPr>
-          <w:rFonts w:ascii="Times New Roman" w:eastAsia="宋体" w:hAnsi="Times New Roman" w:cs="Times New Roman" w:hint="eastAsia"/>
-        </w:rPr>
-        <w:t>lua</w:t>
-      </w:r>
-      <w:r>
-        <w:rPr>
-          <w:rFonts w:ascii="Times New Roman" w:eastAsia="宋体" w:hAnsi="Times New Roman" w:cs="Times New Roman" w:hint="eastAsia"/>
-        </w:rPr>
-        <w:t>脚本的</w:t>
-      </w:r>
-      <w:r>
-        <w:rPr>
-          <w:rFonts w:ascii="Times New Roman" w:eastAsia="宋体" w:hAnsi="Times New Roman" w:cs="Times New Roman" w:hint="eastAsia"/>
-        </w:rPr>
-        <w:t>bug</w:t>
-      </w:r>
-    </w:p>
-    <w:p>
-      <w:pPr>
-        <w:pStyle w:val="a9"/>
-        <w:numPr>
-          <w:ilvl w:val="0"/>
-          <w:numId w:val="43"/>
-        </w:numPr>
-        <w:rPr>
-          <w:rFonts w:ascii="Times New Roman" w:eastAsia="宋体" w:hAnsi="Times New Roman" w:cs="Times New Roman"/>
-        </w:rPr>
-      </w:pPr>
-      <w:r>
-        <w:rPr>
-          <w:rFonts w:ascii="Times New Roman" w:eastAsia="宋体" w:hAnsi="Times New Roman" w:cs="Times New Roman" w:hint="eastAsia"/>
-        </w:rPr>
-        <w:t>围墙覆盖物支持</w:t>
-      </w:r>
-      <w:r>
-        <w:rPr>
-          <w:rFonts w:ascii="Times New Roman" w:eastAsia="宋体" w:hAnsi="Times New Roman" w:cs="Times New Roman" w:hint="eastAsia"/>
-        </w:rPr>
-        <w:t>根据最近的建筑</w:t>
-      </w:r>
-      <w:r>
-        <w:rPr>
-          <w:rFonts w:ascii="Times New Roman" w:eastAsia="宋体" w:hAnsi="Times New Roman" w:cs="Times New Roman" w:hint="eastAsia"/>
-        </w:rPr>
-        <w:t>显示所属色</w:t>
-      </w:r>
-      <w:r>
-        <w:rPr>
-          <w:rFonts w:ascii="Times New Roman" w:eastAsia="宋体" w:hAnsi="Times New Roman" w:cs="Times New Roman" w:hint="eastAsia"/>
-        </w:rPr>
-        <w:t>（并不能完全还原游戏）</w:t>
-      </w:r>
-      <w:r>
-        <w:rPr>
-          <w:rFonts w:ascii="Times New Roman" w:eastAsia="宋体" w:hAnsi="Times New Roman" w:cs="Times New Roman" w:hint="eastAsia"/>
-        </w:rPr>
-        <w:t>，详见</w:t>
-      </w:r>
-      <w:r>
-        <w:rPr>
-          <w:rFonts w:ascii="Times New Roman" w:eastAsia="宋体" w:hAnsi="Times New Roman" w:cs="Times New Roman" w:hint="eastAsia"/>
-        </w:rPr>
-        <w:t>InGameDisplay.RemapableOverlay</w:t>
-      </w:r>
-    </w:p>
-    <w:p>
-      <w:pPr>
-        <w:pStyle w:val="a9"/>
-        <w:numPr>
-          <w:ilvl w:val="0"/>
-          <w:numId w:val="43"/>
-        </w:numPr>
-        <w:rPr>
-          <w:rFonts w:ascii="Times New Roman" w:eastAsia="宋体" w:hAnsi="Times New Roman" w:cs="Times New Roman"/>
-        </w:rPr>
-      </w:pPr>
-      <w:r>
-        <w:rPr>
-          <w:rFonts w:ascii="Times New Roman" w:eastAsia="宋体" w:hAnsi="Times New Roman" w:cs="Times New Roman" w:hint="eastAsia"/>
-        </w:rPr>
-        <w:t>恢复心灵终结中被错误隐藏的部分地形组</w:t>
-      </w:r>
-    </w:p>
-    <w:p>
-      <w:pPr>
-        <w:pStyle w:val="a9"/>
-        <w:numPr>
-          <w:ilvl w:val="0"/>
-          <w:numId w:val="43"/>
-        </w:numPr>
-        <w:rPr>
-          <w:rFonts w:ascii="Times New Roman" w:eastAsia="宋体" w:hAnsi="Times New Roman" w:cs="Times New Roman"/>
-        </w:rPr>
-      </w:pPr>
-      <w:r>
-        <w:rPr>
-          <w:rFonts w:ascii="Times New Roman" w:eastAsia="宋体" w:hAnsi="Times New Roman" w:cs="Times New Roman" w:hint="eastAsia"/>
-        </w:rPr>
-        <w:t>支持直接向建筑上放置加载物</w:t>
-      </w:r>
-      <w:r>
-        <w:rPr>
-          <w:rFonts w:ascii="Times New Roman" w:eastAsia="宋体" w:hAnsi="Times New Roman" w:cs="Times New Roman" w:hint="eastAsia"/>
-        </w:rPr>
-        <w:t>，详见</w:t>
-      </w:r>
-      <w:r>
-        <w:rPr>
-          <w:rFonts w:ascii="Times New Roman" w:eastAsia="宋体" w:hAnsi="Times New Roman" w:cs="Times New Roman" w:hint="eastAsia"/>
-        </w:rPr>
-        <w:t>PlaceStructure.PlaceUpgrade</w:t>
-      </w:r>
-    </w:p>
-    <w:p>
-      <w:pPr>
-        <w:pStyle w:val="a9"/>
-        <w:numPr>
-          <w:ilvl w:val="0"/>
-          <w:numId w:val="43"/>
-        </w:numPr>
-        <w:rPr>
-          <w:rFonts w:ascii="Times New Roman" w:eastAsia="宋体" w:hAnsi="Times New Roman" w:cs="Times New Roman"/>
-        </w:rPr>
-      </w:pPr>
-      <w:r>
-        <w:rPr>
-          <w:rFonts w:ascii="Times New Roman" w:eastAsia="宋体" w:hAnsi="Times New Roman" w:cs="Times New Roman" w:hint="eastAsia"/>
-        </w:rPr>
-        <w:t>触发编辑器支持</w:t>
-      </w:r>
-      <w:r>
-        <w:rPr>
-          <w:rFonts w:ascii="Times New Roman" w:eastAsia="宋体" w:hAnsi="Times New Roman" w:cs="Times New Roman" w:hint="eastAsia"/>
-        </w:rPr>
-        <w:t>多</w:t>
-      </w:r>
-      <w:r>
-        <w:rPr>
-          <w:rFonts w:ascii="Times New Roman" w:eastAsia="宋体" w:hAnsi="Times New Roman" w:cs="Times New Roman" w:hint="eastAsia"/>
-        </w:rPr>
-        <w:t>开</w:t>
-      </w:r>
-      <w:r>
-        <w:rPr>
-          <w:rFonts w:ascii="Times New Roman" w:eastAsia="宋体" w:hAnsi="Times New Roman" w:cs="Times New Roman" w:hint="eastAsia"/>
-        </w:rPr>
-        <w:t>，支持通过拖拽触发编辑器上的绿点设置参数</w:t>
-      </w:r>
-      <w:r>
-        <w:rPr>
-          <w:rFonts w:ascii="Times New Roman" w:eastAsia="宋体" w:hAnsi="Times New Roman" w:cs="Times New Roman" w:hint="eastAsia"/>
-        </w:rPr>
-        <w:t>，单击绿点可以为地图上的单位设置标签</w:t>
-      </w:r>
-    </w:p>
-    <w:p>
-      <w:pPr>
-        <w:pStyle w:val="a9"/>
-        <w:numPr>
-          <w:ilvl w:val="0"/>
-          <w:numId w:val="43"/>
-        </w:numPr>
-        <w:rPr>
-          <w:rFonts w:ascii="Times New Roman" w:eastAsia="宋体" w:hAnsi="Times New Roman" w:cs="Times New Roman"/>
-        </w:rPr>
-      </w:pPr>
-      <w:r>
-        <w:rPr>
-          <w:rFonts w:ascii="Times New Roman" w:eastAsia="宋体" w:hAnsi="Times New Roman" w:cs="Times New Roman" w:hint="eastAsia"/>
-        </w:rPr>
-        <w:t>作战小队、特遣部队、动作脚本编辑器支持通过拖拽</w:t>
-      </w:r>
-      <w:r>
-        <w:rPr>
-          <w:rFonts w:ascii="Times New Roman" w:eastAsia="宋体" w:hAnsi="Times New Roman" w:cs="Times New Roman" w:hint="eastAsia"/>
-        </w:rPr>
-        <w:t>绿点</w:t>
-      </w:r>
-      <w:r>
-        <w:rPr>
-          <w:rFonts w:ascii="Times New Roman" w:eastAsia="宋体" w:hAnsi="Times New Roman" w:cs="Times New Roman" w:hint="eastAsia"/>
-        </w:rPr>
-        <w:t>设置参数</w:t>
-      </w:r>
-    </w:p>
-    <w:p>
-      <w:pPr>
-        <w:pStyle w:val="a9"/>
-        <w:numPr>
-          <w:ilvl w:val="0"/>
-          <w:numId w:val="43"/>
-        </w:numPr>
-        <w:rPr>
-          <w:rFonts w:ascii="Times New Roman" w:eastAsia="宋体" w:hAnsi="Times New Roman" w:cs="Times New Roman"/>
-        </w:rPr>
-      </w:pPr>
-      <w:r>
-        <w:rPr>
-          <w:rFonts w:ascii="Times New Roman" w:eastAsia="宋体" w:hAnsi="Times New Roman" w:cs="Times New Roman" w:hint="eastAsia"/>
-        </w:rPr>
-        <w:t>修复当地形浏览器位于覆盖物视图时，切换框架模式会导致视图切换至地形的</w:t>
-      </w:r>
-      <w:r>
-        <w:rPr>
-          <w:rFonts w:ascii="Times New Roman" w:eastAsia="宋体" w:hAnsi="Times New Roman" w:cs="Times New Roman" w:hint="eastAsia"/>
-        </w:rPr>
-        <w:t>bug</w:t>
-      </w:r>
-    </w:p>
-    <w:p>
-      <w:pPr>
-        <w:pStyle w:val="a9"/>
-        <w:numPr>
-          <w:ilvl w:val="0"/>
-          <w:numId w:val="43"/>
-        </w:numPr>
-        <w:rPr>
-          <w:rFonts w:ascii="Times New Roman" w:eastAsia="宋体" w:hAnsi="Times New Roman" w:cs="Times New Roman"/>
-        </w:rPr>
-      </w:pPr>
-      <w:r>
-        <w:rPr>
-          <w:rFonts w:ascii="Times New Roman" w:eastAsia="宋体" w:hAnsi="Times New Roman" w:cs="Times New Roman" w:hint="eastAsia"/>
-        </w:rPr>
-        <w:t>优化高架桥阴影渲染</w:t>
-      </w:r>
-    </w:p>
-    <w:p>
-      <w:pPr>
-        <w:pStyle w:val="a9"/>
-        <w:numPr>
-          <w:ilvl w:val="0"/>
-          <w:numId w:val="43"/>
-        </w:numPr>
-        <w:rPr>
-          <w:rFonts w:ascii="Times New Roman" w:eastAsia="宋体" w:hAnsi="Times New Roman" w:cs="Times New Roman"/>
-        </w:rPr>
-      </w:pPr>
-      <w:r>
-        <w:rPr>
-          <w:rFonts w:ascii="Times New Roman" w:eastAsia="宋体" w:hAnsi="Times New Roman" w:cs="Times New Roman" w:hint="eastAsia"/>
-        </w:rPr>
-        <w:t>使用格式刷时会显示被修改的属性</w:t>
-      </w:r>
-    </w:p>
-    <w:p>
-      <w:pPr>
-        <w:pStyle w:val="a9"/>
-        <w:numPr>
-          <w:ilvl w:val="0"/>
-          <w:numId w:val="43"/>
-        </w:numPr>
-        <w:rPr>
-          <w:rFonts w:ascii="Times New Roman" w:eastAsia="宋体" w:hAnsi="Times New Roman" w:cs="Times New Roman"/>
-        </w:rPr>
-      </w:pPr>
-      <w:r>
-        <w:rPr>
-          <w:rFonts w:ascii="Times New Roman" w:eastAsia="宋体" w:hAnsi="Times New Roman" w:cs="Times New Roman" w:hint="eastAsia"/>
-        </w:rPr>
-        <w:t>优化单元标记和路径点的渲染效率</w:t>
-      </w:r>
-    </w:p>
-    <w:p>
-      <w:pPr>
-        <w:pStyle w:val="a9"/>
-        <w:numPr>
-          <w:ilvl w:val="0"/>
-          <w:numId w:val="43"/>
-        </w:numPr>
-        <w:rPr>
-          <w:rFonts w:ascii="Times New Roman" w:eastAsia="宋体" w:hAnsi="Times New Roman" w:cs="Times New Roman"/>
-        </w:rPr>
-      </w:pPr>
-      <w:r>
-        <w:rPr>
-          <w:rFonts w:ascii="Times New Roman" w:eastAsia="宋体" w:hAnsi="Times New Roman" w:cs="Times New Roman" w:hint="eastAsia"/>
-        </w:rPr>
-        <w:t>支持车辆单位的额外炮塔和额外炮管</w:t>
-      </w:r>
-    </w:p>
-    <w:p>
-      <w:pPr>
-        <w:pStyle w:val="a9"/>
-        <w:numPr>
-          <w:ilvl w:val="0"/>
-          <w:numId w:val="43"/>
-        </w:numPr>
-        <w:rPr>
-          <w:rFonts w:ascii="Times New Roman" w:eastAsia="宋体" w:hAnsi="Times New Roman" w:cs="Times New Roman"/>
-        </w:rPr>
-      </w:pPr>
-      <w:r>
-        <w:rPr>
-          <w:rFonts w:ascii="Times New Roman" w:eastAsia="宋体" w:hAnsi="Times New Roman" w:cs="Times New Roman"/>
-        </w:rPr>
-        <w:t>I</w:t>
-      </w:r>
-      <w:r>
-        <w:rPr>
-          <w:rFonts w:ascii="Times New Roman" w:eastAsia="宋体" w:hAnsi="Times New Roman" w:cs="Times New Roman" w:hint="eastAsia"/>
-        </w:rPr>
-        <w:t>ni</w:t>
-      </w:r>
-      <w:r>
-        <w:rPr>
-          <w:rFonts w:ascii="Times New Roman" w:eastAsia="宋体" w:hAnsi="Times New Roman" w:cs="Times New Roman" w:hint="eastAsia"/>
-        </w:rPr>
-        <w:t>编辑器和</w:t>
-      </w:r>
-      <w:r>
-        <w:rPr>
-          <w:rFonts w:ascii="Times New Roman" w:eastAsia="宋体" w:hAnsi="Times New Roman" w:cs="Times New Roman" w:hint="eastAsia"/>
-        </w:rPr>
-        <w:t>lua</w:t>
-      </w:r>
-      <w:r>
-        <w:rPr>
-          <w:rFonts w:ascii="Times New Roman" w:eastAsia="宋体" w:hAnsi="Times New Roman" w:cs="Times New Roman" w:hint="eastAsia"/>
-        </w:rPr>
-        <w:t>脚本输入窗口引入</w:t>
-      </w:r>
-      <w:r>
-        <w:rPr>
-          <w:rFonts w:ascii="Times New Roman" w:eastAsia="宋体" w:hAnsi="Times New Roman" w:cs="Times New Roman" w:hint="eastAsia"/>
-        </w:rPr>
-        <w:t>Scintilla</w:t>
-      </w:r>
-      <w:r>
-        <w:rPr>
-          <w:rFonts w:ascii="Times New Roman" w:eastAsia="宋体" w:hAnsi="Times New Roman" w:cs="Times New Roman" w:hint="eastAsia"/>
-        </w:rPr>
-        <w:t>引擎（</w:t>
-      </w:r>
-      <w:r>
-        <w:rPr>
-          <w:rFonts w:ascii="Times New Roman" w:eastAsia="宋体" w:hAnsi="Times New Roman" w:cs="Times New Roman" w:hint="eastAsia"/>
-        </w:rPr>
-        <w:t>notepad++</w:t>
-      </w:r>
-      <w:r>
-        <w:rPr>
-          <w:rFonts w:ascii="Times New Roman" w:eastAsia="宋体" w:hAnsi="Times New Roman" w:cs="Times New Roman" w:hint="eastAsia"/>
-        </w:rPr>
-        <w:t>同款），支持语法高亮</w:t>
-      </w:r>
-      <w:r>
-        <w:rPr>
-          <w:rFonts w:ascii="Times New Roman" w:eastAsia="宋体" w:hAnsi="Times New Roman" w:cs="Times New Roman" w:hint="eastAsia"/>
-        </w:rPr>
-        <w:t>、行数显示、矩形选择等特性</w:t>
-      </w:r>
-    </w:p>
-    <w:p>
-      <w:pPr>
-        <w:pStyle w:val="a9"/>
-        <w:numPr>
-          <w:ilvl w:val="0"/>
-          <w:numId w:val="43"/>
-        </w:numPr>
-        <w:rPr>
-          <w:rFonts w:ascii="Times New Roman" w:eastAsia="宋体" w:hAnsi="Times New Roman" w:cs="Times New Roman"/>
-        </w:rPr>
-      </w:pPr>
-      <w:r>
-        <w:rPr>
-          <w:rFonts w:ascii="Times New Roman" w:eastAsia="宋体" w:hAnsi="Times New Roman" w:cs="Times New Roman" w:hint="eastAsia"/>
-        </w:rPr>
-        <w:t>修复触发资源重载后，自定义地形组崩溃的</w:t>
-      </w:r>
-      <w:r>
-        <w:rPr>
-          <w:rFonts w:ascii="Times New Roman" w:eastAsia="宋体" w:hAnsi="Times New Roman" w:cs="Times New Roman" w:hint="eastAsia"/>
-        </w:rPr>
-        <w:t>bug</w:t>
-      </w:r>
-    </w:p>
-    <w:p>
-      <w:pPr>
-        <w:pStyle w:val="a9"/>
-        <w:numPr>
-          <w:ilvl w:val="0"/>
-          <w:numId w:val="43"/>
-        </w:numPr>
-        <w:rPr>
-          <w:rFonts w:ascii="Times New Roman" w:eastAsia="宋体" w:hAnsi="Times New Roman" w:cs="Times New Roman"/>
-        </w:rPr>
-      </w:pPr>
-      <w:r>
-        <w:rPr>
-          <w:rFonts w:ascii="Times New Roman" w:eastAsia="宋体" w:hAnsi="Times New Roman" w:cs="Times New Roman" w:hint="eastAsia"/>
-        </w:rPr>
-        <w:t>触发编辑器的行为列表支持多选，新增“上移”“下移”与“拆分”按钮，可以将选中的行为上下移动或拆分出新触发</w:t>
-      </w:r>
-    </w:p>
-    <w:p>
-      <w:pPr>
-        <w:pStyle w:val="a9"/>
-        <w:numPr>
-          <w:ilvl w:val="0"/>
-          <w:numId w:val="43"/>
-        </w:numPr>
-        <w:rPr>
-          <w:rFonts w:ascii="Times New Roman" w:eastAsia="宋体" w:hAnsi="Times New Roman" w:cs="Times New Roman"/>
-        </w:rPr>
-      </w:pPr>
-      <w:r>
-        <w:rPr>
-          <w:rFonts w:ascii="Times New Roman" w:eastAsia="宋体" w:hAnsi="Times New Roman" w:cs="Times New Roman" w:hint="eastAsia"/>
-        </w:rPr>
-        <w:t>支持通过按住</w:t>
-      </w:r>
-      <w:r>
-        <w:rPr>
-          <w:rFonts w:ascii="Times New Roman" w:eastAsia="宋体" w:hAnsi="Times New Roman" w:cs="Times New Roman" w:hint="eastAsia"/>
-        </w:rPr>
-        <w:t>alt</w:t>
-      </w:r>
-      <w:r>
-        <w:rPr>
-          <w:rFonts w:ascii="Times New Roman" w:eastAsia="宋体" w:hAnsi="Times New Roman" w:cs="Times New Roman" w:hint="eastAsia"/>
-        </w:rPr>
-        <w:t>键直线放置单元标记</w:t>
-      </w:r>
-    </w:p>
-    <w:p>
-      <w:pPr>
-        <w:pStyle w:val="a9"/>
-        <w:numPr>
-          <w:ilvl w:val="0"/>
-          <w:numId w:val="43"/>
-        </w:numPr>
-        <w:rPr>
-          <w:rFonts w:ascii="Times New Roman" w:eastAsia="宋体" w:hAnsi="Times New Roman" w:cs="Times New Roman"/>
-        </w:rPr>
-      </w:pPr>
-      <w:r>
-        <w:rPr>
-          <w:rFonts w:ascii="Times New Roman" w:eastAsia="宋体" w:hAnsi="Times New Roman" w:cs="Times New Roman" w:hint="eastAsia"/>
-        </w:rPr>
-        <w:t>支持通过设置附加命令行参数直接打开地图，格式为</w:t>
-      </w:r>
-      <w:r>
-        <w:rPr>
-          <w:rFonts w:ascii="Times New Roman" w:eastAsia="宋体" w:hAnsi="Times New Roman" w:cs="Times New Roman" w:hint="eastAsia"/>
-        </w:rPr>
-        <w:t xml:space="preserve">-o </w:t>
-      </w:r>
-      <w:r>
-        <w:rPr>
-          <w:rFonts w:ascii="Times New Roman" w:eastAsia="宋体" w:hAnsi="Times New Roman" w:cs="Times New Roman"/>
-        </w:rPr>
-        <w:t>“</w:t>
-      </w:r>
-      <w:r>
-        <w:rPr>
-          <w:rFonts w:ascii="Times New Roman" w:eastAsia="宋体" w:hAnsi="Times New Roman" w:cs="Times New Roman" w:hint="eastAsia"/>
-        </w:rPr>
-        <w:t>地图路径</w:t>
-      </w:r>
-      <w:r>
-        <w:rPr>
-          <w:rFonts w:ascii="Times New Roman" w:eastAsia="宋体" w:hAnsi="Times New Roman" w:cs="Times New Roman"/>
-        </w:rPr>
-        <w:t>”</w:t>
-      </w:r>
-      <w:r>
-        <w:rPr>
-          <w:rFonts w:ascii="Times New Roman" w:eastAsia="宋体" w:hAnsi="Times New Roman" w:cs="Times New Roman" w:hint="eastAsia"/>
-        </w:rPr>
-        <w:t>或</w:t>
-      </w:r>
-      <w:r>
-        <w:rPr>
-          <w:rFonts w:ascii="Times New Roman" w:eastAsia="宋体" w:hAnsi="Times New Roman" w:cs="Times New Roman" w:hint="eastAsia"/>
-        </w:rPr>
-        <w:t xml:space="preserve">--open </w:t>
-      </w:r>
-      <w:r>
-        <w:rPr>
-          <w:rFonts w:ascii="Times New Roman" w:eastAsia="宋体" w:hAnsi="Times New Roman" w:cs="Times New Roman"/>
-        </w:rPr>
-        <w:t>“</w:t>
-      </w:r>
-      <w:r>
-        <w:rPr>
-          <w:rFonts w:ascii="Times New Roman" w:eastAsia="宋体" w:hAnsi="Times New Roman" w:cs="Times New Roman" w:hint="eastAsia"/>
-        </w:rPr>
-        <w:t>地图路径</w:t>
-      </w:r>
-      <w:r>
-        <w:rPr>
-          <w:rFonts w:ascii="Times New Roman" w:eastAsia="宋体" w:hAnsi="Times New Roman" w:cs="Times New Roman"/>
-        </w:rPr>
-        <w:t>”</w:t>
-      </w:r>
-      <w:r>
-        <w:rPr>
-          <w:rFonts w:ascii="Times New Roman" w:eastAsia="宋体" w:hAnsi="Times New Roman" w:cs="Times New Roman" w:hint="eastAsia"/>
-        </w:rPr>
-        <w:t>，命令行参数可以填写在</w:t>
-      </w:r>
-      <w:r>
-        <w:rPr>
-          <w:rFonts w:ascii="Times New Roman" w:eastAsia="宋体" w:hAnsi="Times New Roman" w:cs="Times New Roman" w:hint="eastAsia"/>
-        </w:rPr>
-        <w:t>FA2spLaunch.exe</w:t>
-      </w:r>
-      <w:r>
-        <w:rPr>
-          <w:rFonts w:ascii="Times New Roman" w:eastAsia="宋体" w:hAnsi="Times New Roman" w:cs="Times New Roman" w:hint="eastAsia"/>
-        </w:rPr>
-        <w:t>后方，或者</w:t>
-      </w:r>
-      <w:r>
-        <w:rPr>
-          <w:rFonts w:ascii="Times New Roman" w:eastAsia="宋体" w:hAnsi="Times New Roman" w:cs="Times New Roman" w:hint="eastAsia"/>
-        </w:rPr>
-        <w:t>RunFA2sp.bat</w:t>
-      </w:r>
-      <w:r>
-        <w:rPr>
-          <w:rFonts w:ascii="Times New Roman" w:eastAsia="宋体" w:hAnsi="Times New Roman" w:cs="Times New Roman" w:hint="eastAsia"/>
-        </w:rPr>
-        <w:t>内</w:t>
-      </w:r>
-    </w:p>
-    <w:p>
-      <w:pPr>
-        <w:pStyle w:val="a9"/>
-        <w:numPr>
-          <w:ilvl w:val="0"/>
-          <w:numId w:val="43"/>
-        </w:numPr>
-        <w:rPr>
-          <w:rFonts w:ascii="Times New Roman" w:eastAsia="宋体" w:hAnsi="Times New Roman" w:cs="Times New Roman"/>
-        </w:rPr>
-      </w:pPr>
-      <w:r>
-        <w:rPr>
-          <w:rFonts w:ascii="Times New Roman" w:eastAsia="宋体" w:hAnsi="Times New Roman" w:cs="Times New Roman" w:hint="eastAsia"/>
-        </w:rPr>
-        <w:t>修复当使用放置于地图行为时，对应的标签被删除后仍能摆放单元标记的</w:t>
-      </w:r>
-      <w:r>
-        <w:rPr>
-          <w:rFonts w:ascii="Times New Roman" w:eastAsia="宋体" w:hAnsi="Times New Roman" w:cs="Times New Roman" w:hint="eastAsia"/>
-        </w:rPr>
-        <w:t>bug</w:t>
-      </w:r>
-    </w:p>
-    <w:p>
-      <w:pPr>
-        <w:pStyle w:val="a9"/>
-        <w:numPr>
-          <w:ilvl w:val="0"/>
-          <w:numId w:val="43"/>
-        </w:numPr>
-        <w:rPr>
-          <w:rFonts w:ascii="Times New Roman" w:eastAsia="宋体" w:hAnsi="Times New Roman" w:cs="Times New Roman"/>
-        </w:rPr>
-      </w:pPr>
-      <w:r>
-        <w:rPr>
-          <w:rFonts w:ascii="Times New Roman" w:eastAsia="宋体" w:hAnsi="Times New Roman" w:cs="Times New Roman" w:hint="eastAsia"/>
-        </w:rPr>
-        <w:t>TheaterInfo</w:t>
-      </w:r>
-      <w:r>
-        <w:rPr>
-          <w:rFonts w:ascii="Times New Roman" w:eastAsia="宋体" w:hAnsi="Times New Roman" w:cs="Times New Roman" w:hint="eastAsia"/>
-        </w:rPr>
-        <w:t>内的自定义斜坡类型支持指定地形组下的特定地形块</w:t>
-      </w:r>
-    </w:p>
-    <w:p>
-      <w:pPr>
-        <w:pStyle w:val="a9"/>
-        <w:numPr>
-          <w:ilvl w:val="0"/>
-          <w:numId w:val="43"/>
-        </w:numPr>
-        <w:rPr>
-          <w:rFonts w:ascii="Times New Roman" w:eastAsia="宋体" w:hAnsi="Times New Roman" w:cs="Times New Roman"/>
-        </w:rPr>
-      </w:pPr>
-      <w:r>
-        <w:rPr>
-          <w:rFonts w:ascii="Times New Roman" w:eastAsia="宋体" w:hAnsi="Times New Roman" w:cs="Times New Roman" w:hint="eastAsia"/>
-        </w:rPr>
-        <w:t>支持为无图像单位显示缺省图像，详见</w:t>
-      </w:r>
-      <w:r>
-        <w:rPr>
-          <w:rFonts w:ascii="Times New Roman" w:eastAsia="宋体" w:hAnsi="Times New Roman" w:cs="Times New Roman" w:hint="eastAsia"/>
-        </w:rPr>
-        <w:t>UseDefaultUnitImage</w:t>
-      </w:r>
-    </w:p>
-    <w:p>
-      <w:pPr>
-        <w:pStyle w:val="a9"/>
-        <w:numPr>
-          <w:ilvl w:val="0"/>
-          <w:numId w:val="43"/>
-        </w:numPr>
-        <w:rPr>
-          <w:rFonts w:ascii="Times New Roman" w:eastAsia="宋体" w:hAnsi="Times New Roman" w:cs="Times New Roman"/>
-        </w:rPr>
-      </w:pPr>
-      <w:r>
-        <w:rPr>
-          <w:rFonts w:ascii="Times New Roman" w:eastAsia="宋体" w:hAnsi="Times New Roman" w:cs="Times New Roman" w:hint="eastAsia"/>
-        </w:rPr>
-        <w:t>支持</w:t>
-      </w:r>
-      <w:r>
-        <w:rPr>
-          <w:rFonts w:ascii="Times New Roman" w:eastAsia="宋体" w:hAnsi="Times New Roman" w:cs="Times New Roman" w:hint="eastAsia"/>
-        </w:rPr>
-        <w:t>ares</w:t>
-      </w:r>
-      <w:r>
-        <w:rPr>
-          <w:rFonts w:ascii="Times New Roman" w:eastAsia="宋体" w:hAnsi="Times New Roman" w:cs="Times New Roman" w:hint="eastAsia"/>
-        </w:rPr>
-        <w:t>的自定义军衔</w:t>
-      </w:r>
-    </w:p>
-    <w:p>
-      <w:pPr>
-        <w:pStyle w:val="a9"/>
-        <w:numPr>
-          <w:ilvl w:val="0"/>
-          <w:numId w:val="43"/>
-        </w:numPr>
-        <w:rPr>
-          <w:rFonts w:ascii="Times New Roman" w:eastAsia="宋体" w:hAnsi="Times New Roman" w:cs="Times New Roman"/>
-        </w:rPr>
-      </w:pPr>
-      <w:r>
-        <w:rPr>
-          <w:rFonts w:ascii="Times New Roman" w:eastAsia="宋体" w:hAnsi="Times New Roman" w:cs="Times New Roman" w:hint="eastAsia"/>
-        </w:rPr>
-        <w:t>对无图像地形对象和污染显示文本</w:t>
-      </w:r>
-    </w:p>
-    <w:p>
-      <w:pPr>
-        <w:pStyle w:val="a9"/>
-        <w:numPr>
-          <w:ilvl w:val="0"/>
-          <w:numId w:val="43"/>
-        </w:numPr>
-        <w:rPr>
-          <w:rFonts w:ascii="Times New Roman" w:eastAsia="宋体" w:hAnsi="Times New Roman" w:cs="Times New Roman"/>
-        </w:rPr>
-      </w:pPr>
-      <w:r>
-        <w:rPr>
-          <w:rFonts w:ascii="Times New Roman" w:eastAsia="宋体" w:hAnsi="Times New Roman" w:cs="Times New Roman" w:hint="eastAsia"/>
-        </w:rPr>
         <w:t>修复擦除覆盖物时，若围墙仅剩一格，无法正确调整连接关系的</w:t>
       </w:r>
       <w:r>
@@ -5043,7 +5080,6 @@
           <w:sz w:val="28"/>
           <w:szCs w:val="32"/>
         </w:rPr>
-        <w:lastRenderedPageBreak/>
         <w:t>1.3.4 (202</w:t>
       </w:r>
       <w:r>
@@ -6112,6 +6148,7 @@
         <w:rPr>
           <w:rFonts w:ascii="Times New Roman" w:eastAsia="宋体" w:hAnsi="Times New Roman" w:cs="Times New Roman" w:hint="eastAsia"/>
         </w:rPr>
+        <w:lastRenderedPageBreak/>
         <w:t>TurretShadow</w:t>
       </w:r>
       <w:r>
@@ -6136,7 +6173,6 @@
         <w:rPr>
           <w:rFonts w:ascii="Times New Roman" w:eastAsia="宋体" w:hAnsi="Times New Roman" w:cs="Times New Roman" w:hint="eastAsia"/>
         </w:rPr>
-        <w:lastRenderedPageBreak/>
         <w:t>修复未安装</w:t>
       </w:r>
       <w:r>
@@ -7199,6 +7235,7 @@
         <w:rPr>
           <w:rFonts w:ascii="Times New Roman" w:eastAsia="宋体" w:hAnsi="Times New Roman" w:cs="Times New Roman" w:hint="eastAsia"/>
         </w:rPr>
+        <w:lastRenderedPageBreak/>
         <w:t>仅当基地节点与相同建筑重叠时，才会在关闭建筑轮廓的情况下显示轮廓</w:t>
       </w:r>
     </w:p>
@@ -7225,7 +7262,6 @@
           <w:sz w:val="28"/>
           <w:szCs w:val="32"/>
         </w:rPr>
-        <w:lastRenderedPageBreak/>
         <w:t>1.</w:t>
       </w:r>
       <w:r>
@@ -8250,7 +8286,14 @@
         <w:rPr>
           <w:rFonts w:ascii="Times New Roman" w:eastAsia="宋体" w:hAnsi="Times New Roman" w:cs="Times New Roman" w:hint="eastAsia"/>
         </w:rPr>
-        <w:t>和键</w:t>
+        <w:t>和</w:t>
+      </w:r>
+      <w:r>
+        <w:rPr>
+          <w:rFonts w:ascii="Times New Roman" w:eastAsia="宋体" w:hAnsi="Times New Roman" w:cs="Times New Roman" w:hint="eastAsia"/>
+        </w:rPr>
+        <w:lastRenderedPageBreak/>
+        <w:t>键</w:t>
       </w:r>
       <w:r>
         <w:rPr>
@@ -8292,14 +8335,7 @@
         <w:rPr>
           <w:rFonts w:ascii="Times New Roman" w:eastAsia="宋体" w:hAnsi="Times New Roman" w:cs="Times New Roman" w:hint="eastAsia"/>
         </w:rPr>
-        <w:t>”变</w:t>
-      </w:r>
-      <w:r>
-        <w:rPr>
-          <w:rFonts w:ascii="Times New Roman" w:eastAsia="宋体" w:hAnsi="Times New Roman" w:cs="Times New Roman" w:hint="eastAsia"/>
-        </w:rPr>
-        <w:lastRenderedPageBreak/>
-        <w:t>为“</w:t>
+        <w:t>”变为“</w:t>
       </w:r>
       <w:r>
         <w:rPr>
@@ -9444,6 +9480,7 @@
         <w:rPr>
           <w:rFonts w:ascii="Times New Roman" w:eastAsia="宋体" w:hAnsi="Times New Roman" w:cs="Times New Roman" w:hint="eastAsia"/>
         </w:rPr>
+        <w:lastRenderedPageBreak/>
         <w:t>修补主程序，支持最高</w:t>
       </w:r>
       <w:r>
@@ -9486,7 +9523,6 @@
         <w:rPr>
           <w:rFonts w:ascii="Times New Roman" w:eastAsia="宋体" w:hAnsi="Times New Roman" w:cs="Times New Roman" w:hint="eastAsia"/>
         </w:rPr>
-        <w:lastRenderedPageBreak/>
         <w:t>修复暗色模式下部分按钮控件的文本不能换行的</w:t>
       </w:r>
       <w:r>
@@ -10613,6 +10649,7 @@
         <w:rPr>
           <w:rFonts w:ascii="Times New Roman" w:eastAsia="宋体" w:hAnsi="Times New Roman" w:cs="Times New Roman" w:hint="eastAsia"/>
         </w:rPr>
+        <w:lastRenderedPageBreak/>
         <w:t>修复物品浏览器的标签文本错误换行的</w:t>
       </w:r>
       <w:r>
@@ -10637,7 +10674,6 @@
         <w:rPr>
           <w:rFonts w:ascii="Times New Roman" w:eastAsia="宋体" w:hAnsi="Times New Roman" w:cs="Times New Roman" w:hint="eastAsia"/>
         </w:rPr>
-        <w:lastRenderedPageBreak/>
         <w:t>修复了地图检查器错误项过多时会挤在一起的</w:t>
       </w:r>
       <w:r>
@@ -11664,6 +11700,7 @@
         <w:rPr>
           <w:rFonts w:ascii="Times New Roman" w:eastAsia="宋体" w:hAnsi="Times New Roman" w:cs="Times New Roman" w:hint="eastAsia"/>
         </w:rPr>
+        <w:lastRenderedPageBreak/>
         <w:t>修复了新城市下使用绘制悬崖后部工具时，按</w:t>
       </w:r>
       <w:r>
@@ -11700,7 +11737,6 @@
         <w:rPr>
           <w:rFonts w:ascii="Times New Roman" w:eastAsia="宋体" w:hAnsi="Times New Roman" w:cs="Times New Roman" w:hint="eastAsia"/>
         </w:rPr>
-        <w:lastRenderedPageBreak/>
         <w:t>增强绘制悬崖工具，可以在不同地图类型的</w:t>
       </w:r>
       <w:r>
@@ -12727,6 +12763,7 @@
         <w:rPr>
           <w:rFonts w:ascii="Times New Roman" w:eastAsia="宋体" w:hAnsi="Times New Roman" w:cs="Times New Roman" w:hint="eastAsia"/>
         </w:rPr>
+        <w:lastRenderedPageBreak/>
         <w:t>修复建筑部分位于地图外时，建筑本体可能不能显示的</w:t>
       </w:r>
       <w:r>
@@ -12751,7 +12788,6 @@
         <w:rPr>
           <w:rFonts w:ascii="Times New Roman" w:eastAsia="宋体" w:hAnsi="Times New Roman" w:cs="Times New Roman" w:hint="eastAsia"/>
         </w:rPr>
-        <w:lastRenderedPageBreak/>
         <w:t>修复删除对象、格式刷使用大笔刷时，在地图边缘可能崩溃的</w:t>
       </w:r>
       <w:r>
@@ -13874,6 +13910,7 @@
         <w:rPr>
           <w:rFonts w:ascii="Times New Roman" w:eastAsia="宋体" w:hAnsi="Times New Roman" w:cs="Times New Roman" w:hint="eastAsia"/>
         </w:rPr>
+        <w:lastRenderedPageBreak/>
         <w:t>绘制连接地形支持铁路</w:t>
       </w:r>
     </w:p>
@@ -13892,7 +13929,6 @@
         <w:rPr>
           <w:rFonts w:ascii="Times New Roman" w:eastAsia="宋体" w:hAnsi="Times New Roman" w:cs="Times New Roman" w:hint="eastAsia"/>
         </w:rPr>
-        <w:lastRenderedPageBreak/>
         <w:t>支持</w:t>
       </w:r>
       <w:r>
@@ -14893,6 +14929,7 @@
         <w:rPr>
           <w:rFonts w:ascii="Times New Roman" w:eastAsia="宋体" w:hAnsi="Times New Roman" w:cs="Times New Roman" w:hint="eastAsia"/>
         </w:rPr>
+        <w:lastRenderedPageBreak/>
         <w:t>优化绘制连接地形的性能与内存占用</w:t>
       </w:r>
     </w:p>
@@ -14911,7 +14948,6 @@
         <w:rPr>
           <w:rFonts w:ascii="Times New Roman" w:eastAsia="宋体" w:hAnsi="Times New Roman" w:cs="Times New Roman" w:hint="eastAsia"/>
         </w:rPr>
-        <w:lastRenderedPageBreak/>
         <w:t>支持使用独立的进程存储游戏图像，以节约内存占用，详见</w:t>
       </w:r>
       <w:r>
@@ -15889,6 +15925,7 @@
         <w:rPr>
           <w:rFonts w:ascii="Times New Roman" w:eastAsia="宋体" w:hAnsi="Times New Roman" w:cs="Times New Roman" w:hint="eastAsia"/>
         </w:rPr>
+        <w:lastRenderedPageBreak/>
         <w:t>物品浏览器支持查看预览图</w:t>
       </w:r>
       <w:r>
@@ -15913,7 +15950,6 @@
         <w:rPr>
           <w:rFonts w:ascii="Times New Roman" w:eastAsia="宋体" w:hAnsi="Times New Roman" w:cs="Times New Roman" w:hint="eastAsia"/>
         </w:rPr>
-        <w:lastRenderedPageBreak/>
         <w:t>thumbnails</w:t>
       </w:r>
       <w:r>
@@ -16911,6 +16947,7 @@
         <w:rPr>
           <w:rFonts w:ascii="Times New Roman" w:eastAsia="宋体" w:hAnsi="Times New Roman" w:cs="Times New Roman" w:hint="eastAsia"/>
         </w:rPr>
+        <w:lastRenderedPageBreak/>
         <w:t>修复下拉菜单部分情况下选择失效的</w:t>
       </w:r>
       <w:r>
@@ -16935,7 +16972,6 @@
         <w:rPr>
           <w:rFonts w:ascii="Times New Roman" w:eastAsia="宋体" w:hAnsi="Times New Roman" w:cs="Times New Roman" w:hint="eastAsia"/>
         </w:rPr>
-        <w:lastRenderedPageBreak/>
         <w:t>修复下拉菜单自动搜索部分情况下异常被禁用的</w:t>
       </w:r>
       <w:r>
@@ -17878,6 +17914,7 @@
         <w:rPr>
           <w:rFonts w:ascii="Times New Roman" w:eastAsia="宋体" w:hAnsi="Times New Roman" w:cs="Times New Roman" w:hint="eastAsia"/>
         </w:rPr>
+        <w:lastRenderedPageBreak/>
         <w:t>修复了光照沙盒开启时，内存占用异常增高的</w:t>
       </w:r>
       <w:r>
@@ -17902,7 +17939,6 @@
         <w:rPr>
           <w:rFonts w:ascii="Times New Roman" w:eastAsia="宋体" w:hAnsi="Times New Roman" w:cs="Times New Roman" w:hint="eastAsia"/>
         </w:rPr>
-        <w:lastRenderedPageBreak/>
         <w:t>修复了触发、小队等名称中数字部分超过</w:t>
       </w:r>
       <w:r>
@@ -18853,6 +18889,7 @@
           <w:sz w:val="28"/>
           <w:szCs w:val="32"/>
         </w:rPr>
+        <w:lastRenderedPageBreak/>
         <w:t>1.0.5 (2025.02.24)</w:t>
       </w:r>
     </w:p>
@@ -18871,7 +18908,6 @@
         <w:rPr>
           <w:rFonts w:ascii="Times New Roman" w:eastAsia="宋体" w:hAnsi="Times New Roman" w:cs="Times New Roman" w:hint="eastAsia"/>
         </w:rPr>
-        <w:lastRenderedPageBreak/>
         <w:t>优化了</w:t>
       </w:r>
       <w:r>
@@ -19872,6 +19908,7 @@
         <w:rPr>
           <w:rFonts w:ascii="Times New Roman" w:eastAsia="宋体" w:hAnsi="Times New Roman" w:cs="Times New Roman" w:hint="eastAsia"/>
         </w:rPr>
+        <w:lastRenderedPageBreak/>
         <w:t>LAT</w:t>
       </w:r>
       <w:r>
@@ -19932,14 +19969,7 @@
         <w:rPr>
           <w:rFonts w:ascii="Times New Roman" w:eastAsia="宋体" w:hAnsi="Times New Roman" w:cs="Times New Roman" w:hint="eastAsia"/>
         </w:rPr>
-        <w:t>禁用搜索</w:t>
-      </w:r>
-      <w:r>
-        <w:rPr>
-          <w:rFonts w:ascii="Times New Roman" w:eastAsia="宋体" w:hAnsi="Times New Roman" w:cs="Times New Roman" w:hint="eastAsia"/>
-        </w:rPr>
-        <w:lastRenderedPageBreak/>
-        <w:t>功能以提升性能</w:t>
+        <w:t>禁用搜索功能以提升性能</w:t>
       </w:r>
     </w:p>
     <w:p>
@@ -21033,7 +21063,14 @@
         <w:rPr>
           <w:rFonts w:ascii="Times New Roman" w:eastAsia="宋体" w:hAnsi="Times New Roman" w:cs="Times New Roman" w:hint="eastAsia"/>
         </w:rPr>
-        <w:t>，用于路径点与数字互转，详见</w:t>
+        <w:t>，用于路径点</w:t>
+      </w:r>
+      <w:r>
+        <w:rPr>
+          <w:rFonts w:ascii="Times New Roman" w:eastAsia="宋体" w:hAnsi="Times New Roman" w:cs="Times New Roman" w:hint="eastAsia"/>
+        </w:rPr>
+        <w:lastRenderedPageBreak/>
+        <w:t>与数字互转，详见</w:t>
       </w:r>
       <w:r>
         <w:rPr>
@@ -21077,7 +21114,6 @@
           <w:sz w:val="28"/>
           <w:szCs w:val="32"/>
         </w:rPr>
-        <w:lastRenderedPageBreak/>
         <w:t>FA2SP HDM Edition</w:t>
       </w:r>
       <w:r>
@@ -21610,6 +21646,7 @@
         <w:rPr>
           <w:rFonts w:ascii="Times New Roman" w:eastAsia="宋体" w:hAnsi="Times New Roman" w:cs="Times New Roman" w:hint="eastAsia"/>
         </w:rPr>
+        <w:lastRenderedPageBreak/>
         <w:t>小队列表：位于地形浏览器的菜单栏中</w:t>
       </w:r>
     </w:p>
@@ -21624,7 +21661,6 @@
         <w:rPr>
           <w:rFonts w:ascii="Times New Roman" w:eastAsia="宋体" w:hAnsi="Times New Roman" w:cs="Times New Roman" w:hint="eastAsia"/>
         </w:rPr>
-        <w:lastRenderedPageBreak/>
         <w:t>特遣列表：位于地形浏览器的菜单栏中</w:t>
       </w:r>
     </w:p>
@@ -22161,14 +22197,14 @@
         <w:rPr>
           <w:rFonts w:ascii="Times New Roman" w:eastAsia="宋体" w:hAnsi="Times New Roman" w:cs="Times New Roman" w:hint="eastAsia"/>
         </w:rPr>
-        <w:t>，将触发设置、事件设置、行为设置集中显示在同一页面下，同时以列表状态显示事件与行为，可以显示当前事件或行</w:t>
+        <w:t>，将触发设置、事件设置、行为设</w:t>
       </w:r>
       <w:r>
         <w:rPr>
           <w:rFonts w:ascii="Times New Roman" w:eastAsia="宋体" w:hAnsi="Times New Roman" w:cs="Times New Roman" w:hint="eastAsia"/>
         </w:rPr>
         <w:lastRenderedPageBreak/>
-        <w:t>为的全部参数列表</w:t>
+        <w:t>置集中显示在同一页面下，同时以列表状态显示事件与行为，可以显示当前事件或行为的全部参数列表</w:t>
       </w:r>
     </w:p>
     <w:p>
@@ -22706,6 +22742,7 @@
         <w:rPr>
           <w:rFonts w:ascii="Times New Roman" w:eastAsia="宋体" w:hAnsi="Times New Roman" w:cs="Times New Roman" w:hint="eastAsia"/>
         </w:rPr>
+        <w:lastRenderedPageBreak/>
         <w:t>步兵子单元格：可以正常显示</w:t>
       </w:r>
       <w:r>
@@ -22718,14 +22755,7 @@
         <w:rPr>
           <w:rFonts w:ascii="Times New Roman" w:eastAsia="宋体" w:hAnsi="Times New Roman" w:cs="Times New Roman" w:hint="eastAsia"/>
         </w:rPr>
-        <w:t>号位（游戏中单元格中下位置）的步兵，同时允</w:t>
-      </w:r>
-      <w:r>
-        <w:rPr>
-          <w:rFonts w:ascii="Times New Roman" w:eastAsia="宋体" w:hAnsi="Times New Roman" w:cs="Times New Roman" w:hint="eastAsia"/>
-        </w:rPr>
-        <w:lastRenderedPageBreak/>
-        <w:t>许对步兵进行子单元格编辑，如指定步兵放置的位置，或者拖拽步兵的位置</w:t>
+        <w:t>号位（游戏中单元格中下位置）的步兵，同时允许对步兵进行子单元格编辑，如指定步兵放置的位置，或者拖拽步兵的位置</w:t>
       </w:r>
       <w:r>
         <w:rPr>
@@ -42818,7 +42848,7 @@
         <v:path o:extrusionok="f" gradientshapeok="t" o:connecttype="rect"/>
         <o:lock v:ext="edit" aspectratio="t"/>
       </v:shapetype>
-      <v:shape id="_x0000_i1028" type="#_x0000_t75" style="width:11.5pt;height:11.5pt" o:bullet="t">
+      <v:shape id="_x0000_i1030" type="#_x0000_t75" style="width:11.5pt;height:11.5pt" o:bullet="t">
         <v:imagedata r:id="rId1" o:title="mso9A9A"/>
       </v:shape>
     </w:pict>

</xml_diff>

<commit_message>
optimize lighting preview & shadow drawing, fix a init map bug
</commit_message>
<xml_diff>
--- a/Supplementary/文档/FA2SP HDM Edition说明文档.docx
+++ b/Supplementary/文档/FA2SP HDM Edition说明文档.docx
@@ -174,7 +174,7 @@
           <w:rFonts w:ascii="宋体" w:eastAsia="宋体" w:hAnsi="宋体" w:hint="eastAsia"/>
           <w:sz w:val="24"/>
         </w:rPr>
-        <w:t>1</w:t>
+        <w:t>2</w:t>
       </w:r>
     </w:p>
     <w:p>
@@ -246,7 +246,7 @@
           <w:sz w:val="28"/>
           <w:szCs w:val="32"/>
         </w:rPr>
-        <w:t>1</w:t>
+        <w:t>2</w:t>
       </w:r>
       <w:r>
         <w:rPr>
@@ -484,7 +484,25 @@
         <w:rPr>
           <w:rFonts w:ascii="Times New Roman" w:eastAsia="宋体" w:hAnsi="Times New Roman" w:cs="Times New Roman" w:hint="eastAsia"/>
         </w:rPr>
-        <w:t>优化绘图效率</w:t>
+        <w:t>显著</w:t>
+      </w:r>
+      <w:r>
+        <w:rPr>
+          <w:rFonts w:ascii="Times New Roman" w:eastAsia="宋体" w:hAnsi="Times New Roman" w:cs="Times New Roman" w:hint="eastAsia"/>
+        </w:rPr>
+        <w:t>提升</w:t>
+      </w:r>
+      <w:r>
+        <w:rPr>
+          <w:rFonts w:ascii="Times New Roman" w:eastAsia="宋体" w:hAnsi="Times New Roman" w:cs="Times New Roman" w:hint="eastAsia"/>
+        </w:rPr>
+        <w:t>绘图效率</w:t>
+      </w:r>
+      <w:r>
+        <w:rPr>
+          <w:rFonts w:ascii="Times New Roman" w:eastAsia="宋体" w:hAnsi="Times New Roman" w:cs="Times New Roman" w:hint="eastAsia"/>
+        </w:rPr>
+        <w:t>，优化光照沙盒效率</w:t>
       </w:r>
     </w:p>
     <w:p>
@@ -616,7 +634,37 @@
         <w:rPr>
           <w:rFonts w:ascii="Times New Roman" w:eastAsia="宋体" w:hAnsi="Times New Roman" w:cs="Times New Roman" w:hint="eastAsia"/>
         </w:rPr>
-        <w:t>大幅优化启动加载时间</w:t>
+        <w:t>显著</w:t>
+      </w:r>
+      <w:r>
+        <w:rPr>
+          <w:rFonts w:ascii="Times New Roman" w:eastAsia="宋体" w:hAnsi="Times New Roman" w:cs="Times New Roman" w:hint="eastAsia"/>
+        </w:rPr>
+        <w:t>优化</w:t>
+      </w:r>
+      <w:r>
+        <w:rPr>
+          <w:rFonts w:ascii="Times New Roman" w:eastAsia="宋体" w:hAnsi="Times New Roman" w:cs="Times New Roman" w:hint="eastAsia"/>
+        </w:rPr>
+        <w:t>使用新的</w:t>
+      </w:r>
+      <w:r>
+        <w:rPr>
+          <w:rFonts w:ascii="Times New Roman" w:eastAsia="宋体" w:hAnsi="Times New Roman" w:cs="Times New Roman" w:hint="eastAsia"/>
+        </w:rPr>
+        <w:t>MIX</w:t>
+      </w:r>
+      <w:r>
+        <w:rPr>
+          <w:rFonts w:ascii="Times New Roman" w:eastAsia="宋体" w:hAnsi="Times New Roman" w:cs="Times New Roman" w:hint="eastAsia"/>
+        </w:rPr>
+        <w:t>加载器时的</w:t>
+      </w:r>
+      <w:r>
+        <w:rPr>
+          <w:rFonts w:ascii="Times New Roman" w:eastAsia="宋体" w:hAnsi="Times New Roman" w:cs="Times New Roman" w:hint="eastAsia"/>
+        </w:rPr>
+        <w:t>启动加载时间</w:t>
       </w:r>
     </w:p>
     <w:p>
@@ -646,7 +694,43 @@
         <w:rPr>
           <w:rFonts w:ascii="Times New Roman" w:eastAsia="宋体" w:hAnsi="Times New Roman" w:cs="Times New Roman" w:hint="eastAsia"/>
         </w:rPr>
-        <w:t>单位渲染时间</w:t>
+        <w:t>单位</w:t>
+      </w:r>
+      <w:r>
+        <w:rPr>
+          <w:rFonts w:ascii="Times New Roman" w:eastAsia="宋体" w:hAnsi="Times New Roman" w:cs="Times New Roman" w:hint="eastAsia"/>
+        </w:rPr>
+        <w:t>加载</w:t>
+      </w:r>
+      <w:r>
+        <w:rPr>
+          <w:rFonts w:ascii="Times New Roman" w:eastAsia="宋体" w:hAnsi="Times New Roman" w:cs="Times New Roman" w:hint="eastAsia"/>
+        </w:rPr>
+        <w:t>时间</w:t>
+      </w:r>
+    </w:p>
+    <w:p>
+      <w:pPr>
+        <w:pStyle w:val="a9"/>
+        <w:numPr>
+          <w:ilvl w:val="0"/>
+          <w:numId w:val="11"/>
+        </w:numPr>
+        <w:rPr>
+          <w:rFonts w:ascii="Times New Roman" w:eastAsia="宋体" w:hAnsi="Times New Roman" w:cs="Times New Roman"/>
+        </w:rPr>
+      </w:pPr>
+      <w:r>
+        <w:rPr>
+          <w:rFonts w:ascii="Times New Roman" w:eastAsia="宋体" w:hAnsi="Times New Roman" w:cs="Times New Roman" w:hint="eastAsia"/>
+        </w:rPr>
+        <w:t>修复当地图存在超出有效索引的单元格时，加载地图时可能崩溃的</w:t>
+      </w:r>
+      <w:r>
+        <w:rPr>
+          <w:rFonts w:ascii="Times New Roman" w:eastAsia="宋体" w:hAnsi="Times New Roman" w:cs="Times New Roman" w:hint="eastAsia"/>
+        </w:rPr>
+        <w:t>bug</w:t>
       </w:r>
     </w:p>
     <w:p>
@@ -846,6 +930,7 @@
         <w:rPr>
           <w:rFonts w:ascii="Times New Roman" w:eastAsia="宋体" w:hAnsi="Times New Roman" w:cs="Times New Roman" w:hint="eastAsia"/>
         </w:rPr>
+        <w:lastRenderedPageBreak/>
         <w:t>距离工具箱支持放置圆形</w:t>
       </w:r>
       <w:r>
@@ -864,14 +949,7 @@
         <w:rPr>
           <w:rFonts w:ascii="Times New Roman" w:eastAsia="宋体" w:hAnsi="Times New Roman" w:cs="Times New Roman" w:hint="eastAsia"/>
         </w:rPr>
-        <w:t>，支持撤</w:t>
-      </w:r>
-      <w:r>
-        <w:rPr>
-          <w:rFonts w:ascii="Times New Roman" w:eastAsia="宋体" w:hAnsi="Times New Roman" w:cs="Times New Roman" w:hint="eastAsia"/>
-        </w:rPr>
-        <w:lastRenderedPageBreak/>
-        <w:t>销重做</w:t>
+        <w:t>，支持撤销重做</w:t>
       </w:r>
     </w:p>
     <w:p>
@@ -1792,6 +1870,7 @@
         <w:rPr>
           <w:rFonts w:ascii="Times New Roman" w:eastAsia="宋体" w:hAnsi="Times New Roman" w:cs="Times New Roman" w:hint="eastAsia"/>
         </w:rPr>
+        <w:lastRenderedPageBreak/>
         <w:t>支持以数字显示不可见的桥梁覆盖物，详见</w:t>
       </w:r>
       <w:r>
@@ -1816,7 +1895,6 @@
         <w:rPr>
           <w:rFonts w:ascii="Times New Roman" w:eastAsia="宋体" w:hAnsi="Times New Roman" w:cs="Times New Roman" w:hint="eastAsia"/>
         </w:rPr>
-        <w:lastRenderedPageBreak/>
         <w:t>修复当建筑多个动画互相无限循环时导致崩溃的</w:t>
       </w:r>
       <w:r>
@@ -2973,6 +3051,7 @@
           <w:kern w:val="0"/>
           <w14:ligatures w14:val="none"/>
         </w:rPr>
+        <w:lastRenderedPageBreak/>
         <w:t>显著提升了加载物品浏览器图标的效率</w:t>
       </w:r>
     </w:p>
@@ -2995,7 +3074,6 @@
           <w:kern w:val="0"/>
           <w14:ligatures w14:val="none"/>
         </w:rPr>
-        <w:lastRenderedPageBreak/>
         <w:t>当放置覆盖物进行预览时，不会改变扫过区域的矿石价值</w:t>
       </w:r>
     </w:p>
@@ -42848,7 +42926,7 @@
         <v:path o:extrusionok="f" gradientshapeok="t" o:connecttype="rect"/>
         <o:lock v:ext="edit" aspectratio="t"/>
       </v:shapetype>
-      <v:shape id="_x0000_i1030" type="#_x0000_t75" style="width:11.5pt;height:11.5pt" o:bullet="t">
+      <v:shape id="_x0000_i1035" type="#_x0000_t75" style="width:11.5pt;height:11.5pt" o:bullet="t">
         <v:imagedata r:id="rId1" o:title="mso9A9A"/>
       </v:shape>
     </w:pict>

</xml_diff>

<commit_message>
fix move up/down button dbclick bug
</commit_message>
<xml_diff>
--- a/Supplementary/文档/FA2SP HDM Edition说明文档.docx
+++ b/Supplementary/文档/FA2SP HDM Edition说明文档.docx
@@ -738,6 +738,30 @@
         <w:pStyle w:val="a9"/>
         <w:numPr>
           <w:ilvl w:val="0"/>
+          <w:numId w:val="11"/>
+        </w:numPr>
+        <w:rPr>
+          <w:rFonts w:ascii="Times New Roman" w:eastAsia="宋体" w:hAnsi="Times New Roman" w:cs="Times New Roman"/>
+        </w:rPr>
+      </w:pPr>
+      <w:r>
+        <w:rPr>
+          <w:rFonts w:ascii="Times New Roman" w:eastAsia="宋体" w:hAnsi="Times New Roman" w:cs="Times New Roman" w:hint="eastAsia"/>
+        </w:rPr>
+        <w:t>修复双击触发编辑器行为列表的上移下移按钮时不响应的</w:t>
+      </w:r>
+      <w:r>
+        <w:rPr>
+          <w:rFonts w:ascii="Times New Roman" w:eastAsia="宋体" w:hAnsi="Times New Roman" w:cs="Times New Roman" w:hint="eastAsia"/>
+        </w:rPr>
+        <w:t>bug</w:t>
+      </w:r>
+    </w:p>
+    <w:p>
+      <w:pPr>
+        <w:pStyle w:val="a9"/>
+        <w:numPr>
+          <w:ilvl w:val="0"/>
           <w:numId w:val="10"/>
         </w:numPr>
         <w:rPr>
@@ -894,6 +918,7 @@
         <w:rPr>
           <w:rFonts w:ascii="Times New Roman" w:eastAsia="宋体" w:hAnsi="Times New Roman" w:cs="Times New Roman" w:hint="eastAsia"/>
         </w:rPr>
+        <w:lastRenderedPageBreak/>
         <w:t>支持在副屏上显示绘图界面</w:t>
       </w:r>
       <w:r>
@@ -930,7 +955,6 @@
         <w:rPr>
           <w:rFonts w:ascii="Times New Roman" w:eastAsia="宋体" w:hAnsi="Times New Roman" w:cs="Times New Roman" w:hint="eastAsia"/>
         </w:rPr>
-        <w:lastRenderedPageBreak/>
         <w:t>距离工具箱支持放置圆形</w:t>
       </w:r>
       <w:r>
@@ -1852,6 +1876,7 @@
         <w:rPr>
           <w:rFonts w:ascii="Times New Roman" w:eastAsia="宋体" w:hAnsi="Times New Roman" w:cs="Times New Roman" w:hint="eastAsia"/>
         </w:rPr>
+        <w:lastRenderedPageBreak/>
         <w:t>添加通用格式刷工具，可以同时修改所有科技类型的属性</w:t>
       </w:r>
     </w:p>
@@ -1870,7 +1895,6 @@
         <w:rPr>
           <w:rFonts w:ascii="Times New Roman" w:eastAsia="宋体" w:hAnsi="Times New Roman" w:cs="Times New Roman" w:hint="eastAsia"/>
         </w:rPr>
-        <w:lastRenderedPageBreak/>
         <w:t>支持以数字显示不可见的桥梁覆盖物，详见</w:t>
       </w:r>
       <w:r>
@@ -3005,6 +3029,7 @@
           <w:kern w:val="0"/>
           <w14:ligatures w14:val="none"/>
         </w:rPr>
+        <w:lastRenderedPageBreak/>
         <w:t>支持读取</w:t>
       </w:r>
       <w:r>
@@ -3051,7 +3076,6 @@
           <w:kern w:val="0"/>
           <w14:ligatures w14:val="none"/>
         </w:rPr>
-        <w:lastRenderedPageBreak/>
         <w:t>显著提升了加载物品浏览器图标的效率</w:t>
       </w:r>
     </w:p>
@@ -4134,6 +4158,7 @@
         <w:rPr>
           <w:rFonts w:ascii="Times New Roman" w:eastAsia="宋体" w:hAnsi="Times New Roman" w:cs="Times New Roman" w:hint="eastAsia"/>
         </w:rPr>
+        <w:lastRenderedPageBreak/>
         <w:t>支持使用椭圆绘制范围属性，详见</w:t>
       </w:r>
       <w:r>
@@ -4166,7 +4191,6 @@
           <w:sz w:val="28"/>
           <w:szCs w:val="32"/>
         </w:rPr>
-        <w:lastRenderedPageBreak/>
         <w:t>1.3.5 (2026.0</w:t>
       </w:r>
       <w:r>
@@ -5107,6 +5131,7 @@
         <w:rPr>
           <w:rFonts w:ascii="Times New Roman" w:eastAsia="宋体" w:hAnsi="Times New Roman" w:cs="Times New Roman" w:hint="eastAsia"/>
         </w:rPr>
+        <w:lastRenderedPageBreak/>
         <w:t>对无图像地形对象和污染显示文本</w:t>
       </w:r>
     </w:p>
@@ -5125,7 +5150,6 @@
         <w:rPr>
           <w:rFonts w:ascii="Times New Roman" w:eastAsia="宋体" w:hAnsi="Times New Roman" w:cs="Times New Roman" w:hint="eastAsia"/>
         </w:rPr>
-        <w:lastRenderedPageBreak/>
         <w:t>修复擦除覆盖物时，若围墙仅剩一格，无法正确调整连接关系的</w:t>
       </w:r>
       <w:r>
@@ -6196,6 +6220,7 @@
         <w:rPr>
           <w:rFonts w:ascii="Times New Roman" w:eastAsia="宋体" w:hAnsi="Times New Roman" w:cs="Times New Roman" w:hint="eastAsia"/>
         </w:rPr>
+        <w:lastRenderedPageBreak/>
         <w:t>支持渲染体素的炮塔和炮管阴影，并读取</w:t>
       </w:r>
       <w:r>
@@ -6226,7 +6251,6 @@
         <w:rPr>
           <w:rFonts w:ascii="Times New Roman" w:eastAsia="宋体" w:hAnsi="Times New Roman" w:cs="Times New Roman" w:hint="eastAsia"/>
         </w:rPr>
-        <w:lastRenderedPageBreak/>
         <w:t>TurretShadow</w:t>
       </w:r>
       <w:r>
@@ -7289,6 +7313,7 @@
         <w:rPr>
           <w:rFonts w:ascii="Times New Roman" w:eastAsia="宋体" w:hAnsi="Times New Roman" w:cs="Times New Roman" w:hint="eastAsia"/>
         </w:rPr>
+        <w:lastRenderedPageBreak/>
         <w:t>修复了军衔图层不能隐藏的</w:t>
       </w:r>
       <w:r>
@@ -7313,7 +7338,6 @@
         <w:rPr>
           <w:rFonts w:ascii="Times New Roman" w:eastAsia="宋体" w:hAnsi="Times New Roman" w:cs="Times New Roman" w:hint="eastAsia"/>
         </w:rPr>
-        <w:lastRenderedPageBreak/>
         <w:t>仅当基地节点与相同建筑重叠时，才会在关闭建筑轮廓的情况下显示轮廓</w:t>
       </w:r>
     </w:p>
@@ -8334,6 +8358,7 @@
         <w:rPr>
           <w:rFonts w:ascii="Times New Roman" w:eastAsia="宋体" w:hAnsi="Times New Roman" w:cs="Times New Roman" w:hint="eastAsia"/>
         </w:rPr>
+        <w:lastRenderedPageBreak/>
         <w:t>支持多语言切换，添加了英文版。所有可以在</w:t>
       </w:r>
       <w:r>
@@ -8364,14 +8389,7 @@
         <w:rPr>
           <w:rFonts w:ascii="Times New Roman" w:eastAsia="宋体" w:hAnsi="Times New Roman" w:cs="Times New Roman" w:hint="eastAsia"/>
         </w:rPr>
-        <w:t>和</w:t>
-      </w:r>
-      <w:r>
-        <w:rPr>
-          <w:rFonts w:ascii="Times New Roman" w:eastAsia="宋体" w:hAnsi="Times New Roman" w:cs="Times New Roman" w:hint="eastAsia"/>
-        </w:rPr>
-        <w:lastRenderedPageBreak/>
-        <w:t>键</w:t>
+        <w:t>和键</w:t>
       </w:r>
       <w:r>
         <w:rPr>
@@ -9534,6 +9552,7 @@
         <w:rPr>
           <w:rFonts w:ascii="Times New Roman" w:eastAsia="宋体" w:hAnsi="Times New Roman" w:cs="Times New Roman" w:hint="eastAsia"/>
         </w:rPr>
+        <w:lastRenderedPageBreak/>
         <w:t>新增地图渲染器功能，可以渲染全图</w:t>
       </w:r>
       <w:r>
@@ -9558,7 +9577,6 @@
         <w:rPr>
           <w:rFonts w:ascii="Times New Roman" w:eastAsia="宋体" w:hAnsi="Times New Roman" w:cs="Times New Roman" w:hint="eastAsia"/>
         </w:rPr>
-        <w:lastRenderedPageBreak/>
         <w:t>修补主程序，支持最高</w:t>
       </w:r>
       <w:r>
@@ -10709,7 +10727,14 @@
         <w:rPr>
           <w:rFonts w:ascii="Times New Roman" w:eastAsia="宋体" w:hAnsi="Times New Roman" w:cs="Times New Roman" w:hint="eastAsia"/>
         </w:rPr>
-        <w:t>作战小队编辑器新增跳转按钮，可以跳转至对应的特遣部队、脚本、标签（实际为寻找对应触发）</w:t>
+        <w:t>作战小队编辑器新增跳转按钮，可以跳转至对应的特遣部队、脚本、标签（实</w:t>
+      </w:r>
+      <w:r>
+        <w:rPr>
+          <w:rFonts w:ascii="Times New Roman" w:eastAsia="宋体" w:hAnsi="Times New Roman" w:cs="Times New Roman" w:hint="eastAsia"/>
+        </w:rPr>
+        <w:lastRenderedPageBreak/>
+        <w:t>际为寻找对应触发）</w:t>
       </w:r>
     </w:p>
     <w:p>
@@ -10727,7 +10752,6 @@
         <w:rPr>
           <w:rFonts w:ascii="Times New Roman" w:eastAsia="宋体" w:hAnsi="Times New Roman" w:cs="Times New Roman" w:hint="eastAsia"/>
         </w:rPr>
-        <w:lastRenderedPageBreak/>
         <w:t>修复物品浏览器的标签文本错误换行的</w:t>
       </w:r>
       <w:r>
@@ -11718,6 +11742,7 @@
         <w:rPr>
           <w:rFonts w:ascii="Times New Roman" w:eastAsia="宋体" w:hAnsi="Times New Roman" w:cs="Times New Roman" w:hint="eastAsia"/>
         </w:rPr>
+        <w:lastRenderedPageBreak/>
         <w:t>修复了在开启输入法和部分情况下在地图界面按</w:t>
       </w:r>
       <w:r>
@@ -11778,7 +11803,6 @@
         <w:rPr>
           <w:rFonts w:ascii="Times New Roman" w:eastAsia="宋体" w:hAnsi="Times New Roman" w:cs="Times New Roman" w:hint="eastAsia"/>
         </w:rPr>
-        <w:lastRenderedPageBreak/>
         <w:t>修复了新城市下使用绘制悬崖后部工具时，按</w:t>
       </w:r>
       <w:r>
@@ -12805,6 +12829,7 @@
         <w:rPr>
           <w:rFonts w:ascii="Times New Roman" w:eastAsia="宋体" w:hAnsi="Times New Roman" w:cs="Times New Roman" w:hint="eastAsia"/>
         </w:rPr>
+        <w:lastRenderedPageBreak/>
         <w:t>新增</w:t>
       </w:r>
       <w:r>
@@ -12841,7 +12866,6 @@
         <w:rPr>
           <w:rFonts w:ascii="Times New Roman" w:eastAsia="宋体" w:hAnsi="Times New Roman" w:cs="Times New Roman" w:hint="eastAsia"/>
         </w:rPr>
-        <w:lastRenderedPageBreak/>
         <w:t>修复建筑部分位于地图外时，建筑本体可能不能显示的</w:t>
       </w:r>
       <w:r>
@@ -13970,7 +13994,14 @@
         <w:rPr>
           <w:rFonts w:ascii="Times New Roman" w:eastAsia="宋体" w:hAnsi="Times New Roman" w:cs="Times New Roman" w:hint="eastAsia"/>
         </w:rPr>
-        <w:t>深度调整</w:t>
+        <w:t>深度</w:t>
+      </w:r>
+      <w:r>
+        <w:rPr>
+          <w:rFonts w:ascii="Times New Roman" w:eastAsia="宋体" w:hAnsi="Times New Roman" w:cs="Times New Roman" w:hint="eastAsia"/>
+        </w:rPr>
+        <w:lastRenderedPageBreak/>
+        <w:t>调整</w:t>
       </w:r>
     </w:p>
     <w:p>
@@ -13988,7 +14019,6 @@
         <w:rPr>
           <w:rFonts w:ascii="Times New Roman" w:eastAsia="宋体" w:hAnsi="Times New Roman" w:cs="Times New Roman" w:hint="eastAsia"/>
         </w:rPr>
-        <w:lastRenderedPageBreak/>
         <w:t>绘制连接地形支持铁路</w:t>
       </w:r>
     </w:p>
@@ -14983,6 +15013,7 @@
         <w:rPr>
           <w:rFonts w:ascii="Times New Roman" w:eastAsia="宋体" w:hAnsi="Times New Roman" w:cs="Times New Roman" w:hint="eastAsia"/>
         </w:rPr>
+        <w:lastRenderedPageBreak/>
         <w:t>修复部分情况下物品浏览器取消选择仍会错误选中界面顶端选项的</w:t>
       </w:r>
       <w:r>
@@ -15007,7 +15038,6 @@
         <w:rPr>
           <w:rFonts w:ascii="Times New Roman" w:eastAsia="宋体" w:hAnsi="Times New Roman" w:cs="Times New Roman" w:hint="eastAsia"/>
         </w:rPr>
-        <w:lastRenderedPageBreak/>
         <w:t>优化绘制连接地形的性能与内存占用</w:t>
       </w:r>
     </w:p>
@@ -15985,6 +16015,7 @@
         <w:rPr>
           <w:rFonts w:ascii="Times New Roman" w:eastAsia="宋体" w:hAnsi="Times New Roman" w:cs="Times New Roman" w:hint="eastAsia"/>
         </w:rPr>
+        <w:lastRenderedPageBreak/>
         <w:t>多选模式支持正矩形添加和删除</w:t>
       </w:r>
     </w:p>
@@ -16003,7 +16034,6 @@
         <w:rPr>
           <w:rFonts w:ascii="Times New Roman" w:eastAsia="宋体" w:hAnsi="Times New Roman" w:cs="Times New Roman" w:hint="eastAsia"/>
         </w:rPr>
-        <w:lastRenderedPageBreak/>
         <w:t>物品浏览器支持查看预览图</w:t>
       </w:r>
       <w:r>
@@ -17007,6 +17037,7 @@
         <w:rPr>
           <w:rFonts w:ascii="Times New Roman" w:eastAsia="宋体" w:hAnsi="Times New Roman" w:cs="Times New Roman" w:hint="eastAsia"/>
         </w:rPr>
+        <w:lastRenderedPageBreak/>
         <w:t>恢复在某些地形下被屏蔽的高架木桥桥墩废墟</w:t>
       </w:r>
     </w:p>
@@ -17025,7 +17056,6 @@
         <w:rPr>
           <w:rFonts w:ascii="Times New Roman" w:eastAsia="宋体" w:hAnsi="Times New Roman" w:cs="Times New Roman" w:hint="eastAsia"/>
         </w:rPr>
-        <w:lastRenderedPageBreak/>
         <w:t>修复下拉菜单部分情况下选择失效的</w:t>
       </w:r>
       <w:r>
@@ -17956,6 +17986,7 @@
         <w:rPr>
           <w:rFonts w:ascii="Times New Roman" w:eastAsia="宋体" w:hAnsi="Times New Roman" w:cs="Times New Roman" w:hint="eastAsia"/>
         </w:rPr>
+        <w:lastRenderedPageBreak/>
         <w:t>修复了使用</w:t>
       </w:r>
       <w:r>
@@ -17992,7 +18023,6 @@
         <w:rPr>
           <w:rFonts w:ascii="Times New Roman" w:eastAsia="宋体" w:hAnsi="Times New Roman" w:cs="Times New Roman" w:hint="eastAsia"/>
         </w:rPr>
-        <w:lastRenderedPageBreak/>
         <w:t>修复了光照沙盒开启时，内存占用异常增高的</w:t>
       </w:r>
       <w:r>
@@ -42926,7 +42956,7 @@
         <v:path o:extrusionok="f" gradientshapeok="t" o:connecttype="rect"/>
         <o:lock v:ext="edit" aspectratio="t"/>
       </v:shapetype>
-      <v:shape id="_x0000_i1035" type="#_x0000_t75" style="width:11.5pt;height:11.5pt" o:bullet="t">
+      <v:shape id="_x0000_i1030" type="#_x0000_t75" style="width:11.5pt;height:11.5pt" o:bullet="t">
         <v:imagedata r:id="rId1" o:title="mso9A9A"/>
       </v:shape>
     </w:pict>

</xml_diff>

<commit_message>
fix overlay loading compatibility
</commit_message>
<xml_diff>
--- a/Supplementary/文档/FA2SP HDM Edition说明文档.docx
+++ b/Supplementary/文档/FA2SP HDM Edition说明文档.docx
@@ -762,6 +762,24 @@
         <w:pStyle w:val="a9"/>
         <w:numPr>
           <w:ilvl w:val="0"/>
+          <w:numId w:val="11"/>
+        </w:numPr>
+        <w:rPr>
+          <w:rFonts w:ascii="Times New Roman" w:eastAsia="宋体" w:hAnsi="Times New Roman" w:cs="Times New Roman"/>
+        </w:rPr>
+      </w:pPr>
+      <w:r>
+        <w:rPr>
+          <w:rFonts w:ascii="Times New Roman" w:eastAsia="宋体" w:hAnsi="Times New Roman" w:cs="Times New Roman" w:hint="eastAsia"/>
+        </w:rPr>
+        <w:t>优化覆盖物加载策略，即使素材文件内部标记有误，也会加载前一半图像</w:t>
+      </w:r>
+    </w:p>
+    <w:p>
+      <w:pPr>
+        <w:pStyle w:val="a9"/>
+        <w:numPr>
+          <w:ilvl w:val="0"/>
           <w:numId w:val="10"/>
         </w:numPr>
         <w:rPr>
@@ -900,6 +918,7 @@
         <w:rPr>
           <w:rFonts w:ascii="Times New Roman" w:eastAsia="宋体" w:hAnsi="Times New Roman" w:cs="Times New Roman" w:hint="eastAsia"/>
         </w:rPr>
+        <w:lastRenderedPageBreak/>
         <w:t>优化效率和稳定性</w:t>
       </w:r>
     </w:p>
@@ -918,7 +937,6 @@
         <w:rPr>
           <w:rFonts w:ascii="Times New Roman" w:eastAsia="宋体" w:hAnsi="Times New Roman" w:cs="Times New Roman" w:hint="eastAsia"/>
         </w:rPr>
-        <w:lastRenderedPageBreak/>
         <w:t>支持在副屏上显示绘图界面</w:t>
       </w:r>
       <w:r>
@@ -1858,6 +1876,7 @@
         <w:rPr>
           <w:rFonts w:ascii="Times New Roman" w:eastAsia="宋体" w:hAnsi="Times New Roman" w:cs="Times New Roman" w:hint="eastAsia"/>
         </w:rPr>
+        <w:lastRenderedPageBreak/>
         <w:t>小地图支持缩放</w:t>
       </w:r>
     </w:p>
@@ -1876,7 +1895,6 @@
         <w:rPr>
           <w:rFonts w:ascii="Times New Roman" w:eastAsia="宋体" w:hAnsi="Times New Roman" w:cs="Times New Roman" w:hint="eastAsia"/>
         </w:rPr>
-        <w:lastRenderedPageBreak/>
         <w:t>添加通用格式刷工具，可以同时修改所有科技类型的属性</w:t>
       </w:r>
     </w:p>
@@ -2999,6 +3017,7 @@
           <w:kern w:val="0"/>
           <w14:ligatures w14:val="none"/>
         </w:rPr>
+        <w:lastRenderedPageBreak/>
         <w:t>修复部分建筑炮管无法加载的</w:t>
       </w:r>
       <w:r>
@@ -3029,7 +3048,6 @@
           <w:kern w:val="0"/>
           <w14:ligatures w14:val="none"/>
         </w:rPr>
-        <w:lastRenderedPageBreak/>
         <w:t>支持读取</w:t>
       </w:r>
       <w:r>
@@ -4140,6 +4158,7 @@
         <w:rPr>
           <w:rFonts w:ascii="Times New Roman" w:eastAsia="宋体" w:hAnsi="Times New Roman" w:cs="Times New Roman" w:hint="eastAsia"/>
         </w:rPr>
+        <w:lastRenderedPageBreak/>
         <w:t>触发编辑器的事件列表支持多选</w:t>
       </w:r>
     </w:p>
@@ -4158,7 +4177,6 @@
         <w:rPr>
           <w:rFonts w:ascii="Times New Roman" w:eastAsia="宋体" w:hAnsi="Times New Roman" w:cs="Times New Roman" w:hint="eastAsia"/>
         </w:rPr>
-        <w:lastRenderedPageBreak/>
         <w:t>支持使用椭圆绘制范围属性，详见</w:t>
       </w:r>
       <w:r>
@@ -5101,6 +5119,7 @@
         <w:rPr>
           <w:rFonts w:ascii="Times New Roman" w:eastAsia="宋体" w:hAnsi="Times New Roman" w:cs="Times New Roman" w:hint="eastAsia"/>
         </w:rPr>
+        <w:lastRenderedPageBreak/>
         <w:t>支持</w:t>
       </w:r>
       <w:r>
@@ -5131,7 +5150,6 @@
         <w:rPr>
           <w:rFonts w:ascii="Times New Roman" w:eastAsia="宋体" w:hAnsi="Times New Roman" w:cs="Times New Roman" w:hint="eastAsia"/>
         </w:rPr>
-        <w:lastRenderedPageBreak/>
         <w:t>对无图像地形对象和污染显示文本</w:t>
       </w:r>
     </w:p>
@@ -6196,6 +6214,7 @@
         <w:rPr>
           <w:rFonts w:ascii="Times New Roman" w:eastAsia="宋体" w:hAnsi="Times New Roman" w:cs="Times New Roman" w:hint="eastAsia"/>
         </w:rPr>
+        <w:lastRenderedPageBreak/>
         <w:t>JumpJet</w:t>
       </w:r>
       <w:r>
@@ -6220,7 +6239,6 @@
         <w:rPr>
           <w:rFonts w:ascii="Times New Roman" w:eastAsia="宋体" w:hAnsi="Times New Roman" w:cs="Times New Roman" w:hint="eastAsia"/>
         </w:rPr>
-        <w:lastRenderedPageBreak/>
         <w:t>支持渲染体素的炮塔和炮管阴影，并读取</w:t>
       </w:r>
       <w:r>
@@ -7295,6 +7313,7 @@
         <w:rPr>
           <w:rFonts w:ascii="Times New Roman" w:eastAsia="宋体" w:hAnsi="Times New Roman" w:cs="Times New Roman" w:hint="eastAsia"/>
         </w:rPr>
+        <w:lastRenderedPageBreak/>
         <w:t>微调了地图渲染器的边缘坐标</w:t>
       </w:r>
     </w:p>
@@ -7313,7 +7332,6 @@
         <w:rPr>
           <w:rFonts w:ascii="Times New Roman" w:eastAsia="宋体" w:hAnsi="Times New Roman" w:cs="Times New Roman" w:hint="eastAsia"/>
         </w:rPr>
-        <w:lastRenderedPageBreak/>
         <w:t>修复了军衔图层不能隐藏的</w:t>
       </w:r>
       <w:r>
@@ -8322,6 +8340,7 @@
         <w:rPr>
           <w:rFonts w:ascii="Times New Roman" w:eastAsia="宋体" w:hAnsi="Times New Roman" w:cs="Times New Roman" w:hint="eastAsia"/>
         </w:rPr>
+        <w:lastRenderedPageBreak/>
         <w:t>支持翻译任意</w:t>
       </w:r>
       <w:r>
@@ -8358,7 +8377,6 @@
         <w:rPr>
           <w:rFonts w:ascii="Times New Roman" w:eastAsia="宋体" w:hAnsi="Times New Roman" w:cs="Times New Roman" w:hint="eastAsia"/>
         </w:rPr>
-        <w:lastRenderedPageBreak/>
         <w:t>支持多语言切换，添加了英文版。所有可以在</w:t>
       </w:r>
       <w:r>
@@ -9534,6 +9552,7 @@
         <w:rPr>
           <w:rFonts w:ascii="Times New Roman" w:eastAsia="宋体" w:hAnsi="Times New Roman" w:cs="Times New Roman" w:hint="eastAsia"/>
         </w:rPr>
+        <w:lastRenderedPageBreak/>
         <w:t>支持破损建筑的火焰效果显示</w:t>
       </w:r>
     </w:p>
@@ -9552,7 +9571,6 @@
         <w:rPr>
           <w:rFonts w:ascii="Times New Roman" w:eastAsia="宋体" w:hAnsi="Times New Roman" w:cs="Times New Roman" w:hint="eastAsia"/>
         </w:rPr>
-        <w:lastRenderedPageBreak/>
         <w:t>新增地图渲染器功能，可以渲染全图</w:t>
       </w:r>
       <w:r>
@@ -10727,14 +10745,8 @@
         <w:rPr>
           <w:rFonts w:ascii="Times New Roman" w:eastAsia="宋体" w:hAnsi="Times New Roman" w:cs="Times New Roman" w:hint="eastAsia"/>
         </w:rPr>
-        <w:t>作战小队编辑器新增跳转按钮，可以跳转至对应的特遣部队、脚本、标签（实</w:t>
-      </w:r>
-      <w:r>
-        <w:rPr>
-          <w:rFonts w:ascii="Times New Roman" w:eastAsia="宋体" w:hAnsi="Times New Roman" w:cs="Times New Roman" w:hint="eastAsia"/>
-        </w:rPr>
         <w:lastRenderedPageBreak/>
-        <w:t>际为寻找对应触发）</w:t>
+        <w:t>作战小队编辑器新增跳转按钮，可以跳转至对应的特遣部队、脚本、标签（实际为寻找对应触发）</w:t>
       </w:r>
     </w:p>
     <w:p>
@@ -11718,6 +11730,7 @@
         <w:rPr>
           <w:rFonts w:ascii="Times New Roman" w:eastAsia="宋体" w:hAnsi="Times New Roman" w:cs="Times New Roman" w:hint="eastAsia"/>
         </w:rPr>
+        <w:lastRenderedPageBreak/>
         <w:t>修复调整地图大小后隧道位置错误的</w:t>
       </w:r>
       <w:r>
@@ -11742,7 +11755,6 @@
         <w:rPr>
           <w:rFonts w:ascii="Times New Roman" w:eastAsia="宋体" w:hAnsi="Times New Roman" w:cs="Times New Roman" w:hint="eastAsia"/>
         </w:rPr>
-        <w:lastRenderedPageBreak/>
         <w:t>修复了在开启输入法和部分情况下在地图界面按</w:t>
       </w:r>
       <w:r>
@@ -12805,6 +12817,7 @@
         <w:rPr>
           <w:rFonts w:ascii="Times New Roman" w:eastAsia="宋体" w:hAnsi="Times New Roman" w:cs="Times New Roman" w:hint="eastAsia"/>
         </w:rPr>
+        <w:lastRenderedPageBreak/>
         <w:t>修复在摆放过建筑后改变地图大小时弹框的</w:t>
       </w:r>
       <w:r>
@@ -12829,7 +12842,6 @@
         <w:rPr>
           <w:rFonts w:ascii="Times New Roman" w:eastAsia="宋体" w:hAnsi="Times New Roman" w:cs="Times New Roman" w:hint="eastAsia"/>
         </w:rPr>
-        <w:lastRenderedPageBreak/>
         <w:t>新增</w:t>
       </w:r>
       <w:r>
@@ -13946,6 +13958,7 @@
         <w:rPr>
           <w:rFonts w:ascii="Times New Roman" w:eastAsia="宋体" w:hAnsi="Times New Roman" w:cs="Times New Roman" w:hint="eastAsia"/>
         </w:rPr>
+        <w:lastRenderedPageBreak/>
         <w:t>支持建筑动画的</w:t>
       </w:r>
       <w:r>
@@ -13994,14 +14007,7 @@
         <w:rPr>
           <w:rFonts w:ascii="Times New Roman" w:eastAsia="宋体" w:hAnsi="Times New Roman" w:cs="Times New Roman" w:hint="eastAsia"/>
         </w:rPr>
-        <w:t>深度</w:t>
-      </w:r>
-      <w:r>
-        <w:rPr>
-          <w:rFonts w:ascii="Times New Roman" w:eastAsia="宋体" w:hAnsi="Times New Roman" w:cs="Times New Roman" w:hint="eastAsia"/>
-        </w:rPr>
-        <w:lastRenderedPageBreak/>
-        <w:t>调整</w:t>
+        <w:t>深度调整</w:t>
       </w:r>
     </w:p>
     <w:p>
@@ -14995,6 +15001,7 @@
         <w:rPr>
           <w:rFonts w:ascii="Times New Roman" w:eastAsia="宋体" w:hAnsi="Times New Roman" w:cs="Times New Roman" w:hint="eastAsia"/>
         </w:rPr>
+        <w:lastRenderedPageBreak/>
         <w:t>优化地形浏览器渲染，减少部分地形的黑边</w:t>
       </w:r>
     </w:p>
@@ -15013,7 +15020,6 @@
         <w:rPr>
           <w:rFonts w:ascii="Times New Roman" w:eastAsia="宋体" w:hAnsi="Times New Roman" w:cs="Times New Roman" w:hint="eastAsia"/>
         </w:rPr>
-        <w:lastRenderedPageBreak/>
         <w:t>修复部分情况下物品浏览器取消选择仍会错误选中界面顶端选项的</w:t>
       </w:r>
       <w:r>
@@ -15997,6 +16003,7 @@
         <w:rPr>
           <w:rFonts w:ascii="Times New Roman" w:eastAsia="宋体" w:hAnsi="Times New Roman" w:cs="Times New Roman" w:hint="eastAsia"/>
         </w:rPr>
+        <w:lastRenderedPageBreak/>
         <w:t>粘贴选项新增“粘贴区域描边”，可以控制是否显示描边</w:t>
       </w:r>
     </w:p>
@@ -16015,7 +16022,6 @@
         <w:rPr>
           <w:rFonts w:ascii="Times New Roman" w:eastAsia="宋体" w:hAnsi="Times New Roman" w:cs="Times New Roman" w:hint="eastAsia"/>
         </w:rPr>
-        <w:lastRenderedPageBreak/>
         <w:t>多选模式支持正矩形添加和删除</w:t>
       </w:r>
     </w:p>
@@ -17013,6 +17019,7 @@
         <w:rPr>
           <w:rFonts w:ascii="Times New Roman" w:eastAsia="宋体" w:hAnsi="Times New Roman" w:cs="Times New Roman" w:hint="eastAsia"/>
         </w:rPr>
+        <w:lastRenderedPageBreak/>
         <w:t>CSF</w:t>
       </w:r>
       <w:r>
@@ -17037,7 +17044,6 @@
         <w:rPr>
           <w:rFonts w:ascii="Times New Roman" w:eastAsia="宋体" w:hAnsi="Times New Roman" w:cs="Times New Roman" w:hint="eastAsia"/>
         </w:rPr>
-        <w:lastRenderedPageBreak/>
         <w:t>恢复在某些地形下被屏蔽的高架木桥桥墩废墟</w:t>
       </w:r>
     </w:p>
@@ -17962,6 +17968,7 @@
         <w:rPr>
           <w:rFonts w:ascii="Times New Roman" w:eastAsia="宋体" w:hAnsi="Times New Roman" w:cs="Times New Roman" w:hint="eastAsia"/>
         </w:rPr>
+        <w:lastRenderedPageBreak/>
         <w:t>修复了当建筑位置位于地图外时崩溃的</w:t>
       </w:r>
       <w:r>
@@ -17986,7 +17993,6 @@
         <w:rPr>
           <w:rFonts w:ascii="Times New Roman" w:eastAsia="宋体" w:hAnsi="Times New Roman" w:cs="Times New Roman" w:hint="eastAsia"/>
         </w:rPr>
-        <w:lastRenderedPageBreak/>
         <w:t>修复了使用</w:t>
       </w:r>
       <w:r>
@@ -18965,6 +18971,7 @@
         <w:rPr>
           <w:rFonts w:ascii="Times New Roman" w:eastAsia="宋体" w:hAnsi="Times New Roman" w:cs="Times New Roman" w:hint="eastAsia"/>
         </w:rPr>
+        <w:lastRenderedPageBreak/>
         <w:t>修复由地形自定义色盘导致的部分地形显示</w:t>
       </w:r>
       <w:r>
@@ -18997,7 +19004,6 @@
           <w:sz w:val="28"/>
           <w:szCs w:val="32"/>
         </w:rPr>
-        <w:lastRenderedPageBreak/>
         <w:t>1.0.5 (2025.02.24)</w:t>
       </w:r>
     </w:p>
@@ -20010,13 +20016,13 @@
         <w:rPr>
           <w:rFonts w:ascii="Times New Roman" w:eastAsia="宋体" w:hAnsi="Times New Roman" w:cs="Times New Roman" w:hint="eastAsia"/>
         </w:rPr>
+        <w:lastRenderedPageBreak/>
         <w:t>修复了在开启自动海岸的情况下，放置地形会导致笔刷边缘区域进行不必要的</w:t>
       </w:r>
       <w:r>
         <w:rPr>
           <w:rFonts w:ascii="Times New Roman" w:eastAsia="宋体" w:hAnsi="Times New Roman" w:cs="Times New Roman" w:hint="eastAsia"/>
         </w:rPr>
-        <w:lastRenderedPageBreak/>
         <w:t>LAT</w:t>
       </w:r>
       <w:r>
@@ -21147,6 +21153,7 @@
         <w:rPr>
           <w:rFonts w:ascii="Times New Roman" w:eastAsia="宋体" w:hAnsi="Times New Roman" w:cs="Times New Roman" w:hint="eastAsia"/>
         </w:rPr>
+        <w:lastRenderedPageBreak/>
         <w:t>新增两项工具脚本函数：</w:t>
       </w:r>
       <w:r>
@@ -21171,14 +21178,7 @@
         <w:rPr>
           <w:rFonts w:ascii="Times New Roman" w:eastAsia="宋体" w:hAnsi="Times New Roman" w:cs="Times New Roman" w:hint="eastAsia"/>
         </w:rPr>
-        <w:t>，用于路径点</w:t>
-      </w:r>
-      <w:r>
-        <w:rPr>
-          <w:rFonts w:ascii="Times New Roman" w:eastAsia="宋体" w:hAnsi="Times New Roman" w:cs="Times New Roman" w:hint="eastAsia"/>
-        </w:rPr>
-        <w:lastRenderedPageBreak/>
-        <w:t>与数字互转，详见</w:t>
+        <w:t>，用于路径点与数字互转，详见</w:t>
       </w:r>
       <w:r>
         <w:rPr>

</xml_diff>

<commit_message>
fix remappable color, allow big smudge to drag
</commit_message>
<xml_diff>
--- a/Supplementary/文档/FA2SP HDM Edition说明文档.docx
+++ b/Supplementary/文档/FA2SP HDM Edition说明文档.docx
@@ -1021,6 +1021,36 @@
         <w:pStyle w:val="a9"/>
         <w:numPr>
           <w:ilvl w:val="0"/>
+          <w:numId w:val="11"/>
+        </w:numPr>
+        <w:rPr>
+          <w:rFonts w:ascii="Times New Roman" w:eastAsia="宋体" w:hAnsi="Times New Roman" w:cs="Times New Roman"/>
+        </w:rPr>
+      </w:pPr>
+      <w:r>
+        <w:rPr>
+          <w:rFonts w:ascii="Times New Roman" w:eastAsia="宋体" w:hAnsi="Times New Roman" w:cs="Times New Roman" w:hint="eastAsia"/>
+        </w:rPr>
+        <w:t>占地面积大于</w:t>
+      </w:r>
+      <w:r>
+        <w:rPr>
+          <w:rFonts w:ascii="Times New Roman" w:eastAsia="宋体" w:hAnsi="Times New Roman" w:cs="Times New Roman" w:hint="eastAsia"/>
+        </w:rPr>
+        <w:t>1x1</w:t>
+      </w:r>
+      <w:r>
+        <w:rPr>
+          <w:rFonts w:ascii="Times New Roman" w:eastAsia="宋体" w:hAnsi="Times New Roman" w:cs="Times New Roman" w:hint="eastAsia"/>
+        </w:rPr>
+        <w:t>的污染可以在非原点格子拖动</w:t>
+      </w:r>
+    </w:p>
+    <w:p>
+      <w:pPr>
+        <w:pStyle w:val="a9"/>
+        <w:numPr>
+          <w:ilvl w:val="0"/>
           <w:numId w:val="10"/>
         </w:numPr>
         <w:rPr>
@@ -1795,6 +1825,7 @@
         <w:rPr>
           <w:rFonts w:ascii="Times New Roman" w:eastAsia="宋体" w:hAnsi="Times New Roman" w:cs="Times New Roman" w:hint="eastAsia"/>
         </w:rPr>
+        <w:lastRenderedPageBreak/>
         <w:t>删除</w:t>
       </w:r>
       <w:r>
@@ -1843,7 +1874,6 @@
         <w:rPr>
           <w:rFonts w:ascii="Times New Roman" w:eastAsia="宋体" w:hAnsi="Times New Roman" w:cs="Times New Roman" w:hint="eastAsia"/>
         </w:rPr>
-        <w:lastRenderedPageBreak/>
         <w:t>快捷保存会使用与上次手动保存相同的预览图选项</w:t>
       </w:r>
     </w:p>
@@ -2915,6 +2945,7 @@
           <w:kern w:val="0"/>
           <w14:ligatures w14:val="none"/>
         </w:rPr>
+        <w:lastRenderedPageBreak/>
         <w:t>在物品浏览器中进行分类，其中</w:t>
       </w:r>
       <w:r>
@@ -2947,7 +2978,7 @@
           <w:kern w:val="0"/>
           <w14:ligatures w14:val="none"/>
         </w:rPr>
-        <w:t>中进行翻译，此标</w:t>
+        <w:t>中进行翻译，此标签与</w:t>
       </w:r>
       <w:r>
         <w:rPr>
@@ -2955,8 +2986,7 @@
           <w:kern w:val="0"/>
           <w14:ligatures w14:val="none"/>
         </w:rPr>
-        <w:lastRenderedPageBreak/>
-        <w:t>签与</w:t>
+        <w:t>WAE</w:t>
       </w:r>
       <w:r>
         <w:rPr>
@@ -2964,7 +2994,7 @@
           <w:kern w:val="0"/>
           <w14:ligatures w14:val="none"/>
         </w:rPr>
-        <w:t>WAE</w:t>
+        <w:t>兼容</w:t>
       </w:r>
       <w:r>
         <w:rPr>
@@ -2972,7 +3002,7 @@
           <w:kern w:val="0"/>
           <w14:ligatures w14:val="none"/>
         </w:rPr>
-        <w:t>兼容</w:t>
+        <w:t>；当</w:t>
       </w:r>
       <w:r>
         <w:rPr>
@@ -2980,7 +3010,7 @@
           <w:kern w:val="0"/>
           <w14:ligatures w14:val="none"/>
         </w:rPr>
-        <w:t>；当</w:t>
+        <w:t>value</w:t>
       </w:r>
       <w:r>
         <w:rPr>
@@ -2988,7 +3018,7 @@
           <w:kern w:val="0"/>
           <w14:ligatures w14:val="none"/>
         </w:rPr>
-        <w:t>value</w:t>
+        <w:t>与</w:t>
       </w:r>
       <w:r>
         <w:rPr>
@@ -2996,7 +3026,7 @@
           <w:kern w:val="0"/>
           <w14:ligatures w14:val="none"/>
         </w:rPr>
-        <w:t>与</w:t>
+        <w:t>FAData.ini-&gt;[</w:t>
       </w:r>
       <w:r>
         <w:rPr>
@@ -3004,7 +3034,7 @@
           <w:kern w:val="0"/>
           <w14:ligatures w14:val="none"/>
         </w:rPr>
-        <w:t>FAData.ini-&gt;[</w:t>
+        <w:t>English-Sides</w:t>
       </w:r>
       <w:r>
         <w:rPr>
@@ -3012,7 +3042,7 @@
           <w:kern w:val="0"/>
           <w14:ligatures w14:val="none"/>
         </w:rPr>
-        <w:t>English-Sides</w:t>
+        <w:t>]</w:t>
       </w:r>
       <w:r>
         <w:rPr>
@@ -3020,95 +3050,95 @@
           <w:kern w:val="0"/>
           <w14:ligatures w14:val="none"/>
         </w:rPr>
-        <w:t>]</w:t>
-      </w:r>
+        <w:t>中的值相同时，会进行合并</w:t>
+      </w:r>
+    </w:p>
+    <w:p>
+      <w:pPr>
+        <w:pStyle w:val="a9"/>
+        <w:numPr>
+          <w:ilvl w:val="0"/>
+          <w:numId w:val="45"/>
+        </w:numPr>
+        <w:rPr>
+          <w:rFonts w:ascii="Times New Roman" w:eastAsia="宋体" w:hAnsi="Times New Roman" w:cs="Times New Roman"/>
+        </w:rPr>
+      </w:pPr>
       <w:r>
         <w:rPr>
           <w:rFonts w:ascii="Times New Roman" w:eastAsia="宋体" w:hAnsi="Times New Roman" w:cs="Times New Roman" w:hint="eastAsia"/>
           <w:kern w:val="0"/>
           <w14:ligatures w14:val="none"/>
         </w:rPr>
-        <w:t>中的值相同时，会进行合并</w:t>
-      </w:r>
-    </w:p>
-    <w:p>
-      <w:pPr>
-        <w:pStyle w:val="a9"/>
-        <w:numPr>
-          <w:ilvl w:val="0"/>
-          <w:numId w:val="45"/>
-        </w:numPr>
-        <w:rPr>
-          <w:rFonts w:ascii="Times New Roman" w:eastAsia="宋体" w:hAnsi="Times New Roman" w:cs="Times New Roman"/>
-        </w:rPr>
-      </w:pPr>
+        <w:t>修复部分情况下物品浏览器选项的名称与实际单位不符的</w:t>
+      </w:r>
       <w:r>
         <w:rPr>
           <w:rFonts w:ascii="Times New Roman" w:eastAsia="宋体" w:hAnsi="Times New Roman" w:cs="Times New Roman" w:hint="eastAsia"/>
           <w:kern w:val="0"/>
           <w14:ligatures w14:val="none"/>
         </w:rPr>
-        <w:t>修复部分情况下物品浏览器选项的名称与实际单位不符的</w:t>
-      </w:r>
-      <w:r>
-        <w:rPr>
-          <w:rFonts w:ascii="Times New Roman" w:eastAsia="宋体" w:hAnsi="Times New Roman" w:cs="Times New Roman" w:hint="eastAsia"/>
+        <w:t>bug</w:t>
+      </w:r>
+    </w:p>
+    <w:p>
+      <w:pPr>
+        <w:pStyle w:val="a9"/>
+        <w:numPr>
+          <w:ilvl w:val="0"/>
+          <w:numId w:val="45"/>
+        </w:numPr>
+        <w:rPr>
+          <w:rFonts w:ascii="Times New Roman" w:eastAsia="宋体" w:hAnsi="Times New Roman" w:cs="Times New Roman"/>
           <w:kern w:val="0"/>
           <w14:ligatures w14:val="none"/>
         </w:rPr>
-        <w:t>bug</w:t>
-      </w:r>
-    </w:p>
-    <w:p>
-      <w:pPr>
-        <w:pStyle w:val="a9"/>
-        <w:numPr>
-          <w:ilvl w:val="0"/>
-          <w:numId w:val="45"/>
-        </w:numPr>
-        <w:rPr>
-          <w:rFonts w:ascii="Times New Roman" w:eastAsia="宋体" w:hAnsi="Times New Roman" w:cs="Times New Roman"/>
+      </w:pPr>
+      <w:r>
+        <w:rPr>
+          <w:rFonts w:ascii="Times New Roman" w:eastAsia="宋体" w:hAnsi="Times New Roman" w:cs="Times New Roman" w:hint="eastAsia"/>
           <w:kern w:val="0"/>
           <w14:ligatures w14:val="none"/>
         </w:rPr>
-      </w:pPr>
+        <w:t>支持设置覆盖物数据的最大值，详见</w:t>
+      </w:r>
       <w:r>
         <w:rPr>
           <w:rFonts w:ascii="Times New Roman" w:eastAsia="宋体" w:hAnsi="Times New Roman" w:cs="Times New Roman" w:hint="eastAsia"/>
           <w:kern w:val="0"/>
           <w14:ligatures w14:val="none"/>
         </w:rPr>
-        <w:t>支持设置覆盖物数据的最大值，详见</w:t>
-      </w:r>
-      <w:r>
-        <w:rPr>
-          <w:rFonts w:ascii="Times New Roman" w:eastAsia="宋体" w:hAnsi="Times New Roman" w:cs="Times New Roman" w:hint="eastAsia"/>
+        <w:t>OverlayDataLimit</w:t>
+      </w:r>
+    </w:p>
+    <w:p>
+      <w:pPr>
+        <w:pStyle w:val="a9"/>
+        <w:numPr>
+          <w:ilvl w:val="0"/>
+          <w:numId w:val="45"/>
+        </w:numPr>
+        <w:rPr>
+          <w:rFonts w:ascii="Times New Roman" w:eastAsia="宋体" w:hAnsi="Times New Roman" w:cs="Times New Roman"/>
           <w:kern w:val="0"/>
           <w14:ligatures w14:val="none"/>
         </w:rPr>
-        <w:t>OverlayDataLimit</w:t>
-      </w:r>
-    </w:p>
-    <w:p>
-      <w:pPr>
-        <w:pStyle w:val="a9"/>
-        <w:numPr>
-          <w:ilvl w:val="0"/>
-          <w:numId w:val="45"/>
-        </w:numPr>
-        <w:rPr>
-          <w:rFonts w:ascii="Times New Roman" w:eastAsia="宋体" w:hAnsi="Times New Roman" w:cs="Times New Roman"/>
+      </w:pPr>
+      <w:r>
+        <w:rPr>
+          <w:rFonts w:ascii="Times New Roman" w:eastAsia="宋体" w:hAnsi="Times New Roman" w:cs="Times New Roman" w:hint="eastAsia"/>
           <w:kern w:val="0"/>
           <w14:ligatures w14:val="none"/>
         </w:rPr>
-      </w:pPr>
+        <w:t>修复</w:t>
+      </w:r>
       <w:r>
         <w:rPr>
           <w:rFonts w:ascii="Times New Roman" w:eastAsia="宋体" w:hAnsi="Times New Roman" w:cs="Times New Roman" w:hint="eastAsia"/>
           <w:kern w:val="0"/>
           <w14:ligatures w14:val="none"/>
         </w:rPr>
-        <w:t>修复</w:t>
+        <w:t>phobos</w:t>
       </w:r>
       <w:r>
         <w:rPr>
@@ -3116,59 +3146,59 @@
           <w:kern w:val="0"/>
           <w14:ligatures w14:val="none"/>
         </w:rPr>
-        <w:t>phobos</w:t>
-      </w:r>
-      <w:r>
-        <w:rPr>
-          <w:rFonts w:ascii="Times New Roman" w:eastAsia="宋体" w:hAnsi="Times New Roman" w:cs="Times New Roman" w:hint="eastAsia"/>
+        <w:t>继承的部分问题</w:t>
+      </w:r>
+    </w:p>
+    <w:p>
+      <w:pPr>
+        <w:pStyle w:val="a9"/>
+        <w:numPr>
+          <w:ilvl w:val="0"/>
+          <w:numId w:val="45"/>
+        </w:numPr>
+        <w:rPr>
+          <w:rFonts w:ascii="Times New Roman" w:eastAsia="宋体" w:hAnsi="Times New Roman" w:cs="Times New Roman"/>
           <w:kern w:val="0"/>
           <w14:ligatures w14:val="none"/>
         </w:rPr>
-        <w:t>继承的部分问题</w:t>
-      </w:r>
-    </w:p>
-    <w:p>
-      <w:pPr>
-        <w:pStyle w:val="a9"/>
-        <w:numPr>
-          <w:ilvl w:val="0"/>
-          <w:numId w:val="45"/>
-        </w:numPr>
-        <w:rPr>
-          <w:rFonts w:ascii="Times New Roman" w:eastAsia="宋体" w:hAnsi="Times New Roman" w:cs="Times New Roman"/>
+      </w:pPr>
+      <w:r>
+        <w:rPr>
+          <w:rFonts w:ascii="Times New Roman" w:eastAsia="宋体" w:hAnsi="Times New Roman" w:cs="Times New Roman" w:hint="eastAsia"/>
           <w:kern w:val="0"/>
           <w14:ligatures w14:val="none"/>
         </w:rPr>
-      </w:pPr>
-      <w:r>
-        <w:rPr>
-          <w:rFonts w:ascii="Times New Roman" w:eastAsia="宋体" w:hAnsi="Times New Roman" w:cs="Times New Roman" w:hint="eastAsia"/>
+        <w:t>当单位本体不可见时，仍然支持绘制附加单位</w:t>
+      </w:r>
+    </w:p>
+    <w:p>
+      <w:pPr>
+        <w:pStyle w:val="a9"/>
+        <w:numPr>
+          <w:ilvl w:val="0"/>
+          <w:numId w:val="45"/>
+        </w:numPr>
+        <w:rPr>
+          <w:rFonts w:ascii="Times New Roman" w:eastAsia="宋体" w:hAnsi="Times New Roman" w:cs="Times New Roman"/>
           <w:kern w:val="0"/>
           <w14:ligatures w14:val="none"/>
         </w:rPr>
-        <w:t>当单位本体不可见时，仍然支持绘制附加单位</w:t>
-      </w:r>
-    </w:p>
-    <w:p>
-      <w:pPr>
-        <w:pStyle w:val="a9"/>
-        <w:numPr>
-          <w:ilvl w:val="0"/>
-          <w:numId w:val="45"/>
-        </w:numPr>
-        <w:rPr>
-          <w:rFonts w:ascii="Times New Roman" w:eastAsia="宋体" w:hAnsi="Times New Roman" w:cs="Times New Roman"/>
+      </w:pPr>
+      <w:r>
+        <w:rPr>
+          <w:rFonts w:ascii="Times New Roman" w:eastAsia="宋体" w:hAnsi="Times New Roman" w:cs="Times New Roman" w:hint="eastAsia"/>
           <w:kern w:val="0"/>
           <w14:ligatures w14:val="none"/>
         </w:rPr>
-      </w:pPr>
+        <w:t>修复了高</w:t>
+      </w:r>
       <w:r>
         <w:rPr>
           <w:rFonts w:ascii="Times New Roman" w:eastAsia="宋体" w:hAnsi="Times New Roman" w:cs="Times New Roman" w:hint="eastAsia"/>
           <w:kern w:val="0"/>
           <w14:ligatures w14:val="none"/>
         </w:rPr>
-        <w:t>修复了高</w:t>
+        <w:t>dpi</w:t>
       </w:r>
       <w:r>
         <w:rPr>
@@ -3176,7 +3206,7 @@
           <w:kern w:val="0"/>
           <w14:ligatures w14:val="none"/>
         </w:rPr>
-        <w:t>dpi</w:t>
+        <w:t>下地形浏览器按钮显示不全的</w:t>
       </w:r>
       <w:r>
         <w:rPr>
@@ -3184,119 +3214,119 @@
           <w:kern w:val="0"/>
           <w14:ligatures w14:val="none"/>
         </w:rPr>
-        <w:t>下地形浏览器按钮显示不全的</w:t>
-      </w:r>
-      <w:r>
-        <w:rPr>
-          <w:rFonts w:ascii="Times New Roman" w:eastAsia="宋体" w:hAnsi="Times New Roman" w:cs="Times New Roman" w:hint="eastAsia"/>
+        <w:t>bug</w:t>
+      </w:r>
+    </w:p>
+    <w:p>
+      <w:pPr>
+        <w:pStyle w:val="a9"/>
+        <w:numPr>
+          <w:ilvl w:val="0"/>
+          <w:numId w:val="45"/>
+        </w:numPr>
+        <w:rPr>
+          <w:rFonts w:ascii="Times New Roman" w:eastAsia="宋体" w:hAnsi="Times New Roman" w:cs="Times New Roman"/>
           <w:kern w:val="0"/>
           <w14:ligatures w14:val="none"/>
         </w:rPr>
-        <w:t>bug</w:t>
-      </w:r>
-    </w:p>
-    <w:p>
-      <w:pPr>
-        <w:pStyle w:val="a9"/>
-        <w:numPr>
-          <w:ilvl w:val="0"/>
-          <w:numId w:val="45"/>
-        </w:numPr>
-        <w:rPr>
-          <w:rFonts w:ascii="Times New Roman" w:eastAsia="宋体" w:hAnsi="Times New Roman" w:cs="Times New Roman"/>
+      </w:pPr>
+      <w:r>
+        <w:rPr>
+          <w:rFonts w:ascii="Times New Roman" w:eastAsia="宋体" w:hAnsi="Times New Roman" w:cs="Times New Roman" w:hint="eastAsia"/>
           <w:kern w:val="0"/>
           <w14:ligatures w14:val="none"/>
         </w:rPr>
-      </w:pPr>
+        <w:t>新增对象查看器，可以查看所有游戏对象的图像，并可以选中放置</w:t>
+      </w:r>
       <w:r>
         <w:rPr>
           <w:rFonts w:ascii="Times New Roman" w:eastAsia="宋体" w:hAnsi="Times New Roman" w:cs="Times New Roman" w:hint="eastAsia"/>
           <w:kern w:val="0"/>
           <w14:ligatures w14:val="none"/>
         </w:rPr>
-        <w:t>新增对象查看器，可以查看所有游戏对象的图像，并可以选中放置</w:t>
-      </w:r>
-      <w:r>
-        <w:rPr>
-          <w:rFonts w:ascii="Times New Roman" w:eastAsia="宋体" w:hAnsi="Times New Roman" w:cs="Times New Roman" w:hint="eastAsia"/>
+        <w:t>，支持使用方向键切换选择</w:t>
+      </w:r>
+    </w:p>
+    <w:p>
+      <w:pPr>
+        <w:pStyle w:val="a9"/>
+        <w:numPr>
+          <w:ilvl w:val="0"/>
+          <w:numId w:val="45"/>
+        </w:numPr>
+        <w:rPr>
+          <w:rFonts w:ascii="Times New Roman" w:eastAsia="宋体" w:hAnsi="Times New Roman" w:cs="Times New Roman"/>
           <w:kern w:val="0"/>
           <w14:ligatures w14:val="none"/>
         </w:rPr>
-        <w:t>，支持使用方向键切换选择</w:t>
-      </w:r>
-    </w:p>
-    <w:p>
-      <w:pPr>
-        <w:pStyle w:val="a9"/>
-        <w:numPr>
-          <w:ilvl w:val="0"/>
-          <w:numId w:val="45"/>
-        </w:numPr>
-        <w:rPr>
-          <w:rFonts w:ascii="Times New Roman" w:eastAsia="宋体" w:hAnsi="Times New Roman" w:cs="Times New Roman"/>
+      </w:pPr>
+      <w:r>
+        <w:rPr>
+          <w:rFonts w:ascii="Times New Roman" w:eastAsia="宋体" w:hAnsi="Times New Roman" w:cs="Times New Roman" w:hint="eastAsia"/>
           <w:kern w:val="0"/>
           <w14:ligatures w14:val="none"/>
         </w:rPr>
-      </w:pPr>
-      <w:r>
-        <w:rPr>
-          <w:rFonts w:ascii="Times New Roman" w:eastAsia="宋体" w:hAnsi="Times New Roman" w:cs="Times New Roman" w:hint="eastAsia"/>
+        <w:t>优化灯光建筑算法</w:t>
+      </w:r>
+    </w:p>
+    <w:p>
+      <w:pPr>
+        <w:pStyle w:val="a9"/>
+        <w:numPr>
+          <w:ilvl w:val="0"/>
+          <w:numId w:val="45"/>
+        </w:numPr>
+        <w:rPr>
+          <w:rFonts w:ascii="Times New Roman" w:eastAsia="宋体" w:hAnsi="Times New Roman" w:cs="Times New Roman"/>
           <w:kern w:val="0"/>
           <w14:ligatures w14:val="none"/>
         </w:rPr>
-        <w:t>优化灯光建筑算法</w:t>
-      </w:r>
-    </w:p>
-    <w:p>
-      <w:pPr>
-        <w:pStyle w:val="a9"/>
-        <w:numPr>
-          <w:ilvl w:val="0"/>
-          <w:numId w:val="45"/>
-        </w:numPr>
-        <w:rPr>
-          <w:rFonts w:ascii="Times New Roman" w:eastAsia="宋体" w:hAnsi="Times New Roman" w:cs="Times New Roman"/>
+      </w:pPr>
+      <w:r>
+        <w:rPr>
+          <w:rFonts w:ascii="Times New Roman" w:eastAsia="宋体" w:hAnsi="Times New Roman" w:cs="Times New Roman" w:hint="eastAsia"/>
           <w:kern w:val="0"/>
           <w14:ligatures w14:val="none"/>
         </w:rPr>
-      </w:pPr>
+        <w:t>修复部分建筑炮管无法加载的</w:t>
+      </w:r>
       <w:r>
         <w:rPr>
           <w:rFonts w:ascii="Times New Roman" w:eastAsia="宋体" w:hAnsi="Times New Roman" w:cs="Times New Roman" w:hint="eastAsia"/>
           <w:kern w:val="0"/>
           <w14:ligatures w14:val="none"/>
         </w:rPr>
-        <w:t>修复部分建筑炮管无法加载的</w:t>
-      </w:r>
-      <w:r>
-        <w:rPr>
-          <w:rFonts w:ascii="Times New Roman" w:eastAsia="宋体" w:hAnsi="Times New Roman" w:cs="Times New Roman" w:hint="eastAsia"/>
+        <w:t>bug</w:t>
+      </w:r>
+    </w:p>
+    <w:p>
+      <w:pPr>
+        <w:pStyle w:val="a9"/>
+        <w:numPr>
+          <w:ilvl w:val="0"/>
+          <w:numId w:val="45"/>
+        </w:numPr>
+        <w:rPr>
+          <w:rFonts w:ascii="Times New Roman" w:eastAsia="宋体" w:hAnsi="Times New Roman" w:cs="Times New Roman"/>
           <w:kern w:val="0"/>
           <w14:ligatures w14:val="none"/>
         </w:rPr>
-        <w:t>bug</w:t>
-      </w:r>
-    </w:p>
-    <w:p>
-      <w:pPr>
-        <w:pStyle w:val="a9"/>
-        <w:numPr>
-          <w:ilvl w:val="0"/>
-          <w:numId w:val="45"/>
-        </w:numPr>
-        <w:rPr>
-          <w:rFonts w:ascii="Times New Roman" w:eastAsia="宋体" w:hAnsi="Times New Roman" w:cs="Times New Roman"/>
+      </w:pPr>
+      <w:r>
+        <w:rPr>
+          <w:rFonts w:ascii="Times New Roman" w:eastAsia="宋体" w:hAnsi="Times New Roman" w:cs="Times New Roman" w:hint="eastAsia"/>
           <w:kern w:val="0"/>
           <w14:ligatures w14:val="none"/>
         </w:rPr>
-      </w:pPr>
+        <w:t>支持读取</w:t>
+      </w:r>
       <w:r>
         <w:rPr>
           <w:rFonts w:ascii="Times New Roman" w:eastAsia="宋体" w:hAnsi="Times New Roman" w:cs="Times New Roman" w:hint="eastAsia"/>
           <w:kern w:val="0"/>
           <w14:ligatures w14:val="none"/>
         </w:rPr>
-        <w:t>支持读取</w:t>
+        <w:t>shp</w:t>
       </w:r>
       <w:r>
         <w:rPr>
@@ -3304,7 +3334,7 @@
           <w:kern w:val="0"/>
           <w14:ligatures w14:val="none"/>
         </w:rPr>
-        <w:t>shp</w:t>
+        <w:t>建筑炮塔的</w:t>
       </w:r>
       <w:r>
         <w:rPr>
@@ -3312,81 +3342,81 @@
           <w:kern w:val="0"/>
           <w14:ligatures w14:val="none"/>
         </w:rPr>
-        <w:t>建筑炮塔的</w:t>
-      </w:r>
-      <w:r>
-        <w:rPr>
-          <w:rFonts w:ascii="Times New Roman" w:eastAsia="宋体" w:hAnsi="Times New Roman" w:cs="Times New Roman" w:hint="eastAsia"/>
+        <w:t>TurretAnimDamaged</w:t>
+      </w:r>
+    </w:p>
+    <w:p>
+      <w:pPr>
+        <w:pStyle w:val="a9"/>
+        <w:numPr>
+          <w:ilvl w:val="0"/>
+          <w:numId w:val="45"/>
+        </w:numPr>
+        <w:rPr>
+          <w:rFonts w:ascii="Times New Roman" w:eastAsia="宋体" w:hAnsi="Times New Roman" w:cs="Times New Roman"/>
           <w:kern w:val="0"/>
           <w14:ligatures w14:val="none"/>
         </w:rPr>
-        <w:t>TurretAnimDamaged</w:t>
-      </w:r>
-    </w:p>
-    <w:p>
-      <w:pPr>
-        <w:pStyle w:val="a9"/>
-        <w:numPr>
-          <w:ilvl w:val="0"/>
-          <w:numId w:val="45"/>
-        </w:numPr>
-        <w:rPr>
-          <w:rFonts w:ascii="Times New Roman" w:eastAsia="宋体" w:hAnsi="Times New Roman" w:cs="Times New Roman"/>
+      </w:pPr>
+      <w:r>
+        <w:rPr>
+          <w:rFonts w:ascii="Times New Roman" w:eastAsia="宋体" w:hAnsi="Times New Roman" w:cs="Times New Roman" w:hint="eastAsia"/>
           <w:kern w:val="0"/>
           <w14:ligatures w14:val="none"/>
         </w:rPr>
-      </w:pPr>
-      <w:r>
-        <w:rPr>
-          <w:rFonts w:ascii="Times New Roman" w:eastAsia="宋体" w:hAnsi="Times New Roman" w:cs="Times New Roman" w:hint="eastAsia"/>
+        <w:t>显著提升了加载物品浏览器图标的效率</w:t>
+      </w:r>
+    </w:p>
+    <w:p>
+      <w:pPr>
+        <w:pStyle w:val="a9"/>
+        <w:numPr>
+          <w:ilvl w:val="0"/>
+          <w:numId w:val="45"/>
+        </w:numPr>
+        <w:rPr>
+          <w:rFonts w:ascii="Times New Roman" w:eastAsia="宋体" w:hAnsi="Times New Roman" w:cs="Times New Roman"/>
           <w:kern w:val="0"/>
           <w14:ligatures w14:val="none"/>
         </w:rPr>
-        <w:t>显著提升了加载物品浏览器图标的效率</w:t>
-      </w:r>
-    </w:p>
-    <w:p>
-      <w:pPr>
-        <w:pStyle w:val="a9"/>
-        <w:numPr>
-          <w:ilvl w:val="0"/>
-          <w:numId w:val="45"/>
-        </w:numPr>
-        <w:rPr>
-          <w:rFonts w:ascii="Times New Roman" w:eastAsia="宋体" w:hAnsi="Times New Roman" w:cs="Times New Roman"/>
+      </w:pPr>
+      <w:r>
+        <w:rPr>
+          <w:rFonts w:ascii="Times New Roman" w:eastAsia="宋体" w:hAnsi="Times New Roman" w:cs="Times New Roman" w:hint="eastAsia"/>
           <w:kern w:val="0"/>
           <w14:ligatures w14:val="none"/>
         </w:rPr>
-      </w:pPr>
-      <w:r>
-        <w:rPr>
-          <w:rFonts w:ascii="Times New Roman" w:eastAsia="宋体" w:hAnsi="Times New Roman" w:cs="Times New Roman" w:hint="eastAsia"/>
+        <w:t>当放置覆盖物进行预览时，不会改变扫过区域的矿石价值</w:t>
+      </w:r>
+    </w:p>
+    <w:p>
+      <w:pPr>
+        <w:pStyle w:val="a9"/>
+        <w:numPr>
+          <w:ilvl w:val="0"/>
+          <w:numId w:val="45"/>
+        </w:numPr>
+        <w:rPr>
+          <w:rFonts w:ascii="Times New Roman" w:eastAsia="宋体" w:hAnsi="Times New Roman" w:cs="Times New Roman"/>
           <w:kern w:val="0"/>
           <w14:ligatures w14:val="none"/>
         </w:rPr>
-        <w:t>当放置覆盖物进行预览时，不会改变扫过区域的矿石价值</w:t>
-      </w:r>
-    </w:p>
-    <w:p>
-      <w:pPr>
-        <w:pStyle w:val="a9"/>
-        <w:numPr>
-          <w:ilvl w:val="0"/>
-          <w:numId w:val="45"/>
-        </w:numPr>
-        <w:rPr>
-          <w:rFonts w:ascii="Times New Roman" w:eastAsia="宋体" w:hAnsi="Times New Roman" w:cs="Times New Roman"/>
+      </w:pPr>
+      <w:r>
+        <w:rPr>
+          <w:rFonts w:ascii="Times New Roman" w:eastAsia="宋体" w:hAnsi="Times New Roman" w:cs="Times New Roman" w:hint="eastAsia"/>
           <w:kern w:val="0"/>
           <w14:ligatures w14:val="none"/>
         </w:rPr>
-      </w:pPr>
+        <w:t>脚本编辑器的脚本序号从</w:t>
+      </w:r>
       <w:r>
         <w:rPr>
           <w:rFonts w:ascii="Times New Roman" w:eastAsia="宋体" w:hAnsi="Times New Roman" w:cs="Times New Roman" w:hint="eastAsia"/>
           <w:kern w:val="0"/>
           <w14:ligatures w14:val="none"/>
         </w:rPr>
-        <w:t>脚本编辑器的脚本序号从</w:t>
+        <w:t>1</w:t>
       </w:r>
       <w:r>
         <w:rPr>
@@ -3394,89 +3424,89 @@
           <w:kern w:val="0"/>
           <w14:ligatures w14:val="none"/>
         </w:rPr>
-        <w:t>1</w:t>
-      </w:r>
-      <w:r>
-        <w:rPr>
-          <w:rFonts w:ascii="Times New Roman" w:eastAsia="宋体" w:hAnsi="Times New Roman" w:cs="Times New Roman" w:hint="eastAsia"/>
+        <w:t>开始</w:t>
+      </w:r>
+    </w:p>
+    <w:p>
+      <w:pPr>
+        <w:pStyle w:val="a9"/>
+        <w:numPr>
+          <w:ilvl w:val="0"/>
+          <w:numId w:val="45"/>
+        </w:numPr>
+        <w:rPr>
+          <w:rFonts w:ascii="Times New Roman" w:eastAsia="宋体" w:hAnsi="Times New Roman" w:cs="Times New Roman"/>
           <w:kern w:val="0"/>
           <w14:ligatures w14:val="none"/>
         </w:rPr>
-        <w:t>开始</w:t>
-      </w:r>
-    </w:p>
-    <w:p>
-      <w:pPr>
-        <w:pStyle w:val="a9"/>
-        <w:numPr>
-          <w:ilvl w:val="0"/>
-          <w:numId w:val="45"/>
-        </w:numPr>
-        <w:rPr>
-          <w:rFonts w:ascii="Times New Roman" w:eastAsia="宋体" w:hAnsi="Times New Roman" w:cs="Times New Roman"/>
+      </w:pPr>
+      <w:r>
+        <w:rPr>
+          <w:rFonts w:ascii="Times New Roman" w:eastAsia="宋体" w:hAnsi="Times New Roman" w:cs="Times New Roman" w:hint="eastAsia"/>
           <w:kern w:val="0"/>
           <w14:ligatures w14:val="none"/>
         </w:rPr>
-      </w:pPr>
+        <w:t>修复在地图边缘放置地形时崩溃的</w:t>
+      </w:r>
       <w:r>
         <w:rPr>
           <w:rFonts w:ascii="Times New Roman" w:eastAsia="宋体" w:hAnsi="Times New Roman" w:cs="Times New Roman" w:hint="eastAsia"/>
           <w:kern w:val="0"/>
           <w14:ligatures w14:val="none"/>
         </w:rPr>
-        <w:t>修复在地图边缘放置地形时崩溃的</w:t>
-      </w:r>
-      <w:r>
-        <w:rPr>
-          <w:rFonts w:ascii="Times New Roman" w:eastAsia="宋体" w:hAnsi="Times New Roman" w:cs="Times New Roman" w:hint="eastAsia"/>
+        <w:t>bug</w:t>
+      </w:r>
+    </w:p>
+    <w:p>
+      <w:pPr>
+        <w:pStyle w:val="a9"/>
+        <w:numPr>
+          <w:ilvl w:val="0"/>
+          <w:numId w:val="45"/>
+        </w:numPr>
+        <w:rPr>
+          <w:rFonts w:ascii="Times New Roman" w:eastAsia="宋体" w:hAnsi="Times New Roman" w:cs="Times New Roman"/>
           <w:kern w:val="0"/>
           <w14:ligatures w14:val="none"/>
         </w:rPr>
-        <w:t>bug</w:t>
-      </w:r>
-    </w:p>
-    <w:p>
-      <w:pPr>
-        <w:pStyle w:val="a9"/>
-        <w:numPr>
-          <w:ilvl w:val="0"/>
-          <w:numId w:val="45"/>
-        </w:numPr>
-        <w:rPr>
-          <w:rFonts w:ascii="Times New Roman" w:eastAsia="宋体" w:hAnsi="Times New Roman" w:cs="Times New Roman"/>
+      </w:pPr>
+      <w:r>
+        <w:rPr>
+          <w:rFonts w:ascii="Times New Roman" w:eastAsia="宋体" w:hAnsi="Times New Roman" w:cs="Times New Roman" w:hint="eastAsia"/>
           <w:kern w:val="0"/>
           <w14:ligatures w14:val="none"/>
         </w:rPr>
-      </w:pPr>
-      <w:r>
-        <w:rPr>
-          <w:rFonts w:ascii="Times New Roman" w:eastAsia="宋体" w:hAnsi="Times New Roman" w:cs="Times New Roman" w:hint="eastAsia"/>
+        <w:t>新增距离工具箱，可以支持测距、设置对称点等功能</w:t>
+      </w:r>
+    </w:p>
+    <w:p>
+      <w:pPr>
+        <w:pStyle w:val="a9"/>
+        <w:numPr>
+          <w:ilvl w:val="0"/>
+          <w:numId w:val="45"/>
+        </w:numPr>
+        <w:rPr>
+          <w:rFonts w:ascii="Times New Roman" w:eastAsia="宋体" w:hAnsi="Times New Roman" w:cs="Times New Roman"/>
           <w:kern w:val="0"/>
           <w14:ligatures w14:val="none"/>
         </w:rPr>
-        <w:t>新增距离工具箱，可以支持测距、设置对称点等功能</w:t>
-      </w:r>
-    </w:p>
-    <w:p>
-      <w:pPr>
-        <w:pStyle w:val="a9"/>
-        <w:numPr>
-          <w:ilvl w:val="0"/>
-          <w:numId w:val="45"/>
-        </w:numPr>
-        <w:rPr>
-          <w:rFonts w:ascii="Times New Roman" w:eastAsia="宋体" w:hAnsi="Times New Roman" w:cs="Times New Roman"/>
+      </w:pPr>
+      <w:r>
+        <w:rPr>
+          <w:rFonts w:ascii="Times New Roman" w:eastAsia="宋体" w:hAnsi="Times New Roman" w:cs="Times New Roman" w:hint="eastAsia"/>
           <w:kern w:val="0"/>
           <w14:ligatures w14:val="none"/>
         </w:rPr>
-      </w:pPr>
+        <w:t>支持为</w:t>
+      </w:r>
       <w:r>
         <w:rPr>
           <w:rFonts w:ascii="Times New Roman" w:eastAsia="宋体" w:hAnsi="Times New Roman" w:cs="Times New Roman" w:hint="eastAsia"/>
           <w:kern w:val="0"/>
           <w14:ligatures w14:val="none"/>
         </w:rPr>
-        <w:t>支持为</w:t>
+        <w:t>BarrelAnimIsVoxel</w:t>
       </w:r>
       <w:r>
         <w:rPr>
@@ -3484,7 +3514,7 @@
           <w:kern w:val="0"/>
           <w14:ligatures w14:val="none"/>
         </w:rPr>
-        <w:t>BarrelAnimIsVoxel</w:t>
+        <w:t>=yes</w:t>
       </w:r>
       <w:r>
         <w:rPr>
@@ -3492,7 +3522,7 @@
           <w:kern w:val="0"/>
           <w14:ligatures w14:val="none"/>
         </w:rPr>
-        <w:t>=yes</w:t>
+        <w:t>且</w:t>
       </w:r>
       <w:r>
         <w:rPr>
@@ -3500,7 +3530,7 @@
           <w:kern w:val="0"/>
           <w14:ligatures w14:val="none"/>
         </w:rPr>
-        <w:t>且</w:t>
+        <w:t>TurretAnimIsVoxel=false</w:t>
       </w:r>
       <w:r>
         <w:rPr>
@@ -3508,59 +3538,59 @@
           <w:kern w:val="0"/>
           <w14:ligatures w14:val="none"/>
         </w:rPr>
-        <w:t>TurretAnimIsVoxel=false</w:t>
-      </w:r>
-      <w:r>
-        <w:rPr>
-          <w:rFonts w:ascii="Times New Roman" w:eastAsia="宋体" w:hAnsi="Times New Roman" w:cs="Times New Roman" w:hint="eastAsia"/>
+        <w:t>的建筑加载炮管</w:t>
+      </w:r>
+    </w:p>
+    <w:p>
+      <w:pPr>
+        <w:pStyle w:val="a9"/>
+        <w:numPr>
+          <w:ilvl w:val="0"/>
+          <w:numId w:val="45"/>
+        </w:numPr>
+        <w:rPr>
+          <w:rFonts w:ascii="Times New Roman" w:eastAsia="宋体" w:hAnsi="Times New Roman" w:cs="Times New Roman"/>
           <w:kern w:val="0"/>
           <w14:ligatures w14:val="none"/>
         </w:rPr>
-        <w:t>的建筑加载炮管</w:t>
-      </w:r>
-    </w:p>
-    <w:p>
-      <w:pPr>
-        <w:pStyle w:val="a9"/>
-        <w:numPr>
-          <w:ilvl w:val="0"/>
-          <w:numId w:val="45"/>
-        </w:numPr>
-        <w:rPr>
-          <w:rFonts w:ascii="Times New Roman" w:eastAsia="宋体" w:hAnsi="Times New Roman" w:cs="Times New Roman"/>
+      </w:pPr>
+      <w:r>
+        <w:rPr>
+          <w:rFonts w:ascii="Times New Roman" w:eastAsia="宋体" w:hAnsi="Times New Roman" w:cs="Times New Roman" w:hint="eastAsia"/>
           <w:kern w:val="0"/>
           <w14:ligatures w14:val="none"/>
         </w:rPr>
-      </w:pPr>
-      <w:r>
-        <w:rPr>
-          <w:rFonts w:ascii="Times New Roman" w:eastAsia="宋体" w:hAnsi="Times New Roman" w:cs="Times New Roman" w:hint="eastAsia"/>
+        <w:t>支持新版本检查，若检查到新版本会在窗口标题上显示</w:t>
+      </w:r>
+    </w:p>
+    <w:p>
+      <w:pPr>
+        <w:pStyle w:val="a9"/>
+        <w:numPr>
+          <w:ilvl w:val="0"/>
+          <w:numId w:val="45"/>
+        </w:numPr>
+        <w:rPr>
+          <w:rFonts w:ascii="Times New Roman" w:eastAsia="宋体" w:hAnsi="Times New Roman" w:cs="Times New Roman"/>
           <w:kern w:val="0"/>
           <w14:ligatures w14:val="none"/>
         </w:rPr>
-        <w:t>支持新版本检查，若检查到新版本会在窗口标题上显示</w:t>
-      </w:r>
-    </w:p>
-    <w:p>
-      <w:pPr>
-        <w:pStyle w:val="a9"/>
-        <w:numPr>
-          <w:ilvl w:val="0"/>
-          <w:numId w:val="45"/>
-        </w:numPr>
-        <w:rPr>
-          <w:rFonts w:ascii="Times New Roman" w:eastAsia="宋体" w:hAnsi="Times New Roman" w:cs="Times New Roman"/>
+      </w:pPr>
+      <w:r>
+        <w:rPr>
+          <w:rFonts w:ascii="Times New Roman" w:eastAsia="宋体" w:hAnsi="Times New Roman" w:cs="Times New Roman" w:hint="eastAsia"/>
           <w:kern w:val="0"/>
           <w14:ligatures w14:val="none"/>
         </w:rPr>
-      </w:pPr>
+        <w:t>修复</w:t>
+      </w:r>
       <w:r>
         <w:rPr>
           <w:rFonts w:ascii="Times New Roman" w:eastAsia="宋体" w:hAnsi="Times New Roman" w:cs="Times New Roman" w:hint="eastAsia"/>
           <w:kern w:val="0"/>
           <w14:ligatures w14:val="none"/>
         </w:rPr>
-        <w:t>修复</w:t>
+        <w:t>0x0</w:t>
       </w:r>
       <w:r>
         <w:rPr>
@@ -3568,7 +3598,7 @@
           <w:kern w:val="0"/>
           <w14:ligatures w14:val="none"/>
         </w:rPr>
-        <w:t>0x0</w:t>
+        <w:t>建筑的灯光、</w:t>
       </w:r>
       <w:r>
         <w:rPr>
@@ -3576,7 +3606,7 @@
           <w:kern w:val="0"/>
           <w14:ligatures w14:val="none"/>
         </w:rPr>
-        <w:t>建筑的灯光、</w:t>
+        <w:t>AlphaImage</w:t>
       </w:r>
       <w:r>
         <w:rPr>
@@ -3584,7 +3614,7 @@
           <w:kern w:val="0"/>
           <w14:ligatures w14:val="none"/>
         </w:rPr>
-        <w:t>AlphaImage</w:t>
+        <w:t>、军衔显示错位的</w:t>
       </w:r>
       <w:r>
         <w:rPr>
@@ -3592,37 +3622,37 @@
           <w:kern w:val="0"/>
           <w14:ligatures w14:val="none"/>
         </w:rPr>
-        <w:t>、军衔显示错位的</w:t>
-      </w:r>
-      <w:r>
-        <w:rPr>
-          <w:rFonts w:ascii="Times New Roman" w:eastAsia="宋体" w:hAnsi="Times New Roman" w:cs="Times New Roman" w:hint="eastAsia"/>
+        <w:t>bug</w:t>
+      </w:r>
+    </w:p>
+    <w:p>
+      <w:pPr>
+        <w:pStyle w:val="a9"/>
+        <w:numPr>
+          <w:ilvl w:val="0"/>
+          <w:numId w:val="45"/>
+        </w:numPr>
+        <w:rPr>
+          <w:rFonts w:ascii="Times New Roman" w:eastAsia="宋体" w:hAnsi="Times New Roman" w:cs="Times New Roman"/>
           <w:kern w:val="0"/>
           <w14:ligatures w14:val="none"/>
         </w:rPr>
-        <w:t>bug</w:t>
-      </w:r>
-    </w:p>
-    <w:p>
-      <w:pPr>
-        <w:pStyle w:val="a9"/>
-        <w:numPr>
-          <w:ilvl w:val="0"/>
-          <w:numId w:val="45"/>
-        </w:numPr>
-        <w:rPr>
-          <w:rFonts w:ascii="Times New Roman" w:eastAsia="宋体" w:hAnsi="Times New Roman" w:cs="Times New Roman"/>
+      </w:pPr>
+      <w:r>
+        <w:rPr>
+          <w:rFonts w:ascii="Times New Roman" w:eastAsia="宋体" w:hAnsi="Times New Roman" w:cs="Times New Roman" w:hint="eastAsia"/>
           <w:kern w:val="0"/>
           <w14:ligatures w14:val="none"/>
         </w:rPr>
-      </w:pPr>
+        <w:t>支持为触发、小队等</w:t>
+      </w:r>
       <w:r>
         <w:rPr>
           <w:rFonts w:ascii="Times New Roman" w:eastAsia="宋体" w:hAnsi="Times New Roman" w:cs="Times New Roman" w:hint="eastAsia"/>
           <w:kern w:val="0"/>
           <w14:ligatures w14:val="none"/>
         </w:rPr>
-        <w:t>支持为触发、小队等</w:t>
+        <w:t>ID</w:t>
       </w:r>
       <w:r>
         <w:rPr>
@@ -3630,7 +3660,7 @@
           <w:kern w:val="0"/>
           <w14:ligatures w14:val="none"/>
         </w:rPr>
-        <w:t>ID</w:t>
+        <w:t>分配独立的后缀，详见</w:t>
       </w:r>
       <w:r>
         <w:rPr>
@@ -3638,14 +3668,6 @@
           <w:kern w:val="0"/>
           <w14:ligatures w14:val="none"/>
         </w:rPr>
-        <w:t>分配独立的后缀，详见</w:t>
-      </w:r>
-      <w:r>
-        <w:rPr>
-          <w:rFonts w:ascii="Times New Roman" w:eastAsia="宋体" w:hAnsi="Times New Roman" w:cs="Times New Roman" w:hint="eastAsia"/>
-          <w:kern w:val="0"/>
-          <w14:ligatures w14:val="none"/>
-        </w:rPr>
         <w:t>UseSeparateIndexing</w:t>
       </w:r>
     </w:p>
@@ -4088,6 +4110,7 @@
         <w:rPr>
           <w:rFonts w:ascii="Times New Roman" w:eastAsia="宋体" w:hAnsi="Times New Roman" w:cs="Times New Roman" w:hint="eastAsia"/>
         </w:rPr>
+        <w:lastRenderedPageBreak/>
         <w:t>支持在计算特定地形组的遮挡高度时，忽略其</w:t>
       </w:r>
       <w:r>
@@ -4106,7 +4129,6 @@
         <w:rPr>
           <w:rFonts w:ascii="Times New Roman" w:eastAsia="宋体" w:hAnsi="Times New Roman" w:cs="Times New Roman" w:hint="eastAsia"/>
         </w:rPr>
-        <w:lastRenderedPageBreak/>
         <w:t>NoExtraHeightRedrawTileSets</w:t>
       </w:r>
     </w:p>
@@ -5097,7 +5119,14 @@
         <w:rPr>
           <w:rFonts w:ascii="Times New Roman" w:eastAsia="宋体" w:hAnsi="Times New Roman" w:cs="Times New Roman" w:hint="eastAsia"/>
         </w:rPr>
-        <w:t>同款），支持语法高亮</w:t>
+        <w:t>同款），支持语法</w:t>
+      </w:r>
+      <w:r>
+        <w:rPr>
+          <w:rFonts w:ascii="Times New Roman" w:eastAsia="宋体" w:hAnsi="Times New Roman" w:cs="Times New Roman" w:hint="eastAsia"/>
+        </w:rPr>
+        <w:lastRenderedPageBreak/>
+        <w:t>高亮</w:t>
       </w:r>
       <w:r>
         <w:rPr>
@@ -5121,7 +5150,6 @@
         <w:rPr>
           <w:rFonts w:ascii="Times New Roman" w:eastAsia="宋体" w:hAnsi="Times New Roman" w:cs="Times New Roman" w:hint="eastAsia"/>
         </w:rPr>
-        <w:lastRenderedPageBreak/>
         <w:t>修复触发资源重载后，自定义地形组崩溃的</w:t>
       </w:r>
       <w:r>
@@ -6180,6 +6208,7 @@
         <w:rPr>
           <w:rFonts w:ascii="Times New Roman" w:eastAsia="宋体" w:hAnsi="Times New Roman" w:cs="Times New Roman" w:hint="eastAsia"/>
         </w:rPr>
+        <w:lastRenderedPageBreak/>
         <w:t>修复缩放的</w:t>
       </w:r>
       <w:r>
@@ -6216,7 +6245,6 @@
         <w:rPr>
           <w:rFonts w:ascii="Times New Roman" w:eastAsia="宋体" w:hAnsi="Times New Roman" w:cs="Times New Roman" w:hint="eastAsia"/>
         </w:rPr>
-        <w:lastRenderedPageBreak/>
         <w:t>修复摆放地形时自动</w:t>
       </w:r>
       <w:r>
@@ -7261,6 +7289,7 @@
         <w:rPr>
           <w:rFonts w:ascii="Times New Roman" w:eastAsia="宋体" w:hAnsi="Times New Roman" w:cs="Times New Roman" w:hint="eastAsia"/>
         </w:rPr>
+        <w:lastRenderedPageBreak/>
         <w:t>修复了闸门的破损帧加载错误的</w:t>
       </w:r>
       <w:r>
@@ -7285,7 +7314,6 @@
         <w:rPr>
           <w:rFonts w:ascii="Times New Roman" w:eastAsia="宋体" w:hAnsi="Times New Roman" w:cs="Times New Roman" w:hint="eastAsia"/>
         </w:rPr>
-        <w:lastRenderedPageBreak/>
         <w:t>修复程序关闭后进程不能立即结束的</w:t>
       </w:r>
       <w:r>
@@ -8318,6 +8346,7 @@
         <w:rPr>
           <w:rFonts w:ascii="Times New Roman" w:eastAsia="宋体" w:hAnsi="Times New Roman" w:cs="Times New Roman" w:hint="eastAsia"/>
         </w:rPr>
+        <w:lastRenderedPageBreak/>
         <w:t>全局搜索的地形选项可以搜索覆盖物了</w:t>
       </w:r>
     </w:p>
@@ -8336,7 +8365,6 @@
         <w:rPr>
           <w:rFonts w:ascii="Times New Roman" w:eastAsia="宋体" w:hAnsi="Times New Roman" w:cs="Times New Roman" w:hint="eastAsia"/>
         </w:rPr>
-        <w:lastRenderedPageBreak/>
         <w:t>双击地图注释改为打开编辑框，缩放注释功能改为按住</w:t>
       </w:r>
       <w:r>
@@ -9447,6 +9475,7 @@
         <w:rPr>
           <w:rFonts w:ascii="Times New Roman" w:eastAsia="宋体" w:hAnsi="Times New Roman" w:cs="Times New Roman" w:hint="eastAsia"/>
         </w:rPr>
+        <w:lastRenderedPageBreak/>
         <w:t>修复降低地表和平坦地形在</w:t>
       </w:r>
       <w:r>
@@ -9483,7 +9512,6 @@
         <w:rPr>
           <w:rFonts w:ascii="Times New Roman" w:eastAsia="宋体" w:hAnsi="Times New Roman" w:cs="Times New Roman" w:hint="eastAsia"/>
         </w:rPr>
-        <w:lastRenderedPageBreak/>
         <w:t>修复开启“</w:t>
       </w:r>
       <w:r>
@@ -10647,6 +10675,7 @@
         <w:rPr>
           <w:rFonts w:ascii="Times New Roman" w:eastAsia="宋体" w:hAnsi="Times New Roman" w:cs="Times New Roman" w:hint="eastAsia"/>
         </w:rPr>
+        <w:lastRenderedPageBreak/>
         <w:t>优化地图注释的显示性能</w:t>
       </w:r>
     </w:p>
@@ -10665,7 +10694,6 @@
         <w:rPr>
           <w:rFonts w:ascii="Times New Roman" w:eastAsia="宋体" w:hAnsi="Times New Roman" w:cs="Times New Roman" w:hint="eastAsia"/>
         </w:rPr>
-        <w:lastRenderedPageBreak/>
         <w:t>可以根据系统设置或手动指定时间，自动设置暗色模式，详见</w:t>
       </w:r>
       <w:r>
@@ -11726,6 +11754,7 @@
         <w:rPr>
           <w:rFonts w:ascii="Times New Roman" w:eastAsia="宋体" w:hAnsi="Times New Roman" w:cs="Times New Roman" w:hint="eastAsia"/>
         </w:rPr>
+        <w:lastRenderedPageBreak/>
         <w:t>修复了</w:t>
       </w:r>
       <w:r>
@@ -11774,14 +11803,980 @@
         <w:rPr>
           <w:rFonts w:ascii="Times New Roman" w:eastAsia="宋体" w:hAnsi="Times New Roman" w:cs="Times New Roman" w:hint="eastAsia"/>
         </w:rPr>
+        <w:t>修复部分情况下绘制连接地形上升、下降段高度错误的</w:t>
+      </w:r>
+      <w:r>
+        <w:rPr>
+          <w:rFonts w:ascii="Times New Roman" w:eastAsia="宋体" w:hAnsi="Times New Roman" w:cs="Times New Roman" w:hint="eastAsia"/>
+        </w:rPr>
+        <w:t>bug</w:t>
+      </w:r>
+    </w:p>
+    <w:p>
+      <w:pPr>
+        <w:pStyle w:val="a9"/>
+        <w:numPr>
+          <w:ilvl w:val="0"/>
+          <w:numId w:val="31"/>
+        </w:numPr>
+        <w:rPr>
+          <w:rFonts w:ascii="Times New Roman" w:eastAsia="宋体" w:hAnsi="Times New Roman" w:cs="Times New Roman"/>
+        </w:rPr>
+      </w:pPr>
+      <w:r>
+        <w:rPr>
+          <w:rFonts w:ascii="Times New Roman" w:eastAsia="宋体" w:hAnsi="Times New Roman" w:cs="Times New Roman" w:hint="eastAsia"/>
+        </w:rPr>
+        <w:t>优化光照沙盒切换时的性能</w:t>
+      </w:r>
+    </w:p>
+    <w:p>
+      <w:pPr>
+        <w:pStyle w:val="a9"/>
+        <w:numPr>
+          <w:ilvl w:val="0"/>
+          <w:numId w:val="31"/>
+        </w:numPr>
+        <w:rPr>
+          <w:rFonts w:ascii="Times New Roman" w:eastAsia="宋体" w:hAnsi="Times New Roman" w:cs="Times New Roman"/>
+        </w:rPr>
+      </w:pPr>
+      <w:r>
+        <w:rPr>
+          <w:rFonts w:ascii="Times New Roman" w:eastAsia="宋体" w:hAnsi="Times New Roman" w:cs="Times New Roman" w:hint="eastAsia"/>
+        </w:rPr>
+        <w:t>新增</w:t>
+      </w:r>
+      <w:r>
+        <w:rPr>
+          <w:rFonts w:ascii="Times New Roman" w:eastAsia="宋体" w:hAnsi="Times New Roman" w:cs="Times New Roman" w:hint="eastAsia"/>
+        </w:rPr>
+        <w:t>LightingPreview</w:t>
+      </w:r>
+      <w:r>
+        <w:rPr>
+          <w:rFonts w:ascii="Times New Roman" w:eastAsia="宋体" w:hAnsi="Times New Roman" w:cs="Times New Roman" w:hint="eastAsia"/>
+        </w:rPr>
+        <w:t>.</w:t>
+      </w:r>
+      <w:r>
+        <w:rPr>
+          <w:rFonts w:ascii="Times New Roman" w:eastAsia="宋体" w:hAnsi="Times New Roman" w:cs="Times New Roman" w:hint="eastAsia"/>
+        </w:rPr>
+        <w:t>Tint</w:t>
+      </w:r>
+      <w:r>
+        <w:rPr>
+          <w:rFonts w:ascii="Times New Roman" w:eastAsia="宋体" w:hAnsi="Times New Roman" w:cs="Times New Roman" w:hint="eastAsia"/>
+        </w:rPr>
+        <w:t>TileSetBrowserView</w:t>
+      </w:r>
+      <w:r>
+        <w:rPr>
+          <w:rFonts w:ascii="Times New Roman" w:eastAsia="宋体" w:hAnsi="Times New Roman" w:cs="Times New Roman" w:hint="eastAsia"/>
+        </w:rPr>
+        <w:t>，控制是否按光照沙盒渲染地形浏览器图像</w:t>
+      </w:r>
+    </w:p>
+    <w:p>
+      <w:pPr>
+        <w:pStyle w:val="a9"/>
+        <w:numPr>
+          <w:ilvl w:val="0"/>
+          <w:numId w:val="31"/>
+        </w:numPr>
+        <w:rPr>
+          <w:rFonts w:ascii="Times New Roman" w:eastAsia="宋体" w:hAnsi="Times New Roman" w:cs="Times New Roman"/>
+        </w:rPr>
+      </w:pPr>
+      <w:r>
+        <w:rPr>
+          <w:rFonts w:ascii="Times New Roman" w:eastAsia="宋体" w:hAnsi="Times New Roman" w:cs="Times New Roman" w:hint="eastAsia"/>
+        </w:rPr>
+        <w:t>新增距离标尺，可以记录当前鼠标位置距离上次按下左键位置的距离，记录历史数量见</w:t>
+      </w:r>
+      <w:r>
+        <w:rPr>
+          <w:rFonts w:ascii="Times New Roman" w:eastAsia="宋体" w:hAnsi="Times New Roman" w:cs="Times New Roman" w:hint="eastAsia"/>
+        </w:rPr>
+        <w:t>DistanceRuler.Records</w:t>
+      </w:r>
+    </w:p>
+    <w:p>
+      <w:pPr>
+        <w:pStyle w:val="a9"/>
+        <w:numPr>
+          <w:ilvl w:val="0"/>
+          <w:numId w:val="31"/>
+        </w:numPr>
+        <w:rPr>
+          <w:rFonts w:ascii="Times New Roman" w:eastAsia="宋体" w:hAnsi="Times New Roman" w:cs="Times New Roman"/>
+        </w:rPr>
+      </w:pPr>
+      <w:r>
+        <w:rPr>
+          <w:rFonts w:ascii="Times New Roman" w:eastAsia="宋体" w:hAnsi="Times New Roman" w:cs="Times New Roman" w:hint="eastAsia"/>
+        </w:rPr>
+        <w:t>微调新建地图时可视边界数值</w:t>
+      </w:r>
+    </w:p>
+    <w:p>
+      <w:pPr>
+        <w:pStyle w:val="a9"/>
+        <w:numPr>
+          <w:ilvl w:val="0"/>
+          <w:numId w:val="31"/>
+        </w:numPr>
+        <w:rPr>
+          <w:rFonts w:ascii="Times New Roman" w:eastAsia="宋体" w:hAnsi="Times New Roman" w:cs="Times New Roman"/>
+        </w:rPr>
+      </w:pPr>
+      <w:r>
+        <w:rPr>
+          <w:rFonts w:ascii="Times New Roman" w:eastAsia="宋体" w:hAnsi="Times New Roman" w:cs="Times New Roman" w:hint="eastAsia"/>
+        </w:rPr>
+        <w:t>修复平坦地形工具无法平坦地图边缘斜坡的</w:t>
+      </w:r>
+      <w:r>
+        <w:rPr>
+          <w:rFonts w:ascii="Times New Roman" w:eastAsia="宋体" w:hAnsi="Times New Roman" w:cs="Times New Roman" w:hint="eastAsia"/>
+        </w:rPr>
+        <w:t>bug</w:t>
+      </w:r>
+    </w:p>
+    <w:p>
+      <w:pPr>
+        <w:pStyle w:val="a9"/>
+        <w:numPr>
+          <w:ilvl w:val="0"/>
+          <w:numId w:val="31"/>
+        </w:numPr>
+        <w:rPr>
+          <w:rFonts w:ascii="Times New Roman" w:eastAsia="宋体" w:hAnsi="Times New Roman" w:cs="Times New Roman"/>
+        </w:rPr>
+      </w:pPr>
+      <w:r>
+        <w:rPr>
+          <w:rFonts w:ascii="Times New Roman" w:eastAsia="宋体" w:hAnsi="Times New Roman" w:cs="Times New Roman" w:hint="eastAsia"/>
+        </w:rPr>
+        <w:t>绘制连接地形可以将鼠标移动到地图边界外，更方便靠近边界的绘制</w:t>
+      </w:r>
+    </w:p>
+    <w:p>
+      <w:pPr>
+        <w:pStyle w:val="a9"/>
+        <w:numPr>
+          <w:ilvl w:val="0"/>
+          <w:numId w:val="31"/>
+        </w:numPr>
+        <w:rPr>
+          <w:rFonts w:ascii="Times New Roman" w:eastAsia="宋体" w:hAnsi="Times New Roman" w:cs="Times New Roman"/>
+        </w:rPr>
+      </w:pPr>
+      <w:r>
+        <w:rPr>
+          <w:rFonts w:ascii="Times New Roman" w:eastAsia="宋体" w:hAnsi="Times New Roman" w:cs="Times New Roman" w:hint="eastAsia"/>
+        </w:rPr>
+        <w:t>优化</w:t>
+      </w:r>
+      <w:r>
+        <w:rPr>
+          <w:rFonts w:ascii="Times New Roman" w:eastAsia="宋体" w:hAnsi="Times New Roman" w:cs="Times New Roman" w:hint="eastAsia"/>
+        </w:rPr>
+        <w:t>IsoMapPack5</w:t>
+      </w:r>
+      <w:r>
+        <w:rPr>
+          <w:rFonts w:ascii="Times New Roman" w:eastAsia="宋体" w:hAnsi="Times New Roman" w:cs="Times New Roman" w:hint="eastAsia"/>
+        </w:rPr>
+        <w:t>压缩，减少地图体积，减少游戏内大地图地形异常的可能</w:t>
+      </w:r>
+    </w:p>
+    <w:p>
+      <w:pPr>
+        <w:pStyle w:val="a9"/>
+        <w:numPr>
+          <w:ilvl w:val="0"/>
+          <w:numId w:val="31"/>
+        </w:numPr>
+        <w:rPr>
+          <w:rFonts w:ascii="Times New Roman" w:eastAsia="宋体" w:hAnsi="Times New Roman" w:cs="Times New Roman"/>
+        </w:rPr>
+      </w:pPr>
+      <w:r>
+        <w:rPr>
+          <w:rFonts w:ascii="Times New Roman" w:eastAsia="宋体" w:hAnsi="Times New Roman" w:cs="Times New Roman" w:hint="eastAsia"/>
+        </w:rPr>
+        <w:t>修复调整地图大小后隧道位置错误的</w:t>
+      </w:r>
+      <w:r>
+        <w:rPr>
+          <w:rFonts w:ascii="Times New Roman" w:eastAsia="宋体" w:hAnsi="Times New Roman" w:cs="Times New Roman" w:hint="eastAsia"/>
+        </w:rPr>
+        <w:t>bug</w:t>
+      </w:r>
+    </w:p>
+    <w:p>
+      <w:pPr>
+        <w:pStyle w:val="a9"/>
+        <w:numPr>
+          <w:ilvl w:val="0"/>
+          <w:numId w:val="31"/>
+        </w:numPr>
+        <w:rPr>
+          <w:rFonts w:ascii="Times New Roman" w:eastAsia="宋体" w:hAnsi="Times New Roman" w:cs="Times New Roman"/>
+        </w:rPr>
+      </w:pPr>
+      <w:r>
+        <w:rPr>
+          <w:rFonts w:ascii="Times New Roman" w:eastAsia="宋体" w:hAnsi="Times New Roman" w:cs="Times New Roman" w:hint="eastAsia"/>
+        </w:rPr>
+        <w:t>修复了在开启输入法和部分情况下在地图界面按</w:t>
+      </w:r>
+      <w:r>
+        <w:rPr>
+          <w:rFonts w:ascii="Times New Roman" w:eastAsia="宋体" w:hAnsi="Times New Roman" w:cs="Times New Roman" w:hint="eastAsia"/>
+        </w:rPr>
+        <w:t>D</w:t>
+      </w:r>
+      <w:r>
+        <w:rPr>
+          <w:rFonts w:ascii="Times New Roman" w:eastAsia="宋体" w:hAnsi="Times New Roman" w:cs="Times New Roman" w:hint="eastAsia"/>
+        </w:rPr>
+        <w:t>、</w:t>
+      </w:r>
+      <w:r>
+        <w:rPr>
+          <w:rFonts w:ascii="Times New Roman" w:eastAsia="宋体" w:hAnsi="Times New Roman" w:cs="Times New Roman" w:hint="eastAsia"/>
+        </w:rPr>
+        <w:t>[</w:t>
+      </w:r>
+      <w:r>
+        <w:rPr>
+          <w:rFonts w:ascii="Times New Roman" w:eastAsia="宋体" w:hAnsi="Times New Roman" w:cs="Times New Roman" w:hint="eastAsia"/>
+        </w:rPr>
+        <w:t>、</w:t>
+      </w:r>
+      <w:r>
+        <w:rPr>
+          <w:rFonts w:ascii="Times New Roman" w:eastAsia="宋体" w:hAnsi="Times New Roman" w:cs="Times New Roman" w:hint="eastAsia"/>
+        </w:rPr>
+        <w:t>]</w:t>
+      </w:r>
+      <w:r>
+        <w:rPr>
+          <w:rFonts w:ascii="Times New Roman" w:eastAsia="宋体" w:hAnsi="Times New Roman" w:cs="Times New Roman" w:hint="eastAsia"/>
+        </w:rPr>
+        <w:t>键无效的</w:t>
+      </w:r>
+      <w:r>
+        <w:rPr>
+          <w:rFonts w:ascii="Times New Roman" w:eastAsia="宋体" w:hAnsi="Times New Roman" w:cs="Times New Roman" w:hint="eastAsia"/>
+        </w:rPr>
+        <w:t>bug</w:t>
+      </w:r>
+    </w:p>
+    <w:p>
+      <w:pPr>
+        <w:pStyle w:val="a9"/>
+        <w:numPr>
+          <w:ilvl w:val="0"/>
+          <w:numId w:val="31"/>
+        </w:numPr>
+        <w:rPr>
+          <w:rFonts w:ascii="Times New Roman" w:eastAsia="宋体" w:hAnsi="Times New Roman" w:cs="Times New Roman"/>
+        </w:rPr>
+      </w:pPr>
+      <w:r>
+        <w:rPr>
+          <w:rFonts w:ascii="Times New Roman" w:eastAsia="宋体" w:hAnsi="Times New Roman" w:cs="Times New Roman" w:hint="eastAsia"/>
+        </w:rPr>
+        <w:t>修复了新城市下使用绘制悬崖后部工具时，按</w:t>
+      </w:r>
+      <w:r>
+        <w:rPr>
+          <w:rFonts w:ascii="Times New Roman" w:eastAsia="宋体" w:hAnsi="Times New Roman" w:cs="Times New Roman" w:hint="eastAsia"/>
+        </w:rPr>
+        <w:t>A</w:t>
+      </w:r>
+      <w:r>
+        <w:rPr>
+          <w:rFonts w:ascii="Times New Roman" w:eastAsia="宋体" w:hAnsi="Times New Roman" w:cs="Times New Roman" w:hint="eastAsia"/>
+        </w:rPr>
+        <w:t>键无法切换悬崖类型的</w:t>
+      </w:r>
+      <w:r>
+        <w:rPr>
+          <w:rFonts w:ascii="Times New Roman" w:eastAsia="宋体" w:hAnsi="Times New Roman" w:cs="Times New Roman" w:hint="eastAsia"/>
+        </w:rPr>
+        <w:t>bug</w:t>
+      </w:r>
+    </w:p>
+    <w:p>
+      <w:pPr>
+        <w:pStyle w:val="a9"/>
+        <w:numPr>
+          <w:ilvl w:val="0"/>
+          <w:numId w:val="31"/>
+        </w:numPr>
+        <w:rPr>
+          <w:rFonts w:ascii="Times New Roman" w:eastAsia="宋体" w:hAnsi="Times New Roman" w:cs="Times New Roman"/>
+        </w:rPr>
+      </w:pPr>
+      <w:r>
+        <w:rPr>
+          <w:rFonts w:ascii="Times New Roman" w:eastAsia="宋体" w:hAnsi="Times New Roman" w:cs="Times New Roman" w:hint="eastAsia"/>
+        </w:rPr>
+        <w:t>增强绘制悬崖工具，可以在不同地图类型的</w:t>
+      </w:r>
+      <w:r>
+        <w:rPr>
+          <w:rFonts w:ascii="Times New Roman" w:eastAsia="宋体" w:hAnsi="Times New Roman" w:cs="Times New Roman" w:hint="eastAsia"/>
+        </w:rPr>
+        <w:t>[TheaterInfo]</w:t>
+      </w:r>
+      <w:r>
+        <w:rPr>
+          <w:rFonts w:ascii="Times New Roman" w:eastAsia="宋体" w:hAnsi="Times New Roman" w:cs="Times New Roman" w:hint="eastAsia"/>
+        </w:rPr>
+        <w:t>（如</w:t>
+      </w:r>
+      <w:r>
+        <w:rPr>
+          <w:rFonts w:ascii="Times New Roman" w:eastAsia="宋体" w:hAnsi="Times New Roman" w:cs="Times New Roman" w:hint="eastAsia"/>
+        </w:rPr>
+        <w:t>[SnowInfo]</w:t>
+      </w:r>
+      <w:r>
+        <w:rPr>
+          <w:rFonts w:ascii="Times New Roman" w:eastAsia="宋体" w:hAnsi="Times New Roman" w:cs="Times New Roman" w:hint="eastAsia"/>
+        </w:rPr>
+        <w:t>）中填写</w:t>
+      </w:r>
+      <w:r>
+        <w:rPr>
+          <w:rFonts w:ascii="Times New Roman" w:eastAsia="宋体" w:hAnsi="Times New Roman" w:cs="Times New Roman" w:hint="eastAsia"/>
+        </w:rPr>
+        <w:t>Cliffs2</w:t>
+      </w:r>
+      <w:r>
+        <w:rPr>
+          <w:rFonts w:ascii="Times New Roman" w:eastAsia="宋体" w:hAnsi="Times New Roman" w:cs="Times New Roman" w:hint="eastAsia"/>
+        </w:rPr>
+        <w:t>、</w:t>
+      </w:r>
+      <w:r>
+        <w:rPr>
+          <w:rFonts w:ascii="Times New Roman" w:eastAsia="宋体" w:hAnsi="Times New Roman" w:cs="Times New Roman" w:hint="eastAsia"/>
+        </w:rPr>
+        <w:t>CliffsWater2</w:t>
+      </w:r>
+      <w:r>
+        <w:rPr>
+          <w:rFonts w:ascii="Times New Roman" w:eastAsia="宋体" w:hAnsi="Times New Roman" w:cs="Times New Roman" w:hint="eastAsia"/>
+        </w:rPr>
+        <w:t>以支持悬崖类型切换；在存在月球悬崖时，支持绘制月球悬崖</w:t>
+      </w:r>
+    </w:p>
+    <w:p>
+      <w:pPr>
+        <w:pStyle w:val="a9"/>
+        <w:numPr>
+          <w:ilvl w:val="0"/>
+          <w:numId w:val="31"/>
+        </w:numPr>
+        <w:rPr>
+          <w:rFonts w:ascii="Times New Roman" w:eastAsia="宋体" w:hAnsi="Times New Roman" w:cs="Times New Roman"/>
+        </w:rPr>
+      </w:pPr>
+      <w:r>
+        <w:rPr>
+          <w:rFonts w:ascii="Times New Roman" w:eastAsia="宋体" w:hAnsi="Times New Roman" w:cs="Times New Roman" w:hint="eastAsia"/>
+        </w:rPr>
+        <w:t>支持</w:t>
+      </w:r>
+      <w:r>
+        <w:rPr>
+          <w:rFonts w:ascii="Times New Roman" w:eastAsia="宋体" w:hAnsi="Times New Roman" w:cs="Times New Roman" w:hint="eastAsia"/>
+        </w:rPr>
+        <w:t>32</w:t>
+      </w:r>
+      <w:r>
+        <w:rPr>
+          <w:rFonts w:ascii="Times New Roman" w:eastAsia="宋体" w:hAnsi="Times New Roman" w:cs="Times New Roman" w:hint="eastAsia"/>
+        </w:rPr>
+        <w:t>向面向</w:t>
+      </w:r>
+      <w:r>
+        <w:rPr>
+          <w:rFonts w:ascii="Times New Roman" w:eastAsia="宋体" w:hAnsi="Times New Roman" w:cs="Times New Roman" w:hint="eastAsia"/>
+        </w:rPr>
+        <w:t>与拖拽</w:t>
+      </w:r>
+      <w:r>
+        <w:rPr>
+          <w:rFonts w:ascii="Times New Roman" w:eastAsia="宋体" w:hAnsi="Times New Roman" w:cs="Times New Roman" w:hint="eastAsia"/>
+        </w:rPr>
+        <w:t>，详见</w:t>
+      </w:r>
+      <w:r>
+        <w:rPr>
+          <w:rFonts w:ascii="Times New Roman" w:eastAsia="宋体" w:hAnsi="Times New Roman" w:cs="Times New Roman" w:hint="eastAsia"/>
+        </w:rPr>
+        <w:t>ExtFacings</w:t>
+      </w:r>
+      <w:r>
+        <w:rPr>
+          <w:rFonts w:ascii="Times New Roman" w:eastAsia="宋体" w:hAnsi="Times New Roman" w:cs="Times New Roman" w:hint="eastAsia"/>
+        </w:rPr>
+        <w:t>与</w:t>
+      </w:r>
+      <w:r>
+        <w:rPr>
+          <w:rFonts w:ascii="Times New Roman" w:eastAsia="宋体" w:hAnsi="Times New Roman" w:cs="Times New Roman" w:hint="eastAsia"/>
+        </w:rPr>
+        <w:t>ExtFacings.Drag</w:t>
+      </w:r>
+    </w:p>
+    <w:p>
+      <w:pPr>
+        <w:pStyle w:val="a9"/>
+        <w:numPr>
+          <w:ilvl w:val="0"/>
+          <w:numId w:val="31"/>
+        </w:numPr>
+        <w:rPr>
+          <w:rFonts w:ascii="Times New Roman" w:eastAsia="宋体" w:hAnsi="Times New Roman" w:cs="Times New Roman"/>
+        </w:rPr>
+      </w:pPr>
+      <w:r>
+        <w:rPr>
+          <w:rFonts w:ascii="Times New Roman" w:eastAsia="宋体" w:hAnsi="Times New Roman" w:cs="Times New Roman" w:hint="eastAsia"/>
+        </w:rPr>
+        <w:t>重写部分字符串类型，优化字符串加载稳定性</w:t>
+      </w:r>
+    </w:p>
+    <w:p>
+      <w:pPr>
+        <w:pStyle w:val="a9"/>
+        <w:numPr>
+          <w:ilvl w:val="0"/>
+          <w:numId w:val="31"/>
+        </w:numPr>
+        <w:rPr>
+          <w:rFonts w:ascii="Times New Roman" w:eastAsia="宋体" w:hAnsi="Times New Roman" w:cs="Times New Roman"/>
+        </w:rPr>
+      </w:pPr>
+      <w:r>
+        <w:rPr>
+          <w:rFonts w:ascii="Times New Roman" w:eastAsia="宋体" w:hAnsi="Times New Roman" w:cs="Times New Roman" w:hint="eastAsia"/>
+        </w:rPr>
+        <w:t>优化抬升</w:t>
+      </w:r>
+      <w:r>
+        <w:rPr>
+          <w:rFonts w:ascii="Times New Roman" w:eastAsia="宋体" w:hAnsi="Times New Roman" w:cs="Times New Roman" w:hint="eastAsia"/>
+        </w:rPr>
+        <w:t>/</w:t>
+      </w:r>
+      <w:r>
+        <w:rPr>
+          <w:rFonts w:ascii="Times New Roman" w:eastAsia="宋体" w:hAnsi="Times New Roman" w:cs="Times New Roman" w:hint="eastAsia"/>
+        </w:rPr>
+        <w:t>降低地表算法，不会出现异常的大范围变动</w:t>
+      </w:r>
+    </w:p>
+    <w:p>
+      <w:pPr>
+        <w:pStyle w:val="a9"/>
+        <w:numPr>
+          <w:ilvl w:val="0"/>
+          <w:numId w:val="31"/>
+        </w:numPr>
+        <w:rPr>
+          <w:rFonts w:ascii="Times New Roman" w:eastAsia="宋体" w:hAnsi="Times New Roman" w:cs="Times New Roman"/>
+        </w:rPr>
+      </w:pPr>
+      <w:r>
+        <w:rPr>
+          <w:rFonts w:ascii="Times New Roman" w:eastAsia="宋体" w:hAnsi="Times New Roman" w:cs="Times New Roman" w:hint="eastAsia"/>
+        </w:rPr>
+        <w:t>FA2sp.log</w:t>
+      </w:r>
+      <w:r>
+        <w:rPr>
+          <w:rFonts w:ascii="Times New Roman" w:eastAsia="宋体" w:hAnsi="Times New Roman" w:cs="Times New Roman" w:hint="eastAsia"/>
+        </w:rPr>
+        <w:t>使用</w:t>
+      </w:r>
+      <w:r>
+        <w:rPr>
+          <w:rFonts w:ascii="Times New Roman" w:eastAsia="宋体" w:hAnsi="Times New Roman" w:cs="Times New Roman" w:hint="eastAsia"/>
+        </w:rPr>
+        <w:t>UTF8</w:t>
+      </w:r>
+      <w:r>
+        <w:rPr>
+          <w:rFonts w:ascii="Times New Roman" w:eastAsia="宋体" w:hAnsi="Times New Roman" w:cs="Times New Roman" w:hint="eastAsia"/>
+        </w:rPr>
+        <w:t>编码</w:t>
+      </w:r>
+    </w:p>
+    <w:p>
+      <w:pPr>
+        <w:pStyle w:val="a9"/>
+        <w:numPr>
+          <w:ilvl w:val="0"/>
+          <w:numId w:val="31"/>
+        </w:numPr>
+        <w:rPr>
+          <w:rFonts w:ascii="Times New Roman" w:eastAsia="宋体" w:hAnsi="Times New Roman" w:cs="Times New Roman"/>
+        </w:rPr>
+      </w:pPr>
+      <w:r>
+        <w:rPr>
+          <w:rFonts w:ascii="Times New Roman" w:eastAsia="宋体" w:hAnsi="Times New Roman" w:cs="Times New Roman" w:hint="eastAsia"/>
+        </w:rPr>
+        <w:t>保存地图时可以维持已有的</w:t>
+      </w:r>
+      <w:r>
+        <w:rPr>
+          <w:rFonts w:ascii="Times New Roman" w:eastAsia="宋体" w:hAnsi="Times New Roman" w:cs="Times New Roman" w:hint="eastAsia"/>
+        </w:rPr>
+        <w:t>ini</w:t>
+      </w:r>
+      <w:r>
+        <w:rPr>
+          <w:rFonts w:ascii="Times New Roman" w:eastAsia="宋体" w:hAnsi="Times New Roman" w:cs="Times New Roman" w:hint="eastAsia"/>
+        </w:rPr>
+        <w:t>小节顺序，详见</w:t>
+      </w:r>
+      <w:r>
+        <w:rPr>
+          <w:rFonts w:ascii="Times New Roman" w:eastAsia="宋体" w:hAnsi="Times New Roman" w:cs="Times New Roman" w:hint="eastAsia"/>
+        </w:rPr>
+        <w:t>SaveMap.PreserveINISorting</w:t>
+      </w:r>
+    </w:p>
+    <w:p>
+      <w:pPr>
+        <w:pStyle w:val="a9"/>
+        <w:numPr>
+          <w:ilvl w:val="0"/>
+          <w:numId w:val="31"/>
+        </w:numPr>
+        <w:rPr>
+          <w:rFonts w:ascii="Times New Roman" w:eastAsia="宋体" w:hAnsi="Times New Roman" w:cs="Times New Roman"/>
+        </w:rPr>
+      </w:pPr>
+      <w:r>
+        <w:rPr>
+          <w:rFonts w:ascii="Times New Roman" w:eastAsia="宋体" w:hAnsi="Times New Roman" w:cs="Times New Roman" w:hint="eastAsia"/>
+        </w:rPr>
+        <w:t>重写撤销重做系统，所有撤销动作均支持完整重做</w:t>
+      </w:r>
+    </w:p>
+    <w:p>
+      <w:pPr>
+        <w:pStyle w:val="a9"/>
+        <w:numPr>
+          <w:ilvl w:val="0"/>
+          <w:numId w:val="31"/>
+        </w:numPr>
+        <w:rPr>
+          <w:rFonts w:ascii="Times New Roman" w:eastAsia="宋体" w:hAnsi="Times New Roman" w:cs="Times New Roman"/>
+        </w:rPr>
+      </w:pPr>
+      <w:r>
+        <w:rPr>
+          <w:rFonts w:ascii="Times New Roman" w:eastAsia="宋体" w:hAnsi="Times New Roman" w:cs="Times New Roman" w:hint="eastAsia"/>
+        </w:rPr>
+        <w:t>撤销重做系统能够记录游戏对象的修改历史，详见</w:t>
+      </w:r>
+      <w:r>
+        <w:rPr>
+          <w:rFonts w:ascii="Times New Roman" w:eastAsia="宋体" w:hAnsi="Times New Roman" w:cs="Times New Roman" w:hint="eastAsia"/>
+        </w:rPr>
+        <w:t>UndoRedo.RecordObjects</w:t>
+      </w:r>
+    </w:p>
+    <w:p>
+      <w:pPr>
+        <w:pStyle w:val="a9"/>
+        <w:numPr>
+          <w:ilvl w:val="0"/>
+          <w:numId w:val="31"/>
+        </w:numPr>
+        <w:rPr>
+          <w:rFonts w:ascii="Times New Roman" w:eastAsia="宋体" w:hAnsi="Times New Roman" w:cs="Times New Roman"/>
+        </w:rPr>
+      </w:pPr>
+      <w:r>
+        <w:rPr>
+          <w:rFonts w:ascii="Times New Roman" w:eastAsia="宋体" w:hAnsi="Times New Roman" w:cs="Times New Roman" w:hint="eastAsia"/>
+        </w:rPr>
+        <w:t>支持设置</w:t>
+      </w:r>
+      <w:r>
+        <w:rPr>
+          <w:rFonts w:ascii="Times New Roman" w:eastAsia="宋体" w:hAnsi="Times New Roman" w:cs="Times New Roman" w:hint="eastAsia"/>
+        </w:rPr>
+        <w:t>RubblePalette</w:t>
+      </w:r>
+      <w:r>
+        <w:rPr>
+          <w:rFonts w:ascii="Times New Roman" w:eastAsia="宋体" w:hAnsi="Times New Roman" w:cs="Times New Roman" w:hint="eastAsia"/>
+        </w:rPr>
+        <w:t>=</w:t>
+      </w:r>
+      <w:r>
+        <w:rPr>
+          <w:rFonts w:ascii="Times New Roman" w:eastAsia="宋体" w:hAnsi="Times New Roman" w:cs="Times New Roman" w:hint="eastAsia"/>
+        </w:rPr>
+        <w:t>指定建筑废墟色盘</w:t>
+      </w:r>
+    </w:p>
+    <w:p>
+      <w:pPr>
+        <w:pStyle w:val="a9"/>
+        <w:numPr>
+          <w:ilvl w:val="0"/>
+          <w:numId w:val="31"/>
+        </w:numPr>
+        <w:rPr>
+          <w:rFonts w:ascii="Times New Roman" w:eastAsia="宋体" w:hAnsi="Times New Roman" w:cs="Times New Roman"/>
+        </w:rPr>
+      </w:pPr>
+      <w:r>
+        <w:rPr>
+          <w:rFonts w:ascii="Times New Roman" w:eastAsia="宋体" w:hAnsi="Times New Roman" w:cs="Times New Roman" w:hint="eastAsia"/>
+        </w:rPr>
+        <w:t>提升稳定性</w:t>
+      </w:r>
+    </w:p>
+    <w:p>
+      <w:pPr>
+        <w:pStyle w:val="a9"/>
+        <w:numPr>
+          <w:ilvl w:val="0"/>
+          <w:numId w:val="31"/>
+        </w:numPr>
+        <w:rPr>
+          <w:rFonts w:ascii="Times New Roman" w:eastAsia="宋体" w:hAnsi="Times New Roman" w:cs="Times New Roman"/>
+        </w:rPr>
+      </w:pPr>
+      <w:r>
+        <w:rPr>
+          <w:rFonts w:ascii="Times New Roman" w:eastAsia="宋体" w:hAnsi="Times New Roman" w:cs="Times New Roman" w:hint="eastAsia"/>
+        </w:rPr>
+        <w:t>优化素材图像内存占用</w:t>
+      </w:r>
+    </w:p>
+    <w:p>
+      <w:pPr>
+        <w:pStyle w:val="a9"/>
+        <w:numPr>
+          <w:ilvl w:val="0"/>
+          <w:numId w:val="31"/>
+        </w:numPr>
+        <w:rPr>
+          <w:rFonts w:ascii="Times New Roman" w:eastAsia="宋体" w:hAnsi="Times New Roman" w:cs="Times New Roman"/>
+        </w:rPr>
+      </w:pPr>
+      <w:r>
+        <w:rPr>
+          <w:rFonts w:ascii="Times New Roman" w:eastAsia="宋体" w:hAnsi="Times New Roman" w:cs="Times New Roman" w:hint="eastAsia"/>
+        </w:rPr>
+        <w:t>重写</w:t>
+      </w:r>
+      <w:r>
+        <w:rPr>
+          <w:rFonts w:ascii="Times New Roman" w:eastAsia="宋体" w:hAnsi="Times New Roman" w:cs="Times New Roman" w:hint="eastAsia"/>
+        </w:rPr>
+        <w:t>mix</w:t>
+      </w:r>
+      <w:r>
+        <w:rPr>
+          <w:rFonts w:ascii="Times New Roman" w:eastAsia="宋体" w:hAnsi="Times New Roman" w:cs="Times New Roman" w:hint="eastAsia"/>
+        </w:rPr>
+        <w:t>加载逻辑，修复加载中的内存泄漏</w:t>
+      </w:r>
+      <w:r>
+        <w:rPr>
+          <w:rFonts w:ascii="Times New Roman" w:eastAsia="宋体" w:hAnsi="Times New Roman" w:cs="Times New Roman" w:hint="eastAsia"/>
+        </w:rPr>
+        <w:t>，详见</w:t>
+      </w:r>
+      <w:r>
+        <w:rPr>
+          <w:rFonts w:ascii="Times New Roman" w:eastAsia="宋体" w:hAnsi="Times New Roman" w:cs="Times New Roman" w:hint="eastAsia"/>
+        </w:rPr>
+        <w:t>ExtMixLoader</w:t>
+      </w:r>
+    </w:p>
+    <w:p>
+      <w:pPr>
+        <w:pStyle w:val="a9"/>
+        <w:numPr>
+          <w:ilvl w:val="0"/>
+          <w:numId w:val="31"/>
+        </w:numPr>
+        <w:rPr>
+          <w:rFonts w:ascii="Times New Roman" w:eastAsia="宋体" w:hAnsi="Times New Roman" w:cs="Times New Roman"/>
+        </w:rPr>
+      </w:pPr>
+      <w:r>
+        <w:rPr>
+          <w:rFonts w:ascii="Times New Roman" w:eastAsia="宋体" w:hAnsi="Times New Roman" w:cs="Times New Roman" w:hint="eastAsia"/>
+        </w:rPr>
+        <w:t>新增</w:t>
+      </w:r>
+      <w:r>
+        <w:rPr>
+          <w:rFonts w:ascii="Times New Roman" w:eastAsia="宋体" w:hAnsi="Times New Roman" w:cs="Times New Roman" w:hint="eastAsia"/>
+        </w:rPr>
+        <w:t>DDrawScalingBilinear.OnlyShrink</w:t>
+      </w:r>
+      <w:r>
+        <w:rPr>
+          <w:rFonts w:ascii="Times New Roman" w:eastAsia="宋体" w:hAnsi="Times New Roman" w:cs="Times New Roman" w:hint="eastAsia"/>
+        </w:rPr>
+        <w:t>，支持仅在缩小时使用双线性插值，放大时硬边缘放大</w:t>
+      </w:r>
+    </w:p>
+    <w:p>
+      <w:pPr>
+        <w:pStyle w:val="a9"/>
+        <w:numPr>
+          <w:ilvl w:val="0"/>
+          <w:numId w:val="31"/>
+        </w:numPr>
+        <w:rPr>
+          <w:rFonts w:ascii="Times New Roman" w:eastAsia="宋体" w:hAnsi="Times New Roman" w:cs="Times New Roman"/>
+        </w:rPr>
+      </w:pPr>
+      <w:r>
+        <w:rPr>
+          <w:rFonts w:ascii="Times New Roman" w:eastAsia="宋体" w:hAnsi="Times New Roman" w:cs="Times New Roman" w:hint="eastAsia"/>
+        </w:rPr>
+        <w:t>优化绘图性能</w:t>
+      </w:r>
+    </w:p>
+    <w:p>
+      <w:pPr>
+        <w:pStyle w:val="a9"/>
+        <w:numPr>
+          <w:ilvl w:val="0"/>
+          <w:numId w:val="31"/>
+        </w:numPr>
+        <w:rPr>
+          <w:rFonts w:ascii="Times New Roman" w:eastAsia="宋体" w:hAnsi="Times New Roman" w:cs="Times New Roman"/>
+        </w:rPr>
+      </w:pPr>
+      <w:r>
+        <w:rPr>
+          <w:rFonts w:ascii="Times New Roman" w:eastAsia="宋体" w:hAnsi="Times New Roman" w:cs="Times New Roman" w:hint="eastAsia"/>
+        </w:rPr>
+        <w:t>重写</w:t>
+      </w:r>
+      <w:r>
+        <w:rPr>
+          <w:rFonts w:ascii="Times New Roman" w:eastAsia="宋体" w:hAnsi="Times New Roman" w:cs="Times New Roman" w:hint="eastAsia"/>
+        </w:rPr>
+        <w:t>ini</w:t>
+      </w:r>
+      <w:r>
+        <w:rPr>
+          <w:rFonts w:ascii="Times New Roman" w:eastAsia="宋体" w:hAnsi="Times New Roman" w:cs="Times New Roman" w:hint="eastAsia"/>
+        </w:rPr>
+        <w:t>加载逻辑，加载</w:t>
+      </w:r>
+      <w:r>
+        <w:rPr>
+          <w:rFonts w:ascii="Times New Roman" w:eastAsia="宋体" w:hAnsi="Times New Roman" w:cs="Times New Roman" w:hint="eastAsia"/>
+        </w:rPr>
+        <w:t>ini</w:t>
+      </w:r>
+      <w:r>
+        <w:rPr>
+          <w:rFonts w:ascii="Times New Roman" w:eastAsia="宋体" w:hAnsi="Times New Roman" w:cs="Times New Roman" w:hint="eastAsia"/>
+        </w:rPr>
+        <w:t>不会再释放至游戏目录，新建国家等操作可以即时生效</w:t>
+      </w:r>
+    </w:p>
+    <w:p>
+      <w:pPr>
+        <w:pStyle w:val="a9"/>
+        <w:numPr>
+          <w:ilvl w:val="0"/>
+          <w:numId w:val="31"/>
+        </w:numPr>
+        <w:rPr>
+          <w:rFonts w:ascii="Times New Roman" w:eastAsia="宋体" w:hAnsi="Times New Roman" w:cs="Times New Roman"/>
+        </w:rPr>
+      </w:pPr>
+      <w:r>
+        <w:rPr>
+          <w:rFonts w:ascii="Times New Roman" w:eastAsia="宋体" w:hAnsi="Times New Roman" w:cs="Times New Roman" w:hint="eastAsia"/>
+        </w:rPr>
+        <w:t>ini [#include]</w:t>
+      </w:r>
+      <w:r>
+        <w:rPr>
+          <w:rFonts w:ascii="Times New Roman" w:eastAsia="宋体" w:hAnsi="Times New Roman" w:cs="Times New Roman" w:hint="eastAsia"/>
+        </w:rPr>
+        <w:t>逻辑现遵循</w:t>
+      </w:r>
+      <w:r>
+        <w:rPr>
+          <w:rFonts w:ascii="Times New Roman" w:eastAsia="宋体" w:hAnsi="Times New Roman" w:cs="Times New Roman" w:hint="eastAsia"/>
+        </w:rPr>
+        <w:t>ares</w:t>
+      </w:r>
+      <w:r>
+        <w:rPr>
+          <w:rFonts w:ascii="Times New Roman" w:eastAsia="宋体" w:hAnsi="Times New Roman" w:cs="Times New Roman" w:hint="eastAsia"/>
+        </w:rPr>
+        <w:t>规则，为广度优先遍历而非深度优先遍历</w:t>
+      </w:r>
+    </w:p>
+    <w:p>
+      <w:pPr>
+        <w:pStyle w:val="a9"/>
+        <w:numPr>
+          <w:ilvl w:val="0"/>
+          <w:numId w:val="31"/>
+        </w:numPr>
+        <w:rPr>
+          <w:rFonts w:ascii="Times New Roman" w:eastAsia="宋体" w:hAnsi="Times New Roman" w:cs="Times New Roman"/>
+        </w:rPr>
+      </w:pPr>
+      <w:r>
+        <w:rPr>
+          <w:rFonts w:ascii="Times New Roman" w:eastAsia="宋体" w:hAnsi="Times New Roman" w:cs="Times New Roman" w:hint="eastAsia"/>
+        </w:rPr>
+        <w:t>修复了触发编辑器的参数在部分情况下没有正确刷新的</w:t>
+      </w:r>
+      <w:r>
+        <w:rPr>
+          <w:rFonts w:ascii="Times New Roman" w:eastAsia="宋体" w:hAnsi="Times New Roman" w:cs="Times New Roman" w:hint="eastAsia"/>
+        </w:rPr>
+        <w:t>bug</w:t>
+      </w:r>
+    </w:p>
+    <w:p>
+      <w:pPr>
+        <w:pStyle w:val="a9"/>
+        <w:numPr>
+          <w:ilvl w:val="0"/>
+          <w:numId w:val="31"/>
+        </w:numPr>
+        <w:rPr>
+          <w:rFonts w:ascii="Times New Roman" w:eastAsia="宋体" w:hAnsi="Times New Roman" w:cs="Times New Roman"/>
+        </w:rPr>
+      </w:pPr>
+      <w:r>
+        <w:rPr>
+          <w:rFonts w:ascii="Times New Roman" w:eastAsia="宋体" w:hAnsi="Times New Roman" w:cs="Times New Roman" w:hint="eastAsia"/>
+        </w:rPr>
+        <w:t>支持拖拽面向的实时预览，详见</w:t>
+      </w:r>
+      <w:r>
+        <w:rPr>
+          <w:rFonts w:ascii="Times New Roman" w:eastAsia="宋体" w:hAnsi="Times New Roman" w:cs="Times New Roman" w:hint="eastAsia"/>
+        </w:rPr>
+        <w:t>ExtFacings.DragPreview</w:t>
+      </w:r>
+    </w:p>
+    <w:p>
+      <w:pPr>
+        <w:pStyle w:val="a9"/>
+        <w:numPr>
+          <w:ilvl w:val="0"/>
+          <w:numId w:val="31"/>
+        </w:numPr>
+        <w:rPr>
+          <w:rFonts w:ascii="Times New Roman" w:eastAsia="宋体" w:hAnsi="Times New Roman" w:cs="Times New Roman"/>
+        </w:rPr>
+      </w:pPr>
+      <w:r>
+        <w:rPr>
+          <w:rFonts w:ascii="Times New Roman" w:eastAsia="宋体" w:hAnsi="Times New Roman" w:cs="Times New Roman" w:hint="eastAsia"/>
+        </w:rPr>
+        <w:t>支持</w:t>
+      </w:r>
+      <w:r>
+        <w:rPr>
+          <w:rFonts w:ascii="Times New Roman" w:eastAsia="宋体" w:hAnsi="Times New Roman" w:cs="Times New Roman" w:hint="eastAsia"/>
+        </w:rPr>
+        <w:t>3x3REFINERY</w:t>
+      </w:r>
+      <w:r>
+        <w:rPr>
+          <w:rFonts w:ascii="Times New Roman" w:eastAsia="宋体" w:hAnsi="Times New Roman" w:cs="Times New Roman" w:hint="eastAsia"/>
+        </w:rPr>
+        <w:t>建筑格子的正确显示</w:t>
+      </w:r>
+    </w:p>
+    <w:p>
+      <w:pPr>
+        <w:pStyle w:val="a9"/>
+        <w:numPr>
+          <w:ilvl w:val="0"/>
+          <w:numId w:val="31"/>
+        </w:numPr>
+        <w:rPr>
+          <w:rFonts w:ascii="Times New Roman" w:eastAsia="宋体" w:hAnsi="Times New Roman" w:cs="Times New Roman"/>
+        </w:rPr>
+      </w:pPr>
+      <w:r>
+        <w:rPr>
+          <w:rFonts w:ascii="Times New Roman" w:eastAsia="宋体" w:hAnsi="Times New Roman" w:cs="Times New Roman" w:hint="eastAsia"/>
+        </w:rPr>
+        <w:t>修复地形对象的</w:t>
+      </w:r>
+      <w:r>
+        <w:rPr>
+          <w:rFonts w:ascii="Times New Roman" w:eastAsia="宋体" w:hAnsi="Times New Roman" w:cs="Times New Roman" w:hint="eastAsia"/>
+        </w:rPr>
+        <w:t>AlphaImage</w:t>
+      </w:r>
+      <w:r>
+        <w:rPr>
+          <w:rFonts w:ascii="Times New Roman" w:eastAsia="宋体" w:hAnsi="Times New Roman" w:cs="Times New Roman" w:hint="eastAsia"/>
+        </w:rPr>
+        <w:t>不受图层选项控制的</w:t>
+      </w:r>
+      <w:r>
+        <w:rPr>
+          <w:rFonts w:ascii="Times New Roman" w:eastAsia="宋体" w:hAnsi="Times New Roman" w:cs="Times New Roman" w:hint="eastAsia"/>
+        </w:rPr>
+        <w:t>bug</w:t>
+      </w:r>
+      <w:r>
+        <w:rPr>
+          <w:rFonts w:ascii="Times New Roman" w:eastAsia="宋体" w:hAnsi="Times New Roman" w:cs="Times New Roman" w:hint="eastAsia"/>
+        </w:rPr>
+        <w:t>，调整</w:t>
+      </w:r>
+      <w:r>
+        <w:rPr>
+          <w:rFonts w:ascii="Times New Roman" w:eastAsia="宋体" w:hAnsi="Times New Roman" w:cs="Times New Roman" w:hint="eastAsia"/>
+        </w:rPr>
+        <w:t>AlphaImage</w:t>
+      </w:r>
+      <w:r>
+        <w:rPr>
+          <w:rFonts w:ascii="Times New Roman" w:eastAsia="宋体" w:hAnsi="Times New Roman" w:cs="Times New Roman" w:hint="eastAsia"/>
+        </w:rPr>
+        <w:t>绘制</w:t>
+      </w:r>
+      <w:r>
+        <w:rPr>
+          <w:rFonts w:ascii="Times New Roman" w:eastAsia="宋体" w:hAnsi="Times New Roman" w:cs="Times New Roman" w:hint="eastAsia"/>
+        </w:rPr>
         <w:lastRenderedPageBreak/>
-        <w:t>修复部分情况下绘制连接地形上升、下降段高度错误的</w:t>
-      </w:r>
-      <w:r>
-        <w:rPr>
-          <w:rFonts w:ascii="Times New Roman" w:eastAsia="宋体" w:hAnsi="Times New Roman" w:cs="Times New Roman" w:hint="eastAsia"/>
-        </w:rPr>
-        <w:t>bug</w:t>
+        <w:t>顺序</w:t>
       </w:r>
     </w:p>
     <w:p>
@@ -11799,967 +12794,6 @@
         <w:rPr>
           <w:rFonts w:ascii="Times New Roman" w:eastAsia="宋体" w:hAnsi="Times New Roman" w:cs="Times New Roman" w:hint="eastAsia"/>
         </w:rPr>
-        <w:t>优化光照沙盒切换时的性能</w:t>
-      </w:r>
-    </w:p>
-    <w:p>
-      <w:pPr>
-        <w:pStyle w:val="a9"/>
-        <w:numPr>
-          <w:ilvl w:val="0"/>
-          <w:numId w:val="31"/>
-        </w:numPr>
-        <w:rPr>
-          <w:rFonts w:ascii="Times New Roman" w:eastAsia="宋体" w:hAnsi="Times New Roman" w:cs="Times New Roman"/>
-        </w:rPr>
-      </w:pPr>
-      <w:r>
-        <w:rPr>
-          <w:rFonts w:ascii="Times New Roman" w:eastAsia="宋体" w:hAnsi="Times New Roman" w:cs="Times New Roman" w:hint="eastAsia"/>
-        </w:rPr>
-        <w:t>新增</w:t>
-      </w:r>
-      <w:r>
-        <w:rPr>
-          <w:rFonts w:ascii="Times New Roman" w:eastAsia="宋体" w:hAnsi="Times New Roman" w:cs="Times New Roman" w:hint="eastAsia"/>
-        </w:rPr>
-        <w:t>LightingPreview</w:t>
-      </w:r>
-      <w:r>
-        <w:rPr>
-          <w:rFonts w:ascii="Times New Roman" w:eastAsia="宋体" w:hAnsi="Times New Roman" w:cs="Times New Roman" w:hint="eastAsia"/>
-        </w:rPr>
-        <w:t>.</w:t>
-      </w:r>
-      <w:r>
-        <w:rPr>
-          <w:rFonts w:ascii="Times New Roman" w:eastAsia="宋体" w:hAnsi="Times New Roman" w:cs="Times New Roman" w:hint="eastAsia"/>
-        </w:rPr>
-        <w:t>Tint</w:t>
-      </w:r>
-      <w:r>
-        <w:rPr>
-          <w:rFonts w:ascii="Times New Roman" w:eastAsia="宋体" w:hAnsi="Times New Roman" w:cs="Times New Roman" w:hint="eastAsia"/>
-        </w:rPr>
-        <w:t>TileSetBrowserView</w:t>
-      </w:r>
-      <w:r>
-        <w:rPr>
-          <w:rFonts w:ascii="Times New Roman" w:eastAsia="宋体" w:hAnsi="Times New Roman" w:cs="Times New Roman" w:hint="eastAsia"/>
-        </w:rPr>
-        <w:t>，控制是否按光照沙盒渲染地形浏览器图像</w:t>
-      </w:r>
-    </w:p>
-    <w:p>
-      <w:pPr>
-        <w:pStyle w:val="a9"/>
-        <w:numPr>
-          <w:ilvl w:val="0"/>
-          <w:numId w:val="31"/>
-        </w:numPr>
-        <w:rPr>
-          <w:rFonts w:ascii="Times New Roman" w:eastAsia="宋体" w:hAnsi="Times New Roman" w:cs="Times New Roman"/>
-        </w:rPr>
-      </w:pPr>
-      <w:r>
-        <w:rPr>
-          <w:rFonts w:ascii="Times New Roman" w:eastAsia="宋体" w:hAnsi="Times New Roman" w:cs="Times New Roman" w:hint="eastAsia"/>
-        </w:rPr>
-        <w:t>新增距离标尺，可以记录当前鼠标位置距离上次按下左键位置的距离，记录历史数量见</w:t>
-      </w:r>
-      <w:r>
-        <w:rPr>
-          <w:rFonts w:ascii="Times New Roman" w:eastAsia="宋体" w:hAnsi="Times New Roman" w:cs="Times New Roman" w:hint="eastAsia"/>
-        </w:rPr>
-        <w:t>DistanceRuler.Records</w:t>
-      </w:r>
-    </w:p>
-    <w:p>
-      <w:pPr>
-        <w:pStyle w:val="a9"/>
-        <w:numPr>
-          <w:ilvl w:val="0"/>
-          <w:numId w:val="31"/>
-        </w:numPr>
-        <w:rPr>
-          <w:rFonts w:ascii="Times New Roman" w:eastAsia="宋体" w:hAnsi="Times New Roman" w:cs="Times New Roman"/>
-        </w:rPr>
-      </w:pPr>
-      <w:r>
-        <w:rPr>
-          <w:rFonts w:ascii="Times New Roman" w:eastAsia="宋体" w:hAnsi="Times New Roman" w:cs="Times New Roman" w:hint="eastAsia"/>
-        </w:rPr>
-        <w:t>微调新建地图时可视边界数值</w:t>
-      </w:r>
-    </w:p>
-    <w:p>
-      <w:pPr>
-        <w:pStyle w:val="a9"/>
-        <w:numPr>
-          <w:ilvl w:val="0"/>
-          <w:numId w:val="31"/>
-        </w:numPr>
-        <w:rPr>
-          <w:rFonts w:ascii="Times New Roman" w:eastAsia="宋体" w:hAnsi="Times New Roman" w:cs="Times New Roman"/>
-        </w:rPr>
-      </w:pPr>
-      <w:r>
-        <w:rPr>
-          <w:rFonts w:ascii="Times New Roman" w:eastAsia="宋体" w:hAnsi="Times New Roman" w:cs="Times New Roman" w:hint="eastAsia"/>
-        </w:rPr>
-        <w:t>修复平坦地形工具无法平坦地图边缘斜坡的</w:t>
-      </w:r>
-      <w:r>
-        <w:rPr>
-          <w:rFonts w:ascii="Times New Roman" w:eastAsia="宋体" w:hAnsi="Times New Roman" w:cs="Times New Roman" w:hint="eastAsia"/>
-        </w:rPr>
-        <w:t>bug</w:t>
-      </w:r>
-    </w:p>
-    <w:p>
-      <w:pPr>
-        <w:pStyle w:val="a9"/>
-        <w:numPr>
-          <w:ilvl w:val="0"/>
-          <w:numId w:val="31"/>
-        </w:numPr>
-        <w:rPr>
-          <w:rFonts w:ascii="Times New Roman" w:eastAsia="宋体" w:hAnsi="Times New Roman" w:cs="Times New Roman"/>
-        </w:rPr>
-      </w:pPr>
-      <w:r>
-        <w:rPr>
-          <w:rFonts w:ascii="Times New Roman" w:eastAsia="宋体" w:hAnsi="Times New Roman" w:cs="Times New Roman" w:hint="eastAsia"/>
-        </w:rPr>
-        <w:t>绘制连接地形可以将鼠标移动到地图边界外，更方便靠近边界的绘制</w:t>
-      </w:r>
-    </w:p>
-    <w:p>
-      <w:pPr>
-        <w:pStyle w:val="a9"/>
-        <w:numPr>
-          <w:ilvl w:val="0"/>
-          <w:numId w:val="31"/>
-        </w:numPr>
-        <w:rPr>
-          <w:rFonts w:ascii="Times New Roman" w:eastAsia="宋体" w:hAnsi="Times New Roman" w:cs="Times New Roman"/>
-        </w:rPr>
-      </w:pPr>
-      <w:r>
-        <w:rPr>
-          <w:rFonts w:ascii="Times New Roman" w:eastAsia="宋体" w:hAnsi="Times New Roman" w:cs="Times New Roman" w:hint="eastAsia"/>
-        </w:rPr>
-        <w:t>优化</w:t>
-      </w:r>
-      <w:r>
-        <w:rPr>
-          <w:rFonts w:ascii="Times New Roman" w:eastAsia="宋体" w:hAnsi="Times New Roman" w:cs="Times New Roman" w:hint="eastAsia"/>
-        </w:rPr>
-        <w:t>IsoMapPack5</w:t>
-      </w:r>
-      <w:r>
-        <w:rPr>
-          <w:rFonts w:ascii="Times New Roman" w:eastAsia="宋体" w:hAnsi="Times New Roman" w:cs="Times New Roman" w:hint="eastAsia"/>
-        </w:rPr>
-        <w:t>压缩，减少地图体积，减少游戏内大地图地形异常的可能</w:t>
-      </w:r>
-    </w:p>
-    <w:p>
-      <w:pPr>
-        <w:pStyle w:val="a9"/>
-        <w:numPr>
-          <w:ilvl w:val="0"/>
-          <w:numId w:val="31"/>
-        </w:numPr>
-        <w:rPr>
-          <w:rFonts w:ascii="Times New Roman" w:eastAsia="宋体" w:hAnsi="Times New Roman" w:cs="Times New Roman"/>
-        </w:rPr>
-      </w:pPr>
-      <w:r>
-        <w:rPr>
-          <w:rFonts w:ascii="Times New Roman" w:eastAsia="宋体" w:hAnsi="Times New Roman" w:cs="Times New Roman" w:hint="eastAsia"/>
-        </w:rPr>
-        <w:t>修复调整地图大小后隧道位置错误的</w:t>
-      </w:r>
-      <w:r>
-        <w:rPr>
-          <w:rFonts w:ascii="Times New Roman" w:eastAsia="宋体" w:hAnsi="Times New Roman" w:cs="Times New Roman" w:hint="eastAsia"/>
-        </w:rPr>
-        <w:t>bug</w:t>
-      </w:r>
-    </w:p>
-    <w:p>
-      <w:pPr>
-        <w:pStyle w:val="a9"/>
-        <w:numPr>
-          <w:ilvl w:val="0"/>
-          <w:numId w:val="31"/>
-        </w:numPr>
-        <w:rPr>
-          <w:rFonts w:ascii="Times New Roman" w:eastAsia="宋体" w:hAnsi="Times New Roman" w:cs="Times New Roman"/>
-        </w:rPr>
-      </w:pPr>
-      <w:r>
-        <w:rPr>
-          <w:rFonts w:ascii="Times New Roman" w:eastAsia="宋体" w:hAnsi="Times New Roman" w:cs="Times New Roman" w:hint="eastAsia"/>
-        </w:rPr>
-        <w:t>修复了在开启输入法和部分情况下在地图界面按</w:t>
-      </w:r>
-      <w:r>
-        <w:rPr>
-          <w:rFonts w:ascii="Times New Roman" w:eastAsia="宋体" w:hAnsi="Times New Roman" w:cs="Times New Roman" w:hint="eastAsia"/>
-        </w:rPr>
-        <w:t>D</w:t>
-      </w:r>
-      <w:r>
-        <w:rPr>
-          <w:rFonts w:ascii="Times New Roman" w:eastAsia="宋体" w:hAnsi="Times New Roman" w:cs="Times New Roman" w:hint="eastAsia"/>
-        </w:rPr>
-        <w:t>、</w:t>
-      </w:r>
-      <w:r>
-        <w:rPr>
-          <w:rFonts w:ascii="Times New Roman" w:eastAsia="宋体" w:hAnsi="Times New Roman" w:cs="Times New Roman" w:hint="eastAsia"/>
-        </w:rPr>
-        <w:t>[</w:t>
-      </w:r>
-      <w:r>
-        <w:rPr>
-          <w:rFonts w:ascii="Times New Roman" w:eastAsia="宋体" w:hAnsi="Times New Roman" w:cs="Times New Roman" w:hint="eastAsia"/>
-        </w:rPr>
-        <w:t>、</w:t>
-      </w:r>
-      <w:r>
-        <w:rPr>
-          <w:rFonts w:ascii="Times New Roman" w:eastAsia="宋体" w:hAnsi="Times New Roman" w:cs="Times New Roman" w:hint="eastAsia"/>
-        </w:rPr>
-        <w:t>]</w:t>
-      </w:r>
-      <w:r>
-        <w:rPr>
-          <w:rFonts w:ascii="Times New Roman" w:eastAsia="宋体" w:hAnsi="Times New Roman" w:cs="Times New Roman" w:hint="eastAsia"/>
-        </w:rPr>
-        <w:t>键无效的</w:t>
-      </w:r>
-      <w:r>
-        <w:rPr>
-          <w:rFonts w:ascii="Times New Roman" w:eastAsia="宋体" w:hAnsi="Times New Roman" w:cs="Times New Roman" w:hint="eastAsia"/>
-        </w:rPr>
-        <w:t>bug</w:t>
-      </w:r>
-    </w:p>
-    <w:p>
-      <w:pPr>
-        <w:pStyle w:val="a9"/>
-        <w:numPr>
-          <w:ilvl w:val="0"/>
-          <w:numId w:val="31"/>
-        </w:numPr>
-        <w:rPr>
-          <w:rFonts w:ascii="Times New Roman" w:eastAsia="宋体" w:hAnsi="Times New Roman" w:cs="Times New Roman"/>
-        </w:rPr>
-      </w:pPr>
-      <w:r>
-        <w:rPr>
-          <w:rFonts w:ascii="Times New Roman" w:eastAsia="宋体" w:hAnsi="Times New Roman" w:cs="Times New Roman" w:hint="eastAsia"/>
-        </w:rPr>
-        <w:t>修复了新城市下使用绘制悬崖后部工具时，按</w:t>
-      </w:r>
-      <w:r>
-        <w:rPr>
-          <w:rFonts w:ascii="Times New Roman" w:eastAsia="宋体" w:hAnsi="Times New Roman" w:cs="Times New Roman" w:hint="eastAsia"/>
-        </w:rPr>
-        <w:t>A</w:t>
-      </w:r>
-      <w:r>
-        <w:rPr>
-          <w:rFonts w:ascii="Times New Roman" w:eastAsia="宋体" w:hAnsi="Times New Roman" w:cs="Times New Roman" w:hint="eastAsia"/>
-        </w:rPr>
-        <w:t>键无法切换悬崖类型的</w:t>
-      </w:r>
-      <w:r>
-        <w:rPr>
-          <w:rFonts w:ascii="Times New Roman" w:eastAsia="宋体" w:hAnsi="Times New Roman" w:cs="Times New Roman" w:hint="eastAsia"/>
-        </w:rPr>
-        <w:t>bug</w:t>
-      </w:r>
-    </w:p>
-    <w:p>
-      <w:pPr>
-        <w:pStyle w:val="a9"/>
-        <w:numPr>
-          <w:ilvl w:val="0"/>
-          <w:numId w:val="31"/>
-        </w:numPr>
-        <w:rPr>
-          <w:rFonts w:ascii="Times New Roman" w:eastAsia="宋体" w:hAnsi="Times New Roman" w:cs="Times New Roman"/>
-        </w:rPr>
-      </w:pPr>
-      <w:r>
-        <w:rPr>
-          <w:rFonts w:ascii="Times New Roman" w:eastAsia="宋体" w:hAnsi="Times New Roman" w:cs="Times New Roman" w:hint="eastAsia"/>
-        </w:rPr>
-        <w:t>增强绘制悬崖工具，可以在不同地图类型的</w:t>
-      </w:r>
-      <w:r>
-        <w:rPr>
-          <w:rFonts w:ascii="Times New Roman" w:eastAsia="宋体" w:hAnsi="Times New Roman" w:cs="Times New Roman" w:hint="eastAsia"/>
-        </w:rPr>
-        <w:t>[TheaterInfo]</w:t>
-      </w:r>
-      <w:r>
-        <w:rPr>
-          <w:rFonts w:ascii="Times New Roman" w:eastAsia="宋体" w:hAnsi="Times New Roman" w:cs="Times New Roman" w:hint="eastAsia"/>
-        </w:rPr>
-        <w:t>（如</w:t>
-      </w:r>
-      <w:r>
-        <w:rPr>
-          <w:rFonts w:ascii="Times New Roman" w:eastAsia="宋体" w:hAnsi="Times New Roman" w:cs="Times New Roman" w:hint="eastAsia"/>
-        </w:rPr>
-        <w:t>[SnowInfo]</w:t>
-      </w:r>
-      <w:r>
-        <w:rPr>
-          <w:rFonts w:ascii="Times New Roman" w:eastAsia="宋体" w:hAnsi="Times New Roman" w:cs="Times New Roman" w:hint="eastAsia"/>
-        </w:rPr>
-        <w:t>）中填写</w:t>
-      </w:r>
-      <w:r>
-        <w:rPr>
-          <w:rFonts w:ascii="Times New Roman" w:eastAsia="宋体" w:hAnsi="Times New Roman" w:cs="Times New Roman" w:hint="eastAsia"/>
-        </w:rPr>
-        <w:t>Cliffs2</w:t>
-      </w:r>
-      <w:r>
-        <w:rPr>
-          <w:rFonts w:ascii="Times New Roman" w:eastAsia="宋体" w:hAnsi="Times New Roman" w:cs="Times New Roman" w:hint="eastAsia"/>
-        </w:rPr>
-        <w:t>、</w:t>
-      </w:r>
-      <w:r>
-        <w:rPr>
-          <w:rFonts w:ascii="Times New Roman" w:eastAsia="宋体" w:hAnsi="Times New Roman" w:cs="Times New Roman" w:hint="eastAsia"/>
-        </w:rPr>
-        <w:t>CliffsWater2</w:t>
-      </w:r>
-      <w:r>
-        <w:rPr>
-          <w:rFonts w:ascii="Times New Roman" w:eastAsia="宋体" w:hAnsi="Times New Roman" w:cs="Times New Roman" w:hint="eastAsia"/>
-        </w:rPr>
-        <w:t>以支持悬崖类型切换；在存在月球悬崖时，支持绘制月球悬崖</w:t>
-      </w:r>
-    </w:p>
-    <w:p>
-      <w:pPr>
-        <w:pStyle w:val="a9"/>
-        <w:numPr>
-          <w:ilvl w:val="0"/>
-          <w:numId w:val="31"/>
-        </w:numPr>
-        <w:rPr>
-          <w:rFonts w:ascii="Times New Roman" w:eastAsia="宋体" w:hAnsi="Times New Roman" w:cs="Times New Roman"/>
-        </w:rPr>
-      </w:pPr>
-      <w:r>
-        <w:rPr>
-          <w:rFonts w:ascii="Times New Roman" w:eastAsia="宋体" w:hAnsi="Times New Roman" w:cs="Times New Roman" w:hint="eastAsia"/>
-        </w:rPr>
-        <w:t>支持</w:t>
-      </w:r>
-      <w:r>
-        <w:rPr>
-          <w:rFonts w:ascii="Times New Roman" w:eastAsia="宋体" w:hAnsi="Times New Roman" w:cs="Times New Roman" w:hint="eastAsia"/>
-        </w:rPr>
-        <w:t>32</w:t>
-      </w:r>
-      <w:r>
-        <w:rPr>
-          <w:rFonts w:ascii="Times New Roman" w:eastAsia="宋体" w:hAnsi="Times New Roman" w:cs="Times New Roman" w:hint="eastAsia"/>
-        </w:rPr>
-        <w:t>向面向</w:t>
-      </w:r>
-      <w:r>
-        <w:rPr>
-          <w:rFonts w:ascii="Times New Roman" w:eastAsia="宋体" w:hAnsi="Times New Roman" w:cs="Times New Roman" w:hint="eastAsia"/>
-        </w:rPr>
-        <w:t>与拖拽</w:t>
-      </w:r>
-      <w:r>
-        <w:rPr>
-          <w:rFonts w:ascii="Times New Roman" w:eastAsia="宋体" w:hAnsi="Times New Roman" w:cs="Times New Roman" w:hint="eastAsia"/>
-        </w:rPr>
-        <w:t>，详见</w:t>
-      </w:r>
-      <w:r>
-        <w:rPr>
-          <w:rFonts w:ascii="Times New Roman" w:eastAsia="宋体" w:hAnsi="Times New Roman" w:cs="Times New Roman" w:hint="eastAsia"/>
-        </w:rPr>
-        <w:t>ExtFacings</w:t>
-      </w:r>
-      <w:r>
-        <w:rPr>
-          <w:rFonts w:ascii="Times New Roman" w:eastAsia="宋体" w:hAnsi="Times New Roman" w:cs="Times New Roman" w:hint="eastAsia"/>
-        </w:rPr>
-        <w:t>与</w:t>
-      </w:r>
-      <w:r>
-        <w:rPr>
-          <w:rFonts w:ascii="Times New Roman" w:eastAsia="宋体" w:hAnsi="Times New Roman" w:cs="Times New Roman" w:hint="eastAsia"/>
-        </w:rPr>
-        <w:t>ExtFacings.Drag</w:t>
-      </w:r>
-    </w:p>
-    <w:p>
-      <w:pPr>
-        <w:pStyle w:val="a9"/>
-        <w:numPr>
-          <w:ilvl w:val="0"/>
-          <w:numId w:val="31"/>
-        </w:numPr>
-        <w:rPr>
-          <w:rFonts w:ascii="Times New Roman" w:eastAsia="宋体" w:hAnsi="Times New Roman" w:cs="Times New Roman"/>
-        </w:rPr>
-      </w:pPr>
-      <w:r>
-        <w:rPr>
-          <w:rFonts w:ascii="Times New Roman" w:eastAsia="宋体" w:hAnsi="Times New Roman" w:cs="Times New Roman" w:hint="eastAsia"/>
-        </w:rPr>
-        <w:t>重写部分字符串类型，优化字符串加载稳定性</w:t>
-      </w:r>
-    </w:p>
-    <w:p>
-      <w:pPr>
-        <w:pStyle w:val="a9"/>
-        <w:numPr>
-          <w:ilvl w:val="0"/>
-          <w:numId w:val="31"/>
-        </w:numPr>
-        <w:rPr>
-          <w:rFonts w:ascii="Times New Roman" w:eastAsia="宋体" w:hAnsi="Times New Roman" w:cs="Times New Roman"/>
-        </w:rPr>
-      </w:pPr>
-      <w:r>
-        <w:rPr>
-          <w:rFonts w:ascii="Times New Roman" w:eastAsia="宋体" w:hAnsi="Times New Roman" w:cs="Times New Roman" w:hint="eastAsia"/>
-        </w:rPr>
-        <w:t>优化抬升</w:t>
-      </w:r>
-      <w:r>
-        <w:rPr>
-          <w:rFonts w:ascii="Times New Roman" w:eastAsia="宋体" w:hAnsi="Times New Roman" w:cs="Times New Roman" w:hint="eastAsia"/>
-        </w:rPr>
-        <w:t>/</w:t>
-      </w:r>
-      <w:r>
-        <w:rPr>
-          <w:rFonts w:ascii="Times New Roman" w:eastAsia="宋体" w:hAnsi="Times New Roman" w:cs="Times New Roman" w:hint="eastAsia"/>
-        </w:rPr>
-        <w:t>降低地表算法，不会出现异常的大范围变动</w:t>
-      </w:r>
-    </w:p>
-    <w:p>
-      <w:pPr>
-        <w:pStyle w:val="a9"/>
-        <w:numPr>
-          <w:ilvl w:val="0"/>
-          <w:numId w:val="31"/>
-        </w:numPr>
-        <w:rPr>
-          <w:rFonts w:ascii="Times New Roman" w:eastAsia="宋体" w:hAnsi="Times New Roman" w:cs="Times New Roman"/>
-        </w:rPr>
-      </w:pPr>
-      <w:r>
-        <w:rPr>
-          <w:rFonts w:ascii="Times New Roman" w:eastAsia="宋体" w:hAnsi="Times New Roman" w:cs="Times New Roman" w:hint="eastAsia"/>
-        </w:rPr>
-        <w:t>FA2sp.log</w:t>
-      </w:r>
-      <w:r>
-        <w:rPr>
-          <w:rFonts w:ascii="Times New Roman" w:eastAsia="宋体" w:hAnsi="Times New Roman" w:cs="Times New Roman" w:hint="eastAsia"/>
-        </w:rPr>
-        <w:t>使用</w:t>
-      </w:r>
-      <w:r>
-        <w:rPr>
-          <w:rFonts w:ascii="Times New Roman" w:eastAsia="宋体" w:hAnsi="Times New Roman" w:cs="Times New Roman" w:hint="eastAsia"/>
-        </w:rPr>
-        <w:t>UTF8</w:t>
-      </w:r>
-      <w:r>
-        <w:rPr>
-          <w:rFonts w:ascii="Times New Roman" w:eastAsia="宋体" w:hAnsi="Times New Roman" w:cs="Times New Roman" w:hint="eastAsia"/>
-        </w:rPr>
-        <w:t>编码</w:t>
-      </w:r>
-    </w:p>
-    <w:p>
-      <w:pPr>
-        <w:pStyle w:val="a9"/>
-        <w:numPr>
-          <w:ilvl w:val="0"/>
-          <w:numId w:val="31"/>
-        </w:numPr>
-        <w:rPr>
-          <w:rFonts w:ascii="Times New Roman" w:eastAsia="宋体" w:hAnsi="Times New Roman" w:cs="Times New Roman"/>
-        </w:rPr>
-      </w:pPr>
-      <w:r>
-        <w:rPr>
-          <w:rFonts w:ascii="Times New Roman" w:eastAsia="宋体" w:hAnsi="Times New Roman" w:cs="Times New Roman" w:hint="eastAsia"/>
-        </w:rPr>
-        <w:t>保存地图时可以维持已有的</w:t>
-      </w:r>
-      <w:r>
-        <w:rPr>
-          <w:rFonts w:ascii="Times New Roman" w:eastAsia="宋体" w:hAnsi="Times New Roman" w:cs="Times New Roman" w:hint="eastAsia"/>
-        </w:rPr>
-        <w:t>ini</w:t>
-      </w:r>
-      <w:r>
-        <w:rPr>
-          <w:rFonts w:ascii="Times New Roman" w:eastAsia="宋体" w:hAnsi="Times New Roman" w:cs="Times New Roman" w:hint="eastAsia"/>
-        </w:rPr>
-        <w:t>小节顺序，详见</w:t>
-      </w:r>
-      <w:r>
-        <w:rPr>
-          <w:rFonts w:ascii="Times New Roman" w:eastAsia="宋体" w:hAnsi="Times New Roman" w:cs="Times New Roman" w:hint="eastAsia"/>
-        </w:rPr>
-        <w:t>SaveMap.PreserveINISorting</w:t>
-      </w:r>
-    </w:p>
-    <w:p>
-      <w:pPr>
-        <w:pStyle w:val="a9"/>
-        <w:numPr>
-          <w:ilvl w:val="0"/>
-          <w:numId w:val="31"/>
-        </w:numPr>
-        <w:rPr>
-          <w:rFonts w:ascii="Times New Roman" w:eastAsia="宋体" w:hAnsi="Times New Roman" w:cs="Times New Roman"/>
-        </w:rPr>
-      </w:pPr>
-      <w:r>
-        <w:rPr>
-          <w:rFonts w:ascii="Times New Roman" w:eastAsia="宋体" w:hAnsi="Times New Roman" w:cs="Times New Roman" w:hint="eastAsia"/>
-        </w:rPr>
-        <w:t>重写撤销重做系统，所有撤销动作均支持完整重做</w:t>
-      </w:r>
-    </w:p>
-    <w:p>
-      <w:pPr>
-        <w:pStyle w:val="a9"/>
-        <w:numPr>
-          <w:ilvl w:val="0"/>
-          <w:numId w:val="31"/>
-        </w:numPr>
-        <w:rPr>
-          <w:rFonts w:ascii="Times New Roman" w:eastAsia="宋体" w:hAnsi="Times New Roman" w:cs="Times New Roman"/>
-        </w:rPr>
-      </w:pPr>
-      <w:r>
-        <w:rPr>
-          <w:rFonts w:ascii="Times New Roman" w:eastAsia="宋体" w:hAnsi="Times New Roman" w:cs="Times New Roman" w:hint="eastAsia"/>
-        </w:rPr>
-        <w:t>撤销重做系统能够记录游戏对象的修改历史，详见</w:t>
-      </w:r>
-      <w:r>
-        <w:rPr>
-          <w:rFonts w:ascii="Times New Roman" w:eastAsia="宋体" w:hAnsi="Times New Roman" w:cs="Times New Roman" w:hint="eastAsia"/>
-        </w:rPr>
-        <w:t>UndoRedo.RecordObjects</w:t>
-      </w:r>
-    </w:p>
-    <w:p>
-      <w:pPr>
-        <w:pStyle w:val="a9"/>
-        <w:numPr>
-          <w:ilvl w:val="0"/>
-          <w:numId w:val="31"/>
-        </w:numPr>
-        <w:rPr>
-          <w:rFonts w:ascii="Times New Roman" w:eastAsia="宋体" w:hAnsi="Times New Roman" w:cs="Times New Roman"/>
-        </w:rPr>
-      </w:pPr>
-      <w:r>
-        <w:rPr>
-          <w:rFonts w:ascii="Times New Roman" w:eastAsia="宋体" w:hAnsi="Times New Roman" w:cs="Times New Roman" w:hint="eastAsia"/>
-        </w:rPr>
-        <w:t>支持设置</w:t>
-      </w:r>
-      <w:r>
-        <w:rPr>
-          <w:rFonts w:ascii="Times New Roman" w:eastAsia="宋体" w:hAnsi="Times New Roman" w:cs="Times New Roman" w:hint="eastAsia"/>
-        </w:rPr>
-        <w:t>RubblePalette</w:t>
-      </w:r>
-      <w:r>
-        <w:rPr>
-          <w:rFonts w:ascii="Times New Roman" w:eastAsia="宋体" w:hAnsi="Times New Roman" w:cs="Times New Roman" w:hint="eastAsia"/>
-        </w:rPr>
-        <w:t>=</w:t>
-      </w:r>
-      <w:r>
-        <w:rPr>
-          <w:rFonts w:ascii="Times New Roman" w:eastAsia="宋体" w:hAnsi="Times New Roman" w:cs="Times New Roman" w:hint="eastAsia"/>
-        </w:rPr>
-        <w:t>指定建筑废墟色盘</w:t>
-      </w:r>
-    </w:p>
-    <w:p>
-      <w:pPr>
-        <w:pStyle w:val="a9"/>
-        <w:numPr>
-          <w:ilvl w:val="0"/>
-          <w:numId w:val="31"/>
-        </w:numPr>
-        <w:rPr>
-          <w:rFonts w:ascii="Times New Roman" w:eastAsia="宋体" w:hAnsi="Times New Roman" w:cs="Times New Roman"/>
-        </w:rPr>
-      </w:pPr>
-      <w:r>
-        <w:rPr>
-          <w:rFonts w:ascii="Times New Roman" w:eastAsia="宋体" w:hAnsi="Times New Roman" w:cs="Times New Roman" w:hint="eastAsia"/>
-        </w:rPr>
-        <w:t>提升稳定性</w:t>
-      </w:r>
-    </w:p>
-    <w:p>
-      <w:pPr>
-        <w:pStyle w:val="a9"/>
-        <w:numPr>
-          <w:ilvl w:val="0"/>
-          <w:numId w:val="31"/>
-        </w:numPr>
-        <w:rPr>
-          <w:rFonts w:ascii="Times New Roman" w:eastAsia="宋体" w:hAnsi="Times New Roman" w:cs="Times New Roman"/>
-        </w:rPr>
-      </w:pPr>
-      <w:r>
-        <w:rPr>
-          <w:rFonts w:ascii="Times New Roman" w:eastAsia="宋体" w:hAnsi="Times New Roman" w:cs="Times New Roman" w:hint="eastAsia"/>
-        </w:rPr>
-        <w:t>优化素材图像内存占用</w:t>
-      </w:r>
-    </w:p>
-    <w:p>
-      <w:pPr>
-        <w:pStyle w:val="a9"/>
-        <w:numPr>
-          <w:ilvl w:val="0"/>
-          <w:numId w:val="31"/>
-        </w:numPr>
-        <w:rPr>
-          <w:rFonts w:ascii="Times New Roman" w:eastAsia="宋体" w:hAnsi="Times New Roman" w:cs="Times New Roman"/>
-        </w:rPr>
-      </w:pPr>
-      <w:r>
-        <w:rPr>
-          <w:rFonts w:ascii="Times New Roman" w:eastAsia="宋体" w:hAnsi="Times New Roman" w:cs="Times New Roman" w:hint="eastAsia"/>
-        </w:rPr>
-        <w:t>重写</w:t>
-      </w:r>
-      <w:r>
-        <w:rPr>
-          <w:rFonts w:ascii="Times New Roman" w:eastAsia="宋体" w:hAnsi="Times New Roman" w:cs="Times New Roman" w:hint="eastAsia"/>
-        </w:rPr>
-        <w:t>mix</w:t>
-      </w:r>
-      <w:r>
-        <w:rPr>
-          <w:rFonts w:ascii="Times New Roman" w:eastAsia="宋体" w:hAnsi="Times New Roman" w:cs="Times New Roman" w:hint="eastAsia"/>
-        </w:rPr>
-        <w:t>加载逻辑，修复加载中的内存泄漏</w:t>
-      </w:r>
-      <w:r>
-        <w:rPr>
-          <w:rFonts w:ascii="Times New Roman" w:eastAsia="宋体" w:hAnsi="Times New Roman" w:cs="Times New Roman" w:hint="eastAsia"/>
-        </w:rPr>
-        <w:t>，详见</w:t>
-      </w:r>
-      <w:r>
-        <w:rPr>
-          <w:rFonts w:ascii="Times New Roman" w:eastAsia="宋体" w:hAnsi="Times New Roman" w:cs="Times New Roman" w:hint="eastAsia"/>
-        </w:rPr>
-        <w:t>ExtMixLoader</w:t>
-      </w:r>
-    </w:p>
-    <w:p>
-      <w:pPr>
-        <w:pStyle w:val="a9"/>
-        <w:numPr>
-          <w:ilvl w:val="0"/>
-          <w:numId w:val="31"/>
-        </w:numPr>
-        <w:rPr>
-          <w:rFonts w:ascii="Times New Roman" w:eastAsia="宋体" w:hAnsi="Times New Roman" w:cs="Times New Roman"/>
-        </w:rPr>
-      </w:pPr>
-      <w:r>
-        <w:rPr>
-          <w:rFonts w:ascii="Times New Roman" w:eastAsia="宋体" w:hAnsi="Times New Roman" w:cs="Times New Roman" w:hint="eastAsia"/>
-        </w:rPr>
-        <w:t>新增</w:t>
-      </w:r>
-      <w:r>
-        <w:rPr>
-          <w:rFonts w:ascii="Times New Roman" w:eastAsia="宋体" w:hAnsi="Times New Roman" w:cs="Times New Roman" w:hint="eastAsia"/>
-        </w:rPr>
-        <w:t>DDrawScalingBilinear.OnlyShrink</w:t>
-      </w:r>
-      <w:r>
-        <w:rPr>
-          <w:rFonts w:ascii="Times New Roman" w:eastAsia="宋体" w:hAnsi="Times New Roman" w:cs="Times New Roman" w:hint="eastAsia"/>
-        </w:rPr>
-        <w:t>，支持仅在缩小时使用双线性插值，放大时硬边缘放大</w:t>
-      </w:r>
-    </w:p>
-    <w:p>
-      <w:pPr>
-        <w:pStyle w:val="a9"/>
-        <w:numPr>
-          <w:ilvl w:val="0"/>
-          <w:numId w:val="31"/>
-        </w:numPr>
-        <w:rPr>
-          <w:rFonts w:ascii="Times New Roman" w:eastAsia="宋体" w:hAnsi="Times New Roman" w:cs="Times New Roman"/>
-        </w:rPr>
-      </w:pPr>
-      <w:r>
-        <w:rPr>
-          <w:rFonts w:ascii="Times New Roman" w:eastAsia="宋体" w:hAnsi="Times New Roman" w:cs="Times New Roman" w:hint="eastAsia"/>
-        </w:rPr>
-        <w:t>优化绘图性能</w:t>
-      </w:r>
-    </w:p>
-    <w:p>
-      <w:pPr>
-        <w:pStyle w:val="a9"/>
-        <w:numPr>
-          <w:ilvl w:val="0"/>
-          <w:numId w:val="31"/>
-        </w:numPr>
-        <w:rPr>
-          <w:rFonts w:ascii="Times New Roman" w:eastAsia="宋体" w:hAnsi="Times New Roman" w:cs="Times New Roman"/>
-        </w:rPr>
-      </w:pPr>
-      <w:r>
-        <w:rPr>
-          <w:rFonts w:ascii="Times New Roman" w:eastAsia="宋体" w:hAnsi="Times New Roman" w:cs="Times New Roman" w:hint="eastAsia"/>
-        </w:rPr>
-        <w:t>重写</w:t>
-      </w:r>
-      <w:r>
-        <w:rPr>
-          <w:rFonts w:ascii="Times New Roman" w:eastAsia="宋体" w:hAnsi="Times New Roman" w:cs="Times New Roman" w:hint="eastAsia"/>
-        </w:rPr>
-        <w:t>ini</w:t>
-      </w:r>
-      <w:r>
-        <w:rPr>
-          <w:rFonts w:ascii="Times New Roman" w:eastAsia="宋体" w:hAnsi="Times New Roman" w:cs="Times New Roman" w:hint="eastAsia"/>
-        </w:rPr>
-        <w:t>加载逻辑，加载</w:t>
-      </w:r>
-      <w:r>
-        <w:rPr>
-          <w:rFonts w:ascii="Times New Roman" w:eastAsia="宋体" w:hAnsi="Times New Roman" w:cs="Times New Roman" w:hint="eastAsia"/>
-        </w:rPr>
-        <w:t>ini</w:t>
-      </w:r>
-      <w:r>
-        <w:rPr>
-          <w:rFonts w:ascii="Times New Roman" w:eastAsia="宋体" w:hAnsi="Times New Roman" w:cs="Times New Roman" w:hint="eastAsia"/>
-        </w:rPr>
-        <w:t>不会再释放至游戏目录，新建国家等操作可以即时生效</w:t>
-      </w:r>
-    </w:p>
-    <w:p>
-      <w:pPr>
-        <w:pStyle w:val="a9"/>
-        <w:numPr>
-          <w:ilvl w:val="0"/>
-          <w:numId w:val="31"/>
-        </w:numPr>
-        <w:rPr>
-          <w:rFonts w:ascii="Times New Roman" w:eastAsia="宋体" w:hAnsi="Times New Roman" w:cs="Times New Roman"/>
-        </w:rPr>
-      </w:pPr>
-      <w:r>
-        <w:rPr>
-          <w:rFonts w:ascii="Times New Roman" w:eastAsia="宋体" w:hAnsi="Times New Roman" w:cs="Times New Roman" w:hint="eastAsia"/>
-        </w:rPr>
-        <w:t>ini [#include]</w:t>
-      </w:r>
-      <w:r>
-        <w:rPr>
-          <w:rFonts w:ascii="Times New Roman" w:eastAsia="宋体" w:hAnsi="Times New Roman" w:cs="Times New Roman" w:hint="eastAsia"/>
-        </w:rPr>
-        <w:t>逻辑现遵循</w:t>
-      </w:r>
-      <w:r>
-        <w:rPr>
-          <w:rFonts w:ascii="Times New Roman" w:eastAsia="宋体" w:hAnsi="Times New Roman" w:cs="Times New Roman" w:hint="eastAsia"/>
-        </w:rPr>
-        <w:t>ares</w:t>
-      </w:r>
-      <w:r>
-        <w:rPr>
-          <w:rFonts w:ascii="Times New Roman" w:eastAsia="宋体" w:hAnsi="Times New Roman" w:cs="Times New Roman" w:hint="eastAsia"/>
-        </w:rPr>
-        <w:t>规则，为广度优先遍历而非深度优先遍历</w:t>
-      </w:r>
-    </w:p>
-    <w:p>
-      <w:pPr>
-        <w:pStyle w:val="a9"/>
-        <w:numPr>
-          <w:ilvl w:val="0"/>
-          <w:numId w:val="31"/>
-        </w:numPr>
-        <w:rPr>
-          <w:rFonts w:ascii="Times New Roman" w:eastAsia="宋体" w:hAnsi="Times New Roman" w:cs="Times New Roman"/>
-        </w:rPr>
-      </w:pPr>
-      <w:r>
-        <w:rPr>
-          <w:rFonts w:ascii="Times New Roman" w:eastAsia="宋体" w:hAnsi="Times New Roman" w:cs="Times New Roman" w:hint="eastAsia"/>
-        </w:rPr>
-        <w:t>修复了触发编辑器的参数在部分情况下没有正确刷新的</w:t>
-      </w:r>
-      <w:r>
-        <w:rPr>
-          <w:rFonts w:ascii="Times New Roman" w:eastAsia="宋体" w:hAnsi="Times New Roman" w:cs="Times New Roman" w:hint="eastAsia"/>
-        </w:rPr>
-        <w:t>bug</w:t>
-      </w:r>
-    </w:p>
-    <w:p>
-      <w:pPr>
-        <w:pStyle w:val="a9"/>
-        <w:numPr>
-          <w:ilvl w:val="0"/>
-          <w:numId w:val="31"/>
-        </w:numPr>
-        <w:rPr>
-          <w:rFonts w:ascii="Times New Roman" w:eastAsia="宋体" w:hAnsi="Times New Roman" w:cs="Times New Roman"/>
-        </w:rPr>
-      </w:pPr>
-      <w:r>
-        <w:rPr>
-          <w:rFonts w:ascii="Times New Roman" w:eastAsia="宋体" w:hAnsi="Times New Roman" w:cs="Times New Roman" w:hint="eastAsia"/>
-        </w:rPr>
-        <w:t>支持拖拽面向的实时预览，详见</w:t>
-      </w:r>
-      <w:r>
-        <w:rPr>
-          <w:rFonts w:ascii="Times New Roman" w:eastAsia="宋体" w:hAnsi="Times New Roman" w:cs="Times New Roman" w:hint="eastAsia"/>
-        </w:rPr>
-        <w:t>ExtFacings.DragPreview</w:t>
-      </w:r>
-    </w:p>
-    <w:p>
-      <w:pPr>
-        <w:pStyle w:val="a9"/>
-        <w:numPr>
-          <w:ilvl w:val="0"/>
-          <w:numId w:val="31"/>
-        </w:numPr>
-        <w:rPr>
-          <w:rFonts w:ascii="Times New Roman" w:eastAsia="宋体" w:hAnsi="Times New Roman" w:cs="Times New Roman"/>
-        </w:rPr>
-      </w:pPr>
-      <w:r>
-        <w:rPr>
-          <w:rFonts w:ascii="Times New Roman" w:eastAsia="宋体" w:hAnsi="Times New Roman" w:cs="Times New Roman" w:hint="eastAsia"/>
-        </w:rPr>
-        <w:t>支持</w:t>
-      </w:r>
-      <w:r>
-        <w:rPr>
-          <w:rFonts w:ascii="Times New Roman" w:eastAsia="宋体" w:hAnsi="Times New Roman" w:cs="Times New Roman" w:hint="eastAsia"/>
-        </w:rPr>
-        <w:t>3x3REFINERY</w:t>
-      </w:r>
-      <w:r>
-        <w:rPr>
-          <w:rFonts w:ascii="Times New Roman" w:eastAsia="宋体" w:hAnsi="Times New Roman" w:cs="Times New Roman" w:hint="eastAsia"/>
-        </w:rPr>
-        <w:t>建筑格子的正确显示</w:t>
-      </w:r>
-    </w:p>
-    <w:p>
-      <w:pPr>
-        <w:pStyle w:val="a9"/>
-        <w:numPr>
-          <w:ilvl w:val="0"/>
-          <w:numId w:val="31"/>
-        </w:numPr>
-        <w:rPr>
-          <w:rFonts w:ascii="Times New Roman" w:eastAsia="宋体" w:hAnsi="Times New Roman" w:cs="Times New Roman"/>
-        </w:rPr>
-      </w:pPr>
-      <w:r>
-        <w:rPr>
-          <w:rFonts w:ascii="Times New Roman" w:eastAsia="宋体" w:hAnsi="Times New Roman" w:cs="Times New Roman" w:hint="eastAsia"/>
-        </w:rPr>
-        <w:t>修复地形对象的</w:t>
-      </w:r>
-      <w:r>
-        <w:rPr>
-          <w:rFonts w:ascii="Times New Roman" w:eastAsia="宋体" w:hAnsi="Times New Roman" w:cs="Times New Roman" w:hint="eastAsia"/>
-        </w:rPr>
-        <w:t>AlphaImage</w:t>
-      </w:r>
-      <w:r>
-        <w:rPr>
-          <w:rFonts w:ascii="Times New Roman" w:eastAsia="宋体" w:hAnsi="Times New Roman" w:cs="Times New Roman" w:hint="eastAsia"/>
-        </w:rPr>
-        <w:t>不受图层选项控制的</w:t>
-      </w:r>
-      <w:r>
-        <w:rPr>
-          <w:rFonts w:ascii="Times New Roman" w:eastAsia="宋体" w:hAnsi="Times New Roman" w:cs="Times New Roman" w:hint="eastAsia"/>
-        </w:rPr>
-        <w:t>bug</w:t>
-      </w:r>
-      <w:r>
-        <w:rPr>
-          <w:rFonts w:ascii="Times New Roman" w:eastAsia="宋体" w:hAnsi="Times New Roman" w:cs="Times New Roman" w:hint="eastAsia"/>
-        </w:rPr>
-        <w:t>，调整</w:t>
-      </w:r>
-      <w:r>
-        <w:rPr>
-          <w:rFonts w:ascii="Times New Roman" w:eastAsia="宋体" w:hAnsi="Times New Roman" w:cs="Times New Roman" w:hint="eastAsia"/>
-        </w:rPr>
-        <w:t>AlphaImage</w:t>
-      </w:r>
-      <w:r>
-        <w:rPr>
-          <w:rFonts w:ascii="Times New Roman" w:eastAsia="宋体" w:hAnsi="Times New Roman" w:cs="Times New Roman" w:hint="eastAsia"/>
-        </w:rPr>
-        <w:t>绘制顺序</w:t>
-      </w:r>
-    </w:p>
-    <w:p>
-      <w:pPr>
-        <w:pStyle w:val="a9"/>
-        <w:numPr>
-          <w:ilvl w:val="0"/>
-          <w:numId w:val="31"/>
-        </w:numPr>
-        <w:rPr>
-          <w:rFonts w:ascii="Times New Roman" w:eastAsia="宋体" w:hAnsi="Times New Roman" w:cs="Times New Roman"/>
-        </w:rPr>
-      </w:pPr>
-      <w:r>
-        <w:rPr>
-          <w:rFonts w:ascii="Times New Roman" w:eastAsia="宋体" w:hAnsi="Times New Roman" w:cs="Times New Roman" w:hint="eastAsia"/>
-        </w:rPr>
-        <w:lastRenderedPageBreak/>
         <w:t>修复点击全局搜索</w:t>
       </w:r>
       <w:r>
@@ -13780,6 +13814,7 @@
         <w:rPr>
           <w:rFonts w:ascii="Times New Roman" w:eastAsia="宋体" w:hAnsi="Times New Roman" w:cs="Times New Roman" w:hint="eastAsia"/>
         </w:rPr>
+        <w:lastRenderedPageBreak/>
         <w:t>新增</w:t>
       </w:r>
       <w:r>
@@ -13816,7 +13851,6 @@
         <w:rPr>
           <w:rFonts w:ascii="Times New Roman" w:eastAsia="宋体" w:hAnsi="Times New Roman" w:cs="Times New Roman" w:hint="eastAsia"/>
         </w:rPr>
-        <w:lastRenderedPageBreak/>
         <w:t>支持读取继承小节，详见</w:t>
       </w:r>
       <w:r>
@@ -43333,7 +43367,7 @@
         <v:path o:extrusionok="f" gradientshapeok="t" o:connecttype="rect"/>
         <o:lock v:ext="edit" aspectratio="t"/>
       </v:shapetype>
-      <v:shape id="_x0000_i1031" type="#_x0000_t75" style="width:11.65pt;height:11.65pt" o:bullet="t">
+      <v:shape id="_x0000_i1030" type="#_x0000_t75" style="width:11.65pt;height:11.65pt" o:bullet="t">
         <v:imagedata r:id="rId1" o:title="mso9A9A"/>
       </v:shape>
     </w:pict>

</xml_diff>

<commit_message>
fix damage fire bug, fix double release surface bug
</commit_message>
<xml_diff>
--- a/Supplementary/文档/FA2SP HDM Edition说明文档.docx
+++ b/Supplementary/文档/FA2SP HDM Edition说明文档.docx
@@ -167,7 +167,7 @@
           <w:rFonts w:ascii="宋体" w:eastAsia="宋体" w:hAnsi="宋体" w:hint="eastAsia"/>
           <w:sz w:val="24"/>
         </w:rPr>
-        <w:t>4</w:t>
+        <w:t>10</w:t>
       </w:r>
     </w:p>
     <w:p>
@@ -269,7 +269,7 @@
           <w:sz w:val="28"/>
           <w:szCs w:val="32"/>
         </w:rPr>
-        <w:t>0</w:t>
+        <w:t>10</w:t>
       </w:r>
       <w:r>
         <w:rPr>
@@ -279,298 +279,334 @@
           <w:sz w:val="28"/>
           <w:szCs w:val="32"/>
         </w:rPr>
-        <w:t>4</w:t>
-      </w:r>
-      <w:r>
-        <w:rPr>
-          <w:rFonts w:ascii="Times New Roman" w:eastAsia="宋体" w:hAnsi="Times New Roman" w:cs="Times New Roman" w:hint="eastAsia"/>
+        <w:t>)</w:t>
+      </w:r>
+    </w:p>
+    <w:p>
+      <w:pPr>
+        <w:pStyle w:val="a9"/>
+        <w:numPr>
+          <w:ilvl w:val="0"/>
+          <w:numId w:val="11"/>
+        </w:numPr>
+        <w:rPr>
+          <w:rFonts w:ascii="Times New Roman" w:eastAsia="宋体" w:hAnsi="Times New Roman" w:cs="Times New Roman"/>
+        </w:rPr>
+      </w:pPr>
+      <w:r>
+        <w:rPr>
+          <w:rFonts w:ascii="Times New Roman" w:eastAsia="宋体" w:hAnsi="Times New Roman" w:cs="Times New Roman" w:hint="eastAsia"/>
+        </w:rPr>
+        <w:t>允许设置下拉菜单是否自动搜索，若禁止，则需要按下</w:t>
+      </w:r>
+      <w:r>
+        <w:rPr>
+          <w:rFonts w:ascii="Times New Roman" w:eastAsia="宋体" w:hAnsi="Times New Roman" w:cs="Times New Roman" w:hint="eastAsia"/>
+        </w:rPr>
+        <w:t>Enter</w:t>
+      </w:r>
+      <w:r>
+        <w:rPr>
+          <w:rFonts w:ascii="Times New Roman" w:eastAsia="宋体" w:hAnsi="Times New Roman" w:cs="Times New Roman" w:hint="eastAsia"/>
+        </w:rPr>
+        <w:t>才会搜索。详见</w:t>
+      </w:r>
+      <w:r>
+        <w:rPr>
+          <w:rFonts w:ascii="Times New Roman" w:eastAsia="宋体" w:hAnsi="Times New Roman" w:cs="Times New Roman" w:hint="eastAsia"/>
+        </w:rPr>
+        <w:t>SearchCombobox.Disabled</w:t>
+      </w:r>
+      <w:r>
+        <w:rPr>
+          <w:rFonts w:ascii="Times New Roman" w:eastAsia="宋体" w:hAnsi="Times New Roman" w:cs="Times New Roman" w:hint="eastAsia"/>
+        </w:rPr>
+        <w:t>与</w:t>
+      </w:r>
+      <w:r>
+        <w:rPr>
+          <w:rFonts w:ascii="Times New Roman" w:eastAsia="宋体" w:hAnsi="Times New Roman" w:cs="Times New Roman" w:hint="eastAsia"/>
+        </w:rPr>
+        <w:t>SearchCombobox.AllowNonParams</w:t>
+      </w:r>
+    </w:p>
+    <w:p>
+      <w:pPr>
+        <w:pStyle w:val="a9"/>
+        <w:numPr>
+          <w:ilvl w:val="0"/>
+          <w:numId w:val="11"/>
+        </w:numPr>
+        <w:rPr>
+          <w:rFonts w:ascii="Times New Roman" w:eastAsia="宋体" w:hAnsi="Times New Roman" w:cs="Times New Roman"/>
+        </w:rPr>
+      </w:pPr>
+      <w:r>
+        <w:rPr>
+          <w:rFonts w:ascii="Times New Roman" w:eastAsia="宋体" w:hAnsi="Times New Roman" w:cs="Times New Roman" w:hint="eastAsia"/>
+        </w:rPr>
+        <w:t>修复使用</w:t>
+      </w:r>
+      <w:r>
+        <w:rPr>
+          <w:rFonts w:ascii="Times New Roman" w:eastAsia="宋体" w:hAnsi="Times New Roman" w:cs="Times New Roman" w:hint="eastAsia"/>
+        </w:rPr>
+        <w:t>FA2ForceSide</w:t>
+      </w:r>
+      <w:r>
+        <w:rPr>
+          <w:rFonts w:ascii="Times New Roman" w:eastAsia="宋体" w:hAnsi="Times New Roman" w:cs="Times New Roman" w:hint="eastAsia"/>
+        </w:rPr>
+        <w:t>时，非第一层分类无法按照</w:t>
+      </w:r>
+      <w:r>
+        <w:rPr>
+          <w:rFonts w:ascii="Times New Roman" w:eastAsia="宋体" w:hAnsi="Times New Roman" w:cs="Times New Roman" w:hint="eastAsia"/>
+        </w:rPr>
+        <w:t>[</w:t>
+      </w:r>
+      <w:r>
+        <w:rPr>
+          <w:rFonts w:ascii="Times New Roman" w:eastAsia="宋体" w:hAnsi="Times New Roman" w:cs="Times New Roman" w:hint="eastAsia"/>
+        </w:rPr>
+        <w:t>Sides</w:t>
+      </w:r>
+      <w:r>
+        <w:rPr>
+          <w:rFonts w:ascii="Times New Roman" w:eastAsia="宋体" w:hAnsi="Times New Roman" w:cs="Times New Roman" w:hint="eastAsia"/>
+        </w:rPr>
+        <w:t>]</w:t>
+      </w:r>
+      <w:r>
+        <w:rPr>
+          <w:rFonts w:ascii="Times New Roman" w:eastAsia="宋体" w:hAnsi="Times New Roman" w:cs="Times New Roman" w:hint="eastAsia"/>
+        </w:rPr>
+        <w:t>顺序进行排序的</w:t>
+      </w:r>
+      <w:r>
+        <w:rPr>
+          <w:rFonts w:ascii="Times New Roman" w:eastAsia="宋体" w:hAnsi="Times New Roman" w:cs="Times New Roman" w:hint="eastAsia"/>
+        </w:rPr>
+        <w:t>bug</w:t>
+      </w:r>
+    </w:p>
+    <w:p>
+      <w:pPr>
+        <w:pStyle w:val="a9"/>
+        <w:numPr>
+          <w:ilvl w:val="0"/>
+          <w:numId w:val="11"/>
+        </w:numPr>
+        <w:rPr>
+          <w:rFonts w:ascii="Times New Roman" w:eastAsia="宋体" w:hAnsi="Times New Roman" w:cs="Times New Roman"/>
+        </w:rPr>
+      </w:pPr>
+      <w:r>
+        <w:rPr>
+          <w:rFonts w:ascii="Times New Roman" w:eastAsia="宋体" w:hAnsi="Times New Roman" w:cs="Times New Roman" w:hint="eastAsia"/>
+        </w:rPr>
+        <w:t>修复在老系统上展开下拉菜单使用滚轮时，会错误触发文本框选择切换的</w:t>
+      </w:r>
+      <w:r>
+        <w:rPr>
+          <w:rFonts w:ascii="Times New Roman" w:eastAsia="宋体" w:hAnsi="Times New Roman" w:cs="Times New Roman" w:hint="eastAsia"/>
+        </w:rPr>
+        <w:t>bug</w:t>
+      </w:r>
+    </w:p>
+    <w:p>
+      <w:pPr>
+        <w:pStyle w:val="a9"/>
+        <w:numPr>
+          <w:ilvl w:val="0"/>
+          <w:numId w:val="11"/>
+        </w:numPr>
+        <w:rPr>
+          <w:rFonts w:ascii="Times New Roman" w:eastAsia="宋体" w:hAnsi="Times New Roman" w:cs="Times New Roman"/>
+        </w:rPr>
+      </w:pPr>
+      <w:r>
+        <w:rPr>
+          <w:rFonts w:ascii="Times New Roman" w:eastAsia="宋体" w:hAnsi="Times New Roman" w:cs="Times New Roman" w:hint="eastAsia"/>
+        </w:rPr>
+        <w:t>修复</w:t>
+      </w:r>
+      <w:r>
+        <w:rPr>
+          <w:rFonts w:ascii="Times New Roman" w:eastAsia="宋体" w:hAnsi="Times New Roman" w:cs="Times New Roman" w:hint="eastAsia"/>
+        </w:rPr>
+        <w:t>在使用了某些系统设置软件后，下拉菜单无法正确获取文本的</w:t>
+      </w:r>
+      <w:r>
+        <w:rPr>
+          <w:rFonts w:ascii="Times New Roman" w:eastAsia="宋体" w:hAnsi="Times New Roman" w:cs="Times New Roman" w:hint="eastAsia"/>
+        </w:rPr>
+        <w:t>bug</w:t>
+      </w:r>
+    </w:p>
+    <w:p>
+      <w:pPr>
+        <w:pStyle w:val="a9"/>
+        <w:numPr>
+          <w:ilvl w:val="0"/>
+          <w:numId w:val="11"/>
+        </w:numPr>
+        <w:rPr>
+          <w:rFonts w:ascii="Times New Roman" w:eastAsia="宋体" w:hAnsi="Times New Roman" w:cs="Times New Roman"/>
+        </w:rPr>
+      </w:pPr>
+      <w:r>
+        <w:rPr>
+          <w:rFonts w:ascii="Times New Roman" w:eastAsia="宋体" w:hAnsi="Times New Roman" w:cs="Times New Roman" w:hint="eastAsia"/>
+        </w:rPr>
+        <w:t>重写标签编辑器，支持查找引用、转到触发等特性，支持按名称进行排序，详见</w:t>
+      </w:r>
+      <w:r>
+        <w:rPr>
+          <w:rFonts w:ascii="Times New Roman" w:eastAsia="宋体" w:hAnsi="Times New Roman" w:cs="Times New Roman" w:hint="eastAsia"/>
+        </w:rPr>
+        <w:t>SortByLabelName.Tag</w:t>
+      </w:r>
+    </w:p>
+    <w:p>
+      <w:pPr>
+        <w:pStyle w:val="a9"/>
+        <w:numPr>
+          <w:ilvl w:val="0"/>
+          <w:numId w:val="11"/>
+        </w:numPr>
+        <w:rPr>
+          <w:rFonts w:ascii="Times New Roman" w:eastAsia="宋体" w:hAnsi="Times New Roman" w:cs="Times New Roman"/>
+        </w:rPr>
+      </w:pPr>
+      <w:r>
+        <w:rPr>
+          <w:rFonts w:ascii="Times New Roman" w:eastAsia="宋体" w:hAnsi="Times New Roman" w:cs="Times New Roman" w:hint="eastAsia"/>
+        </w:rPr>
+        <w:t>修复触发批量编辑器</w:t>
+      </w:r>
+      <w:r>
+        <w:rPr>
+          <w:rFonts w:ascii="Times New Roman" w:eastAsia="宋体" w:hAnsi="Times New Roman" w:cs="Times New Roman" w:hint="eastAsia"/>
+        </w:rPr>
+        <w:t>左侧</w:t>
+      </w:r>
+      <w:r>
+        <w:rPr>
+          <w:rFonts w:ascii="Times New Roman" w:eastAsia="宋体" w:hAnsi="Times New Roman" w:cs="Times New Roman" w:hint="eastAsia"/>
+        </w:rPr>
+        <w:t>列表排序</w:t>
+      </w:r>
+      <w:r>
+        <w:rPr>
+          <w:rFonts w:ascii="Times New Roman" w:eastAsia="宋体" w:hAnsi="Times New Roman" w:cs="Times New Roman" w:hint="eastAsia"/>
+        </w:rPr>
+        <w:t>bug</w:t>
+      </w:r>
+    </w:p>
+    <w:p>
+      <w:pPr>
+        <w:pStyle w:val="a9"/>
+        <w:numPr>
+          <w:ilvl w:val="0"/>
+          <w:numId w:val="11"/>
+        </w:numPr>
+        <w:rPr>
+          <w:rFonts w:ascii="Times New Roman" w:eastAsia="宋体" w:hAnsi="Times New Roman" w:cs="Times New Roman"/>
+        </w:rPr>
+      </w:pPr>
+      <w:r>
+        <w:rPr>
+          <w:rFonts w:ascii="Times New Roman" w:eastAsia="宋体" w:hAnsi="Times New Roman" w:cs="Times New Roman"/>
+        </w:rPr>
+        <w:t>I</w:t>
+      </w:r>
+      <w:r>
+        <w:rPr>
+          <w:rFonts w:ascii="Times New Roman" w:eastAsia="宋体" w:hAnsi="Times New Roman" w:cs="Times New Roman" w:hint="eastAsia"/>
+        </w:rPr>
+        <w:t>ni</w:t>
+      </w:r>
+      <w:r>
+        <w:rPr>
+          <w:rFonts w:ascii="Times New Roman" w:eastAsia="宋体" w:hAnsi="Times New Roman" w:cs="Times New Roman" w:hint="eastAsia"/>
+        </w:rPr>
+        <w:t>编辑器的“导入</w:t>
+      </w:r>
+      <w:r>
+        <w:rPr>
+          <w:rFonts w:ascii="Times New Roman" w:eastAsia="宋体" w:hAnsi="Times New Roman" w:cs="Times New Roman" w:hint="eastAsia"/>
+        </w:rPr>
+        <w:t>ini</w:t>
+      </w:r>
+      <w:r>
+        <w:rPr>
+          <w:rFonts w:ascii="Times New Roman" w:eastAsia="宋体" w:hAnsi="Times New Roman" w:cs="Times New Roman" w:hint="eastAsia"/>
+        </w:rPr>
+        <w:t>”窗口支持调整大小</w:t>
+      </w:r>
+    </w:p>
+    <w:p>
+      <w:pPr>
+        <w:pStyle w:val="a9"/>
+        <w:numPr>
+          <w:ilvl w:val="0"/>
+          <w:numId w:val="11"/>
+        </w:numPr>
+        <w:rPr>
+          <w:rFonts w:ascii="Times New Roman" w:eastAsia="宋体" w:hAnsi="Times New Roman" w:cs="Times New Roman"/>
+        </w:rPr>
+      </w:pPr>
+      <w:r>
+        <w:rPr>
+          <w:rFonts w:ascii="Times New Roman" w:eastAsia="宋体" w:hAnsi="Times New Roman" w:cs="Times New Roman" w:hint="eastAsia"/>
+        </w:rPr>
+        <w:t>修复部分建筑无法显示受损火焰、</w:t>
+      </w:r>
+      <w:r>
+        <w:rPr>
+          <w:rFonts w:ascii="Times New Roman" w:eastAsia="宋体" w:hAnsi="Times New Roman" w:cs="Times New Roman" w:hint="eastAsia"/>
+        </w:rPr>
+        <w:t>AlphaImage</w:t>
+      </w:r>
+      <w:r>
+        <w:rPr>
+          <w:rFonts w:ascii="Times New Roman" w:eastAsia="宋体" w:hAnsi="Times New Roman" w:cs="Times New Roman" w:hint="eastAsia"/>
+        </w:rPr>
+        <w:t>的</w:t>
+      </w:r>
+      <w:r>
+        <w:rPr>
+          <w:rFonts w:ascii="Times New Roman" w:eastAsia="宋体" w:hAnsi="Times New Roman" w:cs="Times New Roman" w:hint="eastAsia"/>
+        </w:rPr>
+        <w:t>bug</w:t>
+      </w:r>
+    </w:p>
+    <w:p>
+      <w:pPr>
+        <w:pStyle w:val="a9"/>
+        <w:numPr>
+          <w:ilvl w:val="0"/>
+          <w:numId w:val="10"/>
+        </w:numPr>
+        <w:rPr>
+          <w:rFonts w:ascii="Times New Roman" w:eastAsia="宋体" w:hAnsi="Times New Roman" w:cs="Times New Roman"/>
           <w:b/>
           <w:bCs/>
           <w:sz w:val="28"/>
           <w:szCs w:val="32"/>
         </w:rPr>
-        <w:t>)</w:t>
-      </w:r>
-    </w:p>
-    <w:p>
-      <w:pPr>
-        <w:pStyle w:val="a9"/>
-        <w:numPr>
-          <w:ilvl w:val="0"/>
-          <w:numId w:val="11"/>
-        </w:numPr>
-        <w:rPr>
-          <w:rFonts w:ascii="Times New Roman" w:eastAsia="宋体" w:hAnsi="Times New Roman" w:cs="Times New Roman"/>
-        </w:rPr>
-      </w:pPr>
-      <w:r>
-        <w:rPr>
-          <w:rFonts w:ascii="Times New Roman" w:eastAsia="宋体" w:hAnsi="Times New Roman" w:cs="Times New Roman" w:hint="eastAsia"/>
-        </w:rPr>
-        <w:t>允许设置下拉菜单是否自动搜索，若禁止，则需要按下</w:t>
-      </w:r>
-      <w:r>
-        <w:rPr>
-          <w:rFonts w:ascii="Times New Roman" w:eastAsia="宋体" w:hAnsi="Times New Roman" w:cs="Times New Roman" w:hint="eastAsia"/>
-        </w:rPr>
-        <w:t>Enter</w:t>
-      </w:r>
-      <w:r>
-        <w:rPr>
-          <w:rFonts w:ascii="Times New Roman" w:eastAsia="宋体" w:hAnsi="Times New Roman" w:cs="Times New Roman" w:hint="eastAsia"/>
-        </w:rPr>
-        <w:t>才会搜索。详见</w:t>
-      </w:r>
-      <w:r>
-        <w:rPr>
-          <w:rFonts w:ascii="Times New Roman" w:eastAsia="宋体" w:hAnsi="Times New Roman" w:cs="Times New Roman" w:hint="eastAsia"/>
-        </w:rPr>
-        <w:t>SearchCombobox.Disabled</w:t>
-      </w:r>
-      <w:r>
-        <w:rPr>
-          <w:rFonts w:ascii="Times New Roman" w:eastAsia="宋体" w:hAnsi="Times New Roman" w:cs="Times New Roman" w:hint="eastAsia"/>
-        </w:rPr>
-        <w:t>与</w:t>
-      </w:r>
-      <w:r>
-        <w:rPr>
-          <w:rFonts w:ascii="Times New Roman" w:eastAsia="宋体" w:hAnsi="Times New Roman" w:cs="Times New Roman" w:hint="eastAsia"/>
-        </w:rPr>
-        <w:t>SearchCombobox.AllowNonParams</w:t>
-      </w:r>
-    </w:p>
-    <w:p>
-      <w:pPr>
-        <w:pStyle w:val="a9"/>
-        <w:numPr>
-          <w:ilvl w:val="0"/>
-          <w:numId w:val="11"/>
-        </w:numPr>
-        <w:rPr>
-          <w:rFonts w:ascii="Times New Roman" w:eastAsia="宋体" w:hAnsi="Times New Roman" w:cs="Times New Roman"/>
-        </w:rPr>
-      </w:pPr>
-      <w:r>
-        <w:rPr>
-          <w:rFonts w:ascii="Times New Roman" w:eastAsia="宋体" w:hAnsi="Times New Roman" w:cs="Times New Roman" w:hint="eastAsia"/>
-        </w:rPr>
-        <w:t>修复使用</w:t>
-      </w:r>
-      <w:r>
-        <w:rPr>
-          <w:rFonts w:ascii="Times New Roman" w:eastAsia="宋体" w:hAnsi="Times New Roman" w:cs="Times New Roman" w:hint="eastAsia"/>
-        </w:rPr>
-        <w:t>FA2ForceSide</w:t>
-      </w:r>
-      <w:r>
-        <w:rPr>
-          <w:rFonts w:ascii="Times New Roman" w:eastAsia="宋体" w:hAnsi="Times New Roman" w:cs="Times New Roman" w:hint="eastAsia"/>
-        </w:rPr>
-        <w:t>时，非第一层分类无法按照</w:t>
-      </w:r>
-      <w:r>
-        <w:rPr>
-          <w:rFonts w:ascii="Times New Roman" w:eastAsia="宋体" w:hAnsi="Times New Roman" w:cs="Times New Roman" w:hint="eastAsia"/>
-        </w:rPr>
-        <w:t>[</w:t>
-      </w:r>
-      <w:r>
-        <w:rPr>
-          <w:rFonts w:ascii="Times New Roman" w:eastAsia="宋体" w:hAnsi="Times New Roman" w:cs="Times New Roman" w:hint="eastAsia"/>
-        </w:rPr>
-        <w:t>Sides</w:t>
-      </w:r>
-      <w:r>
-        <w:rPr>
-          <w:rFonts w:ascii="Times New Roman" w:eastAsia="宋体" w:hAnsi="Times New Roman" w:cs="Times New Roman" w:hint="eastAsia"/>
-        </w:rPr>
-        <w:t>]</w:t>
-      </w:r>
-      <w:r>
-        <w:rPr>
-          <w:rFonts w:ascii="Times New Roman" w:eastAsia="宋体" w:hAnsi="Times New Roman" w:cs="Times New Roman" w:hint="eastAsia"/>
-        </w:rPr>
-        <w:t>顺序进行排序的</w:t>
-      </w:r>
-      <w:r>
-        <w:rPr>
-          <w:rFonts w:ascii="Times New Roman" w:eastAsia="宋体" w:hAnsi="Times New Roman" w:cs="Times New Roman" w:hint="eastAsia"/>
-        </w:rPr>
-        <w:t>bug</w:t>
-      </w:r>
-    </w:p>
-    <w:p>
-      <w:pPr>
-        <w:pStyle w:val="a9"/>
-        <w:numPr>
-          <w:ilvl w:val="0"/>
-          <w:numId w:val="11"/>
-        </w:numPr>
-        <w:rPr>
-          <w:rFonts w:ascii="Times New Roman" w:eastAsia="宋体" w:hAnsi="Times New Roman" w:cs="Times New Roman"/>
-        </w:rPr>
-      </w:pPr>
-      <w:r>
-        <w:rPr>
-          <w:rFonts w:ascii="Times New Roman" w:eastAsia="宋体" w:hAnsi="Times New Roman" w:cs="Times New Roman" w:hint="eastAsia"/>
-        </w:rPr>
-        <w:t>修复在老系统上展开下拉菜单使用滚轮时，会错误触发文本框选择切换的</w:t>
-      </w:r>
-      <w:r>
-        <w:rPr>
-          <w:rFonts w:ascii="Times New Roman" w:eastAsia="宋体" w:hAnsi="Times New Roman" w:cs="Times New Roman" w:hint="eastAsia"/>
-        </w:rPr>
-        <w:t>bug</w:t>
-      </w:r>
-    </w:p>
-    <w:p>
-      <w:pPr>
-        <w:pStyle w:val="a9"/>
-        <w:numPr>
-          <w:ilvl w:val="0"/>
-          <w:numId w:val="11"/>
-        </w:numPr>
-        <w:rPr>
-          <w:rFonts w:ascii="Times New Roman" w:eastAsia="宋体" w:hAnsi="Times New Roman" w:cs="Times New Roman"/>
-        </w:rPr>
-      </w:pPr>
-      <w:r>
-        <w:rPr>
-          <w:rFonts w:ascii="Times New Roman" w:eastAsia="宋体" w:hAnsi="Times New Roman" w:cs="Times New Roman" w:hint="eastAsia"/>
-        </w:rPr>
-        <w:t>修复</w:t>
-      </w:r>
-      <w:r>
-        <w:rPr>
-          <w:rFonts w:ascii="Times New Roman" w:eastAsia="宋体" w:hAnsi="Times New Roman" w:cs="Times New Roman" w:hint="eastAsia"/>
-        </w:rPr>
-        <w:t>在使用了某些系统设置软件后，下拉菜单无法正确获取文本的</w:t>
-      </w:r>
-      <w:r>
-        <w:rPr>
-          <w:rFonts w:ascii="Times New Roman" w:eastAsia="宋体" w:hAnsi="Times New Roman" w:cs="Times New Roman" w:hint="eastAsia"/>
-        </w:rPr>
-        <w:t>bug</w:t>
-      </w:r>
-    </w:p>
-    <w:p>
-      <w:pPr>
-        <w:pStyle w:val="a9"/>
-        <w:numPr>
-          <w:ilvl w:val="0"/>
-          <w:numId w:val="11"/>
-        </w:numPr>
-        <w:rPr>
-          <w:rFonts w:ascii="Times New Roman" w:eastAsia="宋体" w:hAnsi="Times New Roman" w:cs="Times New Roman"/>
-        </w:rPr>
-      </w:pPr>
-      <w:r>
-        <w:rPr>
-          <w:rFonts w:ascii="Times New Roman" w:eastAsia="宋体" w:hAnsi="Times New Roman" w:cs="Times New Roman" w:hint="eastAsia"/>
-        </w:rPr>
-        <w:t>重写标签编辑器，支持查找引用、转到触发等特性，支持按名称进行排序，详见</w:t>
-      </w:r>
-      <w:r>
-        <w:rPr>
-          <w:rFonts w:ascii="Times New Roman" w:eastAsia="宋体" w:hAnsi="Times New Roman" w:cs="Times New Roman" w:hint="eastAsia"/>
-        </w:rPr>
-        <w:t>SortByLabelName.Tag</w:t>
-      </w:r>
-    </w:p>
-    <w:p>
-      <w:pPr>
-        <w:pStyle w:val="a9"/>
-        <w:numPr>
-          <w:ilvl w:val="0"/>
-          <w:numId w:val="11"/>
-        </w:numPr>
-        <w:rPr>
-          <w:rFonts w:ascii="Times New Roman" w:eastAsia="宋体" w:hAnsi="Times New Roman" w:cs="Times New Roman"/>
-        </w:rPr>
-      </w:pPr>
-      <w:r>
-        <w:rPr>
-          <w:rFonts w:ascii="Times New Roman" w:eastAsia="宋体" w:hAnsi="Times New Roman" w:cs="Times New Roman" w:hint="eastAsia"/>
-        </w:rPr>
-        <w:t>修复触发批量编辑器</w:t>
-      </w:r>
-      <w:r>
-        <w:rPr>
-          <w:rFonts w:ascii="Times New Roman" w:eastAsia="宋体" w:hAnsi="Times New Roman" w:cs="Times New Roman" w:hint="eastAsia"/>
-        </w:rPr>
-        <w:t>左侧</w:t>
-      </w:r>
-      <w:r>
-        <w:rPr>
-          <w:rFonts w:ascii="Times New Roman" w:eastAsia="宋体" w:hAnsi="Times New Roman" w:cs="Times New Roman" w:hint="eastAsia"/>
-        </w:rPr>
-        <w:t>列表排序</w:t>
-      </w:r>
-      <w:r>
-        <w:rPr>
-          <w:rFonts w:ascii="Times New Roman" w:eastAsia="宋体" w:hAnsi="Times New Roman" w:cs="Times New Roman" w:hint="eastAsia"/>
-        </w:rPr>
-        <w:t>bug</w:t>
-      </w:r>
-    </w:p>
-    <w:p>
-      <w:pPr>
-        <w:pStyle w:val="a9"/>
-        <w:numPr>
-          <w:ilvl w:val="0"/>
-          <w:numId w:val="11"/>
-        </w:numPr>
-        <w:rPr>
-          <w:rFonts w:ascii="Times New Roman" w:eastAsia="宋体" w:hAnsi="Times New Roman" w:cs="Times New Roman"/>
-        </w:rPr>
-      </w:pPr>
-      <w:r>
-        <w:rPr>
-          <w:rFonts w:ascii="Times New Roman" w:eastAsia="宋体" w:hAnsi="Times New Roman" w:cs="Times New Roman"/>
-        </w:rPr>
-        <w:t>I</w:t>
-      </w:r>
-      <w:r>
-        <w:rPr>
-          <w:rFonts w:ascii="Times New Roman" w:eastAsia="宋体" w:hAnsi="Times New Roman" w:cs="Times New Roman" w:hint="eastAsia"/>
-        </w:rPr>
-        <w:t>ni</w:t>
-      </w:r>
-      <w:r>
-        <w:rPr>
-          <w:rFonts w:ascii="Times New Roman" w:eastAsia="宋体" w:hAnsi="Times New Roman" w:cs="Times New Roman" w:hint="eastAsia"/>
-        </w:rPr>
-        <w:t>编辑器的“导入</w:t>
-      </w:r>
-      <w:r>
-        <w:rPr>
-          <w:rFonts w:ascii="Times New Roman" w:eastAsia="宋体" w:hAnsi="Times New Roman" w:cs="Times New Roman" w:hint="eastAsia"/>
-        </w:rPr>
-        <w:t>ini</w:t>
-      </w:r>
-      <w:r>
-        <w:rPr>
-          <w:rFonts w:ascii="Times New Roman" w:eastAsia="宋体" w:hAnsi="Times New Roman" w:cs="Times New Roman" w:hint="eastAsia"/>
-        </w:rPr>
-        <w:t>”窗口支持调整大小</w:t>
-      </w:r>
-    </w:p>
-    <w:p>
-      <w:pPr>
-        <w:pStyle w:val="a9"/>
-        <w:numPr>
-          <w:ilvl w:val="0"/>
-          <w:numId w:val="10"/>
-        </w:numPr>
-        <w:rPr>
-          <w:rFonts w:ascii="Times New Roman" w:eastAsia="宋体" w:hAnsi="Times New Roman" w:cs="Times New Roman"/>
+      </w:pPr>
+      <w:r>
+        <w:rPr>
+          <w:rFonts w:ascii="Times New Roman" w:eastAsia="宋体" w:hAnsi="Times New Roman" w:cs="Times New Roman" w:hint="eastAsia"/>
           <w:b/>
           <w:bCs/>
           <w:sz w:val="28"/>
           <w:szCs w:val="32"/>
         </w:rPr>
-      </w:pPr>
+        <w:t>1.4.2 (2026.04.</w:t>
+      </w:r>
       <w:r>
         <w:rPr>
           <w:rFonts w:ascii="Times New Roman" w:eastAsia="宋体" w:hAnsi="Times New Roman" w:cs="Times New Roman" w:hint="eastAsia"/>
@@ -579,7 +615,7 @@
           <w:sz w:val="28"/>
           <w:szCs w:val="32"/>
         </w:rPr>
-        <w:t>1.4.2 (2026.04.</w:t>
+        <w:t>2</w:t>
       </w:r>
       <w:r>
         <w:rPr>
@@ -589,7 +625,7 @@
           <w:sz w:val="28"/>
           <w:szCs w:val="32"/>
         </w:rPr>
-        <w:t>2</w:t>
+        <w:t>8</w:t>
       </w:r>
       <w:r>
         <w:rPr>
@@ -599,893 +635,893 @@
           <w:sz w:val="28"/>
           <w:szCs w:val="32"/>
         </w:rPr>
-        <w:t>8</w:t>
-      </w:r>
-      <w:r>
-        <w:rPr>
-          <w:rFonts w:ascii="Times New Roman" w:eastAsia="宋体" w:hAnsi="Times New Roman" w:cs="Times New Roman" w:hint="eastAsia"/>
+        <w:t>)</w:t>
+      </w:r>
+    </w:p>
+    <w:p>
+      <w:pPr>
+        <w:pStyle w:val="a9"/>
+        <w:numPr>
+          <w:ilvl w:val="0"/>
+          <w:numId w:val="47"/>
+        </w:numPr>
+        <w:rPr>
+          <w:rFonts w:ascii="Times New Roman" w:eastAsia="宋体" w:hAnsi="Times New Roman" w:cs="Times New Roman"/>
+        </w:rPr>
+      </w:pPr>
+      <w:r>
+        <w:rPr>
+          <w:rFonts w:ascii="Times New Roman" w:eastAsia="宋体" w:hAnsi="Times New Roman" w:cs="Times New Roman" w:hint="eastAsia"/>
+        </w:rPr>
+        <w:t>修复当副屏在主屏幕左侧或上侧时的显示</w:t>
+      </w:r>
+      <w:r>
+        <w:rPr>
+          <w:rFonts w:ascii="Times New Roman" w:eastAsia="宋体" w:hAnsi="Times New Roman" w:cs="Times New Roman" w:hint="eastAsia"/>
+        </w:rPr>
+        <w:t>bug</w:t>
+      </w:r>
+    </w:p>
+    <w:p>
+      <w:pPr>
+        <w:pStyle w:val="a9"/>
+        <w:numPr>
+          <w:ilvl w:val="0"/>
+          <w:numId w:val="47"/>
+        </w:numPr>
+        <w:rPr>
+          <w:rFonts w:ascii="Times New Roman" w:eastAsia="宋体" w:hAnsi="Times New Roman" w:cs="Times New Roman"/>
+        </w:rPr>
+      </w:pPr>
+      <w:r>
+        <w:rPr>
+          <w:rFonts w:ascii="Times New Roman" w:eastAsia="宋体" w:hAnsi="Times New Roman" w:cs="Times New Roman" w:hint="eastAsia"/>
+        </w:rPr>
+        <w:t>自定义</w:t>
+      </w:r>
+      <w:r>
+        <w:rPr>
+          <w:rFonts w:ascii="Times New Roman" w:eastAsia="宋体" w:hAnsi="Times New Roman" w:cs="Times New Roman" w:hint="eastAsia"/>
+        </w:rPr>
+        <w:t>LAT</w:t>
+      </w:r>
+      <w:r>
+        <w:rPr>
+          <w:rFonts w:ascii="Times New Roman" w:eastAsia="宋体" w:hAnsi="Times New Roman" w:cs="Times New Roman" w:hint="eastAsia"/>
+        </w:rPr>
+        <w:t>支持指定</w:t>
+      </w:r>
+      <w:r>
+        <w:rPr>
+          <w:rFonts w:ascii="Times New Roman" w:eastAsia="宋体" w:hAnsi="Times New Roman" w:cs="Times New Roman" w:hint="eastAsia"/>
+        </w:rPr>
+        <w:t>ClearTile</w:t>
+      </w:r>
+      <w:r>
+        <w:rPr>
+          <w:rFonts w:ascii="Times New Roman" w:eastAsia="宋体" w:hAnsi="Times New Roman" w:cs="Times New Roman" w:hint="eastAsia"/>
+        </w:rPr>
+        <w:t>，详见</w:t>
+      </w:r>
+      <w:r>
+        <w:rPr>
+          <w:rFonts w:ascii="Times New Roman" w:eastAsia="宋体" w:hAnsi="Times New Roman" w:cs="Times New Roman" w:hint="eastAsia"/>
+        </w:rPr>
+        <w:t>[LATGroups]</w:t>
+      </w:r>
+    </w:p>
+    <w:p>
+      <w:pPr>
+        <w:pStyle w:val="a9"/>
+        <w:numPr>
+          <w:ilvl w:val="0"/>
+          <w:numId w:val="47"/>
+        </w:numPr>
+        <w:rPr>
+          <w:rFonts w:ascii="Times New Roman" w:eastAsia="宋体" w:hAnsi="Times New Roman" w:cs="Times New Roman"/>
+        </w:rPr>
+      </w:pPr>
+      <w:r>
+        <w:rPr>
+          <w:rFonts w:ascii="Times New Roman" w:eastAsia="宋体" w:hAnsi="Times New Roman" w:cs="Times New Roman" w:hint="eastAsia"/>
+        </w:rPr>
+        <w:t>修复撤销、重做等菜单选项无效的</w:t>
+      </w:r>
+      <w:r>
+        <w:rPr>
+          <w:rFonts w:ascii="Times New Roman" w:eastAsia="宋体" w:hAnsi="Times New Roman" w:cs="Times New Roman" w:hint="eastAsia"/>
+        </w:rPr>
+        <w:t>bug</w:t>
+      </w:r>
+    </w:p>
+    <w:p>
+      <w:pPr>
+        <w:pStyle w:val="a9"/>
+        <w:numPr>
+          <w:ilvl w:val="0"/>
+          <w:numId w:val="47"/>
+        </w:numPr>
+        <w:rPr>
+          <w:rFonts w:ascii="Times New Roman" w:eastAsia="宋体" w:hAnsi="Times New Roman" w:cs="Times New Roman"/>
+        </w:rPr>
+      </w:pPr>
+      <w:r>
+        <w:rPr>
+          <w:rFonts w:ascii="Times New Roman" w:eastAsia="宋体" w:hAnsi="Times New Roman" w:cs="Times New Roman" w:hint="eastAsia"/>
+        </w:rPr>
+        <w:t>优化单位渲染顺序，优化了较大单位被地形遮挡的问题</w:t>
+      </w:r>
+    </w:p>
+    <w:p>
+      <w:pPr>
+        <w:pStyle w:val="a9"/>
+        <w:numPr>
+          <w:ilvl w:val="0"/>
+          <w:numId w:val="47"/>
+        </w:numPr>
+        <w:rPr>
+          <w:rFonts w:ascii="Times New Roman" w:eastAsia="宋体" w:hAnsi="Times New Roman" w:cs="Times New Roman"/>
+        </w:rPr>
+      </w:pPr>
+      <w:r>
+        <w:rPr>
+          <w:rFonts w:ascii="Times New Roman" w:eastAsia="宋体" w:hAnsi="Times New Roman" w:cs="Times New Roman" w:hint="eastAsia"/>
+        </w:rPr>
+        <w:t>修复单位与建筑重叠时，单位</w:t>
+      </w:r>
+      <w:r>
+        <w:rPr>
+          <w:rFonts w:ascii="Times New Roman" w:eastAsia="宋体" w:hAnsi="Times New Roman" w:cs="Times New Roman" w:hint="eastAsia"/>
+        </w:rPr>
+        <w:t>被遮挡</w:t>
+      </w:r>
+      <w:r>
+        <w:rPr>
+          <w:rFonts w:ascii="Times New Roman" w:eastAsia="宋体" w:hAnsi="Times New Roman" w:cs="Times New Roman" w:hint="eastAsia"/>
+        </w:rPr>
+        <w:t>的</w:t>
+      </w:r>
+      <w:r>
+        <w:rPr>
+          <w:rFonts w:ascii="Times New Roman" w:eastAsia="宋体" w:hAnsi="Times New Roman" w:cs="Times New Roman" w:hint="eastAsia"/>
+        </w:rPr>
+        <w:t>bug</w:t>
+      </w:r>
+    </w:p>
+    <w:p>
+      <w:pPr>
+        <w:pStyle w:val="a9"/>
+        <w:numPr>
+          <w:ilvl w:val="0"/>
+          <w:numId w:val="47"/>
+        </w:numPr>
+        <w:rPr>
+          <w:rFonts w:ascii="Times New Roman" w:eastAsia="宋体" w:hAnsi="Times New Roman" w:cs="Times New Roman"/>
+        </w:rPr>
+      </w:pPr>
+      <w:r>
+        <w:rPr>
+          <w:rFonts w:ascii="Times New Roman" w:eastAsia="宋体" w:hAnsi="Times New Roman" w:cs="Times New Roman" w:hint="eastAsia"/>
+        </w:rPr>
+        <w:t>可以正确显示驻军建筑的动画</w:t>
+      </w:r>
+    </w:p>
+    <w:p>
+      <w:pPr>
+        <w:pStyle w:val="a9"/>
+        <w:numPr>
+          <w:ilvl w:val="0"/>
+          <w:numId w:val="47"/>
+        </w:numPr>
+        <w:rPr>
+          <w:rFonts w:ascii="Times New Roman" w:eastAsia="宋体" w:hAnsi="Times New Roman" w:cs="Times New Roman"/>
+        </w:rPr>
+      </w:pPr>
+      <w:r>
+        <w:rPr>
+          <w:rFonts w:ascii="Times New Roman" w:eastAsia="宋体" w:hAnsi="Times New Roman" w:cs="Times New Roman" w:hint="eastAsia"/>
+        </w:rPr>
+        <w:t>可以正确显示生化反应炉的动画，计算初始乘员带来的发电量</w:t>
+      </w:r>
+    </w:p>
+    <w:p>
+      <w:pPr>
+        <w:pStyle w:val="a9"/>
+        <w:numPr>
+          <w:ilvl w:val="0"/>
+          <w:numId w:val="47"/>
+        </w:numPr>
+        <w:rPr>
+          <w:rFonts w:ascii="Times New Roman" w:eastAsia="宋体" w:hAnsi="Times New Roman" w:cs="Times New Roman"/>
+        </w:rPr>
+      </w:pPr>
+      <w:r>
+        <w:rPr>
+          <w:rFonts w:ascii="Times New Roman" w:eastAsia="宋体" w:hAnsi="Times New Roman" w:cs="Times New Roman" w:hint="eastAsia"/>
+        </w:rPr>
+        <w:t>修复撤销重做时没有更新灯光建筑的</w:t>
+      </w:r>
+      <w:r>
+        <w:rPr>
+          <w:rFonts w:ascii="Times New Roman" w:eastAsia="宋体" w:hAnsi="Times New Roman" w:cs="Times New Roman" w:hint="eastAsia"/>
+        </w:rPr>
+        <w:t>bug</w:t>
+      </w:r>
+    </w:p>
+    <w:p>
+      <w:pPr>
+        <w:pStyle w:val="a9"/>
+        <w:numPr>
+          <w:ilvl w:val="0"/>
+          <w:numId w:val="47"/>
+        </w:numPr>
+        <w:rPr>
+          <w:rFonts w:ascii="Times New Roman" w:eastAsia="宋体" w:hAnsi="Times New Roman" w:cs="Times New Roman"/>
+        </w:rPr>
+      </w:pPr>
+      <w:r>
+        <w:rPr>
+          <w:rFonts w:ascii="Times New Roman" w:eastAsia="宋体" w:hAnsi="Times New Roman" w:cs="Times New Roman" w:hint="eastAsia"/>
+        </w:rPr>
+        <w:t>显著</w:t>
+      </w:r>
+      <w:r>
+        <w:rPr>
+          <w:rFonts w:ascii="Times New Roman" w:eastAsia="宋体" w:hAnsi="Times New Roman" w:cs="Times New Roman" w:hint="eastAsia"/>
+        </w:rPr>
+        <w:t>提升</w:t>
+      </w:r>
+      <w:r>
+        <w:rPr>
+          <w:rFonts w:ascii="Times New Roman" w:eastAsia="宋体" w:hAnsi="Times New Roman" w:cs="Times New Roman" w:hint="eastAsia"/>
+        </w:rPr>
+        <w:t>绘图效率</w:t>
+      </w:r>
+      <w:r>
+        <w:rPr>
+          <w:rFonts w:ascii="Times New Roman" w:eastAsia="宋体" w:hAnsi="Times New Roman" w:cs="Times New Roman" w:hint="eastAsia"/>
+        </w:rPr>
+        <w:t>，优化光照沙盒效率</w:t>
+      </w:r>
+    </w:p>
+    <w:p>
+      <w:pPr>
+        <w:pStyle w:val="a9"/>
+        <w:numPr>
+          <w:ilvl w:val="0"/>
+          <w:numId w:val="47"/>
+        </w:numPr>
+        <w:rPr>
+          <w:rFonts w:ascii="Times New Roman" w:eastAsia="宋体" w:hAnsi="Times New Roman" w:cs="Times New Roman"/>
+        </w:rPr>
+      </w:pPr>
+      <w:r>
+        <w:rPr>
+          <w:rFonts w:ascii="Times New Roman" w:eastAsia="宋体" w:hAnsi="Times New Roman" w:cs="Times New Roman" w:hint="eastAsia"/>
+        </w:rPr>
+        <w:t>显著提升触发编辑器、小队编辑器等编辑器的效率</w:t>
+      </w:r>
+    </w:p>
+    <w:p>
+      <w:pPr>
+        <w:pStyle w:val="a9"/>
+        <w:numPr>
+          <w:ilvl w:val="0"/>
+          <w:numId w:val="47"/>
+        </w:numPr>
+        <w:rPr>
+          <w:rFonts w:ascii="Times New Roman" w:eastAsia="宋体" w:hAnsi="Times New Roman" w:cs="Times New Roman"/>
+        </w:rPr>
+      </w:pPr>
+      <w:r>
+        <w:rPr>
+          <w:rFonts w:ascii="Times New Roman" w:eastAsia="宋体" w:hAnsi="Times New Roman" w:cs="Times New Roman" w:hint="eastAsia"/>
+        </w:rPr>
+        <w:t>修复触发列表等列表选中父节点并右键选择“在本组创建触发”时，无法正确为触发添加前缀的</w:t>
+      </w:r>
+      <w:r>
+        <w:rPr>
+          <w:rFonts w:ascii="Times New Roman" w:eastAsia="宋体" w:hAnsi="Times New Roman" w:cs="Times New Roman" w:hint="eastAsia"/>
+        </w:rPr>
+        <w:t>bug</w:t>
+      </w:r>
+    </w:p>
+    <w:p>
+      <w:pPr>
+        <w:pStyle w:val="a9"/>
+        <w:numPr>
+          <w:ilvl w:val="0"/>
+          <w:numId w:val="47"/>
+        </w:numPr>
+        <w:rPr>
+          <w:rFonts w:ascii="Times New Roman" w:eastAsia="宋体" w:hAnsi="Times New Roman" w:cs="Times New Roman"/>
+        </w:rPr>
+      </w:pPr>
+      <w:r>
+        <w:rPr>
+          <w:rFonts w:ascii="Times New Roman" w:eastAsia="宋体" w:hAnsi="Times New Roman" w:cs="Times New Roman" w:hint="eastAsia"/>
+        </w:rPr>
+        <w:t>修复点击触发编辑器事件和行为列表的空白部分，会将当前选项切换至最后一个的</w:t>
+      </w:r>
+      <w:r>
+        <w:rPr>
+          <w:rFonts w:ascii="Times New Roman" w:eastAsia="宋体" w:hAnsi="Times New Roman" w:cs="Times New Roman" w:hint="eastAsia"/>
+        </w:rPr>
+        <w:t>bug</w:t>
+      </w:r>
+    </w:p>
+    <w:p>
+      <w:pPr>
+        <w:pStyle w:val="a9"/>
+        <w:numPr>
+          <w:ilvl w:val="0"/>
+          <w:numId w:val="47"/>
+        </w:numPr>
+        <w:rPr>
+          <w:rFonts w:ascii="Times New Roman" w:eastAsia="宋体" w:hAnsi="Times New Roman" w:cs="Times New Roman"/>
+        </w:rPr>
+      </w:pPr>
+      <w:r>
+        <w:rPr>
+          <w:rFonts w:ascii="Times New Roman" w:eastAsia="宋体" w:hAnsi="Times New Roman" w:cs="Times New Roman" w:hint="eastAsia"/>
+        </w:rPr>
+        <w:t>修复当隧道信息不正确时崩溃的</w:t>
+      </w:r>
+      <w:r>
+        <w:rPr>
+          <w:rFonts w:ascii="Times New Roman" w:eastAsia="宋体" w:hAnsi="Times New Roman" w:cs="Times New Roman" w:hint="eastAsia"/>
+        </w:rPr>
+        <w:t>bug</w:t>
+      </w:r>
+    </w:p>
+    <w:p>
+      <w:pPr>
+        <w:pStyle w:val="a9"/>
+        <w:numPr>
+          <w:ilvl w:val="0"/>
+          <w:numId w:val="47"/>
+        </w:numPr>
+        <w:rPr>
+          <w:rFonts w:ascii="Times New Roman" w:eastAsia="宋体" w:hAnsi="Times New Roman" w:cs="Times New Roman"/>
+        </w:rPr>
+      </w:pPr>
+      <w:r>
+        <w:rPr>
+          <w:rFonts w:ascii="Times New Roman" w:eastAsia="宋体" w:hAnsi="Times New Roman" w:cs="Times New Roman" w:hint="eastAsia"/>
+        </w:rPr>
+        <w:lastRenderedPageBreak/>
+        <w:t>修复在地形浏览器中切换过多次后程序无响应的</w:t>
+      </w:r>
+      <w:r>
+        <w:rPr>
+          <w:rFonts w:ascii="Times New Roman" w:eastAsia="宋体" w:hAnsi="Times New Roman" w:cs="Times New Roman" w:hint="eastAsia"/>
+        </w:rPr>
+        <w:t>bug</w:t>
+      </w:r>
+    </w:p>
+    <w:p>
+      <w:pPr>
+        <w:pStyle w:val="a9"/>
+        <w:numPr>
+          <w:ilvl w:val="0"/>
+          <w:numId w:val="47"/>
+        </w:numPr>
+        <w:rPr>
+          <w:rFonts w:ascii="Times New Roman" w:eastAsia="宋体" w:hAnsi="Times New Roman" w:cs="Times New Roman"/>
+        </w:rPr>
+      </w:pPr>
+      <w:r>
+        <w:rPr>
+          <w:rFonts w:ascii="Times New Roman" w:eastAsia="宋体" w:hAnsi="Times New Roman" w:cs="Times New Roman" w:hint="eastAsia"/>
+        </w:rPr>
+        <w:t>显著</w:t>
+      </w:r>
+      <w:r>
+        <w:rPr>
+          <w:rFonts w:ascii="Times New Roman" w:eastAsia="宋体" w:hAnsi="Times New Roman" w:cs="Times New Roman" w:hint="eastAsia"/>
+        </w:rPr>
+        <w:t>优化</w:t>
+      </w:r>
+      <w:r>
+        <w:rPr>
+          <w:rFonts w:ascii="Times New Roman" w:eastAsia="宋体" w:hAnsi="Times New Roman" w:cs="Times New Roman" w:hint="eastAsia"/>
+        </w:rPr>
+        <w:t>使用新的</w:t>
+      </w:r>
+      <w:r>
+        <w:rPr>
+          <w:rFonts w:ascii="Times New Roman" w:eastAsia="宋体" w:hAnsi="Times New Roman" w:cs="Times New Roman" w:hint="eastAsia"/>
+        </w:rPr>
+        <w:t>MIX</w:t>
+      </w:r>
+      <w:r>
+        <w:rPr>
+          <w:rFonts w:ascii="Times New Roman" w:eastAsia="宋体" w:hAnsi="Times New Roman" w:cs="Times New Roman" w:hint="eastAsia"/>
+        </w:rPr>
+        <w:t>加载器时的</w:t>
+      </w:r>
+      <w:r>
+        <w:rPr>
+          <w:rFonts w:ascii="Times New Roman" w:eastAsia="宋体" w:hAnsi="Times New Roman" w:cs="Times New Roman" w:hint="eastAsia"/>
+        </w:rPr>
+        <w:t>启动加载时间</w:t>
+      </w:r>
+    </w:p>
+    <w:p>
+      <w:pPr>
+        <w:pStyle w:val="a9"/>
+        <w:numPr>
+          <w:ilvl w:val="0"/>
+          <w:numId w:val="47"/>
+        </w:numPr>
+        <w:rPr>
+          <w:rFonts w:ascii="Times New Roman" w:eastAsia="宋体" w:hAnsi="Times New Roman" w:cs="Times New Roman"/>
+        </w:rPr>
+      </w:pPr>
+      <w:r>
+        <w:rPr>
+          <w:rFonts w:ascii="Times New Roman" w:eastAsia="宋体" w:hAnsi="Times New Roman" w:cs="Times New Roman" w:hint="eastAsia"/>
+        </w:rPr>
+        <w:t>优化</w:t>
+      </w:r>
+      <w:r>
+        <w:rPr>
+          <w:rFonts w:ascii="Times New Roman" w:eastAsia="宋体" w:hAnsi="Times New Roman" w:cs="Times New Roman" w:hint="eastAsia"/>
+        </w:rPr>
+        <w:t>VXL</w:t>
+      </w:r>
+      <w:r>
+        <w:rPr>
+          <w:rFonts w:ascii="Times New Roman" w:eastAsia="宋体" w:hAnsi="Times New Roman" w:cs="Times New Roman" w:hint="eastAsia"/>
+        </w:rPr>
+        <w:t>单位</w:t>
+      </w:r>
+      <w:r>
+        <w:rPr>
+          <w:rFonts w:ascii="Times New Roman" w:eastAsia="宋体" w:hAnsi="Times New Roman" w:cs="Times New Roman" w:hint="eastAsia"/>
+        </w:rPr>
+        <w:t>加载</w:t>
+      </w:r>
+      <w:r>
+        <w:rPr>
+          <w:rFonts w:ascii="Times New Roman" w:eastAsia="宋体" w:hAnsi="Times New Roman" w:cs="Times New Roman" w:hint="eastAsia"/>
+        </w:rPr>
+        <w:t>时间</w:t>
+      </w:r>
+    </w:p>
+    <w:p>
+      <w:pPr>
+        <w:pStyle w:val="a9"/>
+        <w:numPr>
+          <w:ilvl w:val="0"/>
+          <w:numId w:val="47"/>
+        </w:numPr>
+        <w:rPr>
+          <w:rFonts w:ascii="Times New Roman" w:eastAsia="宋体" w:hAnsi="Times New Roman" w:cs="Times New Roman"/>
+        </w:rPr>
+      </w:pPr>
+      <w:r>
+        <w:rPr>
+          <w:rFonts w:ascii="Times New Roman" w:eastAsia="宋体" w:hAnsi="Times New Roman" w:cs="Times New Roman" w:hint="eastAsia"/>
+        </w:rPr>
+        <w:t>修复当地图存在超出有效索引的单元格时，加载地图时可能崩溃的</w:t>
+      </w:r>
+      <w:r>
+        <w:rPr>
+          <w:rFonts w:ascii="Times New Roman" w:eastAsia="宋体" w:hAnsi="Times New Roman" w:cs="Times New Roman" w:hint="eastAsia"/>
+        </w:rPr>
+        <w:t>bug</w:t>
+      </w:r>
+    </w:p>
+    <w:p>
+      <w:pPr>
+        <w:pStyle w:val="a9"/>
+        <w:numPr>
+          <w:ilvl w:val="0"/>
+          <w:numId w:val="47"/>
+        </w:numPr>
+        <w:rPr>
+          <w:rFonts w:ascii="Times New Roman" w:eastAsia="宋体" w:hAnsi="Times New Roman" w:cs="Times New Roman"/>
+        </w:rPr>
+      </w:pPr>
+      <w:r>
+        <w:rPr>
+          <w:rFonts w:ascii="Times New Roman" w:eastAsia="宋体" w:hAnsi="Times New Roman" w:cs="Times New Roman" w:hint="eastAsia"/>
+        </w:rPr>
+        <w:t>修复双击触发编辑器行为列表的上移下移按钮时不响应的</w:t>
+      </w:r>
+      <w:r>
+        <w:rPr>
+          <w:rFonts w:ascii="Times New Roman" w:eastAsia="宋体" w:hAnsi="Times New Roman" w:cs="Times New Roman" w:hint="eastAsia"/>
+        </w:rPr>
+        <w:t>bug</w:t>
+      </w:r>
+    </w:p>
+    <w:p>
+      <w:pPr>
+        <w:pStyle w:val="a9"/>
+        <w:numPr>
+          <w:ilvl w:val="0"/>
+          <w:numId w:val="47"/>
+        </w:numPr>
+        <w:rPr>
+          <w:rFonts w:ascii="Times New Roman" w:eastAsia="宋体" w:hAnsi="Times New Roman" w:cs="Times New Roman"/>
+        </w:rPr>
+      </w:pPr>
+      <w:r>
+        <w:rPr>
+          <w:rFonts w:ascii="Times New Roman" w:eastAsia="宋体" w:hAnsi="Times New Roman" w:cs="Times New Roman" w:hint="eastAsia"/>
+        </w:rPr>
+        <w:t>优化覆盖物加载策略，即使素材文件内部标记有误，也会加载前一半图像</w:t>
+      </w:r>
+    </w:p>
+    <w:p>
+      <w:pPr>
+        <w:pStyle w:val="a9"/>
+        <w:numPr>
+          <w:ilvl w:val="0"/>
+          <w:numId w:val="47"/>
+        </w:numPr>
+        <w:rPr>
+          <w:rFonts w:ascii="Times New Roman" w:eastAsia="宋体" w:hAnsi="Times New Roman" w:cs="Times New Roman"/>
+        </w:rPr>
+      </w:pPr>
+      <w:r>
+        <w:rPr>
+          <w:rFonts w:ascii="Times New Roman" w:eastAsia="宋体" w:hAnsi="Times New Roman" w:cs="Times New Roman" w:hint="eastAsia"/>
+        </w:rPr>
+        <w:t>修复部分情况下随机放置对象不显示图标的</w:t>
+      </w:r>
+      <w:r>
+        <w:rPr>
+          <w:rFonts w:ascii="Times New Roman" w:eastAsia="宋体" w:hAnsi="Times New Roman" w:cs="Times New Roman" w:hint="eastAsia"/>
+        </w:rPr>
+        <w:t>bug</w:t>
+      </w:r>
+    </w:p>
+    <w:p>
+      <w:pPr>
+        <w:pStyle w:val="a9"/>
+        <w:numPr>
+          <w:ilvl w:val="0"/>
+          <w:numId w:val="47"/>
+        </w:numPr>
+        <w:rPr>
+          <w:rFonts w:ascii="Times New Roman" w:eastAsia="宋体" w:hAnsi="Times New Roman" w:cs="Times New Roman"/>
+        </w:rPr>
+      </w:pPr>
+      <w:r>
+        <w:rPr>
+          <w:rFonts w:ascii="Times New Roman" w:eastAsia="宋体" w:hAnsi="Times New Roman" w:cs="Times New Roman" w:hint="eastAsia"/>
+        </w:rPr>
+        <w:t>为所属方窗口补充缺失的翻译</w:t>
+      </w:r>
+    </w:p>
+    <w:p>
+      <w:pPr>
+        <w:pStyle w:val="a9"/>
+        <w:numPr>
+          <w:ilvl w:val="0"/>
+          <w:numId w:val="47"/>
+        </w:numPr>
+        <w:rPr>
+          <w:rFonts w:ascii="Times New Roman" w:eastAsia="宋体" w:hAnsi="Times New Roman" w:cs="Times New Roman"/>
+        </w:rPr>
+      </w:pPr>
+      <w:r>
+        <w:rPr>
+          <w:rFonts w:ascii="Times New Roman" w:eastAsia="宋体" w:hAnsi="Times New Roman" w:cs="Times New Roman" w:hint="eastAsia"/>
+        </w:rPr>
+        <w:t>优化</w:t>
+      </w:r>
+      <w:r>
+        <w:rPr>
+          <w:rFonts w:ascii="Times New Roman" w:eastAsia="宋体" w:hAnsi="Times New Roman" w:cs="Times New Roman" w:hint="eastAsia"/>
+        </w:rPr>
+        <w:t>CSF</w:t>
+      </w:r>
+      <w:r>
+        <w:rPr>
+          <w:rFonts w:ascii="Times New Roman" w:eastAsia="宋体" w:hAnsi="Times New Roman" w:cs="Times New Roman" w:hint="eastAsia"/>
+        </w:rPr>
+        <w:t>浏览器性能</w:t>
+      </w:r>
+    </w:p>
+    <w:p>
+      <w:pPr>
+        <w:pStyle w:val="a9"/>
+        <w:numPr>
+          <w:ilvl w:val="0"/>
+          <w:numId w:val="47"/>
+        </w:numPr>
+        <w:rPr>
+          <w:rFonts w:ascii="Times New Roman" w:eastAsia="宋体" w:hAnsi="Times New Roman" w:cs="Times New Roman"/>
+        </w:rPr>
+      </w:pPr>
+      <w:r>
+        <w:rPr>
+          <w:rFonts w:ascii="Times New Roman" w:eastAsia="宋体" w:hAnsi="Times New Roman" w:cs="Times New Roman" w:hint="eastAsia"/>
+        </w:rPr>
+        <w:t>修复地形的</w:t>
+      </w:r>
+      <w:r>
+        <w:rPr>
+          <w:rFonts w:ascii="Times New Roman" w:eastAsia="宋体" w:hAnsi="Times New Roman" w:cs="Times New Roman" w:hint="eastAsia"/>
+        </w:rPr>
+        <w:t>ExtraImage</w:t>
+      </w:r>
+      <w:r>
+        <w:rPr>
+          <w:rFonts w:ascii="Times New Roman" w:eastAsia="宋体" w:hAnsi="Times New Roman" w:cs="Times New Roman" w:hint="eastAsia"/>
+        </w:rPr>
+        <w:t>部分情况下会渲染在其他地形上的</w:t>
+      </w:r>
+      <w:r>
+        <w:rPr>
+          <w:rFonts w:ascii="Times New Roman" w:eastAsia="宋体" w:hAnsi="Times New Roman" w:cs="Times New Roman" w:hint="eastAsia"/>
+        </w:rPr>
+        <w:t>bug</w:t>
+      </w:r>
+    </w:p>
+    <w:p>
+      <w:pPr>
+        <w:pStyle w:val="a9"/>
+        <w:numPr>
+          <w:ilvl w:val="0"/>
+          <w:numId w:val="47"/>
+        </w:numPr>
+        <w:rPr>
+          <w:rFonts w:ascii="Times New Roman" w:eastAsia="宋体" w:hAnsi="Times New Roman" w:cs="Times New Roman"/>
+        </w:rPr>
+      </w:pPr>
+      <w:r>
+        <w:rPr>
+          <w:rFonts w:ascii="Times New Roman" w:eastAsia="宋体" w:hAnsi="Times New Roman" w:cs="Times New Roman" w:hint="eastAsia"/>
+        </w:rPr>
+        <w:t>支持</w:t>
+      </w:r>
+      <w:r>
+        <w:rPr>
+          <w:rFonts w:ascii="Times New Roman" w:eastAsia="宋体" w:hAnsi="Times New Roman" w:cs="Times New Roman" w:hint="eastAsia"/>
+        </w:rPr>
+        <w:t>64</w:t>
+      </w:r>
+      <w:r>
+        <w:rPr>
+          <w:rFonts w:ascii="Times New Roman" w:eastAsia="宋体" w:hAnsi="Times New Roman" w:cs="Times New Roman" w:hint="eastAsia"/>
+        </w:rPr>
+        <w:t>向建筑炮塔图像的加载</w:t>
+      </w:r>
+    </w:p>
+    <w:p>
+      <w:pPr>
+        <w:pStyle w:val="a9"/>
+        <w:numPr>
+          <w:ilvl w:val="0"/>
+          <w:numId w:val="47"/>
+        </w:numPr>
+        <w:rPr>
+          <w:rFonts w:ascii="Times New Roman" w:eastAsia="宋体" w:hAnsi="Times New Roman" w:cs="Times New Roman"/>
+        </w:rPr>
+      </w:pPr>
+      <w:r>
+        <w:rPr>
+          <w:rFonts w:ascii="Times New Roman" w:eastAsia="宋体" w:hAnsi="Times New Roman" w:cs="Times New Roman" w:hint="eastAsia"/>
+        </w:rPr>
+        <w:t>支持建筑炮塔动画（</w:t>
+      </w:r>
+      <w:r>
+        <w:rPr>
+          <w:rFonts w:ascii="Times New Roman" w:eastAsia="宋体" w:hAnsi="Times New Roman" w:cs="Times New Roman" w:hint="eastAsia"/>
+        </w:rPr>
+        <w:t>TurretAnim.IdleFrames</w:t>
+      </w:r>
+      <w:r>
+        <w:rPr>
+          <w:rFonts w:ascii="Times New Roman" w:eastAsia="宋体" w:hAnsi="Times New Roman" w:cs="Times New Roman" w:hint="eastAsia"/>
+        </w:rPr>
+        <w:t>）</w:t>
+      </w:r>
+    </w:p>
+    <w:p>
+      <w:pPr>
+        <w:pStyle w:val="a9"/>
+        <w:numPr>
+          <w:ilvl w:val="0"/>
+          <w:numId w:val="47"/>
+        </w:numPr>
+        <w:rPr>
+          <w:rFonts w:ascii="Times New Roman" w:eastAsia="宋体" w:hAnsi="Times New Roman" w:cs="Times New Roman"/>
+        </w:rPr>
+      </w:pPr>
+      <w:r>
+        <w:rPr>
+          <w:rFonts w:ascii="Times New Roman" w:eastAsia="宋体" w:hAnsi="Times New Roman" w:cs="Times New Roman" w:hint="eastAsia"/>
+        </w:rPr>
+        <w:t>AI</w:t>
+      </w:r>
+      <w:r>
+        <w:rPr>
+          <w:rFonts w:ascii="Times New Roman" w:eastAsia="宋体" w:hAnsi="Times New Roman" w:cs="Times New Roman" w:hint="eastAsia"/>
+        </w:rPr>
+        <w:t>触发编辑器的激活条件支持自定义，详见</w:t>
+      </w:r>
+      <w:r>
+        <w:rPr>
+          <w:rFonts w:ascii="Times New Roman" w:eastAsia="宋体" w:hAnsi="Times New Roman" w:cs="Times New Roman" w:hint="eastAsia"/>
+        </w:rPr>
+        <w:t>AITriggerConditionTypes</w:t>
+      </w:r>
+    </w:p>
+    <w:p>
+      <w:pPr>
+        <w:pStyle w:val="a9"/>
+        <w:numPr>
+          <w:ilvl w:val="0"/>
+          <w:numId w:val="47"/>
+        </w:numPr>
+        <w:rPr>
+          <w:rFonts w:ascii="Times New Roman" w:eastAsia="宋体" w:hAnsi="Times New Roman" w:cs="Times New Roman"/>
+        </w:rPr>
+      </w:pPr>
+      <w:r>
+        <w:rPr>
+          <w:rFonts w:ascii="Times New Roman" w:eastAsia="宋体" w:hAnsi="Times New Roman" w:cs="Times New Roman" w:hint="eastAsia"/>
+        </w:rPr>
+        <w:t>修复通用格式刷同时应用于多种不同对象时，</w:t>
+      </w:r>
+      <w:r>
+        <w:rPr>
+          <w:rFonts w:ascii="Times New Roman" w:eastAsia="宋体" w:hAnsi="Times New Roman" w:cs="Times New Roman" w:hint="eastAsia"/>
+        </w:rPr>
+        <w:t>历史记录</w:t>
+      </w:r>
+      <w:r>
+        <w:rPr>
+          <w:rFonts w:ascii="Times New Roman" w:eastAsia="宋体" w:hAnsi="Times New Roman" w:cs="Times New Roman" w:hint="eastAsia"/>
+        </w:rPr>
+        <w:t>错误的</w:t>
+      </w:r>
+      <w:r>
+        <w:rPr>
+          <w:rFonts w:ascii="Times New Roman" w:eastAsia="宋体" w:hAnsi="Times New Roman" w:cs="Times New Roman" w:hint="eastAsia"/>
+        </w:rPr>
+        <w:t>bug</w:t>
+      </w:r>
+      <w:r>
+        <w:rPr>
+          <w:rFonts w:ascii="Times New Roman" w:eastAsia="宋体" w:hAnsi="Times New Roman" w:cs="Times New Roman" w:hint="eastAsia"/>
+        </w:rPr>
+        <w:t>，添加修改实时预览</w:t>
+      </w:r>
+    </w:p>
+    <w:p>
+      <w:pPr>
+        <w:pStyle w:val="a9"/>
+        <w:numPr>
+          <w:ilvl w:val="0"/>
+          <w:numId w:val="47"/>
+        </w:numPr>
+        <w:rPr>
+          <w:rFonts w:ascii="Times New Roman" w:eastAsia="宋体" w:hAnsi="Times New Roman" w:cs="Times New Roman"/>
+        </w:rPr>
+      </w:pPr>
+      <w:r>
+        <w:rPr>
+          <w:rFonts w:ascii="Times New Roman" w:eastAsia="宋体" w:hAnsi="Times New Roman" w:cs="Times New Roman" w:hint="eastAsia"/>
+        </w:rPr>
+        <w:t>占地面积大于</w:t>
+      </w:r>
+      <w:r>
+        <w:rPr>
+          <w:rFonts w:ascii="Times New Roman" w:eastAsia="宋体" w:hAnsi="Times New Roman" w:cs="Times New Roman" w:hint="eastAsia"/>
+        </w:rPr>
+        <w:t>1x1</w:t>
+      </w:r>
+      <w:r>
+        <w:rPr>
+          <w:rFonts w:ascii="Times New Roman" w:eastAsia="宋体" w:hAnsi="Times New Roman" w:cs="Times New Roman" w:hint="eastAsia"/>
+        </w:rPr>
+        <w:t>的污染可以在非原点格子拖动</w:t>
+      </w:r>
+    </w:p>
+    <w:p>
+      <w:pPr>
+        <w:pStyle w:val="a9"/>
+        <w:numPr>
+          <w:ilvl w:val="0"/>
+          <w:numId w:val="47"/>
+        </w:numPr>
+        <w:rPr>
+          <w:rFonts w:ascii="Times New Roman" w:eastAsia="宋体" w:hAnsi="Times New Roman" w:cs="Times New Roman"/>
+        </w:rPr>
+      </w:pPr>
+      <w:r>
+        <w:rPr>
+          <w:rFonts w:ascii="Times New Roman" w:eastAsia="宋体" w:hAnsi="Times New Roman" w:cs="Times New Roman" w:hint="eastAsia"/>
+        </w:rPr>
+        <w:t>Delete</w:t>
+      </w:r>
+      <w:r>
+        <w:rPr>
+          <w:rFonts w:ascii="Times New Roman" w:eastAsia="宋体" w:hAnsi="Times New Roman" w:cs="Times New Roman" w:hint="eastAsia"/>
+        </w:rPr>
+        <w:t>键不再作为删除对象的快捷键；每按一次</w:t>
+      </w:r>
+      <w:r>
+        <w:rPr>
+          <w:rFonts w:ascii="Times New Roman" w:eastAsia="宋体" w:hAnsi="Times New Roman" w:cs="Times New Roman" w:hint="eastAsia"/>
+        </w:rPr>
+        <w:t>Delete</w:t>
+      </w:r>
+      <w:r>
+        <w:rPr>
+          <w:rFonts w:ascii="Times New Roman" w:eastAsia="宋体" w:hAnsi="Times New Roman" w:cs="Times New Roman" w:hint="eastAsia"/>
+        </w:rPr>
+        <w:t>，都将删除鼠标所在单元格的各种对象</w:t>
+      </w:r>
+    </w:p>
+    <w:p>
+      <w:pPr>
+        <w:pStyle w:val="a9"/>
+        <w:numPr>
+          <w:ilvl w:val="0"/>
+          <w:numId w:val="47"/>
+        </w:numPr>
+        <w:rPr>
+          <w:rFonts w:ascii="Times New Roman" w:eastAsia="宋体" w:hAnsi="Times New Roman" w:cs="Times New Roman"/>
+        </w:rPr>
+      </w:pPr>
+      <w:r>
+        <w:rPr>
+          <w:rFonts w:ascii="Times New Roman" w:eastAsia="宋体" w:hAnsi="Times New Roman" w:cs="Times New Roman" w:hint="eastAsia"/>
+        </w:rPr>
+        <w:t>修复在部分老旧</w:t>
+      </w:r>
+      <w:r>
+        <w:rPr>
+          <w:rFonts w:ascii="Times New Roman" w:eastAsia="宋体" w:hAnsi="Times New Roman" w:cs="Times New Roman" w:hint="eastAsia"/>
+        </w:rPr>
+        <w:t>CPU</w:t>
+      </w:r>
+      <w:r>
+        <w:rPr>
+          <w:rFonts w:ascii="Times New Roman" w:eastAsia="宋体" w:hAnsi="Times New Roman" w:cs="Times New Roman" w:hint="eastAsia"/>
+        </w:rPr>
+        <w:t>上方向计算错误的</w:t>
+      </w:r>
+      <w:r>
+        <w:rPr>
+          <w:rFonts w:ascii="Times New Roman" w:eastAsia="宋体" w:hAnsi="Times New Roman" w:cs="Times New Roman" w:hint="eastAsia"/>
+        </w:rPr>
+        <w:t>bug</w:t>
+      </w:r>
+    </w:p>
+    <w:p>
+      <w:pPr>
+        <w:pStyle w:val="a9"/>
+        <w:numPr>
+          <w:ilvl w:val="0"/>
+          <w:numId w:val="10"/>
+        </w:numPr>
+        <w:rPr>
+          <w:rFonts w:ascii="Times New Roman" w:eastAsia="宋体" w:hAnsi="Times New Roman" w:cs="Times New Roman"/>
           <w:b/>
           <w:bCs/>
           <w:sz w:val="28"/>
           <w:szCs w:val="32"/>
         </w:rPr>
-        <w:t>)</w:t>
-      </w:r>
-    </w:p>
-    <w:p>
-      <w:pPr>
-        <w:pStyle w:val="a9"/>
-        <w:numPr>
-          <w:ilvl w:val="0"/>
-          <w:numId w:val="47"/>
-        </w:numPr>
-        <w:rPr>
-          <w:rFonts w:ascii="Times New Roman" w:eastAsia="宋体" w:hAnsi="Times New Roman" w:cs="Times New Roman"/>
-        </w:rPr>
-      </w:pPr>
-      <w:r>
-        <w:rPr>
-          <w:rFonts w:ascii="Times New Roman" w:eastAsia="宋体" w:hAnsi="Times New Roman" w:cs="Times New Roman" w:hint="eastAsia"/>
-        </w:rPr>
-        <w:t>修复当副屏在主屏幕左侧或上侧时的显示</w:t>
-      </w:r>
-      <w:r>
-        <w:rPr>
-          <w:rFonts w:ascii="Times New Roman" w:eastAsia="宋体" w:hAnsi="Times New Roman" w:cs="Times New Roman" w:hint="eastAsia"/>
-        </w:rPr>
-        <w:t>bug</w:t>
-      </w:r>
-    </w:p>
-    <w:p>
-      <w:pPr>
-        <w:pStyle w:val="a9"/>
-        <w:numPr>
-          <w:ilvl w:val="0"/>
-          <w:numId w:val="47"/>
-        </w:numPr>
-        <w:rPr>
-          <w:rFonts w:ascii="Times New Roman" w:eastAsia="宋体" w:hAnsi="Times New Roman" w:cs="Times New Roman"/>
-        </w:rPr>
-      </w:pPr>
-      <w:r>
-        <w:rPr>
-          <w:rFonts w:ascii="Times New Roman" w:eastAsia="宋体" w:hAnsi="Times New Roman" w:cs="Times New Roman" w:hint="eastAsia"/>
-        </w:rPr>
-        <w:t>自定义</w:t>
-      </w:r>
-      <w:r>
-        <w:rPr>
-          <w:rFonts w:ascii="Times New Roman" w:eastAsia="宋体" w:hAnsi="Times New Roman" w:cs="Times New Roman" w:hint="eastAsia"/>
-        </w:rPr>
-        <w:t>LAT</w:t>
-      </w:r>
-      <w:r>
-        <w:rPr>
-          <w:rFonts w:ascii="Times New Roman" w:eastAsia="宋体" w:hAnsi="Times New Roman" w:cs="Times New Roman" w:hint="eastAsia"/>
-        </w:rPr>
-        <w:t>支持指定</w:t>
-      </w:r>
-      <w:r>
-        <w:rPr>
-          <w:rFonts w:ascii="Times New Roman" w:eastAsia="宋体" w:hAnsi="Times New Roman" w:cs="Times New Roman" w:hint="eastAsia"/>
-        </w:rPr>
-        <w:t>ClearTile</w:t>
-      </w:r>
-      <w:r>
-        <w:rPr>
-          <w:rFonts w:ascii="Times New Roman" w:eastAsia="宋体" w:hAnsi="Times New Roman" w:cs="Times New Roman" w:hint="eastAsia"/>
-        </w:rPr>
-        <w:t>，详见</w:t>
-      </w:r>
-      <w:r>
-        <w:rPr>
-          <w:rFonts w:ascii="Times New Roman" w:eastAsia="宋体" w:hAnsi="Times New Roman" w:cs="Times New Roman" w:hint="eastAsia"/>
-        </w:rPr>
-        <w:t>[LATGroups]</w:t>
-      </w:r>
-    </w:p>
-    <w:p>
-      <w:pPr>
-        <w:pStyle w:val="a9"/>
-        <w:numPr>
-          <w:ilvl w:val="0"/>
-          <w:numId w:val="47"/>
-        </w:numPr>
-        <w:rPr>
-          <w:rFonts w:ascii="Times New Roman" w:eastAsia="宋体" w:hAnsi="Times New Roman" w:cs="Times New Roman"/>
-        </w:rPr>
-      </w:pPr>
-      <w:r>
-        <w:rPr>
-          <w:rFonts w:ascii="Times New Roman" w:eastAsia="宋体" w:hAnsi="Times New Roman" w:cs="Times New Roman" w:hint="eastAsia"/>
-        </w:rPr>
-        <w:t>修复撤销、重做等菜单选项无效的</w:t>
-      </w:r>
-      <w:r>
-        <w:rPr>
-          <w:rFonts w:ascii="Times New Roman" w:eastAsia="宋体" w:hAnsi="Times New Roman" w:cs="Times New Roman" w:hint="eastAsia"/>
-        </w:rPr>
-        <w:t>bug</w:t>
-      </w:r>
-    </w:p>
-    <w:p>
-      <w:pPr>
-        <w:pStyle w:val="a9"/>
-        <w:numPr>
-          <w:ilvl w:val="0"/>
-          <w:numId w:val="47"/>
-        </w:numPr>
-        <w:rPr>
-          <w:rFonts w:ascii="Times New Roman" w:eastAsia="宋体" w:hAnsi="Times New Roman" w:cs="Times New Roman"/>
-        </w:rPr>
-      </w:pPr>
-      <w:r>
-        <w:rPr>
-          <w:rFonts w:ascii="Times New Roman" w:eastAsia="宋体" w:hAnsi="Times New Roman" w:cs="Times New Roman" w:hint="eastAsia"/>
-        </w:rPr>
-        <w:t>优化单位渲染顺序，优化了较大单位被地形遮挡的问题</w:t>
-      </w:r>
-    </w:p>
-    <w:p>
-      <w:pPr>
-        <w:pStyle w:val="a9"/>
-        <w:numPr>
-          <w:ilvl w:val="0"/>
-          <w:numId w:val="47"/>
-        </w:numPr>
-        <w:rPr>
-          <w:rFonts w:ascii="Times New Roman" w:eastAsia="宋体" w:hAnsi="Times New Roman" w:cs="Times New Roman"/>
-        </w:rPr>
-      </w:pPr>
-      <w:r>
-        <w:rPr>
-          <w:rFonts w:ascii="Times New Roman" w:eastAsia="宋体" w:hAnsi="Times New Roman" w:cs="Times New Roman" w:hint="eastAsia"/>
-        </w:rPr>
-        <w:t>修复单位与建筑重叠时，单位</w:t>
-      </w:r>
-      <w:r>
-        <w:rPr>
-          <w:rFonts w:ascii="Times New Roman" w:eastAsia="宋体" w:hAnsi="Times New Roman" w:cs="Times New Roman" w:hint="eastAsia"/>
-        </w:rPr>
-        <w:t>被遮挡</w:t>
-      </w:r>
-      <w:r>
-        <w:rPr>
-          <w:rFonts w:ascii="Times New Roman" w:eastAsia="宋体" w:hAnsi="Times New Roman" w:cs="Times New Roman" w:hint="eastAsia"/>
-        </w:rPr>
-        <w:t>的</w:t>
-      </w:r>
-      <w:r>
-        <w:rPr>
-          <w:rFonts w:ascii="Times New Roman" w:eastAsia="宋体" w:hAnsi="Times New Roman" w:cs="Times New Roman" w:hint="eastAsia"/>
-        </w:rPr>
-        <w:t>bug</w:t>
-      </w:r>
-    </w:p>
-    <w:p>
-      <w:pPr>
-        <w:pStyle w:val="a9"/>
-        <w:numPr>
-          <w:ilvl w:val="0"/>
-          <w:numId w:val="47"/>
-        </w:numPr>
-        <w:rPr>
-          <w:rFonts w:ascii="Times New Roman" w:eastAsia="宋体" w:hAnsi="Times New Roman" w:cs="Times New Roman"/>
-        </w:rPr>
-      </w:pPr>
-      <w:r>
-        <w:rPr>
-          <w:rFonts w:ascii="Times New Roman" w:eastAsia="宋体" w:hAnsi="Times New Roman" w:cs="Times New Roman" w:hint="eastAsia"/>
-        </w:rPr>
-        <w:t>可以正确显示驻军建筑的动画</w:t>
-      </w:r>
-    </w:p>
-    <w:p>
-      <w:pPr>
-        <w:pStyle w:val="a9"/>
-        <w:numPr>
-          <w:ilvl w:val="0"/>
-          <w:numId w:val="47"/>
-        </w:numPr>
-        <w:rPr>
-          <w:rFonts w:ascii="Times New Roman" w:eastAsia="宋体" w:hAnsi="Times New Roman" w:cs="Times New Roman"/>
-        </w:rPr>
-      </w:pPr>
-      <w:r>
-        <w:rPr>
-          <w:rFonts w:ascii="Times New Roman" w:eastAsia="宋体" w:hAnsi="Times New Roman" w:cs="Times New Roman" w:hint="eastAsia"/>
-        </w:rPr>
-        <w:t>可以正确显示生化反应炉的动画，计算初始乘员带来的发电量</w:t>
-      </w:r>
-    </w:p>
-    <w:p>
-      <w:pPr>
-        <w:pStyle w:val="a9"/>
-        <w:numPr>
-          <w:ilvl w:val="0"/>
-          <w:numId w:val="47"/>
-        </w:numPr>
-        <w:rPr>
-          <w:rFonts w:ascii="Times New Roman" w:eastAsia="宋体" w:hAnsi="Times New Roman" w:cs="Times New Roman"/>
-        </w:rPr>
-      </w:pPr>
-      <w:r>
-        <w:rPr>
-          <w:rFonts w:ascii="Times New Roman" w:eastAsia="宋体" w:hAnsi="Times New Roman" w:cs="Times New Roman" w:hint="eastAsia"/>
-        </w:rPr>
-        <w:t>修复撤销重做时没有更新灯光建筑的</w:t>
-      </w:r>
-      <w:r>
-        <w:rPr>
-          <w:rFonts w:ascii="Times New Roman" w:eastAsia="宋体" w:hAnsi="Times New Roman" w:cs="Times New Roman" w:hint="eastAsia"/>
-        </w:rPr>
-        <w:t>bug</w:t>
-      </w:r>
-    </w:p>
-    <w:p>
-      <w:pPr>
-        <w:pStyle w:val="a9"/>
-        <w:numPr>
-          <w:ilvl w:val="0"/>
-          <w:numId w:val="47"/>
-        </w:numPr>
-        <w:rPr>
-          <w:rFonts w:ascii="Times New Roman" w:eastAsia="宋体" w:hAnsi="Times New Roman" w:cs="Times New Roman"/>
-        </w:rPr>
-      </w:pPr>
-      <w:r>
-        <w:rPr>
-          <w:rFonts w:ascii="Times New Roman" w:eastAsia="宋体" w:hAnsi="Times New Roman" w:cs="Times New Roman" w:hint="eastAsia"/>
-        </w:rPr>
-        <w:t>显著</w:t>
-      </w:r>
-      <w:r>
-        <w:rPr>
-          <w:rFonts w:ascii="Times New Roman" w:eastAsia="宋体" w:hAnsi="Times New Roman" w:cs="Times New Roman" w:hint="eastAsia"/>
-        </w:rPr>
-        <w:t>提升</w:t>
-      </w:r>
-      <w:r>
-        <w:rPr>
-          <w:rFonts w:ascii="Times New Roman" w:eastAsia="宋体" w:hAnsi="Times New Roman" w:cs="Times New Roman" w:hint="eastAsia"/>
-        </w:rPr>
-        <w:t>绘图效率</w:t>
-      </w:r>
-      <w:r>
-        <w:rPr>
-          <w:rFonts w:ascii="Times New Roman" w:eastAsia="宋体" w:hAnsi="Times New Roman" w:cs="Times New Roman" w:hint="eastAsia"/>
-        </w:rPr>
-        <w:t>，优化光照沙盒效率</w:t>
-      </w:r>
-    </w:p>
-    <w:p>
-      <w:pPr>
-        <w:pStyle w:val="a9"/>
-        <w:numPr>
-          <w:ilvl w:val="0"/>
-          <w:numId w:val="47"/>
-        </w:numPr>
-        <w:rPr>
-          <w:rFonts w:ascii="Times New Roman" w:eastAsia="宋体" w:hAnsi="Times New Roman" w:cs="Times New Roman"/>
-        </w:rPr>
-      </w:pPr>
-      <w:r>
-        <w:rPr>
-          <w:rFonts w:ascii="Times New Roman" w:eastAsia="宋体" w:hAnsi="Times New Roman" w:cs="Times New Roman" w:hint="eastAsia"/>
-        </w:rPr>
-        <w:t>显著提升触发编辑器、小队编辑器等编辑器的效率</w:t>
-      </w:r>
-    </w:p>
-    <w:p>
-      <w:pPr>
-        <w:pStyle w:val="a9"/>
-        <w:numPr>
-          <w:ilvl w:val="0"/>
-          <w:numId w:val="47"/>
-        </w:numPr>
-        <w:rPr>
-          <w:rFonts w:ascii="Times New Roman" w:eastAsia="宋体" w:hAnsi="Times New Roman" w:cs="Times New Roman"/>
-        </w:rPr>
-      </w:pPr>
-      <w:r>
-        <w:rPr>
-          <w:rFonts w:ascii="Times New Roman" w:eastAsia="宋体" w:hAnsi="Times New Roman" w:cs="Times New Roman" w:hint="eastAsia"/>
-        </w:rPr>
-        <w:t>修复触发列表等列表选中父节点并右键选择“在本组创建触发”时，无法正确为触发添加前缀的</w:t>
-      </w:r>
-      <w:r>
-        <w:rPr>
-          <w:rFonts w:ascii="Times New Roman" w:eastAsia="宋体" w:hAnsi="Times New Roman" w:cs="Times New Roman" w:hint="eastAsia"/>
-        </w:rPr>
-        <w:t>bug</w:t>
-      </w:r>
-    </w:p>
-    <w:p>
-      <w:pPr>
-        <w:pStyle w:val="a9"/>
-        <w:numPr>
-          <w:ilvl w:val="0"/>
-          <w:numId w:val="47"/>
-        </w:numPr>
-        <w:rPr>
-          <w:rFonts w:ascii="Times New Roman" w:eastAsia="宋体" w:hAnsi="Times New Roman" w:cs="Times New Roman"/>
-        </w:rPr>
-      </w:pPr>
-      <w:r>
-        <w:rPr>
-          <w:rFonts w:ascii="Times New Roman" w:eastAsia="宋体" w:hAnsi="Times New Roman" w:cs="Times New Roman" w:hint="eastAsia"/>
-        </w:rPr>
-        <w:t>修复点击触发编辑器事件和行为列表的空白部分，会将当前选项切换至最后一个的</w:t>
-      </w:r>
-      <w:r>
-        <w:rPr>
-          <w:rFonts w:ascii="Times New Roman" w:eastAsia="宋体" w:hAnsi="Times New Roman" w:cs="Times New Roman" w:hint="eastAsia"/>
-        </w:rPr>
-        <w:t>bug</w:t>
-      </w:r>
-    </w:p>
-    <w:p>
-      <w:pPr>
-        <w:pStyle w:val="a9"/>
-        <w:numPr>
-          <w:ilvl w:val="0"/>
-          <w:numId w:val="47"/>
-        </w:numPr>
-        <w:rPr>
-          <w:rFonts w:ascii="Times New Roman" w:eastAsia="宋体" w:hAnsi="Times New Roman" w:cs="Times New Roman"/>
-        </w:rPr>
-      </w:pPr>
-      <w:r>
-        <w:rPr>
-          <w:rFonts w:ascii="Times New Roman" w:eastAsia="宋体" w:hAnsi="Times New Roman" w:cs="Times New Roman" w:hint="eastAsia"/>
-        </w:rPr>
-        <w:t>修复当隧道信息不正确时崩溃的</w:t>
-      </w:r>
-      <w:r>
-        <w:rPr>
-          <w:rFonts w:ascii="Times New Roman" w:eastAsia="宋体" w:hAnsi="Times New Roman" w:cs="Times New Roman" w:hint="eastAsia"/>
-        </w:rPr>
-        <w:t>bug</w:t>
-      </w:r>
-    </w:p>
-    <w:p>
-      <w:pPr>
-        <w:pStyle w:val="a9"/>
-        <w:numPr>
-          <w:ilvl w:val="0"/>
-          <w:numId w:val="47"/>
-        </w:numPr>
-        <w:rPr>
-          <w:rFonts w:ascii="Times New Roman" w:eastAsia="宋体" w:hAnsi="Times New Roman" w:cs="Times New Roman"/>
-        </w:rPr>
-      </w:pPr>
-      <w:r>
-        <w:rPr>
-          <w:rFonts w:ascii="Times New Roman" w:eastAsia="宋体" w:hAnsi="Times New Roman" w:cs="Times New Roman" w:hint="eastAsia"/>
-        </w:rPr>
-        <w:t>修复在地形浏览器中切换过多次后程序无响应的</w:t>
-      </w:r>
-      <w:r>
-        <w:rPr>
-          <w:rFonts w:ascii="Times New Roman" w:eastAsia="宋体" w:hAnsi="Times New Roman" w:cs="Times New Roman" w:hint="eastAsia"/>
-        </w:rPr>
-        <w:t>bug</w:t>
-      </w:r>
-    </w:p>
-    <w:p>
-      <w:pPr>
-        <w:pStyle w:val="a9"/>
-        <w:numPr>
-          <w:ilvl w:val="0"/>
-          <w:numId w:val="47"/>
-        </w:numPr>
-        <w:rPr>
-          <w:rFonts w:ascii="Times New Roman" w:eastAsia="宋体" w:hAnsi="Times New Roman" w:cs="Times New Roman"/>
-        </w:rPr>
-      </w:pPr>
-      <w:r>
-        <w:rPr>
-          <w:rFonts w:ascii="Times New Roman" w:eastAsia="宋体" w:hAnsi="Times New Roman" w:cs="Times New Roman" w:hint="eastAsia"/>
-        </w:rPr>
-        <w:lastRenderedPageBreak/>
-        <w:t>显著</w:t>
-      </w:r>
-      <w:r>
-        <w:rPr>
-          <w:rFonts w:ascii="Times New Roman" w:eastAsia="宋体" w:hAnsi="Times New Roman" w:cs="Times New Roman" w:hint="eastAsia"/>
-        </w:rPr>
-        <w:t>优化</w:t>
-      </w:r>
-      <w:r>
-        <w:rPr>
-          <w:rFonts w:ascii="Times New Roman" w:eastAsia="宋体" w:hAnsi="Times New Roman" w:cs="Times New Roman" w:hint="eastAsia"/>
-        </w:rPr>
-        <w:t>使用新的</w:t>
-      </w:r>
-      <w:r>
-        <w:rPr>
-          <w:rFonts w:ascii="Times New Roman" w:eastAsia="宋体" w:hAnsi="Times New Roman" w:cs="Times New Roman" w:hint="eastAsia"/>
-        </w:rPr>
-        <w:t>MIX</w:t>
-      </w:r>
-      <w:r>
-        <w:rPr>
-          <w:rFonts w:ascii="Times New Roman" w:eastAsia="宋体" w:hAnsi="Times New Roman" w:cs="Times New Roman" w:hint="eastAsia"/>
-        </w:rPr>
-        <w:t>加载器时的</w:t>
-      </w:r>
-      <w:r>
-        <w:rPr>
-          <w:rFonts w:ascii="Times New Roman" w:eastAsia="宋体" w:hAnsi="Times New Roman" w:cs="Times New Roman" w:hint="eastAsia"/>
-        </w:rPr>
-        <w:t>启动加载时间</w:t>
-      </w:r>
-    </w:p>
-    <w:p>
-      <w:pPr>
-        <w:pStyle w:val="a9"/>
-        <w:numPr>
-          <w:ilvl w:val="0"/>
-          <w:numId w:val="47"/>
-        </w:numPr>
-        <w:rPr>
-          <w:rFonts w:ascii="Times New Roman" w:eastAsia="宋体" w:hAnsi="Times New Roman" w:cs="Times New Roman"/>
-        </w:rPr>
-      </w:pPr>
-      <w:r>
-        <w:rPr>
-          <w:rFonts w:ascii="Times New Roman" w:eastAsia="宋体" w:hAnsi="Times New Roman" w:cs="Times New Roman" w:hint="eastAsia"/>
-        </w:rPr>
-        <w:t>优化</w:t>
-      </w:r>
-      <w:r>
-        <w:rPr>
-          <w:rFonts w:ascii="Times New Roman" w:eastAsia="宋体" w:hAnsi="Times New Roman" w:cs="Times New Roman" w:hint="eastAsia"/>
-        </w:rPr>
-        <w:t>VXL</w:t>
-      </w:r>
-      <w:r>
-        <w:rPr>
-          <w:rFonts w:ascii="Times New Roman" w:eastAsia="宋体" w:hAnsi="Times New Roman" w:cs="Times New Roman" w:hint="eastAsia"/>
-        </w:rPr>
-        <w:t>单位</w:t>
-      </w:r>
-      <w:r>
-        <w:rPr>
-          <w:rFonts w:ascii="Times New Roman" w:eastAsia="宋体" w:hAnsi="Times New Roman" w:cs="Times New Roman" w:hint="eastAsia"/>
-        </w:rPr>
-        <w:t>加载</w:t>
-      </w:r>
-      <w:r>
-        <w:rPr>
-          <w:rFonts w:ascii="Times New Roman" w:eastAsia="宋体" w:hAnsi="Times New Roman" w:cs="Times New Roman" w:hint="eastAsia"/>
-        </w:rPr>
-        <w:t>时间</w:t>
-      </w:r>
-    </w:p>
-    <w:p>
-      <w:pPr>
-        <w:pStyle w:val="a9"/>
-        <w:numPr>
-          <w:ilvl w:val="0"/>
-          <w:numId w:val="47"/>
-        </w:numPr>
-        <w:rPr>
-          <w:rFonts w:ascii="Times New Roman" w:eastAsia="宋体" w:hAnsi="Times New Roman" w:cs="Times New Roman"/>
-        </w:rPr>
-      </w:pPr>
-      <w:r>
-        <w:rPr>
-          <w:rFonts w:ascii="Times New Roman" w:eastAsia="宋体" w:hAnsi="Times New Roman" w:cs="Times New Roman" w:hint="eastAsia"/>
-        </w:rPr>
-        <w:t>修复当地图存在超出有效索引的单元格时，加载地图时可能崩溃的</w:t>
-      </w:r>
-      <w:r>
-        <w:rPr>
-          <w:rFonts w:ascii="Times New Roman" w:eastAsia="宋体" w:hAnsi="Times New Roman" w:cs="Times New Roman" w:hint="eastAsia"/>
-        </w:rPr>
-        <w:t>bug</w:t>
-      </w:r>
-    </w:p>
-    <w:p>
-      <w:pPr>
-        <w:pStyle w:val="a9"/>
-        <w:numPr>
-          <w:ilvl w:val="0"/>
-          <w:numId w:val="47"/>
-        </w:numPr>
-        <w:rPr>
-          <w:rFonts w:ascii="Times New Roman" w:eastAsia="宋体" w:hAnsi="Times New Roman" w:cs="Times New Roman"/>
-        </w:rPr>
-      </w:pPr>
-      <w:r>
-        <w:rPr>
-          <w:rFonts w:ascii="Times New Roman" w:eastAsia="宋体" w:hAnsi="Times New Roman" w:cs="Times New Roman" w:hint="eastAsia"/>
-        </w:rPr>
-        <w:t>修复双击触发编辑器行为列表的上移下移按钮时不响应的</w:t>
-      </w:r>
-      <w:r>
-        <w:rPr>
-          <w:rFonts w:ascii="Times New Roman" w:eastAsia="宋体" w:hAnsi="Times New Roman" w:cs="Times New Roman" w:hint="eastAsia"/>
-        </w:rPr>
-        <w:t>bug</w:t>
-      </w:r>
-    </w:p>
-    <w:p>
-      <w:pPr>
-        <w:pStyle w:val="a9"/>
-        <w:numPr>
-          <w:ilvl w:val="0"/>
-          <w:numId w:val="47"/>
-        </w:numPr>
-        <w:rPr>
-          <w:rFonts w:ascii="Times New Roman" w:eastAsia="宋体" w:hAnsi="Times New Roman" w:cs="Times New Roman"/>
-        </w:rPr>
-      </w:pPr>
-      <w:r>
-        <w:rPr>
-          <w:rFonts w:ascii="Times New Roman" w:eastAsia="宋体" w:hAnsi="Times New Roman" w:cs="Times New Roman" w:hint="eastAsia"/>
-        </w:rPr>
-        <w:t>优化覆盖物加载策略，即使素材文件内部标记有误，也会加载前一半图像</w:t>
-      </w:r>
-    </w:p>
-    <w:p>
-      <w:pPr>
-        <w:pStyle w:val="a9"/>
-        <w:numPr>
-          <w:ilvl w:val="0"/>
-          <w:numId w:val="47"/>
-        </w:numPr>
-        <w:rPr>
-          <w:rFonts w:ascii="Times New Roman" w:eastAsia="宋体" w:hAnsi="Times New Roman" w:cs="Times New Roman"/>
-        </w:rPr>
-      </w:pPr>
-      <w:r>
-        <w:rPr>
-          <w:rFonts w:ascii="Times New Roman" w:eastAsia="宋体" w:hAnsi="Times New Roman" w:cs="Times New Roman" w:hint="eastAsia"/>
-        </w:rPr>
-        <w:t>修复部分情况下随机放置对象不显示图标的</w:t>
-      </w:r>
-      <w:r>
-        <w:rPr>
-          <w:rFonts w:ascii="Times New Roman" w:eastAsia="宋体" w:hAnsi="Times New Roman" w:cs="Times New Roman" w:hint="eastAsia"/>
-        </w:rPr>
-        <w:t>bug</w:t>
-      </w:r>
-    </w:p>
-    <w:p>
-      <w:pPr>
-        <w:pStyle w:val="a9"/>
-        <w:numPr>
-          <w:ilvl w:val="0"/>
-          <w:numId w:val="47"/>
-        </w:numPr>
-        <w:rPr>
-          <w:rFonts w:ascii="Times New Roman" w:eastAsia="宋体" w:hAnsi="Times New Roman" w:cs="Times New Roman"/>
-        </w:rPr>
-      </w:pPr>
-      <w:r>
-        <w:rPr>
-          <w:rFonts w:ascii="Times New Roman" w:eastAsia="宋体" w:hAnsi="Times New Roman" w:cs="Times New Roman" w:hint="eastAsia"/>
-        </w:rPr>
-        <w:t>为所属方窗口补充缺失的翻译</w:t>
-      </w:r>
-    </w:p>
-    <w:p>
-      <w:pPr>
-        <w:pStyle w:val="a9"/>
-        <w:numPr>
-          <w:ilvl w:val="0"/>
-          <w:numId w:val="47"/>
-        </w:numPr>
-        <w:rPr>
-          <w:rFonts w:ascii="Times New Roman" w:eastAsia="宋体" w:hAnsi="Times New Roman" w:cs="Times New Roman"/>
-        </w:rPr>
-      </w:pPr>
-      <w:r>
-        <w:rPr>
-          <w:rFonts w:ascii="Times New Roman" w:eastAsia="宋体" w:hAnsi="Times New Roman" w:cs="Times New Roman" w:hint="eastAsia"/>
-        </w:rPr>
-        <w:t>优化</w:t>
-      </w:r>
-      <w:r>
-        <w:rPr>
-          <w:rFonts w:ascii="Times New Roman" w:eastAsia="宋体" w:hAnsi="Times New Roman" w:cs="Times New Roman" w:hint="eastAsia"/>
-        </w:rPr>
-        <w:t>CSF</w:t>
-      </w:r>
-      <w:r>
-        <w:rPr>
-          <w:rFonts w:ascii="Times New Roman" w:eastAsia="宋体" w:hAnsi="Times New Roman" w:cs="Times New Roman" w:hint="eastAsia"/>
-        </w:rPr>
-        <w:t>浏览器性能</w:t>
-      </w:r>
-    </w:p>
-    <w:p>
-      <w:pPr>
-        <w:pStyle w:val="a9"/>
-        <w:numPr>
-          <w:ilvl w:val="0"/>
-          <w:numId w:val="47"/>
-        </w:numPr>
-        <w:rPr>
-          <w:rFonts w:ascii="Times New Roman" w:eastAsia="宋体" w:hAnsi="Times New Roman" w:cs="Times New Roman"/>
-        </w:rPr>
-      </w:pPr>
-      <w:r>
-        <w:rPr>
-          <w:rFonts w:ascii="Times New Roman" w:eastAsia="宋体" w:hAnsi="Times New Roman" w:cs="Times New Roman" w:hint="eastAsia"/>
-        </w:rPr>
-        <w:t>修复地形的</w:t>
-      </w:r>
-      <w:r>
-        <w:rPr>
-          <w:rFonts w:ascii="Times New Roman" w:eastAsia="宋体" w:hAnsi="Times New Roman" w:cs="Times New Roman" w:hint="eastAsia"/>
-        </w:rPr>
-        <w:t>ExtraImage</w:t>
-      </w:r>
-      <w:r>
-        <w:rPr>
-          <w:rFonts w:ascii="Times New Roman" w:eastAsia="宋体" w:hAnsi="Times New Roman" w:cs="Times New Roman" w:hint="eastAsia"/>
-        </w:rPr>
-        <w:t>部分情况下会渲染在其他地形上的</w:t>
-      </w:r>
-      <w:r>
-        <w:rPr>
-          <w:rFonts w:ascii="Times New Roman" w:eastAsia="宋体" w:hAnsi="Times New Roman" w:cs="Times New Roman" w:hint="eastAsia"/>
-        </w:rPr>
-        <w:t>bug</w:t>
-      </w:r>
-    </w:p>
-    <w:p>
-      <w:pPr>
-        <w:pStyle w:val="a9"/>
-        <w:numPr>
-          <w:ilvl w:val="0"/>
-          <w:numId w:val="47"/>
-        </w:numPr>
-        <w:rPr>
-          <w:rFonts w:ascii="Times New Roman" w:eastAsia="宋体" w:hAnsi="Times New Roman" w:cs="Times New Roman"/>
-        </w:rPr>
-      </w:pPr>
-      <w:r>
-        <w:rPr>
-          <w:rFonts w:ascii="Times New Roman" w:eastAsia="宋体" w:hAnsi="Times New Roman" w:cs="Times New Roman" w:hint="eastAsia"/>
-        </w:rPr>
-        <w:t>支持</w:t>
-      </w:r>
-      <w:r>
-        <w:rPr>
-          <w:rFonts w:ascii="Times New Roman" w:eastAsia="宋体" w:hAnsi="Times New Roman" w:cs="Times New Roman" w:hint="eastAsia"/>
-        </w:rPr>
-        <w:t>64</w:t>
-      </w:r>
-      <w:r>
-        <w:rPr>
-          <w:rFonts w:ascii="Times New Roman" w:eastAsia="宋体" w:hAnsi="Times New Roman" w:cs="Times New Roman" w:hint="eastAsia"/>
-        </w:rPr>
-        <w:t>向建筑炮塔图像的加载</w:t>
-      </w:r>
-    </w:p>
-    <w:p>
-      <w:pPr>
-        <w:pStyle w:val="a9"/>
-        <w:numPr>
-          <w:ilvl w:val="0"/>
-          <w:numId w:val="47"/>
-        </w:numPr>
-        <w:rPr>
-          <w:rFonts w:ascii="Times New Roman" w:eastAsia="宋体" w:hAnsi="Times New Roman" w:cs="Times New Roman"/>
-        </w:rPr>
-      </w:pPr>
-      <w:r>
-        <w:rPr>
-          <w:rFonts w:ascii="Times New Roman" w:eastAsia="宋体" w:hAnsi="Times New Roman" w:cs="Times New Roman" w:hint="eastAsia"/>
-        </w:rPr>
-        <w:t>支持建筑炮塔动画（</w:t>
-      </w:r>
-      <w:r>
-        <w:rPr>
-          <w:rFonts w:ascii="Times New Roman" w:eastAsia="宋体" w:hAnsi="Times New Roman" w:cs="Times New Roman" w:hint="eastAsia"/>
-        </w:rPr>
-        <w:t>TurretAnim.IdleFrames</w:t>
-      </w:r>
-      <w:r>
-        <w:rPr>
-          <w:rFonts w:ascii="Times New Roman" w:eastAsia="宋体" w:hAnsi="Times New Roman" w:cs="Times New Roman" w:hint="eastAsia"/>
-        </w:rPr>
-        <w:t>）</w:t>
-      </w:r>
-    </w:p>
-    <w:p>
-      <w:pPr>
-        <w:pStyle w:val="a9"/>
-        <w:numPr>
-          <w:ilvl w:val="0"/>
-          <w:numId w:val="47"/>
-        </w:numPr>
-        <w:rPr>
-          <w:rFonts w:ascii="Times New Roman" w:eastAsia="宋体" w:hAnsi="Times New Roman" w:cs="Times New Roman"/>
-        </w:rPr>
-      </w:pPr>
-      <w:r>
-        <w:rPr>
-          <w:rFonts w:ascii="Times New Roman" w:eastAsia="宋体" w:hAnsi="Times New Roman" w:cs="Times New Roman" w:hint="eastAsia"/>
-        </w:rPr>
-        <w:t>AI</w:t>
-      </w:r>
-      <w:r>
-        <w:rPr>
-          <w:rFonts w:ascii="Times New Roman" w:eastAsia="宋体" w:hAnsi="Times New Roman" w:cs="Times New Roman" w:hint="eastAsia"/>
-        </w:rPr>
-        <w:t>触发编辑器的激活条件支持自定义，详见</w:t>
-      </w:r>
-      <w:r>
-        <w:rPr>
-          <w:rFonts w:ascii="Times New Roman" w:eastAsia="宋体" w:hAnsi="Times New Roman" w:cs="Times New Roman" w:hint="eastAsia"/>
-        </w:rPr>
-        <w:t>AITriggerConditionTypes</w:t>
-      </w:r>
-    </w:p>
-    <w:p>
-      <w:pPr>
-        <w:pStyle w:val="a9"/>
-        <w:numPr>
-          <w:ilvl w:val="0"/>
-          <w:numId w:val="47"/>
-        </w:numPr>
-        <w:rPr>
-          <w:rFonts w:ascii="Times New Roman" w:eastAsia="宋体" w:hAnsi="Times New Roman" w:cs="Times New Roman"/>
-        </w:rPr>
-      </w:pPr>
-      <w:r>
-        <w:rPr>
-          <w:rFonts w:ascii="Times New Roman" w:eastAsia="宋体" w:hAnsi="Times New Roman" w:cs="Times New Roman" w:hint="eastAsia"/>
-        </w:rPr>
-        <w:t>修复通用格式刷同时应用于多种不同对象时，</w:t>
-      </w:r>
-      <w:r>
-        <w:rPr>
-          <w:rFonts w:ascii="Times New Roman" w:eastAsia="宋体" w:hAnsi="Times New Roman" w:cs="Times New Roman" w:hint="eastAsia"/>
-        </w:rPr>
-        <w:t>历史记录</w:t>
-      </w:r>
-      <w:r>
-        <w:rPr>
-          <w:rFonts w:ascii="Times New Roman" w:eastAsia="宋体" w:hAnsi="Times New Roman" w:cs="Times New Roman" w:hint="eastAsia"/>
-        </w:rPr>
-        <w:t>错误的</w:t>
-      </w:r>
-      <w:r>
-        <w:rPr>
-          <w:rFonts w:ascii="Times New Roman" w:eastAsia="宋体" w:hAnsi="Times New Roman" w:cs="Times New Roman" w:hint="eastAsia"/>
-        </w:rPr>
-        <w:t>bug</w:t>
-      </w:r>
-      <w:r>
-        <w:rPr>
-          <w:rFonts w:ascii="Times New Roman" w:eastAsia="宋体" w:hAnsi="Times New Roman" w:cs="Times New Roman" w:hint="eastAsia"/>
-        </w:rPr>
-        <w:t>，添加修改实时预览</w:t>
-      </w:r>
-    </w:p>
-    <w:p>
-      <w:pPr>
-        <w:pStyle w:val="a9"/>
-        <w:numPr>
-          <w:ilvl w:val="0"/>
-          <w:numId w:val="47"/>
-        </w:numPr>
-        <w:rPr>
-          <w:rFonts w:ascii="Times New Roman" w:eastAsia="宋体" w:hAnsi="Times New Roman" w:cs="Times New Roman"/>
-        </w:rPr>
-      </w:pPr>
-      <w:r>
-        <w:rPr>
-          <w:rFonts w:ascii="Times New Roman" w:eastAsia="宋体" w:hAnsi="Times New Roman" w:cs="Times New Roman" w:hint="eastAsia"/>
-        </w:rPr>
-        <w:t>占地面积大于</w:t>
-      </w:r>
-      <w:r>
-        <w:rPr>
-          <w:rFonts w:ascii="Times New Roman" w:eastAsia="宋体" w:hAnsi="Times New Roman" w:cs="Times New Roman" w:hint="eastAsia"/>
-        </w:rPr>
-        <w:t>1x1</w:t>
-      </w:r>
-      <w:r>
-        <w:rPr>
-          <w:rFonts w:ascii="Times New Roman" w:eastAsia="宋体" w:hAnsi="Times New Roman" w:cs="Times New Roman" w:hint="eastAsia"/>
-        </w:rPr>
-        <w:t>的污染可以在非原点格子拖动</w:t>
-      </w:r>
-    </w:p>
-    <w:p>
-      <w:pPr>
-        <w:pStyle w:val="a9"/>
-        <w:numPr>
-          <w:ilvl w:val="0"/>
-          <w:numId w:val="47"/>
-        </w:numPr>
-        <w:rPr>
-          <w:rFonts w:ascii="Times New Roman" w:eastAsia="宋体" w:hAnsi="Times New Roman" w:cs="Times New Roman"/>
-        </w:rPr>
-      </w:pPr>
-      <w:r>
-        <w:rPr>
-          <w:rFonts w:ascii="Times New Roman" w:eastAsia="宋体" w:hAnsi="Times New Roman" w:cs="Times New Roman" w:hint="eastAsia"/>
-        </w:rPr>
-        <w:t>Delete</w:t>
-      </w:r>
-      <w:r>
-        <w:rPr>
-          <w:rFonts w:ascii="Times New Roman" w:eastAsia="宋体" w:hAnsi="Times New Roman" w:cs="Times New Roman" w:hint="eastAsia"/>
-        </w:rPr>
-        <w:t>键不再作为删除对象的快捷键；每按一次</w:t>
-      </w:r>
-      <w:r>
-        <w:rPr>
-          <w:rFonts w:ascii="Times New Roman" w:eastAsia="宋体" w:hAnsi="Times New Roman" w:cs="Times New Roman" w:hint="eastAsia"/>
-        </w:rPr>
-        <w:t>Delete</w:t>
-      </w:r>
-      <w:r>
-        <w:rPr>
-          <w:rFonts w:ascii="Times New Roman" w:eastAsia="宋体" w:hAnsi="Times New Roman" w:cs="Times New Roman" w:hint="eastAsia"/>
-        </w:rPr>
-        <w:t>，都将删除鼠标所在单元格的各种对象</w:t>
-      </w:r>
-    </w:p>
-    <w:p>
-      <w:pPr>
-        <w:pStyle w:val="a9"/>
-        <w:numPr>
-          <w:ilvl w:val="0"/>
-          <w:numId w:val="47"/>
-        </w:numPr>
-        <w:rPr>
-          <w:rFonts w:ascii="Times New Roman" w:eastAsia="宋体" w:hAnsi="Times New Roman" w:cs="Times New Roman"/>
-        </w:rPr>
-      </w:pPr>
-      <w:r>
-        <w:rPr>
-          <w:rFonts w:ascii="Times New Roman" w:eastAsia="宋体" w:hAnsi="Times New Roman" w:cs="Times New Roman" w:hint="eastAsia"/>
-        </w:rPr>
-        <w:t>修复在部分老旧</w:t>
-      </w:r>
-      <w:r>
-        <w:rPr>
-          <w:rFonts w:ascii="Times New Roman" w:eastAsia="宋体" w:hAnsi="Times New Roman" w:cs="Times New Roman" w:hint="eastAsia"/>
-        </w:rPr>
-        <w:t>CPU</w:t>
-      </w:r>
-      <w:r>
-        <w:rPr>
-          <w:rFonts w:ascii="Times New Roman" w:eastAsia="宋体" w:hAnsi="Times New Roman" w:cs="Times New Roman" w:hint="eastAsia"/>
-        </w:rPr>
-        <w:t>上方向计算错误的</w:t>
-      </w:r>
-      <w:r>
-        <w:rPr>
-          <w:rFonts w:ascii="Times New Roman" w:eastAsia="宋体" w:hAnsi="Times New Roman" w:cs="Times New Roman" w:hint="eastAsia"/>
-        </w:rPr>
-        <w:t>bug</w:t>
-      </w:r>
-    </w:p>
-    <w:p>
-      <w:pPr>
-        <w:pStyle w:val="a9"/>
-        <w:numPr>
-          <w:ilvl w:val="0"/>
-          <w:numId w:val="10"/>
-        </w:numPr>
-        <w:rPr>
-          <w:rFonts w:ascii="Times New Roman" w:eastAsia="宋体" w:hAnsi="Times New Roman" w:cs="Times New Roman"/>
+      </w:pPr>
+      <w:r>
+        <w:rPr>
+          <w:rFonts w:ascii="Times New Roman" w:eastAsia="宋体" w:hAnsi="Times New Roman" w:cs="Times New Roman" w:hint="eastAsia"/>
           <w:b/>
           <w:bCs/>
           <w:sz w:val="28"/>
           <w:szCs w:val="32"/>
         </w:rPr>
-      </w:pPr>
+        <w:t>1.4.1 (2026.04.</w:t>
+      </w:r>
       <w:r>
         <w:rPr>
           <w:rFonts w:ascii="Times New Roman" w:eastAsia="宋体" w:hAnsi="Times New Roman" w:cs="Times New Roman" w:hint="eastAsia"/>
@@ -1494,7 +1530,7 @@
           <w:sz w:val="28"/>
           <w:szCs w:val="32"/>
         </w:rPr>
-        <w:t>1.4.1 (2026.04.</w:t>
+        <w:t>1</w:t>
       </w:r>
       <w:r>
         <w:rPr>
@@ -1504,7 +1540,7 @@
           <w:sz w:val="28"/>
           <w:szCs w:val="32"/>
         </w:rPr>
-        <w:t>1</w:t>
+        <w:t>5</w:t>
       </w:r>
       <w:r>
         <w:rPr>
@@ -1514,16 +1550,6 @@
           <w:sz w:val="28"/>
           <w:szCs w:val="32"/>
         </w:rPr>
-        <w:t>5</w:t>
-      </w:r>
-      <w:r>
-        <w:rPr>
-          <w:rFonts w:ascii="Times New Roman" w:eastAsia="宋体" w:hAnsi="Times New Roman" w:cs="Times New Roman" w:hint="eastAsia"/>
-          <w:b/>
-          <w:bCs/>
-          <w:sz w:val="28"/>
-          <w:szCs w:val="32"/>
-        </w:rPr>
         <w:t>)</w:t>
       </w:r>
     </w:p>
@@ -1932,6 +1958,7 @@
         <w:rPr>
           <w:rFonts w:ascii="Times New Roman" w:eastAsia="宋体" w:hAnsi="Times New Roman" w:cs="Times New Roman" w:hint="eastAsia"/>
         </w:rPr>
+        <w:lastRenderedPageBreak/>
         <w:t>绘制连接地形时，初始高度会减去当前地形的内部高度</w:t>
       </w:r>
     </w:p>
@@ -1950,7 +1977,6 @@
         <w:rPr>
           <w:rFonts w:ascii="Times New Roman" w:eastAsia="宋体" w:hAnsi="Times New Roman" w:cs="Times New Roman" w:hint="eastAsia"/>
         </w:rPr>
-        <w:lastRenderedPageBreak/>
         <w:t>在地形生成器中同时生成覆盖物和地形对象时，地形对象不会在</w:t>
       </w:r>
       <w:r>
@@ -2962,6 +2988,7 @@
         <w:rPr>
           <w:rFonts w:ascii="Times New Roman" w:eastAsia="宋体" w:hAnsi="Times New Roman" w:cs="Times New Roman" w:hint="eastAsia"/>
         </w:rPr>
+        <w:lastRenderedPageBreak/>
         <w:t>可以在</w:t>
       </w:r>
       <w:r>
@@ -2998,7 +3025,6 @@
         <w:rPr>
           <w:rFonts w:ascii="Times New Roman" w:eastAsia="宋体" w:hAnsi="Times New Roman" w:cs="Times New Roman" w:hint="eastAsia"/>
         </w:rPr>
-        <w:lastRenderedPageBreak/>
         <w:t>IgnoreOverlays</w:t>
       </w:r>
       <w:r>
@@ -4247,6 +4273,7 @@
         <w:rPr>
           <w:rFonts w:ascii="Times New Roman" w:eastAsia="宋体" w:hAnsi="Times New Roman" w:cs="Times New Roman" w:hint="eastAsia"/>
         </w:rPr>
+        <w:lastRenderedPageBreak/>
         <w:t>为基地节点渲染自定义军衔</w:t>
       </w:r>
     </w:p>
@@ -4265,7 +4292,6 @@
         <w:rPr>
           <w:rFonts w:ascii="Times New Roman" w:eastAsia="宋体" w:hAnsi="Times New Roman" w:cs="Times New Roman" w:hint="eastAsia"/>
         </w:rPr>
-        <w:lastRenderedPageBreak/>
         <w:t>支持将地图文件关联至启动器，直接打开地图；支持将地图拖拽至启动器打开，详见</w:t>
       </w:r>
       <w:r>
@@ -5262,6 +5288,7 @@
         <w:rPr>
           <w:rFonts w:ascii="Times New Roman" w:eastAsia="宋体" w:hAnsi="Times New Roman" w:cs="Times New Roman" w:hint="eastAsia"/>
         </w:rPr>
+        <w:lastRenderedPageBreak/>
         <w:t>InGameDisplay.RemapableOverlay</w:t>
       </w:r>
     </w:p>
@@ -5280,7 +5307,6 @@
         <w:rPr>
           <w:rFonts w:ascii="Times New Roman" w:eastAsia="宋体" w:hAnsi="Times New Roman" w:cs="Times New Roman" w:hint="eastAsia"/>
         </w:rPr>
-        <w:lastRenderedPageBreak/>
         <w:t>恢复心灵终结中被错误隐藏的部分地形组</w:t>
       </w:r>
     </w:p>
@@ -6241,6 +6267,7 @@
         <w:rPr>
           <w:rFonts w:ascii="Times New Roman" w:eastAsia="宋体" w:hAnsi="Times New Roman" w:cs="Times New Roman" w:hint="eastAsia"/>
         </w:rPr>
+        <w:lastRenderedPageBreak/>
         <w:t>物品浏览器</w:t>
       </w:r>
       <w:r>
@@ -6265,14 +6292,7 @@
         <w:rPr>
           <w:rFonts w:ascii="Times New Roman" w:eastAsia="宋体" w:hAnsi="Times New Roman" w:cs="Times New Roman" w:hint="eastAsia"/>
         </w:rPr>
-        <w:t>水晶不能将矿石放在斜坡上（不影响地形浏览器中的</w:t>
-      </w:r>
-      <w:r>
-        <w:rPr>
-          <w:rFonts w:ascii="Times New Roman" w:eastAsia="宋体" w:hAnsi="Times New Roman" w:cs="Times New Roman" w:hint="eastAsia"/>
-        </w:rPr>
-        <w:lastRenderedPageBreak/>
-        <w:t>摆放）</w:t>
+        <w:t>水晶不能将矿石放在斜坡上（不影响地形浏览器中的摆放）</w:t>
       </w:r>
     </w:p>
     <w:p>
@@ -7356,6 +7376,7 @@
         <w:rPr>
           <w:rFonts w:ascii="Times New Roman" w:eastAsia="宋体" w:hAnsi="Times New Roman" w:cs="Times New Roman" w:hint="eastAsia"/>
         </w:rPr>
+        <w:lastRenderedPageBreak/>
         <w:t>修复地形生成器的显示范围比划定范围宽一格的</w:t>
       </w:r>
       <w:r>
@@ -7380,7 +7401,6 @@
         <w:rPr>
           <w:rFonts w:ascii="Times New Roman" w:eastAsia="宋体" w:hAnsi="Times New Roman" w:cs="Times New Roman" w:hint="eastAsia"/>
         </w:rPr>
-        <w:lastRenderedPageBreak/>
         <w:t>支持自定义加载嵌套</w:t>
       </w:r>
       <w:r>
@@ -8441,6 +8461,7 @@
         <w:rPr>
           <w:rFonts w:ascii="Times New Roman" w:eastAsia="宋体" w:hAnsi="Times New Roman" w:cs="Times New Roman" w:hint="eastAsia"/>
         </w:rPr>
+        <w:lastRenderedPageBreak/>
         <w:t>粘贴功能支持按</w:t>
       </w:r>
       <w:r>
@@ -8471,7 +8492,6 @@
         <w:rPr>
           <w:rFonts w:ascii="Times New Roman" w:eastAsia="宋体" w:hAnsi="Times New Roman" w:cs="Times New Roman" w:hint="eastAsia"/>
         </w:rPr>
-        <w:lastRenderedPageBreak/>
         <w:t>优化地形与阴影的覆盖关系，使渲染更接近游戏内效果</w:t>
       </w:r>
     </w:p>
@@ -43941,7 +43961,7 @@
         <v:path o:extrusionok="f" gradientshapeok="t" o:connecttype="rect"/>
         <o:lock v:ext="edit" aspectratio="t"/>
       </v:shapetype>
-      <v:shape id="_x0000_i1027" type="#_x0000_t75" style="width:11.65pt;height:11.65pt" o:bullet="t">
+      <v:shape id="_x0000_i1030" type="#_x0000_t75" style="width:11.5pt;height:11.5pt" o:bullet="t">
         <v:imagedata r:id="rId1" o:title="mso9A9A"/>
       </v:shape>
     </w:pict>

</xml_diff>

<commit_message>
fix event params trim bug
</commit_message>
<xml_diff>
--- a/Supplementary/文档/FA2SP HDM Edition说明文档.docx
+++ b/Supplementary/文档/FA2SP HDM Edition说明文档.docx
@@ -1037,6 +1037,30 @@
         <w:pStyle w:val="a9"/>
         <w:numPr>
           <w:ilvl w:val="0"/>
+          <w:numId w:val="11"/>
+        </w:numPr>
+        <w:rPr>
+          <w:rFonts w:ascii="Times New Roman" w:eastAsia="宋体" w:hAnsi="Times New Roman" w:cs="Times New Roman"/>
+        </w:rPr>
+      </w:pPr>
+      <w:r>
+        <w:rPr>
+          <w:rFonts w:ascii="Times New Roman" w:eastAsia="宋体" w:hAnsi="Times New Roman" w:cs="Times New Roman" w:hint="eastAsia"/>
+        </w:rPr>
+        <w:t>修复触发编辑器事件参数填写触发或小队时，不能正确截断名称的</w:t>
+      </w:r>
+      <w:r>
+        <w:rPr>
+          <w:rFonts w:ascii="Times New Roman" w:eastAsia="宋体" w:hAnsi="Times New Roman" w:cs="Times New Roman" w:hint="eastAsia"/>
+        </w:rPr>
+        <w:t>bug</w:t>
+      </w:r>
+    </w:p>
+    <w:p>
+      <w:pPr>
+        <w:pStyle w:val="a9"/>
+        <w:numPr>
+          <w:ilvl w:val="0"/>
           <w:numId w:val="10"/>
         </w:numPr>
         <w:rPr>
@@ -1907,7 +1931,14 @@
         <w:rPr>
           <w:rFonts w:ascii="Times New Roman" w:eastAsia="宋体" w:hAnsi="Times New Roman" w:cs="Times New Roman" w:hint="eastAsia"/>
         </w:rPr>
-        <w:t>，都将删除鼠标所在单元格的各种对象</w:t>
+        <w:t>，都将删除鼠标所在单</w:t>
+      </w:r>
+      <w:r>
+        <w:rPr>
+          <w:rFonts w:ascii="Times New Roman" w:eastAsia="宋体" w:hAnsi="Times New Roman" w:cs="Times New Roman" w:hint="eastAsia"/>
+        </w:rPr>
+        <w:lastRenderedPageBreak/>
+        <w:t>元格的各种对象</w:t>
       </w:r>
     </w:p>
     <w:p>
@@ -1925,7 +1956,6 @@
         <w:rPr>
           <w:rFonts w:ascii="Times New Roman" w:eastAsia="宋体" w:hAnsi="Times New Roman" w:cs="Times New Roman" w:hint="eastAsia"/>
         </w:rPr>
-        <w:lastRenderedPageBreak/>
         <w:t>修复在部分老旧</w:t>
       </w:r>
       <w:r>
@@ -2822,6 +2852,7 @@
         <w:rPr>
           <w:rFonts w:ascii="Times New Roman" w:eastAsia="宋体" w:hAnsi="Times New Roman" w:cs="Times New Roman" w:hint="eastAsia"/>
         </w:rPr>
+        <w:lastRenderedPageBreak/>
         <w:t>39</w:t>
       </w:r>
       <w:r>
@@ -2864,7 +2895,6 @@
         <w:rPr>
           <w:rFonts w:ascii="Times New Roman" w:eastAsia="宋体" w:hAnsi="Times New Roman" w:cs="Times New Roman" w:hint="eastAsia"/>
         </w:rPr>
-        <w:lastRenderedPageBreak/>
         <w:t>擦除覆盖物读取笔刷大小，删除“</w:t>
       </w:r>
       <w:r>
@@ -3970,6 +4000,7 @@
           <w:kern w:val="0"/>
           <w14:ligatures w14:val="none"/>
         </w:rPr>
+        <w:lastRenderedPageBreak/>
         <w:t>修复部分情况下物品浏览器选项的名称与实际单位不符的</w:t>
       </w:r>
       <w:r>
@@ -4000,7 +4031,6 @@
           <w:kern w:val="0"/>
           <w14:ligatures w14:val="none"/>
         </w:rPr>
-        <w:lastRenderedPageBreak/>
         <w:t>支持设置覆盖物数据的最大值，详见</w:t>
       </w:r>
       <w:r>
@@ -5077,6 +5107,7 @@
         <w:rPr>
           <w:rFonts w:ascii="Times New Roman" w:eastAsia="宋体" w:hAnsi="Times New Roman" w:cs="Times New Roman" w:hint="eastAsia"/>
         </w:rPr>
+        <w:lastRenderedPageBreak/>
         <w:t>修复当破损建筑动画未指定时，部分参数不能正确读取其完好动画信息的</w:t>
       </w:r>
       <w:r>
@@ -5101,7 +5132,6 @@
         <w:rPr>
           <w:rFonts w:ascii="Times New Roman" w:eastAsia="宋体" w:hAnsi="Times New Roman" w:cs="Times New Roman" w:hint="eastAsia"/>
         </w:rPr>
-        <w:lastRenderedPageBreak/>
         <w:t>修复部分情况下保存完地图后会弹出“</w:t>
       </w:r>
       <w:r>
@@ -6068,7 +6098,14 @@
         <w:rPr>
           <w:rFonts w:ascii="Times New Roman" w:eastAsia="宋体" w:hAnsi="Times New Roman" w:cs="Times New Roman" w:hint="eastAsia"/>
         </w:rPr>
-        <w:t>触发编辑器的行为列表支持多选，新增“上移”“下移”与“拆分”按钮，可以将选中的行为上下移动或拆分出新触发</w:t>
+        <w:t>触发编辑器的行为列表支持多选，新增“上移”“下移”与“拆分”按钮，可</w:t>
+      </w:r>
+      <w:r>
+        <w:rPr>
+          <w:rFonts w:ascii="Times New Roman" w:eastAsia="宋体" w:hAnsi="Times New Roman" w:cs="Times New Roman" w:hint="eastAsia"/>
+        </w:rPr>
+        <w:lastRenderedPageBreak/>
+        <w:t>以将选中的行为上下移动或拆分出新触发</w:t>
       </w:r>
     </w:p>
     <w:p>
@@ -6086,7 +6123,6 @@
         <w:rPr>
           <w:rFonts w:ascii="Times New Roman" w:eastAsia="宋体" w:hAnsi="Times New Roman" w:cs="Times New Roman" w:hint="eastAsia"/>
         </w:rPr>
-        <w:lastRenderedPageBreak/>
         <w:t>支持通过按住</w:t>
       </w:r>
       <w:r>
@@ -7205,6 +7241,7 @@
         <w:rPr>
           <w:rFonts w:ascii="Times New Roman" w:eastAsia="宋体" w:hAnsi="Times New Roman" w:cs="Times New Roman" w:hint="eastAsia"/>
         </w:rPr>
+        <w:lastRenderedPageBreak/>
         <w:t>FinalAlert2YR.dat</w:t>
       </w:r>
       <w:r>
@@ -7229,7 +7266,6 @@
         <w:rPr>
           <w:rFonts w:ascii="Times New Roman" w:eastAsia="宋体" w:hAnsi="Times New Roman" w:cs="Times New Roman" w:hint="eastAsia"/>
         </w:rPr>
-        <w:lastRenderedPageBreak/>
         <w:t>修复在启用</w:t>
       </w:r>
       <w:r>
@@ -8274,6 +8310,7 @@
         <w:rPr>
           <w:rFonts w:ascii="Times New Roman" w:eastAsia="宋体" w:hAnsi="Times New Roman" w:cs="Times New Roman" w:hint="eastAsia"/>
         </w:rPr>
+        <w:lastRenderedPageBreak/>
         <w:t>修复了建筑面积为</w:t>
       </w:r>
       <w:r>
@@ -8304,7 +8341,6 @@
         <w:rPr>
           <w:rFonts w:ascii="Times New Roman" w:eastAsia="宋体" w:hAnsi="Times New Roman" w:cs="Times New Roman" w:hint="eastAsia"/>
         </w:rPr>
-        <w:lastRenderedPageBreak/>
         <w:t>修复了标签列表中的跳转位置错误的</w:t>
       </w:r>
       <w:r>
@@ -9289,7 +9325,14 @@
         <w:rPr>
           <w:rFonts w:ascii="Times New Roman" w:eastAsia="宋体" w:hAnsi="Times New Roman" w:cs="Times New Roman" w:hint="eastAsia"/>
         </w:rPr>
-        <w:t>地图渲染器“使用数字渲染透明覆盖物”选项更改为“显示游戏内不可见对象”</w:t>
+        <w:t>地图渲染器“使用数字渲染透明覆盖物”选项更改为“显示游戏内不可见对</w:t>
+      </w:r>
+      <w:r>
+        <w:rPr>
+          <w:rFonts w:ascii="Times New Roman" w:eastAsia="宋体" w:hAnsi="Times New Roman" w:cs="Times New Roman" w:hint="eastAsia"/>
+        </w:rPr>
+        <w:lastRenderedPageBreak/>
+        <w:t>象”</w:t>
       </w:r>
     </w:p>
     <w:p>
@@ -9307,7 +9350,6 @@
         <w:rPr>
           <w:rFonts w:ascii="Times New Roman" w:eastAsia="宋体" w:hAnsi="Times New Roman" w:cs="Times New Roman" w:hint="eastAsia"/>
         </w:rPr>
-        <w:lastRenderedPageBreak/>
         <w:t>修复当</w:t>
       </w:r>
       <w:r>
@@ -10442,6 +10484,7 @@
         <w:rPr>
           <w:rFonts w:ascii="Times New Roman" w:eastAsia="宋体" w:hAnsi="Times New Roman" w:cs="Times New Roman" w:hint="eastAsia"/>
         </w:rPr>
+        <w:lastRenderedPageBreak/>
         <w:t>修复加载地图后小地图不显示覆盖物颜色的</w:t>
       </w:r>
       <w:r>
@@ -10466,7 +10509,6 @@
         <w:rPr>
           <w:rFonts w:ascii="Times New Roman" w:eastAsia="宋体" w:hAnsi="Times New Roman" w:cs="Times New Roman" w:hint="eastAsia"/>
         </w:rPr>
-        <w:lastRenderedPageBreak/>
         <w:t>优化了触发编辑器加载触发时的性能</w:t>
       </w:r>
     </w:p>
@@ -44773,7 +44815,7 @@
         <v:path o:extrusionok="f" gradientshapeok="t" o:connecttype="rect"/>
         <o:lock v:ext="edit" aspectratio="t"/>
       </v:shapetype>
-      <v:shape id="_x0000_i1032" type="#_x0000_t75" style="width:11.4pt;height:11.4pt" o:bullet="t">
+      <v:shape id="_x0000_i1030" type="#_x0000_t75" style="width:11.4pt;height:11.4pt" o:bullet="t">
         <v:imagedata r:id="rId1" o:title="mso9A9A"/>
       </v:shape>
     </w:pict>

</xml_diff>

<commit_message>
fix trigger rename bug
</commit_message>
<xml_diff>
--- a/Supplementary/文档/FA2SP HDM Edition说明文档.docx
+++ b/Supplementary/文档/FA2SP HDM Edition说明文档.docx
@@ -1169,6 +1169,30 @@
         <w:pStyle w:val="a9"/>
         <w:numPr>
           <w:ilvl w:val="0"/>
+          <w:numId w:val="11"/>
+        </w:numPr>
+        <w:rPr>
+          <w:rFonts w:ascii="Times New Roman" w:eastAsia="宋体" w:hAnsi="Times New Roman" w:cs="Times New Roman"/>
+        </w:rPr>
+      </w:pPr>
+      <w:r>
+        <w:rPr>
+          <w:rFonts w:ascii="Times New Roman" w:eastAsia="宋体" w:hAnsi="Times New Roman" w:cs="Times New Roman" w:hint="eastAsia"/>
+        </w:rPr>
+        <w:t>修复触发编辑器在修改触发名称时可能会导致触发列表产生重复的</w:t>
+      </w:r>
+      <w:r>
+        <w:rPr>
+          <w:rFonts w:ascii="Times New Roman" w:eastAsia="宋体" w:hAnsi="Times New Roman" w:cs="Times New Roman" w:hint="eastAsia"/>
+        </w:rPr>
+        <w:t>bug</w:t>
+      </w:r>
+    </w:p>
+    <w:p>
+      <w:pPr>
+        <w:pStyle w:val="a9"/>
+        <w:numPr>
+          <w:ilvl w:val="0"/>
           <w:numId w:val="10"/>
         </w:numPr>
         <w:rPr>
@@ -1889,6 +1913,7 @@
         <w:rPr>
           <w:rFonts w:ascii="Times New Roman" w:eastAsia="宋体" w:hAnsi="Times New Roman" w:cs="Times New Roman" w:hint="eastAsia"/>
         </w:rPr>
+        <w:lastRenderedPageBreak/>
         <w:t>支持建筑炮塔动画（</w:t>
       </w:r>
       <w:r>
@@ -1919,7 +1944,6 @@
         <w:rPr>
           <w:rFonts w:ascii="Times New Roman" w:eastAsia="宋体" w:hAnsi="Times New Roman" w:cs="Times New Roman" w:hint="eastAsia"/>
         </w:rPr>
-        <w:lastRenderedPageBreak/>
         <w:t>AI</w:t>
       </w:r>
       <w:r>
@@ -2780,7 +2804,14 @@
         <w:rPr>
           <w:rFonts w:ascii="Times New Roman" w:eastAsia="宋体" w:hAnsi="Times New Roman" w:cs="Times New Roman" w:hint="eastAsia"/>
         </w:rPr>
-        <w:t>修复当拖拽小绿点或触发事件、行为时，若突然失去焦点，会导致拖拽预览始终显示的</w:t>
+        <w:t>修复当拖拽小绿点或触发事件、行为时，若突然失去焦点，会导致拖拽预览始</w:t>
+      </w:r>
+      <w:r>
+        <w:rPr>
+          <w:rFonts w:ascii="Times New Roman" w:eastAsia="宋体" w:hAnsi="Times New Roman" w:cs="Times New Roman" w:hint="eastAsia"/>
+        </w:rPr>
+        <w:lastRenderedPageBreak/>
+        <w:t>终显示的</w:t>
       </w:r>
       <w:r>
         <w:rPr>
@@ -2804,7 +2835,6 @@
         <w:rPr>
           <w:rFonts w:ascii="Times New Roman" w:eastAsia="宋体" w:hAnsi="Times New Roman" w:cs="Times New Roman" w:hint="eastAsia"/>
         </w:rPr>
-        <w:lastRenderedPageBreak/>
         <w:t>修复导入已存在的地图对话框中三个导入选项不正常的</w:t>
       </w:r>
       <w:r>
@@ -3864,6 +3894,7 @@
         <w:rPr>
           <w:rFonts w:ascii="Times New Roman" w:eastAsia="宋体" w:hAnsi="Times New Roman" w:cs="Times New Roman" w:hint="eastAsia"/>
         </w:rPr>
+        <w:lastRenderedPageBreak/>
         <w:t>TheaterSuffixes</w:t>
       </w:r>
     </w:p>
@@ -3882,7 +3913,6 @@
         <w:rPr>
           <w:rFonts w:ascii="Times New Roman" w:eastAsia="宋体" w:hAnsi="Times New Roman" w:cs="Times New Roman" w:hint="eastAsia"/>
         </w:rPr>
-        <w:lastRenderedPageBreak/>
         <w:t>支持自定义气候类型的</w:t>
       </w:r>
       <w:r>
@@ -5047,6 +5077,7 @@
         <w:rPr>
           <w:rFonts w:ascii="Times New Roman" w:eastAsia="宋体" w:hAnsi="Times New Roman" w:cs="Times New Roman" w:hint="eastAsia"/>
         </w:rPr>
+        <w:lastRenderedPageBreak/>
         <w:t>支持半透明的建筑动画</w:t>
       </w:r>
     </w:p>
@@ -5065,7 +5096,6 @@
         <w:rPr>
           <w:rFonts w:ascii="Times New Roman" w:eastAsia="宋体" w:hAnsi="Times New Roman" w:cs="Times New Roman" w:hint="eastAsia"/>
         </w:rPr>
-        <w:lastRenderedPageBreak/>
         <w:t>修复当显示缺省图像开启时，对没有影子帧的单位显示缺省阴影的</w:t>
       </w:r>
       <w:r>
@@ -6068,6 +6098,7 @@
         <w:rPr>
           <w:rFonts w:ascii="Times New Roman" w:eastAsia="宋体" w:hAnsi="Times New Roman" w:cs="Times New Roman" w:hint="eastAsia"/>
         </w:rPr>
+        <w:lastRenderedPageBreak/>
         <w:t>优化单元标记和路径点的渲染效率</w:t>
       </w:r>
     </w:p>
@@ -6086,7 +6117,6 @@
         <w:rPr>
           <w:rFonts w:ascii="Times New Roman" w:eastAsia="宋体" w:hAnsi="Times New Roman" w:cs="Times New Roman" w:hint="eastAsia"/>
         </w:rPr>
-        <w:lastRenderedPageBreak/>
         <w:t>支持车辆单位的额外炮塔和额外炮管</w:t>
       </w:r>
     </w:p>
@@ -7149,6 +7179,7 @@
         <w:rPr>
           <w:rFonts w:ascii="Times New Roman" w:eastAsia="宋体" w:hAnsi="Times New Roman" w:cs="Times New Roman" w:hint="eastAsia"/>
         </w:rPr>
+        <w:lastRenderedPageBreak/>
         <w:t>新增</w:t>
       </w:r>
       <w:r>
@@ -7187,7 +7218,6 @@
           <w:sz w:val="28"/>
           <w:szCs w:val="32"/>
         </w:rPr>
-        <w:lastRenderedPageBreak/>
         <w:t>1.3.3 (2025.12.</w:t>
       </w:r>
       <w:r>
@@ -8238,6 +8268,7 @@
         <w:rPr>
           <w:rFonts w:ascii="Times New Roman" w:eastAsia="宋体" w:hAnsi="Times New Roman" w:cs="Times New Roman" w:hint="eastAsia"/>
         </w:rPr>
+        <w:lastRenderedPageBreak/>
         <w:t>修复当地图上存在</w:t>
       </w:r>
       <w:r>
@@ -8268,7 +8299,6 @@
         <w:rPr>
           <w:rFonts w:ascii="Times New Roman" w:eastAsia="宋体" w:hAnsi="Times New Roman" w:cs="Times New Roman" w:hint="eastAsia"/>
         </w:rPr>
-        <w:lastRenderedPageBreak/>
         <w:t>bug</w:t>
       </w:r>
     </w:p>
@@ -9319,6 +9349,7 @@
         <w:rPr>
           <w:rFonts w:ascii="Times New Roman" w:eastAsia="宋体" w:hAnsi="Times New Roman" w:cs="Times New Roman" w:hint="eastAsia"/>
         </w:rPr>
+        <w:lastRenderedPageBreak/>
         <w:t>“</w:t>
       </w:r>
       <w:r>
@@ -9331,14 +9362,7 @@
         <w:rPr>
           <w:rFonts w:ascii="Times New Roman" w:eastAsia="宋体" w:hAnsi="Times New Roman" w:cs="Times New Roman" w:hint="eastAsia"/>
         </w:rPr>
-        <w:t>”覆盖物为了兼容旧地编，进行了额外的偏移，在</w:t>
-      </w:r>
-      <w:r>
-        <w:rPr>
-          <w:rFonts w:ascii="Times New Roman" w:eastAsia="宋体" w:hAnsi="Times New Roman" w:cs="Times New Roman" w:hint="eastAsia"/>
-        </w:rPr>
-        <w:lastRenderedPageBreak/>
-        <w:t>修复后反而会偏移。</w:t>
+        <w:t>”覆盖物为了兼容旧地编，进行了额外的偏移，在修复后反而会偏移。</w:t>
       </w:r>
       <w:r>
         <w:rPr>
@@ -10406,6 +10430,7 @@
         <w:rPr>
           <w:rFonts w:ascii="Times New Roman" w:eastAsia="宋体" w:hAnsi="Times New Roman" w:cs="Times New Roman" w:hint="eastAsia"/>
         </w:rPr>
+        <w:lastRenderedPageBreak/>
         <w:t>新增触发注释窗口，可以为触发、小队、脚本、特遣、</w:t>
       </w:r>
       <w:r>
@@ -10430,14 +10455,7 @@
         <w:rPr>
           <w:rFonts w:ascii="Times New Roman" w:eastAsia="宋体" w:hAnsi="Times New Roman" w:cs="Times New Roman" w:hint="eastAsia"/>
         </w:rPr>
-        <w:t>添加注</w:t>
-      </w:r>
-      <w:r>
-        <w:rPr>
-          <w:rFonts w:ascii="Times New Roman" w:eastAsia="宋体" w:hAnsi="Times New Roman" w:cs="Times New Roman" w:hint="eastAsia"/>
-        </w:rPr>
-        <w:lastRenderedPageBreak/>
-        <w:t>释</w:t>
+        <w:t>添加注释</w:t>
       </w:r>
     </w:p>
     <w:p>
@@ -11594,6 +11612,7 @@
         <w:rPr>
           <w:rFonts w:ascii="Times New Roman" w:eastAsia="宋体" w:hAnsi="Times New Roman" w:cs="Times New Roman" w:hint="eastAsia"/>
         </w:rPr>
+        <w:lastRenderedPageBreak/>
         <w:t>修复了</w:t>
       </w:r>
       <w:r>
@@ -11630,7 +11649,6 @@
         <w:rPr>
           <w:rFonts w:ascii="Times New Roman" w:eastAsia="宋体" w:hAnsi="Times New Roman" w:cs="Times New Roman" w:hint="eastAsia"/>
         </w:rPr>
-        <w:lastRenderedPageBreak/>
         <w:t>支持</w:t>
       </w:r>
       <w:r>
@@ -12721,6 +12739,7 @@
         <w:rPr>
           <w:rFonts w:ascii="Times New Roman" w:eastAsia="宋体" w:hAnsi="Times New Roman" w:cs="Times New Roman" w:hint="eastAsia"/>
         </w:rPr>
+        <w:lastRenderedPageBreak/>
         <w:t>优化建筑动画读取逻辑，尊重动画的</w:t>
       </w:r>
       <w:r>
@@ -12751,14 +12770,980 @@
         <w:rPr>
           <w:rFonts w:ascii="Times New Roman" w:eastAsia="宋体" w:hAnsi="Times New Roman" w:cs="Times New Roman" w:hint="eastAsia"/>
         </w:rPr>
+        <w:t>Lua</w:t>
+      </w:r>
+      <w:r>
+        <w:rPr>
+          <w:rFonts w:ascii="Times New Roman" w:eastAsia="宋体" w:hAnsi="Times New Roman" w:cs="Times New Roman" w:hint="eastAsia"/>
+        </w:rPr>
+        <w:t>脚本终端支持搜索脚本文件</w:t>
+      </w:r>
+    </w:p>
+    <w:p>
+      <w:pPr>
+        <w:pStyle w:val="a9"/>
+        <w:numPr>
+          <w:ilvl w:val="0"/>
+          <w:numId w:val="31"/>
+        </w:numPr>
+        <w:rPr>
+          <w:rFonts w:ascii="Times New Roman" w:eastAsia="宋体" w:hAnsi="Times New Roman" w:cs="Times New Roman"/>
+        </w:rPr>
+      </w:pPr>
+      <w:r>
+        <w:rPr>
+          <w:rFonts w:ascii="Times New Roman" w:eastAsia="宋体" w:hAnsi="Times New Roman" w:cs="Times New Roman" w:hint="eastAsia"/>
+        </w:rPr>
+        <w:t>微调地图边界细蓝线的位置</w:t>
+      </w:r>
+    </w:p>
+    <w:p>
+      <w:pPr>
+        <w:pStyle w:val="a9"/>
+        <w:numPr>
+          <w:ilvl w:val="0"/>
+          <w:numId w:val="31"/>
+        </w:numPr>
+        <w:rPr>
+          <w:rFonts w:ascii="Times New Roman" w:eastAsia="宋体" w:hAnsi="Times New Roman" w:cs="Times New Roman"/>
+        </w:rPr>
+      </w:pPr>
+      <w:r>
+        <w:rPr>
+          <w:rFonts w:ascii="Times New Roman" w:eastAsia="宋体" w:hAnsi="Times New Roman" w:cs="Times New Roman" w:hint="eastAsia"/>
+        </w:rPr>
+        <w:t>修复了</w:t>
+      </w:r>
+      <w:r>
+        <w:rPr>
+          <w:rFonts w:ascii="Times New Roman" w:eastAsia="宋体" w:hAnsi="Times New Roman" w:cs="Times New Roman" w:hint="eastAsia"/>
+        </w:rPr>
+        <w:t>Vxl</w:t>
+      </w:r>
+      <w:r>
+        <w:rPr>
+          <w:rFonts w:ascii="Times New Roman" w:eastAsia="宋体" w:hAnsi="Times New Roman" w:cs="Times New Roman" w:hint="eastAsia"/>
+        </w:rPr>
+        <w:t>车辆</w:t>
+      </w:r>
+      <w:r>
+        <w:rPr>
+          <w:rFonts w:ascii="Times New Roman" w:eastAsia="宋体" w:hAnsi="Times New Roman" w:cs="Times New Roman" w:hint="eastAsia"/>
+        </w:rPr>
+        <w:t>Noshadow=yes</w:t>
+      </w:r>
+      <w:r>
+        <w:rPr>
+          <w:rFonts w:ascii="Times New Roman" w:eastAsia="宋体" w:hAnsi="Times New Roman" w:cs="Times New Roman" w:hint="eastAsia"/>
+        </w:rPr>
+        <w:t>时仍会显示阴影的</w:t>
+      </w:r>
+      <w:r>
+        <w:rPr>
+          <w:rFonts w:ascii="Times New Roman" w:eastAsia="宋体" w:hAnsi="Times New Roman" w:cs="Times New Roman" w:hint="eastAsia"/>
+        </w:rPr>
+        <w:t>bug</w:t>
+      </w:r>
+    </w:p>
+    <w:p>
+      <w:pPr>
+        <w:pStyle w:val="a9"/>
+        <w:numPr>
+          <w:ilvl w:val="0"/>
+          <w:numId w:val="31"/>
+        </w:numPr>
+        <w:rPr>
+          <w:rFonts w:ascii="Times New Roman" w:eastAsia="宋体" w:hAnsi="Times New Roman" w:cs="Times New Roman"/>
+        </w:rPr>
+      </w:pPr>
+      <w:r>
+        <w:rPr>
+          <w:rFonts w:ascii="Times New Roman" w:eastAsia="宋体" w:hAnsi="Times New Roman" w:cs="Times New Roman" w:hint="eastAsia"/>
+        </w:rPr>
+        <w:t>修复部分情况下绘制连接地形上升、下降段高度错误的</w:t>
+      </w:r>
+      <w:r>
+        <w:rPr>
+          <w:rFonts w:ascii="Times New Roman" w:eastAsia="宋体" w:hAnsi="Times New Roman" w:cs="Times New Roman" w:hint="eastAsia"/>
+        </w:rPr>
+        <w:t>bug</w:t>
+      </w:r>
+    </w:p>
+    <w:p>
+      <w:pPr>
+        <w:pStyle w:val="a9"/>
+        <w:numPr>
+          <w:ilvl w:val="0"/>
+          <w:numId w:val="31"/>
+        </w:numPr>
+        <w:rPr>
+          <w:rFonts w:ascii="Times New Roman" w:eastAsia="宋体" w:hAnsi="Times New Roman" w:cs="Times New Roman"/>
+        </w:rPr>
+      </w:pPr>
+      <w:r>
+        <w:rPr>
+          <w:rFonts w:ascii="Times New Roman" w:eastAsia="宋体" w:hAnsi="Times New Roman" w:cs="Times New Roman" w:hint="eastAsia"/>
+        </w:rPr>
+        <w:t>优化光照沙盒切换时的性能</w:t>
+      </w:r>
+    </w:p>
+    <w:p>
+      <w:pPr>
+        <w:pStyle w:val="a9"/>
+        <w:numPr>
+          <w:ilvl w:val="0"/>
+          <w:numId w:val="31"/>
+        </w:numPr>
+        <w:rPr>
+          <w:rFonts w:ascii="Times New Roman" w:eastAsia="宋体" w:hAnsi="Times New Roman" w:cs="Times New Roman"/>
+        </w:rPr>
+      </w:pPr>
+      <w:r>
+        <w:rPr>
+          <w:rFonts w:ascii="Times New Roman" w:eastAsia="宋体" w:hAnsi="Times New Roman" w:cs="Times New Roman" w:hint="eastAsia"/>
+        </w:rPr>
+        <w:t>新增</w:t>
+      </w:r>
+      <w:r>
+        <w:rPr>
+          <w:rFonts w:ascii="Times New Roman" w:eastAsia="宋体" w:hAnsi="Times New Roman" w:cs="Times New Roman" w:hint="eastAsia"/>
+        </w:rPr>
+        <w:t>LightingPreview</w:t>
+      </w:r>
+      <w:r>
+        <w:rPr>
+          <w:rFonts w:ascii="Times New Roman" w:eastAsia="宋体" w:hAnsi="Times New Roman" w:cs="Times New Roman" w:hint="eastAsia"/>
+        </w:rPr>
+        <w:t>.</w:t>
+      </w:r>
+      <w:r>
+        <w:rPr>
+          <w:rFonts w:ascii="Times New Roman" w:eastAsia="宋体" w:hAnsi="Times New Roman" w:cs="Times New Roman" w:hint="eastAsia"/>
+        </w:rPr>
+        <w:t>Tint</w:t>
+      </w:r>
+      <w:r>
+        <w:rPr>
+          <w:rFonts w:ascii="Times New Roman" w:eastAsia="宋体" w:hAnsi="Times New Roman" w:cs="Times New Roman" w:hint="eastAsia"/>
+        </w:rPr>
+        <w:t>TileSetBrowserView</w:t>
+      </w:r>
+      <w:r>
+        <w:rPr>
+          <w:rFonts w:ascii="Times New Roman" w:eastAsia="宋体" w:hAnsi="Times New Roman" w:cs="Times New Roman" w:hint="eastAsia"/>
+        </w:rPr>
+        <w:t>，控制是否按光照沙盒渲染地形浏览器图像</w:t>
+      </w:r>
+    </w:p>
+    <w:p>
+      <w:pPr>
+        <w:pStyle w:val="a9"/>
+        <w:numPr>
+          <w:ilvl w:val="0"/>
+          <w:numId w:val="31"/>
+        </w:numPr>
+        <w:rPr>
+          <w:rFonts w:ascii="Times New Roman" w:eastAsia="宋体" w:hAnsi="Times New Roman" w:cs="Times New Roman"/>
+        </w:rPr>
+      </w:pPr>
+      <w:r>
+        <w:rPr>
+          <w:rFonts w:ascii="Times New Roman" w:eastAsia="宋体" w:hAnsi="Times New Roman" w:cs="Times New Roman" w:hint="eastAsia"/>
+        </w:rPr>
+        <w:t>新增距离标尺，可以记录当前鼠标位置距离上次按下左键位置的距离，记录历史数量见</w:t>
+      </w:r>
+      <w:r>
+        <w:rPr>
+          <w:rFonts w:ascii="Times New Roman" w:eastAsia="宋体" w:hAnsi="Times New Roman" w:cs="Times New Roman" w:hint="eastAsia"/>
+        </w:rPr>
+        <w:t>DistanceRuler.Records</w:t>
+      </w:r>
+    </w:p>
+    <w:p>
+      <w:pPr>
+        <w:pStyle w:val="a9"/>
+        <w:numPr>
+          <w:ilvl w:val="0"/>
+          <w:numId w:val="31"/>
+        </w:numPr>
+        <w:rPr>
+          <w:rFonts w:ascii="Times New Roman" w:eastAsia="宋体" w:hAnsi="Times New Roman" w:cs="Times New Roman"/>
+        </w:rPr>
+      </w:pPr>
+      <w:r>
+        <w:rPr>
+          <w:rFonts w:ascii="Times New Roman" w:eastAsia="宋体" w:hAnsi="Times New Roman" w:cs="Times New Roman" w:hint="eastAsia"/>
+        </w:rPr>
+        <w:t>微调新建地图时可视边界数值</w:t>
+      </w:r>
+    </w:p>
+    <w:p>
+      <w:pPr>
+        <w:pStyle w:val="a9"/>
+        <w:numPr>
+          <w:ilvl w:val="0"/>
+          <w:numId w:val="31"/>
+        </w:numPr>
+        <w:rPr>
+          <w:rFonts w:ascii="Times New Roman" w:eastAsia="宋体" w:hAnsi="Times New Roman" w:cs="Times New Roman"/>
+        </w:rPr>
+      </w:pPr>
+      <w:r>
+        <w:rPr>
+          <w:rFonts w:ascii="Times New Roman" w:eastAsia="宋体" w:hAnsi="Times New Roman" w:cs="Times New Roman" w:hint="eastAsia"/>
+        </w:rPr>
+        <w:t>修复平坦地形工具无法平坦地图边缘斜坡的</w:t>
+      </w:r>
+      <w:r>
+        <w:rPr>
+          <w:rFonts w:ascii="Times New Roman" w:eastAsia="宋体" w:hAnsi="Times New Roman" w:cs="Times New Roman" w:hint="eastAsia"/>
+        </w:rPr>
+        <w:t>bug</w:t>
+      </w:r>
+    </w:p>
+    <w:p>
+      <w:pPr>
+        <w:pStyle w:val="a9"/>
+        <w:numPr>
+          <w:ilvl w:val="0"/>
+          <w:numId w:val="31"/>
+        </w:numPr>
+        <w:rPr>
+          <w:rFonts w:ascii="Times New Roman" w:eastAsia="宋体" w:hAnsi="Times New Roman" w:cs="Times New Roman"/>
+        </w:rPr>
+      </w:pPr>
+      <w:r>
+        <w:rPr>
+          <w:rFonts w:ascii="Times New Roman" w:eastAsia="宋体" w:hAnsi="Times New Roman" w:cs="Times New Roman" w:hint="eastAsia"/>
+        </w:rPr>
+        <w:t>绘制连接地形可以将鼠标移动到地图边界外，更方便靠近边界的绘制</w:t>
+      </w:r>
+    </w:p>
+    <w:p>
+      <w:pPr>
+        <w:pStyle w:val="a9"/>
+        <w:numPr>
+          <w:ilvl w:val="0"/>
+          <w:numId w:val="31"/>
+        </w:numPr>
+        <w:rPr>
+          <w:rFonts w:ascii="Times New Roman" w:eastAsia="宋体" w:hAnsi="Times New Roman" w:cs="Times New Roman"/>
+        </w:rPr>
+      </w:pPr>
+      <w:r>
+        <w:rPr>
+          <w:rFonts w:ascii="Times New Roman" w:eastAsia="宋体" w:hAnsi="Times New Roman" w:cs="Times New Roman" w:hint="eastAsia"/>
+        </w:rPr>
+        <w:t>优化</w:t>
+      </w:r>
+      <w:r>
+        <w:rPr>
+          <w:rFonts w:ascii="Times New Roman" w:eastAsia="宋体" w:hAnsi="Times New Roman" w:cs="Times New Roman" w:hint="eastAsia"/>
+        </w:rPr>
+        <w:t>IsoMapPack5</w:t>
+      </w:r>
+      <w:r>
+        <w:rPr>
+          <w:rFonts w:ascii="Times New Roman" w:eastAsia="宋体" w:hAnsi="Times New Roman" w:cs="Times New Roman" w:hint="eastAsia"/>
+        </w:rPr>
+        <w:t>压缩，减少地图体积，减少游戏内大地图地形异常的可能</w:t>
+      </w:r>
+    </w:p>
+    <w:p>
+      <w:pPr>
+        <w:pStyle w:val="a9"/>
+        <w:numPr>
+          <w:ilvl w:val="0"/>
+          <w:numId w:val="31"/>
+        </w:numPr>
+        <w:rPr>
+          <w:rFonts w:ascii="Times New Roman" w:eastAsia="宋体" w:hAnsi="Times New Roman" w:cs="Times New Roman"/>
+        </w:rPr>
+      </w:pPr>
+      <w:r>
+        <w:rPr>
+          <w:rFonts w:ascii="Times New Roman" w:eastAsia="宋体" w:hAnsi="Times New Roman" w:cs="Times New Roman" w:hint="eastAsia"/>
+        </w:rPr>
+        <w:t>修复调整地图大小后隧道位置错误的</w:t>
+      </w:r>
+      <w:r>
+        <w:rPr>
+          <w:rFonts w:ascii="Times New Roman" w:eastAsia="宋体" w:hAnsi="Times New Roman" w:cs="Times New Roman" w:hint="eastAsia"/>
+        </w:rPr>
+        <w:t>bug</w:t>
+      </w:r>
+    </w:p>
+    <w:p>
+      <w:pPr>
+        <w:pStyle w:val="a9"/>
+        <w:numPr>
+          <w:ilvl w:val="0"/>
+          <w:numId w:val="31"/>
+        </w:numPr>
+        <w:rPr>
+          <w:rFonts w:ascii="Times New Roman" w:eastAsia="宋体" w:hAnsi="Times New Roman" w:cs="Times New Roman"/>
+        </w:rPr>
+      </w:pPr>
+      <w:r>
+        <w:rPr>
+          <w:rFonts w:ascii="Times New Roman" w:eastAsia="宋体" w:hAnsi="Times New Roman" w:cs="Times New Roman" w:hint="eastAsia"/>
+        </w:rPr>
+        <w:t>修复了在开启输入法和部分情况下在地图界面按</w:t>
+      </w:r>
+      <w:r>
+        <w:rPr>
+          <w:rFonts w:ascii="Times New Roman" w:eastAsia="宋体" w:hAnsi="Times New Roman" w:cs="Times New Roman" w:hint="eastAsia"/>
+        </w:rPr>
+        <w:t>D</w:t>
+      </w:r>
+      <w:r>
+        <w:rPr>
+          <w:rFonts w:ascii="Times New Roman" w:eastAsia="宋体" w:hAnsi="Times New Roman" w:cs="Times New Roman" w:hint="eastAsia"/>
+        </w:rPr>
+        <w:t>、</w:t>
+      </w:r>
+      <w:r>
+        <w:rPr>
+          <w:rFonts w:ascii="Times New Roman" w:eastAsia="宋体" w:hAnsi="Times New Roman" w:cs="Times New Roman" w:hint="eastAsia"/>
+        </w:rPr>
+        <w:t>[</w:t>
+      </w:r>
+      <w:r>
+        <w:rPr>
+          <w:rFonts w:ascii="Times New Roman" w:eastAsia="宋体" w:hAnsi="Times New Roman" w:cs="Times New Roman" w:hint="eastAsia"/>
+        </w:rPr>
+        <w:t>、</w:t>
+      </w:r>
+      <w:r>
+        <w:rPr>
+          <w:rFonts w:ascii="Times New Roman" w:eastAsia="宋体" w:hAnsi="Times New Roman" w:cs="Times New Roman" w:hint="eastAsia"/>
+        </w:rPr>
+        <w:t>]</w:t>
+      </w:r>
+      <w:r>
+        <w:rPr>
+          <w:rFonts w:ascii="Times New Roman" w:eastAsia="宋体" w:hAnsi="Times New Roman" w:cs="Times New Roman" w:hint="eastAsia"/>
+        </w:rPr>
+        <w:t>键无效的</w:t>
+      </w:r>
+      <w:r>
+        <w:rPr>
+          <w:rFonts w:ascii="Times New Roman" w:eastAsia="宋体" w:hAnsi="Times New Roman" w:cs="Times New Roman" w:hint="eastAsia"/>
+        </w:rPr>
+        <w:t>bug</w:t>
+      </w:r>
+    </w:p>
+    <w:p>
+      <w:pPr>
+        <w:pStyle w:val="a9"/>
+        <w:numPr>
+          <w:ilvl w:val="0"/>
+          <w:numId w:val="31"/>
+        </w:numPr>
+        <w:rPr>
+          <w:rFonts w:ascii="Times New Roman" w:eastAsia="宋体" w:hAnsi="Times New Roman" w:cs="Times New Roman"/>
+        </w:rPr>
+      </w:pPr>
+      <w:r>
+        <w:rPr>
+          <w:rFonts w:ascii="Times New Roman" w:eastAsia="宋体" w:hAnsi="Times New Roman" w:cs="Times New Roman" w:hint="eastAsia"/>
+        </w:rPr>
+        <w:t>修复了新城市下使用绘制悬崖后部工具时，按</w:t>
+      </w:r>
+      <w:r>
+        <w:rPr>
+          <w:rFonts w:ascii="Times New Roman" w:eastAsia="宋体" w:hAnsi="Times New Roman" w:cs="Times New Roman" w:hint="eastAsia"/>
+        </w:rPr>
+        <w:t>A</w:t>
+      </w:r>
+      <w:r>
+        <w:rPr>
+          <w:rFonts w:ascii="Times New Roman" w:eastAsia="宋体" w:hAnsi="Times New Roman" w:cs="Times New Roman" w:hint="eastAsia"/>
+        </w:rPr>
+        <w:t>键无法切换悬崖类型的</w:t>
+      </w:r>
+      <w:r>
+        <w:rPr>
+          <w:rFonts w:ascii="Times New Roman" w:eastAsia="宋体" w:hAnsi="Times New Roman" w:cs="Times New Roman" w:hint="eastAsia"/>
+        </w:rPr>
+        <w:t>bug</w:t>
+      </w:r>
+    </w:p>
+    <w:p>
+      <w:pPr>
+        <w:pStyle w:val="a9"/>
+        <w:numPr>
+          <w:ilvl w:val="0"/>
+          <w:numId w:val="31"/>
+        </w:numPr>
+        <w:rPr>
+          <w:rFonts w:ascii="Times New Roman" w:eastAsia="宋体" w:hAnsi="Times New Roman" w:cs="Times New Roman"/>
+        </w:rPr>
+      </w:pPr>
+      <w:r>
+        <w:rPr>
+          <w:rFonts w:ascii="Times New Roman" w:eastAsia="宋体" w:hAnsi="Times New Roman" w:cs="Times New Roman" w:hint="eastAsia"/>
+        </w:rPr>
+        <w:t>增强绘制悬崖工具，可以在不同地图类型的</w:t>
+      </w:r>
+      <w:r>
+        <w:rPr>
+          <w:rFonts w:ascii="Times New Roman" w:eastAsia="宋体" w:hAnsi="Times New Roman" w:cs="Times New Roman" w:hint="eastAsia"/>
+        </w:rPr>
+        <w:t>[TheaterInfo]</w:t>
+      </w:r>
+      <w:r>
+        <w:rPr>
+          <w:rFonts w:ascii="Times New Roman" w:eastAsia="宋体" w:hAnsi="Times New Roman" w:cs="Times New Roman" w:hint="eastAsia"/>
+        </w:rPr>
+        <w:t>（如</w:t>
+      </w:r>
+      <w:r>
+        <w:rPr>
+          <w:rFonts w:ascii="Times New Roman" w:eastAsia="宋体" w:hAnsi="Times New Roman" w:cs="Times New Roman" w:hint="eastAsia"/>
+        </w:rPr>
+        <w:t>[SnowInfo]</w:t>
+      </w:r>
+      <w:r>
+        <w:rPr>
+          <w:rFonts w:ascii="Times New Roman" w:eastAsia="宋体" w:hAnsi="Times New Roman" w:cs="Times New Roman" w:hint="eastAsia"/>
+        </w:rPr>
+        <w:t>）中填写</w:t>
+      </w:r>
+      <w:r>
+        <w:rPr>
+          <w:rFonts w:ascii="Times New Roman" w:eastAsia="宋体" w:hAnsi="Times New Roman" w:cs="Times New Roman" w:hint="eastAsia"/>
+        </w:rPr>
+        <w:t>Cliffs2</w:t>
+      </w:r>
+      <w:r>
+        <w:rPr>
+          <w:rFonts w:ascii="Times New Roman" w:eastAsia="宋体" w:hAnsi="Times New Roman" w:cs="Times New Roman" w:hint="eastAsia"/>
+        </w:rPr>
+        <w:t>、</w:t>
+      </w:r>
+      <w:r>
+        <w:rPr>
+          <w:rFonts w:ascii="Times New Roman" w:eastAsia="宋体" w:hAnsi="Times New Roman" w:cs="Times New Roman" w:hint="eastAsia"/>
+        </w:rPr>
+        <w:t>CliffsWater2</w:t>
+      </w:r>
+      <w:r>
+        <w:rPr>
+          <w:rFonts w:ascii="Times New Roman" w:eastAsia="宋体" w:hAnsi="Times New Roman" w:cs="Times New Roman" w:hint="eastAsia"/>
+        </w:rPr>
+        <w:t>以支持悬崖类型切换；在存在月球悬崖时，支持绘制月球悬崖</w:t>
+      </w:r>
+    </w:p>
+    <w:p>
+      <w:pPr>
+        <w:pStyle w:val="a9"/>
+        <w:numPr>
+          <w:ilvl w:val="0"/>
+          <w:numId w:val="31"/>
+        </w:numPr>
+        <w:rPr>
+          <w:rFonts w:ascii="Times New Roman" w:eastAsia="宋体" w:hAnsi="Times New Roman" w:cs="Times New Roman"/>
+        </w:rPr>
+      </w:pPr>
+      <w:r>
+        <w:rPr>
+          <w:rFonts w:ascii="Times New Roman" w:eastAsia="宋体" w:hAnsi="Times New Roman" w:cs="Times New Roman" w:hint="eastAsia"/>
+        </w:rPr>
+        <w:t>支持</w:t>
+      </w:r>
+      <w:r>
+        <w:rPr>
+          <w:rFonts w:ascii="Times New Roman" w:eastAsia="宋体" w:hAnsi="Times New Roman" w:cs="Times New Roman" w:hint="eastAsia"/>
+        </w:rPr>
+        <w:t>32</w:t>
+      </w:r>
+      <w:r>
+        <w:rPr>
+          <w:rFonts w:ascii="Times New Roman" w:eastAsia="宋体" w:hAnsi="Times New Roman" w:cs="Times New Roman" w:hint="eastAsia"/>
+        </w:rPr>
+        <w:t>向面向</w:t>
+      </w:r>
+      <w:r>
+        <w:rPr>
+          <w:rFonts w:ascii="Times New Roman" w:eastAsia="宋体" w:hAnsi="Times New Roman" w:cs="Times New Roman" w:hint="eastAsia"/>
+        </w:rPr>
+        <w:t>与拖拽</w:t>
+      </w:r>
+      <w:r>
+        <w:rPr>
+          <w:rFonts w:ascii="Times New Roman" w:eastAsia="宋体" w:hAnsi="Times New Roman" w:cs="Times New Roman" w:hint="eastAsia"/>
+        </w:rPr>
+        <w:t>，详见</w:t>
+      </w:r>
+      <w:r>
+        <w:rPr>
+          <w:rFonts w:ascii="Times New Roman" w:eastAsia="宋体" w:hAnsi="Times New Roman" w:cs="Times New Roman" w:hint="eastAsia"/>
+        </w:rPr>
+        <w:t>ExtFacings</w:t>
+      </w:r>
+      <w:r>
+        <w:rPr>
+          <w:rFonts w:ascii="Times New Roman" w:eastAsia="宋体" w:hAnsi="Times New Roman" w:cs="Times New Roman" w:hint="eastAsia"/>
+        </w:rPr>
+        <w:t>与</w:t>
+      </w:r>
+      <w:r>
+        <w:rPr>
+          <w:rFonts w:ascii="Times New Roman" w:eastAsia="宋体" w:hAnsi="Times New Roman" w:cs="Times New Roman" w:hint="eastAsia"/>
+        </w:rPr>
+        <w:t>ExtFacings.Drag</w:t>
+      </w:r>
+    </w:p>
+    <w:p>
+      <w:pPr>
+        <w:pStyle w:val="a9"/>
+        <w:numPr>
+          <w:ilvl w:val="0"/>
+          <w:numId w:val="31"/>
+        </w:numPr>
+        <w:rPr>
+          <w:rFonts w:ascii="Times New Roman" w:eastAsia="宋体" w:hAnsi="Times New Roman" w:cs="Times New Roman"/>
+        </w:rPr>
+      </w:pPr>
+      <w:r>
+        <w:rPr>
+          <w:rFonts w:ascii="Times New Roman" w:eastAsia="宋体" w:hAnsi="Times New Roman" w:cs="Times New Roman" w:hint="eastAsia"/>
+        </w:rPr>
+        <w:t>重写部分字符串类型，优化字符串加载稳定性</w:t>
+      </w:r>
+    </w:p>
+    <w:p>
+      <w:pPr>
+        <w:pStyle w:val="a9"/>
+        <w:numPr>
+          <w:ilvl w:val="0"/>
+          <w:numId w:val="31"/>
+        </w:numPr>
+        <w:rPr>
+          <w:rFonts w:ascii="Times New Roman" w:eastAsia="宋体" w:hAnsi="Times New Roman" w:cs="Times New Roman"/>
+        </w:rPr>
+      </w:pPr>
+      <w:r>
+        <w:rPr>
+          <w:rFonts w:ascii="Times New Roman" w:eastAsia="宋体" w:hAnsi="Times New Roman" w:cs="Times New Roman" w:hint="eastAsia"/>
+        </w:rPr>
+        <w:t>优化抬升</w:t>
+      </w:r>
+      <w:r>
+        <w:rPr>
+          <w:rFonts w:ascii="Times New Roman" w:eastAsia="宋体" w:hAnsi="Times New Roman" w:cs="Times New Roman" w:hint="eastAsia"/>
+        </w:rPr>
+        <w:t>/</w:t>
+      </w:r>
+      <w:r>
+        <w:rPr>
+          <w:rFonts w:ascii="Times New Roman" w:eastAsia="宋体" w:hAnsi="Times New Roman" w:cs="Times New Roman" w:hint="eastAsia"/>
+        </w:rPr>
+        <w:t>降低地表算法，不会出现异常的大范围变动</w:t>
+      </w:r>
+    </w:p>
+    <w:p>
+      <w:pPr>
+        <w:pStyle w:val="a9"/>
+        <w:numPr>
+          <w:ilvl w:val="0"/>
+          <w:numId w:val="31"/>
+        </w:numPr>
+        <w:rPr>
+          <w:rFonts w:ascii="Times New Roman" w:eastAsia="宋体" w:hAnsi="Times New Roman" w:cs="Times New Roman"/>
+        </w:rPr>
+      </w:pPr>
+      <w:r>
+        <w:rPr>
+          <w:rFonts w:ascii="Times New Roman" w:eastAsia="宋体" w:hAnsi="Times New Roman" w:cs="Times New Roman" w:hint="eastAsia"/>
+        </w:rPr>
+        <w:t>FA2sp.log</w:t>
+      </w:r>
+      <w:r>
+        <w:rPr>
+          <w:rFonts w:ascii="Times New Roman" w:eastAsia="宋体" w:hAnsi="Times New Roman" w:cs="Times New Roman" w:hint="eastAsia"/>
+        </w:rPr>
+        <w:t>使用</w:t>
+      </w:r>
+      <w:r>
+        <w:rPr>
+          <w:rFonts w:ascii="Times New Roman" w:eastAsia="宋体" w:hAnsi="Times New Roman" w:cs="Times New Roman" w:hint="eastAsia"/>
+        </w:rPr>
+        <w:t>UTF8</w:t>
+      </w:r>
+      <w:r>
+        <w:rPr>
+          <w:rFonts w:ascii="Times New Roman" w:eastAsia="宋体" w:hAnsi="Times New Roman" w:cs="Times New Roman" w:hint="eastAsia"/>
+        </w:rPr>
+        <w:t>编码</w:t>
+      </w:r>
+    </w:p>
+    <w:p>
+      <w:pPr>
+        <w:pStyle w:val="a9"/>
+        <w:numPr>
+          <w:ilvl w:val="0"/>
+          <w:numId w:val="31"/>
+        </w:numPr>
+        <w:rPr>
+          <w:rFonts w:ascii="Times New Roman" w:eastAsia="宋体" w:hAnsi="Times New Roman" w:cs="Times New Roman"/>
+        </w:rPr>
+      </w:pPr>
+      <w:r>
+        <w:rPr>
+          <w:rFonts w:ascii="Times New Roman" w:eastAsia="宋体" w:hAnsi="Times New Roman" w:cs="Times New Roman" w:hint="eastAsia"/>
+        </w:rPr>
+        <w:t>保存地图时可以维持已有的</w:t>
+      </w:r>
+      <w:r>
+        <w:rPr>
+          <w:rFonts w:ascii="Times New Roman" w:eastAsia="宋体" w:hAnsi="Times New Roman" w:cs="Times New Roman" w:hint="eastAsia"/>
+        </w:rPr>
+        <w:t>ini</w:t>
+      </w:r>
+      <w:r>
+        <w:rPr>
+          <w:rFonts w:ascii="Times New Roman" w:eastAsia="宋体" w:hAnsi="Times New Roman" w:cs="Times New Roman" w:hint="eastAsia"/>
+        </w:rPr>
+        <w:t>小节顺序，详见</w:t>
+      </w:r>
+      <w:r>
+        <w:rPr>
+          <w:rFonts w:ascii="Times New Roman" w:eastAsia="宋体" w:hAnsi="Times New Roman" w:cs="Times New Roman" w:hint="eastAsia"/>
+        </w:rPr>
+        <w:t>SaveMap.PreserveINISorting</w:t>
+      </w:r>
+    </w:p>
+    <w:p>
+      <w:pPr>
+        <w:pStyle w:val="a9"/>
+        <w:numPr>
+          <w:ilvl w:val="0"/>
+          <w:numId w:val="31"/>
+        </w:numPr>
+        <w:rPr>
+          <w:rFonts w:ascii="Times New Roman" w:eastAsia="宋体" w:hAnsi="Times New Roman" w:cs="Times New Roman"/>
+        </w:rPr>
+      </w:pPr>
+      <w:r>
+        <w:rPr>
+          <w:rFonts w:ascii="Times New Roman" w:eastAsia="宋体" w:hAnsi="Times New Roman" w:cs="Times New Roman" w:hint="eastAsia"/>
+        </w:rPr>
+        <w:t>重写撤销重做系统，所有撤销动作均支持完整重做</w:t>
+      </w:r>
+    </w:p>
+    <w:p>
+      <w:pPr>
+        <w:pStyle w:val="a9"/>
+        <w:numPr>
+          <w:ilvl w:val="0"/>
+          <w:numId w:val="31"/>
+        </w:numPr>
+        <w:rPr>
+          <w:rFonts w:ascii="Times New Roman" w:eastAsia="宋体" w:hAnsi="Times New Roman" w:cs="Times New Roman"/>
+        </w:rPr>
+      </w:pPr>
+      <w:r>
+        <w:rPr>
+          <w:rFonts w:ascii="Times New Roman" w:eastAsia="宋体" w:hAnsi="Times New Roman" w:cs="Times New Roman" w:hint="eastAsia"/>
+        </w:rPr>
+        <w:t>撤销重做系统能够记录游戏对象的修改历史，详见</w:t>
+      </w:r>
+      <w:r>
+        <w:rPr>
+          <w:rFonts w:ascii="Times New Roman" w:eastAsia="宋体" w:hAnsi="Times New Roman" w:cs="Times New Roman" w:hint="eastAsia"/>
+        </w:rPr>
+        <w:t>UndoRedo.RecordObjects</w:t>
+      </w:r>
+    </w:p>
+    <w:p>
+      <w:pPr>
+        <w:pStyle w:val="a9"/>
+        <w:numPr>
+          <w:ilvl w:val="0"/>
+          <w:numId w:val="31"/>
+        </w:numPr>
+        <w:rPr>
+          <w:rFonts w:ascii="Times New Roman" w:eastAsia="宋体" w:hAnsi="Times New Roman" w:cs="Times New Roman"/>
+        </w:rPr>
+      </w:pPr>
+      <w:r>
+        <w:rPr>
+          <w:rFonts w:ascii="Times New Roman" w:eastAsia="宋体" w:hAnsi="Times New Roman" w:cs="Times New Roman" w:hint="eastAsia"/>
+        </w:rPr>
+        <w:t>支持设置</w:t>
+      </w:r>
+      <w:r>
+        <w:rPr>
+          <w:rFonts w:ascii="Times New Roman" w:eastAsia="宋体" w:hAnsi="Times New Roman" w:cs="Times New Roman" w:hint="eastAsia"/>
+        </w:rPr>
+        <w:t>RubblePalette</w:t>
+      </w:r>
+      <w:r>
+        <w:rPr>
+          <w:rFonts w:ascii="Times New Roman" w:eastAsia="宋体" w:hAnsi="Times New Roman" w:cs="Times New Roman" w:hint="eastAsia"/>
+        </w:rPr>
+        <w:t>=</w:t>
+      </w:r>
+      <w:r>
+        <w:rPr>
+          <w:rFonts w:ascii="Times New Roman" w:eastAsia="宋体" w:hAnsi="Times New Roman" w:cs="Times New Roman" w:hint="eastAsia"/>
+        </w:rPr>
+        <w:t>指定建筑废墟色盘</w:t>
+      </w:r>
+    </w:p>
+    <w:p>
+      <w:pPr>
+        <w:pStyle w:val="a9"/>
+        <w:numPr>
+          <w:ilvl w:val="0"/>
+          <w:numId w:val="31"/>
+        </w:numPr>
+        <w:rPr>
+          <w:rFonts w:ascii="Times New Roman" w:eastAsia="宋体" w:hAnsi="Times New Roman" w:cs="Times New Roman"/>
+        </w:rPr>
+      </w:pPr>
+      <w:r>
+        <w:rPr>
+          <w:rFonts w:ascii="Times New Roman" w:eastAsia="宋体" w:hAnsi="Times New Roman" w:cs="Times New Roman" w:hint="eastAsia"/>
+        </w:rPr>
+        <w:t>提升稳定性</w:t>
+      </w:r>
+    </w:p>
+    <w:p>
+      <w:pPr>
+        <w:pStyle w:val="a9"/>
+        <w:numPr>
+          <w:ilvl w:val="0"/>
+          <w:numId w:val="31"/>
+        </w:numPr>
+        <w:rPr>
+          <w:rFonts w:ascii="Times New Roman" w:eastAsia="宋体" w:hAnsi="Times New Roman" w:cs="Times New Roman"/>
+        </w:rPr>
+      </w:pPr>
+      <w:r>
+        <w:rPr>
+          <w:rFonts w:ascii="Times New Roman" w:eastAsia="宋体" w:hAnsi="Times New Roman" w:cs="Times New Roman" w:hint="eastAsia"/>
+        </w:rPr>
+        <w:t>优化素材图像内存占用</w:t>
+      </w:r>
+    </w:p>
+    <w:p>
+      <w:pPr>
+        <w:pStyle w:val="a9"/>
+        <w:numPr>
+          <w:ilvl w:val="0"/>
+          <w:numId w:val="31"/>
+        </w:numPr>
+        <w:rPr>
+          <w:rFonts w:ascii="Times New Roman" w:eastAsia="宋体" w:hAnsi="Times New Roman" w:cs="Times New Roman"/>
+        </w:rPr>
+      </w:pPr>
+      <w:r>
+        <w:rPr>
+          <w:rFonts w:ascii="Times New Roman" w:eastAsia="宋体" w:hAnsi="Times New Roman" w:cs="Times New Roman" w:hint="eastAsia"/>
+        </w:rPr>
+        <w:t>重写</w:t>
+      </w:r>
+      <w:r>
+        <w:rPr>
+          <w:rFonts w:ascii="Times New Roman" w:eastAsia="宋体" w:hAnsi="Times New Roman" w:cs="Times New Roman" w:hint="eastAsia"/>
+        </w:rPr>
+        <w:t>mix</w:t>
+      </w:r>
+      <w:r>
+        <w:rPr>
+          <w:rFonts w:ascii="Times New Roman" w:eastAsia="宋体" w:hAnsi="Times New Roman" w:cs="Times New Roman" w:hint="eastAsia"/>
+        </w:rPr>
+        <w:t>加载逻辑，修复加载中的内存泄漏</w:t>
+      </w:r>
+      <w:r>
+        <w:rPr>
+          <w:rFonts w:ascii="Times New Roman" w:eastAsia="宋体" w:hAnsi="Times New Roman" w:cs="Times New Roman" w:hint="eastAsia"/>
+        </w:rPr>
+        <w:t>，详见</w:t>
+      </w:r>
+      <w:r>
+        <w:rPr>
+          <w:rFonts w:ascii="Times New Roman" w:eastAsia="宋体" w:hAnsi="Times New Roman" w:cs="Times New Roman" w:hint="eastAsia"/>
+        </w:rPr>
+        <w:t>ExtMixLoader</w:t>
+      </w:r>
+    </w:p>
+    <w:p>
+      <w:pPr>
+        <w:pStyle w:val="a9"/>
+        <w:numPr>
+          <w:ilvl w:val="0"/>
+          <w:numId w:val="31"/>
+        </w:numPr>
+        <w:rPr>
+          <w:rFonts w:ascii="Times New Roman" w:eastAsia="宋体" w:hAnsi="Times New Roman" w:cs="Times New Roman"/>
+        </w:rPr>
+      </w:pPr>
+      <w:r>
+        <w:rPr>
+          <w:rFonts w:ascii="Times New Roman" w:eastAsia="宋体" w:hAnsi="Times New Roman" w:cs="Times New Roman" w:hint="eastAsia"/>
+        </w:rPr>
+        <w:t>新增</w:t>
+      </w:r>
+      <w:r>
+        <w:rPr>
+          <w:rFonts w:ascii="Times New Roman" w:eastAsia="宋体" w:hAnsi="Times New Roman" w:cs="Times New Roman" w:hint="eastAsia"/>
+        </w:rPr>
+        <w:t>DDrawScalingBilinear.OnlyShrink</w:t>
+      </w:r>
+      <w:r>
+        <w:rPr>
+          <w:rFonts w:ascii="Times New Roman" w:eastAsia="宋体" w:hAnsi="Times New Roman" w:cs="Times New Roman" w:hint="eastAsia"/>
+        </w:rPr>
+        <w:t>，支持仅在缩小时使用双线性插值，放大时硬边缘放大</w:t>
+      </w:r>
+    </w:p>
+    <w:p>
+      <w:pPr>
+        <w:pStyle w:val="a9"/>
+        <w:numPr>
+          <w:ilvl w:val="0"/>
+          <w:numId w:val="31"/>
+        </w:numPr>
+        <w:rPr>
+          <w:rFonts w:ascii="Times New Roman" w:eastAsia="宋体" w:hAnsi="Times New Roman" w:cs="Times New Roman"/>
+        </w:rPr>
+      </w:pPr>
+      <w:r>
+        <w:rPr>
+          <w:rFonts w:ascii="Times New Roman" w:eastAsia="宋体" w:hAnsi="Times New Roman" w:cs="Times New Roman" w:hint="eastAsia"/>
+        </w:rPr>
+        <w:t>优化绘图性能</w:t>
+      </w:r>
+    </w:p>
+    <w:p>
+      <w:pPr>
+        <w:pStyle w:val="a9"/>
+        <w:numPr>
+          <w:ilvl w:val="0"/>
+          <w:numId w:val="31"/>
+        </w:numPr>
+        <w:rPr>
+          <w:rFonts w:ascii="Times New Roman" w:eastAsia="宋体" w:hAnsi="Times New Roman" w:cs="Times New Roman"/>
+        </w:rPr>
+      </w:pPr>
+      <w:r>
+        <w:rPr>
+          <w:rFonts w:ascii="Times New Roman" w:eastAsia="宋体" w:hAnsi="Times New Roman" w:cs="Times New Roman" w:hint="eastAsia"/>
+        </w:rPr>
+        <w:t>重写</w:t>
+      </w:r>
+      <w:r>
+        <w:rPr>
+          <w:rFonts w:ascii="Times New Roman" w:eastAsia="宋体" w:hAnsi="Times New Roman" w:cs="Times New Roman" w:hint="eastAsia"/>
+        </w:rPr>
+        <w:t>ini</w:t>
+      </w:r>
+      <w:r>
+        <w:rPr>
+          <w:rFonts w:ascii="Times New Roman" w:eastAsia="宋体" w:hAnsi="Times New Roman" w:cs="Times New Roman" w:hint="eastAsia"/>
+        </w:rPr>
+        <w:t>加载逻辑，加载</w:t>
+      </w:r>
+      <w:r>
+        <w:rPr>
+          <w:rFonts w:ascii="Times New Roman" w:eastAsia="宋体" w:hAnsi="Times New Roman" w:cs="Times New Roman" w:hint="eastAsia"/>
+        </w:rPr>
+        <w:t>ini</w:t>
+      </w:r>
+      <w:r>
+        <w:rPr>
+          <w:rFonts w:ascii="Times New Roman" w:eastAsia="宋体" w:hAnsi="Times New Roman" w:cs="Times New Roman" w:hint="eastAsia"/>
+        </w:rPr>
+        <w:t>不会再释放至游戏目录，新建国家等操作可以即时生效</w:t>
+      </w:r>
+    </w:p>
+    <w:p>
+      <w:pPr>
+        <w:pStyle w:val="a9"/>
+        <w:numPr>
+          <w:ilvl w:val="0"/>
+          <w:numId w:val="31"/>
+        </w:numPr>
+        <w:rPr>
+          <w:rFonts w:ascii="Times New Roman" w:eastAsia="宋体" w:hAnsi="Times New Roman" w:cs="Times New Roman"/>
+        </w:rPr>
+      </w:pPr>
+      <w:r>
+        <w:rPr>
+          <w:rFonts w:ascii="Times New Roman" w:eastAsia="宋体" w:hAnsi="Times New Roman" w:cs="Times New Roman" w:hint="eastAsia"/>
+        </w:rPr>
+        <w:t>ini [#include]</w:t>
+      </w:r>
+      <w:r>
+        <w:rPr>
+          <w:rFonts w:ascii="Times New Roman" w:eastAsia="宋体" w:hAnsi="Times New Roman" w:cs="Times New Roman" w:hint="eastAsia"/>
+        </w:rPr>
+        <w:t>逻辑现遵循</w:t>
+      </w:r>
+      <w:r>
+        <w:rPr>
+          <w:rFonts w:ascii="Times New Roman" w:eastAsia="宋体" w:hAnsi="Times New Roman" w:cs="Times New Roman" w:hint="eastAsia"/>
+        </w:rPr>
+        <w:t>ares</w:t>
+      </w:r>
+      <w:r>
+        <w:rPr>
+          <w:rFonts w:ascii="Times New Roman" w:eastAsia="宋体" w:hAnsi="Times New Roman" w:cs="Times New Roman" w:hint="eastAsia"/>
+        </w:rPr>
+        <w:t>规则，为广度优先遍历而非深度优先遍历</w:t>
+      </w:r>
+    </w:p>
+    <w:p>
+      <w:pPr>
+        <w:pStyle w:val="a9"/>
+        <w:numPr>
+          <w:ilvl w:val="0"/>
+          <w:numId w:val="31"/>
+        </w:numPr>
+        <w:rPr>
+          <w:rFonts w:ascii="Times New Roman" w:eastAsia="宋体" w:hAnsi="Times New Roman" w:cs="Times New Roman"/>
+        </w:rPr>
+      </w:pPr>
+      <w:r>
+        <w:rPr>
+          <w:rFonts w:ascii="Times New Roman" w:eastAsia="宋体" w:hAnsi="Times New Roman" w:cs="Times New Roman" w:hint="eastAsia"/>
+        </w:rPr>
+        <w:t>修复了触发编辑器的参数在部分情况下没有正确刷新的</w:t>
+      </w:r>
+      <w:r>
+        <w:rPr>
+          <w:rFonts w:ascii="Times New Roman" w:eastAsia="宋体" w:hAnsi="Times New Roman" w:cs="Times New Roman" w:hint="eastAsia"/>
+        </w:rPr>
+        <w:t>bug</w:t>
+      </w:r>
+    </w:p>
+    <w:p>
+      <w:pPr>
+        <w:pStyle w:val="a9"/>
+        <w:numPr>
+          <w:ilvl w:val="0"/>
+          <w:numId w:val="31"/>
+        </w:numPr>
+        <w:rPr>
+          <w:rFonts w:ascii="Times New Roman" w:eastAsia="宋体" w:hAnsi="Times New Roman" w:cs="Times New Roman"/>
+        </w:rPr>
+      </w:pPr>
+      <w:r>
+        <w:rPr>
+          <w:rFonts w:ascii="Times New Roman" w:eastAsia="宋体" w:hAnsi="Times New Roman" w:cs="Times New Roman" w:hint="eastAsia"/>
+        </w:rPr>
         <w:lastRenderedPageBreak/>
-        <w:t>Lua</w:t>
-      </w:r>
-      <w:r>
-        <w:rPr>
-          <w:rFonts w:ascii="Times New Roman" w:eastAsia="宋体" w:hAnsi="Times New Roman" w:cs="Times New Roman" w:hint="eastAsia"/>
-        </w:rPr>
-        <w:t>脚本终端支持搜索脚本文件</w:t>
+        <w:t>支持拖拽面向的实时预览，详见</w:t>
+      </w:r>
+      <w:r>
+        <w:rPr>
+          <w:rFonts w:ascii="Times New Roman" w:eastAsia="宋体" w:hAnsi="Times New Roman" w:cs="Times New Roman" w:hint="eastAsia"/>
+        </w:rPr>
+        <w:t>ExtFacings.DragPreview</w:t>
       </w:r>
     </w:p>
     <w:p>
@@ -12776,973 +13761,6 @@
         <w:rPr>
           <w:rFonts w:ascii="Times New Roman" w:eastAsia="宋体" w:hAnsi="Times New Roman" w:cs="Times New Roman" w:hint="eastAsia"/>
         </w:rPr>
-        <w:t>微调地图边界细蓝线的位置</w:t>
-      </w:r>
-    </w:p>
-    <w:p>
-      <w:pPr>
-        <w:pStyle w:val="a9"/>
-        <w:numPr>
-          <w:ilvl w:val="0"/>
-          <w:numId w:val="31"/>
-        </w:numPr>
-        <w:rPr>
-          <w:rFonts w:ascii="Times New Roman" w:eastAsia="宋体" w:hAnsi="Times New Roman" w:cs="Times New Roman"/>
-        </w:rPr>
-      </w:pPr>
-      <w:r>
-        <w:rPr>
-          <w:rFonts w:ascii="Times New Roman" w:eastAsia="宋体" w:hAnsi="Times New Roman" w:cs="Times New Roman" w:hint="eastAsia"/>
-        </w:rPr>
-        <w:t>修复了</w:t>
-      </w:r>
-      <w:r>
-        <w:rPr>
-          <w:rFonts w:ascii="Times New Roman" w:eastAsia="宋体" w:hAnsi="Times New Roman" w:cs="Times New Roman" w:hint="eastAsia"/>
-        </w:rPr>
-        <w:t>Vxl</w:t>
-      </w:r>
-      <w:r>
-        <w:rPr>
-          <w:rFonts w:ascii="Times New Roman" w:eastAsia="宋体" w:hAnsi="Times New Roman" w:cs="Times New Roman" w:hint="eastAsia"/>
-        </w:rPr>
-        <w:t>车辆</w:t>
-      </w:r>
-      <w:r>
-        <w:rPr>
-          <w:rFonts w:ascii="Times New Roman" w:eastAsia="宋体" w:hAnsi="Times New Roman" w:cs="Times New Roman" w:hint="eastAsia"/>
-        </w:rPr>
-        <w:t>Noshadow=yes</w:t>
-      </w:r>
-      <w:r>
-        <w:rPr>
-          <w:rFonts w:ascii="Times New Roman" w:eastAsia="宋体" w:hAnsi="Times New Roman" w:cs="Times New Roman" w:hint="eastAsia"/>
-        </w:rPr>
-        <w:t>时仍会显示阴影的</w:t>
-      </w:r>
-      <w:r>
-        <w:rPr>
-          <w:rFonts w:ascii="Times New Roman" w:eastAsia="宋体" w:hAnsi="Times New Roman" w:cs="Times New Roman" w:hint="eastAsia"/>
-        </w:rPr>
-        <w:t>bug</w:t>
-      </w:r>
-    </w:p>
-    <w:p>
-      <w:pPr>
-        <w:pStyle w:val="a9"/>
-        <w:numPr>
-          <w:ilvl w:val="0"/>
-          <w:numId w:val="31"/>
-        </w:numPr>
-        <w:rPr>
-          <w:rFonts w:ascii="Times New Roman" w:eastAsia="宋体" w:hAnsi="Times New Roman" w:cs="Times New Roman"/>
-        </w:rPr>
-      </w:pPr>
-      <w:r>
-        <w:rPr>
-          <w:rFonts w:ascii="Times New Roman" w:eastAsia="宋体" w:hAnsi="Times New Roman" w:cs="Times New Roman" w:hint="eastAsia"/>
-        </w:rPr>
-        <w:t>修复部分情况下绘制连接地形上升、下降段高度错误的</w:t>
-      </w:r>
-      <w:r>
-        <w:rPr>
-          <w:rFonts w:ascii="Times New Roman" w:eastAsia="宋体" w:hAnsi="Times New Roman" w:cs="Times New Roman" w:hint="eastAsia"/>
-        </w:rPr>
-        <w:t>bug</w:t>
-      </w:r>
-    </w:p>
-    <w:p>
-      <w:pPr>
-        <w:pStyle w:val="a9"/>
-        <w:numPr>
-          <w:ilvl w:val="0"/>
-          <w:numId w:val="31"/>
-        </w:numPr>
-        <w:rPr>
-          <w:rFonts w:ascii="Times New Roman" w:eastAsia="宋体" w:hAnsi="Times New Roman" w:cs="Times New Roman"/>
-        </w:rPr>
-      </w:pPr>
-      <w:r>
-        <w:rPr>
-          <w:rFonts w:ascii="Times New Roman" w:eastAsia="宋体" w:hAnsi="Times New Roman" w:cs="Times New Roman" w:hint="eastAsia"/>
-        </w:rPr>
-        <w:t>优化光照沙盒切换时的性能</w:t>
-      </w:r>
-    </w:p>
-    <w:p>
-      <w:pPr>
-        <w:pStyle w:val="a9"/>
-        <w:numPr>
-          <w:ilvl w:val="0"/>
-          <w:numId w:val="31"/>
-        </w:numPr>
-        <w:rPr>
-          <w:rFonts w:ascii="Times New Roman" w:eastAsia="宋体" w:hAnsi="Times New Roman" w:cs="Times New Roman"/>
-        </w:rPr>
-      </w:pPr>
-      <w:r>
-        <w:rPr>
-          <w:rFonts w:ascii="Times New Roman" w:eastAsia="宋体" w:hAnsi="Times New Roman" w:cs="Times New Roman" w:hint="eastAsia"/>
-        </w:rPr>
-        <w:t>新增</w:t>
-      </w:r>
-      <w:r>
-        <w:rPr>
-          <w:rFonts w:ascii="Times New Roman" w:eastAsia="宋体" w:hAnsi="Times New Roman" w:cs="Times New Roman" w:hint="eastAsia"/>
-        </w:rPr>
-        <w:t>LightingPreview</w:t>
-      </w:r>
-      <w:r>
-        <w:rPr>
-          <w:rFonts w:ascii="Times New Roman" w:eastAsia="宋体" w:hAnsi="Times New Roman" w:cs="Times New Roman" w:hint="eastAsia"/>
-        </w:rPr>
-        <w:t>.</w:t>
-      </w:r>
-      <w:r>
-        <w:rPr>
-          <w:rFonts w:ascii="Times New Roman" w:eastAsia="宋体" w:hAnsi="Times New Roman" w:cs="Times New Roman" w:hint="eastAsia"/>
-        </w:rPr>
-        <w:t>Tint</w:t>
-      </w:r>
-      <w:r>
-        <w:rPr>
-          <w:rFonts w:ascii="Times New Roman" w:eastAsia="宋体" w:hAnsi="Times New Roman" w:cs="Times New Roman" w:hint="eastAsia"/>
-        </w:rPr>
-        <w:t>TileSetBrowserView</w:t>
-      </w:r>
-      <w:r>
-        <w:rPr>
-          <w:rFonts w:ascii="Times New Roman" w:eastAsia="宋体" w:hAnsi="Times New Roman" w:cs="Times New Roman" w:hint="eastAsia"/>
-        </w:rPr>
-        <w:t>，控制是否按光照沙盒渲染地形浏览器图像</w:t>
-      </w:r>
-    </w:p>
-    <w:p>
-      <w:pPr>
-        <w:pStyle w:val="a9"/>
-        <w:numPr>
-          <w:ilvl w:val="0"/>
-          <w:numId w:val="31"/>
-        </w:numPr>
-        <w:rPr>
-          <w:rFonts w:ascii="Times New Roman" w:eastAsia="宋体" w:hAnsi="Times New Roman" w:cs="Times New Roman"/>
-        </w:rPr>
-      </w:pPr>
-      <w:r>
-        <w:rPr>
-          <w:rFonts w:ascii="Times New Roman" w:eastAsia="宋体" w:hAnsi="Times New Roman" w:cs="Times New Roman" w:hint="eastAsia"/>
-        </w:rPr>
-        <w:t>新增距离标尺，可以记录当前鼠标位置距离上次按下左键位置的距离，记录历史数量见</w:t>
-      </w:r>
-      <w:r>
-        <w:rPr>
-          <w:rFonts w:ascii="Times New Roman" w:eastAsia="宋体" w:hAnsi="Times New Roman" w:cs="Times New Roman" w:hint="eastAsia"/>
-        </w:rPr>
-        <w:t>DistanceRuler.Records</w:t>
-      </w:r>
-    </w:p>
-    <w:p>
-      <w:pPr>
-        <w:pStyle w:val="a9"/>
-        <w:numPr>
-          <w:ilvl w:val="0"/>
-          <w:numId w:val="31"/>
-        </w:numPr>
-        <w:rPr>
-          <w:rFonts w:ascii="Times New Roman" w:eastAsia="宋体" w:hAnsi="Times New Roman" w:cs="Times New Roman"/>
-        </w:rPr>
-      </w:pPr>
-      <w:r>
-        <w:rPr>
-          <w:rFonts w:ascii="Times New Roman" w:eastAsia="宋体" w:hAnsi="Times New Roman" w:cs="Times New Roman" w:hint="eastAsia"/>
-        </w:rPr>
-        <w:t>微调新建地图时可视边界数值</w:t>
-      </w:r>
-    </w:p>
-    <w:p>
-      <w:pPr>
-        <w:pStyle w:val="a9"/>
-        <w:numPr>
-          <w:ilvl w:val="0"/>
-          <w:numId w:val="31"/>
-        </w:numPr>
-        <w:rPr>
-          <w:rFonts w:ascii="Times New Roman" w:eastAsia="宋体" w:hAnsi="Times New Roman" w:cs="Times New Roman"/>
-        </w:rPr>
-      </w:pPr>
-      <w:r>
-        <w:rPr>
-          <w:rFonts w:ascii="Times New Roman" w:eastAsia="宋体" w:hAnsi="Times New Roman" w:cs="Times New Roman" w:hint="eastAsia"/>
-        </w:rPr>
-        <w:t>修复平坦地形工具无法平坦地图边缘斜坡的</w:t>
-      </w:r>
-      <w:r>
-        <w:rPr>
-          <w:rFonts w:ascii="Times New Roman" w:eastAsia="宋体" w:hAnsi="Times New Roman" w:cs="Times New Roman" w:hint="eastAsia"/>
-        </w:rPr>
-        <w:t>bug</w:t>
-      </w:r>
-    </w:p>
-    <w:p>
-      <w:pPr>
-        <w:pStyle w:val="a9"/>
-        <w:numPr>
-          <w:ilvl w:val="0"/>
-          <w:numId w:val="31"/>
-        </w:numPr>
-        <w:rPr>
-          <w:rFonts w:ascii="Times New Roman" w:eastAsia="宋体" w:hAnsi="Times New Roman" w:cs="Times New Roman"/>
-        </w:rPr>
-      </w:pPr>
-      <w:r>
-        <w:rPr>
-          <w:rFonts w:ascii="Times New Roman" w:eastAsia="宋体" w:hAnsi="Times New Roman" w:cs="Times New Roman" w:hint="eastAsia"/>
-        </w:rPr>
-        <w:t>绘制连接地形可以将鼠标移动到地图边界外，更方便靠近边界的绘制</w:t>
-      </w:r>
-    </w:p>
-    <w:p>
-      <w:pPr>
-        <w:pStyle w:val="a9"/>
-        <w:numPr>
-          <w:ilvl w:val="0"/>
-          <w:numId w:val="31"/>
-        </w:numPr>
-        <w:rPr>
-          <w:rFonts w:ascii="Times New Roman" w:eastAsia="宋体" w:hAnsi="Times New Roman" w:cs="Times New Roman"/>
-        </w:rPr>
-      </w:pPr>
-      <w:r>
-        <w:rPr>
-          <w:rFonts w:ascii="Times New Roman" w:eastAsia="宋体" w:hAnsi="Times New Roman" w:cs="Times New Roman" w:hint="eastAsia"/>
-        </w:rPr>
-        <w:t>优化</w:t>
-      </w:r>
-      <w:r>
-        <w:rPr>
-          <w:rFonts w:ascii="Times New Roman" w:eastAsia="宋体" w:hAnsi="Times New Roman" w:cs="Times New Roman" w:hint="eastAsia"/>
-        </w:rPr>
-        <w:t>IsoMapPack5</w:t>
-      </w:r>
-      <w:r>
-        <w:rPr>
-          <w:rFonts w:ascii="Times New Roman" w:eastAsia="宋体" w:hAnsi="Times New Roman" w:cs="Times New Roman" w:hint="eastAsia"/>
-        </w:rPr>
-        <w:t>压缩，减少地图体积，减少游戏内大地图地形异常的可能</w:t>
-      </w:r>
-    </w:p>
-    <w:p>
-      <w:pPr>
-        <w:pStyle w:val="a9"/>
-        <w:numPr>
-          <w:ilvl w:val="0"/>
-          <w:numId w:val="31"/>
-        </w:numPr>
-        <w:rPr>
-          <w:rFonts w:ascii="Times New Roman" w:eastAsia="宋体" w:hAnsi="Times New Roman" w:cs="Times New Roman"/>
-        </w:rPr>
-      </w:pPr>
-      <w:r>
-        <w:rPr>
-          <w:rFonts w:ascii="Times New Roman" w:eastAsia="宋体" w:hAnsi="Times New Roman" w:cs="Times New Roman" w:hint="eastAsia"/>
-        </w:rPr>
-        <w:t>修复调整地图大小后隧道位置错误的</w:t>
-      </w:r>
-      <w:r>
-        <w:rPr>
-          <w:rFonts w:ascii="Times New Roman" w:eastAsia="宋体" w:hAnsi="Times New Roman" w:cs="Times New Roman" w:hint="eastAsia"/>
-        </w:rPr>
-        <w:t>bug</w:t>
-      </w:r>
-    </w:p>
-    <w:p>
-      <w:pPr>
-        <w:pStyle w:val="a9"/>
-        <w:numPr>
-          <w:ilvl w:val="0"/>
-          <w:numId w:val="31"/>
-        </w:numPr>
-        <w:rPr>
-          <w:rFonts w:ascii="Times New Roman" w:eastAsia="宋体" w:hAnsi="Times New Roman" w:cs="Times New Roman"/>
-        </w:rPr>
-      </w:pPr>
-      <w:r>
-        <w:rPr>
-          <w:rFonts w:ascii="Times New Roman" w:eastAsia="宋体" w:hAnsi="Times New Roman" w:cs="Times New Roman" w:hint="eastAsia"/>
-        </w:rPr>
-        <w:t>修复了在开启输入法和部分情况下在地图界面按</w:t>
-      </w:r>
-      <w:r>
-        <w:rPr>
-          <w:rFonts w:ascii="Times New Roman" w:eastAsia="宋体" w:hAnsi="Times New Roman" w:cs="Times New Roman" w:hint="eastAsia"/>
-        </w:rPr>
-        <w:t>D</w:t>
-      </w:r>
-      <w:r>
-        <w:rPr>
-          <w:rFonts w:ascii="Times New Roman" w:eastAsia="宋体" w:hAnsi="Times New Roman" w:cs="Times New Roman" w:hint="eastAsia"/>
-        </w:rPr>
-        <w:t>、</w:t>
-      </w:r>
-      <w:r>
-        <w:rPr>
-          <w:rFonts w:ascii="Times New Roman" w:eastAsia="宋体" w:hAnsi="Times New Roman" w:cs="Times New Roman" w:hint="eastAsia"/>
-        </w:rPr>
-        <w:t>[</w:t>
-      </w:r>
-      <w:r>
-        <w:rPr>
-          <w:rFonts w:ascii="Times New Roman" w:eastAsia="宋体" w:hAnsi="Times New Roman" w:cs="Times New Roman" w:hint="eastAsia"/>
-        </w:rPr>
-        <w:t>、</w:t>
-      </w:r>
-      <w:r>
-        <w:rPr>
-          <w:rFonts w:ascii="Times New Roman" w:eastAsia="宋体" w:hAnsi="Times New Roman" w:cs="Times New Roman" w:hint="eastAsia"/>
-        </w:rPr>
-        <w:t>]</w:t>
-      </w:r>
-      <w:r>
-        <w:rPr>
-          <w:rFonts w:ascii="Times New Roman" w:eastAsia="宋体" w:hAnsi="Times New Roman" w:cs="Times New Roman" w:hint="eastAsia"/>
-        </w:rPr>
-        <w:t>键无效的</w:t>
-      </w:r>
-      <w:r>
-        <w:rPr>
-          <w:rFonts w:ascii="Times New Roman" w:eastAsia="宋体" w:hAnsi="Times New Roman" w:cs="Times New Roman" w:hint="eastAsia"/>
-        </w:rPr>
-        <w:t>bug</w:t>
-      </w:r>
-    </w:p>
-    <w:p>
-      <w:pPr>
-        <w:pStyle w:val="a9"/>
-        <w:numPr>
-          <w:ilvl w:val="0"/>
-          <w:numId w:val="31"/>
-        </w:numPr>
-        <w:rPr>
-          <w:rFonts w:ascii="Times New Roman" w:eastAsia="宋体" w:hAnsi="Times New Roman" w:cs="Times New Roman"/>
-        </w:rPr>
-      </w:pPr>
-      <w:r>
-        <w:rPr>
-          <w:rFonts w:ascii="Times New Roman" w:eastAsia="宋体" w:hAnsi="Times New Roman" w:cs="Times New Roman" w:hint="eastAsia"/>
-        </w:rPr>
-        <w:t>修复了新城市下使用绘制悬崖后部工具时，按</w:t>
-      </w:r>
-      <w:r>
-        <w:rPr>
-          <w:rFonts w:ascii="Times New Roman" w:eastAsia="宋体" w:hAnsi="Times New Roman" w:cs="Times New Roman" w:hint="eastAsia"/>
-        </w:rPr>
-        <w:t>A</w:t>
-      </w:r>
-      <w:r>
-        <w:rPr>
-          <w:rFonts w:ascii="Times New Roman" w:eastAsia="宋体" w:hAnsi="Times New Roman" w:cs="Times New Roman" w:hint="eastAsia"/>
-        </w:rPr>
-        <w:t>键无法切换悬崖类型的</w:t>
-      </w:r>
-      <w:r>
-        <w:rPr>
-          <w:rFonts w:ascii="Times New Roman" w:eastAsia="宋体" w:hAnsi="Times New Roman" w:cs="Times New Roman" w:hint="eastAsia"/>
-        </w:rPr>
-        <w:t>bug</w:t>
-      </w:r>
-    </w:p>
-    <w:p>
-      <w:pPr>
-        <w:pStyle w:val="a9"/>
-        <w:numPr>
-          <w:ilvl w:val="0"/>
-          <w:numId w:val="31"/>
-        </w:numPr>
-        <w:rPr>
-          <w:rFonts w:ascii="Times New Roman" w:eastAsia="宋体" w:hAnsi="Times New Roman" w:cs="Times New Roman"/>
-        </w:rPr>
-      </w:pPr>
-      <w:r>
-        <w:rPr>
-          <w:rFonts w:ascii="Times New Roman" w:eastAsia="宋体" w:hAnsi="Times New Roman" w:cs="Times New Roman" w:hint="eastAsia"/>
-        </w:rPr>
-        <w:t>增强绘制悬崖工具，可以在不同地图类型的</w:t>
-      </w:r>
-      <w:r>
-        <w:rPr>
-          <w:rFonts w:ascii="Times New Roman" w:eastAsia="宋体" w:hAnsi="Times New Roman" w:cs="Times New Roman" w:hint="eastAsia"/>
-        </w:rPr>
-        <w:t>[TheaterInfo]</w:t>
-      </w:r>
-      <w:r>
-        <w:rPr>
-          <w:rFonts w:ascii="Times New Roman" w:eastAsia="宋体" w:hAnsi="Times New Roman" w:cs="Times New Roman" w:hint="eastAsia"/>
-        </w:rPr>
-        <w:t>（如</w:t>
-      </w:r>
-      <w:r>
-        <w:rPr>
-          <w:rFonts w:ascii="Times New Roman" w:eastAsia="宋体" w:hAnsi="Times New Roman" w:cs="Times New Roman" w:hint="eastAsia"/>
-        </w:rPr>
-        <w:t>[SnowInfo]</w:t>
-      </w:r>
-      <w:r>
-        <w:rPr>
-          <w:rFonts w:ascii="Times New Roman" w:eastAsia="宋体" w:hAnsi="Times New Roman" w:cs="Times New Roman" w:hint="eastAsia"/>
-        </w:rPr>
-        <w:t>）中填写</w:t>
-      </w:r>
-      <w:r>
-        <w:rPr>
-          <w:rFonts w:ascii="Times New Roman" w:eastAsia="宋体" w:hAnsi="Times New Roman" w:cs="Times New Roman" w:hint="eastAsia"/>
-        </w:rPr>
-        <w:t>Cliffs2</w:t>
-      </w:r>
-      <w:r>
-        <w:rPr>
-          <w:rFonts w:ascii="Times New Roman" w:eastAsia="宋体" w:hAnsi="Times New Roman" w:cs="Times New Roman" w:hint="eastAsia"/>
-        </w:rPr>
-        <w:t>、</w:t>
-      </w:r>
-      <w:r>
-        <w:rPr>
-          <w:rFonts w:ascii="Times New Roman" w:eastAsia="宋体" w:hAnsi="Times New Roman" w:cs="Times New Roman" w:hint="eastAsia"/>
-        </w:rPr>
-        <w:t>CliffsWater2</w:t>
-      </w:r>
-      <w:r>
-        <w:rPr>
-          <w:rFonts w:ascii="Times New Roman" w:eastAsia="宋体" w:hAnsi="Times New Roman" w:cs="Times New Roman" w:hint="eastAsia"/>
-        </w:rPr>
-        <w:t>以支持悬崖类型切换；在存在月球悬崖时，支持绘制月球悬崖</w:t>
-      </w:r>
-    </w:p>
-    <w:p>
-      <w:pPr>
-        <w:pStyle w:val="a9"/>
-        <w:numPr>
-          <w:ilvl w:val="0"/>
-          <w:numId w:val="31"/>
-        </w:numPr>
-        <w:rPr>
-          <w:rFonts w:ascii="Times New Roman" w:eastAsia="宋体" w:hAnsi="Times New Roman" w:cs="Times New Roman"/>
-        </w:rPr>
-      </w:pPr>
-      <w:r>
-        <w:rPr>
-          <w:rFonts w:ascii="Times New Roman" w:eastAsia="宋体" w:hAnsi="Times New Roman" w:cs="Times New Roman" w:hint="eastAsia"/>
-        </w:rPr>
-        <w:t>支持</w:t>
-      </w:r>
-      <w:r>
-        <w:rPr>
-          <w:rFonts w:ascii="Times New Roman" w:eastAsia="宋体" w:hAnsi="Times New Roman" w:cs="Times New Roman" w:hint="eastAsia"/>
-        </w:rPr>
-        <w:t>32</w:t>
-      </w:r>
-      <w:r>
-        <w:rPr>
-          <w:rFonts w:ascii="Times New Roman" w:eastAsia="宋体" w:hAnsi="Times New Roman" w:cs="Times New Roman" w:hint="eastAsia"/>
-        </w:rPr>
-        <w:t>向面向</w:t>
-      </w:r>
-      <w:r>
-        <w:rPr>
-          <w:rFonts w:ascii="Times New Roman" w:eastAsia="宋体" w:hAnsi="Times New Roman" w:cs="Times New Roman" w:hint="eastAsia"/>
-        </w:rPr>
-        <w:t>与拖拽</w:t>
-      </w:r>
-      <w:r>
-        <w:rPr>
-          <w:rFonts w:ascii="Times New Roman" w:eastAsia="宋体" w:hAnsi="Times New Roman" w:cs="Times New Roman" w:hint="eastAsia"/>
-        </w:rPr>
-        <w:t>，详见</w:t>
-      </w:r>
-      <w:r>
-        <w:rPr>
-          <w:rFonts w:ascii="Times New Roman" w:eastAsia="宋体" w:hAnsi="Times New Roman" w:cs="Times New Roman" w:hint="eastAsia"/>
-        </w:rPr>
-        <w:t>ExtFacings</w:t>
-      </w:r>
-      <w:r>
-        <w:rPr>
-          <w:rFonts w:ascii="Times New Roman" w:eastAsia="宋体" w:hAnsi="Times New Roman" w:cs="Times New Roman" w:hint="eastAsia"/>
-        </w:rPr>
-        <w:t>与</w:t>
-      </w:r>
-      <w:r>
-        <w:rPr>
-          <w:rFonts w:ascii="Times New Roman" w:eastAsia="宋体" w:hAnsi="Times New Roman" w:cs="Times New Roman" w:hint="eastAsia"/>
-        </w:rPr>
-        <w:t>ExtFacings.Drag</w:t>
-      </w:r>
-    </w:p>
-    <w:p>
-      <w:pPr>
-        <w:pStyle w:val="a9"/>
-        <w:numPr>
-          <w:ilvl w:val="0"/>
-          <w:numId w:val="31"/>
-        </w:numPr>
-        <w:rPr>
-          <w:rFonts w:ascii="Times New Roman" w:eastAsia="宋体" w:hAnsi="Times New Roman" w:cs="Times New Roman"/>
-        </w:rPr>
-      </w:pPr>
-      <w:r>
-        <w:rPr>
-          <w:rFonts w:ascii="Times New Roman" w:eastAsia="宋体" w:hAnsi="Times New Roman" w:cs="Times New Roman" w:hint="eastAsia"/>
-        </w:rPr>
-        <w:t>重写部分字符串类型，优化字符串加载稳定性</w:t>
-      </w:r>
-    </w:p>
-    <w:p>
-      <w:pPr>
-        <w:pStyle w:val="a9"/>
-        <w:numPr>
-          <w:ilvl w:val="0"/>
-          <w:numId w:val="31"/>
-        </w:numPr>
-        <w:rPr>
-          <w:rFonts w:ascii="Times New Roman" w:eastAsia="宋体" w:hAnsi="Times New Roman" w:cs="Times New Roman"/>
-        </w:rPr>
-      </w:pPr>
-      <w:r>
-        <w:rPr>
-          <w:rFonts w:ascii="Times New Roman" w:eastAsia="宋体" w:hAnsi="Times New Roman" w:cs="Times New Roman" w:hint="eastAsia"/>
-        </w:rPr>
-        <w:t>优化抬升</w:t>
-      </w:r>
-      <w:r>
-        <w:rPr>
-          <w:rFonts w:ascii="Times New Roman" w:eastAsia="宋体" w:hAnsi="Times New Roman" w:cs="Times New Roman" w:hint="eastAsia"/>
-        </w:rPr>
-        <w:t>/</w:t>
-      </w:r>
-      <w:r>
-        <w:rPr>
-          <w:rFonts w:ascii="Times New Roman" w:eastAsia="宋体" w:hAnsi="Times New Roman" w:cs="Times New Roman" w:hint="eastAsia"/>
-        </w:rPr>
-        <w:t>降低地表算法，不会出现异常的大范围变动</w:t>
-      </w:r>
-    </w:p>
-    <w:p>
-      <w:pPr>
-        <w:pStyle w:val="a9"/>
-        <w:numPr>
-          <w:ilvl w:val="0"/>
-          <w:numId w:val="31"/>
-        </w:numPr>
-        <w:rPr>
-          <w:rFonts w:ascii="Times New Roman" w:eastAsia="宋体" w:hAnsi="Times New Roman" w:cs="Times New Roman"/>
-        </w:rPr>
-      </w:pPr>
-      <w:r>
-        <w:rPr>
-          <w:rFonts w:ascii="Times New Roman" w:eastAsia="宋体" w:hAnsi="Times New Roman" w:cs="Times New Roman" w:hint="eastAsia"/>
-        </w:rPr>
-        <w:t>FA2sp.log</w:t>
-      </w:r>
-      <w:r>
-        <w:rPr>
-          <w:rFonts w:ascii="Times New Roman" w:eastAsia="宋体" w:hAnsi="Times New Roman" w:cs="Times New Roman" w:hint="eastAsia"/>
-        </w:rPr>
-        <w:t>使用</w:t>
-      </w:r>
-      <w:r>
-        <w:rPr>
-          <w:rFonts w:ascii="Times New Roman" w:eastAsia="宋体" w:hAnsi="Times New Roman" w:cs="Times New Roman" w:hint="eastAsia"/>
-        </w:rPr>
-        <w:t>UTF8</w:t>
-      </w:r>
-      <w:r>
-        <w:rPr>
-          <w:rFonts w:ascii="Times New Roman" w:eastAsia="宋体" w:hAnsi="Times New Roman" w:cs="Times New Roman" w:hint="eastAsia"/>
-        </w:rPr>
-        <w:t>编码</w:t>
-      </w:r>
-    </w:p>
-    <w:p>
-      <w:pPr>
-        <w:pStyle w:val="a9"/>
-        <w:numPr>
-          <w:ilvl w:val="0"/>
-          <w:numId w:val="31"/>
-        </w:numPr>
-        <w:rPr>
-          <w:rFonts w:ascii="Times New Roman" w:eastAsia="宋体" w:hAnsi="Times New Roman" w:cs="Times New Roman"/>
-        </w:rPr>
-      </w:pPr>
-      <w:r>
-        <w:rPr>
-          <w:rFonts w:ascii="Times New Roman" w:eastAsia="宋体" w:hAnsi="Times New Roman" w:cs="Times New Roman" w:hint="eastAsia"/>
-        </w:rPr>
-        <w:t>保存地图时可以维持已有的</w:t>
-      </w:r>
-      <w:r>
-        <w:rPr>
-          <w:rFonts w:ascii="Times New Roman" w:eastAsia="宋体" w:hAnsi="Times New Roman" w:cs="Times New Roman" w:hint="eastAsia"/>
-        </w:rPr>
-        <w:t>ini</w:t>
-      </w:r>
-      <w:r>
-        <w:rPr>
-          <w:rFonts w:ascii="Times New Roman" w:eastAsia="宋体" w:hAnsi="Times New Roman" w:cs="Times New Roman" w:hint="eastAsia"/>
-        </w:rPr>
-        <w:t>小节顺序，详见</w:t>
-      </w:r>
-      <w:r>
-        <w:rPr>
-          <w:rFonts w:ascii="Times New Roman" w:eastAsia="宋体" w:hAnsi="Times New Roman" w:cs="Times New Roman" w:hint="eastAsia"/>
-        </w:rPr>
-        <w:t>SaveMap.PreserveINISorting</w:t>
-      </w:r>
-    </w:p>
-    <w:p>
-      <w:pPr>
-        <w:pStyle w:val="a9"/>
-        <w:numPr>
-          <w:ilvl w:val="0"/>
-          <w:numId w:val="31"/>
-        </w:numPr>
-        <w:rPr>
-          <w:rFonts w:ascii="Times New Roman" w:eastAsia="宋体" w:hAnsi="Times New Roman" w:cs="Times New Roman"/>
-        </w:rPr>
-      </w:pPr>
-      <w:r>
-        <w:rPr>
-          <w:rFonts w:ascii="Times New Roman" w:eastAsia="宋体" w:hAnsi="Times New Roman" w:cs="Times New Roman" w:hint="eastAsia"/>
-        </w:rPr>
-        <w:t>重写撤销重做系统，所有撤销动作均支持完整重做</w:t>
-      </w:r>
-    </w:p>
-    <w:p>
-      <w:pPr>
-        <w:pStyle w:val="a9"/>
-        <w:numPr>
-          <w:ilvl w:val="0"/>
-          <w:numId w:val="31"/>
-        </w:numPr>
-        <w:rPr>
-          <w:rFonts w:ascii="Times New Roman" w:eastAsia="宋体" w:hAnsi="Times New Roman" w:cs="Times New Roman"/>
-        </w:rPr>
-      </w:pPr>
-      <w:r>
-        <w:rPr>
-          <w:rFonts w:ascii="Times New Roman" w:eastAsia="宋体" w:hAnsi="Times New Roman" w:cs="Times New Roman" w:hint="eastAsia"/>
-        </w:rPr>
-        <w:t>撤销重做系统能够记录游戏对象的修改历史，详见</w:t>
-      </w:r>
-      <w:r>
-        <w:rPr>
-          <w:rFonts w:ascii="Times New Roman" w:eastAsia="宋体" w:hAnsi="Times New Roman" w:cs="Times New Roman" w:hint="eastAsia"/>
-        </w:rPr>
-        <w:t>UndoRedo.RecordObjects</w:t>
-      </w:r>
-    </w:p>
-    <w:p>
-      <w:pPr>
-        <w:pStyle w:val="a9"/>
-        <w:numPr>
-          <w:ilvl w:val="0"/>
-          <w:numId w:val="31"/>
-        </w:numPr>
-        <w:rPr>
-          <w:rFonts w:ascii="Times New Roman" w:eastAsia="宋体" w:hAnsi="Times New Roman" w:cs="Times New Roman"/>
-        </w:rPr>
-      </w:pPr>
-      <w:r>
-        <w:rPr>
-          <w:rFonts w:ascii="Times New Roman" w:eastAsia="宋体" w:hAnsi="Times New Roman" w:cs="Times New Roman" w:hint="eastAsia"/>
-        </w:rPr>
-        <w:t>支持设置</w:t>
-      </w:r>
-      <w:r>
-        <w:rPr>
-          <w:rFonts w:ascii="Times New Roman" w:eastAsia="宋体" w:hAnsi="Times New Roman" w:cs="Times New Roman" w:hint="eastAsia"/>
-        </w:rPr>
-        <w:t>RubblePalette</w:t>
-      </w:r>
-      <w:r>
-        <w:rPr>
-          <w:rFonts w:ascii="Times New Roman" w:eastAsia="宋体" w:hAnsi="Times New Roman" w:cs="Times New Roman" w:hint="eastAsia"/>
-        </w:rPr>
-        <w:t>=</w:t>
-      </w:r>
-      <w:r>
-        <w:rPr>
-          <w:rFonts w:ascii="Times New Roman" w:eastAsia="宋体" w:hAnsi="Times New Roman" w:cs="Times New Roman" w:hint="eastAsia"/>
-        </w:rPr>
-        <w:t>指定建筑废墟色盘</w:t>
-      </w:r>
-    </w:p>
-    <w:p>
-      <w:pPr>
-        <w:pStyle w:val="a9"/>
-        <w:numPr>
-          <w:ilvl w:val="0"/>
-          <w:numId w:val="31"/>
-        </w:numPr>
-        <w:rPr>
-          <w:rFonts w:ascii="Times New Roman" w:eastAsia="宋体" w:hAnsi="Times New Roman" w:cs="Times New Roman"/>
-        </w:rPr>
-      </w:pPr>
-      <w:r>
-        <w:rPr>
-          <w:rFonts w:ascii="Times New Roman" w:eastAsia="宋体" w:hAnsi="Times New Roman" w:cs="Times New Roman" w:hint="eastAsia"/>
-        </w:rPr>
-        <w:t>提升稳定性</w:t>
-      </w:r>
-    </w:p>
-    <w:p>
-      <w:pPr>
-        <w:pStyle w:val="a9"/>
-        <w:numPr>
-          <w:ilvl w:val="0"/>
-          <w:numId w:val="31"/>
-        </w:numPr>
-        <w:rPr>
-          <w:rFonts w:ascii="Times New Roman" w:eastAsia="宋体" w:hAnsi="Times New Roman" w:cs="Times New Roman"/>
-        </w:rPr>
-      </w:pPr>
-      <w:r>
-        <w:rPr>
-          <w:rFonts w:ascii="Times New Roman" w:eastAsia="宋体" w:hAnsi="Times New Roman" w:cs="Times New Roman" w:hint="eastAsia"/>
-        </w:rPr>
-        <w:t>优化素材图像内存占用</w:t>
-      </w:r>
-    </w:p>
-    <w:p>
-      <w:pPr>
-        <w:pStyle w:val="a9"/>
-        <w:numPr>
-          <w:ilvl w:val="0"/>
-          <w:numId w:val="31"/>
-        </w:numPr>
-        <w:rPr>
-          <w:rFonts w:ascii="Times New Roman" w:eastAsia="宋体" w:hAnsi="Times New Roman" w:cs="Times New Roman"/>
-        </w:rPr>
-      </w:pPr>
-      <w:r>
-        <w:rPr>
-          <w:rFonts w:ascii="Times New Roman" w:eastAsia="宋体" w:hAnsi="Times New Roman" w:cs="Times New Roman" w:hint="eastAsia"/>
-        </w:rPr>
-        <w:t>重写</w:t>
-      </w:r>
-      <w:r>
-        <w:rPr>
-          <w:rFonts w:ascii="Times New Roman" w:eastAsia="宋体" w:hAnsi="Times New Roman" w:cs="Times New Roman" w:hint="eastAsia"/>
-        </w:rPr>
-        <w:t>mix</w:t>
-      </w:r>
-      <w:r>
-        <w:rPr>
-          <w:rFonts w:ascii="Times New Roman" w:eastAsia="宋体" w:hAnsi="Times New Roman" w:cs="Times New Roman" w:hint="eastAsia"/>
-        </w:rPr>
-        <w:t>加载逻辑，修复加载中的内存泄漏</w:t>
-      </w:r>
-      <w:r>
-        <w:rPr>
-          <w:rFonts w:ascii="Times New Roman" w:eastAsia="宋体" w:hAnsi="Times New Roman" w:cs="Times New Roman" w:hint="eastAsia"/>
-        </w:rPr>
-        <w:t>，详见</w:t>
-      </w:r>
-      <w:r>
-        <w:rPr>
-          <w:rFonts w:ascii="Times New Roman" w:eastAsia="宋体" w:hAnsi="Times New Roman" w:cs="Times New Roman" w:hint="eastAsia"/>
-        </w:rPr>
-        <w:t>ExtMixLoader</w:t>
-      </w:r>
-    </w:p>
-    <w:p>
-      <w:pPr>
-        <w:pStyle w:val="a9"/>
-        <w:numPr>
-          <w:ilvl w:val="0"/>
-          <w:numId w:val="31"/>
-        </w:numPr>
-        <w:rPr>
-          <w:rFonts w:ascii="Times New Roman" w:eastAsia="宋体" w:hAnsi="Times New Roman" w:cs="Times New Roman"/>
-        </w:rPr>
-      </w:pPr>
-      <w:r>
-        <w:rPr>
-          <w:rFonts w:ascii="Times New Roman" w:eastAsia="宋体" w:hAnsi="Times New Roman" w:cs="Times New Roman" w:hint="eastAsia"/>
-        </w:rPr>
-        <w:t>新增</w:t>
-      </w:r>
-      <w:r>
-        <w:rPr>
-          <w:rFonts w:ascii="Times New Roman" w:eastAsia="宋体" w:hAnsi="Times New Roman" w:cs="Times New Roman" w:hint="eastAsia"/>
-        </w:rPr>
-        <w:t>DDrawScalingBilinear.OnlyShrink</w:t>
-      </w:r>
-      <w:r>
-        <w:rPr>
-          <w:rFonts w:ascii="Times New Roman" w:eastAsia="宋体" w:hAnsi="Times New Roman" w:cs="Times New Roman" w:hint="eastAsia"/>
-        </w:rPr>
-        <w:t>，支持仅在缩小时使用双线性插值，放大时硬边缘放大</w:t>
-      </w:r>
-    </w:p>
-    <w:p>
-      <w:pPr>
-        <w:pStyle w:val="a9"/>
-        <w:numPr>
-          <w:ilvl w:val="0"/>
-          <w:numId w:val="31"/>
-        </w:numPr>
-        <w:rPr>
-          <w:rFonts w:ascii="Times New Roman" w:eastAsia="宋体" w:hAnsi="Times New Roman" w:cs="Times New Roman"/>
-        </w:rPr>
-      </w:pPr>
-      <w:r>
-        <w:rPr>
-          <w:rFonts w:ascii="Times New Roman" w:eastAsia="宋体" w:hAnsi="Times New Roman" w:cs="Times New Roman" w:hint="eastAsia"/>
-        </w:rPr>
-        <w:t>优化绘图性能</w:t>
-      </w:r>
-    </w:p>
-    <w:p>
-      <w:pPr>
-        <w:pStyle w:val="a9"/>
-        <w:numPr>
-          <w:ilvl w:val="0"/>
-          <w:numId w:val="31"/>
-        </w:numPr>
-        <w:rPr>
-          <w:rFonts w:ascii="Times New Roman" w:eastAsia="宋体" w:hAnsi="Times New Roman" w:cs="Times New Roman"/>
-        </w:rPr>
-      </w:pPr>
-      <w:r>
-        <w:rPr>
-          <w:rFonts w:ascii="Times New Roman" w:eastAsia="宋体" w:hAnsi="Times New Roman" w:cs="Times New Roman" w:hint="eastAsia"/>
-        </w:rPr>
-        <w:t>重写</w:t>
-      </w:r>
-      <w:r>
-        <w:rPr>
-          <w:rFonts w:ascii="Times New Roman" w:eastAsia="宋体" w:hAnsi="Times New Roman" w:cs="Times New Roman" w:hint="eastAsia"/>
-        </w:rPr>
-        <w:t>ini</w:t>
-      </w:r>
-      <w:r>
-        <w:rPr>
-          <w:rFonts w:ascii="Times New Roman" w:eastAsia="宋体" w:hAnsi="Times New Roman" w:cs="Times New Roman" w:hint="eastAsia"/>
-        </w:rPr>
-        <w:t>加载逻辑，加载</w:t>
-      </w:r>
-      <w:r>
-        <w:rPr>
-          <w:rFonts w:ascii="Times New Roman" w:eastAsia="宋体" w:hAnsi="Times New Roman" w:cs="Times New Roman" w:hint="eastAsia"/>
-        </w:rPr>
-        <w:t>ini</w:t>
-      </w:r>
-      <w:r>
-        <w:rPr>
-          <w:rFonts w:ascii="Times New Roman" w:eastAsia="宋体" w:hAnsi="Times New Roman" w:cs="Times New Roman" w:hint="eastAsia"/>
-        </w:rPr>
-        <w:t>不会再释放至游戏目录，新建国家等操作可以即时生效</w:t>
-      </w:r>
-    </w:p>
-    <w:p>
-      <w:pPr>
-        <w:pStyle w:val="a9"/>
-        <w:numPr>
-          <w:ilvl w:val="0"/>
-          <w:numId w:val="31"/>
-        </w:numPr>
-        <w:rPr>
-          <w:rFonts w:ascii="Times New Roman" w:eastAsia="宋体" w:hAnsi="Times New Roman" w:cs="Times New Roman"/>
-        </w:rPr>
-      </w:pPr>
-      <w:r>
-        <w:rPr>
-          <w:rFonts w:ascii="Times New Roman" w:eastAsia="宋体" w:hAnsi="Times New Roman" w:cs="Times New Roman" w:hint="eastAsia"/>
-        </w:rPr>
-        <w:t>ini [#include]</w:t>
-      </w:r>
-      <w:r>
-        <w:rPr>
-          <w:rFonts w:ascii="Times New Roman" w:eastAsia="宋体" w:hAnsi="Times New Roman" w:cs="Times New Roman" w:hint="eastAsia"/>
-        </w:rPr>
-        <w:t>逻辑现遵循</w:t>
-      </w:r>
-      <w:r>
-        <w:rPr>
-          <w:rFonts w:ascii="Times New Roman" w:eastAsia="宋体" w:hAnsi="Times New Roman" w:cs="Times New Roman" w:hint="eastAsia"/>
-        </w:rPr>
-        <w:t>ares</w:t>
-      </w:r>
-      <w:r>
-        <w:rPr>
-          <w:rFonts w:ascii="Times New Roman" w:eastAsia="宋体" w:hAnsi="Times New Roman" w:cs="Times New Roman" w:hint="eastAsia"/>
-        </w:rPr>
-        <w:t>规则，为广度优先遍历而非深度优先遍历</w:t>
-      </w:r>
-    </w:p>
-    <w:p>
-      <w:pPr>
-        <w:pStyle w:val="a9"/>
-        <w:numPr>
-          <w:ilvl w:val="0"/>
-          <w:numId w:val="31"/>
-        </w:numPr>
-        <w:rPr>
-          <w:rFonts w:ascii="Times New Roman" w:eastAsia="宋体" w:hAnsi="Times New Roman" w:cs="Times New Roman"/>
-        </w:rPr>
-      </w:pPr>
-      <w:r>
-        <w:rPr>
-          <w:rFonts w:ascii="Times New Roman" w:eastAsia="宋体" w:hAnsi="Times New Roman" w:cs="Times New Roman" w:hint="eastAsia"/>
-        </w:rPr>
-        <w:t>修复了触发编辑器的参数在部分情况下没有正确刷新的</w:t>
-      </w:r>
-      <w:r>
-        <w:rPr>
-          <w:rFonts w:ascii="Times New Roman" w:eastAsia="宋体" w:hAnsi="Times New Roman" w:cs="Times New Roman" w:hint="eastAsia"/>
-        </w:rPr>
-        <w:t>bug</w:t>
-      </w:r>
-    </w:p>
-    <w:p>
-      <w:pPr>
-        <w:pStyle w:val="a9"/>
-        <w:numPr>
-          <w:ilvl w:val="0"/>
-          <w:numId w:val="31"/>
-        </w:numPr>
-        <w:rPr>
-          <w:rFonts w:ascii="Times New Roman" w:eastAsia="宋体" w:hAnsi="Times New Roman" w:cs="Times New Roman"/>
-        </w:rPr>
-      </w:pPr>
-      <w:r>
-        <w:rPr>
-          <w:rFonts w:ascii="Times New Roman" w:eastAsia="宋体" w:hAnsi="Times New Roman" w:cs="Times New Roman" w:hint="eastAsia"/>
-        </w:rPr>
-        <w:t>支持拖拽面向的实时预览，详见</w:t>
-      </w:r>
-      <w:r>
-        <w:rPr>
-          <w:rFonts w:ascii="Times New Roman" w:eastAsia="宋体" w:hAnsi="Times New Roman" w:cs="Times New Roman" w:hint="eastAsia"/>
-        </w:rPr>
-        <w:t>ExtFacings.DragPreview</w:t>
-      </w:r>
-    </w:p>
-    <w:p>
-      <w:pPr>
-        <w:pStyle w:val="a9"/>
-        <w:numPr>
-          <w:ilvl w:val="0"/>
-          <w:numId w:val="31"/>
-        </w:numPr>
-        <w:rPr>
-          <w:rFonts w:ascii="Times New Roman" w:eastAsia="宋体" w:hAnsi="Times New Roman" w:cs="Times New Roman"/>
-        </w:rPr>
-      </w:pPr>
-      <w:r>
-        <w:rPr>
-          <w:rFonts w:ascii="Times New Roman" w:eastAsia="宋体" w:hAnsi="Times New Roman" w:cs="Times New Roman" w:hint="eastAsia"/>
-        </w:rPr>
-        <w:lastRenderedPageBreak/>
         <w:t>支持</w:t>
       </w:r>
       <w:r>
@@ -14775,7 +14793,14 @@
         <w:rPr>
           <w:rFonts w:ascii="Times New Roman" w:eastAsia="宋体" w:hAnsi="Times New Roman" w:cs="Times New Roman" w:hint="eastAsia"/>
         </w:rPr>
-        <w:t>键点击单元格时，会拾取单元格的地形块；若同时按住</w:t>
+        <w:t>键点击单元格时，会拾取单元格的地</w:t>
+      </w:r>
+      <w:r>
+        <w:rPr>
+          <w:rFonts w:ascii="Times New Roman" w:eastAsia="宋体" w:hAnsi="Times New Roman" w:cs="Times New Roman" w:hint="eastAsia"/>
+        </w:rPr>
+        <w:lastRenderedPageBreak/>
+        <w:t>形块；若同时按住</w:t>
       </w:r>
       <w:r>
         <w:rPr>
@@ -14805,7 +14830,6 @@
         <w:rPr>
           <w:rFonts w:ascii="Times New Roman" w:eastAsia="宋体" w:hAnsi="Times New Roman" w:cs="Times New Roman" w:hint="eastAsia"/>
         </w:rPr>
-        <w:lastRenderedPageBreak/>
         <w:t>全局搜索的“地图”选项支持搜索单位的关联标签</w:t>
       </w:r>
     </w:p>
@@ -15888,6 +15912,7 @@
         <w:rPr>
           <w:rFonts w:ascii="Times New Roman" w:eastAsia="宋体" w:hAnsi="Times New Roman" w:cs="Times New Roman" w:hint="eastAsia"/>
         </w:rPr>
+        <w:lastRenderedPageBreak/>
         <w:t>修复</w:t>
       </w:r>
       <w:r>
@@ -15924,7 +15949,6 @@
         <w:rPr>
           <w:rFonts w:ascii="Times New Roman" w:eastAsia="宋体" w:hAnsi="Times New Roman" w:cs="Times New Roman" w:hint="eastAsia"/>
         </w:rPr>
-        <w:lastRenderedPageBreak/>
         <w:t>支持在开启平面显示时隐藏</w:t>
       </w:r>
       <w:r>
@@ -16927,14 +16951,8 @@
         <w:rPr>
           <w:rFonts w:ascii="Times New Roman" w:eastAsia="宋体" w:hAnsi="Times New Roman" w:cs="Times New Roman" w:hint="eastAsia"/>
         </w:rPr>
-        <w:t>多选模式新增自定义添加与删除，可以在多个选项中自选条件，删除同类与同</w:t>
-      </w:r>
-      <w:r>
-        <w:rPr>
-          <w:rFonts w:ascii="Times New Roman" w:eastAsia="宋体" w:hAnsi="Times New Roman" w:cs="Times New Roman" w:hint="eastAsia"/>
-        </w:rPr>
         <w:lastRenderedPageBreak/>
-        <w:t>类相连添加和删除</w:t>
+        <w:t>多选模式新增自定义添加与删除，可以在多个选项中自选条件，删除同类与同类相连添加和删除</w:t>
       </w:r>
     </w:p>
     <w:p>
@@ -17964,6 +17982,7 @@
         <w:rPr>
           <w:rFonts w:ascii="Times New Roman" w:eastAsia="宋体" w:hAnsi="Times New Roman" w:cs="Times New Roman" w:hint="eastAsia"/>
         </w:rPr>
+        <w:lastRenderedPageBreak/>
         <w:t>修复了地形对象、污染重叠后再拖走不能正常显示的</w:t>
       </w:r>
       <w:r>
@@ -17988,7 +18007,6 @@
         <w:rPr>
           <w:rFonts w:ascii="Times New Roman" w:eastAsia="宋体" w:hAnsi="Times New Roman" w:cs="Times New Roman" w:hint="eastAsia"/>
         </w:rPr>
-        <w:lastRenderedPageBreak/>
         <w:t>多选模式添加同类相连多选功能，仅会选择相邻的同类地形；添加隐藏多选单元格功能</w:t>
       </w:r>
     </w:p>
@@ -18951,6 +18969,7 @@
         <w:rPr>
           <w:rFonts w:ascii="Times New Roman" w:eastAsia="宋体" w:hAnsi="Times New Roman" w:cs="Times New Roman" w:hint="eastAsia"/>
         </w:rPr>
+        <w:lastRenderedPageBreak/>
         <w:t>修复了部分情况下路径点</w:t>
       </w:r>
       <w:r>
@@ -18987,7 +19006,6 @@
         <w:rPr>
           <w:rFonts w:ascii="Times New Roman" w:eastAsia="宋体" w:hAnsi="Times New Roman" w:cs="Times New Roman" w:hint="eastAsia"/>
         </w:rPr>
-        <w:lastRenderedPageBreak/>
         <w:t>优化了灯光建筑较多时，光照沙盒模式的性能</w:t>
       </w:r>
     </w:p>
@@ -19908,6 +19926,7 @@
         <w:rPr>
           <w:rFonts w:ascii="Times New Roman" w:eastAsia="宋体" w:hAnsi="Times New Roman" w:cs="Times New Roman" w:hint="eastAsia"/>
         </w:rPr>
+        <w:lastRenderedPageBreak/>
         <w:t>支持直接读取</w:t>
       </w:r>
       <w:r>
@@ -19938,7 +19957,6 @@
         <w:rPr>
           <w:rFonts w:ascii="Times New Roman" w:eastAsia="宋体" w:hAnsi="Times New Roman" w:cs="Times New Roman" w:hint="eastAsia"/>
         </w:rPr>
-        <w:lastRenderedPageBreak/>
         <w:t>优化对象绘制次序，减少了建筑物不正常遮挡现象</w:t>
       </w:r>
     </w:p>

</xml_diff>

<commit_message>
set directX rendering to default, add auto fallback
</commit_message>
<xml_diff>
--- a/Supplementary/文档/FA2SP HDM Edition说明文档.docx
+++ b/Supplementary/文档/FA2SP HDM Edition说明文档.docx
@@ -28857,7 +28857,13 @@
         <w:rPr>
           <w:rFonts w:ascii="Times New Roman" w:eastAsia="宋体" w:hAnsi="Times New Roman" w:cs="Times New Roman" w:hint="eastAsia"/>
         </w:rPr>
-        <w:t xml:space="preserve"> false</w:t>
+        <w:t xml:space="preserve"> </w:t>
+      </w:r>
+      <w:r>
+        <w:rPr>
+          <w:rFonts w:ascii="Times New Roman" w:eastAsia="宋体" w:hAnsi="Times New Roman" w:cs="Times New Roman" w:hint="eastAsia"/>
+        </w:rPr>
+        <w:t>true</w:t>
       </w:r>
     </w:p>
     <w:p>
@@ -44939,7 +44945,7 @@
         <v:path o:extrusionok="f" gradientshapeok="t" o:connecttype="rect"/>
         <o:lock v:ext="edit" aspectratio="t"/>
       </v:shapetype>
-      <v:shape id="_x0000_i1030" type="#_x0000_t75" style="width:11.4pt;height:11.4pt" o:bullet="t">
+      <v:shape id="_x0000_i1029" type="#_x0000_t75" style="width:11.4pt;height:11.4pt" o:bullet="t">
         <v:imagedata r:id="rId1" o:title="mso9A9A"/>
       </v:shape>
     </w:pict>

</xml_diff>

<commit_message>
memorize tilesetbrowser size, auto scaling toolbar icons
</commit_message>
<xml_diff>
--- a/Supplementary/文档/FA2SP HDM Edition说明文档.docx
+++ b/Supplementary/文档/FA2SP HDM Edition说明文档.docx
@@ -174,7 +174,7 @@
           <w:rFonts w:ascii="宋体" w:eastAsia="宋体" w:hAnsi="宋体" w:hint="eastAsia"/>
           <w:sz w:val="24"/>
         </w:rPr>
-        <w:t>6</w:t>
+        <w:t>8</w:t>
       </w:r>
     </w:p>
     <w:p>
@@ -286,7 +286,7 @@
           <w:sz w:val="28"/>
           <w:szCs w:val="32"/>
         </w:rPr>
-        <w:t>6</w:t>
+        <w:t>8</w:t>
       </w:r>
       <w:r>
         <w:rPr>
@@ -1211,6 +1211,54 @@
         <w:pStyle w:val="a9"/>
         <w:numPr>
           <w:ilvl w:val="0"/>
+          <w:numId w:val="11"/>
+        </w:numPr>
+        <w:rPr>
+          <w:rFonts w:ascii="Times New Roman" w:eastAsia="宋体" w:hAnsi="Times New Roman" w:cs="Times New Roman"/>
+        </w:rPr>
+      </w:pPr>
+      <w:r>
+        <w:rPr>
+          <w:rFonts w:ascii="Times New Roman" w:eastAsia="宋体" w:hAnsi="Times New Roman" w:cs="Times New Roman" w:hint="eastAsia"/>
+        </w:rPr>
+        <w:t>开启高</w:t>
+      </w:r>
+      <w:r>
+        <w:rPr>
+          <w:rFonts w:ascii="Times New Roman" w:eastAsia="宋体" w:hAnsi="Times New Roman" w:cs="Times New Roman" w:hint="eastAsia"/>
+        </w:rPr>
+        <w:t>dpi</w:t>
+      </w:r>
+      <w:r>
+        <w:rPr>
+          <w:rFonts w:ascii="Times New Roman" w:eastAsia="宋体" w:hAnsi="Times New Roman" w:cs="Times New Roman" w:hint="eastAsia"/>
+        </w:rPr>
+        <w:t>时，工具栏图标会放大以适应当前大小</w:t>
+      </w:r>
+    </w:p>
+    <w:p>
+      <w:pPr>
+        <w:pStyle w:val="a9"/>
+        <w:numPr>
+          <w:ilvl w:val="0"/>
+          <w:numId w:val="11"/>
+        </w:numPr>
+        <w:rPr>
+          <w:rFonts w:ascii="Times New Roman" w:eastAsia="宋体" w:hAnsi="Times New Roman" w:cs="Times New Roman"/>
+        </w:rPr>
+      </w:pPr>
+      <w:r>
+        <w:rPr>
+          <w:rFonts w:ascii="Times New Roman" w:eastAsia="宋体" w:hAnsi="Times New Roman" w:cs="Times New Roman" w:hint="eastAsia"/>
+        </w:rPr>
+        <w:t>可以记忆地形浏览器的大小</w:t>
+      </w:r>
+    </w:p>
+    <w:p>
+      <w:pPr>
+        <w:pStyle w:val="a9"/>
+        <w:numPr>
+          <w:ilvl w:val="0"/>
           <w:numId w:val="10"/>
         </w:numPr>
         <w:rPr>
@@ -1835,6 +1883,7 @@
         <w:rPr>
           <w:rFonts w:ascii="Times New Roman" w:eastAsia="宋体" w:hAnsi="Times New Roman" w:cs="Times New Roman" w:hint="eastAsia"/>
         </w:rPr>
+        <w:lastRenderedPageBreak/>
         <w:t>优化</w:t>
       </w:r>
       <w:r>
@@ -1901,7 +1950,6 @@
         <w:rPr>
           <w:rFonts w:ascii="Times New Roman" w:eastAsia="宋体" w:hAnsi="Times New Roman" w:cs="Times New Roman" w:hint="eastAsia"/>
         </w:rPr>
-        <w:lastRenderedPageBreak/>
         <w:t>支持</w:t>
       </w:r>
       <w:r>
@@ -2768,6 +2816,7 @@
         <w:rPr>
           <w:rFonts w:ascii="Times New Roman" w:eastAsia="宋体" w:hAnsi="Times New Roman" w:cs="Times New Roman" w:hint="eastAsia"/>
         </w:rPr>
+        <w:lastRenderedPageBreak/>
         <w:t>多功能步兵车在地图内</w:t>
       </w:r>
       <w:r>
@@ -2822,7 +2871,6 @@
         <w:rPr>
           <w:rFonts w:ascii="Times New Roman" w:eastAsia="宋体" w:hAnsi="Times New Roman" w:cs="Times New Roman" w:hint="eastAsia"/>
         </w:rPr>
-        <w:lastRenderedPageBreak/>
         <w:t>修复当拖拽小绿点或触发事件、行为时，若突然失去焦点，会导致拖拽预览始终显示的</w:t>
       </w:r>
       <w:r>
@@ -3840,6 +3888,7 @@
         <w:rPr>
           <w:rFonts w:ascii="Times New Roman" w:eastAsia="宋体" w:hAnsi="Times New Roman" w:cs="Times New Roman" w:hint="eastAsia"/>
         </w:rPr>
+        <w:lastRenderedPageBreak/>
         <w:t>建筑</w:t>
       </w:r>
       <w:r>
@@ -3888,7 +3937,6 @@
         <w:rPr>
           <w:rFonts w:ascii="Times New Roman" w:eastAsia="宋体" w:hAnsi="Times New Roman" w:cs="Times New Roman" w:hint="eastAsia"/>
         </w:rPr>
-        <w:lastRenderedPageBreak/>
         <w:t>支持自定义气候类型的素材文件后缀和</w:t>
       </w:r>
       <w:r>
@@ -5023,7 +5071,14 @@
         <w:rPr>
           <w:rFonts w:ascii="Times New Roman" w:eastAsia="宋体" w:hAnsi="Times New Roman" w:cs="Times New Roman" w:hint="eastAsia"/>
         </w:rPr>
-        <w:t>、驻军建筑显示驻扎帧</w:t>
+        <w:t>、驻军建筑显示</w:t>
+      </w:r>
+      <w:r>
+        <w:rPr>
+          <w:rFonts w:ascii="Times New Roman" w:eastAsia="宋体" w:hAnsi="Times New Roman" w:cs="Times New Roman" w:hint="eastAsia"/>
+        </w:rPr>
+        <w:lastRenderedPageBreak/>
+        <w:t>驻扎帧</w:t>
       </w:r>
     </w:p>
     <w:p>
@@ -5059,7 +5114,6 @@
         <w:rPr>
           <w:rFonts w:ascii="Times New Roman" w:eastAsia="宋体" w:hAnsi="Times New Roman" w:cs="Times New Roman" w:hint="eastAsia"/>
         </w:rPr>
-        <w:lastRenderedPageBreak/>
         <w:t>优化建筑</w:t>
       </w:r>
       <w:r>
@@ -6050,7 +6104,14 @@
         <w:rPr>
           <w:rFonts w:ascii="Times New Roman" w:eastAsia="宋体" w:hAnsi="Times New Roman" w:cs="Times New Roman" w:hint="eastAsia"/>
         </w:rPr>
-        <w:t>修复当地形浏览器位于覆盖物视图时，切换框架模式会导致视图切换至地形的</w:t>
+        <w:t>修复当地形浏览器位于覆盖物视图时，切换框架模式会导致视图切换至地形</w:t>
+      </w:r>
+      <w:r>
+        <w:rPr>
+          <w:rFonts w:ascii="Times New Roman" w:eastAsia="宋体" w:hAnsi="Times New Roman" w:cs="Times New Roman" w:hint="eastAsia"/>
+        </w:rPr>
+        <w:lastRenderedPageBreak/>
+        <w:t>的</w:t>
       </w:r>
       <w:r>
         <w:rPr>
@@ -6092,7 +6153,6 @@
         <w:rPr>
           <w:rFonts w:ascii="Times New Roman" w:eastAsia="宋体" w:hAnsi="Times New Roman" w:cs="Times New Roman" w:hint="eastAsia"/>
         </w:rPr>
-        <w:lastRenderedPageBreak/>
         <w:t>使用格式刷时会显示被修改的属性</w:t>
       </w:r>
     </w:p>
@@ -7095,6 +7155,7 @@
         <w:rPr>
           <w:rFonts w:ascii="Times New Roman" w:eastAsia="宋体" w:hAnsi="Times New Roman" w:cs="Times New Roman" w:hint="eastAsia"/>
         </w:rPr>
+        <w:lastRenderedPageBreak/>
         <w:t>修复了当框架模式不完整时，开启框架模式可能会导致崩溃的</w:t>
       </w:r>
       <w:r>
@@ -7161,7 +7222,6 @@
         <w:rPr>
           <w:rFonts w:ascii="Times New Roman" w:eastAsia="宋体" w:hAnsi="Times New Roman" w:cs="Times New Roman"/>
         </w:rPr>
-        <w:lastRenderedPageBreak/>
         <w:t>L</w:t>
       </w:r>
       <w:r>
@@ -8186,6 +8246,7 @@
         <w:rPr>
           <w:rFonts w:ascii="Times New Roman" w:eastAsia="宋体" w:hAnsi="Times New Roman" w:cs="Times New Roman" w:hint="eastAsia"/>
         </w:rPr>
+        <w:lastRenderedPageBreak/>
         <w:t>优化部分描边的绘制性能</w:t>
       </w:r>
     </w:p>
@@ -8212,7 +8273,6 @@
           <w:sz w:val="28"/>
           <w:szCs w:val="32"/>
         </w:rPr>
-        <w:lastRenderedPageBreak/>
         <w:t>1.3.1 (2025.1</w:t>
       </w:r>
       <w:r>
@@ -9277,6 +9337,7 @@
         <w:rPr>
           <w:rFonts w:ascii="Times New Roman" w:eastAsia="宋体" w:hAnsi="Times New Roman" w:cs="Times New Roman" w:hint="eastAsia"/>
         </w:rPr>
+        <w:lastRenderedPageBreak/>
         <w:t>使用随机地形填充地表时支持随机选取</w:t>
       </w:r>
     </w:p>
@@ -9295,7 +9356,6 @@
         <w:rPr>
           <w:rFonts w:ascii="Times New Roman" w:eastAsia="宋体" w:hAnsi="Times New Roman" w:cs="Times New Roman" w:hint="eastAsia"/>
         </w:rPr>
-        <w:lastRenderedPageBreak/>
         <w:t>地图渲染器支持将渲染图保存为</w:t>
       </w:r>
       <w:r>
@@ -10358,6 +10418,7 @@
         <w:rPr>
           <w:rFonts w:ascii="Times New Roman" w:eastAsia="宋体" w:hAnsi="Times New Roman" w:cs="Times New Roman" w:hint="eastAsia"/>
         </w:rPr>
+        <w:lastRenderedPageBreak/>
         <w:t>修复打开偏好设置后会使自动暗色模式失效的</w:t>
       </w:r>
       <w:r>
@@ -10382,7 +10443,6 @@
         <w:rPr>
           <w:rFonts w:ascii="Times New Roman" w:eastAsia="宋体" w:hAnsi="Times New Roman" w:cs="Times New Roman" w:hint="eastAsia"/>
         </w:rPr>
-        <w:lastRenderedPageBreak/>
         <w:t>优化暗色模式的图标</w:t>
       </w:r>
     </w:p>
@@ -11558,6 +11618,7 @@
         <w:rPr>
           <w:rFonts w:ascii="Times New Roman" w:eastAsia="宋体" w:hAnsi="Times New Roman" w:cs="Times New Roman" w:hint="eastAsia"/>
         </w:rPr>
+        <w:lastRenderedPageBreak/>
         <w:t>图层</w:t>
       </w:r>
       <w:r>
@@ -11588,14 +11649,7 @@
         <w:rPr>
           <w:rFonts w:ascii="Times New Roman" w:eastAsia="宋体" w:hAnsi="Times New Roman" w:cs="Times New Roman" w:hint="eastAsia"/>
         </w:rPr>
-        <w:t>，</w:t>
-      </w:r>
-      <w:r>
-        <w:rPr>
-          <w:rFonts w:ascii="Times New Roman" w:eastAsia="宋体" w:hAnsi="Times New Roman" w:cs="Times New Roman" w:hint="eastAsia"/>
-        </w:rPr>
-        <w:lastRenderedPageBreak/>
-        <w:t>增加缩放倍率显示</w:t>
+        <w:t>，增加缩放倍率显示</w:t>
       </w:r>
     </w:p>
     <w:p>
@@ -12643,6 +12697,7 @@
         <w:rPr>
           <w:rFonts w:ascii="Times New Roman" w:eastAsia="宋体" w:hAnsi="Times New Roman" w:cs="Times New Roman" w:hint="eastAsia"/>
         </w:rPr>
+        <w:lastRenderedPageBreak/>
         <w:t>新增</w:t>
       </w:r>
       <w:r>
@@ -12703,8 +12758,986 @@
         <w:rPr>
           <w:rFonts w:ascii="Times New Roman" w:eastAsia="宋体" w:hAnsi="Times New Roman" w:cs="Times New Roman" w:hint="eastAsia"/>
         </w:rPr>
+        <w:t>复制粘贴功能支持跨进程粘贴游戏对象</w:t>
+      </w:r>
+    </w:p>
+    <w:p>
+      <w:pPr>
+        <w:pStyle w:val="a9"/>
+        <w:numPr>
+          <w:ilvl w:val="0"/>
+          <w:numId w:val="31"/>
+        </w:numPr>
+        <w:rPr>
+          <w:rFonts w:ascii="Times New Roman" w:eastAsia="宋体" w:hAnsi="Times New Roman" w:cs="Times New Roman"/>
+        </w:rPr>
+      </w:pPr>
+      <w:r>
+        <w:rPr>
+          <w:rFonts w:ascii="Times New Roman" w:eastAsia="宋体" w:hAnsi="Times New Roman" w:cs="Times New Roman" w:hint="eastAsia"/>
+        </w:rPr>
+        <w:t>复制粘贴功能支持</w:t>
+      </w:r>
+      <w:r>
+        <w:rPr>
+          <w:rFonts w:ascii="Times New Roman" w:eastAsia="宋体" w:hAnsi="Times New Roman" w:cs="Times New Roman" w:hint="eastAsia"/>
+        </w:rPr>
+        <w:t>跨</w:t>
+      </w:r>
+      <w:r>
+        <w:rPr>
+          <w:rFonts w:ascii="Times New Roman" w:eastAsia="宋体" w:hAnsi="Times New Roman" w:cs="Times New Roman" w:hint="eastAsia"/>
+        </w:rPr>
+        <w:t>地形转换，详见</w:t>
+      </w:r>
+      <w:r>
+        <w:rPr>
+          <w:rFonts w:ascii="Times New Roman" w:eastAsia="宋体" w:hAnsi="Times New Roman" w:cs="Times New Roman" w:hint="eastAsia"/>
+        </w:rPr>
+        <w:t>TileConvertRules.ini</w:t>
+      </w:r>
+    </w:p>
+    <w:p>
+      <w:pPr>
+        <w:pStyle w:val="a9"/>
+        <w:numPr>
+          <w:ilvl w:val="0"/>
+          <w:numId w:val="31"/>
+        </w:numPr>
+        <w:rPr>
+          <w:rFonts w:ascii="Times New Roman" w:eastAsia="宋体" w:hAnsi="Times New Roman" w:cs="Times New Roman"/>
+        </w:rPr>
+      </w:pPr>
+      <w:r>
+        <w:rPr>
+          <w:rFonts w:ascii="Times New Roman" w:eastAsia="宋体" w:hAnsi="Times New Roman" w:cs="Times New Roman" w:hint="eastAsia"/>
+        </w:rPr>
+        <w:t>优化建筑动画读取逻辑，尊重动画的</w:t>
+      </w:r>
+      <w:r>
+        <w:rPr>
+          <w:rFonts w:ascii="Times New Roman" w:eastAsia="宋体" w:hAnsi="Times New Roman" w:cs="Times New Roman" w:hint="eastAsia"/>
+        </w:rPr>
+        <w:t>NewTheater</w:t>
+      </w:r>
+      <w:r>
+        <w:rPr>
+          <w:rFonts w:ascii="Times New Roman" w:eastAsia="宋体" w:hAnsi="Times New Roman" w:cs="Times New Roman" w:hint="eastAsia"/>
+        </w:rPr>
+        <w:t>设置</w:t>
+      </w:r>
+    </w:p>
+    <w:p>
+      <w:pPr>
+        <w:pStyle w:val="a9"/>
+        <w:numPr>
+          <w:ilvl w:val="0"/>
+          <w:numId w:val="31"/>
+        </w:numPr>
+        <w:rPr>
+          <w:rFonts w:ascii="Times New Roman" w:eastAsia="宋体" w:hAnsi="Times New Roman" w:cs="Times New Roman"/>
+        </w:rPr>
+      </w:pPr>
+      <w:r>
+        <w:rPr>
+          <w:rFonts w:ascii="Times New Roman" w:eastAsia="宋体" w:hAnsi="Times New Roman" w:cs="Times New Roman" w:hint="eastAsia"/>
+        </w:rPr>
+        <w:t>Lua</w:t>
+      </w:r>
+      <w:r>
+        <w:rPr>
+          <w:rFonts w:ascii="Times New Roman" w:eastAsia="宋体" w:hAnsi="Times New Roman" w:cs="Times New Roman" w:hint="eastAsia"/>
+        </w:rPr>
+        <w:t>脚本终端支持搜索脚本文件</w:t>
+      </w:r>
+    </w:p>
+    <w:p>
+      <w:pPr>
+        <w:pStyle w:val="a9"/>
+        <w:numPr>
+          <w:ilvl w:val="0"/>
+          <w:numId w:val="31"/>
+        </w:numPr>
+        <w:rPr>
+          <w:rFonts w:ascii="Times New Roman" w:eastAsia="宋体" w:hAnsi="Times New Roman" w:cs="Times New Roman"/>
+        </w:rPr>
+      </w:pPr>
+      <w:r>
+        <w:rPr>
+          <w:rFonts w:ascii="Times New Roman" w:eastAsia="宋体" w:hAnsi="Times New Roman" w:cs="Times New Roman" w:hint="eastAsia"/>
+        </w:rPr>
+        <w:t>微调地图边界细蓝线的位置</w:t>
+      </w:r>
+    </w:p>
+    <w:p>
+      <w:pPr>
+        <w:pStyle w:val="a9"/>
+        <w:numPr>
+          <w:ilvl w:val="0"/>
+          <w:numId w:val="31"/>
+        </w:numPr>
+        <w:rPr>
+          <w:rFonts w:ascii="Times New Roman" w:eastAsia="宋体" w:hAnsi="Times New Roman" w:cs="Times New Roman"/>
+        </w:rPr>
+      </w:pPr>
+      <w:r>
+        <w:rPr>
+          <w:rFonts w:ascii="Times New Roman" w:eastAsia="宋体" w:hAnsi="Times New Roman" w:cs="Times New Roman" w:hint="eastAsia"/>
+        </w:rPr>
+        <w:t>修复了</w:t>
+      </w:r>
+      <w:r>
+        <w:rPr>
+          <w:rFonts w:ascii="Times New Roman" w:eastAsia="宋体" w:hAnsi="Times New Roman" w:cs="Times New Roman" w:hint="eastAsia"/>
+        </w:rPr>
+        <w:t>Vxl</w:t>
+      </w:r>
+      <w:r>
+        <w:rPr>
+          <w:rFonts w:ascii="Times New Roman" w:eastAsia="宋体" w:hAnsi="Times New Roman" w:cs="Times New Roman" w:hint="eastAsia"/>
+        </w:rPr>
+        <w:t>车辆</w:t>
+      </w:r>
+      <w:r>
+        <w:rPr>
+          <w:rFonts w:ascii="Times New Roman" w:eastAsia="宋体" w:hAnsi="Times New Roman" w:cs="Times New Roman" w:hint="eastAsia"/>
+        </w:rPr>
+        <w:t>Noshadow=yes</w:t>
+      </w:r>
+      <w:r>
+        <w:rPr>
+          <w:rFonts w:ascii="Times New Roman" w:eastAsia="宋体" w:hAnsi="Times New Roman" w:cs="Times New Roman" w:hint="eastAsia"/>
+        </w:rPr>
+        <w:t>时仍会显示阴影的</w:t>
+      </w:r>
+      <w:r>
+        <w:rPr>
+          <w:rFonts w:ascii="Times New Roman" w:eastAsia="宋体" w:hAnsi="Times New Roman" w:cs="Times New Roman" w:hint="eastAsia"/>
+        </w:rPr>
+        <w:t>bug</w:t>
+      </w:r>
+    </w:p>
+    <w:p>
+      <w:pPr>
+        <w:pStyle w:val="a9"/>
+        <w:numPr>
+          <w:ilvl w:val="0"/>
+          <w:numId w:val="31"/>
+        </w:numPr>
+        <w:rPr>
+          <w:rFonts w:ascii="Times New Roman" w:eastAsia="宋体" w:hAnsi="Times New Roman" w:cs="Times New Roman"/>
+        </w:rPr>
+      </w:pPr>
+      <w:r>
+        <w:rPr>
+          <w:rFonts w:ascii="Times New Roman" w:eastAsia="宋体" w:hAnsi="Times New Roman" w:cs="Times New Roman" w:hint="eastAsia"/>
+        </w:rPr>
+        <w:t>修复部分情况下绘制连接地形上升、下降段高度错误的</w:t>
+      </w:r>
+      <w:r>
+        <w:rPr>
+          <w:rFonts w:ascii="Times New Roman" w:eastAsia="宋体" w:hAnsi="Times New Roman" w:cs="Times New Roman" w:hint="eastAsia"/>
+        </w:rPr>
+        <w:t>bug</w:t>
+      </w:r>
+    </w:p>
+    <w:p>
+      <w:pPr>
+        <w:pStyle w:val="a9"/>
+        <w:numPr>
+          <w:ilvl w:val="0"/>
+          <w:numId w:val="31"/>
+        </w:numPr>
+        <w:rPr>
+          <w:rFonts w:ascii="Times New Roman" w:eastAsia="宋体" w:hAnsi="Times New Roman" w:cs="Times New Roman"/>
+        </w:rPr>
+      </w:pPr>
+      <w:r>
+        <w:rPr>
+          <w:rFonts w:ascii="Times New Roman" w:eastAsia="宋体" w:hAnsi="Times New Roman" w:cs="Times New Roman" w:hint="eastAsia"/>
+        </w:rPr>
+        <w:t>优化光照沙盒切换时的性能</w:t>
+      </w:r>
+    </w:p>
+    <w:p>
+      <w:pPr>
+        <w:pStyle w:val="a9"/>
+        <w:numPr>
+          <w:ilvl w:val="0"/>
+          <w:numId w:val="31"/>
+        </w:numPr>
+        <w:rPr>
+          <w:rFonts w:ascii="Times New Roman" w:eastAsia="宋体" w:hAnsi="Times New Roman" w:cs="Times New Roman"/>
+        </w:rPr>
+      </w:pPr>
+      <w:r>
+        <w:rPr>
+          <w:rFonts w:ascii="Times New Roman" w:eastAsia="宋体" w:hAnsi="Times New Roman" w:cs="Times New Roman" w:hint="eastAsia"/>
+        </w:rPr>
+        <w:t>新增</w:t>
+      </w:r>
+      <w:r>
+        <w:rPr>
+          <w:rFonts w:ascii="Times New Roman" w:eastAsia="宋体" w:hAnsi="Times New Roman" w:cs="Times New Roman" w:hint="eastAsia"/>
+        </w:rPr>
+        <w:t>LightingPreview</w:t>
+      </w:r>
+      <w:r>
+        <w:rPr>
+          <w:rFonts w:ascii="Times New Roman" w:eastAsia="宋体" w:hAnsi="Times New Roman" w:cs="Times New Roman" w:hint="eastAsia"/>
+        </w:rPr>
+        <w:t>.</w:t>
+      </w:r>
+      <w:r>
+        <w:rPr>
+          <w:rFonts w:ascii="Times New Roman" w:eastAsia="宋体" w:hAnsi="Times New Roman" w:cs="Times New Roman" w:hint="eastAsia"/>
+        </w:rPr>
+        <w:t>Tint</w:t>
+      </w:r>
+      <w:r>
+        <w:rPr>
+          <w:rFonts w:ascii="Times New Roman" w:eastAsia="宋体" w:hAnsi="Times New Roman" w:cs="Times New Roman" w:hint="eastAsia"/>
+        </w:rPr>
+        <w:t>TileSetBrowserView</w:t>
+      </w:r>
+      <w:r>
+        <w:rPr>
+          <w:rFonts w:ascii="Times New Roman" w:eastAsia="宋体" w:hAnsi="Times New Roman" w:cs="Times New Roman" w:hint="eastAsia"/>
+        </w:rPr>
+        <w:t>，控制是否按光照沙盒渲染地形浏览器图像</w:t>
+      </w:r>
+    </w:p>
+    <w:p>
+      <w:pPr>
+        <w:pStyle w:val="a9"/>
+        <w:numPr>
+          <w:ilvl w:val="0"/>
+          <w:numId w:val="31"/>
+        </w:numPr>
+        <w:rPr>
+          <w:rFonts w:ascii="Times New Roman" w:eastAsia="宋体" w:hAnsi="Times New Roman" w:cs="Times New Roman"/>
+        </w:rPr>
+      </w:pPr>
+      <w:r>
+        <w:rPr>
+          <w:rFonts w:ascii="Times New Roman" w:eastAsia="宋体" w:hAnsi="Times New Roman" w:cs="Times New Roman" w:hint="eastAsia"/>
+        </w:rPr>
+        <w:t>新增距离标尺，可以记录当前鼠标位置距离上次按下左键位置的距离，记录历史数量见</w:t>
+      </w:r>
+      <w:r>
+        <w:rPr>
+          <w:rFonts w:ascii="Times New Roman" w:eastAsia="宋体" w:hAnsi="Times New Roman" w:cs="Times New Roman" w:hint="eastAsia"/>
+        </w:rPr>
+        <w:t>DistanceRuler.Records</w:t>
+      </w:r>
+    </w:p>
+    <w:p>
+      <w:pPr>
+        <w:pStyle w:val="a9"/>
+        <w:numPr>
+          <w:ilvl w:val="0"/>
+          <w:numId w:val="31"/>
+        </w:numPr>
+        <w:rPr>
+          <w:rFonts w:ascii="Times New Roman" w:eastAsia="宋体" w:hAnsi="Times New Roman" w:cs="Times New Roman"/>
+        </w:rPr>
+      </w:pPr>
+      <w:r>
+        <w:rPr>
+          <w:rFonts w:ascii="Times New Roman" w:eastAsia="宋体" w:hAnsi="Times New Roman" w:cs="Times New Roman" w:hint="eastAsia"/>
+        </w:rPr>
+        <w:t>微调新建地图时可视边界数值</w:t>
+      </w:r>
+    </w:p>
+    <w:p>
+      <w:pPr>
+        <w:pStyle w:val="a9"/>
+        <w:numPr>
+          <w:ilvl w:val="0"/>
+          <w:numId w:val="31"/>
+        </w:numPr>
+        <w:rPr>
+          <w:rFonts w:ascii="Times New Roman" w:eastAsia="宋体" w:hAnsi="Times New Roman" w:cs="Times New Roman"/>
+        </w:rPr>
+      </w:pPr>
+      <w:r>
+        <w:rPr>
+          <w:rFonts w:ascii="Times New Roman" w:eastAsia="宋体" w:hAnsi="Times New Roman" w:cs="Times New Roman" w:hint="eastAsia"/>
+        </w:rPr>
+        <w:t>修复平坦地形工具无法平坦地图边缘斜坡的</w:t>
+      </w:r>
+      <w:r>
+        <w:rPr>
+          <w:rFonts w:ascii="Times New Roman" w:eastAsia="宋体" w:hAnsi="Times New Roman" w:cs="Times New Roman" w:hint="eastAsia"/>
+        </w:rPr>
+        <w:t>bug</w:t>
+      </w:r>
+    </w:p>
+    <w:p>
+      <w:pPr>
+        <w:pStyle w:val="a9"/>
+        <w:numPr>
+          <w:ilvl w:val="0"/>
+          <w:numId w:val="31"/>
+        </w:numPr>
+        <w:rPr>
+          <w:rFonts w:ascii="Times New Roman" w:eastAsia="宋体" w:hAnsi="Times New Roman" w:cs="Times New Roman"/>
+        </w:rPr>
+      </w:pPr>
+      <w:r>
+        <w:rPr>
+          <w:rFonts w:ascii="Times New Roman" w:eastAsia="宋体" w:hAnsi="Times New Roman" w:cs="Times New Roman" w:hint="eastAsia"/>
+        </w:rPr>
+        <w:t>绘制连接地形可以将鼠标移动到地图边界外，更方便靠近边界的绘制</w:t>
+      </w:r>
+    </w:p>
+    <w:p>
+      <w:pPr>
+        <w:pStyle w:val="a9"/>
+        <w:numPr>
+          <w:ilvl w:val="0"/>
+          <w:numId w:val="31"/>
+        </w:numPr>
+        <w:rPr>
+          <w:rFonts w:ascii="Times New Roman" w:eastAsia="宋体" w:hAnsi="Times New Roman" w:cs="Times New Roman"/>
+        </w:rPr>
+      </w:pPr>
+      <w:r>
+        <w:rPr>
+          <w:rFonts w:ascii="Times New Roman" w:eastAsia="宋体" w:hAnsi="Times New Roman" w:cs="Times New Roman" w:hint="eastAsia"/>
+        </w:rPr>
+        <w:t>优化</w:t>
+      </w:r>
+      <w:r>
+        <w:rPr>
+          <w:rFonts w:ascii="Times New Roman" w:eastAsia="宋体" w:hAnsi="Times New Roman" w:cs="Times New Roman" w:hint="eastAsia"/>
+        </w:rPr>
+        <w:t>IsoMapPack5</w:t>
+      </w:r>
+      <w:r>
+        <w:rPr>
+          <w:rFonts w:ascii="Times New Roman" w:eastAsia="宋体" w:hAnsi="Times New Roman" w:cs="Times New Roman" w:hint="eastAsia"/>
+        </w:rPr>
+        <w:t>压缩，减少地图体积，减少游戏内大地图地形异常的可能</w:t>
+      </w:r>
+    </w:p>
+    <w:p>
+      <w:pPr>
+        <w:pStyle w:val="a9"/>
+        <w:numPr>
+          <w:ilvl w:val="0"/>
+          <w:numId w:val="31"/>
+        </w:numPr>
+        <w:rPr>
+          <w:rFonts w:ascii="Times New Roman" w:eastAsia="宋体" w:hAnsi="Times New Roman" w:cs="Times New Roman"/>
+        </w:rPr>
+      </w:pPr>
+      <w:r>
+        <w:rPr>
+          <w:rFonts w:ascii="Times New Roman" w:eastAsia="宋体" w:hAnsi="Times New Roman" w:cs="Times New Roman" w:hint="eastAsia"/>
+        </w:rPr>
+        <w:t>修复调整地图大小后隧道位置错误的</w:t>
+      </w:r>
+      <w:r>
+        <w:rPr>
+          <w:rFonts w:ascii="Times New Roman" w:eastAsia="宋体" w:hAnsi="Times New Roman" w:cs="Times New Roman" w:hint="eastAsia"/>
+        </w:rPr>
+        <w:t>bug</w:t>
+      </w:r>
+    </w:p>
+    <w:p>
+      <w:pPr>
+        <w:pStyle w:val="a9"/>
+        <w:numPr>
+          <w:ilvl w:val="0"/>
+          <w:numId w:val="31"/>
+        </w:numPr>
+        <w:rPr>
+          <w:rFonts w:ascii="Times New Roman" w:eastAsia="宋体" w:hAnsi="Times New Roman" w:cs="Times New Roman"/>
+        </w:rPr>
+      </w:pPr>
+      <w:r>
+        <w:rPr>
+          <w:rFonts w:ascii="Times New Roman" w:eastAsia="宋体" w:hAnsi="Times New Roman" w:cs="Times New Roman" w:hint="eastAsia"/>
+        </w:rPr>
+        <w:t>修复了在开启输入法和部分情况下在地图界面按</w:t>
+      </w:r>
+      <w:r>
+        <w:rPr>
+          <w:rFonts w:ascii="Times New Roman" w:eastAsia="宋体" w:hAnsi="Times New Roman" w:cs="Times New Roman" w:hint="eastAsia"/>
+        </w:rPr>
+        <w:t>D</w:t>
+      </w:r>
+      <w:r>
+        <w:rPr>
+          <w:rFonts w:ascii="Times New Roman" w:eastAsia="宋体" w:hAnsi="Times New Roman" w:cs="Times New Roman" w:hint="eastAsia"/>
+        </w:rPr>
+        <w:t>、</w:t>
+      </w:r>
+      <w:r>
+        <w:rPr>
+          <w:rFonts w:ascii="Times New Roman" w:eastAsia="宋体" w:hAnsi="Times New Roman" w:cs="Times New Roman" w:hint="eastAsia"/>
+        </w:rPr>
+        <w:t>[</w:t>
+      </w:r>
+      <w:r>
+        <w:rPr>
+          <w:rFonts w:ascii="Times New Roman" w:eastAsia="宋体" w:hAnsi="Times New Roman" w:cs="Times New Roman" w:hint="eastAsia"/>
+        </w:rPr>
+        <w:t>、</w:t>
+      </w:r>
+      <w:r>
+        <w:rPr>
+          <w:rFonts w:ascii="Times New Roman" w:eastAsia="宋体" w:hAnsi="Times New Roman" w:cs="Times New Roman" w:hint="eastAsia"/>
+        </w:rPr>
+        <w:t>]</w:t>
+      </w:r>
+      <w:r>
+        <w:rPr>
+          <w:rFonts w:ascii="Times New Roman" w:eastAsia="宋体" w:hAnsi="Times New Roman" w:cs="Times New Roman" w:hint="eastAsia"/>
+        </w:rPr>
+        <w:t>键无效的</w:t>
+      </w:r>
+      <w:r>
+        <w:rPr>
+          <w:rFonts w:ascii="Times New Roman" w:eastAsia="宋体" w:hAnsi="Times New Roman" w:cs="Times New Roman" w:hint="eastAsia"/>
+        </w:rPr>
+        <w:t>bug</w:t>
+      </w:r>
+    </w:p>
+    <w:p>
+      <w:pPr>
+        <w:pStyle w:val="a9"/>
+        <w:numPr>
+          <w:ilvl w:val="0"/>
+          <w:numId w:val="31"/>
+        </w:numPr>
+        <w:rPr>
+          <w:rFonts w:ascii="Times New Roman" w:eastAsia="宋体" w:hAnsi="Times New Roman" w:cs="Times New Roman"/>
+        </w:rPr>
+      </w:pPr>
+      <w:r>
+        <w:rPr>
+          <w:rFonts w:ascii="Times New Roman" w:eastAsia="宋体" w:hAnsi="Times New Roman" w:cs="Times New Roman" w:hint="eastAsia"/>
+        </w:rPr>
+        <w:t>修复了新城市下使用绘制悬崖后部工具时，按</w:t>
+      </w:r>
+      <w:r>
+        <w:rPr>
+          <w:rFonts w:ascii="Times New Roman" w:eastAsia="宋体" w:hAnsi="Times New Roman" w:cs="Times New Roman" w:hint="eastAsia"/>
+        </w:rPr>
+        <w:t>A</w:t>
+      </w:r>
+      <w:r>
+        <w:rPr>
+          <w:rFonts w:ascii="Times New Roman" w:eastAsia="宋体" w:hAnsi="Times New Roman" w:cs="Times New Roman" w:hint="eastAsia"/>
+        </w:rPr>
+        <w:t>键无法切换悬崖类型的</w:t>
+      </w:r>
+      <w:r>
+        <w:rPr>
+          <w:rFonts w:ascii="Times New Roman" w:eastAsia="宋体" w:hAnsi="Times New Roman" w:cs="Times New Roman" w:hint="eastAsia"/>
+        </w:rPr>
+        <w:t>bug</w:t>
+      </w:r>
+    </w:p>
+    <w:p>
+      <w:pPr>
+        <w:pStyle w:val="a9"/>
+        <w:numPr>
+          <w:ilvl w:val="0"/>
+          <w:numId w:val="31"/>
+        </w:numPr>
+        <w:rPr>
+          <w:rFonts w:ascii="Times New Roman" w:eastAsia="宋体" w:hAnsi="Times New Roman" w:cs="Times New Roman"/>
+        </w:rPr>
+      </w:pPr>
+      <w:r>
+        <w:rPr>
+          <w:rFonts w:ascii="Times New Roman" w:eastAsia="宋体" w:hAnsi="Times New Roman" w:cs="Times New Roman" w:hint="eastAsia"/>
+        </w:rPr>
+        <w:t>增强绘制悬崖工具，可以在不同地图类型的</w:t>
+      </w:r>
+      <w:r>
+        <w:rPr>
+          <w:rFonts w:ascii="Times New Roman" w:eastAsia="宋体" w:hAnsi="Times New Roman" w:cs="Times New Roman" w:hint="eastAsia"/>
+        </w:rPr>
+        <w:t>[TheaterInfo]</w:t>
+      </w:r>
+      <w:r>
+        <w:rPr>
+          <w:rFonts w:ascii="Times New Roman" w:eastAsia="宋体" w:hAnsi="Times New Roman" w:cs="Times New Roman" w:hint="eastAsia"/>
+        </w:rPr>
+        <w:t>（如</w:t>
+      </w:r>
+      <w:r>
+        <w:rPr>
+          <w:rFonts w:ascii="Times New Roman" w:eastAsia="宋体" w:hAnsi="Times New Roman" w:cs="Times New Roman" w:hint="eastAsia"/>
+        </w:rPr>
+        <w:t>[SnowInfo]</w:t>
+      </w:r>
+      <w:r>
+        <w:rPr>
+          <w:rFonts w:ascii="Times New Roman" w:eastAsia="宋体" w:hAnsi="Times New Roman" w:cs="Times New Roman" w:hint="eastAsia"/>
+        </w:rPr>
+        <w:t>）中填写</w:t>
+      </w:r>
+      <w:r>
+        <w:rPr>
+          <w:rFonts w:ascii="Times New Roman" w:eastAsia="宋体" w:hAnsi="Times New Roman" w:cs="Times New Roman" w:hint="eastAsia"/>
+        </w:rPr>
+        <w:t>Cliffs2</w:t>
+      </w:r>
+      <w:r>
+        <w:rPr>
+          <w:rFonts w:ascii="Times New Roman" w:eastAsia="宋体" w:hAnsi="Times New Roman" w:cs="Times New Roman" w:hint="eastAsia"/>
+        </w:rPr>
+        <w:t>、</w:t>
+      </w:r>
+      <w:r>
+        <w:rPr>
+          <w:rFonts w:ascii="Times New Roman" w:eastAsia="宋体" w:hAnsi="Times New Roman" w:cs="Times New Roman" w:hint="eastAsia"/>
+        </w:rPr>
+        <w:t>CliffsWater2</w:t>
+      </w:r>
+      <w:r>
+        <w:rPr>
+          <w:rFonts w:ascii="Times New Roman" w:eastAsia="宋体" w:hAnsi="Times New Roman" w:cs="Times New Roman" w:hint="eastAsia"/>
+        </w:rPr>
+        <w:t>以支持悬崖类型切换；在存在月球悬崖时，支持绘制月球悬崖</w:t>
+      </w:r>
+    </w:p>
+    <w:p>
+      <w:pPr>
+        <w:pStyle w:val="a9"/>
+        <w:numPr>
+          <w:ilvl w:val="0"/>
+          <w:numId w:val="31"/>
+        </w:numPr>
+        <w:rPr>
+          <w:rFonts w:ascii="Times New Roman" w:eastAsia="宋体" w:hAnsi="Times New Roman" w:cs="Times New Roman"/>
+        </w:rPr>
+      </w:pPr>
+      <w:r>
+        <w:rPr>
+          <w:rFonts w:ascii="Times New Roman" w:eastAsia="宋体" w:hAnsi="Times New Roman" w:cs="Times New Roman" w:hint="eastAsia"/>
+        </w:rPr>
+        <w:t>支持</w:t>
+      </w:r>
+      <w:r>
+        <w:rPr>
+          <w:rFonts w:ascii="Times New Roman" w:eastAsia="宋体" w:hAnsi="Times New Roman" w:cs="Times New Roman" w:hint="eastAsia"/>
+        </w:rPr>
+        <w:t>32</w:t>
+      </w:r>
+      <w:r>
+        <w:rPr>
+          <w:rFonts w:ascii="Times New Roman" w:eastAsia="宋体" w:hAnsi="Times New Roman" w:cs="Times New Roman" w:hint="eastAsia"/>
+        </w:rPr>
+        <w:t>向面向</w:t>
+      </w:r>
+      <w:r>
+        <w:rPr>
+          <w:rFonts w:ascii="Times New Roman" w:eastAsia="宋体" w:hAnsi="Times New Roman" w:cs="Times New Roman" w:hint="eastAsia"/>
+        </w:rPr>
+        <w:t>与拖拽</w:t>
+      </w:r>
+      <w:r>
+        <w:rPr>
+          <w:rFonts w:ascii="Times New Roman" w:eastAsia="宋体" w:hAnsi="Times New Roman" w:cs="Times New Roman" w:hint="eastAsia"/>
+        </w:rPr>
+        <w:t>，详见</w:t>
+      </w:r>
+      <w:r>
+        <w:rPr>
+          <w:rFonts w:ascii="Times New Roman" w:eastAsia="宋体" w:hAnsi="Times New Roman" w:cs="Times New Roman" w:hint="eastAsia"/>
+        </w:rPr>
+        <w:t>ExtFacings</w:t>
+      </w:r>
+      <w:r>
+        <w:rPr>
+          <w:rFonts w:ascii="Times New Roman" w:eastAsia="宋体" w:hAnsi="Times New Roman" w:cs="Times New Roman" w:hint="eastAsia"/>
+        </w:rPr>
+        <w:t>与</w:t>
+      </w:r>
+      <w:r>
+        <w:rPr>
+          <w:rFonts w:ascii="Times New Roman" w:eastAsia="宋体" w:hAnsi="Times New Roman" w:cs="Times New Roman" w:hint="eastAsia"/>
+        </w:rPr>
+        <w:t>ExtFacings.Drag</w:t>
+      </w:r>
+    </w:p>
+    <w:p>
+      <w:pPr>
+        <w:pStyle w:val="a9"/>
+        <w:numPr>
+          <w:ilvl w:val="0"/>
+          <w:numId w:val="31"/>
+        </w:numPr>
+        <w:rPr>
+          <w:rFonts w:ascii="Times New Roman" w:eastAsia="宋体" w:hAnsi="Times New Roman" w:cs="Times New Roman"/>
+        </w:rPr>
+      </w:pPr>
+      <w:r>
+        <w:rPr>
+          <w:rFonts w:ascii="Times New Roman" w:eastAsia="宋体" w:hAnsi="Times New Roman" w:cs="Times New Roman" w:hint="eastAsia"/>
+        </w:rPr>
+        <w:t>重写部分字符串类型，优化字符串加载稳定性</w:t>
+      </w:r>
+    </w:p>
+    <w:p>
+      <w:pPr>
+        <w:pStyle w:val="a9"/>
+        <w:numPr>
+          <w:ilvl w:val="0"/>
+          <w:numId w:val="31"/>
+        </w:numPr>
+        <w:rPr>
+          <w:rFonts w:ascii="Times New Roman" w:eastAsia="宋体" w:hAnsi="Times New Roman" w:cs="Times New Roman"/>
+        </w:rPr>
+      </w:pPr>
+      <w:r>
+        <w:rPr>
+          <w:rFonts w:ascii="Times New Roman" w:eastAsia="宋体" w:hAnsi="Times New Roman" w:cs="Times New Roman" w:hint="eastAsia"/>
+        </w:rPr>
+        <w:t>优化抬升</w:t>
+      </w:r>
+      <w:r>
+        <w:rPr>
+          <w:rFonts w:ascii="Times New Roman" w:eastAsia="宋体" w:hAnsi="Times New Roman" w:cs="Times New Roman" w:hint="eastAsia"/>
+        </w:rPr>
+        <w:t>/</w:t>
+      </w:r>
+      <w:r>
+        <w:rPr>
+          <w:rFonts w:ascii="Times New Roman" w:eastAsia="宋体" w:hAnsi="Times New Roman" w:cs="Times New Roman" w:hint="eastAsia"/>
+        </w:rPr>
+        <w:t>降低地表算法，不会出现异常的大范围变动</w:t>
+      </w:r>
+    </w:p>
+    <w:p>
+      <w:pPr>
+        <w:pStyle w:val="a9"/>
+        <w:numPr>
+          <w:ilvl w:val="0"/>
+          <w:numId w:val="31"/>
+        </w:numPr>
+        <w:rPr>
+          <w:rFonts w:ascii="Times New Roman" w:eastAsia="宋体" w:hAnsi="Times New Roman" w:cs="Times New Roman"/>
+        </w:rPr>
+      </w:pPr>
+      <w:r>
+        <w:rPr>
+          <w:rFonts w:ascii="Times New Roman" w:eastAsia="宋体" w:hAnsi="Times New Roman" w:cs="Times New Roman" w:hint="eastAsia"/>
+        </w:rPr>
+        <w:t>FA2sp.log</w:t>
+      </w:r>
+      <w:r>
+        <w:rPr>
+          <w:rFonts w:ascii="Times New Roman" w:eastAsia="宋体" w:hAnsi="Times New Roman" w:cs="Times New Roman" w:hint="eastAsia"/>
+        </w:rPr>
+        <w:t>使用</w:t>
+      </w:r>
+      <w:r>
+        <w:rPr>
+          <w:rFonts w:ascii="Times New Roman" w:eastAsia="宋体" w:hAnsi="Times New Roman" w:cs="Times New Roman" w:hint="eastAsia"/>
+        </w:rPr>
+        <w:t>UTF8</w:t>
+      </w:r>
+      <w:r>
+        <w:rPr>
+          <w:rFonts w:ascii="Times New Roman" w:eastAsia="宋体" w:hAnsi="Times New Roman" w:cs="Times New Roman" w:hint="eastAsia"/>
+        </w:rPr>
+        <w:t>编码</w:t>
+      </w:r>
+    </w:p>
+    <w:p>
+      <w:pPr>
+        <w:pStyle w:val="a9"/>
+        <w:numPr>
+          <w:ilvl w:val="0"/>
+          <w:numId w:val="31"/>
+        </w:numPr>
+        <w:rPr>
+          <w:rFonts w:ascii="Times New Roman" w:eastAsia="宋体" w:hAnsi="Times New Roman" w:cs="Times New Roman"/>
+        </w:rPr>
+      </w:pPr>
+      <w:r>
+        <w:rPr>
+          <w:rFonts w:ascii="Times New Roman" w:eastAsia="宋体" w:hAnsi="Times New Roman" w:cs="Times New Roman" w:hint="eastAsia"/>
+        </w:rPr>
+        <w:t>保存地图时可以维持已有的</w:t>
+      </w:r>
+      <w:r>
+        <w:rPr>
+          <w:rFonts w:ascii="Times New Roman" w:eastAsia="宋体" w:hAnsi="Times New Roman" w:cs="Times New Roman" w:hint="eastAsia"/>
+        </w:rPr>
+        <w:t>ini</w:t>
+      </w:r>
+      <w:r>
+        <w:rPr>
+          <w:rFonts w:ascii="Times New Roman" w:eastAsia="宋体" w:hAnsi="Times New Roman" w:cs="Times New Roman" w:hint="eastAsia"/>
+        </w:rPr>
+        <w:t>小节顺序，详见</w:t>
+      </w:r>
+      <w:r>
+        <w:rPr>
+          <w:rFonts w:ascii="Times New Roman" w:eastAsia="宋体" w:hAnsi="Times New Roman" w:cs="Times New Roman" w:hint="eastAsia"/>
+        </w:rPr>
+        <w:t>SaveMap.PreserveINISorting</w:t>
+      </w:r>
+    </w:p>
+    <w:p>
+      <w:pPr>
+        <w:pStyle w:val="a9"/>
+        <w:numPr>
+          <w:ilvl w:val="0"/>
+          <w:numId w:val="31"/>
+        </w:numPr>
+        <w:rPr>
+          <w:rFonts w:ascii="Times New Roman" w:eastAsia="宋体" w:hAnsi="Times New Roman" w:cs="Times New Roman"/>
+        </w:rPr>
+      </w:pPr>
+      <w:r>
+        <w:rPr>
+          <w:rFonts w:ascii="Times New Roman" w:eastAsia="宋体" w:hAnsi="Times New Roman" w:cs="Times New Roman" w:hint="eastAsia"/>
+        </w:rPr>
+        <w:t>重写撤销重做系统，所有撤销动作均支持完整重做</w:t>
+      </w:r>
+    </w:p>
+    <w:p>
+      <w:pPr>
+        <w:pStyle w:val="a9"/>
+        <w:numPr>
+          <w:ilvl w:val="0"/>
+          <w:numId w:val="31"/>
+        </w:numPr>
+        <w:rPr>
+          <w:rFonts w:ascii="Times New Roman" w:eastAsia="宋体" w:hAnsi="Times New Roman" w:cs="Times New Roman"/>
+        </w:rPr>
+      </w:pPr>
+      <w:r>
+        <w:rPr>
+          <w:rFonts w:ascii="Times New Roman" w:eastAsia="宋体" w:hAnsi="Times New Roman" w:cs="Times New Roman" w:hint="eastAsia"/>
+        </w:rPr>
+        <w:t>撤销重做系统能够记录游戏对象的修改历史，详见</w:t>
+      </w:r>
+      <w:r>
+        <w:rPr>
+          <w:rFonts w:ascii="Times New Roman" w:eastAsia="宋体" w:hAnsi="Times New Roman" w:cs="Times New Roman" w:hint="eastAsia"/>
+        </w:rPr>
+        <w:t>UndoRedo.RecordObjects</w:t>
+      </w:r>
+    </w:p>
+    <w:p>
+      <w:pPr>
+        <w:pStyle w:val="a9"/>
+        <w:numPr>
+          <w:ilvl w:val="0"/>
+          <w:numId w:val="31"/>
+        </w:numPr>
+        <w:rPr>
+          <w:rFonts w:ascii="Times New Roman" w:eastAsia="宋体" w:hAnsi="Times New Roman" w:cs="Times New Roman"/>
+        </w:rPr>
+      </w:pPr>
+      <w:r>
+        <w:rPr>
+          <w:rFonts w:ascii="Times New Roman" w:eastAsia="宋体" w:hAnsi="Times New Roman" w:cs="Times New Roman" w:hint="eastAsia"/>
+        </w:rPr>
+        <w:t>支持设置</w:t>
+      </w:r>
+      <w:r>
+        <w:rPr>
+          <w:rFonts w:ascii="Times New Roman" w:eastAsia="宋体" w:hAnsi="Times New Roman" w:cs="Times New Roman" w:hint="eastAsia"/>
+        </w:rPr>
+        <w:t>RubblePalette</w:t>
+      </w:r>
+      <w:r>
+        <w:rPr>
+          <w:rFonts w:ascii="Times New Roman" w:eastAsia="宋体" w:hAnsi="Times New Roman" w:cs="Times New Roman" w:hint="eastAsia"/>
+        </w:rPr>
+        <w:t>=</w:t>
+      </w:r>
+      <w:r>
+        <w:rPr>
+          <w:rFonts w:ascii="Times New Roman" w:eastAsia="宋体" w:hAnsi="Times New Roman" w:cs="Times New Roman" w:hint="eastAsia"/>
+        </w:rPr>
+        <w:t>指定建筑废墟色盘</w:t>
+      </w:r>
+    </w:p>
+    <w:p>
+      <w:pPr>
+        <w:pStyle w:val="a9"/>
+        <w:numPr>
+          <w:ilvl w:val="0"/>
+          <w:numId w:val="31"/>
+        </w:numPr>
+        <w:rPr>
+          <w:rFonts w:ascii="Times New Roman" w:eastAsia="宋体" w:hAnsi="Times New Roman" w:cs="Times New Roman"/>
+        </w:rPr>
+      </w:pPr>
+      <w:r>
+        <w:rPr>
+          <w:rFonts w:ascii="Times New Roman" w:eastAsia="宋体" w:hAnsi="Times New Roman" w:cs="Times New Roman" w:hint="eastAsia"/>
+        </w:rPr>
+        <w:t>提升稳定性</w:t>
+      </w:r>
+    </w:p>
+    <w:p>
+      <w:pPr>
+        <w:pStyle w:val="a9"/>
+        <w:numPr>
+          <w:ilvl w:val="0"/>
+          <w:numId w:val="31"/>
+        </w:numPr>
+        <w:rPr>
+          <w:rFonts w:ascii="Times New Roman" w:eastAsia="宋体" w:hAnsi="Times New Roman" w:cs="Times New Roman"/>
+        </w:rPr>
+      </w:pPr>
+      <w:r>
+        <w:rPr>
+          <w:rFonts w:ascii="Times New Roman" w:eastAsia="宋体" w:hAnsi="Times New Roman" w:cs="Times New Roman" w:hint="eastAsia"/>
+        </w:rPr>
+        <w:t>优化素材图像内存占用</w:t>
+      </w:r>
+    </w:p>
+    <w:p>
+      <w:pPr>
+        <w:pStyle w:val="a9"/>
+        <w:numPr>
+          <w:ilvl w:val="0"/>
+          <w:numId w:val="31"/>
+        </w:numPr>
+        <w:rPr>
+          <w:rFonts w:ascii="Times New Roman" w:eastAsia="宋体" w:hAnsi="Times New Roman" w:cs="Times New Roman"/>
+        </w:rPr>
+      </w:pPr>
+      <w:r>
+        <w:rPr>
+          <w:rFonts w:ascii="Times New Roman" w:eastAsia="宋体" w:hAnsi="Times New Roman" w:cs="Times New Roman" w:hint="eastAsia"/>
+        </w:rPr>
+        <w:t>重写</w:t>
+      </w:r>
+      <w:r>
+        <w:rPr>
+          <w:rFonts w:ascii="Times New Roman" w:eastAsia="宋体" w:hAnsi="Times New Roman" w:cs="Times New Roman" w:hint="eastAsia"/>
+        </w:rPr>
+        <w:t>mix</w:t>
+      </w:r>
+      <w:r>
+        <w:rPr>
+          <w:rFonts w:ascii="Times New Roman" w:eastAsia="宋体" w:hAnsi="Times New Roman" w:cs="Times New Roman" w:hint="eastAsia"/>
+        </w:rPr>
+        <w:t>加载逻辑，修复加载中的内存泄漏</w:t>
+      </w:r>
+      <w:r>
+        <w:rPr>
+          <w:rFonts w:ascii="Times New Roman" w:eastAsia="宋体" w:hAnsi="Times New Roman" w:cs="Times New Roman" w:hint="eastAsia"/>
+        </w:rPr>
+        <w:t>，详见</w:t>
+      </w:r>
+      <w:r>
+        <w:rPr>
+          <w:rFonts w:ascii="Times New Roman" w:eastAsia="宋体" w:hAnsi="Times New Roman" w:cs="Times New Roman" w:hint="eastAsia"/>
+        </w:rPr>
+        <w:t>ExtMixLoader</w:t>
+      </w:r>
+    </w:p>
+    <w:p>
+      <w:pPr>
+        <w:pStyle w:val="a9"/>
+        <w:numPr>
+          <w:ilvl w:val="0"/>
+          <w:numId w:val="31"/>
+        </w:numPr>
+        <w:rPr>
+          <w:rFonts w:ascii="Times New Roman" w:eastAsia="宋体" w:hAnsi="Times New Roman" w:cs="Times New Roman"/>
+        </w:rPr>
+      </w:pPr>
+      <w:r>
+        <w:rPr>
+          <w:rFonts w:ascii="Times New Roman" w:eastAsia="宋体" w:hAnsi="Times New Roman" w:cs="Times New Roman" w:hint="eastAsia"/>
+        </w:rPr>
+        <w:t>新增</w:t>
+      </w:r>
+      <w:r>
+        <w:rPr>
+          <w:rFonts w:ascii="Times New Roman" w:eastAsia="宋体" w:hAnsi="Times New Roman" w:cs="Times New Roman" w:hint="eastAsia"/>
+        </w:rPr>
+        <w:t>DDrawScalingBilinear.OnlyShrink</w:t>
+      </w:r>
+      <w:r>
+        <w:rPr>
+          <w:rFonts w:ascii="Times New Roman" w:eastAsia="宋体" w:hAnsi="Times New Roman" w:cs="Times New Roman" w:hint="eastAsia"/>
+        </w:rPr>
+        <w:t>，支持仅在缩小时使用双线性插值，放大时硬边缘放大</w:t>
+      </w:r>
+    </w:p>
+    <w:p>
+      <w:pPr>
+        <w:pStyle w:val="a9"/>
+        <w:numPr>
+          <w:ilvl w:val="0"/>
+          <w:numId w:val="31"/>
+        </w:numPr>
+        <w:rPr>
+          <w:rFonts w:ascii="Times New Roman" w:eastAsia="宋体" w:hAnsi="Times New Roman" w:cs="Times New Roman"/>
+        </w:rPr>
+      </w:pPr>
+      <w:r>
+        <w:rPr>
+          <w:rFonts w:ascii="Times New Roman" w:eastAsia="宋体" w:hAnsi="Times New Roman" w:cs="Times New Roman" w:hint="eastAsia"/>
+        </w:rPr>
+        <w:t>优化绘图性能</w:t>
+      </w:r>
+    </w:p>
+    <w:p>
+      <w:pPr>
+        <w:pStyle w:val="a9"/>
+        <w:numPr>
+          <w:ilvl w:val="0"/>
+          <w:numId w:val="31"/>
+        </w:numPr>
+        <w:rPr>
+          <w:rFonts w:ascii="Times New Roman" w:eastAsia="宋体" w:hAnsi="Times New Roman" w:cs="Times New Roman"/>
+        </w:rPr>
+      </w:pPr>
+      <w:r>
+        <w:rPr>
+          <w:rFonts w:ascii="Times New Roman" w:eastAsia="宋体" w:hAnsi="Times New Roman" w:cs="Times New Roman" w:hint="eastAsia"/>
+        </w:rPr>
+        <w:t>重写</w:t>
+      </w:r>
+      <w:r>
+        <w:rPr>
+          <w:rFonts w:ascii="Times New Roman" w:eastAsia="宋体" w:hAnsi="Times New Roman" w:cs="Times New Roman" w:hint="eastAsia"/>
+        </w:rPr>
+        <w:t>ini</w:t>
+      </w:r>
+      <w:r>
+        <w:rPr>
+          <w:rFonts w:ascii="Times New Roman" w:eastAsia="宋体" w:hAnsi="Times New Roman" w:cs="Times New Roman" w:hint="eastAsia"/>
+        </w:rPr>
+        <w:t>加载逻辑，加载</w:t>
+      </w:r>
+      <w:r>
+        <w:rPr>
+          <w:rFonts w:ascii="Times New Roman" w:eastAsia="宋体" w:hAnsi="Times New Roman" w:cs="Times New Roman" w:hint="eastAsia"/>
+        </w:rPr>
+        <w:t>ini</w:t>
+      </w:r>
+      <w:r>
+        <w:rPr>
+          <w:rFonts w:ascii="Times New Roman" w:eastAsia="宋体" w:hAnsi="Times New Roman" w:cs="Times New Roman" w:hint="eastAsia"/>
+        </w:rPr>
+        <w:t>不会再释放至游戏目录，新建国家等操作可以即</w:t>
+      </w:r>
+      <w:r>
+        <w:rPr>
+          <w:rFonts w:ascii="Times New Roman" w:eastAsia="宋体" w:hAnsi="Times New Roman" w:cs="Times New Roman" w:hint="eastAsia"/>
+        </w:rPr>
         <w:lastRenderedPageBreak/>
-        <w:t>复制粘贴功能支持跨进程粘贴游戏对象</w:t>
+        <w:t>时生效</w:t>
       </w:r>
     </w:p>
     <w:p>
@@ -12722,979 +13755,6 @@
         <w:rPr>
           <w:rFonts w:ascii="Times New Roman" w:eastAsia="宋体" w:hAnsi="Times New Roman" w:cs="Times New Roman" w:hint="eastAsia"/>
         </w:rPr>
-        <w:t>复制粘贴功能支持</w:t>
-      </w:r>
-      <w:r>
-        <w:rPr>
-          <w:rFonts w:ascii="Times New Roman" w:eastAsia="宋体" w:hAnsi="Times New Roman" w:cs="Times New Roman" w:hint="eastAsia"/>
-        </w:rPr>
-        <w:t>跨</w:t>
-      </w:r>
-      <w:r>
-        <w:rPr>
-          <w:rFonts w:ascii="Times New Roman" w:eastAsia="宋体" w:hAnsi="Times New Roman" w:cs="Times New Roman" w:hint="eastAsia"/>
-        </w:rPr>
-        <w:t>地形转换，详见</w:t>
-      </w:r>
-      <w:r>
-        <w:rPr>
-          <w:rFonts w:ascii="Times New Roman" w:eastAsia="宋体" w:hAnsi="Times New Roman" w:cs="Times New Roman" w:hint="eastAsia"/>
-        </w:rPr>
-        <w:t>TileConvertRules.ini</w:t>
-      </w:r>
-    </w:p>
-    <w:p>
-      <w:pPr>
-        <w:pStyle w:val="a9"/>
-        <w:numPr>
-          <w:ilvl w:val="0"/>
-          <w:numId w:val="31"/>
-        </w:numPr>
-        <w:rPr>
-          <w:rFonts w:ascii="Times New Roman" w:eastAsia="宋体" w:hAnsi="Times New Roman" w:cs="Times New Roman"/>
-        </w:rPr>
-      </w:pPr>
-      <w:r>
-        <w:rPr>
-          <w:rFonts w:ascii="Times New Roman" w:eastAsia="宋体" w:hAnsi="Times New Roman" w:cs="Times New Roman" w:hint="eastAsia"/>
-        </w:rPr>
-        <w:t>优化建筑动画读取逻辑，尊重动画的</w:t>
-      </w:r>
-      <w:r>
-        <w:rPr>
-          <w:rFonts w:ascii="Times New Roman" w:eastAsia="宋体" w:hAnsi="Times New Roman" w:cs="Times New Roman" w:hint="eastAsia"/>
-        </w:rPr>
-        <w:t>NewTheater</w:t>
-      </w:r>
-      <w:r>
-        <w:rPr>
-          <w:rFonts w:ascii="Times New Roman" w:eastAsia="宋体" w:hAnsi="Times New Roman" w:cs="Times New Roman" w:hint="eastAsia"/>
-        </w:rPr>
-        <w:t>设置</w:t>
-      </w:r>
-    </w:p>
-    <w:p>
-      <w:pPr>
-        <w:pStyle w:val="a9"/>
-        <w:numPr>
-          <w:ilvl w:val="0"/>
-          <w:numId w:val="31"/>
-        </w:numPr>
-        <w:rPr>
-          <w:rFonts w:ascii="Times New Roman" w:eastAsia="宋体" w:hAnsi="Times New Roman" w:cs="Times New Roman"/>
-        </w:rPr>
-      </w:pPr>
-      <w:r>
-        <w:rPr>
-          <w:rFonts w:ascii="Times New Roman" w:eastAsia="宋体" w:hAnsi="Times New Roman" w:cs="Times New Roman" w:hint="eastAsia"/>
-        </w:rPr>
-        <w:t>Lua</w:t>
-      </w:r>
-      <w:r>
-        <w:rPr>
-          <w:rFonts w:ascii="Times New Roman" w:eastAsia="宋体" w:hAnsi="Times New Roman" w:cs="Times New Roman" w:hint="eastAsia"/>
-        </w:rPr>
-        <w:t>脚本终端支持搜索脚本文件</w:t>
-      </w:r>
-    </w:p>
-    <w:p>
-      <w:pPr>
-        <w:pStyle w:val="a9"/>
-        <w:numPr>
-          <w:ilvl w:val="0"/>
-          <w:numId w:val="31"/>
-        </w:numPr>
-        <w:rPr>
-          <w:rFonts w:ascii="Times New Roman" w:eastAsia="宋体" w:hAnsi="Times New Roman" w:cs="Times New Roman"/>
-        </w:rPr>
-      </w:pPr>
-      <w:r>
-        <w:rPr>
-          <w:rFonts w:ascii="Times New Roman" w:eastAsia="宋体" w:hAnsi="Times New Roman" w:cs="Times New Roman" w:hint="eastAsia"/>
-        </w:rPr>
-        <w:t>微调地图边界细蓝线的位置</w:t>
-      </w:r>
-    </w:p>
-    <w:p>
-      <w:pPr>
-        <w:pStyle w:val="a9"/>
-        <w:numPr>
-          <w:ilvl w:val="0"/>
-          <w:numId w:val="31"/>
-        </w:numPr>
-        <w:rPr>
-          <w:rFonts w:ascii="Times New Roman" w:eastAsia="宋体" w:hAnsi="Times New Roman" w:cs="Times New Roman"/>
-        </w:rPr>
-      </w:pPr>
-      <w:r>
-        <w:rPr>
-          <w:rFonts w:ascii="Times New Roman" w:eastAsia="宋体" w:hAnsi="Times New Roman" w:cs="Times New Roman" w:hint="eastAsia"/>
-        </w:rPr>
-        <w:t>修复了</w:t>
-      </w:r>
-      <w:r>
-        <w:rPr>
-          <w:rFonts w:ascii="Times New Roman" w:eastAsia="宋体" w:hAnsi="Times New Roman" w:cs="Times New Roman" w:hint="eastAsia"/>
-        </w:rPr>
-        <w:t>Vxl</w:t>
-      </w:r>
-      <w:r>
-        <w:rPr>
-          <w:rFonts w:ascii="Times New Roman" w:eastAsia="宋体" w:hAnsi="Times New Roman" w:cs="Times New Roman" w:hint="eastAsia"/>
-        </w:rPr>
-        <w:t>车辆</w:t>
-      </w:r>
-      <w:r>
-        <w:rPr>
-          <w:rFonts w:ascii="Times New Roman" w:eastAsia="宋体" w:hAnsi="Times New Roman" w:cs="Times New Roman" w:hint="eastAsia"/>
-        </w:rPr>
-        <w:t>Noshadow=yes</w:t>
-      </w:r>
-      <w:r>
-        <w:rPr>
-          <w:rFonts w:ascii="Times New Roman" w:eastAsia="宋体" w:hAnsi="Times New Roman" w:cs="Times New Roman" w:hint="eastAsia"/>
-        </w:rPr>
-        <w:t>时仍会显示阴影的</w:t>
-      </w:r>
-      <w:r>
-        <w:rPr>
-          <w:rFonts w:ascii="Times New Roman" w:eastAsia="宋体" w:hAnsi="Times New Roman" w:cs="Times New Roman" w:hint="eastAsia"/>
-        </w:rPr>
-        <w:t>bug</w:t>
-      </w:r>
-    </w:p>
-    <w:p>
-      <w:pPr>
-        <w:pStyle w:val="a9"/>
-        <w:numPr>
-          <w:ilvl w:val="0"/>
-          <w:numId w:val="31"/>
-        </w:numPr>
-        <w:rPr>
-          <w:rFonts w:ascii="Times New Roman" w:eastAsia="宋体" w:hAnsi="Times New Roman" w:cs="Times New Roman"/>
-        </w:rPr>
-      </w:pPr>
-      <w:r>
-        <w:rPr>
-          <w:rFonts w:ascii="Times New Roman" w:eastAsia="宋体" w:hAnsi="Times New Roman" w:cs="Times New Roman" w:hint="eastAsia"/>
-        </w:rPr>
-        <w:t>修复部分情况下绘制连接地形上升、下降段高度错误的</w:t>
-      </w:r>
-      <w:r>
-        <w:rPr>
-          <w:rFonts w:ascii="Times New Roman" w:eastAsia="宋体" w:hAnsi="Times New Roman" w:cs="Times New Roman" w:hint="eastAsia"/>
-        </w:rPr>
-        <w:t>bug</w:t>
-      </w:r>
-    </w:p>
-    <w:p>
-      <w:pPr>
-        <w:pStyle w:val="a9"/>
-        <w:numPr>
-          <w:ilvl w:val="0"/>
-          <w:numId w:val="31"/>
-        </w:numPr>
-        <w:rPr>
-          <w:rFonts w:ascii="Times New Roman" w:eastAsia="宋体" w:hAnsi="Times New Roman" w:cs="Times New Roman"/>
-        </w:rPr>
-      </w:pPr>
-      <w:r>
-        <w:rPr>
-          <w:rFonts w:ascii="Times New Roman" w:eastAsia="宋体" w:hAnsi="Times New Roman" w:cs="Times New Roman" w:hint="eastAsia"/>
-        </w:rPr>
-        <w:t>优化光照沙盒切换时的性能</w:t>
-      </w:r>
-    </w:p>
-    <w:p>
-      <w:pPr>
-        <w:pStyle w:val="a9"/>
-        <w:numPr>
-          <w:ilvl w:val="0"/>
-          <w:numId w:val="31"/>
-        </w:numPr>
-        <w:rPr>
-          <w:rFonts w:ascii="Times New Roman" w:eastAsia="宋体" w:hAnsi="Times New Roman" w:cs="Times New Roman"/>
-        </w:rPr>
-      </w:pPr>
-      <w:r>
-        <w:rPr>
-          <w:rFonts w:ascii="Times New Roman" w:eastAsia="宋体" w:hAnsi="Times New Roman" w:cs="Times New Roman" w:hint="eastAsia"/>
-        </w:rPr>
-        <w:t>新增</w:t>
-      </w:r>
-      <w:r>
-        <w:rPr>
-          <w:rFonts w:ascii="Times New Roman" w:eastAsia="宋体" w:hAnsi="Times New Roman" w:cs="Times New Roman" w:hint="eastAsia"/>
-        </w:rPr>
-        <w:t>LightingPreview</w:t>
-      </w:r>
-      <w:r>
-        <w:rPr>
-          <w:rFonts w:ascii="Times New Roman" w:eastAsia="宋体" w:hAnsi="Times New Roman" w:cs="Times New Roman" w:hint="eastAsia"/>
-        </w:rPr>
-        <w:t>.</w:t>
-      </w:r>
-      <w:r>
-        <w:rPr>
-          <w:rFonts w:ascii="Times New Roman" w:eastAsia="宋体" w:hAnsi="Times New Roman" w:cs="Times New Roman" w:hint="eastAsia"/>
-        </w:rPr>
-        <w:t>Tint</w:t>
-      </w:r>
-      <w:r>
-        <w:rPr>
-          <w:rFonts w:ascii="Times New Roman" w:eastAsia="宋体" w:hAnsi="Times New Roman" w:cs="Times New Roman" w:hint="eastAsia"/>
-        </w:rPr>
-        <w:t>TileSetBrowserView</w:t>
-      </w:r>
-      <w:r>
-        <w:rPr>
-          <w:rFonts w:ascii="Times New Roman" w:eastAsia="宋体" w:hAnsi="Times New Roman" w:cs="Times New Roman" w:hint="eastAsia"/>
-        </w:rPr>
-        <w:t>，控制是否按光照沙盒渲染地形浏览器图像</w:t>
-      </w:r>
-    </w:p>
-    <w:p>
-      <w:pPr>
-        <w:pStyle w:val="a9"/>
-        <w:numPr>
-          <w:ilvl w:val="0"/>
-          <w:numId w:val="31"/>
-        </w:numPr>
-        <w:rPr>
-          <w:rFonts w:ascii="Times New Roman" w:eastAsia="宋体" w:hAnsi="Times New Roman" w:cs="Times New Roman"/>
-        </w:rPr>
-      </w:pPr>
-      <w:r>
-        <w:rPr>
-          <w:rFonts w:ascii="Times New Roman" w:eastAsia="宋体" w:hAnsi="Times New Roman" w:cs="Times New Roman" w:hint="eastAsia"/>
-        </w:rPr>
-        <w:t>新增距离标尺，可以记录当前鼠标位置距离上次按下左键位置的距离，记录历史数量见</w:t>
-      </w:r>
-      <w:r>
-        <w:rPr>
-          <w:rFonts w:ascii="Times New Roman" w:eastAsia="宋体" w:hAnsi="Times New Roman" w:cs="Times New Roman" w:hint="eastAsia"/>
-        </w:rPr>
-        <w:t>DistanceRuler.Records</w:t>
-      </w:r>
-    </w:p>
-    <w:p>
-      <w:pPr>
-        <w:pStyle w:val="a9"/>
-        <w:numPr>
-          <w:ilvl w:val="0"/>
-          <w:numId w:val="31"/>
-        </w:numPr>
-        <w:rPr>
-          <w:rFonts w:ascii="Times New Roman" w:eastAsia="宋体" w:hAnsi="Times New Roman" w:cs="Times New Roman"/>
-        </w:rPr>
-      </w:pPr>
-      <w:r>
-        <w:rPr>
-          <w:rFonts w:ascii="Times New Roman" w:eastAsia="宋体" w:hAnsi="Times New Roman" w:cs="Times New Roman" w:hint="eastAsia"/>
-        </w:rPr>
-        <w:t>微调新建地图时可视边界数值</w:t>
-      </w:r>
-    </w:p>
-    <w:p>
-      <w:pPr>
-        <w:pStyle w:val="a9"/>
-        <w:numPr>
-          <w:ilvl w:val="0"/>
-          <w:numId w:val="31"/>
-        </w:numPr>
-        <w:rPr>
-          <w:rFonts w:ascii="Times New Roman" w:eastAsia="宋体" w:hAnsi="Times New Roman" w:cs="Times New Roman"/>
-        </w:rPr>
-      </w:pPr>
-      <w:r>
-        <w:rPr>
-          <w:rFonts w:ascii="Times New Roman" w:eastAsia="宋体" w:hAnsi="Times New Roman" w:cs="Times New Roman" w:hint="eastAsia"/>
-        </w:rPr>
-        <w:t>修复平坦地形工具无法平坦地图边缘斜坡的</w:t>
-      </w:r>
-      <w:r>
-        <w:rPr>
-          <w:rFonts w:ascii="Times New Roman" w:eastAsia="宋体" w:hAnsi="Times New Roman" w:cs="Times New Roman" w:hint="eastAsia"/>
-        </w:rPr>
-        <w:t>bug</w:t>
-      </w:r>
-    </w:p>
-    <w:p>
-      <w:pPr>
-        <w:pStyle w:val="a9"/>
-        <w:numPr>
-          <w:ilvl w:val="0"/>
-          <w:numId w:val="31"/>
-        </w:numPr>
-        <w:rPr>
-          <w:rFonts w:ascii="Times New Roman" w:eastAsia="宋体" w:hAnsi="Times New Roman" w:cs="Times New Roman"/>
-        </w:rPr>
-      </w:pPr>
-      <w:r>
-        <w:rPr>
-          <w:rFonts w:ascii="Times New Roman" w:eastAsia="宋体" w:hAnsi="Times New Roman" w:cs="Times New Roman" w:hint="eastAsia"/>
-        </w:rPr>
-        <w:t>绘制连接地形可以将鼠标移动到地图边界外，更方便靠近边界的绘制</w:t>
-      </w:r>
-    </w:p>
-    <w:p>
-      <w:pPr>
-        <w:pStyle w:val="a9"/>
-        <w:numPr>
-          <w:ilvl w:val="0"/>
-          <w:numId w:val="31"/>
-        </w:numPr>
-        <w:rPr>
-          <w:rFonts w:ascii="Times New Roman" w:eastAsia="宋体" w:hAnsi="Times New Roman" w:cs="Times New Roman"/>
-        </w:rPr>
-      </w:pPr>
-      <w:r>
-        <w:rPr>
-          <w:rFonts w:ascii="Times New Roman" w:eastAsia="宋体" w:hAnsi="Times New Roman" w:cs="Times New Roman" w:hint="eastAsia"/>
-        </w:rPr>
-        <w:t>优化</w:t>
-      </w:r>
-      <w:r>
-        <w:rPr>
-          <w:rFonts w:ascii="Times New Roman" w:eastAsia="宋体" w:hAnsi="Times New Roman" w:cs="Times New Roman" w:hint="eastAsia"/>
-        </w:rPr>
-        <w:t>IsoMapPack5</w:t>
-      </w:r>
-      <w:r>
-        <w:rPr>
-          <w:rFonts w:ascii="Times New Roman" w:eastAsia="宋体" w:hAnsi="Times New Roman" w:cs="Times New Roman" w:hint="eastAsia"/>
-        </w:rPr>
-        <w:t>压缩，减少地图体积，减少游戏内大地图地形异常的可能</w:t>
-      </w:r>
-    </w:p>
-    <w:p>
-      <w:pPr>
-        <w:pStyle w:val="a9"/>
-        <w:numPr>
-          <w:ilvl w:val="0"/>
-          <w:numId w:val="31"/>
-        </w:numPr>
-        <w:rPr>
-          <w:rFonts w:ascii="Times New Roman" w:eastAsia="宋体" w:hAnsi="Times New Roman" w:cs="Times New Roman"/>
-        </w:rPr>
-      </w:pPr>
-      <w:r>
-        <w:rPr>
-          <w:rFonts w:ascii="Times New Roman" w:eastAsia="宋体" w:hAnsi="Times New Roman" w:cs="Times New Roman" w:hint="eastAsia"/>
-        </w:rPr>
-        <w:t>修复调整地图大小后隧道位置错误的</w:t>
-      </w:r>
-      <w:r>
-        <w:rPr>
-          <w:rFonts w:ascii="Times New Roman" w:eastAsia="宋体" w:hAnsi="Times New Roman" w:cs="Times New Roman" w:hint="eastAsia"/>
-        </w:rPr>
-        <w:t>bug</w:t>
-      </w:r>
-    </w:p>
-    <w:p>
-      <w:pPr>
-        <w:pStyle w:val="a9"/>
-        <w:numPr>
-          <w:ilvl w:val="0"/>
-          <w:numId w:val="31"/>
-        </w:numPr>
-        <w:rPr>
-          <w:rFonts w:ascii="Times New Roman" w:eastAsia="宋体" w:hAnsi="Times New Roman" w:cs="Times New Roman"/>
-        </w:rPr>
-      </w:pPr>
-      <w:r>
-        <w:rPr>
-          <w:rFonts w:ascii="Times New Roman" w:eastAsia="宋体" w:hAnsi="Times New Roman" w:cs="Times New Roman" w:hint="eastAsia"/>
-        </w:rPr>
-        <w:t>修复了在开启输入法和部分情况下在地图界面按</w:t>
-      </w:r>
-      <w:r>
-        <w:rPr>
-          <w:rFonts w:ascii="Times New Roman" w:eastAsia="宋体" w:hAnsi="Times New Roman" w:cs="Times New Roman" w:hint="eastAsia"/>
-        </w:rPr>
-        <w:t>D</w:t>
-      </w:r>
-      <w:r>
-        <w:rPr>
-          <w:rFonts w:ascii="Times New Roman" w:eastAsia="宋体" w:hAnsi="Times New Roman" w:cs="Times New Roman" w:hint="eastAsia"/>
-        </w:rPr>
-        <w:t>、</w:t>
-      </w:r>
-      <w:r>
-        <w:rPr>
-          <w:rFonts w:ascii="Times New Roman" w:eastAsia="宋体" w:hAnsi="Times New Roman" w:cs="Times New Roman" w:hint="eastAsia"/>
-        </w:rPr>
-        <w:t>[</w:t>
-      </w:r>
-      <w:r>
-        <w:rPr>
-          <w:rFonts w:ascii="Times New Roman" w:eastAsia="宋体" w:hAnsi="Times New Roman" w:cs="Times New Roman" w:hint="eastAsia"/>
-        </w:rPr>
-        <w:t>、</w:t>
-      </w:r>
-      <w:r>
-        <w:rPr>
-          <w:rFonts w:ascii="Times New Roman" w:eastAsia="宋体" w:hAnsi="Times New Roman" w:cs="Times New Roman" w:hint="eastAsia"/>
-        </w:rPr>
-        <w:t>]</w:t>
-      </w:r>
-      <w:r>
-        <w:rPr>
-          <w:rFonts w:ascii="Times New Roman" w:eastAsia="宋体" w:hAnsi="Times New Roman" w:cs="Times New Roman" w:hint="eastAsia"/>
-        </w:rPr>
-        <w:t>键无效的</w:t>
-      </w:r>
-      <w:r>
-        <w:rPr>
-          <w:rFonts w:ascii="Times New Roman" w:eastAsia="宋体" w:hAnsi="Times New Roman" w:cs="Times New Roman" w:hint="eastAsia"/>
-        </w:rPr>
-        <w:t>bug</w:t>
-      </w:r>
-    </w:p>
-    <w:p>
-      <w:pPr>
-        <w:pStyle w:val="a9"/>
-        <w:numPr>
-          <w:ilvl w:val="0"/>
-          <w:numId w:val="31"/>
-        </w:numPr>
-        <w:rPr>
-          <w:rFonts w:ascii="Times New Roman" w:eastAsia="宋体" w:hAnsi="Times New Roman" w:cs="Times New Roman"/>
-        </w:rPr>
-      </w:pPr>
-      <w:r>
-        <w:rPr>
-          <w:rFonts w:ascii="Times New Roman" w:eastAsia="宋体" w:hAnsi="Times New Roman" w:cs="Times New Roman" w:hint="eastAsia"/>
-        </w:rPr>
-        <w:t>修复了新城市下使用绘制悬崖后部工具时，按</w:t>
-      </w:r>
-      <w:r>
-        <w:rPr>
-          <w:rFonts w:ascii="Times New Roman" w:eastAsia="宋体" w:hAnsi="Times New Roman" w:cs="Times New Roman" w:hint="eastAsia"/>
-        </w:rPr>
-        <w:t>A</w:t>
-      </w:r>
-      <w:r>
-        <w:rPr>
-          <w:rFonts w:ascii="Times New Roman" w:eastAsia="宋体" w:hAnsi="Times New Roman" w:cs="Times New Roman" w:hint="eastAsia"/>
-        </w:rPr>
-        <w:t>键无法切换悬崖类型的</w:t>
-      </w:r>
-      <w:r>
-        <w:rPr>
-          <w:rFonts w:ascii="Times New Roman" w:eastAsia="宋体" w:hAnsi="Times New Roman" w:cs="Times New Roman" w:hint="eastAsia"/>
-        </w:rPr>
-        <w:t>bug</w:t>
-      </w:r>
-    </w:p>
-    <w:p>
-      <w:pPr>
-        <w:pStyle w:val="a9"/>
-        <w:numPr>
-          <w:ilvl w:val="0"/>
-          <w:numId w:val="31"/>
-        </w:numPr>
-        <w:rPr>
-          <w:rFonts w:ascii="Times New Roman" w:eastAsia="宋体" w:hAnsi="Times New Roman" w:cs="Times New Roman"/>
-        </w:rPr>
-      </w:pPr>
-      <w:r>
-        <w:rPr>
-          <w:rFonts w:ascii="Times New Roman" w:eastAsia="宋体" w:hAnsi="Times New Roman" w:cs="Times New Roman" w:hint="eastAsia"/>
-        </w:rPr>
-        <w:t>增强绘制悬崖工具，可以在不同地图类型的</w:t>
-      </w:r>
-      <w:r>
-        <w:rPr>
-          <w:rFonts w:ascii="Times New Roman" w:eastAsia="宋体" w:hAnsi="Times New Roman" w:cs="Times New Roman" w:hint="eastAsia"/>
-        </w:rPr>
-        <w:t>[TheaterInfo]</w:t>
-      </w:r>
-      <w:r>
-        <w:rPr>
-          <w:rFonts w:ascii="Times New Roman" w:eastAsia="宋体" w:hAnsi="Times New Roman" w:cs="Times New Roman" w:hint="eastAsia"/>
-        </w:rPr>
-        <w:t>（如</w:t>
-      </w:r>
-      <w:r>
-        <w:rPr>
-          <w:rFonts w:ascii="Times New Roman" w:eastAsia="宋体" w:hAnsi="Times New Roman" w:cs="Times New Roman" w:hint="eastAsia"/>
-        </w:rPr>
-        <w:t>[SnowInfo]</w:t>
-      </w:r>
-      <w:r>
-        <w:rPr>
-          <w:rFonts w:ascii="Times New Roman" w:eastAsia="宋体" w:hAnsi="Times New Roman" w:cs="Times New Roman" w:hint="eastAsia"/>
-        </w:rPr>
-        <w:t>）中填写</w:t>
-      </w:r>
-      <w:r>
-        <w:rPr>
-          <w:rFonts w:ascii="Times New Roman" w:eastAsia="宋体" w:hAnsi="Times New Roman" w:cs="Times New Roman" w:hint="eastAsia"/>
-        </w:rPr>
-        <w:t>Cliffs2</w:t>
-      </w:r>
-      <w:r>
-        <w:rPr>
-          <w:rFonts w:ascii="Times New Roman" w:eastAsia="宋体" w:hAnsi="Times New Roman" w:cs="Times New Roman" w:hint="eastAsia"/>
-        </w:rPr>
-        <w:t>、</w:t>
-      </w:r>
-      <w:r>
-        <w:rPr>
-          <w:rFonts w:ascii="Times New Roman" w:eastAsia="宋体" w:hAnsi="Times New Roman" w:cs="Times New Roman" w:hint="eastAsia"/>
-        </w:rPr>
-        <w:t>CliffsWater2</w:t>
-      </w:r>
-      <w:r>
-        <w:rPr>
-          <w:rFonts w:ascii="Times New Roman" w:eastAsia="宋体" w:hAnsi="Times New Roman" w:cs="Times New Roman" w:hint="eastAsia"/>
-        </w:rPr>
-        <w:t>以支持悬崖类型切换；在存在月球悬崖时，支持绘制月球悬崖</w:t>
-      </w:r>
-    </w:p>
-    <w:p>
-      <w:pPr>
-        <w:pStyle w:val="a9"/>
-        <w:numPr>
-          <w:ilvl w:val="0"/>
-          <w:numId w:val="31"/>
-        </w:numPr>
-        <w:rPr>
-          <w:rFonts w:ascii="Times New Roman" w:eastAsia="宋体" w:hAnsi="Times New Roman" w:cs="Times New Roman"/>
-        </w:rPr>
-      </w:pPr>
-      <w:r>
-        <w:rPr>
-          <w:rFonts w:ascii="Times New Roman" w:eastAsia="宋体" w:hAnsi="Times New Roman" w:cs="Times New Roman" w:hint="eastAsia"/>
-        </w:rPr>
-        <w:t>支持</w:t>
-      </w:r>
-      <w:r>
-        <w:rPr>
-          <w:rFonts w:ascii="Times New Roman" w:eastAsia="宋体" w:hAnsi="Times New Roman" w:cs="Times New Roman" w:hint="eastAsia"/>
-        </w:rPr>
-        <w:t>32</w:t>
-      </w:r>
-      <w:r>
-        <w:rPr>
-          <w:rFonts w:ascii="Times New Roman" w:eastAsia="宋体" w:hAnsi="Times New Roman" w:cs="Times New Roman" w:hint="eastAsia"/>
-        </w:rPr>
-        <w:t>向面向</w:t>
-      </w:r>
-      <w:r>
-        <w:rPr>
-          <w:rFonts w:ascii="Times New Roman" w:eastAsia="宋体" w:hAnsi="Times New Roman" w:cs="Times New Roman" w:hint="eastAsia"/>
-        </w:rPr>
-        <w:t>与拖拽</w:t>
-      </w:r>
-      <w:r>
-        <w:rPr>
-          <w:rFonts w:ascii="Times New Roman" w:eastAsia="宋体" w:hAnsi="Times New Roman" w:cs="Times New Roman" w:hint="eastAsia"/>
-        </w:rPr>
-        <w:t>，详见</w:t>
-      </w:r>
-      <w:r>
-        <w:rPr>
-          <w:rFonts w:ascii="Times New Roman" w:eastAsia="宋体" w:hAnsi="Times New Roman" w:cs="Times New Roman" w:hint="eastAsia"/>
-        </w:rPr>
-        <w:t>ExtFacings</w:t>
-      </w:r>
-      <w:r>
-        <w:rPr>
-          <w:rFonts w:ascii="Times New Roman" w:eastAsia="宋体" w:hAnsi="Times New Roman" w:cs="Times New Roman" w:hint="eastAsia"/>
-        </w:rPr>
-        <w:t>与</w:t>
-      </w:r>
-      <w:r>
-        <w:rPr>
-          <w:rFonts w:ascii="Times New Roman" w:eastAsia="宋体" w:hAnsi="Times New Roman" w:cs="Times New Roman" w:hint="eastAsia"/>
-        </w:rPr>
-        <w:t>ExtFacings.Drag</w:t>
-      </w:r>
-    </w:p>
-    <w:p>
-      <w:pPr>
-        <w:pStyle w:val="a9"/>
-        <w:numPr>
-          <w:ilvl w:val="0"/>
-          <w:numId w:val="31"/>
-        </w:numPr>
-        <w:rPr>
-          <w:rFonts w:ascii="Times New Roman" w:eastAsia="宋体" w:hAnsi="Times New Roman" w:cs="Times New Roman"/>
-        </w:rPr>
-      </w:pPr>
-      <w:r>
-        <w:rPr>
-          <w:rFonts w:ascii="Times New Roman" w:eastAsia="宋体" w:hAnsi="Times New Roman" w:cs="Times New Roman" w:hint="eastAsia"/>
-        </w:rPr>
-        <w:t>重写部分字符串类型，优化字符串加载稳定性</w:t>
-      </w:r>
-    </w:p>
-    <w:p>
-      <w:pPr>
-        <w:pStyle w:val="a9"/>
-        <w:numPr>
-          <w:ilvl w:val="0"/>
-          <w:numId w:val="31"/>
-        </w:numPr>
-        <w:rPr>
-          <w:rFonts w:ascii="Times New Roman" w:eastAsia="宋体" w:hAnsi="Times New Roman" w:cs="Times New Roman"/>
-        </w:rPr>
-      </w:pPr>
-      <w:r>
-        <w:rPr>
-          <w:rFonts w:ascii="Times New Roman" w:eastAsia="宋体" w:hAnsi="Times New Roman" w:cs="Times New Roman" w:hint="eastAsia"/>
-        </w:rPr>
-        <w:t>优化抬升</w:t>
-      </w:r>
-      <w:r>
-        <w:rPr>
-          <w:rFonts w:ascii="Times New Roman" w:eastAsia="宋体" w:hAnsi="Times New Roman" w:cs="Times New Roman" w:hint="eastAsia"/>
-        </w:rPr>
-        <w:t>/</w:t>
-      </w:r>
-      <w:r>
-        <w:rPr>
-          <w:rFonts w:ascii="Times New Roman" w:eastAsia="宋体" w:hAnsi="Times New Roman" w:cs="Times New Roman" w:hint="eastAsia"/>
-        </w:rPr>
-        <w:t>降低地表算法，不会出现异常的大范围变动</w:t>
-      </w:r>
-    </w:p>
-    <w:p>
-      <w:pPr>
-        <w:pStyle w:val="a9"/>
-        <w:numPr>
-          <w:ilvl w:val="0"/>
-          <w:numId w:val="31"/>
-        </w:numPr>
-        <w:rPr>
-          <w:rFonts w:ascii="Times New Roman" w:eastAsia="宋体" w:hAnsi="Times New Roman" w:cs="Times New Roman"/>
-        </w:rPr>
-      </w:pPr>
-      <w:r>
-        <w:rPr>
-          <w:rFonts w:ascii="Times New Roman" w:eastAsia="宋体" w:hAnsi="Times New Roman" w:cs="Times New Roman" w:hint="eastAsia"/>
-        </w:rPr>
-        <w:t>FA2sp.log</w:t>
-      </w:r>
-      <w:r>
-        <w:rPr>
-          <w:rFonts w:ascii="Times New Roman" w:eastAsia="宋体" w:hAnsi="Times New Roman" w:cs="Times New Roman" w:hint="eastAsia"/>
-        </w:rPr>
-        <w:t>使用</w:t>
-      </w:r>
-      <w:r>
-        <w:rPr>
-          <w:rFonts w:ascii="Times New Roman" w:eastAsia="宋体" w:hAnsi="Times New Roman" w:cs="Times New Roman" w:hint="eastAsia"/>
-        </w:rPr>
-        <w:t>UTF8</w:t>
-      </w:r>
-      <w:r>
-        <w:rPr>
-          <w:rFonts w:ascii="Times New Roman" w:eastAsia="宋体" w:hAnsi="Times New Roman" w:cs="Times New Roman" w:hint="eastAsia"/>
-        </w:rPr>
-        <w:t>编码</w:t>
-      </w:r>
-    </w:p>
-    <w:p>
-      <w:pPr>
-        <w:pStyle w:val="a9"/>
-        <w:numPr>
-          <w:ilvl w:val="0"/>
-          <w:numId w:val="31"/>
-        </w:numPr>
-        <w:rPr>
-          <w:rFonts w:ascii="Times New Roman" w:eastAsia="宋体" w:hAnsi="Times New Roman" w:cs="Times New Roman"/>
-        </w:rPr>
-      </w:pPr>
-      <w:r>
-        <w:rPr>
-          <w:rFonts w:ascii="Times New Roman" w:eastAsia="宋体" w:hAnsi="Times New Roman" w:cs="Times New Roman" w:hint="eastAsia"/>
-        </w:rPr>
-        <w:t>保存地图时可以维持已有的</w:t>
-      </w:r>
-      <w:r>
-        <w:rPr>
-          <w:rFonts w:ascii="Times New Roman" w:eastAsia="宋体" w:hAnsi="Times New Roman" w:cs="Times New Roman" w:hint="eastAsia"/>
-        </w:rPr>
-        <w:t>ini</w:t>
-      </w:r>
-      <w:r>
-        <w:rPr>
-          <w:rFonts w:ascii="Times New Roman" w:eastAsia="宋体" w:hAnsi="Times New Roman" w:cs="Times New Roman" w:hint="eastAsia"/>
-        </w:rPr>
-        <w:t>小节顺序，详见</w:t>
-      </w:r>
-      <w:r>
-        <w:rPr>
-          <w:rFonts w:ascii="Times New Roman" w:eastAsia="宋体" w:hAnsi="Times New Roman" w:cs="Times New Roman" w:hint="eastAsia"/>
-        </w:rPr>
-        <w:t>SaveMap.PreserveINISorting</w:t>
-      </w:r>
-    </w:p>
-    <w:p>
-      <w:pPr>
-        <w:pStyle w:val="a9"/>
-        <w:numPr>
-          <w:ilvl w:val="0"/>
-          <w:numId w:val="31"/>
-        </w:numPr>
-        <w:rPr>
-          <w:rFonts w:ascii="Times New Roman" w:eastAsia="宋体" w:hAnsi="Times New Roman" w:cs="Times New Roman"/>
-        </w:rPr>
-      </w:pPr>
-      <w:r>
-        <w:rPr>
-          <w:rFonts w:ascii="Times New Roman" w:eastAsia="宋体" w:hAnsi="Times New Roman" w:cs="Times New Roman" w:hint="eastAsia"/>
-        </w:rPr>
-        <w:t>重写撤销重做系统，所有撤销动作均支持完整重做</w:t>
-      </w:r>
-    </w:p>
-    <w:p>
-      <w:pPr>
-        <w:pStyle w:val="a9"/>
-        <w:numPr>
-          <w:ilvl w:val="0"/>
-          <w:numId w:val="31"/>
-        </w:numPr>
-        <w:rPr>
-          <w:rFonts w:ascii="Times New Roman" w:eastAsia="宋体" w:hAnsi="Times New Roman" w:cs="Times New Roman"/>
-        </w:rPr>
-      </w:pPr>
-      <w:r>
-        <w:rPr>
-          <w:rFonts w:ascii="Times New Roman" w:eastAsia="宋体" w:hAnsi="Times New Roman" w:cs="Times New Roman" w:hint="eastAsia"/>
-        </w:rPr>
-        <w:t>撤销重做系统能够记录游戏对象的修改历史，详见</w:t>
-      </w:r>
-      <w:r>
-        <w:rPr>
-          <w:rFonts w:ascii="Times New Roman" w:eastAsia="宋体" w:hAnsi="Times New Roman" w:cs="Times New Roman" w:hint="eastAsia"/>
-        </w:rPr>
-        <w:t>UndoRedo.RecordObjects</w:t>
-      </w:r>
-    </w:p>
-    <w:p>
-      <w:pPr>
-        <w:pStyle w:val="a9"/>
-        <w:numPr>
-          <w:ilvl w:val="0"/>
-          <w:numId w:val="31"/>
-        </w:numPr>
-        <w:rPr>
-          <w:rFonts w:ascii="Times New Roman" w:eastAsia="宋体" w:hAnsi="Times New Roman" w:cs="Times New Roman"/>
-        </w:rPr>
-      </w:pPr>
-      <w:r>
-        <w:rPr>
-          <w:rFonts w:ascii="Times New Roman" w:eastAsia="宋体" w:hAnsi="Times New Roman" w:cs="Times New Roman" w:hint="eastAsia"/>
-        </w:rPr>
-        <w:t>支持设置</w:t>
-      </w:r>
-      <w:r>
-        <w:rPr>
-          <w:rFonts w:ascii="Times New Roman" w:eastAsia="宋体" w:hAnsi="Times New Roman" w:cs="Times New Roman" w:hint="eastAsia"/>
-        </w:rPr>
-        <w:t>RubblePalette</w:t>
-      </w:r>
-      <w:r>
-        <w:rPr>
-          <w:rFonts w:ascii="Times New Roman" w:eastAsia="宋体" w:hAnsi="Times New Roman" w:cs="Times New Roman" w:hint="eastAsia"/>
-        </w:rPr>
-        <w:t>=</w:t>
-      </w:r>
-      <w:r>
-        <w:rPr>
-          <w:rFonts w:ascii="Times New Roman" w:eastAsia="宋体" w:hAnsi="Times New Roman" w:cs="Times New Roman" w:hint="eastAsia"/>
-        </w:rPr>
-        <w:t>指定建筑废墟色盘</w:t>
-      </w:r>
-    </w:p>
-    <w:p>
-      <w:pPr>
-        <w:pStyle w:val="a9"/>
-        <w:numPr>
-          <w:ilvl w:val="0"/>
-          <w:numId w:val="31"/>
-        </w:numPr>
-        <w:rPr>
-          <w:rFonts w:ascii="Times New Roman" w:eastAsia="宋体" w:hAnsi="Times New Roman" w:cs="Times New Roman"/>
-        </w:rPr>
-      </w:pPr>
-      <w:r>
-        <w:rPr>
-          <w:rFonts w:ascii="Times New Roman" w:eastAsia="宋体" w:hAnsi="Times New Roman" w:cs="Times New Roman" w:hint="eastAsia"/>
-        </w:rPr>
-        <w:t>提升稳定性</w:t>
-      </w:r>
-    </w:p>
-    <w:p>
-      <w:pPr>
-        <w:pStyle w:val="a9"/>
-        <w:numPr>
-          <w:ilvl w:val="0"/>
-          <w:numId w:val="31"/>
-        </w:numPr>
-        <w:rPr>
-          <w:rFonts w:ascii="Times New Roman" w:eastAsia="宋体" w:hAnsi="Times New Roman" w:cs="Times New Roman"/>
-        </w:rPr>
-      </w:pPr>
-      <w:r>
-        <w:rPr>
-          <w:rFonts w:ascii="Times New Roman" w:eastAsia="宋体" w:hAnsi="Times New Roman" w:cs="Times New Roman" w:hint="eastAsia"/>
-        </w:rPr>
-        <w:t>优化素材图像内存占用</w:t>
-      </w:r>
-    </w:p>
-    <w:p>
-      <w:pPr>
-        <w:pStyle w:val="a9"/>
-        <w:numPr>
-          <w:ilvl w:val="0"/>
-          <w:numId w:val="31"/>
-        </w:numPr>
-        <w:rPr>
-          <w:rFonts w:ascii="Times New Roman" w:eastAsia="宋体" w:hAnsi="Times New Roman" w:cs="Times New Roman"/>
-        </w:rPr>
-      </w:pPr>
-      <w:r>
-        <w:rPr>
-          <w:rFonts w:ascii="Times New Roman" w:eastAsia="宋体" w:hAnsi="Times New Roman" w:cs="Times New Roman" w:hint="eastAsia"/>
-        </w:rPr>
-        <w:t>重写</w:t>
-      </w:r>
-      <w:r>
-        <w:rPr>
-          <w:rFonts w:ascii="Times New Roman" w:eastAsia="宋体" w:hAnsi="Times New Roman" w:cs="Times New Roman" w:hint="eastAsia"/>
-        </w:rPr>
-        <w:t>mix</w:t>
-      </w:r>
-      <w:r>
-        <w:rPr>
-          <w:rFonts w:ascii="Times New Roman" w:eastAsia="宋体" w:hAnsi="Times New Roman" w:cs="Times New Roman" w:hint="eastAsia"/>
-        </w:rPr>
-        <w:t>加载逻辑，修复加载中的内存泄漏</w:t>
-      </w:r>
-      <w:r>
-        <w:rPr>
-          <w:rFonts w:ascii="Times New Roman" w:eastAsia="宋体" w:hAnsi="Times New Roman" w:cs="Times New Roman" w:hint="eastAsia"/>
-        </w:rPr>
-        <w:t>，详见</w:t>
-      </w:r>
-      <w:r>
-        <w:rPr>
-          <w:rFonts w:ascii="Times New Roman" w:eastAsia="宋体" w:hAnsi="Times New Roman" w:cs="Times New Roman" w:hint="eastAsia"/>
-        </w:rPr>
-        <w:t>ExtMixLoader</w:t>
-      </w:r>
-    </w:p>
-    <w:p>
-      <w:pPr>
-        <w:pStyle w:val="a9"/>
-        <w:numPr>
-          <w:ilvl w:val="0"/>
-          <w:numId w:val="31"/>
-        </w:numPr>
-        <w:rPr>
-          <w:rFonts w:ascii="Times New Roman" w:eastAsia="宋体" w:hAnsi="Times New Roman" w:cs="Times New Roman"/>
-        </w:rPr>
-      </w:pPr>
-      <w:r>
-        <w:rPr>
-          <w:rFonts w:ascii="Times New Roman" w:eastAsia="宋体" w:hAnsi="Times New Roman" w:cs="Times New Roman" w:hint="eastAsia"/>
-        </w:rPr>
-        <w:t>新增</w:t>
-      </w:r>
-      <w:r>
-        <w:rPr>
-          <w:rFonts w:ascii="Times New Roman" w:eastAsia="宋体" w:hAnsi="Times New Roman" w:cs="Times New Roman" w:hint="eastAsia"/>
-        </w:rPr>
-        <w:t>DDrawScalingBilinear.OnlyShrink</w:t>
-      </w:r>
-      <w:r>
-        <w:rPr>
-          <w:rFonts w:ascii="Times New Roman" w:eastAsia="宋体" w:hAnsi="Times New Roman" w:cs="Times New Roman" w:hint="eastAsia"/>
-        </w:rPr>
-        <w:t>，支持仅在缩小时使用双线性插值，放大时硬边缘放大</w:t>
-      </w:r>
-    </w:p>
-    <w:p>
-      <w:pPr>
-        <w:pStyle w:val="a9"/>
-        <w:numPr>
-          <w:ilvl w:val="0"/>
-          <w:numId w:val="31"/>
-        </w:numPr>
-        <w:rPr>
-          <w:rFonts w:ascii="Times New Roman" w:eastAsia="宋体" w:hAnsi="Times New Roman" w:cs="Times New Roman"/>
-        </w:rPr>
-      </w:pPr>
-      <w:r>
-        <w:rPr>
-          <w:rFonts w:ascii="Times New Roman" w:eastAsia="宋体" w:hAnsi="Times New Roman" w:cs="Times New Roman" w:hint="eastAsia"/>
-        </w:rPr>
-        <w:t>优化绘图性能</w:t>
-      </w:r>
-    </w:p>
-    <w:p>
-      <w:pPr>
-        <w:pStyle w:val="a9"/>
-        <w:numPr>
-          <w:ilvl w:val="0"/>
-          <w:numId w:val="31"/>
-        </w:numPr>
-        <w:rPr>
-          <w:rFonts w:ascii="Times New Roman" w:eastAsia="宋体" w:hAnsi="Times New Roman" w:cs="Times New Roman"/>
-        </w:rPr>
-      </w:pPr>
-      <w:r>
-        <w:rPr>
-          <w:rFonts w:ascii="Times New Roman" w:eastAsia="宋体" w:hAnsi="Times New Roman" w:cs="Times New Roman" w:hint="eastAsia"/>
-        </w:rPr>
-        <w:t>重写</w:t>
-      </w:r>
-      <w:r>
-        <w:rPr>
-          <w:rFonts w:ascii="Times New Roman" w:eastAsia="宋体" w:hAnsi="Times New Roman" w:cs="Times New Roman" w:hint="eastAsia"/>
-        </w:rPr>
-        <w:t>ini</w:t>
-      </w:r>
-      <w:r>
-        <w:rPr>
-          <w:rFonts w:ascii="Times New Roman" w:eastAsia="宋体" w:hAnsi="Times New Roman" w:cs="Times New Roman" w:hint="eastAsia"/>
-        </w:rPr>
-        <w:t>加载逻辑，加载</w:t>
-      </w:r>
-      <w:r>
-        <w:rPr>
-          <w:rFonts w:ascii="Times New Roman" w:eastAsia="宋体" w:hAnsi="Times New Roman" w:cs="Times New Roman" w:hint="eastAsia"/>
-        </w:rPr>
-        <w:t>ini</w:t>
-      </w:r>
-      <w:r>
-        <w:rPr>
-          <w:rFonts w:ascii="Times New Roman" w:eastAsia="宋体" w:hAnsi="Times New Roman" w:cs="Times New Roman" w:hint="eastAsia"/>
-        </w:rPr>
-        <w:t>不会再释放至游戏目录，新建国家等操作可以即时生效</w:t>
-      </w:r>
-    </w:p>
-    <w:p>
-      <w:pPr>
-        <w:pStyle w:val="a9"/>
-        <w:numPr>
-          <w:ilvl w:val="0"/>
-          <w:numId w:val="31"/>
-        </w:numPr>
-        <w:rPr>
-          <w:rFonts w:ascii="Times New Roman" w:eastAsia="宋体" w:hAnsi="Times New Roman" w:cs="Times New Roman"/>
-        </w:rPr>
-      </w:pPr>
-      <w:r>
-        <w:rPr>
-          <w:rFonts w:ascii="Times New Roman" w:eastAsia="宋体" w:hAnsi="Times New Roman" w:cs="Times New Roman" w:hint="eastAsia"/>
-        </w:rPr>
-        <w:lastRenderedPageBreak/>
         <w:t>ini [#include]</w:t>
       </w:r>
       <w:r>
@@ -14757,6 +14817,7 @@
         <w:rPr>
           <w:rFonts w:ascii="Times New Roman" w:eastAsia="宋体" w:hAnsi="Times New Roman" w:cs="Times New Roman" w:hint="eastAsia"/>
         </w:rPr>
+        <w:lastRenderedPageBreak/>
         <w:t>摆放地形、</w:t>
       </w:r>
       <w:r>
@@ -14781,14 +14842,7 @@
         <w:rPr>
           <w:rFonts w:ascii="Times New Roman" w:eastAsia="宋体" w:hAnsi="Times New Roman" w:cs="Times New Roman" w:hint="eastAsia"/>
         </w:rPr>
-        <w:t>键可以开启直线模式，在两次鼠标</w:t>
-      </w:r>
-      <w:r>
-        <w:rPr>
-          <w:rFonts w:ascii="Times New Roman" w:eastAsia="宋体" w:hAnsi="Times New Roman" w:cs="Times New Roman" w:hint="eastAsia"/>
-        </w:rPr>
-        <w:lastRenderedPageBreak/>
-        <w:t>点击的线段上摆放</w:t>
+        <w:t>键可以开启直线模式，在两次鼠标点击的线段上摆放</w:t>
       </w:r>
     </w:p>
     <w:p>
@@ -15876,6 +15930,7 @@
         <w:rPr>
           <w:rFonts w:ascii="Times New Roman" w:eastAsia="宋体" w:hAnsi="Times New Roman" w:cs="Times New Roman" w:hint="eastAsia"/>
         </w:rPr>
+        <w:lastRenderedPageBreak/>
         <w:t>多选模式支持显示选择单元格数量统计</w:t>
       </w:r>
     </w:p>
@@ -15894,7 +15949,6 @@
         <w:rPr>
           <w:rFonts w:ascii="Times New Roman" w:eastAsia="宋体" w:hAnsi="Times New Roman" w:cs="Times New Roman" w:hint="eastAsia"/>
         </w:rPr>
-        <w:lastRenderedPageBreak/>
         <w:t>修复部分触发事件的描述</w:t>
       </w:r>
     </w:p>
@@ -16897,6 +16951,7 @@
         <w:rPr>
           <w:rFonts w:ascii="Times New Roman" w:eastAsia="宋体" w:hAnsi="Times New Roman" w:cs="Times New Roman" w:hint="eastAsia"/>
         </w:rPr>
+        <w:lastRenderedPageBreak/>
         <w:t>资源总量与属性查看允许自定义字体大小</w:t>
       </w:r>
     </w:p>
@@ -16915,7 +16970,6 @@
         <w:rPr>
           <w:rFonts w:ascii="Times New Roman" w:eastAsia="宋体" w:hAnsi="Times New Roman" w:cs="Times New Roman" w:hint="eastAsia"/>
         </w:rPr>
-        <w:lastRenderedPageBreak/>
         <w:t>粘贴区域描边使用与复制描边相同的颜色，即</w:t>
       </w:r>
       <w:r>
@@ -17928,6 +17982,7 @@
         <w:rPr>
           <w:rFonts w:ascii="Times New Roman" w:eastAsia="宋体" w:hAnsi="Times New Roman" w:cs="Times New Roman" w:hint="eastAsia"/>
         </w:rPr>
+        <w:lastRenderedPageBreak/>
         <w:t>拖动单位尊重图层状态</w:t>
       </w:r>
       <w:r>
@@ -17952,7 +18007,6 @@
         <w:rPr>
           <w:rFonts w:ascii="Times New Roman" w:eastAsia="宋体" w:hAnsi="Times New Roman" w:cs="Times New Roman" w:hint="eastAsia"/>
         </w:rPr>
-        <w:lastRenderedPageBreak/>
         <w:t>修复对象筛选留空时，不能显示所有对象的</w:t>
       </w:r>
       <w:r>
@@ -18914,6 +18968,7 @@
         <w:rPr>
           <w:rFonts w:ascii="Times New Roman" w:eastAsia="宋体" w:hAnsi="Times New Roman" w:cs="Times New Roman" w:hint="eastAsia"/>
         </w:rPr>
+        <w:lastRenderedPageBreak/>
         <w:t>修复隐藏建筑图层会同时隐藏建筑轮廓的</w:t>
       </w:r>
       <w:r>
@@ -18939,7 +18994,6 @@
         <w:rPr>
           <w:rFonts w:ascii="Times New Roman" w:eastAsia="宋体" w:hAnsi="Times New Roman" w:cs="Times New Roman" w:hint="eastAsia"/>
         </w:rPr>
-        <w:lastRenderedPageBreak/>
         <w:t>修复部分情况下建筑阴影位置偏移的</w:t>
       </w:r>
       <w:r>
@@ -19872,7 +19926,14 @@
         <w:rPr>
           <w:rFonts w:ascii="Times New Roman" w:eastAsia="宋体" w:hAnsi="Times New Roman" w:cs="Times New Roman" w:hint="eastAsia"/>
         </w:rPr>
-        <w:t>触发、脚本编辑器等窗口关闭后也会保存当前选中项索引，再次开启会保持原位置</w:t>
+        <w:t>触发、脚本编辑器等窗口关闭后也会保存当前选中项索引，再次开启会保持</w:t>
+      </w:r>
+      <w:r>
+        <w:rPr>
+          <w:rFonts w:ascii="Times New Roman" w:eastAsia="宋体" w:hAnsi="Times New Roman" w:cs="Times New Roman" w:hint="eastAsia"/>
+        </w:rPr>
+        <w:lastRenderedPageBreak/>
+        <w:t>原位置</w:t>
       </w:r>
     </w:p>
     <w:p>
@@ -19890,7 +19951,6 @@
         <w:rPr>
           <w:rFonts w:ascii="Times New Roman" w:eastAsia="宋体" w:hAnsi="Times New Roman" w:cs="Times New Roman" w:hint="eastAsia"/>
         </w:rPr>
-        <w:lastRenderedPageBreak/>
         <w:t>修复选择“删除对象”后右键取消，再次直接选择删除对象不生效的</w:t>
       </w:r>
       <w:r>
@@ -20847,6 +20907,7 @@
         <w:rPr>
           <w:rFonts w:ascii="Times New Roman" w:eastAsia="宋体" w:hAnsi="Times New Roman" w:cs="Times New Roman" w:hint="eastAsia"/>
         </w:rPr>
+        <w:lastRenderedPageBreak/>
         <w:t>修复属性查看中地形文件名不正确的</w:t>
       </w:r>
       <w:r>
@@ -20871,7 +20932,6 @@
         <w:rPr>
           <w:rFonts w:ascii="Times New Roman" w:eastAsia="宋体" w:hAnsi="Times New Roman" w:cs="Times New Roman" w:hint="eastAsia"/>
         </w:rPr>
-        <w:lastRenderedPageBreak/>
         <w:t>支持</w:t>
       </w:r>
       <w:r>
@@ -21976,6 +22036,7 @@
         <w:rPr>
           <w:rFonts w:ascii="Times New Roman" w:eastAsia="宋体" w:hAnsi="Times New Roman" w:cs="Times New Roman" w:hint="eastAsia"/>
         </w:rPr>
+        <w:lastRenderedPageBreak/>
         <w:t>增加了新的翻译系统</w:t>
       </w:r>
       <w:r>
@@ -22012,7 +22073,6 @@
         <w:rPr>
           <w:rFonts w:ascii="Times New Roman" w:eastAsia="宋体" w:hAnsi="Times New Roman" w:cs="Times New Roman" w:hint="eastAsia"/>
         </w:rPr>
-        <w:lastRenderedPageBreak/>
         <w:t>ID</w:t>
       </w:r>
       <w:r>
@@ -22761,30 +22821,6 @@
         <w:rPr>
           <w:rFonts w:ascii="Times New Roman" w:eastAsia="宋体" w:hAnsi="Times New Roman" w:cs="Times New Roman" w:hint="eastAsia"/>
         </w:rPr>
-        <w:t>CSF</w:t>
-      </w:r>
-      <w:r>
-        <w:rPr>
-          <w:rFonts w:ascii="Times New Roman" w:eastAsia="宋体" w:hAnsi="Times New Roman" w:cs="Times New Roman" w:hint="eastAsia"/>
-        </w:rPr>
-        <w:t>浏览器：可以浏览、搜索当前加载的全部</w:t>
-      </w:r>
-      <w:r>
-        <w:rPr>
-          <w:rFonts w:ascii="Times New Roman" w:eastAsia="宋体" w:hAnsi="Times New Roman" w:cs="Times New Roman" w:hint="eastAsia"/>
-        </w:rPr>
-        <w:t>CSF</w:t>
-      </w:r>
-      <w:r>
-        <w:rPr>
-          <w:rFonts w:ascii="Times New Roman" w:eastAsia="宋体" w:hAnsi="Times New Roman" w:cs="Times New Roman" w:hint="eastAsia"/>
-        </w:rPr>
-        <w:t>文本，也可以立即重新加载</w:t>
-      </w:r>
-      <w:r>
-        <w:rPr>
-          <w:rFonts w:ascii="Times New Roman" w:eastAsia="宋体" w:hAnsi="Times New Roman" w:cs="Times New Roman" w:hint="eastAsia"/>
-        </w:rPr>
         <w:lastRenderedPageBreak/>
         <w:t>CSF</w:t>
       </w:r>
@@ -22792,6 +22828,30 @@
         <w:rPr>
           <w:rFonts w:ascii="Times New Roman" w:eastAsia="宋体" w:hAnsi="Times New Roman" w:cs="Times New Roman" w:hint="eastAsia"/>
         </w:rPr>
+        <w:t>浏览器：可以浏览、搜索当前加载的全部</w:t>
+      </w:r>
+      <w:r>
+        <w:rPr>
+          <w:rFonts w:ascii="Times New Roman" w:eastAsia="宋体" w:hAnsi="Times New Roman" w:cs="Times New Roman" w:hint="eastAsia"/>
+        </w:rPr>
+        <w:t>CSF</w:t>
+      </w:r>
+      <w:r>
+        <w:rPr>
+          <w:rFonts w:ascii="Times New Roman" w:eastAsia="宋体" w:hAnsi="Times New Roman" w:cs="Times New Roman" w:hint="eastAsia"/>
+        </w:rPr>
+        <w:t>文本，也可以立即重新加载</w:t>
+      </w:r>
+      <w:r>
+        <w:rPr>
+          <w:rFonts w:ascii="Times New Roman" w:eastAsia="宋体" w:hAnsi="Times New Roman" w:cs="Times New Roman" w:hint="eastAsia"/>
+        </w:rPr>
+        <w:t>CSF</w:t>
+      </w:r>
+      <w:r>
+        <w:rPr>
+          <w:rFonts w:ascii="Times New Roman" w:eastAsia="宋体" w:hAnsi="Times New Roman" w:cs="Times New Roman" w:hint="eastAsia"/>
+        </w:rPr>
         <w:t>文件，还可以快捷为触发事件的对应参数选择文本标签</w:t>
       </w:r>
     </w:p>
@@ -23392,7 +23452,14 @@
         <w:rPr>
           <w:rFonts w:ascii="Times New Roman" w:eastAsia="宋体" w:hAnsi="Times New Roman" w:cs="Times New Roman" w:hint="eastAsia"/>
         </w:rPr>
-        <w:t>的文件覆盖其中对应内容</w:t>
+        <w:t>的文件覆盖</w:t>
+      </w:r>
+      <w:r>
+        <w:rPr>
+          <w:rFonts w:ascii="Times New Roman" w:eastAsia="宋体" w:hAnsi="Times New Roman" w:cs="Times New Roman" w:hint="eastAsia"/>
+        </w:rPr>
+        <w:lastRenderedPageBreak/>
+        <w:t>其中对应内容</w:t>
       </w:r>
     </w:p>
     <w:p>
@@ -23406,7 +23473,6 @@
         <w:rPr>
           <w:rFonts w:ascii="Times New Roman" w:eastAsia="宋体" w:hAnsi="Times New Roman" w:cs="Times New Roman" w:hint="eastAsia"/>
         </w:rPr>
-        <w:lastRenderedPageBreak/>
         <w:t>为已有地形设置框架模式：在地形</w:t>
       </w:r>
       <w:r>
@@ -23943,6 +24009,7 @@
         <w:rPr>
           <w:rFonts w:ascii="Times New Roman" w:eastAsia="宋体" w:hAnsi="Times New Roman" w:cs="Times New Roman" w:hint="eastAsia"/>
         </w:rPr>
+        <w:lastRenderedPageBreak/>
         <w:t>工具脚本：新增多个函数，提供了读取指定</w:t>
       </w:r>
       <w:r>
@@ -23955,14 +24022,7 @@
         <w:rPr>
           <w:rFonts w:ascii="Times New Roman" w:eastAsia="宋体" w:hAnsi="Times New Roman" w:cs="Times New Roman" w:hint="eastAsia"/>
         </w:rPr>
-        <w:t>、对地形进行操作、获取地形信息</w:t>
-      </w:r>
-      <w:r>
-        <w:rPr>
-          <w:rFonts w:ascii="Times New Roman" w:eastAsia="宋体" w:hAnsi="Times New Roman" w:cs="Times New Roman" w:hint="eastAsia"/>
-        </w:rPr>
-        <w:lastRenderedPageBreak/>
-        <w:t>等功能，详见“</w:t>
+        <w:t>、对地形进行操作、获取地形信息等功能，详见“</w:t>
       </w:r>
       <w:r>
         <w:rPr>
@@ -44945,7 +45005,7 @@
         <v:path o:extrusionok="f" gradientshapeok="t" o:connecttype="rect"/>
         <o:lock v:ext="edit" aspectratio="t"/>
       </v:shapetype>
-      <v:shape id="_x0000_i1029" type="#_x0000_t75" style="width:11.4pt;height:11.4pt" o:bullet="t">
+      <v:shape id="_x0000_i1030" type="#_x0000_t75" style="width:11.4pt;height:11.4pt" o:bullet="t">
         <v:imagedata r:id="rId1" o:title="mso9A9A"/>
       </v:shape>
     </w:pict>

</xml_diff>

<commit_message>
optimize waypoint sort, refresh sort pages on change
</commit_message>
<xml_diff>
--- a/Supplementary/文档/FA2SP HDM Edition说明文档.docx
+++ b/Supplementary/文档/FA2SP HDM Edition说明文档.docx
@@ -153,7 +153,7 @@
           <w:rFonts w:ascii="宋体" w:eastAsia="宋体" w:hAnsi="宋体" w:hint="eastAsia"/>
           <w:sz w:val="24"/>
         </w:rPr>
-        <w:t>5</w:t>
+        <w:t>6</w:t>
       </w:r>
       <w:r>
         <w:rPr>
@@ -167,13 +167,6 @@
           <w:rFonts w:ascii="宋体" w:eastAsia="宋体" w:hAnsi="宋体" w:hint="eastAsia"/>
           <w:sz w:val="24"/>
         </w:rPr>
-        <w:t>3</w:t>
-      </w:r>
-      <w:r>
-        <w:rPr>
-          <w:rFonts w:ascii="宋体" w:eastAsia="宋体" w:hAnsi="宋体" w:hint="eastAsia"/>
-          <w:sz w:val="24"/>
-        </w:rPr>
         <w:t>1</w:t>
       </w:r>
     </w:p>
@@ -256,7 +249,7 @@
           <w:sz w:val="28"/>
           <w:szCs w:val="32"/>
         </w:rPr>
-        <w:t>5</w:t>
+        <w:t>6</w:t>
       </w:r>
       <w:r>
         <w:rPr>
@@ -276,7 +269,7 @@
           <w:sz w:val="28"/>
           <w:szCs w:val="32"/>
         </w:rPr>
-        <w:t>3</w:t>
+        <w:t>0</w:t>
       </w:r>
       <w:r>
         <w:rPr>
@@ -1454,6 +1447,24 @@
         <w:pStyle w:val="a9"/>
         <w:numPr>
           <w:ilvl w:val="0"/>
+          <w:numId w:val="11"/>
+        </w:numPr>
+        <w:rPr>
+          <w:rFonts w:ascii="Times New Roman" w:eastAsia="宋体" w:hAnsi="Times New Roman" w:cs="Times New Roman"/>
+        </w:rPr>
+      </w:pPr>
+      <w:r>
+        <w:rPr>
+          <w:rFonts w:ascii="Times New Roman" w:eastAsia="宋体" w:hAnsi="Times New Roman" w:cs="Times New Roman" w:hint="eastAsia"/>
+        </w:rPr>
+        <w:t>优化路径点列表性能，各列表会在对应编辑器内新建、复制、删除对象时刷新</w:t>
+      </w:r>
+    </w:p>
+    <w:p>
+      <w:pPr>
+        <w:pStyle w:val="a9"/>
+        <w:numPr>
+          <w:ilvl w:val="0"/>
           <w:numId w:val="10"/>
         </w:numPr>
         <w:rPr>
@@ -1832,6 +1843,7 @@
         <w:rPr>
           <w:rFonts w:ascii="Times New Roman" w:eastAsia="宋体" w:hAnsi="Times New Roman" w:cs="Times New Roman" w:hint="eastAsia"/>
         </w:rPr>
+        <w:lastRenderedPageBreak/>
         <w:t>修复当隧道信息不正确时崩溃的</w:t>
       </w:r>
       <w:r>
@@ -1880,7 +1892,6 @@
         <w:rPr>
           <w:rFonts w:ascii="Times New Roman" w:eastAsia="宋体" w:hAnsi="Times New Roman" w:cs="Times New Roman" w:hint="eastAsia"/>
         </w:rPr>
-        <w:lastRenderedPageBreak/>
         <w:t>显著</w:t>
       </w:r>
       <w:r>
@@ -2807,6 +2818,7 @@
         <w:rPr>
           <w:rFonts w:ascii="Times New Roman" w:eastAsia="宋体" w:hAnsi="Times New Roman" w:cs="Times New Roman" w:hint="eastAsia"/>
         </w:rPr>
+        <w:lastRenderedPageBreak/>
         <w:t>优化高架桥的遮挡表现</w:t>
       </w:r>
     </w:p>
@@ -2843,7 +2855,6 @@
         <w:rPr>
           <w:rFonts w:ascii="Times New Roman" w:eastAsia="宋体" w:hAnsi="Times New Roman" w:cs="Times New Roman" w:hint="eastAsia"/>
         </w:rPr>
-        <w:lastRenderedPageBreak/>
         <w:t>在地形生成器中同时生成覆盖物和地形对象时，地形对象不会在</w:t>
       </w:r>
       <w:r>
@@ -3831,6 +3842,7 @@
         <w:rPr>
           <w:rFonts w:ascii="Times New Roman" w:eastAsia="宋体" w:hAnsi="Times New Roman" w:cs="Times New Roman" w:hint="eastAsia"/>
         </w:rPr>
+        <w:lastRenderedPageBreak/>
         <w:t>支持摆放泰伯利亚蔓孔怪物与藤蔓，详见</w:t>
       </w:r>
       <w:r>
@@ -3891,7 +3903,6 @@
         <w:rPr>
           <w:rFonts w:ascii="Times New Roman" w:eastAsia="宋体" w:hAnsi="Times New Roman" w:cs="Times New Roman" w:hint="eastAsia"/>
         </w:rPr>
-        <w:lastRenderedPageBreak/>
         <w:t>IgnoreOverlays</w:t>
       </w:r>
       <w:r>
@@ -5116,6 +5127,7 @@
         <w:rPr>
           <w:rFonts w:ascii="Times New Roman" w:eastAsia="宋体" w:hAnsi="Times New Roman" w:cs="Times New Roman" w:hint="eastAsia"/>
         </w:rPr>
+        <w:lastRenderedPageBreak/>
         <w:t>修复附加单位绑定在建筑炮塔上时，无法跟随旋转的</w:t>
       </w:r>
       <w:r>
@@ -5158,7 +5170,6 @@
         <w:rPr>
           <w:rFonts w:ascii="Times New Roman" w:eastAsia="宋体" w:hAnsi="Times New Roman" w:cs="Times New Roman" w:hint="eastAsia"/>
         </w:rPr>
-        <w:lastRenderedPageBreak/>
         <w:t>支持将地图文件关联至启动器，直接打开地图；支持将地图拖拽至启动器打开，详见</w:t>
       </w:r>
       <w:r>
@@ -6125,6 +6136,7 @@
         <w:rPr>
           <w:rFonts w:ascii="Times New Roman" w:eastAsia="宋体" w:hAnsi="Times New Roman" w:cs="Times New Roman" w:hint="eastAsia"/>
         </w:rPr>
+        <w:lastRenderedPageBreak/>
         <w:t>围墙覆盖物支持</w:t>
       </w:r>
       <w:r>
@@ -6173,7 +6185,6 @@
         <w:rPr>
           <w:rFonts w:ascii="Times New Roman" w:eastAsia="宋体" w:hAnsi="Times New Roman" w:cs="Times New Roman" w:hint="eastAsia"/>
         </w:rPr>
-        <w:lastRenderedPageBreak/>
         <w:t>恢复心灵终结中被错误隐藏的部分地形组</w:t>
       </w:r>
     </w:p>
@@ -7104,6 +7115,7 @@
         <w:rPr>
           <w:rFonts w:ascii="Times New Roman" w:eastAsia="宋体" w:hAnsi="Times New Roman" w:cs="Times New Roman" w:hint="eastAsia"/>
         </w:rPr>
+        <w:lastRenderedPageBreak/>
         <w:t>小队变更时会即时刷新</w:t>
       </w:r>
       <w:r>
@@ -7158,14 +7170,7 @@
         <w:rPr>
           <w:rFonts w:ascii="Times New Roman" w:eastAsia="宋体" w:hAnsi="Times New Roman" w:cs="Times New Roman" w:hint="eastAsia"/>
         </w:rPr>
-        <w:t>水晶不能将矿石放在斜坡上（不影响地形浏览器中的</w:t>
-      </w:r>
-      <w:r>
-        <w:rPr>
-          <w:rFonts w:ascii="Times New Roman" w:eastAsia="宋体" w:hAnsi="Times New Roman" w:cs="Times New Roman" w:hint="eastAsia"/>
-        </w:rPr>
-        <w:lastRenderedPageBreak/>
-        <w:t>摆放）</w:t>
+        <w:t>水晶不能将矿石放在斜坡上（不影响地形浏览器中的摆放）</w:t>
       </w:r>
     </w:p>
     <w:p>
@@ -8231,6 +8236,7 @@
         <w:rPr>
           <w:rFonts w:ascii="Times New Roman" w:eastAsia="宋体" w:hAnsi="Times New Roman" w:cs="Times New Roman" w:hint="eastAsia"/>
         </w:rPr>
+        <w:lastRenderedPageBreak/>
         <w:t>污染现在能正确被阴影遮挡</w:t>
       </w:r>
     </w:p>
@@ -8273,7 +8279,6 @@
         <w:rPr>
           <w:rFonts w:ascii="Times New Roman" w:eastAsia="宋体" w:hAnsi="Times New Roman" w:cs="Times New Roman" w:hint="eastAsia"/>
         </w:rPr>
-        <w:lastRenderedPageBreak/>
         <w:t>支持自定义加载嵌套</w:t>
       </w:r>
       <w:r>
@@ -9298,6 +9303,7 @@
         <w:rPr>
           <w:rFonts w:ascii="Times New Roman" w:eastAsia="宋体" w:hAnsi="Times New Roman" w:cs="Times New Roman" w:hint="eastAsia"/>
         </w:rPr>
+        <w:lastRenderedPageBreak/>
         <w:t>修复了单位“在桥梁上”为</w:t>
       </w:r>
       <w:r>
@@ -9364,7 +9370,6 @@
         <w:rPr>
           <w:rFonts w:ascii="Times New Roman" w:eastAsia="宋体" w:hAnsi="Times New Roman" w:cs="Times New Roman" w:hint="eastAsia"/>
         </w:rPr>
-        <w:lastRenderedPageBreak/>
         <w:t>优化地形与阴影的覆盖关系，使渲染更接近游戏内效果</w:t>
       </w:r>
     </w:p>
@@ -10407,6 +10412,7 @@
         <w:rPr>
           <w:rFonts w:ascii="Times New Roman" w:eastAsia="宋体" w:hAnsi="Times New Roman" w:cs="Times New Roman" w:hint="eastAsia"/>
         </w:rPr>
+        <w:lastRenderedPageBreak/>
         <w:t>修复触发编辑器填写的参数为触发时不能正确截断空格的</w:t>
       </w:r>
       <w:r>
@@ -10439,7 +10445,6 @@
           <w:sz w:val="28"/>
           <w:szCs w:val="32"/>
         </w:rPr>
-        <w:lastRenderedPageBreak/>
         <w:t>1.2.4 (2025.11.02)</w:t>
       </w:r>
     </w:p>
@@ -11579,14 +11584,8 @@
         <w:rPr>
           <w:rFonts w:ascii="Times New Roman" w:eastAsia="宋体" w:hAnsi="Times New Roman" w:cs="Times New Roman" w:hint="eastAsia"/>
         </w:rPr>
-        <w:t>擦除覆盖物不会导致附近的围墙变为完好状态，会保持当前破损状态（但仍</w:t>
-      </w:r>
-      <w:r>
-        <w:rPr>
-          <w:rFonts w:ascii="Times New Roman" w:eastAsia="宋体" w:hAnsi="Times New Roman" w:cs="Times New Roman" w:hint="eastAsia"/>
-        </w:rPr>
         <w:lastRenderedPageBreak/>
-        <w:t>然会重新计算连接方式）</w:t>
+        <w:t>擦除覆盖物不会导致附近的围墙变为完好状态，会保持当前破损状态（但仍然会重新计算连接方式）</w:t>
       </w:r>
     </w:p>
     <w:p>

</xml_diff>

<commit_message>
fix infantry default image display, change some default values
</commit_message>
<xml_diff>
--- a/Supplementary/文档/FA2SP HDM Edition说明文档.docx
+++ b/Supplementary/文档/FA2SP HDM Edition说明文档.docx
@@ -28947,7 +28947,13 @@
         <w:rPr>
           <w:rFonts w:ascii="Times New Roman" w:eastAsia="宋体" w:hAnsi="Times New Roman" w:cs="Times New Roman" w:hint="eastAsia"/>
         </w:rPr>
-        <w:t xml:space="preserve"> false</w:t>
+        <w:t xml:space="preserve"> </w:t>
+      </w:r>
+      <w:r>
+        <w:rPr>
+          <w:rFonts w:ascii="Times New Roman" w:eastAsia="宋体" w:hAnsi="Times New Roman" w:cs="Times New Roman" w:hint="eastAsia"/>
+        </w:rPr>
+        <w:t>true</w:t>
       </w:r>
     </w:p>
     <w:p>
@@ -29204,7 +29210,13 @@
         <w:rPr>
           <w:rFonts w:ascii="Times New Roman" w:eastAsia="宋体" w:hAnsi="Times New Roman" w:cs="Times New Roman" w:hint="eastAsia"/>
         </w:rPr>
-        <w:t xml:space="preserve"> true</w:t>
+        <w:t xml:space="preserve"> </w:t>
+      </w:r>
+      <w:r>
+        <w:rPr>
+          <w:rFonts w:ascii="Times New Roman" w:eastAsia="宋体" w:hAnsi="Times New Roman" w:cs="Times New Roman" w:hint="eastAsia"/>
+        </w:rPr>
+        <w:t>false</w:t>
       </w:r>
     </w:p>
     <w:p>
@@ -38167,32 +38179,14 @@
       <w:pPr>
         <w:ind w:firstLineChars="200" w:firstLine="440"/>
         <w:rPr>
-          <w:rFonts w:ascii="Times New Roman" w:eastAsia="宋体" w:hAnsi="Times New Roman" w:cs="Times New Roman" w:hint="eastAsia"/>
-        </w:rPr>
-      </w:pPr>
-      <w:r>
-        <w:rPr>
-          <w:rFonts w:ascii="Times New Roman" w:eastAsia="宋体" w:hAnsi="Times New Roman" w:cs="Times New Roman" w:hint="eastAsia"/>
-        </w:rPr>
-        <w:t>ColorName</w:t>
-      </w:r>
-      <w:r>
-        <w:rPr>
-          <w:rFonts w:ascii="Times New Roman" w:eastAsia="宋体" w:hAnsi="Times New Roman" w:cs="Times New Roman" w:hint="eastAsia"/>
-        </w:rPr>
-        <w:t>=</w:t>
-      </w:r>
-      <w:r>
-        <w:rPr>
-          <w:rFonts w:ascii="Times New Roman" w:eastAsia="宋体" w:hAnsi="Times New Roman" w:cs="Times New Roman" w:hint="eastAsia"/>
-        </w:rPr>
-        <w:t>HSV</w:t>
-      </w:r>
-      <w:r>
-        <w:rPr>
-          <w:rFonts w:ascii="Times New Roman" w:eastAsia="宋体" w:hAnsi="Times New Roman" w:cs="Times New Roman" w:hint="eastAsia"/>
-        </w:rPr>
-        <w:t xml:space="preserve"> ; </w:t>
+          <w:rFonts w:ascii="Times New Roman" w:eastAsia="宋体" w:hAnsi="Times New Roman" w:cs="Times New Roman"/>
+        </w:rPr>
+      </w:pPr>
+      <w:r>
+        <w:rPr>
+          <w:rFonts w:ascii="Times New Roman" w:eastAsia="宋体" w:hAnsi="Times New Roman" w:cs="Times New Roman" w:hint="eastAsia"/>
+        </w:rPr>
+        <w:t xml:space="preserve">ColorName=HSV ; </w:t>
       </w:r>
       <w:r>
         <w:rPr>
@@ -45431,7 +45425,7 @@
         <v:path o:extrusionok="f" gradientshapeok="t" o:connecttype="rect"/>
         <o:lock v:ext="edit" aspectratio="t"/>
       </v:shapetype>
-      <v:shape id="_x0000_i1035" type="#_x0000_t75" style="width:11.25pt;height:11.25pt" o:bullet="t">
+      <v:shape id="_x0000_i1030" type="#_x0000_t75" style="width:11.25pt;height:11.25pt" o:bullet="t">
         <v:imagedata r:id="rId1" o:title="mso9A9A"/>
       </v:shape>
     </w:pict>

</xml_diff>

<commit_message>
fix drag line position
</commit_message>
<xml_diff>
--- a/Supplementary/文档/FA2SP HDM Edition说明文档.docx
+++ b/Supplementary/文档/FA2SP HDM Edition说明文档.docx
@@ -649,6 +649,30 @@
         <w:pStyle w:val="a9"/>
         <w:numPr>
           <w:ilvl w:val="0"/>
+          <w:numId w:val="11"/>
+        </w:numPr>
+        <w:rPr>
+          <w:rFonts w:ascii="Times New Roman" w:eastAsia="宋体" w:hAnsi="Times New Roman" w:cs="Times New Roman"/>
+        </w:rPr>
+      </w:pPr>
+      <w:r>
+        <w:rPr>
+          <w:rFonts w:ascii="Times New Roman" w:eastAsia="宋体" w:hAnsi="Times New Roman" w:cs="Times New Roman" w:hint="eastAsia"/>
+        </w:rPr>
+        <w:t>修复部分情况下拖拽单位辅助线显示错位的</w:t>
+      </w:r>
+      <w:r>
+        <w:rPr>
+          <w:rFonts w:ascii="Times New Roman" w:eastAsia="宋体" w:hAnsi="Times New Roman" w:cs="Times New Roman" w:hint="eastAsia"/>
+        </w:rPr>
+        <w:t>bug</w:t>
+      </w:r>
+    </w:p>
+    <w:p>
+      <w:pPr>
+        <w:pStyle w:val="a9"/>
+        <w:numPr>
+          <w:ilvl w:val="0"/>
           <w:numId w:val="10"/>
         </w:numPr>
         <w:rPr>
@@ -1055,6 +1079,7 @@
         <w:rPr>
           <w:rFonts w:ascii="Times New Roman" w:eastAsia="宋体" w:hAnsi="Times New Roman" w:cs="Times New Roman" w:hint="eastAsia"/>
         </w:rPr>
+        <w:lastRenderedPageBreak/>
         <w:t>优化右键拖动流畅度，拖动时可以实时更新小地图</w:t>
       </w:r>
     </w:p>
@@ -1073,7 +1098,6 @@
         <w:rPr>
           <w:rFonts w:ascii="Times New Roman" w:eastAsia="宋体" w:hAnsi="Times New Roman" w:cs="Times New Roman" w:hint="eastAsia"/>
         </w:rPr>
-        <w:lastRenderedPageBreak/>
         <w:t>优化右键取消当前指令时物品浏览器不停向上切换的</w:t>
       </w:r>
       <w:r>
@@ -1905,7 +1929,14 @@
         <w:rPr>
           <w:rFonts w:ascii="Times New Roman" w:eastAsia="宋体" w:hAnsi="Times New Roman" w:cs="Times New Roman" w:hint="eastAsia"/>
         </w:rPr>
-        <w:t>优化路径点列表性能，各列表会在对应编辑器内新建、复制、删除对象时刷新</w:t>
+        <w:t>优化路径点列表性能，各列表会在对应编辑器内新建、复制、删除对象时刷</w:t>
+      </w:r>
+      <w:r>
+        <w:rPr>
+          <w:rFonts w:ascii="Times New Roman" w:eastAsia="宋体" w:hAnsi="Times New Roman" w:cs="Times New Roman" w:hint="eastAsia"/>
+        </w:rPr>
+        <w:lastRenderedPageBreak/>
+        <w:t>新</w:t>
       </w:r>
     </w:p>
     <w:p>
@@ -1923,7 +1954,6 @@
         <w:rPr>
           <w:rFonts w:ascii="Times New Roman" w:eastAsia="宋体" w:hAnsi="Times New Roman" w:cs="Times New Roman" w:hint="eastAsia"/>
         </w:rPr>
-        <w:lastRenderedPageBreak/>
         <w:t>可以在</w:t>
       </w:r>
       <w:r>
@@ -46015,7 +46045,7 @@
         <v:path o:extrusionok="f" gradientshapeok="t" o:connecttype="rect"/>
         <o:lock v:ext="edit" aspectratio="t"/>
       </v:shapetype>
-      <v:shape id="_x0000_i1031" type="#_x0000_t75" style="width:11.55pt;height:11.55pt" o:bullet="t">
+      <v:shape id="_x0000_i1030" type="#_x0000_t75" style="width:11.55pt;height:11.55pt" o:bullet="t">
         <v:imagedata r:id="rId1" o:title="mso9A9A"/>
       </v:shape>
     </w:pict>

</xml_diff>

<commit_message>
add new lua scripts
</commit_message>
<xml_diff>
--- a/Supplementary/文档/FA2SP HDM Edition说明文档.docx
+++ b/Supplementary/文档/FA2SP HDM Edition说明文档.docx
@@ -174,7 +174,7 @@
           <w:rFonts w:ascii="宋体" w:eastAsia="宋体" w:hAnsi="宋体" w:hint="eastAsia"/>
           <w:sz w:val="24"/>
         </w:rPr>
-        <w:t>1</w:t>
+        <w:t>2</w:t>
       </w:r>
     </w:p>
     <w:p>
@@ -246,7 +246,7 @@
           <w:sz w:val="28"/>
           <w:szCs w:val="32"/>
         </w:rPr>
-        <w:t>1</w:t>
+        <w:t>2</w:t>
       </w:r>
       <w:r>
         <w:rPr>
@@ -756,6 +756,36 @@
         <w:pStyle w:val="a9"/>
         <w:numPr>
           <w:ilvl w:val="0"/>
+          <w:numId w:val="11"/>
+        </w:numPr>
+        <w:rPr>
+          <w:rFonts w:ascii="Times New Roman" w:eastAsia="宋体" w:hAnsi="Times New Roman" w:cs="Times New Roman"/>
+        </w:rPr>
+      </w:pPr>
+      <w:r>
+        <w:rPr>
+          <w:rFonts w:ascii="Times New Roman" w:eastAsia="宋体" w:hAnsi="Times New Roman" w:cs="Times New Roman" w:hint="eastAsia"/>
+        </w:rPr>
+        <w:t>添加新</w:t>
+      </w:r>
+      <w:r>
+        <w:rPr>
+          <w:rFonts w:ascii="Times New Roman" w:eastAsia="宋体" w:hAnsi="Times New Roman" w:cs="Times New Roman" w:hint="eastAsia"/>
+        </w:rPr>
+        <w:t>lua</w:t>
+      </w:r>
+      <w:r>
+        <w:rPr>
+          <w:rFonts w:ascii="Times New Roman" w:eastAsia="宋体" w:hAnsi="Times New Roman" w:cs="Times New Roman" w:hint="eastAsia"/>
+        </w:rPr>
+        <w:t>脚本</w:t>
+      </w:r>
+    </w:p>
+    <w:p>
+      <w:pPr>
+        <w:pStyle w:val="a9"/>
+        <w:numPr>
+          <w:ilvl w:val="0"/>
           <w:numId w:val="10"/>
         </w:numPr>
         <w:rPr>
@@ -1024,14 +1054,8 @@
         <w:rPr>
           <w:rFonts w:ascii="Times New Roman" w:eastAsia="宋体" w:hAnsi="Times New Roman" w:cs="Times New Roman" w:hint="eastAsia"/>
         </w:rPr>
-        <w:t>重写标签编辑器，支持查找引用、转到触发等特性，支持按名称进行排序，详</w:t>
-      </w:r>
-      <w:r>
-        <w:rPr>
-          <w:rFonts w:ascii="Times New Roman" w:eastAsia="宋体" w:hAnsi="Times New Roman" w:cs="Times New Roman" w:hint="eastAsia"/>
-        </w:rPr>
         <w:lastRenderedPageBreak/>
-        <w:t>见</w:t>
+        <w:t>重写标签编辑器，支持查找引用、转到触发等特性，支持按名称进行排序，详见</w:t>
       </w:r>
       <w:r>
         <w:rPr>
@@ -1922,7 +1946,14 @@
         <w:rPr>
           <w:rFonts w:ascii="Times New Roman" w:eastAsia="宋体" w:hAnsi="Times New Roman" w:cs="Times New Roman" w:hint="eastAsia"/>
         </w:rPr>
-        <w:t>滚轮缩放，并且能记住缩放大小</w:t>
+        <w:t>滚轮缩放，并且能记</w:t>
+      </w:r>
+      <w:r>
+        <w:rPr>
+          <w:rFonts w:ascii="Times New Roman" w:eastAsia="宋体" w:hAnsi="Times New Roman" w:cs="Times New Roman" w:hint="eastAsia"/>
+        </w:rPr>
+        <w:lastRenderedPageBreak/>
+        <w:t>住缩放大小</w:t>
       </w:r>
     </w:p>
     <w:p>
@@ -1940,7 +1971,6 @@
         <w:rPr>
           <w:rFonts w:ascii="Times New Roman" w:eastAsia="宋体" w:hAnsi="Times New Roman" w:cs="Times New Roman" w:hint="eastAsia"/>
         </w:rPr>
-        <w:lastRenderedPageBreak/>
         <w:t>建筑物可以在</w:t>
       </w:r>
       <w:r>
@@ -2873,7 +2903,14 @@
         <w:rPr>
           <w:rFonts w:ascii="Times New Roman" w:eastAsia="宋体" w:hAnsi="Times New Roman" w:cs="Times New Roman" w:hint="eastAsia"/>
         </w:rPr>
-        <w:t>，添加修改实时预览</w:t>
+        <w:t>，添加修改</w:t>
+      </w:r>
+      <w:r>
+        <w:rPr>
+          <w:rFonts w:ascii="Times New Roman" w:eastAsia="宋体" w:hAnsi="Times New Roman" w:cs="Times New Roman" w:hint="eastAsia"/>
+        </w:rPr>
+        <w:lastRenderedPageBreak/>
+        <w:t>实时预览</w:t>
       </w:r>
     </w:p>
     <w:p>
@@ -2891,7 +2928,6 @@
         <w:rPr>
           <w:rFonts w:ascii="Times New Roman" w:eastAsia="宋体" w:hAnsi="Times New Roman" w:cs="Times New Roman" w:hint="eastAsia"/>
         </w:rPr>
-        <w:lastRenderedPageBreak/>
         <w:t>占地面积大于</w:t>
       </w:r>
       <w:r>
@@ -3758,6 +3794,7 @@
         <w:rPr>
           <w:rFonts w:ascii="Times New Roman" w:eastAsia="宋体" w:hAnsi="Times New Roman" w:cs="Times New Roman" w:hint="eastAsia"/>
         </w:rPr>
+        <w:lastRenderedPageBreak/>
         <w:t>删除</w:t>
       </w:r>
       <w:r>
@@ -3806,7 +3843,6 @@
         <w:rPr>
           <w:rFonts w:ascii="Times New Roman" w:eastAsia="宋体" w:hAnsi="Times New Roman" w:cs="Times New Roman" w:hint="eastAsia"/>
         </w:rPr>
-        <w:lastRenderedPageBreak/>
         <w:t>快捷保存会使用与上次手动保存相同的预览图选项</w:t>
       </w:r>
     </w:p>
@@ -4878,6 +4914,7 @@
           <w:kern w:val="0"/>
           <w14:ligatures w14:val="none"/>
         </w:rPr>
+        <w:lastRenderedPageBreak/>
         <w:t>在物品浏览器中进行分类，其中</w:t>
       </w:r>
       <w:r>
@@ -4910,7 +4947,7 @@
           <w:kern w:val="0"/>
           <w14:ligatures w14:val="none"/>
         </w:rPr>
-        <w:t>中进行翻译，此标</w:t>
+        <w:t>中进行翻译，此标签与</w:t>
       </w:r>
       <w:r>
         <w:rPr>
@@ -4918,8 +4955,7 @@
           <w:kern w:val="0"/>
           <w14:ligatures w14:val="none"/>
         </w:rPr>
-        <w:lastRenderedPageBreak/>
-        <w:t>签与</w:t>
+        <w:t>WAE</w:t>
       </w:r>
       <w:r>
         <w:rPr>
@@ -4927,7 +4963,7 @@
           <w:kern w:val="0"/>
           <w14:ligatures w14:val="none"/>
         </w:rPr>
-        <w:t>WAE</w:t>
+        <w:t>兼容</w:t>
       </w:r>
       <w:r>
         <w:rPr>
@@ -4935,7 +4971,7 @@
           <w:kern w:val="0"/>
           <w14:ligatures w14:val="none"/>
         </w:rPr>
-        <w:t>兼容</w:t>
+        <w:t>；当</w:t>
       </w:r>
       <w:r>
         <w:rPr>
@@ -4943,7 +4979,7 @@
           <w:kern w:val="0"/>
           <w14:ligatures w14:val="none"/>
         </w:rPr>
-        <w:t>；当</w:t>
+        <w:t>value</w:t>
       </w:r>
       <w:r>
         <w:rPr>
@@ -4951,7 +4987,7 @@
           <w:kern w:val="0"/>
           <w14:ligatures w14:val="none"/>
         </w:rPr>
-        <w:t>value</w:t>
+        <w:t>与</w:t>
       </w:r>
       <w:r>
         <w:rPr>
@@ -4959,7 +4995,7 @@
           <w:kern w:val="0"/>
           <w14:ligatures w14:val="none"/>
         </w:rPr>
-        <w:t>与</w:t>
+        <w:t>FAData.ini-&gt;[</w:t>
       </w:r>
       <w:r>
         <w:rPr>
@@ -4967,7 +5003,7 @@
           <w:kern w:val="0"/>
           <w14:ligatures w14:val="none"/>
         </w:rPr>
-        <w:t>FAData.ini-&gt;[</w:t>
+        <w:t>English-Sides</w:t>
       </w:r>
       <w:r>
         <w:rPr>
@@ -4975,7 +5011,7 @@
           <w:kern w:val="0"/>
           <w14:ligatures w14:val="none"/>
         </w:rPr>
-        <w:t>English-Sides</w:t>
+        <w:t>]</w:t>
       </w:r>
       <w:r>
         <w:rPr>
@@ -4983,95 +5019,95 @@
           <w:kern w:val="0"/>
           <w14:ligatures w14:val="none"/>
         </w:rPr>
-        <w:t>]</w:t>
-      </w:r>
+        <w:t>中的值相同时，会进行合并</w:t>
+      </w:r>
+    </w:p>
+    <w:p>
+      <w:pPr>
+        <w:pStyle w:val="a9"/>
+        <w:numPr>
+          <w:ilvl w:val="0"/>
+          <w:numId w:val="45"/>
+        </w:numPr>
+        <w:rPr>
+          <w:rFonts w:ascii="Times New Roman" w:eastAsia="宋体" w:hAnsi="Times New Roman" w:cs="Times New Roman"/>
+        </w:rPr>
+      </w:pPr>
       <w:r>
         <w:rPr>
           <w:rFonts w:ascii="Times New Roman" w:eastAsia="宋体" w:hAnsi="Times New Roman" w:cs="Times New Roman" w:hint="eastAsia"/>
           <w:kern w:val="0"/>
           <w14:ligatures w14:val="none"/>
         </w:rPr>
-        <w:t>中的值相同时，会进行合并</w:t>
-      </w:r>
-    </w:p>
-    <w:p>
-      <w:pPr>
-        <w:pStyle w:val="a9"/>
-        <w:numPr>
-          <w:ilvl w:val="0"/>
-          <w:numId w:val="45"/>
-        </w:numPr>
-        <w:rPr>
-          <w:rFonts w:ascii="Times New Roman" w:eastAsia="宋体" w:hAnsi="Times New Roman" w:cs="Times New Roman"/>
-        </w:rPr>
-      </w:pPr>
+        <w:t>修复部分情况下物品浏览器选项的名称与实际单位不符的</w:t>
+      </w:r>
       <w:r>
         <w:rPr>
           <w:rFonts w:ascii="Times New Roman" w:eastAsia="宋体" w:hAnsi="Times New Roman" w:cs="Times New Roman" w:hint="eastAsia"/>
           <w:kern w:val="0"/>
           <w14:ligatures w14:val="none"/>
         </w:rPr>
-        <w:t>修复部分情况下物品浏览器选项的名称与实际单位不符的</w:t>
-      </w:r>
-      <w:r>
-        <w:rPr>
-          <w:rFonts w:ascii="Times New Roman" w:eastAsia="宋体" w:hAnsi="Times New Roman" w:cs="Times New Roman" w:hint="eastAsia"/>
+        <w:t>bug</w:t>
+      </w:r>
+    </w:p>
+    <w:p>
+      <w:pPr>
+        <w:pStyle w:val="a9"/>
+        <w:numPr>
+          <w:ilvl w:val="0"/>
+          <w:numId w:val="45"/>
+        </w:numPr>
+        <w:rPr>
+          <w:rFonts w:ascii="Times New Roman" w:eastAsia="宋体" w:hAnsi="Times New Roman" w:cs="Times New Roman"/>
           <w:kern w:val="0"/>
           <w14:ligatures w14:val="none"/>
         </w:rPr>
-        <w:t>bug</w:t>
-      </w:r>
-    </w:p>
-    <w:p>
-      <w:pPr>
-        <w:pStyle w:val="a9"/>
-        <w:numPr>
-          <w:ilvl w:val="0"/>
-          <w:numId w:val="45"/>
-        </w:numPr>
-        <w:rPr>
-          <w:rFonts w:ascii="Times New Roman" w:eastAsia="宋体" w:hAnsi="Times New Roman" w:cs="Times New Roman"/>
+      </w:pPr>
+      <w:r>
+        <w:rPr>
+          <w:rFonts w:ascii="Times New Roman" w:eastAsia="宋体" w:hAnsi="Times New Roman" w:cs="Times New Roman" w:hint="eastAsia"/>
           <w:kern w:val="0"/>
           <w14:ligatures w14:val="none"/>
         </w:rPr>
-      </w:pPr>
+        <w:t>支持设置覆盖物数据的最大值，详见</w:t>
+      </w:r>
       <w:r>
         <w:rPr>
           <w:rFonts w:ascii="Times New Roman" w:eastAsia="宋体" w:hAnsi="Times New Roman" w:cs="Times New Roman" w:hint="eastAsia"/>
           <w:kern w:val="0"/>
           <w14:ligatures w14:val="none"/>
         </w:rPr>
-        <w:t>支持设置覆盖物数据的最大值，详见</w:t>
-      </w:r>
-      <w:r>
-        <w:rPr>
-          <w:rFonts w:ascii="Times New Roman" w:eastAsia="宋体" w:hAnsi="Times New Roman" w:cs="Times New Roman" w:hint="eastAsia"/>
+        <w:t>OverlayDataLimit</w:t>
+      </w:r>
+    </w:p>
+    <w:p>
+      <w:pPr>
+        <w:pStyle w:val="a9"/>
+        <w:numPr>
+          <w:ilvl w:val="0"/>
+          <w:numId w:val="45"/>
+        </w:numPr>
+        <w:rPr>
+          <w:rFonts w:ascii="Times New Roman" w:eastAsia="宋体" w:hAnsi="Times New Roman" w:cs="Times New Roman"/>
           <w:kern w:val="0"/>
           <w14:ligatures w14:val="none"/>
         </w:rPr>
-        <w:t>OverlayDataLimit</w:t>
-      </w:r>
-    </w:p>
-    <w:p>
-      <w:pPr>
-        <w:pStyle w:val="a9"/>
-        <w:numPr>
-          <w:ilvl w:val="0"/>
-          <w:numId w:val="45"/>
-        </w:numPr>
-        <w:rPr>
-          <w:rFonts w:ascii="Times New Roman" w:eastAsia="宋体" w:hAnsi="Times New Roman" w:cs="Times New Roman"/>
+      </w:pPr>
+      <w:r>
+        <w:rPr>
+          <w:rFonts w:ascii="Times New Roman" w:eastAsia="宋体" w:hAnsi="Times New Roman" w:cs="Times New Roman" w:hint="eastAsia"/>
           <w:kern w:val="0"/>
           <w14:ligatures w14:val="none"/>
         </w:rPr>
-      </w:pPr>
+        <w:t>修复</w:t>
+      </w:r>
       <w:r>
         <w:rPr>
           <w:rFonts w:ascii="Times New Roman" w:eastAsia="宋体" w:hAnsi="Times New Roman" w:cs="Times New Roman" w:hint="eastAsia"/>
           <w:kern w:val="0"/>
           <w14:ligatures w14:val="none"/>
         </w:rPr>
-        <w:t>修复</w:t>
+        <w:t>phobos</w:t>
       </w:r>
       <w:r>
         <w:rPr>
@@ -5079,59 +5115,59 @@
           <w:kern w:val="0"/>
           <w14:ligatures w14:val="none"/>
         </w:rPr>
-        <w:t>phobos</w:t>
-      </w:r>
-      <w:r>
-        <w:rPr>
-          <w:rFonts w:ascii="Times New Roman" w:eastAsia="宋体" w:hAnsi="Times New Roman" w:cs="Times New Roman" w:hint="eastAsia"/>
+        <w:t>继承的部分问题</w:t>
+      </w:r>
+    </w:p>
+    <w:p>
+      <w:pPr>
+        <w:pStyle w:val="a9"/>
+        <w:numPr>
+          <w:ilvl w:val="0"/>
+          <w:numId w:val="45"/>
+        </w:numPr>
+        <w:rPr>
+          <w:rFonts w:ascii="Times New Roman" w:eastAsia="宋体" w:hAnsi="Times New Roman" w:cs="Times New Roman"/>
           <w:kern w:val="0"/>
           <w14:ligatures w14:val="none"/>
         </w:rPr>
-        <w:t>继承的部分问题</w:t>
-      </w:r>
-    </w:p>
-    <w:p>
-      <w:pPr>
-        <w:pStyle w:val="a9"/>
-        <w:numPr>
-          <w:ilvl w:val="0"/>
-          <w:numId w:val="45"/>
-        </w:numPr>
-        <w:rPr>
-          <w:rFonts w:ascii="Times New Roman" w:eastAsia="宋体" w:hAnsi="Times New Roman" w:cs="Times New Roman"/>
+      </w:pPr>
+      <w:r>
+        <w:rPr>
+          <w:rFonts w:ascii="Times New Roman" w:eastAsia="宋体" w:hAnsi="Times New Roman" w:cs="Times New Roman" w:hint="eastAsia"/>
           <w:kern w:val="0"/>
           <w14:ligatures w14:val="none"/>
         </w:rPr>
-      </w:pPr>
-      <w:r>
-        <w:rPr>
-          <w:rFonts w:ascii="Times New Roman" w:eastAsia="宋体" w:hAnsi="Times New Roman" w:cs="Times New Roman" w:hint="eastAsia"/>
+        <w:t>当单位本体不可见时，仍然支持绘制附加单位</w:t>
+      </w:r>
+    </w:p>
+    <w:p>
+      <w:pPr>
+        <w:pStyle w:val="a9"/>
+        <w:numPr>
+          <w:ilvl w:val="0"/>
+          <w:numId w:val="45"/>
+        </w:numPr>
+        <w:rPr>
+          <w:rFonts w:ascii="Times New Roman" w:eastAsia="宋体" w:hAnsi="Times New Roman" w:cs="Times New Roman"/>
           <w:kern w:val="0"/>
           <w14:ligatures w14:val="none"/>
         </w:rPr>
-        <w:t>当单位本体不可见时，仍然支持绘制附加单位</w:t>
-      </w:r>
-    </w:p>
-    <w:p>
-      <w:pPr>
-        <w:pStyle w:val="a9"/>
-        <w:numPr>
-          <w:ilvl w:val="0"/>
-          <w:numId w:val="45"/>
-        </w:numPr>
-        <w:rPr>
-          <w:rFonts w:ascii="Times New Roman" w:eastAsia="宋体" w:hAnsi="Times New Roman" w:cs="Times New Roman"/>
+      </w:pPr>
+      <w:r>
+        <w:rPr>
+          <w:rFonts w:ascii="Times New Roman" w:eastAsia="宋体" w:hAnsi="Times New Roman" w:cs="Times New Roman" w:hint="eastAsia"/>
           <w:kern w:val="0"/>
           <w14:ligatures w14:val="none"/>
         </w:rPr>
-      </w:pPr>
+        <w:t>修复了高</w:t>
+      </w:r>
       <w:r>
         <w:rPr>
           <w:rFonts w:ascii="Times New Roman" w:eastAsia="宋体" w:hAnsi="Times New Roman" w:cs="Times New Roman" w:hint="eastAsia"/>
           <w:kern w:val="0"/>
           <w14:ligatures w14:val="none"/>
         </w:rPr>
-        <w:t>修复了高</w:t>
+        <w:t>dpi</w:t>
       </w:r>
       <w:r>
         <w:rPr>
@@ -5139,7 +5175,7 @@
           <w:kern w:val="0"/>
           <w14:ligatures w14:val="none"/>
         </w:rPr>
-        <w:t>dpi</w:t>
+        <w:t>下地形浏览器按钮显示不全的</w:t>
       </w:r>
       <w:r>
         <w:rPr>
@@ -5147,119 +5183,119 @@
           <w:kern w:val="0"/>
           <w14:ligatures w14:val="none"/>
         </w:rPr>
-        <w:t>下地形浏览器按钮显示不全的</w:t>
-      </w:r>
-      <w:r>
-        <w:rPr>
-          <w:rFonts w:ascii="Times New Roman" w:eastAsia="宋体" w:hAnsi="Times New Roman" w:cs="Times New Roman" w:hint="eastAsia"/>
+        <w:t>bug</w:t>
+      </w:r>
+    </w:p>
+    <w:p>
+      <w:pPr>
+        <w:pStyle w:val="a9"/>
+        <w:numPr>
+          <w:ilvl w:val="0"/>
+          <w:numId w:val="45"/>
+        </w:numPr>
+        <w:rPr>
+          <w:rFonts w:ascii="Times New Roman" w:eastAsia="宋体" w:hAnsi="Times New Roman" w:cs="Times New Roman"/>
           <w:kern w:val="0"/>
           <w14:ligatures w14:val="none"/>
         </w:rPr>
-        <w:t>bug</w:t>
-      </w:r>
-    </w:p>
-    <w:p>
-      <w:pPr>
-        <w:pStyle w:val="a9"/>
-        <w:numPr>
-          <w:ilvl w:val="0"/>
-          <w:numId w:val="45"/>
-        </w:numPr>
-        <w:rPr>
-          <w:rFonts w:ascii="Times New Roman" w:eastAsia="宋体" w:hAnsi="Times New Roman" w:cs="Times New Roman"/>
+      </w:pPr>
+      <w:r>
+        <w:rPr>
+          <w:rFonts w:ascii="Times New Roman" w:eastAsia="宋体" w:hAnsi="Times New Roman" w:cs="Times New Roman" w:hint="eastAsia"/>
           <w:kern w:val="0"/>
           <w14:ligatures w14:val="none"/>
         </w:rPr>
-      </w:pPr>
+        <w:t>新增对象查看器，可以查看所有游戏对象的图像，并可以选中放置</w:t>
+      </w:r>
       <w:r>
         <w:rPr>
           <w:rFonts w:ascii="Times New Roman" w:eastAsia="宋体" w:hAnsi="Times New Roman" w:cs="Times New Roman" w:hint="eastAsia"/>
           <w:kern w:val="0"/>
           <w14:ligatures w14:val="none"/>
         </w:rPr>
-        <w:t>新增对象查看器，可以查看所有游戏对象的图像，并可以选中放置</w:t>
-      </w:r>
-      <w:r>
-        <w:rPr>
-          <w:rFonts w:ascii="Times New Roman" w:eastAsia="宋体" w:hAnsi="Times New Roman" w:cs="Times New Roman" w:hint="eastAsia"/>
+        <w:t>，支持使用方向键切换选择</w:t>
+      </w:r>
+    </w:p>
+    <w:p>
+      <w:pPr>
+        <w:pStyle w:val="a9"/>
+        <w:numPr>
+          <w:ilvl w:val="0"/>
+          <w:numId w:val="45"/>
+        </w:numPr>
+        <w:rPr>
+          <w:rFonts w:ascii="Times New Roman" w:eastAsia="宋体" w:hAnsi="Times New Roman" w:cs="Times New Roman"/>
           <w:kern w:val="0"/>
           <w14:ligatures w14:val="none"/>
         </w:rPr>
-        <w:t>，支持使用方向键切换选择</w:t>
-      </w:r>
-    </w:p>
-    <w:p>
-      <w:pPr>
-        <w:pStyle w:val="a9"/>
-        <w:numPr>
-          <w:ilvl w:val="0"/>
-          <w:numId w:val="45"/>
-        </w:numPr>
-        <w:rPr>
-          <w:rFonts w:ascii="Times New Roman" w:eastAsia="宋体" w:hAnsi="Times New Roman" w:cs="Times New Roman"/>
+      </w:pPr>
+      <w:r>
+        <w:rPr>
+          <w:rFonts w:ascii="Times New Roman" w:eastAsia="宋体" w:hAnsi="Times New Roman" w:cs="Times New Roman" w:hint="eastAsia"/>
           <w:kern w:val="0"/>
           <w14:ligatures w14:val="none"/>
         </w:rPr>
-      </w:pPr>
-      <w:r>
-        <w:rPr>
-          <w:rFonts w:ascii="Times New Roman" w:eastAsia="宋体" w:hAnsi="Times New Roman" w:cs="Times New Roman" w:hint="eastAsia"/>
+        <w:t>优化灯光建筑算法</w:t>
+      </w:r>
+    </w:p>
+    <w:p>
+      <w:pPr>
+        <w:pStyle w:val="a9"/>
+        <w:numPr>
+          <w:ilvl w:val="0"/>
+          <w:numId w:val="45"/>
+        </w:numPr>
+        <w:rPr>
+          <w:rFonts w:ascii="Times New Roman" w:eastAsia="宋体" w:hAnsi="Times New Roman" w:cs="Times New Roman"/>
           <w:kern w:val="0"/>
           <w14:ligatures w14:val="none"/>
         </w:rPr>
-        <w:t>优化灯光建筑算法</w:t>
-      </w:r>
-    </w:p>
-    <w:p>
-      <w:pPr>
-        <w:pStyle w:val="a9"/>
-        <w:numPr>
-          <w:ilvl w:val="0"/>
-          <w:numId w:val="45"/>
-        </w:numPr>
-        <w:rPr>
-          <w:rFonts w:ascii="Times New Roman" w:eastAsia="宋体" w:hAnsi="Times New Roman" w:cs="Times New Roman"/>
+      </w:pPr>
+      <w:r>
+        <w:rPr>
+          <w:rFonts w:ascii="Times New Roman" w:eastAsia="宋体" w:hAnsi="Times New Roman" w:cs="Times New Roman" w:hint="eastAsia"/>
           <w:kern w:val="0"/>
           <w14:ligatures w14:val="none"/>
         </w:rPr>
-      </w:pPr>
+        <w:t>修复部分建筑炮管无法加载的</w:t>
+      </w:r>
       <w:r>
         <w:rPr>
           <w:rFonts w:ascii="Times New Roman" w:eastAsia="宋体" w:hAnsi="Times New Roman" w:cs="Times New Roman" w:hint="eastAsia"/>
           <w:kern w:val="0"/>
           <w14:ligatures w14:val="none"/>
         </w:rPr>
-        <w:t>修复部分建筑炮管无法加载的</w:t>
-      </w:r>
-      <w:r>
-        <w:rPr>
-          <w:rFonts w:ascii="Times New Roman" w:eastAsia="宋体" w:hAnsi="Times New Roman" w:cs="Times New Roman" w:hint="eastAsia"/>
+        <w:t>bug</w:t>
+      </w:r>
+    </w:p>
+    <w:p>
+      <w:pPr>
+        <w:pStyle w:val="a9"/>
+        <w:numPr>
+          <w:ilvl w:val="0"/>
+          <w:numId w:val="45"/>
+        </w:numPr>
+        <w:rPr>
+          <w:rFonts w:ascii="Times New Roman" w:eastAsia="宋体" w:hAnsi="Times New Roman" w:cs="Times New Roman"/>
           <w:kern w:val="0"/>
           <w14:ligatures w14:val="none"/>
         </w:rPr>
-        <w:t>bug</w:t>
-      </w:r>
-    </w:p>
-    <w:p>
-      <w:pPr>
-        <w:pStyle w:val="a9"/>
-        <w:numPr>
-          <w:ilvl w:val="0"/>
-          <w:numId w:val="45"/>
-        </w:numPr>
-        <w:rPr>
-          <w:rFonts w:ascii="Times New Roman" w:eastAsia="宋体" w:hAnsi="Times New Roman" w:cs="Times New Roman"/>
+      </w:pPr>
+      <w:r>
+        <w:rPr>
+          <w:rFonts w:ascii="Times New Roman" w:eastAsia="宋体" w:hAnsi="Times New Roman" w:cs="Times New Roman" w:hint="eastAsia"/>
           <w:kern w:val="0"/>
           <w14:ligatures w14:val="none"/>
         </w:rPr>
-      </w:pPr>
+        <w:t>支持读取</w:t>
+      </w:r>
       <w:r>
         <w:rPr>
           <w:rFonts w:ascii="Times New Roman" w:eastAsia="宋体" w:hAnsi="Times New Roman" w:cs="Times New Roman" w:hint="eastAsia"/>
           <w:kern w:val="0"/>
           <w14:ligatures w14:val="none"/>
         </w:rPr>
-        <w:t>支持读取</w:t>
+        <w:t>shp</w:t>
       </w:r>
       <w:r>
         <w:rPr>
@@ -5267,7 +5303,7 @@
           <w:kern w:val="0"/>
           <w14:ligatures w14:val="none"/>
         </w:rPr>
-        <w:t>shp</w:t>
+        <w:t>建筑炮塔的</w:t>
       </w:r>
       <w:r>
         <w:rPr>
@@ -5275,81 +5311,81 @@
           <w:kern w:val="0"/>
           <w14:ligatures w14:val="none"/>
         </w:rPr>
-        <w:t>建筑炮塔的</w:t>
-      </w:r>
-      <w:r>
-        <w:rPr>
-          <w:rFonts w:ascii="Times New Roman" w:eastAsia="宋体" w:hAnsi="Times New Roman" w:cs="Times New Roman" w:hint="eastAsia"/>
+        <w:t>TurretAnimDamaged</w:t>
+      </w:r>
+    </w:p>
+    <w:p>
+      <w:pPr>
+        <w:pStyle w:val="a9"/>
+        <w:numPr>
+          <w:ilvl w:val="0"/>
+          <w:numId w:val="45"/>
+        </w:numPr>
+        <w:rPr>
+          <w:rFonts w:ascii="Times New Roman" w:eastAsia="宋体" w:hAnsi="Times New Roman" w:cs="Times New Roman"/>
           <w:kern w:val="0"/>
           <w14:ligatures w14:val="none"/>
         </w:rPr>
-        <w:t>TurretAnimDamaged</w:t>
-      </w:r>
-    </w:p>
-    <w:p>
-      <w:pPr>
-        <w:pStyle w:val="a9"/>
-        <w:numPr>
-          <w:ilvl w:val="0"/>
-          <w:numId w:val="45"/>
-        </w:numPr>
-        <w:rPr>
-          <w:rFonts w:ascii="Times New Roman" w:eastAsia="宋体" w:hAnsi="Times New Roman" w:cs="Times New Roman"/>
+      </w:pPr>
+      <w:r>
+        <w:rPr>
+          <w:rFonts w:ascii="Times New Roman" w:eastAsia="宋体" w:hAnsi="Times New Roman" w:cs="Times New Roman" w:hint="eastAsia"/>
           <w:kern w:val="0"/>
           <w14:ligatures w14:val="none"/>
         </w:rPr>
-      </w:pPr>
-      <w:r>
-        <w:rPr>
-          <w:rFonts w:ascii="Times New Roman" w:eastAsia="宋体" w:hAnsi="Times New Roman" w:cs="Times New Roman" w:hint="eastAsia"/>
+        <w:t>显著提升了加载物品浏览器图标的效率</w:t>
+      </w:r>
+    </w:p>
+    <w:p>
+      <w:pPr>
+        <w:pStyle w:val="a9"/>
+        <w:numPr>
+          <w:ilvl w:val="0"/>
+          <w:numId w:val="45"/>
+        </w:numPr>
+        <w:rPr>
+          <w:rFonts w:ascii="Times New Roman" w:eastAsia="宋体" w:hAnsi="Times New Roman" w:cs="Times New Roman"/>
           <w:kern w:val="0"/>
           <w14:ligatures w14:val="none"/>
         </w:rPr>
-        <w:t>显著提升了加载物品浏览器图标的效率</w:t>
-      </w:r>
-    </w:p>
-    <w:p>
-      <w:pPr>
-        <w:pStyle w:val="a9"/>
-        <w:numPr>
-          <w:ilvl w:val="0"/>
-          <w:numId w:val="45"/>
-        </w:numPr>
-        <w:rPr>
-          <w:rFonts w:ascii="Times New Roman" w:eastAsia="宋体" w:hAnsi="Times New Roman" w:cs="Times New Roman"/>
+      </w:pPr>
+      <w:r>
+        <w:rPr>
+          <w:rFonts w:ascii="Times New Roman" w:eastAsia="宋体" w:hAnsi="Times New Roman" w:cs="Times New Roman" w:hint="eastAsia"/>
           <w:kern w:val="0"/>
           <w14:ligatures w14:val="none"/>
         </w:rPr>
-      </w:pPr>
-      <w:r>
-        <w:rPr>
-          <w:rFonts w:ascii="Times New Roman" w:eastAsia="宋体" w:hAnsi="Times New Roman" w:cs="Times New Roman" w:hint="eastAsia"/>
+        <w:t>当放置覆盖物进行预览时，不会改变扫过区域的矿石价值</w:t>
+      </w:r>
+    </w:p>
+    <w:p>
+      <w:pPr>
+        <w:pStyle w:val="a9"/>
+        <w:numPr>
+          <w:ilvl w:val="0"/>
+          <w:numId w:val="45"/>
+        </w:numPr>
+        <w:rPr>
+          <w:rFonts w:ascii="Times New Roman" w:eastAsia="宋体" w:hAnsi="Times New Roman" w:cs="Times New Roman"/>
           <w:kern w:val="0"/>
           <w14:ligatures w14:val="none"/>
         </w:rPr>
-        <w:t>当放置覆盖物进行预览时，不会改变扫过区域的矿石价值</w:t>
-      </w:r>
-    </w:p>
-    <w:p>
-      <w:pPr>
-        <w:pStyle w:val="a9"/>
-        <w:numPr>
-          <w:ilvl w:val="0"/>
-          <w:numId w:val="45"/>
-        </w:numPr>
-        <w:rPr>
-          <w:rFonts w:ascii="Times New Roman" w:eastAsia="宋体" w:hAnsi="Times New Roman" w:cs="Times New Roman"/>
+      </w:pPr>
+      <w:r>
+        <w:rPr>
+          <w:rFonts w:ascii="Times New Roman" w:eastAsia="宋体" w:hAnsi="Times New Roman" w:cs="Times New Roman" w:hint="eastAsia"/>
           <w:kern w:val="0"/>
           <w14:ligatures w14:val="none"/>
         </w:rPr>
-      </w:pPr>
+        <w:t>脚本编辑器的脚本序号从</w:t>
+      </w:r>
       <w:r>
         <w:rPr>
           <w:rFonts w:ascii="Times New Roman" w:eastAsia="宋体" w:hAnsi="Times New Roman" w:cs="Times New Roman" w:hint="eastAsia"/>
           <w:kern w:val="0"/>
           <w14:ligatures w14:val="none"/>
         </w:rPr>
-        <w:t>脚本编辑器的脚本序号从</w:t>
+        <w:t>1</w:t>
       </w:r>
       <w:r>
         <w:rPr>
@@ -5357,89 +5393,89 @@
           <w:kern w:val="0"/>
           <w14:ligatures w14:val="none"/>
         </w:rPr>
-        <w:t>1</w:t>
-      </w:r>
-      <w:r>
-        <w:rPr>
-          <w:rFonts w:ascii="Times New Roman" w:eastAsia="宋体" w:hAnsi="Times New Roman" w:cs="Times New Roman" w:hint="eastAsia"/>
+        <w:t>开始</w:t>
+      </w:r>
+    </w:p>
+    <w:p>
+      <w:pPr>
+        <w:pStyle w:val="a9"/>
+        <w:numPr>
+          <w:ilvl w:val="0"/>
+          <w:numId w:val="45"/>
+        </w:numPr>
+        <w:rPr>
+          <w:rFonts w:ascii="Times New Roman" w:eastAsia="宋体" w:hAnsi="Times New Roman" w:cs="Times New Roman"/>
           <w:kern w:val="0"/>
           <w14:ligatures w14:val="none"/>
         </w:rPr>
-        <w:t>开始</w:t>
-      </w:r>
-    </w:p>
-    <w:p>
-      <w:pPr>
-        <w:pStyle w:val="a9"/>
-        <w:numPr>
-          <w:ilvl w:val="0"/>
-          <w:numId w:val="45"/>
-        </w:numPr>
-        <w:rPr>
-          <w:rFonts w:ascii="Times New Roman" w:eastAsia="宋体" w:hAnsi="Times New Roman" w:cs="Times New Roman"/>
+      </w:pPr>
+      <w:r>
+        <w:rPr>
+          <w:rFonts w:ascii="Times New Roman" w:eastAsia="宋体" w:hAnsi="Times New Roman" w:cs="Times New Roman" w:hint="eastAsia"/>
           <w:kern w:val="0"/>
           <w14:ligatures w14:val="none"/>
         </w:rPr>
-      </w:pPr>
+        <w:t>修复在地图边缘放置地形时崩溃的</w:t>
+      </w:r>
       <w:r>
         <w:rPr>
           <w:rFonts w:ascii="Times New Roman" w:eastAsia="宋体" w:hAnsi="Times New Roman" w:cs="Times New Roman" w:hint="eastAsia"/>
           <w:kern w:val="0"/>
           <w14:ligatures w14:val="none"/>
         </w:rPr>
-        <w:t>修复在地图边缘放置地形时崩溃的</w:t>
-      </w:r>
-      <w:r>
-        <w:rPr>
-          <w:rFonts w:ascii="Times New Roman" w:eastAsia="宋体" w:hAnsi="Times New Roman" w:cs="Times New Roman" w:hint="eastAsia"/>
+        <w:t>bug</w:t>
+      </w:r>
+    </w:p>
+    <w:p>
+      <w:pPr>
+        <w:pStyle w:val="a9"/>
+        <w:numPr>
+          <w:ilvl w:val="0"/>
+          <w:numId w:val="45"/>
+        </w:numPr>
+        <w:rPr>
+          <w:rFonts w:ascii="Times New Roman" w:eastAsia="宋体" w:hAnsi="Times New Roman" w:cs="Times New Roman"/>
           <w:kern w:val="0"/>
           <w14:ligatures w14:val="none"/>
         </w:rPr>
-        <w:t>bug</w:t>
-      </w:r>
-    </w:p>
-    <w:p>
-      <w:pPr>
-        <w:pStyle w:val="a9"/>
-        <w:numPr>
-          <w:ilvl w:val="0"/>
-          <w:numId w:val="45"/>
-        </w:numPr>
-        <w:rPr>
-          <w:rFonts w:ascii="Times New Roman" w:eastAsia="宋体" w:hAnsi="Times New Roman" w:cs="Times New Roman"/>
+      </w:pPr>
+      <w:r>
+        <w:rPr>
+          <w:rFonts w:ascii="Times New Roman" w:eastAsia="宋体" w:hAnsi="Times New Roman" w:cs="Times New Roman" w:hint="eastAsia"/>
           <w:kern w:val="0"/>
           <w14:ligatures w14:val="none"/>
         </w:rPr>
-      </w:pPr>
-      <w:r>
-        <w:rPr>
-          <w:rFonts w:ascii="Times New Roman" w:eastAsia="宋体" w:hAnsi="Times New Roman" w:cs="Times New Roman" w:hint="eastAsia"/>
+        <w:t>新增距离工具箱，可以支持测距、设置对称点等功能</w:t>
+      </w:r>
+    </w:p>
+    <w:p>
+      <w:pPr>
+        <w:pStyle w:val="a9"/>
+        <w:numPr>
+          <w:ilvl w:val="0"/>
+          <w:numId w:val="45"/>
+        </w:numPr>
+        <w:rPr>
+          <w:rFonts w:ascii="Times New Roman" w:eastAsia="宋体" w:hAnsi="Times New Roman" w:cs="Times New Roman"/>
           <w:kern w:val="0"/>
           <w14:ligatures w14:val="none"/>
         </w:rPr>
-        <w:t>新增距离工具箱，可以支持测距、设置对称点等功能</w:t>
-      </w:r>
-    </w:p>
-    <w:p>
-      <w:pPr>
-        <w:pStyle w:val="a9"/>
-        <w:numPr>
-          <w:ilvl w:val="0"/>
-          <w:numId w:val="45"/>
-        </w:numPr>
-        <w:rPr>
-          <w:rFonts w:ascii="Times New Roman" w:eastAsia="宋体" w:hAnsi="Times New Roman" w:cs="Times New Roman"/>
+      </w:pPr>
+      <w:r>
+        <w:rPr>
+          <w:rFonts w:ascii="Times New Roman" w:eastAsia="宋体" w:hAnsi="Times New Roman" w:cs="Times New Roman" w:hint="eastAsia"/>
           <w:kern w:val="0"/>
           <w14:ligatures w14:val="none"/>
         </w:rPr>
-      </w:pPr>
+        <w:t>支持为</w:t>
+      </w:r>
       <w:r>
         <w:rPr>
           <w:rFonts w:ascii="Times New Roman" w:eastAsia="宋体" w:hAnsi="Times New Roman" w:cs="Times New Roman" w:hint="eastAsia"/>
           <w:kern w:val="0"/>
           <w14:ligatures w14:val="none"/>
         </w:rPr>
-        <w:t>支持为</w:t>
+        <w:t>BarrelAnimIsVoxel</w:t>
       </w:r>
       <w:r>
         <w:rPr>
@@ -5447,7 +5483,7 @@
           <w:kern w:val="0"/>
           <w14:ligatures w14:val="none"/>
         </w:rPr>
-        <w:t>BarrelAnimIsVoxel</w:t>
+        <w:t>=yes</w:t>
       </w:r>
       <w:r>
         <w:rPr>
@@ -5455,7 +5491,7 @@
           <w:kern w:val="0"/>
           <w14:ligatures w14:val="none"/>
         </w:rPr>
-        <w:t>=yes</w:t>
+        <w:t>且</w:t>
       </w:r>
       <w:r>
         <w:rPr>
@@ -5463,7 +5499,7 @@
           <w:kern w:val="0"/>
           <w14:ligatures w14:val="none"/>
         </w:rPr>
-        <w:t>且</w:t>
+        <w:t>TurretAnimIsVoxel=false</w:t>
       </w:r>
       <w:r>
         <w:rPr>
@@ -5471,59 +5507,59 @@
           <w:kern w:val="0"/>
           <w14:ligatures w14:val="none"/>
         </w:rPr>
-        <w:t>TurretAnimIsVoxel=false</w:t>
-      </w:r>
-      <w:r>
-        <w:rPr>
-          <w:rFonts w:ascii="Times New Roman" w:eastAsia="宋体" w:hAnsi="Times New Roman" w:cs="Times New Roman" w:hint="eastAsia"/>
+        <w:t>的建筑加载炮管</w:t>
+      </w:r>
+    </w:p>
+    <w:p>
+      <w:pPr>
+        <w:pStyle w:val="a9"/>
+        <w:numPr>
+          <w:ilvl w:val="0"/>
+          <w:numId w:val="45"/>
+        </w:numPr>
+        <w:rPr>
+          <w:rFonts w:ascii="Times New Roman" w:eastAsia="宋体" w:hAnsi="Times New Roman" w:cs="Times New Roman"/>
           <w:kern w:val="0"/>
           <w14:ligatures w14:val="none"/>
         </w:rPr>
-        <w:t>的建筑加载炮管</w:t>
-      </w:r>
-    </w:p>
-    <w:p>
-      <w:pPr>
-        <w:pStyle w:val="a9"/>
-        <w:numPr>
-          <w:ilvl w:val="0"/>
-          <w:numId w:val="45"/>
-        </w:numPr>
-        <w:rPr>
-          <w:rFonts w:ascii="Times New Roman" w:eastAsia="宋体" w:hAnsi="Times New Roman" w:cs="Times New Roman"/>
+      </w:pPr>
+      <w:r>
+        <w:rPr>
+          <w:rFonts w:ascii="Times New Roman" w:eastAsia="宋体" w:hAnsi="Times New Roman" w:cs="Times New Roman" w:hint="eastAsia"/>
           <w:kern w:val="0"/>
           <w14:ligatures w14:val="none"/>
         </w:rPr>
-      </w:pPr>
-      <w:r>
-        <w:rPr>
-          <w:rFonts w:ascii="Times New Roman" w:eastAsia="宋体" w:hAnsi="Times New Roman" w:cs="Times New Roman" w:hint="eastAsia"/>
+        <w:t>支持新版本检查，若检查到新版本会在窗口标题上显示</w:t>
+      </w:r>
+    </w:p>
+    <w:p>
+      <w:pPr>
+        <w:pStyle w:val="a9"/>
+        <w:numPr>
+          <w:ilvl w:val="0"/>
+          <w:numId w:val="45"/>
+        </w:numPr>
+        <w:rPr>
+          <w:rFonts w:ascii="Times New Roman" w:eastAsia="宋体" w:hAnsi="Times New Roman" w:cs="Times New Roman"/>
           <w:kern w:val="0"/>
           <w14:ligatures w14:val="none"/>
         </w:rPr>
-        <w:t>支持新版本检查，若检查到新版本会在窗口标题上显示</w:t>
-      </w:r>
-    </w:p>
-    <w:p>
-      <w:pPr>
-        <w:pStyle w:val="a9"/>
-        <w:numPr>
-          <w:ilvl w:val="0"/>
-          <w:numId w:val="45"/>
-        </w:numPr>
-        <w:rPr>
-          <w:rFonts w:ascii="Times New Roman" w:eastAsia="宋体" w:hAnsi="Times New Roman" w:cs="Times New Roman"/>
+      </w:pPr>
+      <w:r>
+        <w:rPr>
+          <w:rFonts w:ascii="Times New Roman" w:eastAsia="宋体" w:hAnsi="Times New Roman" w:cs="Times New Roman" w:hint="eastAsia"/>
           <w:kern w:val="0"/>
           <w14:ligatures w14:val="none"/>
         </w:rPr>
-      </w:pPr>
+        <w:t>修复</w:t>
+      </w:r>
       <w:r>
         <w:rPr>
           <w:rFonts w:ascii="Times New Roman" w:eastAsia="宋体" w:hAnsi="Times New Roman" w:cs="Times New Roman" w:hint="eastAsia"/>
           <w:kern w:val="0"/>
           <w14:ligatures w14:val="none"/>
         </w:rPr>
-        <w:t>修复</w:t>
+        <w:t>0x0</w:t>
       </w:r>
       <w:r>
         <w:rPr>
@@ -5531,7 +5567,7 @@
           <w:kern w:val="0"/>
           <w14:ligatures w14:val="none"/>
         </w:rPr>
-        <w:t>0x0</w:t>
+        <w:t>建筑的灯光、</w:t>
       </w:r>
       <w:r>
         <w:rPr>
@@ -5539,7 +5575,7 @@
           <w:kern w:val="0"/>
           <w14:ligatures w14:val="none"/>
         </w:rPr>
-        <w:t>建筑的灯光、</w:t>
+        <w:t>AlphaImage</w:t>
       </w:r>
       <w:r>
         <w:rPr>
@@ -5547,7 +5583,7 @@
           <w:kern w:val="0"/>
           <w14:ligatures w14:val="none"/>
         </w:rPr>
-        <w:t>AlphaImage</w:t>
+        <w:t>、军衔显示错位的</w:t>
       </w:r>
       <w:r>
         <w:rPr>
@@ -5555,37 +5591,37 @@
           <w:kern w:val="0"/>
           <w14:ligatures w14:val="none"/>
         </w:rPr>
-        <w:t>、军衔显示错位的</w:t>
-      </w:r>
-      <w:r>
-        <w:rPr>
-          <w:rFonts w:ascii="Times New Roman" w:eastAsia="宋体" w:hAnsi="Times New Roman" w:cs="Times New Roman" w:hint="eastAsia"/>
+        <w:t>bug</w:t>
+      </w:r>
+    </w:p>
+    <w:p>
+      <w:pPr>
+        <w:pStyle w:val="a9"/>
+        <w:numPr>
+          <w:ilvl w:val="0"/>
+          <w:numId w:val="45"/>
+        </w:numPr>
+        <w:rPr>
+          <w:rFonts w:ascii="Times New Roman" w:eastAsia="宋体" w:hAnsi="Times New Roman" w:cs="Times New Roman"/>
           <w:kern w:val="0"/>
           <w14:ligatures w14:val="none"/>
         </w:rPr>
-        <w:t>bug</w:t>
-      </w:r>
-    </w:p>
-    <w:p>
-      <w:pPr>
-        <w:pStyle w:val="a9"/>
-        <w:numPr>
-          <w:ilvl w:val="0"/>
-          <w:numId w:val="45"/>
-        </w:numPr>
-        <w:rPr>
-          <w:rFonts w:ascii="Times New Roman" w:eastAsia="宋体" w:hAnsi="Times New Roman" w:cs="Times New Roman"/>
+      </w:pPr>
+      <w:r>
+        <w:rPr>
+          <w:rFonts w:ascii="Times New Roman" w:eastAsia="宋体" w:hAnsi="Times New Roman" w:cs="Times New Roman" w:hint="eastAsia"/>
           <w:kern w:val="0"/>
           <w14:ligatures w14:val="none"/>
         </w:rPr>
-      </w:pPr>
+        <w:t>支持为触发、小队等</w:t>
+      </w:r>
       <w:r>
         <w:rPr>
           <w:rFonts w:ascii="Times New Roman" w:eastAsia="宋体" w:hAnsi="Times New Roman" w:cs="Times New Roman" w:hint="eastAsia"/>
           <w:kern w:val="0"/>
           <w14:ligatures w14:val="none"/>
         </w:rPr>
-        <w:t>支持为触发、小队等</w:t>
+        <w:t>ID</w:t>
       </w:r>
       <w:r>
         <w:rPr>
@@ -5593,7 +5629,7 @@
           <w:kern w:val="0"/>
           <w14:ligatures w14:val="none"/>
         </w:rPr>
-        <w:t>ID</w:t>
+        <w:t>分配独立的后缀，详见</w:t>
       </w:r>
       <w:r>
         <w:rPr>
@@ -5601,14 +5637,6 @@
           <w:kern w:val="0"/>
           <w14:ligatures w14:val="none"/>
         </w:rPr>
-        <w:t>分配独立的后缀，详见</w:t>
-      </w:r>
-      <w:r>
-        <w:rPr>
-          <w:rFonts w:ascii="Times New Roman" w:eastAsia="宋体" w:hAnsi="Times New Roman" w:cs="Times New Roman" w:hint="eastAsia"/>
-          <w:kern w:val="0"/>
-          <w14:ligatures w14:val="none"/>
-        </w:rPr>
         <w:t>UseSeparateIndexing</w:t>
       </w:r>
     </w:p>
@@ -6051,6 +6079,7 @@
         <w:rPr>
           <w:rFonts w:ascii="Times New Roman" w:eastAsia="宋体" w:hAnsi="Times New Roman" w:cs="Times New Roman" w:hint="eastAsia"/>
         </w:rPr>
+        <w:lastRenderedPageBreak/>
         <w:t>支持在计算特定地形组的遮挡高度时，忽略其</w:t>
       </w:r>
       <w:r>
@@ -6069,7 +6098,6 @@
         <w:rPr>
           <w:rFonts w:ascii="Times New Roman" w:eastAsia="宋体" w:hAnsi="Times New Roman" w:cs="Times New Roman" w:hint="eastAsia"/>
         </w:rPr>
-        <w:lastRenderedPageBreak/>
         <w:t>NoExtraHeightRedrawTileSets</w:t>
       </w:r>
     </w:p>
@@ -7060,7 +7088,14 @@
         <w:rPr>
           <w:rFonts w:ascii="Times New Roman" w:eastAsia="宋体" w:hAnsi="Times New Roman" w:cs="Times New Roman" w:hint="eastAsia"/>
         </w:rPr>
-        <w:t>同款），支持语法高亮</w:t>
+        <w:t>同款），支持语法</w:t>
+      </w:r>
+      <w:r>
+        <w:rPr>
+          <w:rFonts w:ascii="Times New Roman" w:eastAsia="宋体" w:hAnsi="Times New Roman" w:cs="Times New Roman" w:hint="eastAsia"/>
+        </w:rPr>
+        <w:lastRenderedPageBreak/>
+        <w:t>高亮</w:t>
       </w:r>
       <w:r>
         <w:rPr>
@@ -7084,7 +7119,6 @@
         <w:rPr>
           <w:rFonts w:ascii="Times New Roman" w:eastAsia="宋体" w:hAnsi="Times New Roman" w:cs="Times New Roman" w:hint="eastAsia"/>
         </w:rPr>
-        <w:lastRenderedPageBreak/>
         <w:t>修复触发资源重载后，自定义地形组崩溃的</w:t>
       </w:r>
       <w:r>
@@ -8143,6 +8177,7 @@
         <w:rPr>
           <w:rFonts w:ascii="Times New Roman" w:eastAsia="宋体" w:hAnsi="Times New Roman" w:cs="Times New Roman" w:hint="eastAsia"/>
         </w:rPr>
+        <w:lastRenderedPageBreak/>
         <w:t>修复缩放的</w:t>
       </w:r>
       <w:r>
@@ -8179,7 +8214,6 @@
         <w:rPr>
           <w:rFonts w:ascii="Times New Roman" w:eastAsia="宋体" w:hAnsi="Times New Roman" w:cs="Times New Roman" w:hint="eastAsia"/>
         </w:rPr>
-        <w:lastRenderedPageBreak/>
         <w:t>修复摆放地形时自动</w:t>
       </w:r>
       <w:r>
@@ -9224,6 +9258,7 @@
         <w:rPr>
           <w:rFonts w:ascii="Times New Roman" w:eastAsia="宋体" w:hAnsi="Times New Roman" w:cs="Times New Roman" w:hint="eastAsia"/>
         </w:rPr>
+        <w:lastRenderedPageBreak/>
         <w:t>修复了闸门的破损帧加载错误的</w:t>
       </w:r>
       <w:r>
@@ -9248,7 +9283,6 @@
         <w:rPr>
           <w:rFonts w:ascii="Times New Roman" w:eastAsia="宋体" w:hAnsi="Times New Roman" w:cs="Times New Roman" w:hint="eastAsia"/>
         </w:rPr>
-        <w:lastRenderedPageBreak/>
         <w:t>修复程序关闭后进程不能立即结束的</w:t>
       </w:r>
       <w:r>
@@ -10281,6 +10315,7 @@
         <w:rPr>
           <w:rFonts w:ascii="Times New Roman" w:eastAsia="宋体" w:hAnsi="Times New Roman" w:cs="Times New Roman" w:hint="eastAsia"/>
         </w:rPr>
+        <w:lastRenderedPageBreak/>
         <w:t>全局搜索的地形选项可以搜索覆盖物了</w:t>
       </w:r>
     </w:p>
@@ -10299,7 +10334,6 @@
         <w:rPr>
           <w:rFonts w:ascii="Times New Roman" w:eastAsia="宋体" w:hAnsi="Times New Roman" w:cs="Times New Roman" w:hint="eastAsia"/>
         </w:rPr>
-        <w:lastRenderedPageBreak/>
         <w:t>双击地图注释改为打开编辑框，缩放注释功能改为按住</w:t>
       </w:r>
       <w:r>
@@ -11410,6 +11444,7 @@
         <w:rPr>
           <w:rFonts w:ascii="Times New Roman" w:eastAsia="宋体" w:hAnsi="Times New Roman" w:cs="Times New Roman" w:hint="eastAsia"/>
         </w:rPr>
+        <w:lastRenderedPageBreak/>
         <w:t>修复降低地表和平坦地形在</w:t>
       </w:r>
       <w:r>
@@ -11446,7 +11481,6 @@
         <w:rPr>
           <w:rFonts w:ascii="Times New Roman" w:eastAsia="宋体" w:hAnsi="Times New Roman" w:cs="Times New Roman" w:hint="eastAsia"/>
         </w:rPr>
-        <w:lastRenderedPageBreak/>
         <w:t>修复开启“</w:t>
       </w:r>
       <w:r>
@@ -12610,6 +12644,7 @@
         <w:rPr>
           <w:rFonts w:ascii="Times New Roman" w:eastAsia="宋体" w:hAnsi="Times New Roman" w:cs="Times New Roman" w:hint="eastAsia"/>
         </w:rPr>
+        <w:lastRenderedPageBreak/>
         <w:t>优化地图注释的显示性能</w:t>
       </w:r>
     </w:p>
@@ -12628,7 +12663,6 @@
         <w:rPr>
           <w:rFonts w:ascii="Times New Roman" w:eastAsia="宋体" w:hAnsi="Times New Roman" w:cs="Times New Roman" w:hint="eastAsia"/>
         </w:rPr>
-        <w:lastRenderedPageBreak/>
         <w:t>可以根据系统设置或手动指定时间，自动设置暗色模式，详见</w:t>
       </w:r>
       <w:r>
@@ -13689,6 +13723,7 @@
         <w:rPr>
           <w:rFonts w:ascii="Times New Roman" w:eastAsia="宋体" w:hAnsi="Times New Roman" w:cs="Times New Roman" w:hint="eastAsia"/>
         </w:rPr>
+        <w:lastRenderedPageBreak/>
         <w:t>修复了</w:t>
       </w:r>
       <w:r>
@@ -13737,14 +13772,980 @@
         <w:rPr>
           <w:rFonts w:ascii="Times New Roman" w:eastAsia="宋体" w:hAnsi="Times New Roman" w:cs="Times New Roman" w:hint="eastAsia"/>
         </w:rPr>
+        <w:t>修复部分情况下绘制连接地形上升、下降段高度错误的</w:t>
+      </w:r>
+      <w:r>
+        <w:rPr>
+          <w:rFonts w:ascii="Times New Roman" w:eastAsia="宋体" w:hAnsi="Times New Roman" w:cs="Times New Roman" w:hint="eastAsia"/>
+        </w:rPr>
+        <w:t>bug</w:t>
+      </w:r>
+    </w:p>
+    <w:p>
+      <w:pPr>
+        <w:pStyle w:val="a9"/>
+        <w:numPr>
+          <w:ilvl w:val="0"/>
+          <w:numId w:val="31"/>
+        </w:numPr>
+        <w:rPr>
+          <w:rFonts w:ascii="Times New Roman" w:eastAsia="宋体" w:hAnsi="Times New Roman" w:cs="Times New Roman"/>
+        </w:rPr>
+      </w:pPr>
+      <w:r>
+        <w:rPr>
+          <w:rFonts w:ascii="Times New Roman" w:eastAsia="宋体" w:hAnsi="Times New Roman" w:cs="Times New Roman" w:hint="eastAsia"/>
+        </w:rPr>
+        <w:t>优化光照沙盒切换时的性能</w:t>
+      </w:r>
+    </w:p>
+    <w:p>
+      <w:pPr>
+        <w:pStyle w:val="a9"/>
+        <w:numPr>
+          <w:ilvl w:val="0"/>
+          <w:numId w:val="31"/>
+        </w:numPr>
+        <w:rPr>
+          <w:rFonts w:ascii="Times New Roman" w:eastAsia="宋体" w:hAnsi="Times New Roman" w:cs="Times New Roman"/>
+        </w:rPr>
+      </w:pPr>
+      <w:r>
+        <w:rPr>
+          <w:rFonts w:ascii="Times New Roman" w:eastAsia="宋体" w:hAnsi="Times New Roman" w:cs="Times New Roman" w:hint="eastAsia"/>
+        </w:rPr>
+        <w:t>新增</w:t>
+      </w:r>
+      <w:r>
+        <w:rPr>
+          <w:rFonts w:ascii="Times New Roman" w:eastAsia="宋体" w:hAnsi="Times New Roman" w:cs="Times New Roman" w:hint="eastAsia"/>
+        </w:rPr>
+        <w:t>LightingPreview</w:t>
+      </w:r>
+      <w:r>
+        <w:rPr>
+          <w:rFonts w:ascii="Times New Roman" w:eastAsia="宋体" w:hAnsi="Times New Roman" w:cs="Times New Roman" w:hint="eastAsia"/>
+        </w:rPr>
+        <w:t>.</w:t>
+      </w:r>
+      <w:r>
+        <w:rPr>
+          <w:rFonts w:ascii="Times New Roman" w:eastAsia="宋体" w:hAnsi="Times New Roman" w:cs="Times New Roman" w:hint="eastAsia"/>
+        </w:rPr>
+        <w:t>Tint</w:t>
+      </w:r>
+      <w:r>
+        <w:rPr>
+          <w:rFonts w:ascii="Times New Roman" w:eastAsia="宋体" w:hAnsi="Times New Roman" w:cs="Times New Roman" w:hint="eastAsia"/>
+        </w:rPr>
+        <w:t>TileSetBrowserView</w:t>
+      </w:r>
+      <w:r>
+        <w:rPr>
+          <w:rFonts w:ascii="Times New Roman" w:eastAsia="宋体" w:hAnsi="Times New Roman" w:cs="Times New Roman" w:hint="eastAsia"/>
+        </w:rPr>
+        <w:t>，控制是否按光照沙盒渲染地形浏览器图像</w:t>
+      </w:r>
+    </w:p>
+    <w:p>
+      <w:pPr>
+        <w:pStyle w:val="a9"/>
+        <w:numPr>
+          <w:ilvl w:val="0"/>
+          <w:numId w:val="31"/>
+        </w:numPr>
+        <w:rPr>
+          <w:rFonts w:ascii="Times New Roman" w:eastAsia="宋体" w:hAnsi="Times New Roman" w:cs="Times New Roman"/>
+        </w:rPr>
+      </w:pPr>
+      <w:r>
+        <w:rPr>
+          <w:rFonts w:ascii="Times New Roman" w:eastAsia="宋体" w:hAnsi="Times New Roman" w:cs="Times New Roman" w:hint="eastAsia"/>
+        </w:rPr>
+        <w:t>新增距离标尺，可以记录当前鼠标位置距离上次按下左键位置的距离，记录历史数量见</w:t>
+      </w:r>
+      <w:r>
+        <w:rPr>
+          <w:rFonts w:ascii="Times New Roman" w:eastAsia="宋体" w:hAnsi="Times New Roman" w:cs="Times New Roman" w:hint="eastAsia"/>
+        </w:rPr>
+        <w:t>DistanceRuler.Records</w:t>
+      </w:r>
+    </w:p>
+    <w:p>
+      <w:pPr>
+        <w:pStyle w:val="a9"/>
+        <w:numPr>
+          <w:ilvl w:val="0"/>
+          <w:numId w:val="31"/>
+        </w:numPr>
+        <w:rPr>
+          <w:rFonts w:ascii="Times New Roman" w:eastAsia="宋体" w:hAnsi="Times New Roman" w:cs="Times New Roman"/>
+        </w:rPr>
+      </w:pPr>
+      <w:r>
+        <w:rPr>
+          <w:rFonts w:ascii="Times New Roman" w:eastAsia="宋体" w:hAnsi="Times New Roman" w:cs="Times New Roman" w:hint="eastAsia"/>
+        </w:rPr>
+        <w:t>微调新建地图时可视边界数值</w:t>
+      </w:r>
+    </w:p>
+    <w:p>
+      <w:pPr>
+        <w:pStyle w:val="a9"/>
+        <w:numPr>
+          <w:ilvl w:val="0"/>
+          <w:numId w:val="31"/>
+        </w:numPr>
+        <w:rPr>
+          <w:rFonts w:ascii="Times New Roman" w:eastAsia="宋体" w:hAnsi="Times New Roman" w:cs="Times New Roman"/>
+        </w:rPr>
+      </w:pPr>
+      <w:r>
+        <w:rPr>
+          <w:rFonts w:ascii="Times New Roman" w:eastAsia="宋体" w:hAnsi="Times New Roman" w:cs="Times New Roman" w:hint="eastAsia"/>
+        </w:rPr>
+        <w:t>修复平坦地形工具无法平坦地图边缘斜坡的</w:t>
+      </w:r>
+      <w:r>
+        <w:rPr>
+          <w:rFonts w:ascii="Times New Roman" w:eastAsia="宋体" w:hAnsi="Times New Roman" w:cs="Times New Roman" w:hint="eastAsia"/>
+        </w:rPr>
+        <w:t>bug</w:t>
+      </w:r>
+    </w:p>
+    <w:p>
+      <w:pPr>
+        <w:pStyle w:val="a9"/>
+        <w:numPr>
+          <w:ilvl w:val="0"/>
+          <w:numId w:val="31"/>
+        </w:numPr>
+        <w:rPr>
+          <w:rFonts w:ascii="Times New Roman" w:eastAsia="宋体" w:hAnsi="Times New Roman" w:cs="Times New Roman"/>
+        </w:rPr>
+      </w:pPr>
+      <w:r>
+        <w:rPr>
+          <w:rFonts w:ascii="Times New Roman" w:eastAsia="宋体" w:hAnsi="Times New Roman" w:cs="Times New Roman" w:hint="eastAsia"/>
+        </w:rPr>
+        <w:t>绘制连接地形可以将鼠标移动到地图边界外，更方便靠近边界的绘制</w:t>
+      </w:r>
+    </w:p>
+    <w:p>
+      <w:pPr>
+        <w:pStyle w:val="a9"/>
+        <w:numPr>
+          <w:ilvl w:val="0"/>
+          <w:numId w:val="31"/>
+        </w:numPr>
+        <w:rPr>
+          <w:rFonts w:ascii="Times New Roman" w:eastAsia="宋体" w:hAnsi="Times New Roman" w:cs="Times New Roman"/>
+        </w:rPr>
+      </w:pPr>
+      <w:r>
+        <w:rPr>
+          <w:rFonts w:ascii="Times New Roman" w:eastAsia="宋体" w:hAnsi="Times New Roman" w:cs="Times New Roman" w:hint="eastAsia"/>
+        </w:rPr>
+        <w:t>优化</w:t>
+      </w:r>
+      <w:r>
+        <w:rPr>
+          <w:rFonts w:ascii="Times New Roman" w:eastAsia="宋体" w:hAnsi="Times New Roman" w:cs="Times New Roman" w:hint="eastAsia"/>
+        </w:rPr>
+        <w:t>IsoMapPack5</w:t>
+      </w:r>
+      <w:r>
+        <w:rPr>
+          <w:rFonts w:ascii="Times New Roman" w:eastAsia="宋体" w:hAnsi="Times New Roman" w:cs="Times New Roman" w:hint="eastAsia"/>
+        </w:rPr>
+        <w:t>压缩，减少地图体积，减少游戏内大地图地形异常的可能</w:t>
+      </w:r>
+    </w:p>
+    <w:p>
+      <w:pPr>
+        <w:pStyle w:val="a9"/>
+        <w:numPr>
+          <w:ilvl w:val="0"/>
+          <w:numId w:val="31"/>
+        </w:numPr>
+        <w:rPr>
+          <w:rFonts w:ascii="Times New Roman" w:eastAsia="宋体" w:hAnsi="Times New Roman" w:cs="Times New Roman"/>
+        </w:rPr>
+      </w:pPr>
+      <w:r>
+        <w:rPr>
+          <w:rFonts w:ascii="Times New Roman" w:eastAsia="宋体" w:hAnsi="Times New Roman" w:cs="Times New Roman" w:hint="eastAsia"/>
+        </w:rPr>
+        <w:t>修复调整地图大小后隧道位置错误的</w:t>
+      </w:r>
+      <w:r>
+        <w:rPr>
+          <w:rFonts w:ascii="Times New Roman" w:eastAsia="宋体" w:hAnsi="Times New Roman" w:cs="Times New Roman" w:hint="eastAsia"/>
+        </w:rPr>
+        <w:t>bug</w:t>
+      </w:r>
+    </w:p>
+    <w:p>
+      <w:pPr>
+        <w:pStyle w:val="a9"/>
+        <w:numPr>
+          <w:ilvl w:val="0"/>
+          <w:numId w:val="31"/>
+        </w:numPr>
+        <w:rPr>
+          <w:rFonts w:ascii="Times New Roman" w:eastAsia="宋体" w:hAnsi="Times New Roman" w:cs="Times New Roman"/>
+        </w:rPr>
+      </w:pPr>
+      <w:r>
+        <w:rPr>
+          <w:rFonts w:ascii="Times New Roman" w:eastAsia="宋体" w:hAnsi="Times New Roman" w:cs="Times New Roman" w:hint="eastAsia"/>
+        </w:rPr>
+        <w:t>修复了在开启输入法和部分情况下在地图界面按</w:t>
+      </w:r>
+      <w:r>
+        <w:rPr>
+          <w:rFonts w:ascii="Times New Roman" w:eastAsia="宋体" w:hAnsi="Times New Roman" w:cs="Times New Roman" w:hint="eastAsia"/>
+        </w:rPr>
+        <w:t>D</w:t>
+      </w:r>
+      <w:r>
+        <w:rPr>
+          <w:rFonts w:ascii="Times New Roman" w:eastAsia="宋体" w:hAnsi="Times New Roman" w:cs="Times New Roman" w:hint="eastAsia"/>
+        </w:rPr>
+        <w:t>、</w:t>
+      </w:r>
+      <w:r>
+        <w:rPr>
+          <w:rFonts w:ascii="Times New Roman" w:eastAsia="宋体" w:hAnsi="Times New Roman" w:cs="Times New Roman" w:hint="eastAsia"/>
+        </w:rPr>
+        <w:t>[</w:t>
+      </w:r>
+      <w:r>
+        <w:rPr>
+          <w:rFonts w:ascii="Times New Roman" w:eastAsia="宋体" w:hAnsi="Times New Roman" w:cs="Times New Roman" w:hint="eastAsia"/>
+        </w:rPr>
+        <w:t>、</w:t>
+      </w:r>
+      <w:r>
+        <w:rPr>
+          <w:rFonts w:ascii="Times New Roman" w:eastAsia="宋体" w:hAnsi="Times New Roman" w:cs="Times New Roman" w:hint="eastAsia"/>
+        </w:rPr>
+        <w:t>]</w:t>
+      </w:r>
+      <w:r>
+        <w:rPr>
+          <w:rFonts w:ascii="Times New Roman" w:eastAsia="宋体" w:hAnsi="Times New Roman" w:cs="Times New Roman" w:hint="eastAsia"/>
+        </w:rPr>
+        <w:t>键无效的</w:t>
+      </w:r>
+      <w:r>
+        <w:rPr>
+          <w:rFonts w:ascii="Times New Roman" w:eastAsia="宋体" w:hAnsi="Times New Roman" w:cs="Times New Roman" w:hint="eastAsia"/>
+        </w:rPr>
+        <w:t>bug</w:t>
+      </w:r>
+    </w:p>
+    <w:p>
+      <w:pPr>
+        <w:pStyle w:val="a9"/>
+        <w:numPr>
+          <w:ilvl w:val="0"/>
+          <w:numId w:val="31"/>
+        </w:numPr>
+        <w:rPr>
+          <w:rFonts w:ascii="Times New Roman" w:eastAsia="宋体" w:hAnsi="Times New Roman" w:cs="Times New Roman"/>
+        </w:rPr>
+      </w:pPr>
+      <w:r>
+        <w:rPr>
+          <w:rFonts w:ascii="Times New Roman" w:eastAsia="宋体" w:hAnsi="Times New Roman" w:cs="Times New Roman" w:hint="eastAsia"/>
+        </w:rPr>
+        <w:t>修复了新城市下使用绘制悬崖后部工具时，按</w:t>
+      </w:r>
+      <w:r>
+        <w:rPr>
+          <w:rFonts w:ascii="Times New Roman" w:eastAsia="宋体" w:hAnsi="Times New Roman" w:cs="Times New Roman" w:hint="eastAsia"/>
+        </w:rPr>
+        <w:t>A</w:t>
+      </w:r>
+      <w:r>
+        <w:rPr>
+          <w:rFonts w:ascii="Times New Roman" w:eastAsia="宋体" w:hAnsi="Times New Roman" w:cs="Times New Roman" w:hint="eastAsia"/>
+        </w:rPr>
+        <w:t>键无法切换悬崖类型的</w:t>
+      </w:r>
+      <w:r>
+        <w:rPr>
+          <w:rFonts w:ascii="Times New Roman" w:eastAsia="宋体" w:hAnsi="Times New Roman" w:cs="Times New Roman" w:hint="eastAsia"/>
+        </w:rPr>
+        <w:t>bug</w:t>
+      </w:r>
+    </w:p>
+    <w:p>
+      <w:pPr>
+        <w:pStyle w:val="a9"/>
+        <w:numPr>
+          <w:ilvl w:val="0"/>
+          <w:numId w:val="31"/>
+        </w:numPr>
+        <w:rPr>
+          <w:rFonts w:ascii="Times New Roman" w:eastAsia="宋体" w:hAnsi="Times New Roman" w:cs="Times New Roman"/>
+        </w:rPr>
+      </w:pPr>
+      <w:r>
+        <w:rPr>
+          <w:rFonts w:ascii="Times New Roman" w:eastAsia="宋体" w:hAnsi="Times New Roman" w:cs="Times New Roman" w:hint="eastAsia"/>
+        </w:rPr>
+        <w:t>增强绘制悬崖工具，可以在不同地图类型的</w:t>
+      </w:r>
+      <w:r>
+        <w:rPr>
+          <w:rFonts w:ascii="Times New Roman" w:eastAsia="宋体" w:hAnsi="Times New Roman" w:cs="Times New Roman" w:hint="eastAsia"/>
+        </w:rPr>
+        <w:t>[TheaterInfo]</w:t>
+      </w:r>
+      <w:r>
+        <w:rPr>
+          <w:rFonts w:ascii="Times New Roman" w:eastAsia="宋体" w:hAnsi="Times New Roman" w:cs="Times New Roman" w:hint="eastAsia"/>
+        </w:rPr>
+        <w:t>（如</w:t>
+      </w:r>
+      <w:r>
+        <w:rPr>
+          <w:rFonts w:ascii="Times New Roman" w:eastAsia="宋体" w:hAnsi="Times New Roman" w:cs="Times New Roman" w:hint="eastAsia"/>
+        </w:rPr>
+        <w:t>[SnowInfo]</w:t>
+      </w:r>
+      <w:r>
+        <w:rPr>
+          <w:rFonts w:ascii="Times New Roman" w:eastAsia="宋体" w:hAnsi="Times New Roman" w:cs="Times New Roman" w:hint="eastAsia"/>
+        </w:rPr>
+        <w:t>）中填写</w:t>
+      </w:r>
+      <w:r>
+        <w:rPr>
+          <w:rFonts w:ascii="Times New Roman" w:eastAsia="宋体" w:hAnsi="Times New Roman" w:cs="Times New Roman" w:hint="eastAsia"/>
+        </w:rPr>
+        <w:t>Cliffs2</w:t>
+      </w:r>
+      <w:r>
+        <w:rPr>
+          <w:rFonts w:ascii="Times New Roman" w:eastAsia="宋体" w:hAnsi="Times New Roman" w:cs="Times New Roman" w:hint="eastAsia"/>
+        </w:rPr>
+        <w:t>、</w:t>
+      </w:r>
+      <w:r>
+        <w:rPr>
+          <w:rFonts w:ascii="Times New Roman" w:eastAsia="宋体" w:hAnsi="Times New Roman" w:cs="Times New Roman" w:hint="eastAsia"/>
+        </w:rPr>
+        <w:t>CliffsWater2</w:t>
+      </w:r>
+      <w:r>
+        <w:rPr>
+          <w:rFonts w:ascii="Times New Roman" w:eastAsia="宋体" w:hAnsi="Times New Roman" w:cs="Times New Roman" w:hint="eastAsia"/>
+        </w:rPr>
+        <w:t>以支持悬崖类型切换；在存在月球悬崖时，支持绘制月球悬崖</w:t>
+      </w:r>
+    </w:p>
+    <w:p>
+      <w:pPr>
+        <w:pStyle w:val="a9"/>
+        <w:numPr>
+          <w:ilvl w:val="0"/>
+          <w:numId w:val="31"/>
+        </w:numPr>
+        <w:rPr>
+          <w:rFonts w:ascii="Times New Roman" w:eastAsia="宋体" w:hAnsi="Times New Roman" w:cs="Times New Roman"/>
+        </w:rPr>
+      </w:pPr>
+      <w:r>
+        <w:rPr>
+          <w:rFonts w:ascii="Times New Roman" w:eastAsia="宋体" w:hAnsi="Times New Roman" w:cs="Times New Roman" w:hint="eastAsia"/>
+        </w:rPr>
+        <w:t>支持</w:t>
+      </w:r>
+      <w:r>
+        <w:rPr>
+          <w:rFonts w:ascii="Times New Roman" w:eastAsia="宋体" w:hAnsi="Times New Roman" w:cs="Times New Roman" w:hint="eastAsia"/>
+        </w:rPr>
+        <w:t>32</w:t>
+      </w:r>
+      <w:r>
+        <w:rPr>
+          <w:rFonts w:ascii="Times New Roman" w:eastAsia="宋体" w:hAnsi="Times New Roman" w:cs="Times New Roman" w:hint="eastAsia"/>
+        </w:rPr>
+        <w:t>向面向</w:t>
+      </w:r>
+      <w:r>
+        <w:rPr>
+          <w:rFonts w:ascii="Times New Roman" w:eastAsia="宋体" w:hAnsi="Times New Roman" w:cs="Times New Roman" w:hint="eastAsia"/>
+        </w:rPr>
+        <w:t>与拖拽</w:t>
+      </w:r>
+      <w:r>
+        <w:rPr>
+          <w:rFonts w:ascii="Times New Roman" w:eastAsia="宋体" w:hAnsi="Times New Roman" w:cs="Times New Roman" w:hint="eastAsia"/>
+        </w:rPr>
+        <w:t>，详见</w:t>
+      </w:r>
+      <w:r>
+        <w:rPr>
+          <w:rFonts w:ascii="Times New Roman" w:eastAsia="宋体" w:hAnsi="Times New Roman" w:cs="Times New Roman" w:hint="eastAsia"/>
+        </w:rPr>
+        <w:t>ExtFacings</w:t>
+      </w:r>
+      <w:r>
+        <w:rPr>
+          <w:rFonts w:ascii="Times New Roman" w:eastAsia="宋体" w:hAnsi="Times New Roman" w:cs="Times New Roman" w:hint="eastAsia"/>
+        </w:rPr>
+        <w:t>与</w:t>
+      </w:r>
+      <w:r>
+        <w:rPr>
+          <w:rFonts w:ascii="Times New Roman" w:eastAsia="宋体" w:hAnsi="Times New Roman" w:cs="Times New Roman" w:hint="eastAsia"/>
+        </w:rPr>
+        <w:t>ExtFacings.Drag</w:t>
+      </w:r>
+    </w:p>
+    <w:p>
+      <w:pPr>
+        <w:pStyle w:val="a9"/>
+        <w:numPr>
+          <w:ilvl w:val="0"/>
+          <w:numId w:val="31"/>
+        </w:numPr>
+        <w:rPr>
+          <w:rFonts w:ascii="Times New Roman" w:eastAsia="宋体" w:hAnsi="Times New Roman" w:cs="Times New Roman"/>
+        </w:rPr>
+      </w:pPr>
+      <w:r>
+        <w:rPr>
+          <w:rFonts w:ascii="Times New Roman" w:eastAsia="宋体" w:hAnsi="Times New Roman" w:cs="Times New Roman" w:hint="eastAsia"/>
+        </w:rPr>
+        <w:t>重写部分字符串类型，优化字符串加载稳定性</w:t>
+      </w:r>
+    </w:p>
+    <w:p>
+      <w:pPr>
+        <w:pStyle w:val="a9"/>
+        <w:numPr>
+          <w:ilvl w:val="0"/>
+          <w:numId w:val="31"/>
+        </w:numPr>
+        <w:rPr>
+          <w:rFonts w:ascii="Times New Roman" w:eastAsia="宋体" w:hAnsi="Times New Roman" w:cs="Times New Roman"/>
+        </w:rPr>
+      </w:pPr>
+      <w:r>
+        <w:rPr>
+          <w:rFonts w:ascii="Times New Roman" w:eastAsia="宋体" w:hAnsi="Times New Roman" w:cs="Times New Roman" w:hint="eastAsia"/>
+        </w:rPr>
+        <w:t>优化抬升</w:t>
+      </w:r>
+      <w:r>
+        <w:rPr>
+          <w:rFonts w:ascii="Times New Roman" w:eastAsia="宋体" w:hAnsi="Times New Roman" w:cs="Times New Roman" w:hint="eastAsia"/>
+        </w:rPr>
+        <w:t>/</w:t>
+      </w:r>
+      <w:r>
+        <w:rPr>
+          <w:rFonts w:ascii="Times New Roman" w:eastAsia="宋体" w:hAnsi="Times New Roman" w:cs="Times New Roman" w:hint="eastAsia"/>
+        </w:rPr>
+        <w:t>降低地表算法，不会出现异常的大范围变动</w:t>
+      </w:r>
+    </w:p>
+    <w:p>
+      <w:pPr>
+        <w:pStyle w:val="a9"/>
+        <w:numPr>
+          <w:ilvl w:val="0"/>
+          <w:numId w:val="31"/>
+        </w:numPr>
+        <w:rPr>
+          <w:rFonts w:ascii="Times New Roman" w:eastAsia="宋体" w:hAnsi="Times New Roman" w:cs="Times New Roman"/>
+        </w:rPr>
+      </w:pPr>
+      <w:r>
+        <w:rPr>
+          <w:rFonts w:ascii="Times New Roman" w:eastAsia="宋体" w:hAnsi="Times New Roman" w:cs="Times New Roman" w:hint="eastAsia"/>
+        </w:rPr>
+        <w:t>FA2sp.log</w:t>
+      </w:r>
+      <w:r>
+        <w:rPr>
+          <w:rFonts w:ascii="Times New Roman" w:eastAsia="宋体" w:hAnsi="Times New Roman" w:cs="Times New Roman" w:hint="eastAsia"/>
+        </w:rPr>
+        <w:t>使用</w:t>
+      </w:r>
+      <w:r>
+        <w:rPr>
+          <w:rFonts w:ascii="Times New Roman" w:eastAsia="宋体" w:hAnsi="Times New Roman" w:cs="Times New Roman" w:hint="eastAsia"/>
+        </w:rPr>
+        <w:t>UTF8</w:t>
+      </w:r>
+      <w:r>
+        <w:rPr>
+          <w:rFonts w:ascii="Times New Roman" w:eastAsia="宋体" w:hAnsi="Times New Roman" w:cs="Times New Roman" w:hint="eastAsia"/>
+        </w:rPr>
+        <w:t>编码</w:t>
+      </w:r>
+    </w:p>
+    <w:p>
+      <w:pPr>
+        <w:pStyle w:val="a9"/>
+        <w:numPr>
+          <w:ilvl w:val="0"/>
+          <w:numId w:val="31"/>
+        </w:numPr>
+        <w:rPr>
+          <w:rFonts w:ascii="Times New Roman" w:eastAsia="宋体" w:hAnsi="Times New Roman" w:cs="Times New Roman"/>
+        </w:rPr>
+      </w:pPr>
+      <w:r>
+        <w:rPr>
+          <w:rFonts w:ascii="Times New Roman" w:eastAsia="宋体" w:hAnsi="Times New Roman" w:cs="Times New Roman" w:hint="eastAsia"/>
+        </w:rPr>
+        <w:t>保存地图时可以维持已有的</w:t>
+      </w:r>
+      <w:r>
+        <w:rPr>
+          <w:rFonts w:ascii="Times New Roman" w:eastAsia="宋体" w:hAnsi="Times New Roman" w:cs="Times New Roman" w:hint="eastAsia"/>
+        </w:rPr>
+        <w:t>ini</w:t>
+      </w:r>
+      <w:r>
+        <w:rPr>
+          <w:rFonts w:ascii="Times New Roman" w:eastAsia="宋体" w:hAnsi="Times New Roman" w:cs="Times New Roman" w:hint="eastAsia"/>
+        </w:rPr>
+        <w:t>小节顺序，详见</w:t>
+      </w:r>
+      <w:r>
+        <w:rPr>
+          <w:rFonts w:ascii="Times New Roman" w:eastAsia="宋体" w:hAnsi="Times New Roman" w:cs="Times New Roman" w:hint="eastAsia"/>
+        </w:rPr>
+        <w:t>SaveMap.PreserveINISorting</w:t>
+      </w:r>
+    </w:p>
+    <w:p>
+      <w:pPr>
+        <w:pStyle w:val="a9"/>
+        <w:numPr>
+          <w:ilvl w:val="0"/>
+          <w:numId w:val="31"/>
+        </w:numPr>
+        <w:rPr>
+          <w:rFonts w:ascii="Times New Roman" w:eastAsia="宋体" w:hAnsi="Times New Roman" w:cs="Times New Roman"/>
+        </w:rPr>
+      </w:pPr>
+      <w:r>
+        <w:rPr>
+          <w:rFonts w:ascii="Times New Roman" w:eastAsia="宋体" w:hAnsi="Times New Roman" w:cs="Times New Roman" w:hint="eastAsia"/>
+        </w:rPr>
+        <w:t>重写撤销重做系统，所有撤销动作均支持完整重做</w:t>
+      </w:r>
+    </w:p>
+    <w:p>
+      <w:pPr>
+        <w:pStyle w:val="a9"/>
+        <w:numPr>
+          <w:ilvl w:val="0"/>
+          <w:numId w:val="31"/>
+        </w:numPr>
+        <w:rPr>
+          <w:rFonts w:ascii="Times New Roman" w:eastAsia="宋体" w:hAnsi="Times New Roman" w:cs="Times New Roman"/>
+        </w:rPr>
+      </w:pPr>
+      <w:r>
+        <w:rPr>
+          <w:rFonts w:ascii="Times New Roman" w:eastAsia="宋体" w:hAnsi="Times New Roman" w:cs="Times New Roman" w:hint="eastAsia"/>
+        </w:rPr>
+        <w:t>撤销重做系统能够记录游戏对象的修改历史，详见</w:t>
+      </w:r>
+      <w:r>
+        <w:rPr>
+          <w:rFonts w:ascii="Times New Roman" w:eastAsia="宋体" w:hAnsi="Times New Roman" w:cs="Times New Roman" w:hint="eastAsia"/>
+        </w:rPr>
+        <w:t>UndoRedo.RecordObjects</w:t>
+      </w:r>
+    </w:p>
+    <w:p>
+      <w:pPr>
+        <w:pStyle w:val="a9"/>
+        <w:numPr>
+          <w:ilvl w:val="0"/>
+          <w:numId w:val="31"/>
+        </w:numPr>
+        <w:rPr>
+          <w:rFonts w:ascii="Times New Roman" w:eastAsia="宋体" w:hAnsi="Times New Roman" w:cs="Times New Roman"/>
+        </w:rPr>
+      </w:pPr>
+      <w:r>
+        <w:rPr>
+          <w:rFonts w:ascii="Times New Roman" w:eastAsia="宋体" w:hAnsi="Times New Roman" w:cs="Times New Roman" w:hint="eastAsia"/>
+        </w:rPr>
+        <w:t>支持设置</w:t>
+      </w:r>
+      <w:r>
+        <w:rPr>
+          <w:rFonts w:ascii="Times New Roman" w:eastAsia="宋体" w:hAnsi="Times New Roman" w:cs="Times New Roman" w:hint="eastAsia"/>
+        </w:rPr>
+        <w:t>RubblePalette</w:t>
+      </w:r>
+      <w:r>
+        <w:rPr>
+          <w:rFonts w:ascii="Times New Roman" w:eastAsia="宋体" w:hAnsi="Times New Roman" w:cs="Times New Roman" w:hint="eastAsia"/>
+        </w:rPr>
+        <w:t>=</w:t>
+      </w:r>
+      <w:r>
+        <w:rPr>
+          <w:rFonts w:ascii="Times New Roman" w:eastAsia="宋体" w:hAnsi="Times New Roman" w:cs="Times New Roman" w:hint="eastAsia"/>
+        </w:rPr>
+        <w:t>指定建筑废墟色盘</w:t>
+      </w:r>
+    </w:p>
+    <w:p>
+      <w:pPr>
+        <w:pStyle w:val="a9"/>
+        <w:numPr>
+          <w:ilvl w:val="0"/>
+          <w:numId w:val="31"/>
+        </w:numPr>
+        <w:rPr>
+          <w:rFonts w:ascii="Times New Roman" w:eastAsia="宋体" w:hAnsi="Times New Roman" w:cs="Times New Roman"/>
+        </w:rPr>
+      </w:pPr>
+      <w:r>
+        <w:rPr>
+          <w:rFonts w:ascii="Times New Roman" w:eastAsia="宋体" w:hAnsi="Times New Roman" w:cs="Times New Roman" w:hint="eastAsia"/>
+        </w:rPr>
+        <w:t>提升稳定性</w:t>
+      </w:r>
+    </w:p>
+    <w:p>
+      <w:pPr>
+        <w:pStyle w:val="a9"/>
+        <w:numPr>
+          <w:ilvl w:val="0"/>
+          <w:numId w:val="31"/>
+        </w:numPr>
+        <w:rPr>
+          <w:rFonts w:ascii="Times New Roman" w:eastAsia="宋体" w:hAnsi="Times New Roman" w:cs="Times New Roman"/>
+        </w:rPr>
+      </w:pPr>
+      <w:r>
+        <w:rPr>
+          <w:rFonts w:ascii="Times New Roman" w:eastAsia="宋体" w:hAnsi="Times New Roman" w:cs="Times New Roman" w:hint="eastAsia"/>
+        </w:rPr>
+        <w:t>优化素材图像内存占用</w:t>
+      </w:r>
+    </w:p>
+    <w:p>
+      <w:pPr>
+        <w:pStyle w:val="a9"/>
+        <w:numPr>
+          <w:ilvl w:val="0"/>
+          <w:numId w:val="31"/>
+        </w:numPr>
+        <w:rPr>
+          <w:rFonts w:ascii="Times New Roman" w:eastAsia="宋体" w:hAnsi="Times New Roman" w:cs="Times New Roman"/>
+        </w:rPr>
+      </w:pPr>
+      <w:r>
+        <w:rPr>
+          <w:rFonts w:ascii="Times New Roman" w:eastAsia="宋体" w:hAnsi="Times New Roman" w:cs="Times New Roman" w:hint="eastAsia"/>
+        </w:rPr>
+        <w:t>重写</w:t>
+      </w:r>
+      <w:r>
+        <w:rPr>
+          <w:rFonts w:ascii="Times New Roman" w:eastAsia="宋体" w:hAnsi="Times New Roman" w:cs="Times New Roman" w:hint="eastAsia"/>
+        </w:rPr>
+        <w:t>mix</w:t>
+      </w:r>
+      <w:r>
+        <w:rPr>
+          <w:rFonts w:ascii="Times New Roman" w:eastAsia="宋体" w:hAnsi="Times New Roman" w:cs="Times New Roman" w:hint="eastAsia"/>
+        </w:rPr>
+        <w:t>加载逻辑，修复加载中的内存泄漏</w:t>
+      </w:r>
+      <w:r>
+        <w:rPr>
+          <w:rFonts w:ascii="Times New Roman" w:eastAsia="宋体" w:hAnsi="Times New Roman" w:cs="Times New Roman" w:hint="eastAsia"/>
+        </w:rPr>
+        <w:t>，详见</w:t>
+      </w:r>
+      <w:r>
+        <w:rPr>
+          <w:rFonts w:ascii="Times New Roman" w:eastAsia="宋体" w:hAnsi="Times New Roman" w:cs="Times New Roman" w:hint="eastAsia"/>
+        </w:rPr>
+        <w:t>ExtMixLoader</w:t>
+      </w:r>
+    </w:p>
+    <w:p>
+      <w:pPr>
+        <w:pStyle w:val="a9"/>
+        <w:numPr>
+          <w:ilvl w:val="0"/>
+          <w:numId w:val="31"/>
+        </w:numPr>
+        <w:rPr>
+          <w:rFonts w:ascii="Times New Roman" w:eastAsia="宋体" w:hAnsi="Times New Roman" w:cs="Times New Roman"/>
+        </w:rPr>
+      </w:pPr>
+      <w:r>
+        <w:rPr>
+          <w:rFonts w:ascii="Times New Roman" w:eastAsia="宋体" w:hAnsi="Times New Roman" w:cs="Times New Roman" w:hint="eastAsia"/>
+        </w:rPr>
+        <w:t>新增</w:t>
+      </w:r>
+      <w:r>
+        <w:rPr>
+          <w:rFonts w:ascii="Times New Roman" w:eastAsia="宋体" w:hAnsi="Times New Roman" w:cs="Times New Roman" w:hint="eastAsia"/>
+        </w:rPr>
+        <w:t>DDrawScalingBilinear.OnlyShrink</w:t>
+      </w:r>
+      <w:r>
+        <w:rPr>
+          <w:rFonts w:ascii="Times New Roman" w:eastAsia="宋体" w:hAnsi="Times New Roman" w:cs="Times New Roman" w:hint="eastAsia"/>
+        </w:rPr>
+        <w:t>，支持仅在缩小时使用双线性插值，放大时硬边缘放大</w:t>
+      </w:r>
+    </w:p>
+    <w:p>
+      <w:pPr>
+        <w:pStyle w:val="a9"/>
+        <w:numPr>
+          <w:ilvl w:val="0"/>
+          <w:numId w:val="31"/>
+        </w:numPr>
+        <w:rPr>
+          <w:rFonts w:ascii="Times New Roman" w:eastAsia="宋体" w:hAnsi="Times New Roman" w:cs="Times New Roman"/>
+        </w:rPr>
+      </w:pPr>
+      <w:r>
+        <w:rPr>
+          <w:rFonts w:ascii="Times New Roman" w:eastAsia="宋体" w:hAnsi="Times New Roman" w:cs="Times New Roman" w:hint="eastAsia"/>
+        </w:rPr>
+        <w:t>优化绘图性能</w:t>
+      </w:r>
+    </w:p>
+    <w:p>
+      <w:pPr>
+        <w:pStyle w:val="a9"/>
+        <w:numPr>
+          <w:ilvl w:val="0"/>
+          <w:numId w:val="31"/>
+        </w:numPr>
+        <w:rPr>
+          <w:rFonts w:ascii="Times New Roman" w:eastAsia="宋体" w:hAnsi="Times New Roman" w:cs="Times New Roman"/>
+        </w:rPr>
+      </w:pPr>
+      <w:r>
+        <w:rPr>
+          <w:rFonts w:ascii="Times New Roman" w:eastAsia="宋体" w:hAnsi="Times New Roman" w:cs="Times New Roman" w:hint="eastAsia"/>
+        </w:rPr>
+        <w:t>重写</w:t>
+      </w:r>
+      <w:r>
+        <w:rPr>
+          <w:rFonts w:ascii="Times New Roman" w:eastAsia="宋体" w:hAnsi="Times New Roman" w:cs="Times New Roman" w:hint="eastAsia"/>
+        </w:rPr>
+        <w:t>ini</w:t>
+      </w:r>
+      <w:r>
+        <w:rPr>
+          <w:rFonts w:ascii="Times New Roman" w:eastAsia="宋体" w:hAnsi="Times New Roman" w:cs="Times New Roman" w:hint="eastAsia"/>
+        </w:rPr>
+        <w:t>加载逻辑，加载</w:t>
+      </w:r>
+      <w:r>
+        <w:rPr>
+          <w:rFonts w:ascii="Times New Roman" w:eastAsia="宋体" w:hAnsi="Times New Roman" w:cs="Times New Roman" w:hint="eastAsia"/>
+        </w:rPr>
+        <w:t>ini</w:t>
+      </w:r>
+      <w:r>
+        <w:rPr>
+          <w:rFonts w:ascii="Times New Roman" w:eastAsia="宋体" w:hAnsi="Times New Roman" w:cs="Times New Roman" w:hint="eastAsia"/>
+        </w:rPr>
+        <w:t>不会再释放至游戏目录，新建国家等操作可以即时生效</w:t>
+      </w:r>
+    </w:p>
+    <w:p>
+      <w:pPr>
+        <w:pStyle w:val="a9"/>
+        <w:numPr>
+          <w:ilvl w:val="0"/>
+          <w:numId w:val="31"/>
+        </w:numPr>
+        <w:rPr>
+          <w:rFonts w:ascii="Times New Roman" w:eastAsia="宋体" w:hAnsi="Times New Roman" w:cs="Times New Roman"/>
+        </w:rPr>
+      </w:pPr>
+      <w:r>
+        <w:rPr>
+          <w:rFonts w:ascii="Times New Roman" w:eastAsia="宋体" w:hAnsi="Times New Roman" w:cs="Times New Roman" w:hint="eastAsia"/>
+        </w:rPr>
+        <w:t>ini [#include]</w:t>
+      </w:r>
+      <w:r>
+        <w:rPr>
+          <w:rFonts w:ascii="Times New Roman" w:eastAsia="宋体" w:hAnsi="Times New Roman" w:cs="Times New Roman" w:hint="eastAsia"/>
+        </w:rPr>
+        <w:t>逻辑现遵循</w:t>
+      </w:r>
+      <w:r>
+        <w:rPr>
+          <w:rFonts w:ascii="Times New Roman" w:eastAsia="宋体" w:hAnsi="Times New Roman" w:cs="Times New Roman" w:hint="eastAsia"/>
+        </w:rPr>
+        <w:t>ares</w:t>
+      </w:r>
+      <w:r>
+        <w:rPr>
+          <w:rFonts w:ascii="Times New Roman" w:eastAsia="宋体" w:hAnsi="Times New Roman" w:cs="Times New Roman" w:hint="eastAsia"/>
+        </w:rPr>
+        <w:t>规则，为广度优先遍历而非深度优先遍历</w:t>
+      </w:r>
+    </w:p>
+    <w:p>
+      <w:pPr>
+        <w:pStyle w:val="a9"/>
+        <w:numPr>
+          <w:ilvl w:val="0"/>
+          <w:numId w:val="31"/>
+        </w:numPr>
+        <w:rPr>
+          <w:rFonts w:ascii="Times New Roman" w:eastAsia="宋体" w:hAnsi="Times New Roman" w:cs="Times New Roman"/>
+        </w:rPr>
+      </w:pPr>
+      <w:r>
+        <w:rPr>
+          <w:rFonts w:ascii="Times New Roman" w:eastAsia="宋体" w:hAnsi="Times New Roman" w:cs="Times New Roman" w:hint="eastAsia"/>
+        </w:rPr>
+        <w:t>修复了触发编辑器的参数在部分情况下没有正确刷新的</w:t>
+      </w:r>
+      <w:r>
+        <w:rPr>
+          <w:rFonts w:ascii="Times New Roman" w:eastAsia="宋体" w:hAnsi="Times New Roman" w:cs="Times New Roman" w:hint="eastAsia"/>
+        </w:rPr>
+        <w:t>bug</w:t>
+      </w:r>
+    </w:p>
+    <w:p>
+      <w:pPr>
+        <w:pStyle w:val="a9"/>
+        <w:numPr>
+          <w:ilvl w:val="0"/>
+          <w:numId w:val="31"/>
+        </w:numPr>
+        <w:rPr>
+          <w:rFonts w:ascii="Times New Roman" w:eastAsia="宋体" w:hAnsi="Times New Roman" w:cs="Times New Roman"/>
+        </w:rPr>
+      </w:pPr>
+      <w:r>
+        <w:rPr>
+          <w:rFonts w:ascii="Times New Roman" w:eastAsia="宋体" w:hAnsi="Times New Roman" w:cs="Times New Roman" w:hint="eastAsia"/>
+        </w:rPr>
+        <w:t>支持拖拽面向的实时预览，详见</w:t>
+      </w:r>
+      <w:r>
+        <w:rPr>
+          <w:rFonts w:ascii="Times New Roman" w:eastAsia="宋体" w:hAnsi="Times New Roman" w:cs="Times New Roman" w:hint="eastAsia"/>
+        </w:rPr>
+        <w:t>ExtFacings.DragPreview</w:t>
+      </w:r>
+    </w:p>
+    <w:p>
+      <w:pPr>
+        <w:pStyle w:val="a9"/>
+        <w:numPr>
+          <w:ilvl w:val="0"/>
+          <w:numId w:val="31"/>
+        </w:numPr>
+        <w:rPr>
+          <w:rFonts w:ascii="Times New Roman" w:eastAsia="宋体" w:hAnsi="Times New Roman" w:cs="Times New Roman"/>
+        </w:rPr>
+      </w:pPr>
+      <w:r>
+        <w:rPr>
+          <w:rFonts w:ascii="Times New Roman" w:eastAsia="宋体" w:hAnsi="Times New Roman" w:cs="Times New Roman" w:hint="eastAsia"/>
+        </w:rPr>
+        <w:t>支持</w:t>
+      </w:r>
+      <w:r>
+        <w:rPr>
+          <w:rFonts w:ascii="Times New Roman" w:eastAsia="宋体" w:hAnsi="Times New Roman" w:cs="Times New Roman" w:hint="eastAsia"/>
+        </w:rPr>
+        <w:t>3x3REFINERY</w:t>
+      </w:r>
+      <w:r>
+        <w:rPr>
+          <w:rFonts w:ascii="Times New Roman" w:eastAsia="宋体" w:hAnsi="Times New Roman" w:cs="Times New Roman" w:hint="eastAsia"/>
+        </w:rPr>
+        <w:t>建筑格子的正确显示</w:t>
+      </w:r>
+    </w:p>
+    <w:p>
+      <w:pPr>
+        <w:pStyle w:val="a9"/>
+        <w:numPr>
+          <w:ilvl w:val="0"/>
+          <w:numId w:val="31"/>
+        </w:numPr>
+        <w:rPr>
+          <w:rFonts w:ascii="Times New Roman" w:eastAsia="宋体" w:hAnsi="Times New Roman" w:cs="Times New Roman"/>
+        </w:rPr>
+      </w:pPr>
+      <w:r>
+        <w:rPr>
+          <w:rFonts w:ascii="Times New Roman" w:eastAsia="宋体" w:hAnsi="Times New Roman" w:cs="Times New Roman" w:hint="eastAsia"/>
+        </w:rPr>
+        <w:t>修复地形对象的</w:t>
+      </w:r>
+      <w:r>
+        <w:rPr>
+          <w:rFonts w:ascii="Times New Roman" w:eastAsia="宋体" w:hAnsi="Times New Roman" w:cs="Times New Roman" w:hint="eastAsia"/>
+        </w:rPr>
+        <w:t>AlphaImage</w:t>
+      </w:r>
+      <w:r>
+        <w:rPr>
+          <w:rFonts w:ascii="Times New Roman" w:eastAsia="宋体" w:hAnsi="Times New Roman" w:cs="Times New Roman" w:hint="eastAsia"/>
+        </w:rPr>
+        <w:t>不受图层选项控制的</w:t>
+      </w:r>
+      <w:r>
+        <w:rPr>
+          <w:rFonts w:ascii="Times New Roman" w:eastAsia="宋体" w:hAnsi="Times New Roman" w:cs="Times New Roman" w:hint="eastAsia"/>
+        </w:rPr>
+        <w:t>bug</w:t>
+      </w:r>
+      <w:r>
+        <w:rPr>
+          <w:rFonts w:ascii="Times New Roman" w:eastAsia="宋体" w:hAnsi="Times New Roman" w:cs="Times New Roman" w:hint="eastAsia"/>
+        </w:rPr>
+        <w:t>，调整</w:t>
+      </w:r>
+      <w:r>
+        <w:rPr>
+          <w:rFonts w:ascii="Times New Roman" w:eastAsia="宋体" w:hAnsi="Times New Roman" w:cs="Times New Roman" w:hint="eastAsia"/>
+        </w:rPr>
+        <w:t>AlphaImage</w:t>
+      </w:r>
+      <w:r>
+        <w:rPr>
+          <w:rFonts w:ascii="Times New Roman" w:eastAsia="宋体" w:hAnsi="Times New Roman" w:cs="Times New Roman" w:hint="eastAsia"/>
+        </w:rPr>
+        <w:t>绘制</w:t>
+      </w:r>
+      <w:r>
+        <w:rPr>
+          <w:rFonts w:ascii="Times New Roman" w:eastAsia="宋体" w:hAnsi="Times New Roman" w:cs="Times New Roman" w:hint="eastAsia"/>
+        </w:rPr>
         <w:lastRenderedPageBreak/>
-        <w:t>修复部分情况下绘制连接地形上升、下降段高度错误的</w:t>
-      </w:r>
-      <w:r>
-        <w:rPr>
-          <w:rFonts w:ascii="Times New Roman" w:eastAsia="宋体" w:hAnsi="Times New Roman" w:cs="Times New Roman" w:hint="eastAsia"/>
-        </w:rPr>
-        <w:t>bug</w:t>
+        <w:t>顺序</w:t>
       </w:r>
     </w:p>
     <w:p>
@@ -13762,967 +14763,6 @@
         <w:rPr>
           <w:rFonts w:ascii="Times New Roman" w:eastAsia="宋体" w:hAnsi="Times New Roman" w:cs="Times New Roman" w:hint="eastAsia"/>
         </w:rPr>
-        <w:t>优化光照沙盒切换时的性能</w:t>
-      </w:r>
-    </w:p>
-    <w:p>
-      <w:pPr>
-        <w:pStyle w:val="a9"/>
-        <w:numPr>
-          <w:ilvl w:val="0"/>
-          <w:numId w:val="31"/>
-        </w:numPr>
-        <w:rPr>
-          <w:rFonts w:ascii="Times New Roman" w:eastAsia="宋体" w:hAnsi="Times New Roman" w:cs="Times New Roman"/>
-        </w:rPr>
-      </w:pPr>
-      <w:r>
-        <w:rPr>
-          <w:rFonts w:ascii="Times New Roman" w:eastAsia="宋体" w:hAnsi="Times New Roman" w:cs="Times New Roman" w:hint="eastAsia"/>
-        </w:rPr>
-        <w:t>新增</w:t>
-      </w:r>
-      <w:r>
-        <w:rPr>
-          <w:rFonts w:ascii="Times New Roman" w:eastAsia="宋体" w:hAnsi="Times New Roman" w:cs="Times New Roman" w:hint="eastAsia"/>
-        </w:rPr>
-        <w:t>LightingPreview</w:t>
-      </w:r>
-      <w:r>
-        <w:rPr>
-          <w:rFonts w:ascii="Times New Roman" w:eastAsia="宋体" w:hAnsi="Times New Roman" w:cs="Times New Roman" w:hint="eastAsia"/>
-        </w:rPr>
-        <w:t>.</w:t>
-      </w:r>
-      <w:r>
-        <w:rPr>
-          <w:rFonts w:ascii="Times New Roman" w:eastAsia="宋体" w:hAnsi="Times New Roman" w:cs="Times New Roman" w:hint="eastAsia"/>
-        </w:rPr>
-        <w:t>Tint</w:t>
-      </w:r>
-      <w:r>
-        <w:rPr>
-          <w:rFonts w:ascii="Times New Roman" w:eastAsia="宋体" w:hAnsi="Times New Roman" w:cs="Times New Roman" w:hint="eastAsia"/>
-        </w:rPr>
-        <w:t>TileSetBrowserView</w:t>
-      </w:r>
-      <w:r>
-        <w:rPr>
-          <w:rFonts w:ascii="Times New Roman" w:eastAsia="宋体" w:hAnsi="Times New Roman" w:cs="Times New Roman" w:hint="eastAsia"/>
-        </w:rPr>
-        <w:t>，控制是否按光照沙盒渲染地形浏览器图像</w:t>
-      </w:r>
-    </w:p>
-    <w:p>
-      <w:pPr>
-        <w:pStyle w:val="a9"/>
-        <w:numPr>
-          <w:ilvl w:val="0"/>
-          <w:numId w:val="31"/>
-        </w:numPr>
-        <w:rPr>
-          <w:rFonts w:ascii="Times New Roman" w:eastAsia="宋体" w:hAnsi="Times New Roman" w:cs="Times New Roman"/>
-        </w:rPr>
-      </w:pPr>
-      <w:r>
-        <w:rPr>
-          <w:rFonts w:ascii="Times New Roman" w:eastAsia="宋体" w:hAnsi="Times New Roman" w:cs="Times New Roman" w:hint="eastAsia"/>
-        </w:rPr>
-        <w:t>新增距离标尺，可以记录当前鼠标位置距离上次按下左键位置的距离，记录历史数量见</w:t>
-      </w:r>
-      <w:r>
-        <w:rPr>
-          <w:rFonts w:ascii="Times New Roman" w:eastAsia="宋体" w:hAnsi="Times New Roman" w:cs="Times New Roman" w:hint="eastAsia"/>
-        </w:rPr>
-        <w:t>DistanceRuler.Records</w:t>
-      </w:r>
-    </w:p>
-    <w:p>
-      <w:pPr>
-        <w:pStyle w:val="a9"/>
-        <w:numPr>
-          <w:ilvl w:val="0"/>
-          <w:numId w:val="31"/>
-        </w:numPr>
-        <w:rPr>
-          <w:rFonts w:ascii="Times New Roman" w:eastAsia="宋体" w:hAnsi="Times New Roman" w:cs="Times New Roman"/>
-        </w:rPr>
-      </w:pPr>
-      <w:r>
-        <w:rPr>
-          <w:rFonts w:ascii="Times New Roman" w:eastAsia="宋体" w:hAnsi="Times New Roman" w:cs="Times New Roman" w:hint="eastAsia"/>
-        </w:rPr>
-        <w:t>微调新建地图时可视边界数值</w:t>
-      </w:r>
-    </w:p>
-    <w:p>
-      <w:pPr>
-        <w:pStyle w:val="a9"/>
-        <w:numPr>
-          <w:ilvl w:val="0"/>
-          <w:numId w:val="31"/>
-        </w:numPr>
-        <w:rPr>
-          <w:rFonts w:ascii="Times New Roman" w:eastAsia="宋体" w:hAnsi="Times New Roman" w:cs="Times New Roman"/>
-        </w:rPr>
-      </w:pPr>
-      <w:r>
-        <w:rPr>
-          <w:rFonts w:ascii="Times New Roman" w:eastAsia="宋体" w:hAnsi="Times New Roman" w:cs="Times New Roman" w:hint="eastAsia"/>
-        </w:rPr>
-        <w:t>修复平坦地形工具无法平坦地图边缘斜坡的</w:t>
-      </w:r>
-      <w:r>
-        <w:rPr>
-          <w:rFonts w:ascii="Times New Roman" w:eastAsia="宋体" w:hAnsi="Times New Roman" w:cs="Times New Roman" w:hint="eastAsia"/>
-        </w:rPr>
-        <w:t>bug</w:t>
-      </w:r>
-    </w:p>
-    <w:p>
-      <w:pPr>
-        <w:pStyle w:val="a9"/>
-        <w:numPr>
-          <w:ilvl w:val="0"/>
-          <w:numId w:val="31"/>
-        </w:numPr>
-        <w:rPr>
-          <w:rFonts w:ascii="Times New Roman" w:eastAsia="宋体" w:hAnsi="Times New Roman" w:cs="Times New Roman"/>
-        </w:rPr>
-      </w:pPr>
-      <w:r>
-        <w:rPr>
-          <w:rFonts w:ascii="Times New Roman" w:eastAsia="宋体" w:hAnsi="Times New Roman" w:cs="Times New Roman" w:hint="eastAsia"/>
-        </w:rPr>
-        <w:t>绘制连接地形可以将鼠标移动到地图边界外，更方便靠近边界的绘制</w:t>
-      </w:r>
-    </w:p>
-    <w:p>
-      <w:pPr>
-        <w:pStyle w:val="a9"/>
-        <w:numPr>
-          <w:ilvl w:val="0"/>
-          <w:numId w:val="31"/>
-        </w:numPr>
-        <w:rPr>
-          <w:rFonts w:ascii="Times New Roman" w:eastAsia="宋体" w:hAnsi="Times New Roman" w:cs="Times New Roman"/>
-        </w:rPr>
-      </w:pPr>
-      <w:r>
-        <w:rPr>
-          <w:rFonts w:ascii="Times New Roman" w:eastAsia="宋体" w:hAnsi="Times New Roman" w:cs="Times New Roman" w:hint="eastAsia"/>
-        </w:rPr>
-        <w:t>优化</w:t>
-      </w:r>
-      <w:r>
-        <w:rPr>
-          <w:rFonts w:ascii="Times New Roman" w:eastAsia="宋体" w:hAnsi="Times New Roman" w:cs="Times New Roman" w:hint="eastAsia"/>
-        </w:rPr>
-        <w:t>IsoMapPack5</w:t>
-      </w:r>
-      <w:r>
-        <w:rPr>
-          <w:rFonts w:ascii="Times New Roman" w:eastAsia="宋体" w:hAnsi="Times New Roman" w:cs="Times New Roman" w:hint="eastAsia"/>
-        </w:rPr>
-        <w:t>压缩，减少地图体积，减少游戏内大地图地形异常的可能</w:t>
-      </w:r>
-    </w:p>
-    <w:p>
-      <w:pPr>
-        <w:pStyle w:val="a9"/>
-        <w:numPr>
-          <w:ilvl w:val="0"/>
-          <w:numId w:val="31"/>
-        </w:numPr>
-        <w:rPr>
-          <w:rFonts w:ascii="Times New Roman" w:eastAsia="宋体" w:hAnsi="Times New Roman" w:cs="Times New Roman"/>
-        </w:rPr>
-      </w:pPr>
-      <w:r>
-        <w:rPr>
-          <w:rFonts w:ascii="Times New Roman" w:eastAsia="宋体" w:hAnsi="Times New Roman" w:cs="Times New Roman" w:hint="eastAsia"/>
-        </w:rPr>
-        <w:t>修复调整地图大小后隧道位置错误的</w:t>
-      </w:r>
-      <w:r>
-        <w:rPr>
-          <w:rFonts w:ascii="Times New Roman" w:eastAsia="宋体" w:hAnsi="Times New Roman" w:cs="Times New Roman" w:hint="eastAsia"/>
-        </w:rPr>
-        <w:t>bug</w:t>
-      </w:r>
-    </w:p>
-    <w:p>
-      <w:pPr>
-        <w:pStyle w:val="a9"/>
-        <w:numPr>
-          <w:ilvl w:val="0"/>
-          <w:numId w:val="31"/>
-        </w:numPr>
-        <w:rPr>
-          <w:rFonts w:ascii="Times New Roman" w:eastAsia="宋体" w:hAnsi="Times New Roman" w:cs="Times New Roman"/>
-        </w:rPr>
-      </w:pPr>
-      <w:r>
-        <w:rPr>
-          <w:rFonts w:ascii="Times New Roman" w:eastAsia="宋体" w:hAnsi="Times New Roman" w:cs="Times New Roman" w:hint="eastAsia"/>
-        </w:rPr>
-        <w:t>修复了在开启输入法和部分情况下在地图界面按</w:t>
-      </w:r>
-      <w:r>
-        <w:rPr>
-          <w:rFonts w:ascii="Times New Roman" w:eastAsia="宋体" w:hAnsi="Times New Roman" w:cs="Times New Roman" w:hint="eastAsia"/>
-        </w:rPr>
-        <w:t>D</w:t>
-      </w:r>
-      <w:r>
-        <w:rPr>
-          <w:rFonts w:ascii="Times New Roman" w:eastAsia="宋体" w:hAnsi="Times New Roman" w:cs="Times New Roman" w:hint="eastAsia"/>
-        </w:rPr>
-        <w:t>、</w:t>
-      </w:r>
-      <w:r>
-        <w:rPr>
-          <w:rFonts w:ascii="Times New Roman" w:eastAsia="宋体" w:hAnsi="Times New Roman" w:cs="Times New Roman" w:hint="eastAsia"/>
-        </w:rPr>
-        <w:t>[</w:t>
-      </w:r>
-      <w:r>
-        <w:rPr>
-          <w:rFonts w:ascii="Times New Roman" w:eastAsia="宋体" w:hAnsi="Times New Roman" w:cs="Times New Roman" w:hint="eastAsia"/>
-        </w:rPr>
-        <w:t>、</w:t>
-      </w:r>
-      <w:r>
-        <w:rPr>
-          <w:rFonts w:ascii="Times New Roman" w:eastAsia="宋体" w:hAnsi="Times New Roman" w:cs="Times New Roman" w:hint="eastAsia"/>
-        </w:rPr>
-        <w:t>]</w:t>
-      </w:r>
-      <w:r>
-        <w:rPr>
-          <w:rFonts w:ascii="Times New Roman" w:eastAsia="宋体" w:hAnsi="Times New Roman" w:cs="Times New Roman" w:hint="eastAsia"/>
-        </w:rPr>
-        <w:t>键无效的</w:t>
-      </w:r>
-      <w:r>
-        <w:rPr>
-          <w:rFonts w:ascii="Times New Roman" w:eastAsia="宋体" w:hAnsi="Times New Roman" w:cs="Times New Roman" w:hint="eastAsia"/>
-        </w:rPr>
-        <w:t>bug</w:t>
-      </w:r>
-    </w:p>
-    <w:p>
-      <w:pPr>
-        <w:pStyle w:val="a9"/>
-        <w:numPr>
-          <w:ilvl w:val="0"/>
-          <w:numId w:val="31"/>
-        </w:numPr>
-        <w:rPr>
-          <w:rFonts w:ascii="Times New Roman" w:eastAsia="宋体" w:hAnsi="Times New Roman" w:cs="Times New Roman"/>
-        </w:rPr>
-      </w:pPr>
-      <w:r>
-        <w:rPr>
-          <w:rFonts w:ascii="Times New Roman" w:eastAsia="宋体" w:hAnsi="Times New Roman" w:cs="Times New Roman" w:hint="eastAsia"/>
-        </w:rPr>
-        <w:t>修复了新城市下使用绘制悬崖后部工具时，按</w:t>
-      </w:r>
-      <w:r>
-        <w:rPr>
-          <w:rFonts w:ascii="Times New Roman" w:eastAsia="宋体" w:hAnsi="Times New Roman" w:cs="Times New Roman" w:hint="eastAsia"/>
-        </w:rPr>
-        <w:t>A</w:t>
-      </w:r>
-      <w:r>
-        <w:rPr>
-          <w:rFonts w:ascii="Times New Roman" w:eastAsia="宋体" w:hAnsi="Times New Roman" w:cs="Times New Roman" w:hint="eastAsia"/>
-        </w:rPr>
-        <w:t>键无法切换悬崖类型的</w:t>
-      </w:r>
-      <w:r>
-        <w:rPr>
-          <w:rFonts w:ascii="Times New Roman" w:eastAsia="宋体" w:hAnsi="Times New Roman" w:cs="Times New Roman" w:hint="eastAsia"/>
-        </w:rPr>
-        <w:t>bug</w:t>
-      </w:r>
-    </w:p>
-    <w:p>
-      <w:pPr>
-        <w:pStyle w:val="a9"/>
-        <w:numPr>
-          <w:ilvl w:val="0"/>
-          <w:numId w:val="31"/>
-        </w:numPr>
-        <w:rPr>
-          <w:rFonts w:ascii="Times New Roman" w:eastAsia="宋体" w:hAnsi="Times New Roman" w:cs="Times New Roman"/>
-        </w:rPr>
-      </w:pPr>
-      <w:r>
-        <w:rPr>
-          <w:rFonts w:ascii="Times New Roman" w:eastAsia="宋体" w:hAnsi="Times New Roman" w:cs="Times New Roman" w:hint="eastAsia"/>
-        </w:rPr>
-        <w:t>增强绘制悬崖工具，可以在不同地图类型的</w:t>
-      </w:r>
-      <w:r>
-        <w:rPr>
-          <w:rFonts w:ascii="Times New Roman" w:eastAsia="宋体" w:hAnsi="Times New Roman" w:cs="Times New Roman" w:hint="eastAsia"/>
-        </w:rPr>
-        <w:t>[TheaterInfo]</w:t>
-      </w:r>
-      <w:r>
-        <w:rPr>
-          <w:rFonts w:ascii="Times New Roman" w:eastAsia="宋体" w:hAnsi="Times New Roman" w:cs="Times New Roman" w:hint="eastAsia"/>
-        </w:rPr>
-        <w:t>（如</w:t>
-      </w:r>
-      <w:r>
-        <w:rPr>
-          <w:rFonts w:ascii="Times New Roman" w:eastAsia="宋体" w:hAnsi="Times New Roman" w:cs="Times New Roman" w:hint="eastAsia"/>
-        </w:rPr>
-        <w:t>[SnowInfo]</w:t>
-      </w:r>
-      <w:r>
-        <w:rPr>
-          <w:rFonts w:ascii="Times New Roman" w:eastAsia="宋体" w:hAnsi="Times New Roman" w:cs="Times New Roman" w:hint="eastAsia"/>
-        </w:rPr>
-        <w:t>）中填写</w:t>
-      </w:r>
-      <w:r>
-        <w:rPr>
-          <w:rFonts w:ascii="Times New Roman" w:eastAsia="宋体" w:hAnsi="Times New Roman" w:cs="Times New Roman" w:hint="eastAsia"/>
-        </w:rPr>
-        <w:t>Cliffs2</w:t>
-      </w:r>
-      <w:r>
-        <w:rPr>
-          <w:rFonts w:ascii="Times New Roman" w:eastAsia="宋体" w:hAnsi="Times New Roman" w:cs="Times New Roman" w:hint="eastAsia"/>
-        </w:rPr>
-        <w:t>、</w:t>
-      </w:r>
-      <w:r>
-        <w:rPr>
-          <w:rFonts w:ascii="Times New Roman" w:eastAsia="宋体" w:hAnsi="Times New Roman" w:cs="Times New Roman" w:hint="eastAsia"/>
-        </w:rPr>
-        <w:t>CliffsWater2</w:t>
-      </w:r>
-      <w:r>
-        <w:rPr>
-          <w:rFonts w:ascii="Times New Roman" w:eastAsia="宋体" w:hAnsi="Times New Roman" w:cs="Times New Roman" w:hint="eastAsia"/>
-        </w:rPr>
-        <w:t>以支持悬崖类型切换；在存在月球悬崖时，支持绘制月球悬崖</w:t>
-      </w:r>
-    </w:p>
-    <w:p>
-      <w:pPr>
-        <w:pStyle w:val="a9"/>
-        <w:numPr>
-          <w:ilvl w:val="0"/>
-          <w:numId w:val="31"/>
-        </w:numPr>
-        <w:rPr>
-          <w:rFonts w:ascii="Times New Roman" w:eastAsia="宋体" w:hAnsi="Times New Roman" w:cs="Times New Roman"/>
-        </w:rPr>
-      </w:pPr>
-      <w:r>
-        <w:rPr>
-          <w:rFonts w:ascii="Times New Roman" w:eastAsia="宋体" w:hAnsi="Times New Roman" w:cs="Times New Roman" w:hint="eastAsia"/>
-        </w:rPr>
-        <w:t>支持</w:t>
-      </w:r>
-      <w:r>
-        <w:rPr>
-          <w:rFonts w:ascii="Times New Roman" w:eastAsia="宋体" w:hAnsi="Times New Roman" w:cs="Times New Roman" w:hint="eastAsia"/>
-        </w:rPr>
-        <w:t>32</w:t>
-      </w:r>
-      <w:r>
-        <w:rPr>
-          <w:rFonts w:ascii="Times New Roman" w:eastAsia="宋体" w:hAnsi="Times New Roman" w:cs="Times New Roman" w:hint="eastAsia"/>
-        </w:rPr>
-        <w:t>向面向</w:t>
-      </w:r>
-      <w:r>
-        <w:rPr>
-          <w:rFonts w:ascii="Times New Roman" w:eastAsia="宋体" w:hAnsi="Times New Roman" w:cs="Times New Roman" w:hint="eastAsia"/>
-        </w:rPr>
-        <w:t>与拖拽</w:t>
-      </w:r>
-      <w:r>
-        <w:rPr>
-          <w:rFonts w:ascii="Times New Roman" w:eastAsia="宋体" w:hAnsi="Times New Roman" w:cs="Times New Roman" w:hint="eastAsia"/>
-        </w:rPr>
-        <w:t>，详见</w:t>
-      </w:r>
-      <w:r>
-        <w:rPr>
-          <w:rFonts w:ascii="Times New Roman" w:eastAsia="宋体" w:hAnsi="Times New Roman" w:cs="Times New Roman" w:hint="eastAsia"/>
-        </w:rPr>
-        <w:t>ExtFacings</w:t>
-      </w:r>
-      <w:r>
-        <w:rPr>
-          <w:rFonts w:ascii="Times New Roman" w:eastAsia="宋体" w:hAnsi="Times New Roman" w:cs="Times New Roman" w:hint="eastAsia"/>
-        </w:rPr>
-        <w:t>与</w:t>
-      </w:r>
-      <w:r>
-        <w:rPr>
-          <w:rFonts w:ascii="Times New Roman" w:eastAsia="宋体" w:hAnsi="Times New Roman" w:cs="Times New Roman" w:hint="eastAsia"/>
-        </w:rPr>
-        <w:t>ExtFacings.Drag</w:t>
-      </w:r>
-    </w:p>
-    <w:p>
-      <w:pPr>
-        <w:pStyle w:val="a9"/>
-        <w:numPr>
-          <w:ilvl w:val="0"/>
-          <w:numId w:val="31"/>
-        </w:numPr>
-        <w:rPr>
-          <w:rFonts w:ascii="Times New Roman" w:eastAsia="宋体" w:hAnsi="Times New Roman" w:cs="Times New Roman"/>
-        </w:rPr>
-      </w:pPr>
-      <w:r>
-        <w:rPr>
-          <w:rFonts w:ascii="Times New Roman" w:eastAsia="宋体" w:hAnsi="Times New Roman" w:cs="Times New Roman" w:hint="eastAsia"/>
-        </w:rPr>
-        <w:t>重写部分字符串类型，优化字符串加载稳定性</w:t>
-      </w:r>
-    </w:p>
-    <w:p>
-      <w:pPr>
-        <w:pStyle w:val="a9"/>
-        <w:numPr>
-          <w:ilvl w:val="0"/>
-          <w:numId w:val="31"/>
-        </w:numPr>
-        <w:rPr>
-          <w:rFonts w:ascii="Times New Roman" w:eastAsia="宋体" w:hAnsi="Times New Roman" w:cs="Times New Roman"/>
-        </w:rPr>
-      </w:pPr>
-      <w:r>
-        <w:rPr>
-          <w:rFonts w:ascii="Times New Roman" w:eastAsia="宋体" w:hAnsi="Times New Roman" w:cs="Times New Roman" w:hint="eastAsia"/>
-        </w:rPr>
-        <w:t>优化抬升</w:t>
-      </w:r>
-      <w:r>
-        <w:rPr>
-          <w:rFonts w:ascii="Times New Roman" w:eastAsia="宋体" w:hAnsi="Times New Roman" w:cs="Times New Roman" w:hint="eastAsia"/>
-        </w:rPr>
-        <w:t>/</w:t>
-      </w:r>
-      <w:r>
-        <w:rPr>
-          <w:rFonts w:ascii="Times New Roman" w:eastAsia="宋体" w:hAnsi="Times New Roman" w:cs="Times New Roman" w:hint="eastAsia"/>
-        </w:rPr>
-        <w:t>降低地表算法，不会出现异常的大范围变动</w:t>
-      </w:r>
-    </w:p>
-    <w:p>
-      <w:pPr>
-        <w:pStyle w:val="a9"/>
-        <w:numPr>
-          <w:ilvl w:val="0"/>
-          <w:numId w:val="31"/>
-        </w:numPr>
-        <w:rPr>
-          <w:rFonts w:ascii="Times New Roman" w:eastAsia="宋体" w:hAnsi="Times New Roman" w:cs="Times New Roman"/>
-        </w:rPr>
-      </w:pPr>
-      <w:r>
-        <w:rPr>
-          <w:rFonts w:ascii="Times New Roman" w:eastAsia="宋体" w:hAnsi="Times New Roman" w:cs="Times New Roman" w:hint="eastAsia"/>
-        </w:rPr>
-        <w:t>FA2sp.log</w:t>
-      </w:r>
-      <w:r>
-        <w:rPr>
-          <w:rFonts w:ascii="Times New Roman" w:eastAsia="宋体" w:hAnsi="Times New Roman" w:cs="Times New Roman" w:hint="eastAsia"/>
-        </w:rPr>
-        <w:t>使用</w:t>
-      </w:r>
-      <w:r>
-        <w:rPr>
-          <w:rFonts w:ascii="Times New Roman" w:eastAsia="宋体" w:hAnsi="Times New Roman" w:cs="Times New Roman" w:hint="eastAsia"/>
-        </w:rPr>
-        <w:t>UTF8</w:t>
-      </w:r>
-      <w:r>
-        <w:rPr>
-          <w:rFonts w:ascii="Times New Roman" w:eastAsia="宋体" w:hAnsi="Times New Roman" w:cs="Times New Roman" w:hint="eastAsia"/>
-        </w:rPr>
-        <w:t>编码</w:t>
-      </w:r>
-    </w:p>
-    <w:p>
-      <w:pPr>
-        <w:pStyle w:val="a9"/>
-        <w:numPr>
-          <w:ilvl w:val="0"/>
-          <w:numId w:val="31"/>
-        </w:numPr>
-        <w:rPr>
-          <w:rFonts w:ascii="Times New Roman" w:eastAsia="宋体" w:hAnsi="Times New Roman" w:cs="Times New Roman"/>
-        </w:rPr>
-      </w:pPr>
-      <w:r>
-        <w:rPr>
-          <w:rFonts w:ascii="Times New Roman" w:eastAsia="宋体" w:hAnsi="Times New Roman" w:cs="Times New Roman" w:hint="eastAsia"/>
-        </w:rPr>
-        <w:t>保存地图时可以维持已有的</w:t>
-      </w:r>
-      <w:r>
-        <w:rPr>
-          <w:rFonts w:ascii="Times New Roman" w:eastAsia="宋体" w:hAnsi="Times New Roman" w:cs="Times New Roman" w:hint="eastAsia"/>
-        </w:rPr>
-        <w:t>ini</w:t>
-      </w:r>
-      <w:r>
-        <w:rPr>
-          <w:rFonts w:ascii="Times New Roman" w:eastAsia="宋体" w:hAnsi="Times New Roman" w:cs="Times New Roman" w:hint="eastAsia"/>
-        </w:rPr>
-        <w:t>小节顺序，详见</w:t>
-      </w:r>
-      <w:r>
-        <w:rPr>
-          <w:rFonts w:ascii="Times New Roman" w:eastAsia="宋体" w:hAnsi="Times New Roman" w:cs="Times New Roman" w:hint="eastAsia"/>
-        </w:rPr>
-        <w:t>SaveMap.PreserveINISorting</w:t>
-      </w:r>
-    </w:p>
-    <w:p>
-      <w:pPr>
-        <w:pStyle w:val="a9"/>
-        <w:numPr>
-          <w:ilvl w:val="0"/>
-          <w:numId w:val="31"/>
-        </w:numPr>
-        <w:rPr>
-          <w:rFonts w:ascii="Times New Roman" w:eastAsia="宋体" w:hAnsi="Times New Roman" w:cs="Times New Roman"/>
-        </w:rPr>
-      </w:pPr>
-      <w:r>
-        <w:rPr>
-          <w:rFonts w:ascii="Times New Roman" w:eastAsia="宋体" w:hAnsi="Times New Roman" w:cs="Times New Roman" w:hint="eastAsia"/>
-        </w:rPr>
-        <w:t>重写撤销重做系统，所有撤销动作均支持完整重做</w:t>
-      </w:r>
-    </w:p>
-    <w:p>
-      <w:pPr>
-        <w:pStyle w:val="a9"/>
-        <w:numPr>
-          <w:ilvl w:val="0"/>
-          <w:numId w:val="31"/>
-        </w:numPr>
-        <w:rPr>
-          <w:rFonts w:ascii="Times New Roman" w:eastAsia="宋体" w:hAnsi="Times New Roman" w:cs="Times New Roman"/>
-        </w:rPr>
-      </w:pPr>
-      <w:r>
-        <w:rPr>
-          <w:rFonts w:ascii="Times New Roman" w:eastAsia="宋体" w:hAnsi="Times New Roman" w:cs="Times New Roman" w:hint="eastAsia"/>
-        </w:rPr>
-        <w:t>撤销重做系统能够记录游戏对象的修改历史，详见</w:t>
-      </w:r>
-      <w:r>
-        <w:rPr>
-          <w:rFonts w:ascii="Times New Roman" w:eastAsia="宋体" w:hAnsi="Times New Roman" w:cs="Times New Roman" w:hint="eastAsia"/>
-        </w:rPr>
-        <w:t>UndoRedo.RecordObjects</w:t>
-      </w:r>
-    </w:p>
-    <w:p>
-      <w:pPr>
-        <w:pStyle w:val="a9"/>
-        <w:numPr>
-          <w:ilvl w:val="0"/>
-          <w:numId w:val="31"/>
-        </w:numPr>
-        <w:rPr>
-          <w:rFonts w:ascii="Times New Roman" w:eastAsia="宋体" w:hAnsi="Times New Roman" w:cs="Times New Roman"/>
-        </w:rPr>
-      </w:pPr>
-      <w:r>
-        <w:rPr>
-          <w:rFonts w:ascii="Times New Roman" w:eastAsia="宋体" w:hAnsi="Times New Roman" w:cs="Times New Roman" w:hint="eastAsia"/>
-        </w:rPr>
-        <w:t>支持设置</w:t>
-      </w:r>
-      <w:r>
-        <w:rPr>
-          <w:rFonts w:ascii="Times New Roman" w:eastAsia="宋体" w:hAnsi="Times New Roman" w:cs="Times New Roman" w:hint="eastAsia"/>
-        </w:rPr>
-        <w:t>RubblePalette</w:t>
-      </w:r>
-      <w:r>
-        <w:rPr>
-          <w:rFonts w:ascii="Times New Roman" w:eastAsia="宋体" w:hAnsi="Times New Roman" w:cs="Times New Roman" w:hint="eastAsia"/>
-        </w:rPr>
-        <w:t>=</w:t>
-      </w:r>
-      <w:r>
-        <w:rPr>
-          <w:rFonts w:ascii="Times New Roman" w:eastAsia="宋体" w:hAnsi="Times New Roman" w:cs="Times New Roman" w:hint="eastAsia"/>
-        </w:rPr>
-        <w:t>指定建筑废墟色盘</w:t>
-      </w:r>
-    </w:p>
-    <w:p>
-      <w:pPr>
-        <w:pStyle w:val="a9"/>
-        <w:numPr>
-          <w:ilvl w:val="0"/>
-          <w:numId w:val="31"/>
-        </w:numPr>
-        <w:rPr>
-          <w:rFonts w:ascii="Times New Roman" w:eastAsia="宋体" w:hAnsi="Times New Roman" w:cs="Times New Roman"/>
-        </w:rPr>
-      </w:pPr>
-      <w:r>
-        <w:rPr>
-          <w:rFonts w:ascii="Times New Roman" w:eastAsia="宋体" w:hAnsi="Times New Roman" w:cs="Times New Roman" w:hint="eastAsia"/>
-        </w:rPr>
-        <w:t>提升稳定性</w:t>
-      </w:r>
-    </w:p>
-    <w:p>
-      <w:pPr>
-        <w:pStyle w:val="a9"/>
-        <w:numPr>
-          <w:ilvl w:val="0"/>
-          <w:numId w:val="31"/>
-        </w:numPr>
-        <w:rPr>
-          <w:rFonts w:ascii="Times New Roman" w:eastAsia="宋体" w:hAnsi="Times New Roman" w:cs="Times New Roman"/>
-        </w:rPr>
-      </w:pPr>
-      <w:r>
-        <w:rPr>
-          <w:rFonts w:ascii="Times New Roman" w:eastAsia="宋体" w:hAnsi="Times New Roman" w:cs="Times New Roman" w:hint="eastAsia"/>
-        </w:rPr>
-        <w:t>优化素材图像内存占用</w:t>
-      </w:r>
-    </w:p>
-    <w:p>
-      <w:pPr>
-        <w:pStyle w:val="a9"/>
-        <w:numPr>
-          <w:ilvl w:val="0"/>
-          <w:numId w:val="31"/>
-        </w:numPr>
-        <w:rPr>
-          <w:rFonts w:ascii="Times New Roman" w:eastAsia="宋体" w:hAnsi="Times New Roman" w:cs="Times New Roman"/>
-        </w:rPr>
-      </w:pPr>
-      <w:r>
-        <w:rPr>
-          <w:rFonts w:ascii="Times New Roman" w:eastAsia="宋体" w:hAnsi="Times New Roman" w:cs="Times New Roman" w:hint="eastAsia"/>
-        </w:rPr>
-        <w:t>重写</w:t>
-      </w:r>
-      <w:r>
-        <w:rPr>
-          <w:rFonts w:ascii="Times New Roman" w:eastAsia="宋体" w:hAnsi="Times New Roman" w:cs="Times New Roman" w:hint="eastAsia"/>
-        </w:rPr>
-        <w:t>mix</w:t>
-      </w:r>
-      <w:r>
-        <w:rPr>
-          <w:rFonts w:ascii="Times New Roman" w:eastAsia="宋体" w:hAnsi="Times New Roman" w:cs="Times New Roman" w:hint="eastAsia"/>
-        </w:rPr>
-        <w:t>加载逻辑，修复加载中的内存泄漏</w:t>
-      </w:r>
-      <w:r>
-        <w:rPr>
-          <w:rFonts w:ascii="Times New Roman" w:eastAsia="宋体" w:hAnsi="Times New Roman" w:cs="Times New Roman" w:hint="eastAsia"/>
-        </w:rPr>
-        <w:t>，详见</w:t>
-      </w:r>
-      <w:r>
-        <w:rPr>
-          <w:rFonts w:ascii="Times New Roman" w:eastAsia="宋体" w:hAnsi="Times New Roman" w:cs="Times New Roman" w:hint="eastAsia"/>
-        </w:rPr>
-        <w:t>ExtMixLoader</w:t>
-      </w:r>
-    </w:p>
-    <w:p>
-      <w:pPr>
-        <w:pStyle w:val="a9"/>
-        <w:numPr>
-          <w:ilvl w:val="0"/>
-          <w:numId w:val="31"/>
-        </w:numPr>
-        <w:rPr>
-          <w:rFonts w:ascii="Times New Roman" w:eastAsia="宋体" w:hAnsi="Times New Roman" w:cs="Times New Roman"/>
-        </w:rPr>
-      </w:pPr>
-      <w:r>
-        <w:rPr>
-          <w:rFonts w:ascii="Times New Roman" w:eastAsia="宋体" w:hAnsi="Times New Roman" w:cs="Times New Roman" w:hint="eastAsia"/>
-        </w:rPr>
-        <w:t>新增</w:t>
-      </w:r>
-      <w:r>
-        <w:rPr>
-          <w:rFonts w:ascii="Times New Roman" w:eastAsia="宋体" w:hAnsi="Times New Roman" w:cs="Times New Roman" w:hint="eastAsia"/>
-        </w:rPr>
-        <w:t>DDrawScalingBilinear.OnlyShrink</w:t>
-      </w:r>
-      <w:r>
-        <w:rPr>
-          <w:rFonts w:ascii="Times New Roman" w:eastAsia="宋体" w:hAnsi="Times New Roman" w:cs="Times New Roman" w:hint="eastAsia"/>
-        </w:rPr>
-        <w:t>，支持仅在缩小时使用双线性插值，放大时硬边缘放大</w:t>
-      </w:r>
-    </w:p>
-    <w:p>
-      <w:pPr>
-        <w:pStyle w:val="a9"/>
-        <w:numPr>
-          <w:ilvl w:val="0"/>
-          <w:numId w:val="31"/>
-        </w:numPr>
-        <w:rPr>
-          <w:rFonts w:ascii="Times New Roman" w:eastAsia="宋体" w:hAnsi="Times New Roman" w:cs="Times New Roman"/>
-        </w:rPr>
-      </w:pPr>
-      <w:r>
-        <w:rPr>
-          <w:rFonts w:ascii="Times New Roman" w:eastAsia="宋体" w:hAnsi="Times New Roman" w:cs="Times New Roman" w:hint="eastAsia"/>
-        </w:rPr>
-        <w:t>优化绘图性能</w:t>
-      </w:r>
-    </w:p>
-    <w:p>
-      <w:pPr>
-        <w:pStyle w:val="a9"/>
-        <w:numPr>
-          <w:ilvl w:val="0"/>
-          <w:numId w:val="31"/>
-        </w:numPr>
-        <w:rPr>
-          <w:rFonts w:ascii="Times New Roman" w:eastAsia="宋体" w:hAnsi="Times New Roman" w:cs="Times New Roman"/>
-        </w:rPr>
-      </w:pPr>
-      <w:r>
-        <w:rPr>
-          <w:rFonts w:ascii="Times New Roman" w:eastAsia="宋体" w:hAnsi="Times New Roman" w:cs="Times New Roman" w:hint="eastAsia"/>
-        </w:rPr>
-        <w:t>重写</w:t>
-      </w:r>
-      <w:r>
-        <w:rPr>
-          <w:rFonts w:ascii="Times New Roman" w:eastAsia="宋体" w:hAnsi="Times New Roman" w:cs="Times New Roman" w:hint="eastAsia"/>
-        </w:rPr>
-        <w:t>ini</w:t>
-      </w:r>
-      <w:r>
-        <w:rPr>
-          <w:rFonts w:ascii="Times New Roman" w:eastAsia="宋体" w:hAnsi="Times New Roman" w:cs="Times New Roman" w:hint="eastAsia"/>
-        </w:rPr>
-        <w:t>加载逻辑，加载</w:t>
-      </w:r>
-      <w:r>
-        <w:rPr>
-          <w:rFonts w:ascii="Times New Roman" w:eastAsia="宋体" w:hAnsi="Times New Roman" w:cs="Times New Roman" w:hint="eastAsia"/>
-        </w:rPr>
-        <w:t>ini</w:t>
-      </w:r>
-      <w:r>
-        <w:rPr>
-          <w:rFonts w:ascii="Times New Roman" w:eastAsia="宋体" w:hAnsi="Times New Roman" w:cs="Times New Roman" w:hint="eastAsia"/>
-        </w:rPr>
-        <w:t>不会再释放至游戏目录，新建国家等操作可以即时生效</w:t>
-      </w:r>
-    </w:p>
-    <w:p>
-      <w:pPr>
-        <w:pStyle w:val="a9"/>
-        <w:numPr>
-          <w:ilvl w:val="0"/>
-          <w:numId w:val="31"/>
-        </w:numPr>
-        <w:rPr>
-          <w:rFonts w:ascii="Times New Roman" w:eastAsia="宋体" w:hAnsi="Times New Roman" w:cs="Times New Roman"/>
-        </w:rPr>
-      </w:pPr>
-      <w:r>
-        <w:rPr>
-          <w:rFonts w:ascii="Times New Roman" w:eastAsia="宋体" w:hAnsi="Times New Roman" w:cs="Times New Roman" w:hint="eastAsia"/>
-        </w:rPr>
-        <w:t>ini [#include]</w:t>
-      </w:r>
-      <w:r>
-        <w:rPr>
-          <w:rFonts w:ascii="Times New Roman" w:eastAsia="宋体" w:hAnsi="Times New Roman" w:cs="Times New Roman" w:hint="eastAsia"/>
-        </w:rPr>
-        <w:t>逻辑现遵循</w:t>
-      </w:r>
-      <w:r>
-        <w:rPr>
-          <w:rFonts w:ascii="Times New Roman" w:eastAsia="宋体" w:hAnsi="Times New Roman" w:cs="Times New Roman" w:hint="eastAsia"/>
-        </w:rPr>
-        <w:t>ares</w:t>
-      </w:r>
-      <w:r>
-        <w:rPr>
-          <w:rFonts w:ascii="Times New Roman" w:eastAsia="宋体" w:hAnsi="Times New Roman" w:cs="Times New Roman" w:hint="eastAsia"/>
-        </w:rPr>
-        <w:t>规则，为广度优先遍历而非深度优先遍历</w:t>
-      </w:r>
-    </w:p>
-    <w:p>
-      <w:pPr>
-        <w:pStyle w:val="a9"/>
-        <w:numPr>
-          <w:ilvl w:val="0"/>
-          <w:numId w:val="31"/>
-        </w:numPr>
-        <w:rPr>
-          <w:rFonts w:ascii="Times New Roman" w:eastAsia="宋体" w:hAnsi="Times New Roman" w:cs="Times New Roman"/>
-        </w:rPr>
-      </w:pPr>
-      <w:r>
-        <w:rPr>
-          <w:rFonts w:ascii="Times New Roman" w:eastAsia="宋体" w:hAnsi="Times New Roman" w:cs="Times New Roman" w:hint="eastAsia"/>
-        </w:rPr>
-        <w:t>修复了触发编辑器的参数在部分情况下没有正确刷新的</w:t>
-      </w:r>
-      <w:r>
-        <w:rPr>
-          <w:rFonts w:ascii="Times New Roman" w:eastAsia="宋体" w:hAnsi="Times New Roman" w:cs="Times New Roman" w:hint="eastAsia"/>
-        </w:rPr>
-        <w:t>bug</w:t>
-      </w:r>
-    </w:p>
-    <w:p>
-      <w:pPr>
-        <w:pStyle w:val="a9"/>
-        <w:numPr>
-          <w:ilvl w:val="0"/>
-          <w:numId w:val="31"/>
-        </w:numPr>
-        <w:rPr>
-          <w:rFonts w:ascii="Times New Roman" w:eastAsia="宋体" w:hAnsi="Times New Roman" w:cs="Times New Roman"/>
-        </w:rPr>
-      </w:pPr>
-      <w:r>
-        <w:rPr>
-          <w:rFonts w:ascii="Times New Roman" w:eastAsia="宋体" w:hAnsi="Times New Roman" w:cs="Times New Roman" w:hint="eastAsia"/>
-        </w:rPr>
-        <w:t>支持拖拽面向的实时预览，详见</w:t>
-      </w:r>
-      <w:r>
-        <w:rPr>
-          <w:rFonts w:ascii="Times New Roman" w:eastAsia="宋体" w:hAnsi="Times New Roman" w:cs="Times New Roman" w:hint="eastAsia"/>
-        </w:rPr>
-        <w:t>ExtFacings.DragPreview</w:t>
-      </w:r>
-    </w:p>
-    <w:p>
-      <w:pPr>
-        <w:pStyle w:val="a9"/>
-        <w:numPr>
-          <w:ilvl w:val="0"/>
-          <w:numId w:val="31"/>
-        </w:numPr>
-        <w:rPr>
-          <w:rFonts w:ascii="Times New Roman" w:eastAsia="宋体" w:hAnsi="Times New Roman" w:cs="Times New Roman"/>
-        </w:rPr>
-      </w:pPr>
-      <w:r>
-        <w:rPr>
-          <w:rFonts w:ascii="Times New Roman" w:eastAsia="宋体" w:hAnsi="Times New Roman" w:cs="Times New Roman" w:hint="eastAsia"/>
-        </w:rPr>
-        <w:t>支持</w:t>
-      </w:r>
-      <w:r>
-        <w:rPr>
-          <w:rFonts w:ascii="Times New Roman" w:eastAsia="宋体" w:hAnsi="Times New Roman" w:cs="Times New Roman" w:hint="eastAsia"/>
-        </w:rPr>
-        <w:t>3x3REFINERY</w:t>
-      </w:r>
-      <w:r>
-        <w:rPr>
-          <w:rFonts w:ascii="Times New Roman" w:eastAsia="宋体" w:hAnsi="Times New Roman" w:cs="Times New Roman" w:hint="eastAsia"/>
-        </w:rPr>
-        <w:t>建筑格子的正确显示</w:t>
-      </w:r>
-    </w:p>
-    <w:p>
-      <w:pPr>
-        <w:pStyle w:val="a9"/>
-        <w:numPr>
-          <w:ilvl w:val="0"/>
-          <w:numId w:val="31"/>
-        </w:numPr>
-        <w:rPr>
-          <w:rFonts w:ascii="Times New Roman" w:eastAsia="宋体" w:hAnsi="Times New Roman" w:cs="Times New Roman"/>
-        </w:rPr>
-      </w:pPr>
-      <w:r>
-        <w:rPr>
-          <w:rFonts w:ascii="Times New Roman" w:eastAsia="宋体" w:hAnsi="Times New Roman" w:cs="Times New Roman" w:hint="eastAsia"/>
-        </w:rPr>
-        <w:t>修复地形对象的</w:t>
-      </w:r>
-      <w:r>
-        <w:rPr>
-          <w:rFonts w:ascii="Times New Roman" w:eastAsia="宋体" w:hAnsi="Times New Roman" w:cs="Times New Roman" w:hint="eastAsia"/>
-        </w:rPr>
-        <w:t>AlphaImage</w:t>
-      </w:r>
-      <w:r>
-        <w:rPr>
-          <w:rFonts w:ascii="Times New Roman" w:eastAsia="宋体" w:hAnsi="Times New Roman" w:cs="Times New Roman" w:hint="eastAsia"/>
-        </w:rPr>
-        <w:t>不受图层选项控制的</w:t>
-      </w:r>
-      <w:r>
-        <w:rPr>
-          <w:rFonts w:ascii="Times New Roman" w:eastAsia="宋体" w:hAnsi="Times New Roman" w:cs="Times New Roman" w:hint="eastAsia"/>
-        </w:rPr>
-        <w:t>bug</w:t>
-      </w:r>
-      <w:r>
-        <w:rPr>
-          <w:rFonts w:ascii="Times New Roman" w:eastAsia="宋体" w:hAnsi="Times New Roman" w:cs="Times New Roman" w:hint="eastAsia"/>
-        </w:rPr>
-        <w:t>，调整</w:t>
-      </w:r>
-      <w:r>
-        <w:rPr>
-          <w:rFonts w:ascii="Times New Roman" w:eastAsia="宋体" w:hAnsi="Times New Roman" w:cs="Times New Roman" w:hint="eastAsia"/>
-        </w:rPr>
-        <w:t>AlphaImage</w:t>
-      </w:r>
-      <w:r>
-        <w:rPr>
-          <w:rFonts w:ascii="Times New Roman" w:eastAsia="宋体" w:hAnsi="Times New Roman" w:cs="Times New Roman" w:hint="eastAsia"/>
-        </w:rPr>
-        <w:t>绘制顺序</w:t>
-      </w:r>
-    </w:p>
-    <w:p>
-      <w:pPr>
-        <w:pStyle w:val="a9"/>
-        <w:numPr>
-          <w:ilvl w:val="0"/>
-          <w:numId w:val="31"/>
-        </w:numPr>
-        <w:rPr>
-          <w:rFonts w:ascii="Times New Roman" w:eastAsia="宋体" w:hAnsi="Times New Roman" w:cs="Times New Roman"/>
-        </w:rPr>
-      </w:pPr>
-      <w:r>
-        <w:rPr>
-          <w:rFonts w:ascii="Times New Roman" w:eastAsia="宋体" w:hAnsi="Times New Roman" w:cs="Times New Roman" w:hint="eastAsia"/>
-        </w:rPr>
-        <w:lastRenderedPageBreak/>
         <w:t>修复点击全局搜索</w:t>
       </w:r>
       <w:r>
@@ -15743,6 +15783,7 @@
         <w:rPr>
           <w:rFonts w:ascii="Times New Roman" w:eastAsia="宋体" w:hAnsi="Times New Roman" w:cs="Times New Roman" w:hint="eastAsia"/>
         </w:rPr>
+        <w:lastRenderedPageBreak/>
         <w:t>新增</w:t>
       </w:r>
       <w:r>
@@ -15779,7 +15820,6 @@
         <w:rPr>
           <w:rFonts w:ascii="Times New Roman" w:eastAsia="宋体" w:hAnsi="Times New Roman" w:cs="Times New Roman" w:hint="eastAsia"/>
         </w:rPr>
-        <w:lastRenderedPageBreak/>
         <w:t>支持读取继承小节，详见</w:t>
       </w:r>
       <w:r>
@@ -41242,38 +41282,26 @@
         <w:rPr>
           <w:rFonts w:ascii="Times New Roman" w:eastAsia="宋体" w:hAnsi="Times New Roman" w:cs="Times New Roman" w:hint="eastAsia"/>
         </w:rPr>
-        <w:t>ParamDesc</w:t>
-      </w:r>
-      <w:r>
-        <w:rPr>
-          <w:rFonts w:ascii="Times New Roman" w:eastAsia="宋体" w:hAnsi="Times New Roman" w:cs="Times New Roman" w:hint="eastAsia"/>
-        </w:rPr>
-        <w:t>为参数</w:t>
+        <w:t>Action/Even</w:t>
+      </w:r>
+      <w:r>
+        <w:rPr>
+          <w:rFonts w:ascii="Times New Roman" w:eastAsia="宋体" w:hAnsi="Times New Roman" w:cs="Times New Roman" w:hint="eastAsia"/>
+        </w:rPr>
+        <w:t>t</w:t>
+      </w:r>
+      <w:r>
+        <w:rPr>
+          <w:rFonts w:ascii="Times New Roman" w:eastAsia="宋体" w:hAnsi="Times New Roman" w:cs="Times New Roman" w:hint="eastAsia"/>
+        </w:rPr>
+        <w:t>决定</w:t>
       </w:r>
       <w:r>
         <w:rPr>
           <w:rFonts w:ascii="Times New Roman" w:eastAsia="宋体" w:hAnsi="Times New Roman" w:cs="Times New Roman" w:hint="eastAsia"/>
         </w:rPr>
         <w:lastRenderedPageBreak/>
-        <w:t>在编辑器中显示的名称，</w:t>
-      </w:r>
-      <w:r>
-        <w:rPr>
-          <w:rFonts w:ascii="Times New Roman" w:eastAsia="宋体" w:hAnsi="Times New Roman" w:cs="Times New Roman" w:hint="eastAsia"/>
-        </w:rPr>
-        <w:t>Action/Even</w:t>
-      </w:r>
-      <w:r>
-        <w:rPr>
-          <w:rFonts w:ascii="Times New Roman" w:eastAsia="宋体" w:hAnsi="Times New Roman" w:cs="Times New Roman" w:hint="eastAsia"/>
-        </w:rPr>
-        <w:t>t</w:t>
-      </w:r>
-      <w:r>
-        <w:rPr>
-          <w:rFonts w:ascii="Times New Roman" w:eastAsia="宋体" w:hAnsi="Times New Roman" w:cs="Times New Roman" w:hint="eastAsia"/>
-        </w:rPr>
-        <w:t>决定该项是触发事件还是行为；</w:t>
+        <w:t>该项是触发事件还是行为；</w:t>
       </w:r>
       <w:r>
         <w:rPr>
@@ -46234,7 +46262,7 @@
         <v:path o:extrusionok="f" gradientshapeok="t" o:connecttype="rect"/>
         <o:lock v:ext="edit" aspectratio="t"/>
       </v:shapetype>
-      <v:shape id="_x0000_i1029" type="#_x0000_t75" style="width:11.55pt;height:11.55pt" o:bullet="t">
+      <v:shape id="_x0000_i1031" type="#_x0000_t75" style="width:11.55pt;height:11.55pt" o:bullet="t">
         <v:imagedata r:id="rId1" o:title="mso9A9A"/>
       </v:shape>
     </w:pict>

</xml_diff>

<commit_message>
add follow active window button
</commit_message>
<xml_diff>
--- a/Supplementary/文档/FA2SP HDM Edition说明文档.docx
+++ b/Supplementary/文档/FA2SP HDM Edition说明文档.docx
@@ -174,7 +174,7 @@
           <w:rFonts w:ascii="宋体" w:eastAsia="宋体" w:hAnsi="宋体" w:hint="eastAsia"/>
           <w:sz w:val="24"/>
         </w:rPr>
-        <w:t>6</w:t>
+        <w:t>8</w:t>
       </w:r>
     </w:p>
     <w:p>
@@ -236,7 +236,7 @@
           <w:sz w:val="28"/>
           <w:szCs w:val="32"/>
         </w:rPr>
-        <w:t>6</w:t>
+        <w:t>8</w:t>
       </w:r>
       <w:r>
         <w:rPr>
@@ -440,6 +440,36 @@
         <w:pStyle w:val="a9"/>
         <w:numPr>
           <w:ilvl w:val="0"/>
+          <w:numId w:val="11"/>
+        </w:numPr>
+        <w:rPr>
+          <w:rFonts w:ascii="Times New Roman" w:eastAsia="宋体" w:hAnsi="Times New Roman" w:cs="Times New Roman"/>
+        </w:rPr>
+      </w:pPr>
+      <w:r>
+        <w:rPr>
+          <w:rFonts w:ascii="Times New Roman" w:eastAsia="宋体" w:hAnsi="Times New Roman" w:cs="Times New Roman" w:hint="eastAsia"/>
+        </w:rPr>
+        <w:t>查找引用窗口增加</w:t>
+      </w:r>
+      <w:r>
+        <w:rPr>
+          <w:rFonts w:ascii="Times New Roman" w:eastAsia="宋体" w:hAnsi="Times New Roman" w:cs="Times New Roman" w:hint="eastAsia"/>
+        </w:rPr>
+        <w:t>跟随活动窗口</w:t>
+      </w:r>
+      <w:r>
+        <w:rPr>
+          <w:rFonts w:ascii="Times New Roman" w:eastAsia="宋体" w:hAnsi="Times New Roman" w:cs="Times New Roman" w:hint="eastAsia"/>
+        </w:rPr>
+        <w:t>选项，勾选后可以实时根据活动窗口切换内容</w:t>
+      </w:r>
+    </w:p>
+    <w:p>
+      <w:pPr>
+        <w:pStyle w:val="a9"/>
+        <w:numPr>
+          <w:ilvl w:val="0"/>
           <w:numId w:val="10"/>
         </w:numPr>
         <w:rPr>
@@ -980,6 +1010,7 @@
         <w:rPr>
           <w:rFonts w:ascii="Times New Roman" w:eastAsia="宋体" w:hAnsi="Times New Roman" w:cs="Times New Roman" w:hint="eastAsia"/>
         </w:rPr>
+        <w:lastRenderedPageBreak/>
         <w:t>查找引用窗口可以查找标签关联的对象</w:t>
       </w:r>
     </w:p>
@@ -998,7 +1029,6 @@
         <w:rPr>
           <w:rFonts w:ascii="Times New Roman" w:eastAsia="宋体" w:hAnsi="Times New Roman" w:cs="Times New Roman" w:hint="eastAsia"/>
         </w:rPr>
-        <w:lastRenderedPageBreak/>
         <w:t>添加新</w:t>
       </w:r>
       <w:r>
@@ -1971,6 +2001,7 @@
         <w:rPr>
           <w:rFonts w:ascii="Times New Roman" w:eastAsia="宋体" w:hAnsi="Times New Roman" w:cs="Times New Roman" w:hint="eastAsia"/>
         </w:rPr>
+        <w:lastRenderedPageBreak/>
         <w:t>可以按住</w:t>
       </w:r>
       <w:r>
@@ -2001,7 +2032,6 @@
         <w:rPr>
           <w:rFonts w:ascii="Times New Roman" w:eastAsia="宋体" w:hAnsi="Times New Roman" w:cs="Times New Roman" w:hint="eastAsia"/>
         </w:rPr>
-        <w:lastRenderedPageBreak/>
         <w:t>平坦地形、抬升地形等工具会显示笔刷范围</w:t>
       </w:r>
     </w:p>
@@ -2889,6 +2919,7 @@
         <w:rPr>
           <w:rFonts w:ascii="Times New Roman" w:eastAsia="宋体" w:hAnsi="Times New Roman" w:cs="Times New Roman" w:hint="eastAsia"/>
         </w:rPr>
+        <w:lastRenderedPageBreak/>
         <w:t>优化</w:t>
       </w:r>
       <w:r>
@@ -2931,7 +2962,6 @@
         <w:rPr>
           <w:rFonts w:ascii="Times New Roman" w:eastAsia="宋体" w:hAnsi="Times New Roman" w:cs="Times New Roman" w:hint="eastAsia"/>
         </w:rPr>
-        <w:lastRenderedPageBreak/>
         <w:t>修复当地图存在超出有效索引的单元格时，加载地图时可能崩溃的</w:t>
       </w:r>
       <w:r>
@@ -3816,7 +3846,14 @@
         <w:rPr>
           <w:rFonts w:ascii="Times New Roman" w:eastAsia="宋体" w:hAnsi="Times New Roman" w:cs="Times New Roman" w:hint="eastAsia"/>
         </w:rPr>
-        <w:t>类型的覆盖物上生成</w:t>
+        <w:t>类型的</w:t>
+      </w:r>
+      <w:r>
+        <w:rPr>
+          <w:rFonts w:ascii="Times New Roman" w:eastAsia="宋体" w:hAnsi="Times New Roman" w:cs="Times New Roman" w:hint="eastAsia"/>
+        </w:rPr>
+        <w:lastRenderedPageBreak/>
+        <w:t>覆盖物上生成</w:t>
       </w:r>
     </w:p>
     <w:p>
@@ -3834,7 +3871,6 @@
         <w:rPr>
           <w:rFonts w:ascii="Times New Roman" w:eastAsia="宋体" w:hAnsi="Times New Roman" w:cs="Times New Roman" w:hint="eastAsia"/>
         </w:rPr>
-        <w:lastRenderedPageBreak/>
         <w:t>地形生成器新增“忽视地表类型”选项，勾选后不会对任何地表类型进行避让</w:t>
       </w:r>
     </w:p>
@@ -4870,6 +4906,7 @@
         <w:rPr>
           <w:rFonts w:ascii="Times New Roman" w:eastAsia="宋体" w:hAnsi="Times New Roman" w:cs="Times New Roman" w:hint="eastAsia"/>
         </w:rPr>
+        <w:lastRenderedPageBreak/>
         <w:t>-&gt;</w:t>
       </w:r>
       <w:r>
@@ -4894,7 +4931,6 @@
         <w:rPr>
           <w:rFonts w:ascii="Times New Roman" w:eastAsia="宋体" w:hAnsi="Times New Roman" w:cs="Times New Roman" w:hint="eastAsia"/>
         </w:rPr>
-        <w:lastRenderedPageBreak/>
         <w:t>使用地形浏览器放置覆盖物时，不会进行任何额外计算，所见即所得</w:t>
       </w:r>
     </w:p>
@@ -6119,7 +6155,14 @@
         <w:rPr>
           <w:rFonts w:ascii="Times New Roman" w:eastAsia="宋体" w:hAnsi="Times New Roman" w:cs="Times New Roman" w:hint="eastAsia"/>
         </w:rPr>
-        <w:t>支持将地图文件关联至启动器，直接打开地图；支持将地图拖拽至启动器打开，详见</w:t>
+        <w:t>支持将地图文件关联至启动器，直接打开地图；支持将地图拖拽至启动器打</w:t>
+      </w:r>
+      <w:r>
+        <w:rPr>
+          <w:rFonts w:ascii="Times New Roman" w:eastAsia="宋体" w:hAnsi="Times New Roman" w:cs="Times New Roman" w:hint="eastAsia"/>
+        </w:rPr>
+        <w:lastRenderedPageBreak/>
+        <w:t>开，详见</w:t>
       </w:r>
       <w:r>
         <w:rPr>
@@ -6143,7 +6186,6 @@
         <w:rPr>
           <w:rFonts w:ascii="Times New Roman" w:eastAsia="宋体" w:hAnsi="Times New Roman" w:cs="Times New Roman" w:hint="eastAsia"/>
         </w:rPr>
-        <w:lastRenderedPageBreak/>
         <w:t>修复重新加载资源后自定义军衔消失的</w:t>
       </w:r>
       <w:r>
@@ -7152,6 +7194,7 @@
         <w:rPr>
           <w:rFonts w:ascii="Times New Roman" w:eastAsia="宋体" w:hAnsi="Times New Roman" w:cs="Times New Roman" w:hint="eastAsia"/>
         </w:rPr>
+        <w:lastRenderedPageBreak/>
         <w:t>支持直接向建筑上放置加载物</w:t>
       </w:r>
       <w:r>
@@ -7182,7 +7225,6 @@
         <w:rPr>
           <w:rFonts w:ascii="Times New Roman" w:eastAsia="宋体" w:hAnsi="Times New Roman" w:cs="Times New Roman" w:hint="eastAsia"/>
         </w:rPr>
-        <w:lastRenderedPageBreak/>
         <w:t>触发编辑器支持</w:t>
       </w:r>
       <w:r>
@@ -8137,6 +8179,7 @@
         <w:rPr>
           <w:rFonts w:ascii="Times New Roman" w:eastAsia="宋体" w:hAnsi="Times New Roman" w:cs="Times New Roman" w:hint="eastAsia"/>
         </w:rPr>
+        <w:lastRenderedPageBreak/>
         <w:t>支持</w:t>
       </w:r>
       <w:r>
@@ -8185,7 +8228,6 @@
         <w:rPr>
           <w:rFonts w:ascii="Times New Roman" w:eastAsia="宋体" w:hAnsi="Times New Roman" w:cs="Times New Roman" w:hint="eastAsia"/>
         </w:rPr>
-        <w:lastRenderedPageBreak/>
         <w:t>绝大部分填写色盘的</w:t>
       </w:r>
       <w:r>
@@ -9264,6 +9306,7 @@
         <w:rPr>
           <w:rFonts w:ascii="Times New Roman" w:eastAsia="宋体" w:hAnsi="Times New Roman" w:cs="Times New Roman" w:hint="eastAsia"/>
         </w:rPr>
+        <w:lastRenderedPageBreak/>
         <w:t>优化绘图效率，特别是在</w:t>
       </w:r>
       <w:r>
@@ -9294,7 +9337,6 @@
         <w:rPr>
           <w:rFonts w:ascii="Times New Roman" w:eastAsia="宋体" w:hAnsi="Times New Roman" w:cs="Times New Roman" w:hint="eastAsia"/>
         </w:rPr>
-        <w:lastRenderedPageBreak/>
         <w:t>地形生成器新增斜坡功能</w:t>
       </w:r>
     </w:p>
@@ -10337,6 +10379,7 @@
         <w:rPr>
           <w:rFonts w:ascii="Times New Roman" w:eastAsia="宋体" w:hAnsi="Times New Roman" w:cs="Times New Roman" w:hint="eastAsia"/>
         </w:rPr>
+        <w:lastRenderedPageBreak/>
         <w:t>支持</w:t>
       </w:r>
       <w:r>
@@ -10367,7 +10410,6 @@
         <w:rPr>
           <w:rFonts w:ascii="Times New Roman" w:eastAsia="宋体" w:hAnsi="Times New Roman" w:cs="Times New Roman" w:hint="eastAsia"/>
         </w:rPr>
-        <w:lastRenderedPageBreak/>
         <w:t>修复了当单位注册名以数字结尾时，可能与其他单位图像冲突的</w:t>
       </w:r>
       <w:r>
@@ -11412,6 +11454,7 @@
         <w:rPr>
           <w:rFonts w:ascii="Times New Roman" w:eastAsia="宋体" w:hAnsi="Times New Roman" w:cs="Times New Roman" w:hint="eastAsia"/>
         </w:rPr>
+        <w:lastRenderedPageBreak/>
         <w:t>修复部分情况下摆放车辆</w:t>
       </w:r>
       <w:r>
@@ -11448,7 +11491,6 @@
         <w:rPr>
           <w:rFonts w:ascii="Times New Roman" w:eastAsia="宋体" w:hAnsi="Times New Roman" w:cs="Times New Roman" w:hint="eastAsia"/>
         </w:rPr>
-        <w:lastRenderedPageBreak/>
         <w:t>修复超大建筑物在部分视角下不能正确渲染的</w:t>
       </w:r>
       <w:r>
@@ -12576,6 +12618,7 @@
         <w:rPr>
           <w:rFonts w:ascii="Times New Roman" w:eastAsia="宋体" w:hAnsi="Times New Roman" w:cs="Times New Roman" w:hint="eastAsia"/>
         </w:rPr>
+        <w:lastRenderedPageBreak/>
         <w:t>修复了建筑</w:t>
       </w:r>
       <w:r>
@@ -12612,7 +12655,6 @@
         <w:rPr>
           <w:rFonts w:ascii="Times New Roman" w:eastAsia="宋体" w:hAnsi="Times New Roman" w:cs="Times New Roman" w:hint="eastAsia"/>
         </w:rPr>
-        <w:lastRenderedPageBreak/>
         <w:t>多人地图建立路径点会跳过</w:t>
       </w:r>
       <w:r>
@@ -13693,6 +13735,7 @@
         <w:rPr>
           <w:rFonts w:ascii="Times New Roman" w:eastAsia="宋体" w:hAnsi="Times New Roman" w:cs="Times New Roman" w:hint="eastAsia"/>
         </w:rPr>
+        <w:lastRenderedPageBreak/>
         <w:t>地图注释窗口的颜色设置可以调用颜色选择器，不再需要手动输入</w:t>
       </w:r>
     </w:p>
@@ -13711,7 +13754,6 @@
         <w:rPr>
           <w:rFonts w:ascii="Times New Roman" w:eastAsia="宋体" w:hAnsi="Times New Roman" w:cs="Times New Roman" w:hint="eastAsia"/>
         </w:rPr>
-        <w:lastRenderedPageBreak/>
         <w:t>优化建筑动画的图层顺序</w:t>
       </w:r>
     </w:p>
@@ -14802,6 +14844,7 @@
         <w:rPr>
           <w:rFonts w:ascii="Times New Roman" w:eastAsia="宋体" w:hAnsi="Times New Roman" w:cs="Times New Roman" w:hint="eastAsia"/>
         </w:rPr>
+        <w:lastRenderedPageBreak/>
         <w:t>新增</w:t>
       </w:r>
       <w:r>
@@ -14814,14 +14857,7 @@
         <w:rPr>
           <w:rFonts w:ascii="Times New Roman" w:eastAsia="宋体" w:hAnsi="Times New Roman" w:cs="Times New Roman" w:hint="eastAsia"/>
         </w:rPr>
-        <w:t>，支持仅在缩小时使用双线性插值，放</w:t>
-      </w:r>
-      <w:r>
-        <w:rPr>
-          <w:rFonts w:ascii="Times New Roman" w:eastAsia="宋体" w:hAnsi="Times New Roman" w:cs="Times New Roman" w:hint="eastAsia"/>
-        </w:rPr>
-        <w:lastRenderedPageBreak/>
-        <w:t>大时硬边缘放大</w:t>
+        <w:t>，支持仅在缩小时使用双线性插值，放大时硬边缘放大</w:t>
       </w:r>
     </w:p>
     <w:p>
@@ -15847,6 +15883,7 @@
         <w:rPr>
           <w:rFonts w:ascii="Times New Roman" w:eastAsia="宋体" w:hAnsi="Times New Roman" w:cs="Times New Roman" w:hint="eastAsia"/>
         </w:rPr>
+        <w:lastRenderedPageBreak/>
         <w:t>支持按“</w:t>
       </w:r>
       <w:r>
@@ -15889,7 +15926,6 @@
         <w:rPr>
           <w:rFonts w:ascii="Times New Roman" w:eastAsia="宋体" w:hAnsi="Times New Roman" w:cs="Times New Roman" w:hint="eastAsia"/>
         </w:rPr>
-        <w:lastRenderedPageBreak/>
         <w:t>修复单位不存在精英武器时，属性查看无法显示精英单位射程的</w:t>
       </w:r>
       <w:r>
@@ -16948,6 +16984,7 @@
         <w:rPr>
           <w:rFonts w:ascii="Times New Roman" w:eastAsia="宋体" w:hAnsi="Times New Roman" w:cs="Times New Roman" w:hint="eastAsia"/>
         </w:rPr>
+        <w:lastRenderedPageBreak/>
         <w:t>修复地图注释不能双击折叠的</w:t>
       </w:r>
       <w:r>
@@ -16972,7 +17009,6 @@
         <w:rPr>
           <w:rFonts w:ascii="Times New Roman" w:eastAsia="宋体" w:hAnsi="Times New Roman" w:cs="Times New Roman" w:hint="eastAsia"/>
         </w:rPr>
-        <w:lastRenderedPageBreak/>
         <w:t>将地图检查器窗口居中</w:t>
       </w:r>
     </w:p>
@@ -46641,7 +46677,7 @@
         <v:path o:extrusionok="f" gradientshapeok="t" o:connecttype="rect"/>
         <o:lock v:ext="edit" aspectratio="t"/>
       </v:shapetype>
-      <v:shape id="_x0000_i1032" type="#_x0000_t75" style="width:11.4pt;height:11.4pt" o:bullet="t">
+      <v:shape id="_x0000_i1029" type="#_x0000_t75" style="width:11.4pt;height:11.4pt" o:bullet="t">
         <v:imagedata r:id="rId1" o:title="mso9A9A"/>
       </v:shape>
     </w:pict>

</xml_diff>

<commit_message>
fix subcell bug in tag attachment
</commit_message>
<xml_diff>
--- a/Supplementary/文档/FA2SP HDM Edition说明文档.docx
+++ b/Supplementary/文档/FA2SP HDM Edition说明文档.docx
@@ -174,7 +174,7 @@
           <w:rFonts w:ascii="宋体" w:eastAsia="宋体" w:hAnsi="宋体" w:hint="eastAsia"/>
           <w:sz w:val="24"/>
         </w:rPr>
-        <w:t>2</w:t>
+        <w:t>5</w:t>
       </w:r>
     </w:p>
     <w:p>
@@ -246,7 +246,7 @@
           <w:sz w:val="28"/>
           <w:szCs w:val="32"/>
         </w:rPr>
-        <w:t>2</w:t>
+        <w:t>5</w:t>
       </w:r>
       <w:r>
         <w:rPr>
@@ -798,6 +798,30 @@
         <w:pStyle w:val="a9"/>
         <w:numPr>
           <w:ilvl w:val="0"/>
+          <w:numId w:val="11"/>
+        </w:numPr>
+        <w:rPr>
+          <w:rFonts w:ascii="Times New Roman" w:eastAsia="宋体" w:hAnsi="Times New Roman" w:cs="Times New Roman"/>
+        </w:rPr>
+      </w:pPr>
+      <w:r>
+        <w:rPr>
+          <w:rFonts w:ascii="Times New Roman" w:eastAsia="宋体" w:hAnsi="Times New Roman" w:cs="Times New Roman" w:hint="eastAsia"/>
+        </w:rPr>
+        <w:t>修复使用触发编辑器拖拽小点为步兵关联标签时，已关联标记没有依据步兵子单元格显示的</w:t>
+      </w:r>
+      <w:r>
+        <w:rPr>
+          <w:rFonts w:ascii="Times New Roman" w:eastAsia="宋体" w:hAnsi="Times New Roman" w:cs="Times New Roman" w:hint="eastAsia"/>
+        </w:rPr>
+        <w:t>bug</w:t>
+      </w:r>
+    </w:p>
+    <w:p>
+      <w:pPr>
+        <w:pStyle w:val="a9"/>
+        <w:numPr>
+          <w:ilvl w:val="0"/>
           <w:numId w:val="10"/>
         </w:numPr>
         <w:rPr>
@@ -960,7 +984,14 @@
         <w:rPr>
           <w:rFonts w:ascii="Times New Roman" w:eastAsia="宋体" w:hAnsi="Times New Roman" w:cs="Times New Roman" w:hint="eastAsia"/>
         </w:rPr>
-        <w:t>修复开启显示地图边界外游戏对象、使用绘制连接地形等时，鼠标无法移动到地图</w:t>
+        <w:t>修复开启显示地图边界外游戏对象、使用绘制连接地形等时，鼠标无法移动到</w:t>
+      </w:r>
+      <w:r>
+        <w:rPr>
+          <w:rFonts w:ascii="Times New Roman" w:eastAsia="宋体" w:hAnsi="Times New Roman" w:cs="Times New Roman" w:hint="eastAsia"/>
+        </w:rPr>
+        <w:lastRenderedPageBreak/>
+        <w:t>地图</w:t>
       </w:r>
       <w:r>
         <w:rPr>
@@ -1032,7 +1063,6 @@
         <w:rPr>
           <w:rFonts w:ascii="Times New Roman" w:eastAsia="宋体" w:hAnsi="Times New Roman" w:cs="Times New Roman" w:hint="eastAsia"/>
         </w:rPr>
-        <w:lastRenderedPageBreak/>
         <w:t>允许在多人地图中强制设置</w:t>
       </w:r>
       <w:r>
@@ -2053,6 +2083,7 @@
         <w:rPr>
           <w:rFonts w:ascii="Times New Roman" w:eastAsia="宋体" w:hAnsi="Times New Roman" w:cs="Times New Roman" w:hint="eastAsia"/>
         </w:rPr>
+        <w:lastRenderedPageBreak/>
         <w:t>PlaceTileSkipHide</w:t>
       </w:r>
     </w:p>
@@ -2107,7 +2138,6 @@
         <w:rPr>
           <w:rFonts w:ascii="Times New Roman" w:eastAsia="宋体" w:hAnsi="Times New Roman" w:cs="Times New Roman" w:hint="eastAsia"/>
         </w:rPr>
-        <w:lastRenderedPageBreak/>
         <w:t>支持切换是否更精确地计算深度关系，详见</w:t>
       </w:r>
       <w:r>
@@ -2935,6 +2965,7 @@
         <w:rPr>
           <w:rFonts w:ascii="Times New Roman" w:eastAsia="宋体" w:hAnsi="Times New Roman" w:cs="Times New Roman" w:hint="eastAsia"/>
         </w:rPr>
+        <w:lastRenderedPageBreak/>
         <w:t>优化单位渲染顺序，优化了较大单位被地形遮挡的问题</w:t>
       </w:r>
     </w:p>
@@ -2989,7 +3020,6 @@
         <w:rPr>
           <w:rFonts w:ascii="Times New Roman" w:eastAsia="宋体" w:hAnsi="Times New Roman" w:cs="Times New Roman" w:hint="eastAsia"/>
         </w:rPr>
-        <w:lastRenderedPageBreak/>
         <w:t>可以正确显示驻军建筑的动画</w:t>
       </w:r>
     </w:p>
@@ -3880,6 +3910,7 @@
         <w:rPr>
           <w:rFonts w:ascii="Times New Roman" w:eastAsia="宋体" w:hAnsi="Times New Roman" w:cs="Times New Roman" w:hint="eastAsia"/>
         </w:rPr>
+        <w:lastRenderedPageBreak/>
         <w:t>距离工具箱支持放置圆形</w:t>
       </w:r>
       <w:r>
@@ -3916,7 +3947,6 @@
         <w:rPr>
           <w:rFonts w:ascii="Times New Roman" w:eastAsia="宋体" w:hAnsi="Times New Roman" w:cs="Times New Roman" w:hint="eastAsia"/>
         </w:rPr>
-        <w:lastRenderedPageBreak/>
         <w:t>优化更改地图大小工具的效率</w:t>
       </w:r>
     </w:p>
@@ -4820,6 +4850,7 @@
         <w:rPr>
           <w:rFonts w:ascii="Times New Roman" w:eastAsia="宋体" w:hAnsi="Times New Roman" w:cs="Times New Roman" w:hint="eastAsia"/>
         </w:rPr>
+        <w:lastRenderedPageBreak/>
         <w:t>支持以数字显示不可见的桥梁覆盖物，详见</w:t>
       </w:r>
       <w:r>
@@ -4868,7 +4899,6 @@
         <w:rPr>
           <w:rFonts w:ascii="Times New Roman" w:eastAsia="宋体" w:hAnsi="Times New Roman" w:cs="Times New Roman" w:hint="eastAsia"/>
         </w:rPr>
-        <w:lastRenderedPageBreak/>
         <w:t>新增禁止自动连接围墙选项，可以在摆放和擦除围墙时不自动修改连接</w:t>
       </w:r>
     </w:p>
@@ -6001,6 +6031,7 @@
           <w:kern w:val="0"/>
           <w14:ligatures w14:val="none"/>
         </w:rPr>
+        <w:lastRenderedPageBreak/>
         <w:t>显著提升了加载物品浏览器图标的效率</w:t>
       </w:r>
     </w:p>
@@ -6045,7 +6076,6 @@
           <w:kern w:val="0"/>
           <w14:ligatures w14:val="none"/>
         </w:rPr>
-        <w:lastRenderedPageBreak/>
         <w:t>脚本编辑器的脚本序号从</w:t>
       </w:r>
       <w:r>
@@ -7116,6 +7146,7 @@
           <w:sz w:val="28"/>
           <w:szCs w:val="32"/>
         </w:rPr>
+        <w:lastRenderedPageBreak/>
         <w:t>1.3.5 (2026.0</w:t>
       </w:r>
       <w:r>
@@ -7174,907 +7205,907 @@
         <w:rPr>
           <w:rFonts w:ascii="Times New Roman" w:eastAsia="宋体" w:hAnsi="Times New Roman" w:cs="Times New Roman" w:hint="eastAsia"/>
         </w:rPr>
+        <w:t>修复自定义面积建筑的渲染遮挡问题</w:t>
+      </w:r>
+    </w:p>
+    <w:p>
+      <w:pPr>
+        <w:pStyle w:val="a9"/>
+        <w:numPr>
+          <w:ilvl w:val="0"/>
+          <w:numId w:val="43"/>
+        </w:numPr>
+        <w:rPr>
+          <w:rFonts w:ascii="Times New Roman" w:eastAsia="宋体" w:hAnsi="Times New Roman" w:cs="Times New Roman"/>
+        </w:rPr>
+      </w:pPr>
+      <w:r>
+        <w:rPr>
+          <w:rFonts w:ascii="Times New Roman" w:eastAsia="宋体" w:hAnsi="Times New Roman" w:cs="Times New Roman" w:hint="eastAsia"/>
+        </w:rPr>
+        <w:t>修复删除地图</w:t>
+      </w:r>
+      <w:r>
+        <w:rPr>
+          <w:rFonts w:ascii="Times New Roman" w:eastAsia="宋体" w:hAnsi="Times New Roman" w:cs="Times New Roman" w:hint="eastAsia"/>
+        </w:rPr>
+        <w:t>include</w:t>
+      </w:r>
+      <w:r>
+        <w:rPr>
+          <w:rFonts w:ascii="Times New Roman" w:eastAsia="宋体" w:hAnsi="Times New Roman" w:cs="Times New Roman" w:hint="eastAsia"/>
+        </w:rPr>
+        <w:t>小节后不能正确保存部分</w:t>
+      </w:r>
+      <w:r>
+        <w:rPr>
+          <w:rFonts w:ascii="Times New Roman" w:eastAsia="宋体" w:hAnsi="Times New Roman" w:cs="Times New Roman" w:hint="eastAsia"/>
+        </w:rPr>
+        <w:t>ini</w:t>
+      </w:r>
+      <w:r>
+        <w:rPr>
+          <w:rFonts w:ascii="Times New Roman" w:eastAsia="宋体" w:hAnsi="Times New Roman" w:cs="Times New Roman" w:hint="eastAsia"/>
+        </w:rPr>
+        <w:t>小节的</w:t>
+      </w:r>
+      <w:r>
+        <w:rPr>
+          <w:rFonts w:ascii="Times New Roman" w:eastAsia="宋体" w:hAnsi="Times New Roman" w:cs="Times New Roman" w:hint="eastAsia"/>
+        </w:rPr>
+        <w:t>bug</w:t>
+      </w:r>
+      <w:r>
+        <w:rPr>
+          <w:rFonts w:ascii="Times New Roman" w:eastAsia="宋体" w:hAnsi="Times New Roman" w:cs="Times New Roman" w:hint="eastAsia"/>
+        </w:rPr>
+        <w:t>。</w:t>
+      </w:r>
+      <w:r>
+        <w:rPr>
+          <w:rFonts w:ascii="Times New Roman" w:eastAsia="宋体" w:hAnsi="Times New Roman" w:cs="Times New Roman" w:hint="eastAsia"/>
+        </w:rPr>
+        <w:t>注意，地图</w:t>
+      </w:r>
+      <w:r>
+        <w:rPr>
+          <w:rFonts w:ascii="Times New Roman" w:eastAsia="宋体" w:hAnsi="Times New Roman" w:cs="Times New Roman" w:hint="eastAsia"/>
+        </w:rPr>
+        <w:t>include</w:t>
+      </w:r>
+      <w:r>
+        <w:rPr>
+          <w:rFonts w:ascii="Times New Roman" w:eastAsia="宋体" w:hAnsi="Times New Roman" w:cs="Times New Roman" w:hint="eastAsia"/>
+        </w:rPr>
+        <w:t>支持仍属于实验性功能，不建议使用</w:t>
+      </w:r>
+      <w:r>
+        <w:rPr>
+          <w:rFonts w:ascii="Times New Roman" w:eastAsia="宋体" w:hAnsi="Times New Roman" w:cs="Times New Roman" w:hint="eastAsia"/>
+        </w:rPr>
+        <w:t>；由于技术限制，保存时并不能固定已有的</w:t>
+      </w:r>
+      <w:r>
+        <w:rPr>
+          <w:rFonts w:ascii="Times New Roman" w:eastAsia="宋体" w:hAnsi="Times New Roman" w:cs="Times New Roman" w:hint="eastAsia"/>
+        </w:rPr>
+        <w:t>include</w:t>
+      </w:r>
+      <w:r>
+        <w:rPr>
+          <w:rFonts w:ascii="Times New Roman" w:eastAsia="宋体" w:hAnsi="Times New Roman" w:cs="Times New Roman" w:hint="eastAsia"/>
+        </w:rPr>
+        <w:t>顺序</w:t>
+      </w:r>
+    </w:p>
+    <w:p>
+      <w:pPr>
+        <w:pStyle w:val="a9"/>
+        <w:numPr>
+          <w:ilvl w:val="0"/>
+          <w:numId w:val="43"/>
+        </w:numPr>
+        <w:rPr>
+          <w:rFonts w:ascii="Times New Roman" w:eastAsia="宋体" w:hAnsi="Times New Roman" w:cs="Times New Roman"/>
+        </w:rPr>
+      </w:pPr>
+      <w:r>
+        <w:rPr>
+          <w:rFonts w:ascii="Times New Roman" w:eastAsia="宋体" w:hAnsi="Times New Roman" w:cs="Times New Roman" w:hint="eastAsia"/>
+        </w:rPr>
+        <w:t>小队变更时会即时刷新触发编辑器对应菜单</w:t>
+      </w:r>
+    </w:p>
+    <w:p>
+      <w:pPr>
+        <w:pStyle w:val="a9"/>
+        <w:numPr>
+          <w:ilvl w:val="0"/>
+          <w:numId w:val="43"/>
+        </w:numPr>
+        <w:rPr>
+          <w:rFonts w:ascii="Times New Roman" w:eastAsia="宋体" w:hAnsi="Times New Roman" w:cs="Times New Roman"/>
+        </w:rPr>
+      </w:pPr>
+      <w:r>
+        <w:rPr>
+          <w:rFonts w:ascii="Times New Roman" w:eastAsia="宋体" w:hAnsi="Times New Roman" w:cs="Times New Roman" w:hint="eastAsia"/>
+        </w:rPr>
+        <w:t>新增选项</w:t>
+      </w:r>
+      <w:r>
+        <w:rPr>
+          <w:rFonts w:ascii="Times New Roman" w:eastAsia="宋体" w:hAnsi="Times New Roman" w:cs="Times New Roman" w:hint="eastAsia"/>
+        </w:rPr>
+        <w:t>SaveMap.KeepComments</w:t>
+      </w:r>
+      <w:r>
+        <w:rPr>
+          <w:rFonts w:ascii="Times New Roman" w:eastAsia="宋体" w:hAnsi="Times New Roman" w:cs="Times New Roman" w:hint="eastAsia"/>
+        </w:rPr>
+        <w:t>，在保存地图时可以保留注释</w:t>
+      </w:r>
+      <w:r>
+        <w:rPr>
+          <w:rFonts w:ascii="Times New Roman" w:eastAsia="宋体" w:hAnsi="Times New Roman" w:cs="Times New Roman" w:hint="eastAsia"/>
+        </w:rPr>
+        <w:t>，</w:t>
+      </w:r>
+      <w:r>
+        <w:rPr>
+          <w:rFonts w:ascii="Times New Roman" w:eastAsia="宋体" w:hAnsi="Times New Roman" w:cs="Times New Roman" w:hint="eastAsia"/>
+        </w:rPr>
+        <w:t>ini</w:t>
+      </w:r>
+      <w:r>
+        <w:rPr>
+          <w:rFonts w:ascii="Times New Roman" w:eastAsia="宋体" w:hAnsi="Times New Roman" w:cs="Times New Roman" w:hint="eastAsia"/>
+        </w:rPr>
+        <w:t>编辑器中可以保留并显示注释</w:t>
+      </w:r>
+    </w:p>
+    <w:p>
+      <w:pPr>
+        <w:pStyle w:val="a9"/>
+        <w:numPr>
+          <w:ilvl w:val="0"/>
+          <w:numId w:val="43"/>
+        </w:numPr>
+        <w:rPr>
+          <w:rFonts w:ascii="Times New Roman" w:eastAsia="宋体" w:hAnsi="Times New Roman" w:cs="Times New Roman"/>
+        </w:rPr>
+      </w:pPr>
+      <w:r>
+        <w:rPr>
+          <w:rFonts w:ascii="Times New Roman" w:eastAsia="宋体" w:hAnsi="Times New Roman" w:cs="Times New Roman" w:hint="eastAsia"/>
+        </w:rPr>
+        <w:t>在触发编辑器中为无标签的重复类型添加说明文本</w:t>
+      </w:r>
+    </w:p>
+    <w:p>
+      <w:pPr>
+        <w:pStyle w:val="a9"/>
+        <w:numPr>
+          <w:ilvl w:val="0"/>
+          <w:numId w:val="43"/>
+        </w:numPr>
+        <w:rPr>
+          <w:rFonts w:ascii="Times New Roman" w:eastAsia="宋体" w:hAnsi="Times New Roman" w:cs="Times New Roman"/>
+        </w:rPr>
+      </w:pPr>
+      <w:r>
+        <w:rPr>
+          <w:rFonts w:ascii="Times New Roman" w:eastAsia="宋体" w:hAnsi="Times New Roman" w:cs="Times New Roman" w:hint="eastAsia"/>
+        </w:rPr>
+        <w:t>新增加载</w:t>
+      </w:r>
+      <w:r>
+        <w:rPr>
+          <w:rFonts w:ascii="Times New Roman" w:eastAsia="宋体" w:hAnsi="Times New Roman" w:cs="Times New Roman" w:hint="eastAsia"/>
+        </w:rPr>
+        <w:t>/</w:t>
+      </w:r>
+      <w:r>
+        <w:rPr>
+          <w:rFonts w:ascii="Times New Roman" w:eastAsia="宋体" w:hAnsi="Times New Roman" w:cs="Times New Roman" w:hint="eastAsia"/>
+        </w:rPr>
+        <w:t>保存文件的</w:t>
+      </w:r>
+      <w:r>
+        <w:rPr>
+          <w:rFonts w:ascii="Times New Roman" w:eastAsia="宋体" w:hAnsi="Times New Roman" w:cs="Times New Roman" w:hint="eastAsia"/>
+        </w:rPr>
+        <w:t>lua</w:t>
+      </w:r>
+      <w:r>
+        <w:rPr>
+          <w:rFonts w:ascii="Times New Roman" w:eastAsia="宋体" w:hAnsi="Times New Roman" w:cs="Times New Roman" w:hint="eastAsia"/>
+        </w:rPr>
+        <w:t>脚本函数</w:t>
+      </w:r>
+    </w:p>
+    <w:p>
+      <w:pPr>
+        <w:pStyle w:val="a9"/>
+        <w:numPr>
+          <w:ilvl w:val="0"/>
+          <w:numId w:val="43"/>
+        </w:numPr>
+        <w:rPr>
+          <w:rFonts w:ascii="Times New Roman" w:eastAsia="宋体" w:hAnsi="Times New Roman" w:cs="Times New Roman"/>
+        </w:rPr>
+      </w:pPr>
+      <w:r>
+        <w:rPr>
+          <w:rFonts w:ascii="Times New Roman" w:eastAsia="宋体" w:hAnsi="Times New Roman" w:cs="Times New Roman" w:hint="eastAsia"/>
+        </w:rPr>
+        <w:t>修复部分</w:t>
+      </w:r>
+      <w:r>
+        <w:rPr>
+          <w:rFonts w:ascii="Times New Roman" w:eastAsia="宋体" w:hAnsi="Times New Roman" w:cs="Times New Roman" w:hint="eastAsia"/>
+        </w:rPr>
+        <w:t>lua</w:t>
+      </w:r>
+      <w:r>
+        <w:rPr>
+          <w:rFonts w:ascii="Times New Roman" w:eastAsia="宋体" w:hAnsi="Times New Roman" w:cs="Times New Roman" w:hint="eastAsia"/>
+        </w:rPr>
+        <w:t>脚本的</w:t>
+      </w:r>
+      <w:r>
+        <w:rPr>
+          <w:rFonts w:ascii="Times New Roman" w:eastAsia="宋体" w:hAnsi="Times New Roman" w:cs="Times New Roman" w:hint="eastAsia"/>
+        </w:rPr>
+        <w:t>bug</w:t>
+      </w:r>
+    </w:p>
+    <w:p>
+      <w:pPr>
+        <w:pStyle w:val="a9"/>
+        <w:numPr>
+          <w:ilvl w:val="0"/>
+          <w:numId w:val="43"/>
+        </w:numPr>
+        <w:rPr>
+          <w:rFonts w:ascii="Times New Roman" w:eastAsia="宋体" w:hAnsi="Times New Roman" w:cs="Times New Roman"/>
+        </w:rPr>
+      </w:pPr>
+      <w:r>
+        <w:rPr>
+          <w:rFonts w:ascii="Times New Roman" w:eastAsia="宋体" w:hAnsi="Times New Roman" w:cs="Times New Roman" w:hint="eastAsia"/>
+        </w:rPr>
+        <w:t>围墙覆盖物支持</w:t>
+      </w:r>
+      <w:r>
+        <w:rPr>
+          <w:rFonts w:ascii="Times New Roman" w:eastAsia="宋体" w:hAnsi="Times New Roman" w:cs="Times New Roman" w:hint="eastAsia"/>
+        </w:rPr>
+        <w:t>根据最近的建筑</w:t>
+      </w:r>
+      <w:r>
+        <w:rPr>
+          <w:rFonts w:ascii="Times New Roman" w:eastAsia="宋体" w:hAnsi="Times New Roman" w:cs="Times New Roman" w:hint="eastAsia"/>
+        </w:rPr>
+        <w:t>显示所属色</w:t>
+      </w:r>
+      <w:r>
+        <w:rPr>
+          <w:rFonts w:ascii="Times New Roman" w:eastAsia="宋体" w:hAnsi="Times New Roman" w:cs="Times New Roman" w:hint="eastAsia"/>
+        </w:rPr>
+        <w:t>（并不能完全还原游戏）</w:t>
+      </w:r>
+      <w:r>
+        <w:rPr>
+          <w:rFonts w:ascii="Times New Roman" w:eastAsia="宋体" w:hAnsi="Times New Roman" w:cs="Times New Roman" w:hint="eastAsia"/>
+        </w:rPr>
+        <w:t>，详见</w:t>
+      </w:r>
+      <w:r>
+        <w:rPr>
+          <w:rFonts w:ascii="Times New Roman" w:eastAsia="宋体" w:hAnsi="Times New Roman" w:cs="Times New Roman" w:hint="eastAsia"/>
+        </w:rPr>
+        <w:t>InGameDisplay.RemapableOverlay</w:t>
+      </w:r>
+    </w:p>
+    <w:p>
+      <w:pPr>
+        <w:pStyle w:val="a9"/>
+        <w:numPr>
+          <w:ilvl w:val="0"/>
+          <w:numId w:val="43"/>
+        </w:numPr>
+        <w:rPr>
+          <w:rFonts w:ascii="Times New Roman" w:eastAsia="宋体" w:hAnsi="Times New Roman" w:cs="Times New Roman"/>
+        </w:rPr>
+      </w:pPr>
+      <w:r>
+        <w:rPr>
+          <w:rFonts w:ascii="Times New Roman" w:eastAsia="宋体" w:hAnsi="Times New Roman" w:cs="Times New Roman" w:hint="eastAsia"/>
+        </w:rPr>
+        <w:t>恢复心灵终结中被错误隐藏的部分地形组</w:t>
+      </w:r>
+    </w:p>
+    <w:p>
+      <w:pPr>
+        <w:pStyle w:val="a9"/>
+        <w:numPr>
+          <w:ilvl w:val="0"/>
+          <w:numId w:val="43"/>
+        </w:numPr>
+        <w:rPr>
+          <w:rFonts w:ascii="Times New Roman" w:eastAsia="宋体" w:hAnsi="Times New Roman" w:cs="Times New Roman"/>
+        </w:rPr>
+      </w:pPr>
+      <w:r>
+        <w:rPr>
+          <w:rFonts w:ascii="Times New Roman" w:eastAsia="宋体" w:hAnsi="Times New Roman" w:cs="Times New Roman" w:hint="eastAsia"/>
+        </w:rPr>
+        <w:t>支持直接向建筑上放置加载物</w:t>
+      </w:r>
+      <w:r>
+        <w:rPr>
+          <w:rFonts w:ascii="Times New Roman" w:eastAsia="宋体" w:hAnsi="Times New Roman" w:cs="Times New Roman" w:hint="eastAsia"/>
+        </w:rPr>
+        <w:t>，详见</w:t>
+      </w:r>
+      <w:r>
+        <w:rPr>
+          <w:rFonts w:ascii="Times New Roman" w:eastAsia="宋体" w:hAnsi="Times New Roman" w:cs="Times New Roman" w:hint="eastAsia"/>
+        </w:rPr>
+        <w:t>PlaceStructure.PlaceUpgrade</w:t>
+      </w:r>
+    </w:p>
+    <w:p>
+      <w:pPr>
+        <w:pStyle w:val="a9"/>
+        <w:numPr>
+          <w:ilvl w:val="0"/>
+          <w:numId w:val="43"/>
+        </w:numPr>
+        <w:rPr>
+          <w:rFonts w:ascii="Times New Roman" w:eastAsia="宋体" w:hAnsi="Times New Roman" w:cs="Times New Roman"/>
+        </w:rPr>
+      </w:pPr>
+      <w:r>
+        <w:rPr>
+          <w:rFonts w:ascii="Times New Roman" w:eastAsia="宋体" w:hAnsi="Times New Roman" w:cs="Times New Roman" w:hint="eastAsia"/>
+        </w:rPr>
+        <w:t>触发编辑器支持</w:t>
+      </w:r>
+      <w:r>
+        <w:rPr>
+          <w:rFonts w:ascii="Times New Roman" w:eastAsia="宋体" w:hAnsi="Times New Roman" w:cs="Times New Roman" w:hint="eastAsia"/>
+        </w:rPr>
+        <w:t>多</w:t>
+      </w:r>
+      <w:r>
+        <w:rPr>
+          <w:rFonts w:ascii="Times New Roman" w:eastAsia="宋体" w:hAnsi="Times New Roman" w:cs="Times New Roman" w:hint="eastAsia"/>
+        </w:rPr>
+        <w:t>开</w:t>
+      </w:r>
+      <w:r>
+        <w:rPr>
+          <w:rFonts w:ascii="Times New Roman" w:eastAsia="宋体" w:hAnsi="Times New Roman" w:cs="Times New Roman" w:hint="eastAsia"/>
+        </w:rPr>
+        <w:t>，支持通过拖拽触发编辑器上的绿点设置参数</w:t>
+      </w:r>
+      <w:r>
+        <w:rPr>
+          <w:rFonts w:ascii="Times New Roman" w:eastAsia="宋体" w:hAnsi="Times New Roman" w:cs="Times New Roman" w:hint="eastAsia"/>
+        </w:rPr>
+        <w:t>，单击绿点可以为地图上的单位设置标签</w:t>
+      </w:r>
+    </w:p>
+    <w:p>
+      <w:pPr>
+        <w:pStyle w:val="a9"/>
+        <w:numPr>
+          <w:ilvl w:val="0"/>
+          <w:numId w:val="43"/>
+        </w:numPr>
+        <w:rPr>
+          <w:rFonts w:ascii="Times New Roman" w:eastAsia="宋体" w:hAnsi="Times New Roman" w:cs="Times New Roman"/>
+        </w:rPr>
+      </w:pPr>
+      <w:r>
+        <w:rPr>
+          <w:rFonts w:ascii="Times New Roman" w:eastAsia="宋体" w:hAnsi="Times New Roman" w:cs="Times New Roman" w:hint="eastAsia"/>
+        </w:rPr>
+        <w:t>作战小队、特遣部队、动作脚本编辑器支持通过拖拽</w:t>
+      </w:r>
+      <w:r>
+        <w:rPr>
+          <w:rFonts w:ascii="Times New Roman" w:eastAsia="宋体" w:hAnsi="Times New Roman" w:cs="Times New Roman" w:hint="eastAsia"/>
+        </w:rPr>
+        <w:t>绿点</w:t>
+      </w:r>
+      <w:r>
+        <w:rPr>
+          <w:rFonts w:ascii="Times New Roman" w:eastAsia="宋体" w:hAnsi="Times New Roman" w:cs="Times New Roman" w:hint="eastAsia"/>
+        </w:rPr>
+        <w:t>设置参数</w:t>
+      </w:r>
+    </w:p>
+    <w:p>
+      <w:pPr>
+        <w:pStyle w:val="a9"/>
+        <w:numPr>
+          <w:ilvl w:val="0"/>
+          <w:numId w:val="43"/>
+        </w:numPr>
+        <w:rPr>
+          <w:rFonts w:ascii="Times New Roman" w:eastAsia="宋体" w:hAnsi="Times New Roman" w:cs="Times New Roman"/>
+        </w:rPr>
+      </w:pPr>
+      <w:r>
+        <w:rPr>
+          <w:rFonts w:ascii="Times New Roman" w:eastAsia="宋体" w:hAnsi="Times New Roman" w:cs="Times New Roman" w:hint="eastAsia"/>
+        </w:rPr>
+        <w:t>修复当地形浏览器位于覆盖物视图时，切换框架模式会导致视图切换至地形的</w:t>
+      </w:r>
+      <w:r>
+        <w:rPr>
+          <w:rFonts w:ascii="Times New Roman" w:eastAsia="宋体" w:hAnsi="Times New Roman" w:cs="Times New Roman" w:hint="eastAsia"/>
+        </w:rPr>
+        <w:t>bug</w:t>
+      </w:r>
+    </w:p>
+    <w:p>
+      <w:pPr>
+        <w:pStyle w:val="a9"/>
+        <w:numPr>
+          <w:ilvl w:val="0"/>
+          <w:numId w:val="43"/>
+        </w:numPr>
+        <w:rPr>
+          <w:rFonts w:ascii="Times New Roman" w:eastAsia="宋体" w:hAnsi="Times New Roman" w:cs="Times New Roman"/>
+        </w:rPr>
+      </w:pPr>
+      <w:r>
+        <w:rPr>
+          <w:rFonts w:ascii="Times New Roman" w:eastAsia="宋体" w:hAnsi="Times New Roman" w:cs="Times New Roman" w:hint="eastAsia"/>
+        </w:rPr>
+        <w:t>优化高架桥阴影渲染</w:t>
+      </w:r>
+    </w:p>
+    <w:p>
+      <w:pPr>
+        <w:pStyle w:val="a9"/>
+        <w:numPr>
+          <w:ilvl w:val="0"/>
+          <w:numId w:val="43"/>
+        </w:numPr>
+        <w:rPr>
+          <w:rFonts w:ascii="Times New Roman" w:eastAsia="宋体" w:hAnsi="Times New Roman" w:cs="Times New Roman"/>
+        </w:rPr>
+      </w:pPr>
+      <w:r>
+        <w:rPr>
+          <w:rFonts w:ascii="Times New Roman" w:eastAsia="宋体" w:hAnsi="Times New Roman" w:cs="Times New Roman" w:hint="eastAsia"/>
+        </w:rPr>
+        <w:t>使用格式刷时会显示被修改的属性</w:t>
+      </w:r>
+    </w:p>
+    <w:p>
+      <w:pPr>
+        <w:pStyle w:val="a9"/>
+        <w:numPr>
+          <w:ilvl w:val="0"/>
+          <w:numId w:val="43"/>
+        </w:numPr>
+        <w:rPr>
+          <w:rFonts w:ascii="Times New Roman" w:eastAsia="宋体" w:hAnsi="Times New Roman" w:cs="Times New Roman"/>
+        </w:rPr>
+      </w:pPr>
+      <w:r>
+        <w:rPr>
+          <w:rFonts w:ascii="Times New Roman" w:eastAsia="宋体" w:hAnsi="Times New Roman" w:cs="Times New Roman" w:hint="eastAsia"/>
+        </w:rPr>
+        <w:t>优化单元标记和路径点的渲染效率</w:t>
+      </w:r>
+    </w:p>
+    <w:p>
+      <w:pPr>
+        <w:pStyle w:val="a9"/>
+        <w:numPr>
+          <w:ilvl w:val="0"/>
+          <w:numId w:val="43"/>
+        </w:numPr>
+        <w:rPr>
+          <w:rFonts w:ascii="Times New Roman" w:eastAsia="宋体" w:hAnsi="Times New Roman" w:cs="Times New Roman"/>
+        </w:rPr>
+      </w:pPr>
+      <w:r>
+        <w:rPr>
+          <w:rFonts w:ascii="Times New Roman" w:eastAsia="宋体" w:hAnsi="Times New Roman" w:cs="Times New Roman" w:hint="eastAsia"/>
+        </w:rPr>
+        <w:t>支持车辆单位的额外炮塔和额外炮管</w:t>
+      </w:r>
+    </w:p>
+    <w:p>
+      <w:pPr>
+        <w:pStyle w:val="a9"/>
+        <w:numPr>
+          <w:ilvl w:val="0"/>
+          <w:numId w:val="43"/>
+        </w:numPr>
+        <w:rPr>
+          <w:rFonts w:ascii="Times New Roman" w:eastAsia="宋体" w:hAnsi="Times New Roman" w:cs="Times New Roman"/>
+        </w:rPr>
+      </w:pPr>
+      <w:r>
+        <w:rPr>
+          <w:rFonts w:ascii="Times New Roman" w:eastAsia="宋体" w:hAnsi="Times New Roman" w:cs="Times New Roman"/>
+        </w:rPr>
+        <w:t>I</w:t>
+      </w:r>
+      <w:r>
+        <w:rPr>
+          <w:rFonts w:ascii="Times New Roman" w:eastAsia="宋体" w:hAnsi="Times New Roman" w:cs="Times New Roman" w:hint="eastAsia"/>
+        </w:rPr>
+        <w:t>ni</w:t>
+      </w:r>
+      <w:r>
+        <w:rPr>
+          <w:rFonts w:ascii="Times New Roman" w:eastAsia="宋体" w:hAnsi="Times New Roman" w:cs="Times New Roman" w:hint="eastAsia"/>
+        </w:rPr>
+        <w:t>编辑器和</w:t>
+      </w:r>
+      <w:r>
+        <w:rPr>
+          <w:rFonts w:ascii="Times New Roman" w:eastAsia="宋体" w:hAnsi="Times New Roman" w:cs="Times New Roman" w:hint="eastAsia"/>
+        </w:rPr>
+        <w:t>lua</w:t>
+      </w:r>
+      <w:r>
+        <w:rPr>
+          <w:rFonts w:ascii="Times New Roman" w:eastAsia="宋体" w:hAnsi="Times New Roman" w:cs="Times New Roman" w:hint="eastAsia"/>
+        </w:rPr>
+        <w:t>脚本输入窗口引入</w:t>
+      </w:r>
+      <w:r>
+        <w:rPr>
+          <w:rFonts w:ascii="Times New Roman" w:eastAsia="宋体" w:hAnsi="Times New Roman" w:cs="Times New Roman" w:hint="eastAsia"/>
+        </w:rPr>
+        <w:t>Scintilla</w:t>
+      </w:r>
+      <w:r>
+        <w:rPr>
+          <w:rFonts w:ascii="Times New Roman" w:eastAsia="宋体" w:hAnsi="Times New Roman" w:cs="Times New Roman" w:hint="eastAsia"/>
+        </w:rPr>
+        <w:t>引擎（</w:t>
+      </w:r>
+      <w:r>
+        <w:rPr>
+          <w:rFonts w:ascii="Times New Roman" w:eastAsia="宋体" w:hAnsi="Times New Roman" w:cs="Times New Roman" w:hint="eastAsia"/>
+        </w:rPr>
+        <w:t>notepad++</w:t>
+      </w:r>
+      <w:r>
+        <w:rPr>
+          <w:rFonts w:ascii="Times New Roman" w:eastAsia="宋体" w:hAnsi="Times New Roman" w:cs="Times New Roman" w:hint="eastAsia"/>
+        </w:rPr>
+        <w:t>同款），支持语法高亮</w:t>
+      </w:r>
+      <w:r>
+        <w:rPr>
+          <w:rFonts w:ascii="Times New Roman" w:eastAsia="宋体" w:hAnsi="Times New Roman" w:cs="Times New Roman" w:hint="eastAsia"/>
+        </w:rPr>
+        <w:t>、行数显示、矩形选择等特性</w:t>
+      </w:r>
+    </w:p>
+    <w:p>
+      <w:pPr>
+        <w:pStyle w:val="a9"/>
+        <w:numPr>
+          <w:ilvl w:val="0"/>
+          <w:numId w:val="43"/>
+        </w:numPr>
+        <w:rPr>
+          <w:rFonts w:ascii="Times New Roman" w:eastAsia="宋体" w:hAnsi="Times New Roman" w:cs="Times New Roman"/>
+        </w:rPr>
+      </w:pPr>
+      <w:r>
+        <w:rPr>
+          <w:rFonts w:ascii="Times New Roman" w:eastAsia="宋体" w:hAnsi="Times New Roman" w:cs="Times New Roman" w:hint="eastAsia"/>
+        </w:rPr>
+        <w:t>修复触发资源重载后，自定义地形组崩溃的</w:t>
+      </w:r>
+      <w:r>
+        <w:rPr>
+          <w:rFonts w:ascii="Times New Roman" w:eastAsia="宋体" w:hAnsi="Times New Roman" w:cs="Times New Roman" w:hint="eastAsia"/>
+        </w:rPr>
+        <w:t>bug</w:t>
+      </w:r>
+    </w:p>
+    <w:p>
+      <w:pPr>
+        <w:pStyle w:val="a9"/>
+        <w:numPr>
+          <w:ilvl w:val="0"/>
+          <w:numId w:val="43"/>
+        </w:numPr>
+        <w:rPr>
+          <w:rFonts w:ascii="Times New Roman" w:eastAsia="宋体" w:hAnsi="Times New Roman" w:cs="Times New Roman"/>
+        </w:rPr>
+      </w:pPr>
+      <w:r>
+        <w:rPr>
+          <w:rFonts w:ascii="Times New Roman" w:eastAsia="宋体" w:hAnsi="Times New Roman" w:cs="Times New Roman" w:hint="eastAsia"/>
+        </w:rPr>
+        <w:t>触发编辑器的行为列表支持多选，新增“上移”“下移”与“拆分”按钮，可以将选中的行为上下移动或拆分出新触发</w:t>
+      </w:r>
+    </w:p>
+    <w:p>
+      <w:pPr>
+        <w:pStyle w:val="a9"/>
+        <w:numPr>
+          <w:ilvl w:val="0"/>
+          <w:numId w:val="43"/>
+        </w:numPr>
+        <w:rPr>
+          <w:rFonts w:ascii="Times New Roman" w:eastAsia="宋体" w:hAnsi="Times New Roman" w:cs="Times New Roman"/>
+        </w:rPr>
+      </w:pPr>
+      <w:r>
+        <w:rPr>
+          <w:rFonts w:ascii="Times New Roman" w:eastAsia="宋体" w:hAnsi="Times New Roman" w:cs="Times New Roman" w:hint="eastAsia"/>
+        </w:rPr>
+        <w:t>支持通过按住</w:t>
+      </w:r>
+      <w:r>
+        <w:rPr>
+          <w:rFonts w:ascii="Times New Roman" w:eastAsia="宋体" w:hAnsi="Times New Roman" w:cs="Times New Roman" w:hint="eastAsia"/>
+        </w:rPr>
+        <w:t>alt</w:t>
+      </w:r>
+      <w:r>
+        <w:rPr>
+          <w:rFonts w:ascii="Times New Roman" w:eastAsia="宋体" w:hAnsi="Times New Roman" w:cs="Times New Roman" w:hint="eastAsia"/>
+        </w:rPr>
+        <w:t>键直线放置单元标记</w:t>
+      </w:r>
+    </w:p>
+    <w:p>
+      <w:pPr>
+        <w:pStyle w:val="a9"/>
+        <w:numPr>
+          <w:ilvl w:val="0"/>
+          <w:numId w:val="43"/>
+        </w:numPr>
+        <w:rPr>
+          <w:rFonts w:ascii="Times New Roman" w:eastAsia="宋体" w:hAnsi="Times New Roman" w:cs="Times New Roman"/>
+        </w:rPr>
+      </w:pPr>
+      <w:r>
+        <w:rPr>
+          <w:rFonts w:ascii="Times New Roman" w:eastAsia="宋体" w:hAnsi="Times New Roman" w:cs="Times New Roman" w:hint="eastAsia"/>
+        </w:rPr>
+        <w:t>支持通过设置附加命令行参数直接打开地图，格式为</w:t>
+      </w:r>
+      <w:r>
+        <w:rPr>
+          <w:rFonts w:ascii="Times New Roman" w:eastAsia="宋体" w:hAnsi="Times New Roman" w:cs="Times New Roman" w:hint="eastAsia"/>
+        </w:rPr>
+        <w:t xml:space="preserve">-o </w:t>
+      </w:r>
+      <w:r>
+        <w:rPr>
+          <w:rFonts w:ascii="Times New Roman" w:eastAsia="宋体" w:hAnsi="Times New Roman" w:cs="Times New Roman"/>
+        </w:rPr>
+        <w:t>“</w:t>
+      </w:r>
+      <w:r>
+        <w:rPr>
+          <w:rFonts w:ascii="Times New Roman" w:eastAsia="宋体" w:hAnsi="Times New Roman" w:cs="Times New Roman" w:hint="eastAsia"/>
+        </w:rPr>
+        <w:t>地图路径</w:t>
+      </w:r>
+      <w:r>
+        <w:rPr>
+          <w:rFonts w:ascii="Times New Roman" w:eastAsia="宋体" w:hAnsi="Times New Roman" w:cs="Times New Roman"/>
+        </w:rPr>
+        <w:t>”</w:t>
+      </w:r>
+      <w:r>
+        <w:rPr>
+          <w:rFonts w:ascii="Times New Roman" w:eastAsia="宋体" w:hAnsi="Times New Roman" w:cs="Times New Roman" w:hint="eastAsia"/>
+        </w:rPr>
+        <w:t>或</w:t>
+      </w:r>
+      <w:r>
+        <w:rPr>
+          <w:rFonts w:ascii="Times New Roman" w:eastAsia="宋体" w:hAnsi="Times New Roman" w:cs="Times New Roman" w:hint="eastAsia"/>
+        </w:rPr>
+        <w:t xml:space="preserve">--open </w:t>
+      </w:r>
+      <w:r>
+        <w:rPr>
+          <w:rFonts w:ascii="Times New Roman" w:eastAsia="宋体" w:hAnsi="Times New Roman" w:cs="Times New Roman"/>
+        </w:rPr>
+        <w:t>“</w:t>
+      </w:r>
+      <w:r>
+        <w:rPr>
+          <w:rFonts w:ascii="Times New Roman" w:eastAsia="宋体" w:hAnsi="Times New Roman" w:cs="Times New Roman" w:hint="eastAsia"/>
+        </w:rPr>
+        <w:t>地图路径</w:t>
+      </w:r>
+      <w:r>
+        <w:rPr>
+          <w:rFonts w:ascii="Times New Roman" w:eastAsia="宋体" w:hAnsi="Times New Roman" w:cs="Times New Roman"/>
+        </w:rPr>
+        <w:t>”</w:t>
+      </w:r>
+      <w:r>
+        <w:rPr>
+          <w:rFonts w:ascii="Times New Roman" w:eastAsia="宋体" w:hAnsi="Times New Roman" w:cs="Times New Roman" w:hint="eastAsia"/>
+        </w:rPr>
+        <w:t>，命令行参数可以填写在</w:t>
+      </w:r>
+      <w:r>
+        <w:rPr>
+          <w:rFonts w:ascii="Times New Roman" w:eastAsia="宋体" w:hAnsi="Times New Roman" w:cs="Times New Roman" w:hint="eastAsia"/>
+        </w:rPr>
+        <w:t>FA2spLaunch.exe</w:t>
+      </w:r>
+      <w:r>
+        <w:rPr>
+          <w:rFonts w:ascii="Times New Roman" w:eastAsia="宋体" w:hAnsi="Times New Roman" w:cs="Times New Roman" w:hint="eastAsia"/>
+        </w:rPr>
+        <w:t>后方，或者</w:t>
+      </w:r>
+      <w:r>
+        <w:rPr>
+          <w:rFonts w:ascii="Times New Roman" w:eastAsia="宋体" w:hAnsi="Times New Roman" w:cs="Times New Roman" w:hint="eastAsia"/>
+        </w:rPr>
+        <w:t>RunFA2sp.bat</w:t>
+      </w:r>
+      <w:r>
+        <w:rPr>
+          <w:rFonts w:ascii="Times New Roman" w:eastAsia="宋体" w:hAnsi="Times New Roman" w:cs="Times New Roman" w:hint="eastAsia"/>
+        </w:rPr>
+        <w:t>内</w:t>
+      </w:r>
+    </w:p>
+    <w:p>
+      <w:pPr>
+        <w:pStyle w:val="a9"/>
+        <w:numPr>
+          <w:ilvl w:val="0"/>
+          <w:numId w:val="43"/>
+        </w:numPr>
+        <w:rPr>
+          <w:rFonts w:ascii="Times New Roman" w:eastAsia="宋体" w:hAnsi="Times New Roman" w:cs="Times New Roman"/>
+        </w:rPr>
+      </w:pPr>
+      <w:r>
+        <w:rPr>
+          <w:rFonts w:ascii="Times New Roman" w:eastAsia="宋体" w:hAnsi="Times New Roman" w:cs="Times New Roman" w:hint="eastAsia"/>
+        </w:rPr>
+        <w:t>修复当使用放置于地图行为时，对应的标签被删除后仍能摆放单元标记的</w:t>
+      </w:r>
+      <w:r>
+        <w:rPr>
+          <w:rFonts w:ascii="Times New Roman" w:eastAsia="宋体" w:hAnsi="Times New Roman" w:cs="Times New Roman" w:hint="eastAsia"/>
+        </w:rPr>
+        <w:t>bug</w:t>
+      </w:r>
+    </w:p>
+    <w:p>
+      <w:pPr>
+        <w:pStyle w:val="a9"/>
+        <w:numPr>
+          <w:ilvl w:val="0"/>
+          <w:numId w:val="43"/>
+        </w:numPr>
+        <w:rPr>
+          <w:rFonts w:ascii="Times New Roman" w:eastAsia="宋体" w:hAnsi="Times New Roman" w:cs="Times New Roman"/>
+        </w:rPr>
+      </w:pPr>
+      <w:r>
+        <w:rPr>
+          <w:rFonts w:ascii="Times New Roman" w:eastAsia="宋体" w:hAnsi="Times New Roman" w:cs="Times New Roman" w:hint="eastAsia"/>
+        </w:rPr>
+        <w:t>TheaterInfo</w:t>
+      </w:r>
+      <w:r>
+        <w:rPr>
+          <w:rFonts w:ascii="Times New Roman" w:eastAsia="宋体" w:hAnsi="Times New Roman" w:cs="Times New Roman" w:hint="eastAsia"/>
+        </w:rPr>
+        <w:t>内的自定义斜坡类型支持指定地形组下的特定地形块</w:t>
+      </w:r>
+    </w:p>
+    <w:p>
+      <w:pPr>
+        <w:pStyle w:val="a9"/>
+        <w:numPr>
+          <w:ilvl w:val="0"/>
+          <w:numId w:val="43"/>
+        </w:numPr>
+        <w:rPr>
+          <w:rFonts w:ascii="Times New Roman" w:eastAsia="宋体" w:hAnsi="Times New Roman" w:cs="Times New Roman"/>
+        </w:rPr>
+      </w:pPr>
+      <w:r>
+        <w:rPr>
+          <w:rFonts w:ascii="Times New Roman" w:eastAsia="宋体" w:hAnsi="Times New Roman" w:cs="Times New Roman" w:hint="eastAsia"/>
+        </w:rPr>
+        <w:t>支持为无图像单位显示缺省图像，详见</w:t>
+      </w:r>
+      <w:r>
+        <w:rPr>
+          <w:rFonts w:ascii="Times New Roman" w:eastAsia="宋体" w:hAnsi="Times New Roman" w:cs="Times New Roman" w:hint="eastAsia"/>
+        </w:rPr>
+        <w:t>UseDefaultUnitImage</w:t>
+      </w:r>
+    </w:p>
+    <w:p>
+      <w:pPr>
+        <w:pStyle w:val="a9"/>
+        <w:numPr>
+          <w:ilvl w:val="0"/>
+          <w:numId w:val="43"/>
+        </w:numPr>
+        <w:rPr>
+          <w:rFonts w:ascii="Times New Roman" w:eastAsia="宋体" w:hAnsi="Times New Roman" w:cs="Times New Roman"/>
+        </w:rPr>
+      </w:pPr>
+      <w:r>
+        <w:rPr>
+          <w:rFonts w:ascii="Times New Roman" w:eastAsia="宋体" w:hAnsi="Times New Roman" w:cs="Times New Roman" w:hint="eastAsia"/>
+        </w:rPr>
+        <w:t>支持</w:t>
+      </w:r>
+      <w:r>
+        <w:rPr>
+          <w:rFonts w:ascii="Times New Roman" w:eastAsia="宋体" w:hAnsi="Times New Roman" w:cs="Times New Roman" w:hint="eastAsia"/>
+        </w:rPr>
+        <w:t>ares</w:t>
+      </w:r>
+      <w:r>
+        <w:rPr>
+          <w:rFonts w:ascii="Times New Roman" w:eastAsia="宋体" w:hAnsi="Times New Roman" w:cs="Times New Roman" w:hint="eastAsia"/>
+        </w:rPr>
+        <w:t>的自定义军衔</w:t>
+      </w:r>
+    </w:p>
+    <w:p>
+      <w:pPr>
+        <w:pStyle w:val="a9"/>
+        <w:numPr>
+          <w:ilvl w:val="0"/>
+          <w:numId w:val="43"/>
+        </w:numPr>
+        <w:rPr>
+          <w:rFonts w:ascii="Times New Roman" w:eastAsia="宋体" w:hAnsi="Times New Roman" w:cs="Times New Roman"/>
+        </w:rPr>
+      </w:pPr>
+      <w:r>
+        <w:rPr>
+          <w:rFonts w:ascii="Times New Roman" w:eastAsia="宋体" w:hAnsi="Times New Roman" w:cs="Times New Roman" w:hint="eastAsia"/>
+        </w:rPr>
+        <w:t>对无图像地形对象和污染显示文本</w:t>
+      </w:r>
+    </w:p>
+    <w:p>
+      <w:pPr>
+        <w:pStyle w:val="a9"/>
+        <w:numPr>
+          <w:ilvl w:val="0"/>
+          <w:numId w:val="43"/>
+        </w:numPr>
+        <w:rPr>
+          <w:rFonts w:ascii="Times New Roman" w:eastAsia="宋体" w:hAnsi="Times New Roman" w:cs="Times New Roman"/>
+        </w:rPr>
+      </w:pPr>
+      <w:r>
+        <w:rPr>
+          <w:rFonts w:ascii="Times New Roman" w:eastAsia="宋体" w:hAnsi="Times New Roman" w:cs="Times New Roman" w:hint="eastAsia"/>
+        </w:rPr>
         <w:lastRenderedPageBreak/>
-        <w:t>修复自定义面积建筑的渲染遮挡问题</w:t>
-      </w:r>
-    </w:p>
-    <w:p>
-      <w:pPr>
-        <w:pStyle w:val="a9"/>
-        <w:numPr>
-          <w:ilvl w:val="0"/>
-          <w:numId w:val="43"/>
-        </w:numPr>
-        <w:rPr>
-          <w:rFonts w:ascii="Times New Roman" w:eastAsia="宋体" w:hAnsi="Times New Roman" w:cs="Times New Roman"/>
-        </w:rPr>
-      </w:pPr>
-      <w:r>
-        <w:rPr>
-          <w:rFonts w:ascii="Times New Roman" w:eastAsia="宋体" w:hAnsi="Times New Roman" w:cs="Times New Roman" w:hint="eastAsia"/>
-        </w:rPr>
-        <w:t>修复删除地图</w:t>
-      </w:r>
-      <w:r>
-        <w:rPr>
-          <w:rFonts w:ascii="Times New Roman" w:eastAsia="宋体" w:hAnsi="Times New Roman" w:cs="Times New Roman" w:hint="eastAsia"/>
-        </w:rPr>
-        <w:t>include</w:t>
-      </w:r>
-      <w:r>
-        <w:rPr>
-          <w:rFonts w:ascii="Times New Roman" w:eastAsia="宋体" w:hAnsi="Times New Roman" w:cs="Times New Roman" w:hint="eastAsia"/>
-        </w:rPr>
-        <w:t>小节后不能正确保存部分</w:t>
-      </w:r>
-      <w:r>
-        <w:rPr>
-          <w:rFonts w:ascii="Times New Roman" w:eastAsia="宋体" w:hAnsi="Times New Roman" w:cs="Times New Roman" w:hint="eastAsia"/>
-        </w:rPr>
-        <w:t>ini</w:t>
-      </w:r>
-      <w:r>
-        <w:rPr>
-          <w:rFonts w:ascii="Times New Roman" w:eastAsia="宋体" w:hAnsi="Times New Roman" w:cs="Times New Roman" w:hint="eastAsia"/>
-        </w:rPr>
-        <w:t>小节的</w:t>
-      </w:r>
-      <w:r>
-        <w:rPr>
-          <w:rFonts w:ascii="Times New Roman" w:eastAsia="宋体" w:hAnsi="Times New Roman" w:cs="Times New Roman" w:hint="eastAsia"/>
-        </w:rPr>
-        <w:t>bug</w:t>
-      </w:r>
-      <w:r>
-        <w:rPr>
-          <w:rFonts w:ascii="Times New Roman" w:eastAsia="宋体" w:hAnsi="Times New Roman" w:cs="Times New Roman" w:hint="eastAsia"/>
-        </w:rPr>
-        <w:t>。</w:t>
-      </w:r>
-      <w:r>
-        <w:rPr>
-          <w:rFonts w:ascii="Times New Roman" w:eastAsia="宋体" w:hAnsi="Times New Roman" w:cs="Times New Roman" w:hint="eastAsia"/>
-        </w:rPr>
-        <w:t>注意，地图</w:t>
-      </w:r>
-      <w:r>
-        <w:rPr>
-          <w:rFonts w:ascii="Times New Roman" w:eastAsia="宋体" w:hAnsi="Times New Roman" w:cs="Times New Roman" w:hint="eastAsia"/>
-        </w:rPr>
-        <w:t>include</w:t>
-      </w:r>
-      <w:r>
-        <w:rPr>
-          <w:rFonts w:ascii="Times New Roman" w:eastAsia="宋体" w:hAnsi="Times New Roman" w:cs="Times New Roman" w:hint="eastAsia"/>
-        </w:rPr>
-        <w:t>支持仍属于实验性功能，不建议使用</w:t>
-      </w:r>
-      <w:r>
-        <w:rPr>
-          <w:rFonts w:ascii="Times New Roman" w:eastAsia="宋体" w:hAnsi="Times New Roman" w:cs="Times New Roman" w:hint="eastAsia"/>
-        </w:rPr>
-        <w:t>；由于技术限制，保存时并不能固定已有的</w:t>
-      </w:r>
-      <w:r>
-        <w:rPr>
-          <w:rFonts w:ascii="Times New Roman" w:eastAsia="宋体" w:hAnsi="Times New Roman" w:cs="Times New Roman" w:hint="eastAsia"/>
-        </w:rPr>
-        <w:t>include</w:t>
-      </w:r>
-      <w:r>
-        <w:rPr>
-          <w:rFonts w:ascii="Times New Roman" w:eastAsia="宋体" w:hAnsi="Times New Roman" w:cs="Times New Roman" w:hint="eastAsia"/>
-        </w:rPr>
-        <w:t>顺序</w:t>
-      </w:r>
-    </w:p>
-    <w:p>
-      <w:pPr>
-        <w:pStyle w:val="a9"/>
-        <w:numPr>
-          <w:ilvl w:val="0"/>
-          <w:numId w:val="43"/>
-        </w:numPr>
-        <w:rPr>
-          <w:rFonts w:ascii="Times New Roman" w:eastAsia="宋体" w:hAnsi="Times New Roman" w:cs="Times New Roman"/>
-        </w:rPr>
-      </w:pPr>
-      <w:r>
-        <w:rPr>
-          <w:rFonts w:ascii="Times New Roman" w:eastAsia="宋体" w:hAnsi="Times New Roman" w:cs="Times New Roman" w:hint="eastAsia"/>
-        </w:rPr>
-        <w:t>小队变更时会即时刷新触发编辑器对应菜单</w:t>
-      </w:r>
-    </w:p>
-    <w:p>
-      <w:pPr>
-        <w:pStyle w:val="a9"/>
-        <w:numPr>
-          <w:ilvl w:val="0"/>
-          <w:numId w:val="43"/>
-        </w:numPr>
-        <w:rPr>
-          <w:rFonts w:ascii="Times New Roman" w:eastAsia="宋体" w:hAnsi="Times New Roman" w:cs="Times New Roman"/>
-        </w:rPr>
-      </w:pPr>
-      <w:r>
-        <w:rPr>
-          <w:rFonts w:ascii="Times New Roman" w:eastAsia="宋体" w:hAnsi="Times New Roman" w:cs="Times New Roman" w:hint="eastAsia"/>
-        </w:rPr>
-        <w:t>新增选项</w:t>
-      </w:r>
-      <w:r>
-        <w:rPr>
-          <w:rFonts w:ascii="Times New Roman" w:eastAsia="宋体" w:hAnsi="Times New Roman" w:cs="Times New Roman" w:hint="eastAsia"/>
-        </w:rPr>
-        <w:t>SaveMap.KeepComments</w:t>
-      </w:r>
-      <w:r>
-        <w:rPr>
-          <w:rFonts w:ascii="Times New Roman" w:eastAsia="宋体" w:hAnsi="Times New Roman" w:cs="Times New Roman" w:hint="eastAsia"/>
-        </w:rPr>
-        <w:t>，在保存地图时可以保留注释</w:t>
-      </w:r>
-      <w:r>
-        <w:rPr>
-          <w:rFonts w:ascii="Times New Roman" w:eastAsia="宋体" w:hAnsi="Times New Roman" w:cs="Times New Roman" w:hint="eastAsia"/>
-        </w:rPr>
-        <w:t>，</w:t>
-      </w:r>
-      <w:r>
-        <w:rPr>
-          <w:rFonts w:ascii="Times New Roman" w:eastAsia="宋体" w:hAnsi="Times New Roman" w:cs="Times New Roman" w:hint="eastAsia"/>
-        </w:rPr>
-        <w:t>ini</w:t>
-      </w:r>
-      <w:r>
-        <w:rPr>
-          <w:rFonts w:ascii="Times New Roman" w:eastAsia="宋体" w:hAnsi="Times New Roman" w:cs="Times New Roman" w:hint="eastAsia"/>
-        </w:rPr>
-        <w:t>编辑器中可以保留并显示注释</w:t>
-      </w:r>
-    </w:p>
-    <w:p>
-      <w:pPr>
-        <w:pStyle w:val="a9"/>
-        <w:numPr>
-          <w:ilvl w:val="0"/>
-          <w:numId w:val="43"/>
-        </w:numPr>
-        <w:rPr>
-          <w:rFonts w:ascii="Times New Roman" w:eastAsia="宋体" w:hAnsi="Times New Roman" w:cs="Times New Roman"/>
-        </w:rPr>
-      </w:pPr>
-      <w:r>
-        <w:rPr>
-          <w:rFonts w:ascii="Times New Roman" w:eastAsia="宋体" w:hAnsi="Times New Roman" w:cs="Times New Roman" w:hint="eastAsia"/>
-        </w:rPr>
-        <w:t>在触发编辑器中为无标签的重复类型添加说明文本</w:t>
-      </w:r>
-    </w:p>
-    <w:p>
-      <w:pPr>
-        <w:pStyle w:val="a9"/>
-        <w:numPr>
-          <w:ilvl w:val="0"/>
-          <w:numId w:val="43"/>
-        </w:numPr>
-        <w:rPr>
-          <w:rFonts w:ascii="Times New Roman" w:eastAsia="宋体" w:hAnsi="Times New Roman" w:cs="Times New Roman"/>
-        </w:rPr>
-      </w:pPr>
-      <w:r>
-        <w:rPr>
-          <w:rFonts w:ascii="Times New Roman" w:eastAsia="宋体" w:hAnsi="Times New Roman" w:cs="Times New Roman" w:hint="eastAsia"/>
-        </w:rPr>
-        <w:t>新增加载</w:t>
-      </w:r>
-      <w:r>
-        <w:rPr>
-          <w:rFonts w:ascii="Times New Roman" w:eastAsia="宋体" w:hAnsi="Times New Roman" w:cs="Times New Roman" w:hint="eastAsia"/>
-        </w:rPr>
-        <w:t>/</w:t>
-      </w:r>
-      <w:r>
-        <w:rPr>
-          <w:rFonts w:ascii="Times New Roman" w:eastAsia="宋体" w:hAnsi="Times New Roman" w:cs="Times New Roman" w:hint="eastAsia"/>
-        </w:rPr>
-        <w:t>保存文件的</w:t>
-      </w:r>
-      <w:r>
-        <w:rPr>
-          <w:rFonts w:ascii="Times New Roman" w:eastAsia="宋体" w:hAnsi="Times New Roman" w:cs="Times New Roman" w:hint="eastAsia"/>
-        </w:rPr>
-        <w:t>lua</w:t>
-      </w:r>
-      <w:r>
-        <w:rPr>
-          <w:rFonts w:ascii="Times New Roman" w:eastAsia="宋体" w:hAnsi="Times New Roman" w:cs="Times New Roman" w:hint="eastAsia"/>
-        </w:rPr>
-        <w:t>脚本函数</w:t>
-      </w:r>
-    </w:p>
-    <w:p>
-      <w:pPr>
-        <w:pStyle w:val="a9"/>
-        <w:numPr>
-          <w:ilvl w:val="0"/>
-          <w:numId w:val="43"/>
-        </w:numPr>
-        <w:rPr>
-          <w:rFonts w:ascii="Times New Roman" w:eastAsia="宋体" w:hAnsi="Times New Roman" w:cs="Times New Roman"/>
-        </w:rPr>
-      </w:pPr>
-      <w:r>
-        <w:rPr>
-          <w:rFonts w:ascii="Times New Roman" w:eastAsia="宋体" w:hAnsi="Times New Roman" w:cs="Times New Roman" w:hint="eastAsia"/>
-        </w:rPr>
-        <w:t>修复部分</w:t>
-      </w:r>
-      <w:r>
-        <w:rPr>
-          <w:rFonts w:ascii="Times New Roman" w:eastAsia="宋体" w:hAnsi="Times New Roman" w:cs="Times New Roman" w:hint="eastAsia"/>
-        </w:rPr>
-        <w:t>lua</w:t>
-      </w:r>
-      <w:r>
-        <w:rPr>
-          <w:rFonts w:ascii="Times New Roman" w:eastAsia="宋体" w:hAnsi="Times New Roman" w:cs="Times New Roman" w:hint="eastAsia"/>
-        </w:rPr>
-        <w:t>脚本的</w:t>
-      </w:r>
-      <w:r>
-        <w:rPr>
-          <w:rFonts w:ascii="Times New Roman" w:eastAsia="宋体" w:hAnsi="Times New Roman" w:cs="Times New Roman" w:hint="eastAsia"/>
-        </w:rPr>
-        <w:t>bug</w:t>
-      </w:r>
-    </w:p>
-    <w:p>
-      <w:pPr>
-        <w:pStyle w:val="a9"/>
-        <w:numPr>
-          <w:ilvl w:val="0"/>
-          <w:numId w:val="43"/>
-        </w:numPr>
-        <w:rPr>
-          <w:rFonts w:ascii="Times New Roman" w:eastAsia="宋体" w:hAnsi="Times New Roman" w:cs="Times New Roman"/>
-        </w:rPr>
-      </w:pPr>
-      <w:r>
-        <w:rPr>
-          <w:rFonts w:ascii="Times New Roman" w:eastAsia="宋体" w:hAnsi="Times New Roman" w:cs="Times New Roman" w:hint="eastAsia"/>
-        </w:rPr>
-        <w:t>围墙覆盖物支持</w:t>
-      </w:r>
-      <w:r>
-        <w:rPr>
-          <w:rFonts w:ascii="Times New Roman" w:eastAsia="宋体" w:hAnsi="Times New Roman" w:cs="Times New Roman" w:hint="eastAsia"/>
-        </w:rPr>
-        <w:t>根据最近的建筑</w:t>
-      </w:r>
-      <w:r>
-        <w:rPr>
-          <w:rFonts w:ascii="Times New Roman" w:eastAsia="宋体" w:hAnsi="Times New Roman" w:cs="Times New Roman" w:hint="eastAsia"/>
-        </w:rPr>
-        <w:t>显示所属色</w:t>
-      </w:r>
-      <w:r>
-        <w:rPr>
-          <w:rFonts w:ascii="Times New Roman" w:eastAsia="宋体" w:hAnsi="Times New Roman" w:cs="Times New Roman" w:hint="eastAsia"/>
-        </w:rPr>
-        <w:t>（并不能完全还原游戏）</w:t>
-      </w:r>
-      <w:r>
-        <w:rPr>
-          <w:rFonts w:ascii="Times New Roman" w:eastAsia="宋体" w:hAnsi="Times New Roman" w:cs="Times New Roman" w:hint="eastAsia"/>
-        </w:rPr>
-        <w:t>，详见</w:t>
-      </w:r>
-      <w:r>
-        <w:rPr>
-          <w:rFonts w:ascii="Times New Roman" w:eastAsia="宋体" w:hAnsi="Times New Roman" w:cs="Times New Roman" w:hint="eastAsia"/>
-        </w:rPr>
-        <w:t>InGameDisplay.RemapableOverlay</w:t>
-      </w:r>
-    </w:p>
-    <w:p>
-      <w:pPr>
-        <w:pStyle w:val="a9"/>
-        <w:numPr>
-          <w:ilvl w:val="0"/>
-          <w:numId w:val="43"/>
-        </w:numPr>
-        <w:rPr>
-          <w:rFonts w:ascii="Times New Roman" w:eastAsia="宋体" w:hAnsi="Times New Roman" w:cs="Times New Roman"/>
-        </w:rPr>
-      </w:pPr>
-      <w:r>
-        <w:rPr>
-          <w:rFonts w:ascii="Times New Roman" w:eastAsia="宋体" w:hAnsi="Times New Roman" w:cs="Times New Roman" w:hint="eastAsia"/>
-        </w:rPr>
-        <w:t>恢复心灵终结中被错误隐藏的部分地形组</w:t>
-      </w:r>
-    </w:p>
-    <w:p>
-      <w:pPr>
-        <w:pStyle w:val="a9"/>
-        <w:numPr>
-          <w:ilvl w:val="0"/>
-          <w:numId w:val="43"/>
-        </w:numPr>
-        <w:rPr>
-          <w:rFonts w:ascii="Times New Roman" w:eastAsia="宋体" w:hAnsi="Times New Roman" w:cs="Times New Roman"/>
-        </w:rPr>
-      </w:pPr>
-      <w:r>
-        <w:rPr>
-          <w:rFonts w:ascii="Times New Roman" w:eastAsia="宋体" w:hAnsi="Times New Roman" w:cs="Times New Roman" w:hint="eastAsia"/>
-        </w:rPr>
-        <w:t>支持直接向建筑上放置加载物</w:t>
-      </w:r>
-      <w:r>
-        <w:rPr>
-          <w:rFonts w:ascii="Times New Roman" w:eastAsia="宋体" w:hAnsi="Times New Roman" w:cs="Times New Roman" w:hint="eastAsia"/>
-        </w:rPr>
-        <w:t>，详见</w:t>
-      </w:r>
-      <w:r>
-        <w:rPr>
-          <w:rFonts w:ascii="Times New Roman" w:eastAsia="宋体" w:hAnsi="Times New Roman" w:cs="Times New Roman" w:hint="eastAsia"/>
-        </w:rPr>
-        <w:t>PlaceStructure.PlaceUpgrade</w:t>
-      </w:r>
-    </w:p>
-    <w:p>
-      <w:pPr>
-        <w:pStyle w:val="a9"/>
-        <w:numPr>
-          <w:ilvl w:val="0"/>
-          <w:numId w:val="43"/>
-        </w:numPr>
-        <w:rPr>
-          <w:rFonts w:ascii="Times New Roman" w:eastAsia="宋体" w:hAnsi="Times New Roman" w:cs="Times New Roman"/>
-        </w:rPr>
-      </w:pPr>
-      <w:r>
-        <w:rPr>
-          <w:rFonts w:ascii="Times New Roman" w:eastAsia="宋体" w:hAnsi="Times New Roman" w:cs="Times New Roman" w:hint="eastAsia"/>
-        </w:rPr>
-        <w:t>触发编辑器支持</w:t>
-      </w:r>
-      <w:r>
-        <w:rPr>
-          <w:rFonts w:ascii="Times New Roman" w:eastAsia="宋体" w:hAnsi="Times New Roman" w:cs="Times New Roman" w:hint="eastAsia"/>
-        </w:rPr>
-        <w:t>多</w:t>
-      </w:r>
-      <w:r>
-        <w:rPr>
-          <w:rFonts w:ascii="Times New Roman" w:eastAsia="宋体" w:hAnsi="Times New Roman" w:cs="Times New Roman" w:hint="eastAsia"/>
-        </w:rPr>
-        <w:t>开</w:t>
-      </w:r>
-      <w:r>
-        <w:rPr>
-          <w:rFonts w:ascii="Times New Roman" w:eastAsia="宋体" w:hAnsi="Times New Roman" w:cs="Times New Roman" w:hint="eastAsia"/>
-        </w:rPr>
-        <w:t>，支持通过拖拽触发编辑器上的绿点设置参数</w:t>
-      </w:r>
-      <w:r>
-        <w:rPr>
-          <w:rFonts w:ascii="Times New Roman" w:eastAsia="宋体" w:hAnsi="Times New Roman" w:cs="Times New Roman" w:hint="eastAsia"/>
-        </w:rPr>
-        <w:t>，单击绿点可以为地图上的单位设置标签</w:t>
-      </w:r>
-    </w:p>
-    <w:p>
-      <w:pPr>
-        <w:pStyle w:val="a9"/>
-        <w:numPr>
-          <w:ilvl w:val="0"/>
-          <w:numId w:val="43"/>
-        </w:numPr>
-        <w:rPr>
-          <w:rFonts w:ascii="Times New Roman" w:eastAsia="宋体" w:hAnsi="Times New Roman" w:cs="Times New Roman"/>
-        </w:rPr>
-      </w:pPr>
-      <w:r>
-        <w:rPr>
-          <w:rFonts w:ascii="Times New Roman" w:eastAsia="宋体" w:hAnsi="Times New Roman" w:cs="Times New Roman" w:hint="eastAsia"/>
-        </w:rPr>
-        <w:t>作战小队、特遣部队、动作脚本编辑器支持通过拖拽</w:t>
-      </w:r>
-      <w:r>
-        <w:rPr>
-          <w:rFonts w:ascii="Times New Roman" w:eastAsia="宋体" w:hAnsi="Times New Roman" w:cs="Times New Roman" w:hint="eastAsia"/>
-        </w:rPr>
-        <w:t>绿点</w:t>
-      </w:r>
-      <w:r>
-        <w:rPr>
-          <w:rFonts w:ascii="Times New Roman" w:eastAsia="宋体" w:hAnsi="Times New Roman" w:cs="Times New Roman" w:hint="eastAsia"/>
-        </w:rPr>
-        <w:t>设置参数</w:t>
-      </w:r>
-    </w:p>
-    <w:p>
-      <w:pPr>
-        <w:pStyle w:val="a9"/>
-        <w:numPr>
-          <w:ilvl w:val="0"/>
-          <w:numId w:val="43"/>
-        </w:numPr>
-        <w:rPr>
-          <w:rFonts w:ascii="Times New Roman" w:eastAsia="宋体" w:hAnsi="Times New Roman" w:cs="Times New Roman"/>
-        </w:rPr>
-      </w:pPr>
-      <w:r>
-        <w:rPr>
-          <w:rFonts w:ascii="Times New Roman" w:eastAsia="宋体" w:hAnsi="Times New Roman" w:cs="Times New Roman" w:hint="eastAsia"/>
-        </w:rPr>
-        <w:t>修复当地形浏览器位于覆盖物视图时，切换框架模式会导致视图切换至地形的</w:t>
-      </w:r>
-      <w:r>
-        <w:rPr>
-          <w:rFonts w:ascii="Times New Roman" w:eastAsia="宋体" w:hAnsi="Times New Roman" w:cs="Times New Roman" w:hint="eastAsia"/>
-        </w:rPr>
-        <w:t>bug</w:t>
-      </w:r>
-    </w:p>
-    <w:p>
-      <w:pPr>
-        <w:pStyle w:val="a9"/>
-        <w:numPr>
-          <w:ilvl w:val="0"/>
-          <w:numId w:val="43"/>
-        </w:numPr>
-        <w:rPr>
-          <w:rFonts w:ascii="Times New Roman" w:eastAsia="宋体" w:hAnsi="Times New Roman" w:cs="Times New Roman"/>
-        </w:rPr>
-      </w:pPr>
-      <w:r>
-        <w:rPr>
-          <w:rFonts w:ascii="Times New Roman" w:eastAsia="宋体" w:hAnsi="Times New Roman" w:cs="Times New Roman" w:hint="eastAsia"/>
-        </w:rPr>
-        <w:t>优化高架桥阴影渲染</w:t>
-      </w:r>
-    </w:p>
-    <w:p>
-      <w:pPr>
-        <w:pStyle w:val="a9"/>
-        <w:numPr>
-          <w:ilvl w:val="0"/>
-          <w:numId w:val="43"/>
-        </w:numPr>
-        <w:rPr>
-          <w:rFonts w:ascii="Times New Roman" w:eastAsia="宋体" w:hAnsi="Times New Roman" w:cs="Times New Roman"/>
-        </w:rPr>
-      </w:pPr>
-      <w:r>
-        <w:rPr>
-          <w:rFonts w:ascii="Times New Roman" w:eastAsia="宋体" w:hAnsi="Times New Roman" w:cs="Times New Roman" w:hint="eastAsia"/>
-        </w:rPr>
-        <w:t>使用格式刷时会显示被修改的属性</w:t>
-      </w:r>
-    </w:p>
-    <w:p>
-      <w:pPr>
-        <w:pStyle w:val="a9"/>
-        <w:numPr>
-          <w:ilvl w:val="0"/>
-          <w:numId w:val="43"/>
-        </w:numPr>
-        <w:rPr>
-          <w:rFonts w:ascii="Times New Roman" w:eastAsia="宋体" w:hAnsi="Times New Roman" w:cs="Times New Roman"/>
-        </w:rPr>
-      </w:pPr>
-      <w:r>
-        <w:rPr>
-          <w:rFonts w:ascii="Times New Roman" w:eastAsia="宋体" w:hAnsi="Times New Roman" w:cs="Times New Roman" w:hint="eastAsia"/>
-        </w:rPr>
-        <w:t>优化单元标记和路径点的渲染效率</w:t>
-      </w:r>
-    </w:p>
-    <w:p>
-      <w:pPr>
-        <w:pStyle w:val="a9"/>
-        <w:numPr>
-          <w:ilvl w:val="0"/>
-          <w:numId w:val="43"/>
-        </w:numPr>
-        <w:rPr>
-          <w:rFonts w:ascii="Times New Roman" w:eastAsia="宋体" w:hAnsi="Times New Roman" w:cs="Times New Roman"/>
-        </w:rPr>
-      </w:pPr>
-      <w:r>
-        <w:rPr>
-          <w:rFonts w:ascii="Times New Roman" w:eastAsia="宋体" w:hAnsi="Times New Roman" w:cs="Times New Roman" w:hint="eastAsia"/>
-        </w:rPr>
-        <w:t>支持车辆单位的额外炮塔和额外炮管</w:t>
-      </w:r>
-    </w:p>
-    <w:p>
-      <w:pPr>
-        <w:pStyle w:val="a9"/>
-        <w:numPr>
-          <w:ilvl w:val="0"/>
-          <w:numId w:val="43"/>
-        </w:numPr>
-        <w:rPr>
-          <w:rFonts w:ascii="Times New Roman" w:eastAsia="宋体" w:hAnsi="Times New Roman" w:cs="Times New Roman"/>
-        </w:rPr>
-      </w:pPr>
-      <w:r>
-        <w:rPr>
-          <w:rFonts w:ascii="Times New Roman" w:eastAsia="宋体" w:hAnsi="Times New Roman" w:cs="Times New Roman"/>
-        </w:rPr>
-        <w:t>I</w:t>
-      </w:r>
-      <w:r>
-        <w:rPr>
-          <w:rFonts w:ascii="Times New Roman" w:eastAsia="宋体" w:hAnsi="Times New Roman" w:cs="Times New Roman" w:hint="eastAsia"/>
-        </w:rPr>
-        <w:t>ni</w:t>
-      </w:r>
-      <w:r>
-        <w:rPr>
-          <w:rFonts w:ascii="Times New Roman" w:eastAsia="宋体" w:hAnsi="Times New Roman" w:cs="Times New Roman" w:hint="eastAsia"/>
-        </w:rPr>
-        <w:t>编辑器和</w:t>
-      </w:r>
-      <w:r>
-        <w:rPr>
-          <w:rFonts w:ascii="Times New Roman" w:eastAsia="宋体" w:hAnsi="Times New Roman" w:cs="Times New Roman" w:hint="eastAsia"/>
-        </w:rPr>
-        <w:t>lua</w:t>
-      </w:r>
-      <w:r>
-        <w:rPr>
-          <w:rFonts w:ascii="Times New Roman" w:eastAsia="宋体" w:hAnsi="Times New Roman" w:cs="Times New Roman" w:hint="eastAsia"/>
-        </w:rPr>
-        <w:t>脚本输入窗口引入</w:t>
-      </w:r>
-      <w:r>
-        <w:rPr>
-          <w:rFonts w:ascii="Times New Roman" w:eastAsia="宋体" w:hAnsi="Times New Roman" w:cs="Times New Roman" w:hint="eastAsia"/>
-        </w:rPr>
-        <w:t>Scintilla</w:t>
-      </w:r>
-      <w:r>
-        <w:rPr>
-          <w:rFonts w:ascii="Times New Roman" w:eastAsia="宋体" w:hAnsi="Times New Roman" w:cs="Times New Roman" w:hint="eastAsia"/>
-        </w:rPr>
-        <w:t>引擎（</w:t>
-      </w:r>
-      <w:r>
-        <w:rPr>
-          <w:rFonts w:ascii="Times New Roman" w:eastAsia="宋体" w:hAnsi="Times New Roman" w:cs="Times New Roman" w:hint="eastAsia"/>
-        </w:rPr>
-        <w:t>notepad++</w:t>
-      </w:r>
-      <w:r>
-        <w:rPr>
-          <w:rFonts w:ascii="Times New Roman" w:eastAsia="宋体" w:hAnsi="Times New Roman" w:cs="Times New Roman" w:hint="eastAsia"/>
-        </w:rPr>
-        <w:t>同款），支持语法高亮</w:t>
-      </w:r>
-      <w:r>
-        <w:rPr>
-          <w:rFonts w:ascii="Times New Roman" w:eastAsia="宋体" w:hAnsi="Times New Roman" w:cs="Times New Roman" w:hint="eastAsia"/>
-        </w:rPr>
-        <w:t>、行数显示、矩形选择等特性</w:t>
-      </w:r>
-    </w:p>
-    <w:p>
-      <w:pPr>
-        <w:pStyle w:val="a9"/>
-        <w:numPr>
-          <w:ilvl w:val="0"/>
-          <w:numId w:val="43"/>
-        </w:numPr>
-        <w:rPr>
-          <w:rFonts w:ascii="Times New Roman" w:eastAsia="宋体" w:hAnsi="Times New Roman" w:cs="Times New Roman"/>
-        </w:rPr>
-      </w:pPr>
-      <w:r>
-        <w:rPr>
-          <w:rFonts w:ascii="Times New Roman" w:eastAsia="宋体" w:hAnsi="Times New Roman" w:cs="Times New Roman" w:hint="eastAsia"/>
-        </w:rPr>
-        <w:t>修复触发资源重载后，自定义地形组崩溃的</w:t>
-      </w:r>
-      <w:r>
-        <w:rPr>
-          <w:rFonts w:ascii="Times New Roman" w:eastAsia="宋体" w:hAnsi="Times New Roman" w:cs="Times New Roman" w:hint="eastAsia"/>
-        </w:rPr>
-        <w:t>bug</w:t>
-      </w:r>
-    </w:p>
-    <w:p>
-      <w:pPr>
-        <w:pStyle w:val="a9"/>
-        <w:numPr>
-          <w:ilvl w:val="0"/>
-          <w:numId w:val="43"/>
-        </w:numPr>
-        <w:rPr>
-          <w:rFonts w:ascii="Times New Roman" w:eastAsia="宋体" w:hAnsi="Times New Roman" w:cs="Times New Roman"/>
-        </w:rPr>
-      </w:pPr>
-      <w:r>
-        <w:rPr>
-          <w:rFonts w:ascii="Times New Roman" w:eastAsia="宋体" w:hAnsi="Times New Roman" w:cs="Times New Roman" w:hint="eastAsia"/>
-        </w:rPr>
-        <w:t>触发编辑器的行为列表支持多选，新增“上移”“下移”与“拆分”按钮，可以将选中的行为上下移动或拆分出新触发</w:t>
-      </w:r>
-    </w:p>
-    <w:p>
-      <w:pPr>
-        <w:pStyle w:val="a9"/>
-        <w:numPr>
-          <w:ilvl w:val="0"/>
-          <w:numId w:val="43"/>
-        </w:numPr>
-        <w:rPr>
-          <w:rFonts w:ascii="Times New Roman" w:eastAsia="宋体" w:hAnsi="Times New Roman" w:cs="Times New Roman"/>
-        </w:rPr>
-      </w:pPr>
-      <w:r>
-        <w:rPr>
-          <w:rFonts w:ascii="Times New Roman" w:eastAsia="宋体" w:hAnsi="Times New Roman" w:cs="Times New Roman" w:hint="eastAsia"/>
-        </w:rPr>
-        <w:t>支持通过按住</w:t>
-      </w:r>
-      <w:r>
-        <w:rPr>
-          <w:rFonts w:ascii="Times New Roman" w:eastAsia="宋体" w:hAnsi="Times New Roman" w:cs="Times New Roman" w:hint="eastAsia"/>
-        </w:rPr>
-        <w:t>alt</w:t>
-      </w:r>
-      <w:r>
-        <w:rPr>
-          <w:rFonts w:ascii="Times New Roman" w:eastAsia="宋体" w:hAnsi="Times New Roman" w:cs="Times New Roman" w:hint="eastAsia"/>
-        </w:rPr>
-        <w:t>键直线放置单元标记</w:t>
-      </w:r>
-    </w:p>
-    <w:p>
-      <w:pPr>
-        <w:pStyle w:val="a9"/>
-        <w:numPr>
-          <w:ilvl w:val="0"/>
-          <w:numId w:val="43"/>
-        </w:numPr>
-        <w:rPr>
-          <w:rFonts w:ascii="Times New Roman" w:eastAsia="宋体" w:hAnsi="Times New Roman" w:cs="Times New Roman"/>
-        </w:rPr>
-      </w:pPr>
-      <w:r>
-        <w:rPr>
-          <w:rFonts w:ascii="Times New Roman" w:eastAsia="宋体" w:hAnsi="Times New Roman" w:cs="Times New Roman" w:hint="eastAsia"/>
-        </w:rPr>
-        <w:t>支持通过设置附加命令行参数直接打开地图，格式为</w:t>
-      </w:r>
-      <w:r>
-        <w:rPr>
-          <w:rFonts w:ascii="Times New Roman" w:eastAsia="宋体" w:hAnsi="Times New Roman" w:cs="Times New Roman" w:hint="eastAsia"/>
-        </w:rPr>
-        <w:t xml:space="preserve">-o </w:t>
-      </w:r>
-      <w:r>
-        <w:rPr>
-          <w:rFonts w:ascii="Times New Roman" w:eastAsia="宋体" w:hAnsi="Times New Roman" w:cs="Times New Roman"/>
-        </w:rPr>
-        <w:t>“</w:t>
-      </w:r>
-      <w:r>
-        <w:rPr>
-          <w:rFonts w:ascii="Times New Roman" w:eastAsia="宋体" w:hAnsi="Times New Roman" w:cs="Times New Roman" w:hint="eastAsia"/>
-        </w:rPr>
-        <w:t>地图路径</w:t>
-      </w:r>
-      <w:r>
-        <w:rPr>
-          <w:rFonts w:ascii="Times New Roman" w:eastAsia="宋体" w:hAnsi="Times New Roman" w:cs="Times New Roman"/>
-        </w:rPr>
-        <w:t>”</w:t>
-      </w:r>
-      <w:r>
-        <w:rPr>
-          <w:rFonts w:ascii="Times New Roman" w:eastAsia="宋体" w:hAnsi="Times New Roman" w:cs="Times New Roman" w:hint="eastAsia"/>
-        </w:rPr>
-        <w:t>或</w:t>
-      </w:r>
-      <w:r>
-        <w:rPr>
-          <w:rFonts w:ascii="Times New Roman" w:eastAsia="宋体" w:hAnsi="Times New Roman" w:cs="Times New Roman" w:hint="eastAsia"/>
-        </w:rPr>
-        <w:t xml:space="preserve">--open </w:t>
-      </w:r>
-      <w:r>
-        <w:rPr>
-          <w:rFonts w:ascii="Times New Roman" w:eastAsia="宋体" w:hAnsi="Times New Roman" w:cs="Times New Roman"/>
-        </w:rPr>
-        <w:t>“</w:t>
-      </w:r>
-      <w:r>
-        <w:rPr>
-          <w:rFonts w:ascii="Times New Roman" w:eastAsia="宋体" w:hAnsi="Times New Roman" w:cs="Times New Roman" w:hint="eastAsia"/>
-        </w:rPr>
-        <w:t>地图路径</w:t>
-      </w:r>
-      <w:r>
-        <w:rPr>
-          <w:rFonts w:ascii="Times New Roman" w:eastAsia="宋体" w:hAnsi="Times New Roman" w:cs="Times New Roman"/>
-        </w:rPr>
-        <w:t>”</w:t>
-      </w:r>
-      <w:r>
-        <w:rPr>
-          <w:rFonts w:ascii="Times New Roman" w:eastAsia="宋体" w:hAnsi="Times New Roman" w:cs="Times New Roman" w:hint="eastAsia"/>
-        </w:rPr>
-        <w:t>，命令行参数可以填写在</w:t>
-      </w:r>
-      <w:r>
-        <w:rPr>
-          <w:rFonts w:ascii="Times New Roman" w:eastAsia="宋体" w:hAnsi="Times New Roman" w:cs="Times New Roman" w:hint="eastAsia"/>
-        </w:rPr>
-        <w:t>FA2spLaunch.exe</w:t>
-      </w:r>
-      <w:r>
-        <w:rPr>
-          <w:rFonts w:ascii="Times New Roman" w:eastAsia="宋体" w:hAnsi="Times New Roman" w:cs="Times New Roman" w:hint="eastAsia"/>
-        </w:rPr>
-        <w:t>后方，或者</w:t>
-      </w:r>
-      <w:r>
-        <w:rPr>
-          <w:rFonts w:ascii="Times New Roman" w:eastAsia="宋体" w:hAnsi="Times New Roman" w:cs="Times New Roman" w:hint="eastAsia"/>
-        </w:rPr>
-        <w:t>RunFA2sp.bat</w:t>
-      </w:r>
-      <w:r>
-        <w:rPr>
-          <w:rFonts w:ascii="Times New Roman" w:eastAsia="宋体" w:hAnsi="Times New Roman" w:cs="Times New Roman" w:hint="eastAsia"/>
-        </w:rPr>
-        <w:t>内</w:t>
-      </w:r>
-    </w:p>
-    <w:p>
-      <w:pPr>
-        <w:pStyle w:val="a9"/>
-        <w:numPr>
-          <w:ilvl w:val="0"/>
-          <w:numId w:val="43"/>
-        </w:numPr>
-        <w:rPr>
-          <w:rFonts w:ascii="Times New Roman" w:eastAsia="宋体" w:hAnsi="Times New Roman" w:cs="Times New Roman"/>
-        </w:rPr>
-      </w:pPr>
-      <w:r>
-        <w:rPr>
-          <w:rFonts w:ascii="Times New Roman" w:eastAsia="宋体" w:hAnsi="Times New Roman" w:cs="Times New Roman" w:hint="eastAsia"/>
-        </w:rPr>
-        <w:t>修复当使用放置于地图行为时，对应的标签被删除后仍能摆放单元标记的</w:t>
-      </w:r>
-      <w:r>
-        <w:rPr>
-          <w:rFonts w:ascii="Times New Roman" w:eastAsia="宋体" w:hAnsi="Times New Roman" w:cs="Times New Roman" w:hint="eastAsia"/>
-        </w:rPr>
-        <w:t>bug</w:t>
-      </w:r>
-    </w:p>
-    <w:p>
-      <w:pPr>
-        <w:pStyle w:val="a9"/>
-        <w:numPr>
-          <w:ilvl w:val="0"/>
-          <w:numId w:val="43"/>
-        </w:numPr>
-        <w:rPr>
-          <w:rFonts w:ascii="Times New Roman" w:eastAsia="宋体" w:hAnsi="Times New Roman" w:cs="Times New Roman"/>
-        </w:rPr>
-      </w:pPr>
-      <w:r>
-        <w:rPr>
-          <w:rFonts w:ascii="Times New Roman" w:eastAsia="宋体" w:hAnsi="Times New Roman" w:cs="Times New Roman" w:hint="eastAsia"/>
-        </w:rPr>
-        <w:t>TheaterInfo</w:t>
-      </w:r>
-      <w:r>
-        <w:rPr>
-          <w:rFonts w:ascii="Times New Roman" w:eastAsia="宋体" w:hAnsi="Times New Roman" w:cs="Times New Roman" w:hint="eastAsia"/>
-        </w:rPr>
-        <w:t>内的自定义斜坡类型支持指定地形组下的特定地形块</w:t>
-      </w:r>
-    </w:p>
-    <w:p>
-      <w:pPr>
-        <w:pStyle w:val="a9"/>
-        <w:numPr>
-          <w:ilvl w:val="0"/>
-          <w:numId w:val="43"/>
-        </w:numPr>
-        <w:rPr>
-          <w:rFonts w:ascii="Times New Roman" w:eastAsia="宋体" w:hAnsi="Times New Roman" w:cs="Times New Roman"/>
-        </w:rPr>
-      </w:pPr>
-      <w:r>
-        <w:rPr>
-          <w:rFonts w:ascii="Times New Roman" w:eastAsia="宋体" w:hAnsi="Times New Roman" w:cs="Times New Roman" w:hint="eastAsia"/>
-        </w:rPr>
-        <w:t>支持为无图像单位显示缺省图像，详见</w:t>
-      </w:r>
-      <w:r>
-        <w:rPr>
-          <w:rFonts w:ascii="Times New Roman" w:eastAsia="宋体" w:hAnsi="Times New Roman" w:cs="Times New Roman" w:hint="eastAsia"/>
-        </w:rPr>
-        <w:t>UseDefaultUnitImage</w:t>
-      </w:r>
-    </w:p>
-    <w:p>
-      <w:pPr>
-        <w:pStyle w:val="a9"/>
-        <w:numPr>
-          <w:ilvl w:val="0"/>
-          <w:numId w:val="43"/>
-        </w:numPr>
-        <w:rPr>
-          <w:rFonts w:ascii="Times New Roman" w:eastAsia="宋体" w:hAnsi="Times New Roman" w:cs="Times New Roman"/>
-        </w:rPr>
-      </w:pPr>
-      <w:r>
-        <w:rPr>
-          <w:rFonts w:ascii="Times New Roman" w:eastAsia="宋体" w:hAnsi="Times New Roman" w:cs="Times New Roman" w:hint="eastAsia"/>
-        </w:rPr>
-        <w:t>支持</w:t>
-      </w:r>
-      <w:r>
-        <w:rPr>
-          <w:rFonts w:ascii="Times New Roman" w:eastAsia="宋体" w:hAnsi="Times New Roman" w:cs="Times New Roman" w:hint="eastAsia"/>
-        </w:rPr>
-        <w:t>ares</w:t>
-      </w:r>
-      <w:r>
-        <w:rPr>
-          <w:rFonts w:ascii="Times New Roman" w:eastAsia="宋体" w:hAnsi="Times New Roman" w:cs="Times New Roman" w:hint="eastAsia"/>
-        </w:rPr>
-        <w:t>的自定义军衔</w:t>
-      </w:r>
-    </w:p>
-    <w:p>
-      <w:pPr>
-        <w:pStyle w:val="a9"/>
-        <w:numPr>
-          <w:ilvl w:val="0"/>
-          <w:numId w:val="43"/>
-        </w:numPr>
-        <w:rPr>
-          <w:rFonts w:ascii="Times New Roman" w:eastAsia="宋体" w:hAnsi="Times New Roman" w:cs="Times New Roman"/>
-        </w:rPr>
-      </w:pPr>
-      <w:r>
-        <w:rPr>
-          <w:rFonts w:ascii="Times New Roman" w:eastAsia="宋体" w:hAnsi="Times New Roman" w:cs="Times New Roman" w:hint="eastAsia"/>
-        </w:rPr>
-        <w:t>对无图像地形对象和污染显示文本</w:t>
-      </w:r>
-    </w:p>
-    <w:p>
-      <w:pPr>
-        <w:pStyle w:val="a9"/>
-        <w:numPr>
-          <w:ilvl w:val="0"/>
-          <w:numId w:val="43"/>
-        </w:numPr>
-        <w:rPr>
-          <w:rFonts w:ascii="Times New Roman" w:eastAsia="宋体" w:hAnsi="Times New Roman" w:cs="Times New Roman"/>
-        </w:rPr>
-      </w:pPr>
-      <w:r>
-        <w:rPr>
-          <w:rFonts w:ascii="Times New Roman" w:eastAsia="宋体" w:hAnsi="Times New Roman" w:cs="Times New Roman" w:hint="eastAsia"/>
-        </w:rPr>
         <w:t>修复擦除覆盖物时，若围墙仅剩一格，无法正确调整连接关系的</w:t>
       </w:r>
       <w:r>
@@ -8107,7 +8138,6 @@
           <w:sz w:val="28"/>
           <w:szCs w:val="32"/>
         </w:rPr>
-        <w:lastRenderedPageBreak/>
         <w:t>1.3.4 (202</w:t>
       </w:r>
       <w:r>
@@ -9176,6 +9206,7 @@
         <w:rPr>
           <w:rFonts w:ascii="Times New Roman" w:eastAsia="宋体" w:hAnsi="Times New Roman" w:cs="Times New Roman" w:hint="eastAsia"/>
         </w:rPr>
+        <w:lastRenderedPageBreak/>
         <w:t>TurretShadow</w:t>
       </w:r>
       <w:r>
@@ -9200,7 +9231,6 @@
         <w:rPr>
           <w:rFonts w:ascii="Times New Roman" w:eastAsia="宋体" w:hAnsi="Times New Roman" w:cs="Times New Roman" w:hint="eastAsia"/>
         </w:rPr>
-        <w:lastRenderedPageBreak/>
         <w:t>修复未安装</w:t>
       </w:r>
       <w:r>
@@ -10263,6 +10293,7 @@
         <w:rPr>
           <w:rFonts w:ascii="Times New Roman" w:eastAsia="宋体" w:hAnsi="Times New Roman" w:cs="Times New Roman" w:hint="eastAsia"/>
         </w:rPr>
+        <w:lastRenderedPageBreak/>
         <w:t>仅当基地节点与相同建筑重叠时，才会在关闭建筑轮廓的情况下显示轮廓</w:t>
       </w:r>
     </w:p>
@@ -10289,7 +10320,6 @@
           <w:sz w:val="28"/>
           <w:szCs w:val="32"/>
         </w:rPr>
-        <w:lastRenderedPageBreak/>
         <w:t>1.</w:t>
       </w:r>
       <w:r>
@@ -11314,7 +11344,14 @@
         <w:rPr>
           <w:rFonts w:ascii="Times New Roman" w:eastAsia="宋体" w:hAnsi="Times New Roman" w:cs="Times New Roman" w:hint="eastAsia"/>
         </w:rPr>
-        <w:t>和键</w:t>
+        <w:t>和</w:t>
+      </w:r>
+      <w:r>
+        <w:rPr>
+          <w:rFonts w:ascii="Times New Roman" w:eastAsia="宋体" w:hAnsi="Times New Roman" w:cs="Times New Roman" w:hint="eastAsia"/>
+        </w:rPr>
+        <w:lastRenderedPageBreak/>
+        <w:t>键</w:t>
       </w:r>
       <w:r>
         <w:rPr>
@@ -11356,14 +11393,7 @@
         <w:rPr>
           <w:rFonts w:ascii="Times New Roman" w:eastAsia="宋体" w:hAnsi="Times New Roman" w:cs="Times New Roman" w:hint="eastAsia"/>
         </w:rPr>
-        <w:t>”变</w:t>
-      </w:r>
-      <w:r>
-        <w:rPr>
-          <w:rFonts w:ascii="Times New Roman" w:eastAsia="宋体" w:hAnsi="Times New Roman" w:cs="Times New Roman" w:hint="eastAsia"/>
-        </w:rPr>
-        <w:lastRenderedPageBreak/>
-        <w:t>为“</w:t>
+        <w:t>”变为“</w:t>
       </w:r>
       <w:r>
         <w:rPr>
@@ -12508,6 +12538,7 @@
         <w:rPr>
           <w:rFonts w:ascii="Times New Roman" w:eastAsia="宋体" w:hAnsi="Times New Roman" w:cs="Times New Roman" w:hint="eastAsia"/>
         </w:rPr>
+        <w:lastRenderedPageBreak/>
         <w:t>修补主程序，支持最高</w:t>
       </w:r>
       <w:r>
@@ -12550,7 +12581,6 @@
         <w:rPr>
           <w:rFonts w:ascii="Times New Roman" w:eastAsia="宋体" w:hAnsi="Times New Roman" w:cs="Times New Roman" w:hint="eastAsia"/>
         </w:rPr>
-        <w:lastRenderedPageBreak/>
         <w:t>修复暗色模式下部分按钮控件的文本不能换行的</w:t>
       </w:r>
       <w:r>
@@ -13677,6 +13707,7 @@
         <w:rPr>
           <w:rFonts w:ascii="Times New Roman" w:eastAsia="宋体" w:hAnsi="Times New Roman" w:cs="Times New Roman" w:hint="eastAsia"/>
         </w:rPr>
+        <w:lastRenderedPageBreak/>
         <w:t>修复物品浏览器的标签文本错误换行的</w:t>
       </w:r>
       <w:r>
@@ -13701,7 +13732,6 @@
         <w:rPr>
           <w:rFonts w:ascii="Times New Roman" w:eastAsia="宋体" w:hAnsi="Times New Roman" w:cs="Times New Roman" w:hint="eastAsia"/>
         </w:rPr>
-        <w:lastRenderedPageBreak/>
         <w:t>修复了地图检查器错误项过多时会挤在一起的</w:t>
       </w:r>
       <w:r>
@@ -14728,6 +14758,7 @@
         <w:rPr>
           <w:rFonts w:ascii="Times New Roman" w:eastAsia="宋体" w:hAnsi="Times New Roman" w:cs="Times New Roman" w:hint="eastAsia"/>
         </w:rPr>
+        <w:lastRenderedPageBreak/>
         <w:t>修复了新城市下使用绘制悬崖后部工具时，按</w:t>
       </w:r>
       <w:r>
@@ -14764,7 +14795,6 @@
         <w:rPr>
           <w:rFonts w:ascii="Times New Roman" w:eastAsia="宋体" w:hAnsi="Times New Roman" w:cs="Times New Roman" w:hint="eastAsia"/>
         </w:rPr>
-        <w:lastRenderedPageBreak/>
         <w:t>增强绘制悬崖工具，可以在不同地图类型的</w:t>
       </w:r>
       <w:r>
@@ -15791,6 +15821,7 @@
         <w:rPr>
           <w:rFonts w:ascii="Times New Roman" w:eastAsia="宋体" w:hAnsi="Times New Roman" w:cs="Times New Roman" w:hint="eastAsia"/>
         </w:rPr>
+        <w:lastRenderedPageBreak/>
         <w:t>修复建筑部分位于地图外时，建筑本体可能不能显示的</w:t>
       </w:r>
       <w:r>
@@ -15815,7 +15846,6 @@
         <w:rPr>
           <w:rFonts w:ascii="Times New Roman" w:eastAsia="宋体" w:hAnsi="Times New Roman" w:cs="Times New Roman" w:hint="eastAsia"/>
         </w:rPr>
-        <w:lastRenderedPageBreak/>
         <w:t>修复删除对象、格式刷使用大笔刷时，在地图边缘可能崩溃的</w:t>
       </w:r>
       <w:r>
@@ -16938,6 +16968,7 @@
         <w:rPr>
           <w:rFonts w:ascii="Times New Roman" w:eastAsia="宋体" w:hAnsi="Times New Roman" w:cs="Times New Roman" w:hint="eastAsia"/>
         </w:rPr>
+        <w:lastRenderedPageBreak/>
         <w:t>绘制连接地形支持铁路</w:t>
       </w:r>
     </w:p>
@@ -16956,7 +16987,6 @@
         <w:rPr>
           <w:rFonts w:ascii="Times New Roman" w:eastAsia="宋体" w:hAnsi="Times New Roman" w:cs="Times New Roman" w:hint="eastAsia"/>
         </w:rPr>
-        <w:lastRenderedPageBreak/>
         <w:t>支持</w:t>
       </w:r>
       <w:r>
@@ -17957,6 +17987,7 @@
         <w:rPr>
           <w:rFonts w:ascii="Times New Roman" w:eastAsia="宋体" w:hAnsi="Times New Roman" w:cs="Times New Roman" w:hint="eastAsia"/>
         </w:rPr>
+        <w:lastRenderedPageBreak/>
         <w:t>优化绘制连接地形的性能与内存占用</w:t>
       </w:r>
     </w:p>
@@ -17975,7 +18006,6 @@
         <w:rPr>
           <w:rFonts w:ascii="Times New Roman" w:eastAsia="宋体" w:hAnsi="Times New Roman" w:cs="Times New Roman" w:hint="eastAsia"/>
         </w:rPr>
-        <w:lastRenderedPageBreak/>
         <w:t>支持使用独立的进程存储游戏图像，以节约内存占用，详见</w:t>
       </w:r>
       <w:r>
@@ -18953,6 +18983,7 @@
         <w:rPr>
           <w:rFonts w:ascii="Times New Roman" w:eastAsia="宋体" w:hAnsi="Times New Roman" w:cs="Times New Roman" w:hint="eastAsia"/>
         </w:rPr>
+        <w:lastRenderedPageBreak/>
         <w:t>物品浏览器支持查看预览图</w:t>
       </w:r>
       <w:r>
@@ -18977,7 +19008,6 @@
         <w:rPr>
           <w:rFonts w:ascii="Times New Roman" w:eastAsia="宋体" w:hAnsi="Times New Roman" w:cs="Times New Roman" w:hint="eastAsia"/>
         </w:rPr>
-        <w:lastRenderedPageBreak/>
         <w:t>thumbnails</w:t>
       </w:r>
       <w:r>
@@ -19975,6 +20005,7 @@
         <w:rPr>
           <w:rFonts w:ascii="Times New Roman" w:eastAsia="宋体" w:hAnsi="Times New Roman" w:cs="Times New Roman" w:hint="eastAsia"/>
         </w:rPr>
+        <w:lastRenderedPageBreak/>
         <w:t>修复下拉菜单部分情况下选择失效的</w:t>
       </w:r>
       <w:r>
@@ -19999,7 +20030,6 @@
         <w:rPr>
           <w:rFonts w:ascii="Times New Roman" w:eastAsia="宋体" w:hAnsi="Times New Roman" w:cs="Times New Roman" w:hint="eastAsia"/>
         </w:rPr>
-        <w:lastRenderedPageBreak/>
         <w:t>修复下拉菜单自动搜索部分情况下异常被禁用的</w:t>
       </w:r>
       <w:r>
@@ -20942,6 +20972,7 @@
         <w:rPr>
           <w:rFonts w:ascii="Times New Roman" w:eastAsia="宋体" w:hAnsi="Times New Roman" w:cs="Times New Roman" w:hint="eastAsia"/>
         </w:rPr>
+        <w:lastRenderedPageBreak/>
         <w:t>修复了光照沙盒开启时，内存占用异常增高的</w:t>
       </w:r>
       <w:r>
@@ -20966,7 +20997,6 @@
         <w:rPr>
           <w:rFonts w:ascii="Times New Roman" w:eastAsia="宋体" w:hAnsi="Times New Roman" w:cs="Times New Roman" w:hint="eastAsia"/>
         </w:rPr>
-        <w:lastRenderedPageBreak/>
         <w:t>修复了触发、小队等名称中数字部分超过</w:t>
       </w:r>
       <w:r>
@@ -21917,6 +21947,7 @@
           <w:sz w:val="28"/>
           <w:szCs w:val="32"/>
         </w:rPr>
+        <w:lastRenderedPageBreak/>
         <w:t>1.0.5 (2025.02.24)</w:t>
       </w:r>
     </w:p>
@@ -21935,7 +21966,6 @@
         <w:rPr>
           <w:rFonts w:ascii="Times New Roman" w:eastAsia="宋体" w:hAnsi="Times New Roman" w:cs="Times New Roman" w:hint="eastAsia"/>
         </w:rPr>
-        <w:lastRenderedPageBreak/>
         <w:t>优化了</w:t>
       </w:r>
       <w:r>
@@ -22936,6 +22966,7 @@
         <w:rPr>
           <w:rFonts w:ascii="Times New Roman" w:eastAsia="宋体" w:hAnsi="Times New Roman" w:cs="Times New Roman" w:hint="eastAsia"/>
         </w:rPr>
+        <w:lastRenderedPageBreak/>
         <w:t>LAT</w:t>
       </w:r>
       <w:r>
@@ -22996,14 +23027,7 @@
         <w:rPr>
           <w:rFonts w:ascii="Times New Roman" w:eastAsia="宋体" w:hAnsi="Times New Roman" w:cs="Times New Roman" w:hint="eastAsia"/>
         </w:rPr>
-        <w:t>禁用搜索</w:t>
-      </w:r>
-      <w:r>
-        <w:rPr>
-          <w:rFonts w:ascii="Times New Roman" w:eastAsia="宋体" w:hAnsi="Times New Roman" w:cs="Times New Roman" w:hint="eastAsia"/>
-        </w:rPr>
-        <w:lastRenderedPageBreak/>
-        <w:t>功能以提升性能</w:t>
+        <w:t>禁用搜索功能以提升性能</w:t>
       </w:r>
     </w:p>
     <w:p>
@@ -24097,7 +24121,14 @@
         <w:rPr>
           <w:rFonts w:ascii="Times New Roman" w:eastAsia="宋体" w:hAnsi="Times New Roman" w:cs="Times New Roman" w:hint="eastAsia"/>
         </w:rPr>
-        <w:t>，用于路径点与数字互转，详见</w:t>
+        <w:t>，用于路径点</w:t>
+      </w:r>
+      <w:r>
+        <w:rPr>
+          <w:rFonts w:ascii="Times New Roman" w:eastAsia="宋体" w:hAnsi="Times New Roman" w:cs="Times New Roman" w:hint="eastAsia"/>
+        </w:rPr>
+        <w:lastRenderedPageBreak/>
+        <w:t>与数字互转，详见</w:t>
       </w:r>
       <w:r>
         <w:rPr>
@@ -24141,7 +24172,6 @@
           <w:sz w:val="28"/>
           <w:szCs w:val="32"/>
         </w:rPr>
-        <w:lastRenderedPageBreak/>
         <w:t>FA2SP HDM Edition</w:t>
       </w:r>
       <w:r>
@@ -24674,6 +24704,7 @@
         <w:rPr>
           <w:rFonts w:ascii="Times New Roman" w:eastAsia="宋体" w:hAnsi="Times New Roman" w:cs="Times New Roman" w:hint="eastAsia"/>
         </w:rPr>
+        <w:lastRenderedPageBreak/>
         <w:t>小队列表：位于地形浏览器的菜单栏中</w:t>
       </w:r>
     </w:p>
@@ -24688,7 +24719,6 @@
         <w:rPr>
           <w:rFonts w:ascii="Times New Roman" w:eastAsia="宋体" w:hAnsi="Times New Roman" w:cs="Times New Roman" w:hint="eastAsia"/>
         </w:rPr>
-        <w:lastRenderedPageBreak/>
         <w:t>特遣列表：位于地形浏览器的菜单栏中</w:t>
       </w:r>
     </w:p>
@@ -25225,14 +25255,14 @@
         <w:rPr>
           <w:rFonts w:ascii="Times New Roman" w:eastAsia="宋体" w:hAnsi="Times New Roman" w:cs="Times New Roman" w:hint="eastAsia"/>
         </w:rPr>
-        <w:t>，将触发设置、事件设置、行为设置集中显示在同一页面下，同时以列表状态显示事件与行为，可以显示当前事件或行</w:t>
+        <w:t>，将触发设置、事件设置、行为设</w:t>
       </w:r>
       <w:r>
         <w:rPr>
           <w:rFonts w:ascii="Times New Roman" w:eastAsia="宋体" w:hAnsi="Times New Roman" w:cs="Times New Roman" w:hint="eastAsia"/>
         </w:rPr>
         <w:lastRenderedPageBreak/>
-        <w:t>为的全部参数列表</w:t>
+        <w:t>置集中显示在同一页面下，同时以列表状态显示事件与行为，可以显示当前事件或行为的全部参数列表</w:t>
       </w:r>
     </w:p>
     <w:p>
@@ -25770,6 +25800,7 @@
         <w:rPr>
           <w:rFonts w:ascii="Times New Roman" w:eastAsia="宋体" w:hAnsi="Times New Roman" w:cs="Times New Roman" w:hint="eastAsia"/>
         </w:rPr>
+        <w:lastRenderedPageBreak/>
         <w:t>步兵子单元格：可以正常显示</w:t>
       </w:r>
       <w:r>
@@ -25782,14 +25813,7 @@
         <w:rPr>
           <w:rFonts w:ascii="Times New Roman" w:eastAsia="宋体" w:hAnsi="Times New Roman" w:cs="Times New Roman" w:hint="eastAsia"/>
         </w:rPr>
-        <w:t>号位（游戏中单元格中下位置）的步兵，同时允</w:t>
-      </w:r>
-      <w:r>
-        <w:rPr>
-          <w:rFonts w:ascii="Times New Roman" w:eastAsia="宋体" w:hAnsi="Times New Roman" w:cs="Times New Roman" w:hint="eastAsia"/>
-        </w:rPr>
-        <w:lastRenderedPageBreak/>
-        <w:t>许对步兵进行子单元格编辑，如指定步兵放置的位置，或者拖拽步兵的位置</w:t>
+        <w:t>号位（游戏中单元格中下位置）的步兵，同时允许对步兵进行子单元格编辑，如指定步兵放置的位置，或者拖拽步兵的位置</w:t>
       </w:r>
       <w:r>
         <w:rPr>
@@ -47061,7 +47085,7 @@
         <v:path o:extrusionok="f" gradientshapeok="t" o:connecttype="rect"/>
         <o:lock v:ext="edit" aspectratio="t"/>
       </v:shapetype>
-      <v:shape id="_x0000_i1030" type="#_x0000_t75" style="width:11.55pt;height:11.55pt" o:bullet="t">
+      <v:shape id="_x0000_i1031" type="#_x0000_t75" style="width:11.55pt;height:11.55pt" o:bullet="t">
         <v:imagedata r:id="rId1" o:title="mso9A9A"/>
       </v:shape>
     </w:pict>

</xml_diff>

<commit_message>
show a reference line when placing high bridge
</commit_message>
<xml_diff>
--- a/Supplementary/文档/FA2SP HDM Edition说明文档.docx
+++ b/Supplementary/文档/FA2SP HDM Edition说明文档.docx
@@ -167,7 +167,7 @@
           <w:rFonts w:ascii="宋体" w:eastAsia="宋体" w:hAnsi="宋体" w:hint="eastAsia"/>
           <w:sz w:val="24"/>
         </w:rPr>
-        <w:t>2</w:t>
+        <w:t>5</w:t>
       </w:r>
     </w:p>
     <w:p>
@@ -249,7 +249,7 @@
           <w:sz w:val="28"/>
           <w:szCs w:val="32"/>
         </w:rPr>
-        <w:t>02</w:t>
+        <w:t>0</w:t>
       </w:r>
       <w:r>
         <w:rPr>
@@ -259,737 +259,755 @@
           <w:sz w:val="28"/>
           <w:szCs w:val="32"/>
         </w:rPr>
-        <w:t>)</w:t>
-      </w:r>
-    </w:p>
-    <w:p>
-      <w:pPr>
-        <w:pStyle w:val="a9"/>
-        <w:numPr>
-          <w:ilvl w:val="0"/>
-          <w:numId w:val="11"/>
-        </w:numPr>
-        <w:rPr>
-          <w:rFonts w:ascii="Times New Roman" w:eastAsia="宋体" w:hAnsi="Times New Roman" w:cs="Times New Roman"/>
-        </w:rPr>
-      </w:pPr>
-      <w:r>
-        <w:rPr>
-          <w:rFonts w:ascii="Times New Roman" w:eastAsia="宋体" w:hAnsi="Times New Roman" w:cs="Times New Roman" w:hint="eastAsia"/>
-        </w:rPr>
-        <w:t>修复当系统关闭动画时，新下拉菜单无法正确定位到选择项的</w:t>
-      </w:r>
-      <w:r>
-        <w:rPr>
-          <w:rFonts w:ascii="Times New Roman" w:eastAsia="宋体" w:hAnsi="Times New Roman" w:cs="Times New Roman" w:hint="eastAsia"/>
-        </w:rPr>
-        <w:t>bug</w:t>
-      </w:r>
-    </w:p>
-    <w:p>
-      <w:pPr>
-        <w:pStyle w:val="a9"/>
-        <w:numPr>
-          <w:ilvl w:val="0"/>
-          <w:numId w:val="11"/>
-        </w:numPr>
-        <w:rPr>
-          <w:rFonts w:ascii="Times New Roman" w:eastAsia="宋体" w:hAnsi="Times New Roman" w:cs="Times New Roman"/>
-        </w:rPr>
-      </w:pPr>
-      <w:r>
-        <w:rPr>
-          <w:rFonts w:ascii="Times New Roman" w:eastAsia="宋体" w:hAnsi="Times New Roman" w:cs="Times New Roman" w:hint="eastAsia"/>
-        </w:rPr>
-        <w:t>修复开启</w:t>
-      </w:r>
-      <w:r>
-        <w:rPr>
-          <w:rFonts w:ascii="Times New Roman" w:eastAsia="宋体" w:hAnsi="Times New Roman" w:cs="Times New Roman" w:hint="eastAsia"/>
-        </w:rPr>
-        <w:t>gpu</w:t>
-      </w:r>
-      <w:r>
-        <w:rPr>
-          <w:rFonts w:ascii="Times New Roman" w:eastAsia="宋体" w:hAnsi="Times New Roman" w:cs="Times New Roman" w:hint="eastAsia"/>
-        </w:rPr>
-        <w:t>渲染时部分悬崖遮挡关系错误的</w:t>
-      </w:r>
-      <w:r>
-        <w:rPr>
-          <w:rFonts w:ascii="Times New Roman" w:eastAsia="宋体" w:hAnsi="Times New Roman" w:cs="Times New Roman" w:hint="eastAsia"/>
-        </w:rPr>
-        <w:t>bug</w:t>
-      </w:r>
-    </w:p>
-    <w:p>
-      <w:pPr>
-        <w:pStyle w:val="a9"/>
-        <w:numPr>
-          <w:ilvl w:val="0"/>
-          <w:numId w:val="11"/>
-        </w:numPr>
-        <w:rPr>
-          <w:rFonts w:ascii="Times New Roman" w:eastAsia="宋体" w:hAnsi="Times New Roman" w:cs="Times New Roman"/>
-        </w:rPr>
-      </w:pPr>
-      <w:r>
-        <w:rPr>
-          <w:rFonts w:ascii="Times New Roman" w:eastAsia="宋体" w:hAnsi="Times New Roman" w:cs="Times New Roman" w:hint="eastAsia"/>
-        </w:rPr>
-        <w:t>修复按键盘</w:t>
-      </w:r>
-      <w:r>
-        <w:rPr>
-          <w:rFonts w:ascii="Times New Roman" w:eastAsia="宋体" w:hAnsi="Times New Roman" w:cs="Times New Roman" w:hint="eastAsia"/>
-        </w:rPr>
-        <w:t>delete</w:t>
-      </w:r>
-      <w:r>
-        <w:rPr>
-          <w:rFonts w:ascii="Times New Roman" w:eastAsia="宋体" w:hAnsi="Times New Roman" w:cs="Times New Roman" w:hint="eastAsia"/>
-        </w:rPr>
-        <w:t>键删除单位历史记录错误的</w:t>
-      </w:r>
-      <w:r>
-        <w:rPr>
-          <w:rFonts w:ascii="Times New Roman" w:eastAsia="宋体" w:hAnsi="Times New Roman" w:cs="Times New Roman" w:hint="eastAsia"/>
-        </w:rPr>
-        <w:t>bug</w:t>
-      </w:r>
-    </w:p>
-    <w:p>
-      <w:pPr>
-        <w:pStyle w:val="a9"/>
-        <w:numPr>
-          <w:ilvl w:val="0"/>
-          <w:numId w:val="11"/>
-        </w:numPr>
-        <w:rPr>
-          <w:rFonts w:ascii="Times New Roman" w:eastAsia="宋体" w:hAnsi="Times New Roman" w:cs="Times New Roman"/>
-        </w:rPr>
-      </w:pPr>
-      <w:r>
-        <w:rPr>
-          <w:rFonts w:ascii="Times New Roman" w:eastAsia="宋体" w:hAnsi="Times New Roman" w:cs="Times New Roman" w:hint="eastAsia"/>
-        </w:rPr>
-        <w:t>调整地形浏览器图像的选中矩形框，使其更加明显</w:t>
-      </w:r>
-    </w:p>
-    <w:p>
-      <w:pPr>
-        <w:pStyle w:val="a9"/>
-        <w:numPr>
-          <w:ilvl w:val="0"/>
-          <w:numId w:val="11"/>
-        </w:numPr>
-        <w:rPr>
-          <w:rFonts w:ascii="Times New Roman" w:eastAsia="宋体" w:hAnsi="Times New Roman" w:cs="Times New Roman"/>
-        </w:rPr>
-      </w:pPr>
-      <w:r>
-        <w:rPr>
-          <w:rFonts w:ascii="Times New Roman" w:eastAsia="宋体" w:hAnsi="Times New Roman" w:cs="Times New Roman" w:hint="eastAsia"/>
-        </w:rPr>
-        <w:t>修复渲染地图时不渲染</w:t>
-      </w:r>
-      <w:r>
-        <w:rPr>
-          <w:rFonts w:ascii="Times New Roman" w:eastAsia="宋体" w:hAnsi="Times New Roman" w:cs="Times New Roman" w:hint="eastAsia"/>
-        </w:rPr>
-        <w:t>InvisibleInGame=yes</w:t>
-      </w:r>
-      <w:r>
-        <w:rPr>
-          <w:rFonts w:ascii="Times New Roman" w:eastAsia="宋体" w:hAnsi="Times New Roman" w:cs="Times New Roman" w:hint="eastAsia"/>
-        </w:rPr>
-        <w:t>的建筑的</w:t>
-      </w:r>
-      <w:r>
-        <w:rPr>
-          <w:rFonts w:ascii="Times New Roman" w:eastAsia="宋体" w:hAnsi="Times New Roman" w:cs="Times New Roman" w:hint="eastAsia"/>
-        </w:rPr>
-        <w:t>AlphaImage</w:t>
-      </w:r>
-      <w:r>
-        <w:rPr>
-          <w:rFonts w:ascii="Times New Roman" w:eastAsia="宋体" w:hAnsi="Times New Roman" w:cs="Times New Roman" w:hint="eastAsia"/>
-        </w:rPr>
-        <w:t>的</w:t>
-      </w:r>
-      <w:r>
-        <w:rPr>
-          <w:rFonts w:ascii="Times New Roman" w:eastAsia="宋体" w:hAnsi="Times New Roman" w:cs="Times New Roman" w:hint="eastAsia"/>
-        </w:rPr>
-        <w:t>bug</w:t>
-      </w:r>
-    </w:p>
-    <w:p>
-      <w:pPr>
-        <w:pStyle w:val="a9"/>
-        <w:numPr>
-          <w:ilvl w:val="0"/>
-          <w:numId w:val="11"/>
-        </w:numPr>
-        <w:rPr>
-          <w:rFonts w:ascii="Times New Roman" w:eastAsia="宋体" w:hAnsi="Times New Roman" w:cs="Times New Roman"/>
-        </w:rPr>
-      </w:pPr>
-      <w:r>
-        <w:rPr>
-          <w:rFonts w:ascii="Times New Roman" w:eastAsia="宋体" w:hAnsi="Times New Roman" w:cs="Times New Roman" w:hint="eastAsia"/>
-        </w:rPr>
-        <w:t>修复启用建筑筛选时无法隐藏阴影的</w:t>
-      </w:r>
-      <w:r>
-        <w:rPr>
-          <w:rFonts w:ascii="Times New Roman" w:eastAsia="宋体" w:hAnsi="Times New Roman" w:cs="Times New Roman" w:hint="eastAsia"/>
-        </w:rPr>
-        <w:t>bug</w:t>
-      </w:r>
-    </w:p>
-    <w:p>
-      <w:pPr>
-        <w:pStyle w:val="a9"/>
-        <w:numPr>
-          <w:ilvl w:val="0"/>
-          <w:numId w:val="11"/>
-        </w:numPr>
-        <w:rPr>
-          <w:rFonts w:ascii="Times New Roman" w:eastAsia="宋体" w:hAnsi="Times New Roman" w:cs="Times New Roman"/>
-        </w:rPr>
-      </w:pPr>
-      <w:r>
-        <w:rPr>
-          <w:rFonts w:ascii="Times New Roman" w:eastAsia="宋体" w:hAnsi="Times New Roman" w:cs="Times New Roman" w:hint="eastAsia"/>
-        </w:rPr>
-        <w:t>查找引用窗口增加</w:t>
-      </w:r>
-      <w:r>
-        <w:rPr>
-          <w:rFonts w:ascii="Times New Roman" w:eastAsia="宋体" w:hAnsi="Times New Roman" w:cs="Times New Roman" w:hint="eastAsia"/>
-        </w:rPr>
-        <w:t>跟随活动窗口</w:t>
-      </w:r>
-      <w:r>
-        <w:rPr>
-          <w:rFonts w:ascii="Times New Roman" w:eastAsia="宋体" w:hAnsi="Times New Roman" w:cs="Times New Roman" w:hint="eastAsia"/>
-        </w:rPr>
-        <w:t>选项，勾选后可以实时根据活动窗口切换内容</w:t>
-      </w:r>
-    </w:p>
-    <w:p>
-      <w:pPr>
-        <w:pStyle w:val="a9"/>
-        <w:numPr>
-          <w:ilvl w:val="0"/>
-          <w:numId w:val="11"/>
-        </w:numPr>
-        <w:rPr>
-          <w:rFonts w:ascii="Times New Roman" w:eastAsia="宋体" w:hAnsi="Times New Roman" w:cs="Times New Roman"/>
-        </w:rPr>
-      </w:pPr>
-      <w:r>
-        <w:rPr>
-          <w:rFonts w:ascii="Times New Roman" w:eastAsia="宋体" w:hAnsi="Times New Roman" w:cs="Times New Roman" w:hint="eastAsia"/>
-        </w:rPr>
-        <w:t>修复修改作战小队名称后，</w:t>
-      </w:r>
-      <w:r>
-        <w:rPr>
-          <w:rFonts w:ascii="Times New Roman" w:eastAsia="宋体" w:hAnsi="Times New Roman" w:cs="Times New Roman" w:hint="eastAsia"/>
-        </w:rPr>
-        <w:t>ai</w:t>
-      </w:r>
-      <w:r>
-        <w:rPr>
-          <w:rFonts w:ascii="Times New Roman" w:eastAsia="宋体" w:hAnsi="Times New Roman" w:cs="Times New Roman" w:hint="eastAsia"/>
-        </w:rPr>
-        <w:t>触发编辑器的小队</w:t>
-      </w:r>
-      <w:r>
-        <w:rPr>
-          <w:rFonts w:ascii="Times New Roman" w:eastAsia="宋体" w:hAnsi="Times New Roman" w:cs="Times New Roman" w:hint="eastAsia"/>
-        </w:rPr>
-        <w:t>#2</w:t>
-      </w:r>
-      <w:r>
-        <w:rPr>
-          <w:rFonts w:ascii="Times New Roman" w:eastAsia="宋体" w:hAnsi="Times New Roman" w:cs="Times New Roman" w:hint="eastAsia"/>
-        </w:rPr>
-        <w:t>显示错误的</w:t>
-      </w:r>
-      <w:r>
-        <w:rPr>
-          <w:rFonts w:ascii="Times New Roman" w:eastAsia="宋体" w:hAnsi="Times New Roman" w:cs="Times New Roman" w:hint="eastAsia"/>
-        </w:rPr>
-        <w:t>bug</w:t>
-      </w:r>
-    </w:p>
-    <w:p>
-      <w:pPr>
-        <w:pStyle w:val="a9"/>
-        <w:numPr>
-          <w:ilvl w:val="0"/>
-          <w:numId w:val="11"/>
-        </w:numPr>
-        <w:rPr>
-          <w:rFonts w:ascii="Times New Roman" w:eastAsia="宋体" w:hAnsi="Times New Roman" w:cs="Times New Roman"/>
-        </w:rPr>
-      </w:pPr>
-      <w:r>
-        <w:rPr>
-          <w:rFonts w:ascii="Times New Roman" w:eastAsia="宋体" w:hAnsi="Times New Roman" w:cs="Times New Roman" w:hint="eastAsia"/>
-        </w:rPr>
-        <w:t>触发、小队等编辑器支持为</w:t>
-      </w:r>
-      <w:r>
-        <w:rPr>
-          <w:rFonts w:ascii="Times New Roman" w:eastAsia="宋体" w:hAnsi="Times New Roman" w:cs="Times New Roman" w:hint="eastAsia"/>
-        </w:rPr>
-        <w:t>ID</w:t>
-      </w:r>
-      <w:r>
-        <w:rPr>
-          <w:rFonts w:ascii="Times New Roman" w:eastAsia="宋体" w:hAnsi="Times New Roman" w:cs="Times New Roman" w:hint="eastAsia"/>
-        </w:rPr>
-        <w:t>染色，双击拖拽小点即可设置颜色</w:t>
-      </w:r>
-    </w:p>
-    <w:p>
-      <w:pPr>
-        <w:pStyle w:val="a9"/>
-        <w:numPr>
-          <w:ilvl w:val="0"/>
-          <w:numId w:val="11"/>
-        </w:numPr>
-        <w:rPr>
-          <w:rFonts w:ascii="Times New Roman" w:eastAsia="宋体" w:hAnsi="Times New Roman" w:cs="Times New Roman"/>
-        </w:rPr>
-      </w:pPr>
-      <w:r>
-        <w:rPr>
-          <w:rFonts w:ascii="Times New Roman" w:eastAsia="宋体" w:hAnsi="Times New Roman" w:cs="Times New Roman" w:hint="eastAsia"/>
-        </w:rPr>
-        <w:t>单元标记支持笔刷大小放置</w:t>
-      </w:r>
-    </w:p>
-    <w:p>
-      <w:pPr>
-        <w:pStyle w:val="a9"/>
-        <w:numPr>
-          <w:ilvl w:val="0"/>
-          <w:numId w:val="11"/>
-        </w:numPr>
-        <w:rPr>
-          <w:rFonts w:ascii="Times New Roman" w:eastAsia="宋体" w:hAnsi="Times New Roman" w:cs="Times New Roman"/>
-        </w:rPr>
-      </w:pPr>
-      <w:r>
-        <w:rPr>
-          <w:rFonts w:ascii="Times New Roman" w:eastAsia="宋体" w:hAnsi="Times New Roman" w:cs="Times New Roman" w:hint="eastAsia"/>
-        </w:rPr>
-        <w:t>增加新的</w:t>
-      </w:r>
-      <w:r>
-        <w:rPr>
-          <w:rFonts w:ascii="Times New Roman" w:eastAsia="宋体" w:hAnsi="Times New Roman" w:cs="Times New Roman" w:hint="eastAsia"/>
-        </w:rPr>
-        <w:t>lua</w:t>
-      </w:r>
-      <w:r>
-        <w:rPr>
-          <w:rFonts w:ascii="Times New Roman" w:eastAsia="宋体" w:hAnsi="Times New Roman" w:cs="Times New Roman" w:hint="eastAsia"/>
-        </w:rPr>
-        <w:t>脚本，由</w:t>
-      </w:r>
-      <w:r>
-        <w:rPr>
-          <w:rFonts w:ascii="Times New Roman" w:eastAsia="宋体" w:hAnsi="Times New Roman" w:cs="Times New Roman" w:hint="eastAsia"/>
-        </w:rPr>
-        <w:t>AUY</w:t>
-      </w:r>
-      <w:r>
-        <w:rPr>
-          <w:rFonts w:ascii="Times New Roman" w:eastAsia="宋体" w:hAnsi="Times New Roman" w:cs="Times New Roman" w:hint="eastAsia"/>
-        </w:rPr>
-        <w:t>制作</w:t>
-      </w:r>
-    </w:p>
-    <w:p>
-      <w:pPr>
-        <w:pStyle w:val="a9"/>
-        <w:numPr>
-          <w:ilvl w:val="0"/>
-          <w:numId w:val="11"/>
-        </w:numPr>
-        <w:rPr>
-          <w:rFonts w:ascii="Times New Roman" w:eastAsia="宋体" w:hAnsi="Times New Roman" w:cs="Times New Roman"/>
-        </w:rPr>
-      </w:pPr>
-      <w:r>
-        <w:rPr>
-          <w:rFonts w:ascii="Times New Roman" w:eastAsia="宋体" w:hAnsi="Times New Roman" w:cs="Times New Roman" w:hint="eastAsia"/>
-        </w:rPr>
-        <w:t>修复跨地图类型粘贴时地形转换部分失效的</w:t>
-      </w:r>
-      <w:r>
-        <w:rPr>
-          <w:rFonts w:ascii="Times New Roman" w:eastAsia="宋体" w:hAnsi="Times New Roman" w:cs="Times New Roman" w:hint="eastAsia"/>
-        </w:rPr>
-        <w:t>bug</w:t>
-      </w:r>
-    </w:p>
-    <w:p>
-      <w:pPr>
-        <w:pStyle w:val="a9"/>
-        <w:numPr>
-          <w:ilvl w:val="0"/>
-          <w:numId w:val="11"/>
-        </w:numPr>
-        <w:rPr>
-          <w:rFonts w:ascii="Times New Roman" w:eastAsia="宋体" w:hAnsi="Times New Roman" w:cs="Times New Roman"/>
-        </w:rPr>
-      </w:pPr>
-      <w:r>
-        <w:rPr>
-          <w:rFonts w:ascii="Times New Roman" w:eastAsia="宋体" w:hAnsi="Times New Roman" w:cs="Times New Roman" w:hint="eastAsia"/>
-        </w:rPr>
-        <w:t>可以记录不同鼠标操作的笔刷大小，并在切换时自动还原，详见</w:t>
-      </w:r>
-      <w:r>
-        <w:rPr>
-          <w:rFonts w:ascii="Times New Roman" w:eastAsia="宋体" w:hAnsi="Times New Roman" w:cs="Times New Roman" w:hint="eastAsia"/>
-        </w:rPr>
-        <w:t>RecordBrushSizeHistory</w:t>
-      </w:r>
-    </w:p>
-    <w:p>
-      <w:pPr>
-        <w:pStyle w:val="a9"/>
-        <w:numPr>
-          <w:ilvl w:val="0"/>
-          <w:numId w:val="11"/>
-        </w:numPr>
-        <w:rPr>
-          <w:rFonts w:ascii="Times New Roman" w:eastAsia="宋体" w:hAnsi="Times New Roman" w:cs="Times New Roman"/>
-        </w:rPr>
-      </w:pPr>
-      <w:r>
-        <w:rPr>
-          <w:rFonts w:ascii="Times New Roman" w:eastAsia="宋体" w:hAnsi="Times New Roman" w:cs="Times New Roman" w:hint="eastAsia"/>
-        </w:rPr>
-        <w:t>增加</w:t>
-      </w:r>
-      <w:r>
-        <w:rPr>
-          <w:rFonts w:ascii="Times New Roman" w:eastAsia="宋体" w:hAnsi="Times New Roman" w:cs="Times New Roman" w:hint="eastAsia"/>
-        </w:rPr>
-        <w:t>/</w:t>
-      </w:r>
-      <w:r>
-        <w:rPr>
-          <w:rFonts w:ascii="Times New Roman" w:eastAsia="宋体" w:hAnsi="Times New Roman" w:cs="Times New Roman" w:hint="eastAsia"/>
-        </w:rPr>
-        <w:t>减少矿石支持调整笔刷大小</w:t>
-      </w:r>
-    </w:p>
-    <w:p>
-      <w:pPr>
-        <w:pStyle w:val="a9"/>
-        <w:numPr>
-          <w:ilvl w:val="0"/>
-          <w:numId w:val="11"/>
-        </w:numPr>
-        <w:rPr>
-          <w:rFonts w:ascii="Times New Roman" w:eastAsia="宋体" w:hAnsi="Times New Roman" w:cs="Times New Roman"/>
-        </w:rPr>
-      </w:pPr>
-      <w:r>
-        <w:rPr>
-          <w:rFonts w:ascii="Times New Roman" w:eastAsia="宋体" w:hAnsi="Times New Roman" w:cs="Times New Roman" w:hint="eastAsia"/>
-        </w:rPr>
-        <w:t>新增</w:t>
-      </w:r>
-      <w:r>
-        <w:rPr>
-          <w:rFonts w:ascii="Times New Roman" w:eastAsia="宋体" w:hAnsi="Times New Roman" w:cs="Times New Roman" w:hint="eastAsia"/>
-        </w:rPr>
-        <w:t>LuaDialog</w:t>
-      </w:r>
-      <w:r>
-        <w:rPr>
-          <w:rFonts w:ascii="Times New Roman" w:eastAsia="宋体" w:hAnsi="Times New Roman" w:cs="Times New Roman" w:hint="eastAsia"/>
-        </w:rPr>
-        <w:t>，可以在</w:t>
-      </w:r>
-      <w:r>
-        <w:rPr>
-          <w:rFonts w:ascii="Times New Roman" w:eastAsia="宋体" w:hAnsi="Times New Roman" w:cs="Times New Roman" w:hint="eastAsia"/>
-        </w:rPr>
-        <w:t>lua</w:t>
-      </w:r>
-      <w:r>
-        <w:rPr>
-          <w:rFonts w:ascii="Times New Roman" w:eastAsia="宋体" w:hAnsi="Times New Roman" w:cs="Times New Roman" w:hint="eastAsia"/>
-        </w:rPr>
-        <w:t>脚本内动态创建自定义窗口</w:t>
-      </w:r>
-    </w:p>
-    <w:p>
-      <w:pPr>
-        <w:pStyle w:val="a9"/>
-        <w:numPr>
-          <w:ilvl w:val="0"/>
-          <w:numId w:val="11"/>
-        </w:numPr>
-        <w:rPr>
-          <w:rFonts w:ascii="Times New Roman" w:eastAsia="宋体" w:hAnsi="Times New Roman" w:cs="Times New Roman"/>
-        </w:rPr>
-      </w:pPr>
-      <w:r>
-        <w:rPr>
-          <w:rFonts w:ascii="Times New Roman" w:eastAsia="宋体" w:hAnsi="Times New Roman" w:cs="Times New Roman" w:hint="eastAsia"/>
-        </w:rPr>
-        <w:t>修复改变地图大小后建筑灯光没有刷新的</w:t>
-      </w:r>
-      <w:r>
-        <w:rPr>
-          <w:rFonts w:ascii="Times New Roman" w:eastAsia="宋体" w:hAnsi="Times New Roman" w:cs="Times New Roman" w:hint="eastAsia"/>
-        </w:rPr>
-        <w:t>bug</w:t>
-      </w:r>
-    </w:p>
-    <w:p>
-      <w:pPr>
-        <w:pStyle w:val="a9"/>
-        <w:numPr>
-          <w:ilvl w:val="0"/>
-          <w:numId w:val="11"/>
-        </w:numPr>
-        <w:rPr>
-          <w:rFonts w:ascii="Times New Roman" w:eastAsia="宋体" w:hAnsi="Times New Roman" w:cs="Times New Roman"/>
-        </w:rPr>
-      </w:pPr>
-      <w:r>
-        <w:rPr>
-          <w:rFonts w:ascii="Times New Roman" w:eastAsia="宋体" w:hAnsi="Times New Roman" w:cs="Times New Roman" w:hint="eastAsia"/>
-        </w:rPr>
-        <w:t>多选模式可以显示不同矿石类型的价格</w:t>
-      </w:r>
-    </w:p>
-    <w:p>
-      <w:pPr>
-        <w:pStyle w:val="a9"/>
-        <w:numPr>
-          <w:ilvl w:val="0"/>
-          <w:numId w:val="11"/>
-        </w:numPr>
-        <w:rPr>
-          <w:rFonts w:ascii="Times New Roman" w:eastAsia="宋体" w:hAnsi="Times New Roman" w:cs="Times New Roman"/>
-        </w:rPr>
-      </w:pPr>
-      <w:r>
-        <w:rPr>
-          <w:rFonts w:ascii="Times New Roman" w:eastAsia="宋体" w:hAnsi="Times New Roman" w:cs="Times New Roman" w:hint="eastAsia"/>
-        </w:rPr>
-        <w:t>优化了绘图界面缩小时的渲染性能</w:t>
-      </w:r>
-    </w:p>
-    <w:p>
-      <w:pPr>
-        <w:pStyle w:val="a9"/>
-        <w:numPr>
-          <w:ilvl w:val="0"/>
-          <w:numId w:val="11"/>
-        </w:numPr>
-        <w:rPr>
-          <w:rFonts w:ascii="Times New Roman" w:eastAsia="宋体" w:hAnsi="Times New Roman" w:cs="Times New Roman"/>
-        </w:rPr>
-      </w:pPr>
-      <w:r>
-        <w:rPr>
-          <w:rFonts w:ascii="Times New Roman" w:eastAsia="宋体" w:hAnsi="Times New Roman" w:cs="Times New Roman" w:hint="eastAsia"/>
-        </w:rPr>
-        <w:t>修复使用触发编辑器拖拽小点为步兵关联标签时，已关联标记没有依据步兵子单元格显示的</w:t>
-      </w:r>
-      <w:r>
-        <w:rPr>
-          <w:rFonts w:ascii="Times New Roman" w:eastAsia="宋体" w:hAnsi="Times New Roman" w:cs="Times New Roman" w:hint="eastAsia"/>
-        </w:rPr>
-        <w:t>bug</w:t>
-      </w:r>
-    </w:p>
-    <w:p>
-      <w:pPr>
-        <w:pStyle w:val="a9"/>
-        <w:numPr>
-          <w:ilvl w:val="0"/>
-          <w:numId w:val="11"/>
-        </w:numPr>
-        <w:rPr>
-          <w:rFonts w:ascii="Times New Roman" w:eastAsia="宋体" w:hAnsi="Times New Roman" w:cs="Times New Roman"/>
-        </w:rPr>
-      </w:pPr>
-      <w:r>
-        <w:rPr>
-          <w:rFonts w:ascii="Times New Roman" w:eastAsia="宋体" w:hAnsi="Times New Roman" w:cs="Times New Roman" w:hint="eastAsia"/>
-        </w:rPr>
-        <w:t>Lua</w:t>
-      </w:r>
-      <w:r>
-        <w:rPr>
-          <w:rFonts w:ascii="Times New Roman" w:eastAsia="宋体" w:hAnsi="Times New Roman" w:cs="Times New Roman" w:hint="eastAsia"/>
-        </w:rPr>
-        <w:t>脚本终端可以开启</w:t>
-      </w:r>
-      <w:r>
-        <w:rPr>
-          <w:rFonts w:ascii="Times New Roman" w:eastAsia="宋体" w:hAnsi="Times New Roman" w:cs="Times New Roman" w:hint="eastAsia"/>
-        </w:rPr>
-        <w:t>MCP</w:t>
-      </w:r>
-      <w:r>
-        <w:rPr>
-          <w:rFonts w:ascii="Times New Roman" w:eastAsia="宋体" w:hAnsi="Times New Roman" w:cs="Times New Roman" w:hint="eastAsia"/>
-        </w:rPr>
-        <w:t>服务器，接入大语言模型调用</w:t>
-      </w:r>
-      <w:r>
-        <w:rPr>
-          <w:rFonts w:ascii="Times New Roman" w:eastAsia="宋体" w:hAnsi="Times New Roman" w:cs="Times New Roman" w:hint="eastAsia"/>
-        </w:rPr>
-        <w:t>lua</w:t>
-      </w:r>
-      <w:r>
-        <w:rPr>
-          <w:rFonts w:ascii="Times New Roman" w:eastAsia="宋体" w:hAnsi="Times New Roman" w:cs="Times New Roman" w:hint="eastAsia"/>
-        </w:rPr>
-        <w:t>脚本</w:t>
-      </w:r>
-      <w:r>
-        <w:rPr>
-          <w:rFonts w:ascii="Times New Roman" w:eastAsia="宋体" w:hAnsi="Times New Roman" w:cs="Times New Roman" w:hint="eastAsia"/>
-        </w:rPr>
-        <w:t>。详见</w:t>
-      </w:r>
-      <w:r>
-        <w:rPr>
-          <w:rFonts w:ascii="Times New Roman" w:eastAsia="宋体" w:hAnsi="Times New Roman" w:cs="Times New Roman" w:hint="eastAsia"/>
-        </w:rPr>
-        <w:t>MCP.Enable</w:t>
-      </w:r>
-    </w:p>
-    <w:p>
-      <w:pPr>
-        <w:pStyle w:val="a9"/>
-        <w:numPr>
-          <w:ilvl w:val="0"/>
-          <w:numId w:val="11"/>
-        </w:numPr>
-        <w:rPr>
-          <w:rFonts w:ascii="Times New Roman" w:eastAsia="宋体" w:hAnsi="Times New Roman" w:cs="Times New Roman"/>
-        </w:rPr>
-      </w:pPr>
-      <w:r>
-        <w:rPr>
-          <w:rFonts w:ascii="Times New Roman" w:eastAsia="宋体" w:hAnsi="Times New Roman" w:cs="Times New Roman" w:hint="eastAsia"/>
-        </w:rPr>
-        <w:t>修复渲染部分</w:t>
-      </w:r>
-      <w:r>
-        <w:rPr>
-          <w:rFonts w:ascii="Times New Roman" w:eastAsia="宋体" w:hAnsi="Times New Roman" w:cs="Times New Roman" w:hint="eastAsia"/>
-        </w:rPr>
-        <w:t>vxl</w:t>
-      </w:r>
-      <w:r>
-        <w:rPr>
-          <w:rFonts w:ascii="Times New Roman" w:eastAsia="宋体" w:hAnsi="Times New Roman" w:cs="Times New Roman" w:hint="eastAsia"/>
-        </w:rPr>
-        <w:t>时崩溃的</w:t>
-      </w:r>
-      <w:r>
-        <w:rPr>
-          <w:rFonts w:ascii="Times New Roman" w:eastAsia="宋体" w:hAnsi="Times New Roman" w:cs="Times New Roman" w:hint="eastAsia"/>
-        </w:rPr>
-        <w:t>bug</w:t>
-      </w:r>
-    </w:p>
-    <w:p>
-      <w:pPr>
-        <w:pStyle w:val="a9"/>
-        <w:numPr>
-          <w:ilvl w:val="0"/>
-          <w:numId w:val="11"/>
-        </w:numPr>
-        <w:rPr>
-          <w:rFonts w:ascii="Times New Roman" w:eastAsia="宋体" w:hAnsi="Times New Roman" w:cs="Times New Roman"/>
-        </w:rPr>
-      </w:pPr>
-      <w:r>
-        <w:rPr>
-          <w:rFonts w:ascii="Times New Roman" w:eastAsia="宋体" w:hAnsi="Times New Roman" w:cs="Times New Roman" w:hint="eastAsia"/>
-        </w:rPr>
-        <w:t>基本设置窗口增加背景音乐和载入界面背景音乐选项</w:t>
-      </w:r>
-    </w:p>
-    <w:p>
-      <w:pPr>
-        <w:pStyle w:val="a9"/>
-        <w:numPr>
-          <w:ilvl w:val="0"/>
-          <w:numId w:val="11"/>
-        </w:numPr>
-        <w:rPr>
-          <w:rFonts w:ascii="Times New Roman" w:eastAsia="宋体" w:hAnsi="Times New Roman" w:cs="Times New Roman"/>
-        </w:rPr>
-      </w:pPr>
-      <w:r>
-        <w:rPr>
-          <w:rFonts w:ascii="Times New Roman" w:eastAsia="宋体" w:hAnsi="Times New Roman" w:cs="Times New Roman" w:hint="eastAsia"/>
-        </w:rPr>
-        <w:t>单人任务设置</w:t>
-      </w:r>
-      <w:r>
-        <w:rPr>
-          <w:rFonts w:ascii="Times New Roman" w:eastAsia="宋体" w:hAnsi="Times New Roman" w:cs="Times New Roman" w:hint="eastAsia"/>
-        </w:rPr>
-        <w:t>-</w:t>
-      </w:r>
-      <w:r>
-        <w:rPr>
-          <w:rFonts w:ascii="Times New Roman" w:eastAsia="宋体" w:hAnsi="Times New Roman" w:cs="Times New Roman" w:hint="eastAsia"/>
-        </w:rPr>
-        <w:t>幻影伪装树木可以使用绘制随机树木窗口进行选择</w:t>
-      </w:r>
-    </w:p>
-    <w:p>
-      <w:pPr>
-        <w:pStyle w:val="a9"/>
-        <w:numPr>
-          <w:ilvl w:val="0"/>
-          <w:numId w:val="10"/>
-        </w:numPr>
-        <w:rPr>
-          <w:rFonts w:ascii="Times New Roman" w:eastAsia="宋体" w:hAnsi="Times New Roman" w:cs="Times New Roman"/>
+        <w:t>5</w:t>
+      </w:r>
+      <w:r>
+        <w:rPr>
+          <w:rFonts w:ascii="Times New Roman" w:eastAsia="宋体" w:hAnsi="Times New Roman" w:cs="Times New Roman" w:hint="eastAsia"/>
           <w:b/>
           <w:bCs/>
           <w:sz w:val="28"/>
           <w:szCs w:val="32"/>
         </w:rPr>
-      </w:pPr>
-      <w:r>
-        <w:rPr>
-          <w:rFonts w:ascii="Times New Roman" w:eastAsia="宋体" w:hAnsi="Times New Roman" w:cs="Times New Roman" w:hint="eastAsia"/>
+        <w:t>)</w:t>
+      </w:r>
+    </w:p>
+    <w:p>
+      <w:pPr>
+        <w:pStyle w:val="a9"/>
+        <w:numPr>
+          <w:ilvl w:val="0"/>
+          <w:numId w:val="11"/>
+        </w:numPr>
+        <w:rPr>
+          <w:rFonts w:ascii="Times New Roman" w:eastAsia="宋体" w:hAnsi="Times New Roman" w:cs="Times New Roman"/>
+        </w:rPr>
+      </w:pPr>
+      <w:r>
+        <w:rPr>
+          <w:rFonts w:ascii="Times New Roman" w:eastAsia="宋体" w:hAnsi="Times New Roman" w:cs="Times New Roman" w:hint="eastAsia"/>
+        </w:rPr>
+        <w:t>修复当系统关闭动画时，新下拉菜单无法正确定位到选择项的</w:t>
+      </w:r>
+      <w:r>
+        <w:rPr>
+          <w:rFonts w:ascii="Times New Roman" w:eastAsia="宋体" w:hAnsi="Times New Roman" w:cs="Times New Roman" w:hint="eastAsia"/>
+        </w:rPr>
+        <w:t>bug</w:t>
+      </w:r>
+    </w:p>
+    <w:p>
+      <w:pPr>
+        <w:pStyle w:val="a9"/>
+        <w:numPr>
+          <w:ilvl w:val="0"/>
+          <w:numId w:val="11"/>
+        </w:numPr>
+        <w:rPr>
+          <w:rFonts w:ascii="Times New Roman" w:eastAsia="宋体" w:hAnsi="Times New Roman" w:cs="Times New Roman"/>
+        </w:rPr>
+      </w:pPr>
+      <w:r>
+        <w:rPr>
+          <w:rFonts w:ascii="Times New Roman" w:eastAsia="宋体" w:hAnsi="Times New Roman" w:cs="Times New Roman" w:hint="eastAsia"/>
+        </w:rPr>
+        <w:t>修复开启</w:t>
+      </w:r>
+      <w:r>
+        <w:rPr>
+          <w:rFonts w:ascii="Times New Roman" w:eastAsia="宋体" w:hAnsi="Times New Roman" w:cs="Times New Roman" w:hint="eastAsia"/>
+        </w:rPr>
+        <w:t>gpu</w:t>
+      </w:r>
+      <w:r>
+        <w:rPr>
+          <w:rFonts w:ascii="Times New Roman" w:eastAsia="宋体" w:hAnsi="Times New Roman" w:cs="Times New Roman" w:hint="eastAsia"/>
+        </w:rPr>
+        <w:t>渲染时部分悬崖遮挡关系错误的</w:t>
+      </w:r>
+      <w:r>
+        <w:rPr>
+          <w:rFonts w:ascii="Times New Roman" w:eastAsia="宋体" w:hAnsi="Times New Roman" w:cs="Times New Roman" w:hint="eastAsia"/>
+        </w:rPr>
+        <w:t>bug</w:t>
+      </w:r>
+    </w:p>
+    <w:p>
+      <w:pPr>
+        <w:pStyle w:val="a9"/>
+        <w:numPr>
+          <w:ilvl w:val="0"/>
+          <w:numId w:val="11"/>
+        </w:numPr>
+        <w:rPr>
+          <w:rFonts w:ascii="Times New Roman" w:eastAsia="宋体" w:hAnsi="Times New Roman" w:cs="Times New Roman"/>
+        </w:rPr>
+      </w:pPr>
+      <w:r>
+        <w:rPr>
+          <w:rFonts w:ascii="Times New Roman" w:eastAsia="宋体" w:hAnsi="Times New Roman" w:cs="Times New Roman" w:hint="eastAsia"/>
+        </w:rPr>
+        <w:t>修复按键盘</w:t>
+      </w:r>
+      <w:r>
+        <w:rPr>
+          <w:rFonts w:ascii="Times New Roman" w:eastAsia="宋体" w:hAnsi="Times New Roman" w:cs="Times New Roman" w:hint="eastAsia"/>
+        </w:rPr>
+        <w:t>delete</w:t>
+      </w:r>
+      <w:r>
+        <w:rPr>
+          <w:rFonts w:ascii="Times New Roman" w:eastAsia="宋体" w:hAnsi="Times New Roman" w:cs="Times New Roman" w:hint="eastAsia"/>
+        </w:rPr>
+        <w:t>键删除单位历史记录错误的</w:t>
+      </w:r>
+      <w:r>
+        <w:rPr>
+          <w:rFonts w:ascii="Times New Roman" w:eastAsia="宋体" w:hAnsi="Times New Roman" w:cs="Times New Roman" w:hint="eastAsia"/>
+        </w:rPr>
+        <w:t>bug</w:t>
+      </w:r>
+    </w:p>
+    <w:p>
+      <w:pPr>
+        <w:pStyle w:val="a9"/>
+        <w:numPr>
+          <w:ilvl w:val="0"/>
+          <w:numId w:val="11"/>
+        </w:numPr>
+        <w:rPr>
+          <w:rFonts w:ascii="Times New Roman" w:eastAsia="宋体" w:hAnsi="Times New Roman" w:cs="Times New Roman"/>
+        </w:rPr>
+      </w:pPr>
+      <w:r>
+        <w:rPr>
+          <w:rFonts w:ascii="Times New Roman" w:eastAsia="宋体" w:hAnsi="Times New Roman" w:cs="Times New Roman" w:hint="eastAsia"/>
+        </w:rPr>
+        <w:t>调整地形浏览器图像的选中矩形框，使其更加明显</w:t>
+      </w:r>
+    </w:p>
+    <w:p>
+      <w:pPr>
+        <w:pStyle w:val="a9"/>
+        <w:numPr>
+          <w:ilvl w:val="0"/>
+          <w:numId w:val="11"/>
+        </w:numPr>
+        <w:rPr>
+          <w:rFonts w:ascii="Times New Roman" w:eastAsia="宋体" w:hAnsi="Times New Roman" w:cs="Times New Roman"/>
+        </w:rPr>
+      </w:pPr>
+      <w:r>
+        <w:rPr>
+          <w:rFonts w:ascii="Times New Roman" w:eastAsia="宋体" w:hAnsi="Times New Roman" w:cs="Times New Roman" w:hint="eastAsia"/>
+        </w:rPr>
+        <w:t>修复渲染地图时不渲染</w:t>
+      </w:r>
+      <w:r>
+        <w:rPr>
+          <w:rFonts w:ascii="Times New Roman" w:eastAsia="宋体" w:hAnsi="Times New Roman" w:cs="Times New Roman" w:hint="eastAsia"/>
+        </w:rPr>
+        <w:t>InvisibleInGame=yes</w:t>
+      </w:r>
+      <w:r>
+        <w:rPr>
+          <w:rFonts w:ascii="Times New Roman" w:eastAsia="宋体" w:hAnsi="Times New Roman" w:cs="Times New Roman" w:hint="eastAsia"/>
+        </w:rPr>
+        <w:t>的建筑的</w:t>
+      </w:r>
+      <w:r>
+        <w:rPr>
+          <w:rFonts w:ascii="Times New Roman" w:eastAsia="宋体" w:hAnsi="Times New Roman" w:cs="Times New Roman" w:hint="eastAsia"/>
+        </w:rPr>
+        <w:t>AlphaImage</w:t>
+      </w:r>
+      <w:r>
+        <w:rPr>
+          <w:rFonts w:ascii="Times New Roman" w:eastAsia="宋体" w:hAnsi="Times New Roman" w:cs="Times New Roman" w:hint="eastAsia"/>
+        </w:rPr>
+        <w:t>的</w:t>
+      </w:r>
+      <w:r>
+        <w:rPr>
+          <w:rFonts w:ascii="Times New Roman" w:eastAsia="宋体" w:hAnsi="Times New Roman" w:cs="Times New Roman" w:hint="eastAsia"/>
+        </w:rPr>
+        <w:t>bug</w:t>
+      </w:r>
+    </w:p>
+    <w:p>
+      <w:pPr>
+        <w:pStyle w:val="a9"/>
+        <w:numPr>
+          <w:ilvl w:val="0"/>
+          <w:numId w:val="11"/>
+        </w:numPr>
+        <w:rPr>
+          <w:rFonts w:ascii="Times New Roman" w:eastAsia="宋体" w:hAnsi="Times New Roman" w:cs="Times New Roman"/>
+        </w:rPr>
+      </w:pPr>
+      <w:r>
+        <w:rPr>
+          <w:rFonts w:ascii="Times New Roman" w:eastAsia="宋体" w:hAnsi="Times New Roman" w:cs="Times New Roman" w:hint="eastAsia"/>
+        </w:rPr>
+        <w:t>修复启用建筑筛选时无法隐藏阴影的</w:t>
+      </w:r>
+      <w:r>
+        <w:rPr>
+          <w:rFonts w:ascii="Times New Roman" w:eastAsia="宋体" w:hAnsi="Times New Roman" w:cs="Times New Roman" w:hint="eastAsia"/>
+        </w:rPr>
+        <w:t>bug</w:t>
+      </w:r>
+    </w:p>
+    <w:p>
+      <w:pPr>
+        <w:pStyle w:val="a9"/>
+        <w:numPr>
+          <w:ilvl w:val="0"/>
+          <w:numId w:val="11"/>
+        </w:numPr>
+        <w:rPr>
+          <w:rFonts w:ascii="Times New Roman" w:eastAsia="宋体" w:hAnsi="Times New Roman" w:cs="Times New Roman"/>
+        </w:rPr>
+      </w:pPr>
+      <w:r>
+        <w:rPr>
+          <w:rFonts w:ascii="Times New Roman" w:eastAsia="宋体" w:hAnsi="Times New Roman" w:cs="Times New Roman" w:hint="eastAsia"/>
+        </w:rPr>
+        <w:t>查找引用窗口增加</w:t>
+      </w:r>
+      <w:r>
+        <w:rPr>
+          <w:rFonts w:ascii="Times New Roman" w:eastAsia="宋体" w:hAnsi="Times New Roman" w:cs="Times New Roman" w:hint="eastAsia"/>
+        </w:rPr>
+        <w:t>跟随活动窗口</w:t>
+      </w:r>
+      <w:r>
+        <w:rPr>
+          <w:rFonts w:ascii="Times New Roman" w:eastAsia="宋体" w:hAnsi="Times New Roman" w:cs="Times New Roman" w:hint="eastAsia"/>
+        </w:rPr>
+        <w:t>选项，勾选后可以实时根据活动窗口切换内容</w:t>
+      </w:r>
+    </w:p>
+    <w:p>
+      <w:pPr>
+        <w:pStyle w:val="a9"/>
+        <w:numPr>
+          <w:ilvl w:val="0"/>
+          <w:numId w:val="11"/>
+        </w:numPr>
+        <w:rPr>
+          <w:rFonts w:ascii="Times New Roman" w:eastAsia="宋体" w:hAnsi="Times New Roman" w:cs="Times New Roman"/>
+        </w:rPr>
+      </w:pPr>
+      <w:r>
+        <w:rPr>
+          <w:rFonts w:ascii="Times New Roman" w:eastAsia="宋体" w:hAnsi="Times New Roman" w:cs="Times New Roman" w:hint="eastAsia"/>
+        </w:rPr>
+        <w:t>修复修改作战小队名称后，</w:t>
+      </w:r>
+      <w:r>
+        <w:rPr>
+          <w:rFonts w:ascii="Times New Roman" w:eastAsia="宋体" w:hAnsi="Times New Roman" w:cs="Times New Roman" w:hint="eastAsia"/>
+        </w:rPr>
+        <w:t>ai</w:t>
+      </w:r>
+      <w:r>
+        <w:rPr>
+          <w:rFonts w:ascii="Times New Roman" w:eastAsia="宋体" w:hAnsi="Times New Roman" w:cs="Times New Roman" w:hint="eastAsia"/>
+        </w:rPr>
+        <w:t>触发编辑器的小队</w:t>
+      </w:r>
+      <w:r>
+        <w:rPr>
+          <w:rFonts w:ascii="Times New Roman" w:eastAsia="宋体" w:hAnsi="Times New Roman" w:cs="Times New Roman" w:hint="eastAsia"/>
+        </w:rPr>
+        <w:t>#2</w:t>
+      </w:r>
+      <w:r>
+        <w:rPr>
+          <w:rFonts w:ascii="Times New Roman" w:eastAsia="宋体" w:hAnsi="Times New Roman" w:cs="Times New Roman" w:hint="eastAsia"/>
+        </w:rPr>
+        <w:t>显示错误的</w:t>
+      </w:r>
+      <w:r>
+        <w:rPr>
+          <w:rFonts w:ascii="Times New Roman" w:eastAsia="宋体" w:hAnsi="Times New Roman" w:cs="Times New Roman" w:hint="eastAsia"/>
+        </w:rPr>
+        <w:t>bug</w:t>
+      </w:r>
+    </w:p>
+    <w:p>
+      <w:pPr>
+        <w:pStyle w:val="a9"/>
+        <w:numPr>
+          <w:ilvl w:val="0"/>
+          <w:numId w:val="11"/>
+        </w:numPr>
+        <w:rPr>
+          <w:rFonts w:ascii="Times New Roman" w:eastAsia="宋体" w:hAnsi="Times New Roman" w:cs="Times New Roman"/>
+        </w:rPr>
+      </w:pPr>
+      <w:r>
+        <w:rPr>
+          <w:rFonts w:ascii="Times New Roman" w:eastAsia="宋体" w:hAnsi="Times New Roman" w:cs="Times New Roman" w:hint="eastAsia"/>
+        </w:rPr>
+        <w:t>触发、小队等编辑器支持为</w:t>
+      </w:r>
+      <w:r>
+        <w:rPr>
+          <w:rFonts w:ascii="Times New Roman" w:eastAsia="宋体" w:hAnsi="Times New Roman" w:cs="Times New Roman" w:hint="eastAsia"/>
+        </w:rPr>
+        <w:t>ID</w:t>
+      </w:r>
+      <w:r>
+        <w:rPr>
+          <w:rFonts w:ascii="Times New Roman" w:eastAsia="宋体" w:hAnsi="Times New Roman" w:cs="Times New Roman" w:hint="eastAsia"/>
+        </w:rPr>
+        <w:t>染色，双击拖拽小点即可设置颜色</w:t>
+      </w:r>
+    </w:p>
+    <w:p>
+      <w:pPr>
+        <w:pStyle w:val="a9"/>
+        <w:numPr>
+          <w:ilvl w:val="0"/>
+          <w:numId w:val="11"/>
+        </w:numPr>
+        <w:rPr>
+          <w:rFonts w:ascii="Times New Roman" w:eastAsia="宋体" w:hAnsi="Times New Roman" w:cs="Times New Roman"/>
+        </w:rPr>
+      </w:pPr>
+      <w:r>
+        <w:rPr>
+          <w:rFonts w:ascii="Times New Roman" w:eastAsia="宋体" w:hAnsi="Times New Roman" w:cs="Times New Roman" w:hint="eastAsia"/>
+        </w:rPr>
+        <w:t>单元标记支持笔刷大小放置</w:t>
+      </w:r>
+    </w:p>
+    <w:p>
+      <w:pPr>
+        <w:pStyle w:val="a9"/>
+        <w:numPr>
+          <w:ilvl w:val="0"/>
+          <w:numId w:val="11"/>
+        </w:numPr>
+        <w:rPr>
+          <w:rFonts w:ascii="Times New Roman" w:eastAsia="宋体" w:hAnsi="Times New Roman" w:cs="Times New Roman"/>
+        </w:rPr>
+      </w:pPr>
+      <w:r>
+        <w:rPr>
+          <w:rFonts w:ascii="Times New Roman" w:eastAsia="宋体" w:hAnsi="Times New Roman" w:cs="Times New Roman" w:hint="eastAsia"/>
+        </w:rPr>
+        <w:t>增加新的</w:t>
+      </w:r>
+      <w:r>
+        <w:rPr>
+          <w:rFonts w:ascii="Times New Roman" w:eastAsia="宋体" w:hAnsi="Times New Roman" w:cs="Times New Roman" w:hint="eastAsia"/>
+        </w:rPr>
+        <w:t>lua</w:t>
+      </w:r>
+      <w:r>
+        <w:rPr>
+          <w:rFonts w:ascii="Times New Roman" w:eastAsia="宋体" w:hAnsi="Times New Roman" w:cs="Times New Roman" w:hint="eastAsia"/>
+        </w:rPr>
+        <w:t>脚本，由</w:t>
+      </w:r>
+      <w:r>
+        <w:rPr>
+          <w:rFonts w:ascii="Times New Roman" w:eastAsia="宋体" w:hAnsi="Times New Roman" w:cs="Times New Roman" w:hint="eastAsia"/>
+        </w:rPr>
+        <w:t>AUY</w:t>
+      </w:r>
+      <w:r>
+        <w:rPr>
+          <w:rFonts w:ascii="Times New Roman" w:eastAsia="宋体" w:hAnsi="Times New Roman" w:cs="Times New Roman" w:hint="eastAsia"/>
+        </w:rPr>
+        <w:t>制作</w:t>
+      </w:r>
+    </w:p>
+    <w:p>
+      <w:pPr>
+        <w:pStyle w:val="a9"/>
+        <w:numPr>
+          <w:ilvl w:val="0"/>
+          <w:numId w:val="11"/>
+        </w:numPr>
+        <w:rPr>
+          <w:rFonts w:ascii="Times New Roman" w:eastAsia="宋体" w:hAnsi="Times New Roman" w:cs="Times New Roman"/>
+        </w:rPr>
+      </w:pPr>
+      <w:r>
+        <w:rPr>
+          <w:rFonts w:ascii="Times New Roman" w:eastAsia="宋体" w:hAnsi="Times New Roman" w:cs="Times New Roman" w:hint="eastAsia"/>
+        </w:rPr>
+        <w:t>修复跨地图类型粘贴时地形转换部分失效的</w:t>
+      </w:r>
+      <w:r>
+        <w:rPr>
+          <w:rFonts w:ascii="Times New Roman" w:eastAsia="宋体" w:hAnsi="Times New Roman" w:cs="Times New Roman" w:hint="eastAsia"/>
+        </w:rPr>
+        <w:t>bug</w:t>
+      </w:r>
+    </w:p>
+    <w:p>
+      <w:pPr>
+        <w:pStyle w:val="a9"/>
+        <w:numPr>
+          <w:ilvl w:val="0"/>
+          <w:numId w:val="11"/>
+        </w:numPr>
+        <w:rPr>
+          <w:rFonts w:ascii="Times New Roman" w:eastAsia="宋体" w:hAnsi="Times New Roman" w:cs="Times New Roman"/>
+        </w:rPr>
+      </w:pPr>
+      <w:r>
+        <w:rPr>
+          <w:rFonts w:ascii="Times New Roman" w:eastAsia="宋体" w:hAnsi="Times New Roman" w:cs="Times New Roman" w:hint="eastAsia"/>
+        </w:rPr>
+        <w:t>可以记录不同鼠标操作的笔刷大小，并在切换时自动还原，详见</w:t>
+      </w:r>
+      <w:r>
+        <w:rPr>
+          <w:rFonts w:ascii="Times New Roman" w:eastAsia="宋体" w:hAnsi="Times New Roman" w:cs="Times New Roman" w:hint="eastAsia"/>
+        </w:rPr>
+        <w:t>RecordBrushSizeHistory</w:t>
+      </w:r>
+    </w:p>
+    <w:p>
+      <w:pPr>
+        <w:pStyle w:val="a9"/>
+        <w:numPr>
+          <w:ilvl w:val="0"/>
+          <w:numId w:val="11"/>
+        </w:numPr>
+        <w:rPr>
+          <w:rFonts w:ascii="Times New Roman" w:eastAsia="宋体" w:hAnsi="Times New Roman" w:cs="Times New Roman"/>
+        </w:rPr>
+      </w:pPr>
+      <w:r>
+        <w:rPr>
+          <w:rFonts w:ascii="Times New Roman" w:eastAsia="宋体" w:hAnsi="Times New Roman" w:cs="Times New Roman" w:hint="eastAsia"/>
+        </w:rPr>
+        <w:t>增加</w:t>
+      </w:r>
+      <w:r>
+        <w:rPr>
+          <w:rFonts w:ascii="Times New Roman" w:eastAsia="宋体" w:hAnsi="Times New Roman" w:cs="Times New Roman" w:hint="eastAsia"/>
+        </w:rPr>
+        <w:t>/</w:t>
+      </w:r>
+      <w:r>
+        <w:rPr>
+          <w:rFonts w:ascii="Times New Roman" w:eastAsia="宋体" w:hAnsi="Times New Roman" w:cs="Times New Roman" w:hint="eastAsia"/>
+        </w:rPr>
+        <w:t>减少矿石支持调整笔刷大小</w:t>
+      </w:r>
+    </w:p>
+    <w:p>
+      <w:pPr>
+        <w:pStyle w:val="a9"/>
+        <w:numPr>
+          <w:ilvl w:val="0"/>
+          <w:numId w:val="11"/>
+        </w:numPr>
+        <w:rPr>
+          <w:rFonts w:ascii="Times New Roman" w:eastAsia="宋体" w:hAnsi="Times New Roman" w:cs="Times New Roman"/>
+        </w:rPr>
+      </w:pPr>
+      <w:r>
+        <w:rPr>
+          <w:rFonts w:ascii="Times New Roman" w:eastAsia="宋体" w:hAnsi="Times New Roman" w:cs="Times New Roman" w:hint="eastAsia"/>
+        </w:rPr>
+        <w:t>新增</w:t>
+      </w:r>
+      <w:r>
+        <w:rPr>
+          <w:rFonts w:ascii="Times New Roman" w:eastAsia="宋体" w:hAnsi="Times New Roman" w:cs="Times New Roman" w:hint="eastAsia"/>
+        </w:rPr>
+        <w:t>LuaDialog</w:t>
+      </w:r>
+      <w:r>
+        <w:rPr>
+          <w:rFonts w:ascii="Times New Roman" w:eastAsia="宋体" w:hAnsi="Times New Roman" w:cs="Times New Roman" w:hint="eastAsia"/>
+        </w:rPr>
+        <w:t>，可以在</w:t>
+      </w:r>
+      <w:r>
+        <w:rPr>
+          <w:rFonts w:ascii="Times New Roman" w:eastAsia="宋体" w:hAnsi="Times New Roman" w:cs="Times New Roman" w:hint="eastAsia"/>
+        </w:rPr>
+        <w:t>lua</w:t>
+      </w:r>
+      <w:r>
+        <w:rPr>
+          <w:rFonts w:ascii="Times New Roman" w:eastAsia="宋体" w:hAnsi="Times New Roman" w:cs="Times New Roman" w:hint="eastAsia"/>
+        </w:rPr>
+        <w:t>脚本内动态创建自定义窗口</w:t>
+      </w:r>
+    </w:p>
+    <w:p>
+      <w:pPr>
+        <w:pStyle w:val="a9"/>
+        <w:numPr>
+          <w:ilvl w:val="0"/>
+          <w:numId w:val="11"/>
+        </w:numPr>
+        <w:rPr>
+          <w:rFonts w:ascii="Times New Roman" w:eastAsia="宋体" w:hAnsi="Times New Roman" w:cs="Times New Roman"/>
+        </w:rPr>
+      </w:pPr>
+      <w:r>
+        <w:rPr>
+          <w:rFonts w:ascii="Times New Roman" w:eastAsia="宋体" w:hAnsi="Times New Roman" w:cs="Times New Roman" w:hint="eastAsia"/>
+        </w:rPr>
+        <w:t>修复改变地图大小后建筑灯光没有刷新的</w:t>
+      </w:r>
+      <w:r>
+        <w:rPr>
+          <w:rFonts w:ascii="Times New Roman" w:eastAsia="宋体" w:hAnsi="Times New Roman" w:cs="Times New Roman" w:hint="eastAsia"/>
+        </w:rPr>
+        <w:t>bug</w:t>
+      </w:r>
+    </w:p>
+    <w:p>
+      <w:pPr>
+        <w:pStyle w:val="a9"/>
+        <w:numPr>
+          <w:ilvl w:val="0"/>
+          <w:numId w:val="11"/>
+        </w:numPr>
+        <w:rPr>
+          <w:rFonts w:ascii="Times New Roman" w:eastAsia="宋体" w:hAnsi="Times New Roman" w:cs="Times New Roman"/>
+        </w:rPr>
+      </w:pPr>
+      <w:r>
+        <w:rPr>
+          <w:rFonts w:ascii="Times New Roman" w:eastAsia="宋体" w:hAnsi="Times New Roman" w:cs="Times New Roman" w:hint="eastAsia"/>
+        </w:rPr>
+        <w:t>多选模式可以显示不同矿石类型的价格</w:t>
+      </w:r>
+    </w:p>
+    <w:p>
+      <w:pPr>
+        <w:pStyle w:val="a9"/>
+        <w:numPr>
+          <w:ilvl w:val="0"/>
+          <w:numId w:val="11"/>
+        </w:numPr>
+        <w:rPr>
+          <w:rFonts w:ascii="Times New Roman" w:eastAsia="宋体" w:hAnsi="Times New Roman" w:cs="Times New Roman"/>
+        </w:rPr>
+      </w:pPr>
+      <w:r>
+        <w:rPr>
+          <w:rFonts w:ascii="Times New Roman" w:eastAsia="宋体" w:hAnsi="Times New Roman" w:cs="Times New Roman" w:hint="eastAsia"/>
+        </w:rPr>
+        <w:t>优化了绘图界面缩小时的渲染性能</w:t>
+      </w:r>
+    </w:p>
+    <w:p>
+      <w:pPr>
+        <w:pStyle w:val="a9"/>
+        <w:numPr>
+          <w:ilvl w:val="0"/>
+          <w:numId w:val="11"/>
+        </w:numPr>
+        <w:rPr>
+          <w:rFonts w:ascii="Times New Roman" w:eastAsia="宋体" w:hAnsi="Times New Roman" w:cs="Times New Roman"/>
+        </w:rPr>
+      </w:pPr>
+      <w:r>
+        <w:rPr>
+          <w:rFonts w:ascii="Times New Roman" w:eastAsia="宋体" w:hAnsi="Times New Roman" w:cs="Times New Roman" w:hint="eastAsia"/>
+        </w:rPr>
+        <w:t>修复使用触发编辑器拖拽小点为步兵关联标签时，已关联标记没有依据步兵子单元格显示的</w:t>
+      </w:r>
+      <w:r>
+        <w:rPr>
+          <w:rFonts w:ascii="Times New Roman" w:eastAsia="宋体" w:hAnsi="Times New Roman" w:cs="Times New Roman" w:hint="eastAsia"/>
+        </w:rPr>
+        <w:t>bug</w:t>
+      </w:r>
+    </w:p>
+    <w:p>
+      <w:pPr>
+        <w:pStyle w:val="a9"/>
+        <w:numPr>
+          <w:ilvl w:val="0"/>
+          <w:numId w:val="11"/>
+        </w:numPr>
+        <w:rPr>
+          <w:rFonts w:ascii="Times New Roman" w:eastAsia="宋体" w:hAnsi="Times New Roman" w:cs="Times New Roman"/>
+        </w:rPr>
+      </w:pPr>
+      <w:r>
+        <w:rPr>
+          <w:rFonts w:ascii="Times New Roman" w:eastAsia="宋体" w:hAnsi="Times New Roman" w:cs="Times New Roman" w:hint="eastAsia"/>
+        </w:rPr>
+        <w:t>Lua</w:t>
+      </w:r>
+      <w:r>
+        <w:rPr>
+          <w:rFonts w:ascii="Times New Roman" w:eastAsia="宋体" w:hAnsi="Times New Roman" w:cs="Times New Roman" w:hint="eastAsia"/>
+        </w:rPr>
+        <w:t>脚本终端可以开启</w:t>
+      </w:r>
+      <w:r>
+        <w:rPr>
+          <w:rFonts w:ascii="Times New Roman" w:eastAsia="宋体" w:hAnsi="Times New Roman" w:cs="Times New Roman" w:hint="eastAsia"/>
+        </w:rPr>
+        <w:t>MCP</w:t>
+      </w:r>
+      <w:r>
+        <w:rPr>
+          <w:rFonts w:ascii="Times New Roman" w:eastAsia="宋体" w:hAnsi="Times New Roman" w:cs="Times New Roman" w:hint="eastAsia"/>
+        </w:rPr>
+        <w:t>服务器，接入大语言模型调用</w:t>
+      </w:r>
+      <w:r>
+        <w:rPr>
+          <w:rFonts w:ascii="Times New Roman" w:eastAsia="宋体" w:hAnsi="Times New Roman" w:cs="Times New Roman" w:hint="eastAsia"/>
+        </w:rPr>
+        <w:t>lua</w:t>
+      </w:r>
+      <w:r>
+        <w:rPr>
+          <w:rFonts w:ascii="Times New Roman" w:eastAsia="宋体" w:hAnsi="Times New Roman" w:cs="Times New Roman" w:hint="eastAsia"/>
+        </w:rPr>
+        <w:t>脚本</w:t>
+      </w:r>
+      <w:r>
+        <w:rPr>
+          <w:rFonts w:ascii="Times New Roman" w:eastAsia="宋体" w:hAnsi="Times New Roman" w:cs="Times New Roman" w:hint="eastAsia"/>
+        </w:rPr>
+        <w:t>。详见</w:t>
+      </w:r>
+      <w:r>
+        <w:rPr>
+          <w:rFonts w:ascii="Times New Roman" w:eastAsia="宋体" w:hAnsi="Times New Roman" w:cs="Times New Roman" w:hint="eastAsia"/>
+        </w:rPr>
+        <w:t>MCP.Enable</w:t>
+      </w:r>
+    </w:p>
+    <w:p>
+      <w:pPr>
+        <w:pStyle w:val="a9"/>
+        <w:numPr>
+          <w:ilvl w:val="0"/>
+          <w:numId w:val="11"/>
+        </w:numPr>
+        <w:rPr>
+          <w:rFonts w:ascii="Times New Roman" w:eastAsia="宋体" w:hAnsi="Times New Roman" w:cs="Times New Roman"/>
+        </w:rPr>
+      </w:pPr>
+      <w:r>
+        <w:rPr>
+          <w:rFonts w:ascii="Times New Roman" w:eastAsia="宋体" w:hAnsi="Times New Roman" w:cs="Times New Roman" w:hint="eastAsia"/>
+        </w:rPr>
+        <w:t>修复渲染部分</w:t>
+      </w:r>
+      <w:r>
+        <w:rPr>
+          <w:rFonts w:ascii="Times New Roman" w:eastAsia="宋体" w:hAnsi="Times New Roman" w:cs="Times New Roman" w:hint="eastAsia"/>
+        </w:rPr>
+        <w:t>vxl</w:t>
+      </w:r>
+      <w:r>
+        <w:rPr>
+          <w:rFonts w:ascii="Times New Roman" w:eastAsia="宋体" w:hAnsi="Times New Roman" w:cs="Times New Roman" w:hint="eastAsia"/>
+        </w:rPr>
+        <w:t>时崩溃的</w:t>
+      </w:r>
+      <w:r>
+        <w:rPr>
+          <w:rFonts w:ascii="Times New Roman" w:eastAsia="宋体" w:hAnsi="Times New Roman" w:cs="Times New Roman" w:hint="eastAsia"/>
+        </w:rPr>
+        <w:t>bug</w:t>
+      </w:r>
+    </w:p>
+    <w:p>
+      <w:pPr>
+        <w:pStyle w:val="a9"/>
+        <w:numPr>
+          <w:ilvl w:val="0"/>
+          <w:numId w:val="11"/>
+        </w:numPr>
+        <w:rPr>
+          <w:rFonts w:ascii="Times New Roman" w:eastAsia="宋体" w:hAnsi="Times New Roman" w:cs="Times New Roman"/>
+        </w:rPr>
+      </w:pPr>
+      <w:r>
+        <w:rPr>
+          <w:rFonts w:ascii="Times New Roman" w:eastAsia="宋体" w:hAnsi="Times New Roman" w:cs="Times New Roman" w:hint="eastAsia"/>
+        </w:rPr>
+        <w:t>基本设置窗口增加背景音乐和载入界面背景音乐选项</w:t>
+      </w:r>
+    </w:p>
+    <w:p>
+      <w:pPr>
+        <w:pStyle w:val="a9"/>
+        <w:numPr>
+          <w:ilvl w:val="0"/>
+          <w:numId w:val="11"/>
+        </w:numPr>
+        <w:rPr>
+          <w:rFonts w:ascii="Times New Roman" w:eastAsia="宋体" w:hAnsi="Times New Roman" w:cs="Times New Roman"/>
+        </w:rPr>
+      </w:pPr>
+      <w:r>
+        <w:rPr>
+          <w:rFonts w:ascii="Times New Roman" w:eastAsia="宋体" w:hAnsi="Times New Roman" w:cs="Times New Roman" w:hint="eastAsia"/>
+        </w:rPr>
+        <w:t>单人任务设置</w:t>
+      </w:r>
+      <w:r>
+        <w:rPr>
+          <w:rFonts w:ascii="Times New Roman" w:eastAsia="宋体" w:hAnsi="Times New Roman" w:cs="Times New Roman" w:hint="eastAsia"/>
+        </w:rPr>
+        <w:t>-</w:t>
+      </w:r>
+      <w:r>
+        <w:rPr>
+          <w:rFonts w:ascii="Times New Roman" w:eastAsia="宋体" w:hAnsi="Times New Roman" w:cs="Times New Roman" w:hint="eastAsia"/>
+        </w:rPr>
+        <w:t>幻影伪装树木可以使用绘制随机树木窗口进行选择</w:t>
+      </w:r>
+    </w:p>
+    <w:p>
+      <w:pPr>
+        <w:pStyle w:val="a9"/>
+        <w:numPr>
+          <w:ilvl w:val="0"/>
+          <w:numId w:val="11"/>
+        </w:numPr>
+        <w:rPr>
+          <w:rFonts w:ascii="Times New Roman" w:eastAsia="宋体" w:hAnsi="Times New Roman" w:cs="Times New Roman"/>
+        </w:rPr>
+      </w:pPr>
+      <w:r>
+        <w:rPr>
+          <w:rFonts w:ascii="Times New Roman" w:eastAsia="宋体" w:hAnsi="Times New Roman" w:cs="Times New Roman" w:hint="eastAsia"/>
+        </w:rPr>
+        <w:lastRenderedPageBreak/>
+        <w:t>放置高架桥头时，可以显示辅助参考线</w:t>
+      </w:r>
+    </w:p>
+    <w:p>
+      <w:pPr>
+        <w:pStyle w:val="a9"/>
+        <w:numPr>
+          <w:ilvl w:val="0"/>
+          <w:numId w:val="10"/>
+        </w:numPr>
+        <w:rPr>
+          <w:rFonts w:ascii="Times New Roman" w:eastAsia="宋体" w:hAnsi="Times New Roman" w:cs="Times New Roman"/>
           <w:b/>
           <w:bCs/>
           <w:sz w:val="28"/>
           <w:szCs w:val="32"/>
         </w:rPr>
-        <w:lastRenderedPageBreak/>
-        <w:t>1.4.4 (2026.06.</w:t>
-      </w:r>
+      </w:pPr>
       <w:r>
         <w:rPr>
           <w:rFonts w:ascii="Times New Roman" w:eastAsia="宋体" w:hAnsi="Times New Roman" w:cs="Times New Roman" w:hint="eastAsia"/>
@@ -998,7 +1016,7 @@
           <w:sz w:val="28"/>
           <w:szCs w:val="32"/>
         </w:rPr>
-        <w:t>1</w:t>
+        <w:t>1.4.4 (2026.06.</w:t>
       </w:r>
       <w:r>
         <w:rPr>
@@ -1008,7 +1026,7 @@
           <w:sz w:val="28"/>
           <w:szCs w:val="32"/>
         </w:rPr>
-        <w:t>4</w:t>
+        <w:t>1</w:t>
       </w:r>
       <w:r>
         <w:rPr>
@@ -1018,646 +1036,646 @@
           <w:sz w:val="28"/>
           <w:szCs w:val="32"/>
         </w:rPr>
-        <w:t>)</w:t>
-      </w:r>
-    </w:p>
-    <w:p>
-      <w:pPr>
-        <w:pStyle w:val="a9"/>
-        <w:numPr>
-          <w:ilvl w:val="0"/>
-          <w:numId w:val="49"/>
-        </w:numPr>
-        <w:rPr>
-          <w:rFonts w:ascii="Times New Roman" w:eastAsia="宋体" w:hAnsi="Times New Roman" w:cs="Times New Roman"/>
-        </w:rPr>
-      </w:pPr>
-      <w:r>
-        <w:rPr>
-          <w:rFonts w:ascii="Times New Roman" w:eastAsia="宋体" w:hAnsi="Times New Roman" w:cs="Times New Roman" w:hint="eastAsia"/>
-        </w:rPr>
-        <w:t>修复批处理渲染地图时，若开启“</w:t>
-      </w:r>
-      <w:r>
-        <w:rPr>
-          <w:rFonts w:ascii="Times New Roman" w:eastAsia="宋体" w:hAnsi="Times New Roman" w:cs="Times New Roman" w:hint="eastAsia"/>
-        </w:rPr>
-        <w:t>启用高</w:t>
-      </w:r>
-      <w:r>
-        <w:rPr>
-          <w:rFonts w:ascii="Times New Roman" w:eastAsia="宋体" w:hAnsi="Times New Roman" w:cs="Times New Roman" w:hint="eastAsia"/>
-        </w:rPr>
-        <w:t>DPI</w:t>
-      </w:r>
-      <w:r>
-        <w:rPr>
-          <w:rFonts w:ascii="Times New Roman" w:eastAsia="宋体" w:hAnsi="Times New Roman" w:cs="Times New Roman" w:hint="eastAsia"/>
-        </w:rPr>
-        <w:t>感知时，使地图视图默认匹配系统缩放比例</w:t>
-      </w:r>
-      <w:r>
-        <w:rPr>
-          <w:rFonts w:ascii="Times New Roman" w:eastAsia="宋体" w:hAnsi="Times New Roman" w:cs="Times New Roman" w:hint="eastAsia"/>
-        </w:rPr>
-        <w:t>”，会导致渲染范围不全的</w:t>
-      </w:r>
-      <w:r>
-        <w:rPr>
-          <w:rFonts w:ascii="Times New Roman" w:eastAsia="宋体" w:hAnsi="Times New Roman" w:cs="Times New Roman" w:hint="eastAsia"/>
-        </w:rPr>
-        <w:t>bug</w:t>
-      </w:r>
-    </w:p>
-    <w:p>
-      <w:pPr>
-        <w:pStyle w:val="a9"/>
-        <w:numPr>
-          <w:ilvl w:val="0"/>
-          <w:numId w:val="49"/>
-        </w:numPr>
-        <w:rPr>
-          <w:rFonts w:ascii="Times New Roman" w:eastAsia="宋体" w:hAnsi="Times New Roman" w:cs="Times New Roman"/>
-        </w:rPr>
-      </w:pPr>
-      <w:r>
-        <w:rPr>
-          <w:rFonts w:ascii="Times New Roman" w:eastAsia="宋体" w:hAnsi="Times New Roman" w:cs="Times New Roman" w:hint="eastAsia"/>
-        </w:rPr>
-        <w:t>增加</w:t>
-      </w:r>
-      <w:r>
-        <w:rPr>
-          <w:rFonts w:ascii="Times New Roman" w:eastAsia="宋体" w:hAnsi="Times New Roman" w:cs="Times New Roman" w:hint="eastAsia"/>
-        </w:rPr>
-        <w:t>OpenGL</w:t>
-      </w:r>
-      <w:r>
-        <w:rPr>
-          <w:rFonts w:ascii="Times New Roman" w:eastAsia="宋体" w:hAnsi="Times New Roman" w:cs="Times New Roman" w:hint="eastAsia"/>
-        </w:rPr>
-        <w:t>渲染后端</w:t>
-      </w:r>
-      <w:r>
-        <w:rPr>
-          <w:rFonts w:ascii="Times New Roman" w:eastAsia="宋体" w:hAnsi="Times New Roman" w:cs="Times New Roman" w:hint="eastAsia"/>
-        </w:rPr>
-        <w:t>，并设置为默认值</w:t>
-      </w:r>
-      <w:r>
-        <w:rPr>
-          <w:rFonts w:ascii="Times New Roman" w:eastAsia="宋体" w:hAnsi="Times New Roman" w:cs="Times New Roman" w:hint="eastAsia"/>
-        </w:rPr>
-        <w:t>，详见</w:t>
-      </w:r>
-      <w:r>
-        <w:rPr>
-          <w:rFonts w:ascii="Times New Roman" w:eastAsia="宋体" w:hAnsi="Times New Roman" w:cs="Times New Roman" w:hint="eastAsia"/>
-        </w:rPr>
-        <w:t>OpenGLRendering</w:t>
-      </w:r>
-    </w:p>
-    <w:p>
-      <w:pPr>
-        <w:pStyle w:val="a9"/>
-        <w:numPr>
-          <w:ilvl w:val="0"/>
-          <w:numId w:val="49"/>
-        </w:numPr>
-        <w:rPr>
-          <w:rFonts w:ascii="Times New Roman" w:eastAsia="宋体" w:hAnsi="Times New Roman" w:cs="Times New Roman"/>
-        </w:rPr>
-      </w:pPr>
-      <w:r>
-        <w:rPr>
-          <w:rFonts w:ascii="Times New Roman" w:eastAsia="宋体" w:hAnsi="Times New Roman" w:cs="Times New Roman" w:hint="eastAsia"/>
-        </w:rPr>
-        <w:t>修复开启显示地图边界外游戏对象、使用绘制连接地形等时，鼠标无法移动到地图</w:t>
-      </w:r>
-      <w:r>
-        <w:rPr>
-          <w:rFonts w:ascii="Times New Roman" w:eastAsia="宋体" w:hAnsi="Times New Roman" w:cs="Times New Roman" w:hint="eastAsia"/>
-        </w:rPr>
-        <w:t>边界</w:t>
-      </w:r>
-      <w:r>
-        <w:rPr>
-          <w:rFonts w:ascii="Times New Roman" w:eastAsia="宋体" w:hAnsi="Times New Roman" w:cs="Times New Roman" w:hint="eastAsia"/>
-        </w:rPr>
-        <w:t>外部的</w:t>
-      </w:r>
-      <w:r>
-        <w:rPr>
-          <w:rFonts w:ascii="Times New Roman" w:eastAsia="宋体" w:hAnsi="Times New Roman" w:cs="Times New Roman" w:hint="eastAsia"/>
-        </w:rPr>
-        <w:t>bug</w:t>
-      </w:r>
-    </w:p>
-    <w:p>
-      <w:pPr>
-        <w:pStyle w:val="a9"/>
-        <w:numPr>
-          <w:ilvl w:val="0"/>
-          <w:numId w:val="49"/>
-        </w:numPr>
-        <w:rPr>
-          <w:rFonts w:ascii="Times New Roman" w:eastAsia="宋体" w:hAnsi="Times New Roman" w:cs="Times New Roman"/>
-        </w:rPr>
-      </w:pPr>
-      <w:r>
-        <w:rPr>
-          <w:rFonts w:ascii="Times New Roman" w:eastAsia="宋体" w:hAnsi="Times New Roman" w:cs="Times New Roman" w:hint="eastAsia"/>
-        </w:rPr>
-        <w:t>修复高</w:t>
-      </w:r>
-      <w:r>
-        <w:rPr>
-          <w:rFonts w:ascii="Times New Roman" w:eastAsia="宋体" w:hAnsi="Times New Roman" w:cs="Times New Roman" w:hint="eastAsia"/>
-        </w:rPr>
-        <w:t>dpi</w:t>
-      </w:r>
-      <w:r>
-        <w:rPr>
-          <w:rFonts w:ascii="Times New Roman" w:eastAsia="宋体" w:hAnsi="Times New Roman" w:cs="Times New Roman" w:hint="eastAsia"/>
-        </w:rPr>
-        <w:t>时缩放小地图后，小地图内矩形框绘制错位的</w:t>
-      </w:r>
-      <w:r>
-        <w:rPr>
-          <w:rFonts w:ascii="Times New Roman" w:eastAsia="宋体" w:hAnsi="Times New Roman" w:cs="Times New Roman" w:hint="eastAsia"/>
-        </w:rPr>
-        <w:t>bug</w:t>
-      </w:r>
-    </w:p>
-    <w:p>
-      <w:pPr>
-        <w:pStyle w:val="a9"/>
-        <w:numPr>
-          <w:ilvl w:val="0"/>
-          <w:numId w:val="49"/>
-        </w:numPr>
-        <w:rPr>
-          <w:rFonts w:ascii="Times New Roman" w:eastAsia="宋体" w:hAnsi="Times New Roman" w:cs="Times New Roman"/>
-        </w:rPr>
-      </w:pPr>
-      <w:r>
-        <w:rPr>
-          <w:rFonts w:ascii="Times New Roman" w:eastAsia="宋体" w:hAnsi="Times New Roman" w:cs="Times New Roman" w:hint="eastAsia"/>
-        </w:rPr>
-        <w:t>允许在多人地图中强制设置</w:t>
-      </w:r>
-      <w:r>
-        <w:rPr>
-          <w:rFonts w:ascii="Times New Roman" w:eastAsia="宋体" w:hAnsi="Times New Roman" w:cs="Times New Roman" w:hint="eastAsia"/>
-        </w:rPr>
-        <w:t>Neutral</w:t>
-      </w:r>
-      <w:r>
-        <w:rPr>
-          <w:rFonts w:ascii="Times New Roman" w:eastAsia="宋体" w:hAnsi="Times New Roman" w:cs="Times New Roman" w:hint="eastAsia"/>
-        </w:rPr>
-        <w:t>和</w:t>
-      </w:r>
-      <w:r>
-        <w:rPr>
-          <w:rFonts w:ascii="Times New Roman" w:eastAsia="宋体" w:hAnsi="Times New Roman" w:cs="Times New Roman" w:hint="eastAsia"/>
-        </w:rPr>
-        <w:t>Special</w:t>
-      </w:r>
-      <w:r>
-        <w:rPr>
-          <w:rFonts w:ascii="Times New Roman" w:eastAsia="宋体" w:hAnsi="Times New Roman" w:cs="Times New Roman" w:hint="eastAsia"/>
-        </w:rPr>
-        <w:t>的所属色为</w:t>
-      </w:r>
-      <w:r>
-        <w:rPr>
-          <w:rFonts w:ascii="Times New Roman" w:eastAsia="宋体" w:hAnsi="Times New Roman" w:cs="Times New Roman" w:hint="eastAsia"/>
-        </w:rPr>
-        <w:t>LightGrey</w:t>
-      </w:r>
-      <w:r>
-        <w:rPr>
-          <w:rFonts w:ascii="Times New Roman" w:eastAsia="宋体" w:hAnsi="Times New Roman" w:cs="Times New Roman" w:hint="eastAsia"/>
-        </w:rPr>
-        <w:t>，以符合游戏表现。详见</w:t>
-      </w:r>
-      <w:r>
-        <w:rPr>
-          <w:rFonts w:ascii="Times New Roman" w:eastAsia="宋体" w:hAnsi="Times New Roman" w:cs="Times New Roman" w:hint="eastAsia"/>
-        </w:rPr>
-        <w:t>ForceNeutralSpecialColor</w:t>
-      </w:r>
-    </w:p>
-    <w:p>
-      <w:pPr>
-        <w:pStyle w:val="a9"/>
-        <w:numPr>
-          <w:ilvl w:val="0"/>
-          <w:numId w:val="49"/>
-        </w:numPr>
-        <w:rPr>
-          <w:rFonts w:ascii="Times New Roman" w:eastAsia="宋体" w:hAnsi="Times New Roman" w:cs="Times New Roman"/>
-        </w:rPr>
-      </w:pPr>
-      <w:r>
-        <w:rPr>
-          <w:rFonts w:ascii="Times New Roman" w:eastAsia="宋体" w:hAnsi="Times New Roman" w:cs="Times New Roman" w:hint="eastAsia"/>
-        </w:rPr>
-        <w:t>触发编辑器下拉菜单可以查看重复类型状态</w:t>
-      </w:r>
-    </w:p>
-    <w:p>
-      <w:pPr>
-        <w:pStyle w:val="a9"/>
-        <w:numPr>
-          <w:ilvl w:val="0"/>
-          <w:numId w:val="49"/>
-        </w:numPr>
-        <w:rPr>
-          <w:rFonts w:ascii="Times New Roman" w:eastAsia="宋体" w:hAnsi="Times New Roman" w:cs="Times New Roman"/>
-        </w:rPr>
-      </w:pPr>
-      <w:r>
-        <w:rPr>
-          <w:rFonts w:ascii="Times New Roman" w:eastAsia="宋体" w:hAnsi="Times New Roman" w:cs="Times New Roman" w:hint="eastAsia"/>
-        </w:rPr>
-        <w:t>优化地形浏览器其余列表的加载速度</w:t>
-      </w:r>
-    </w:p>
-    <w:p>
-      <w:pPr>
-        <w:pStyle w:val="a9"/>
-        <w:numPr>
-          <w:ilvl w:val="0"/>
-          <w:numId w:val="49"/>
-        </w:numPr>
-        <w:rPr>
-          <w:rFonts w:ascii="Times New Roman" w:eastAsia="宋体" w:hAnsi="Times New Roman" w:cs="Times New Roman"/>
-        </w:rPr>
-      </w:pPr>
-      <w:r>
-        <w:rPr>
-          <w:rFonts w:ascii="Times New Roman" w:eastAsia="宋体" w:hAnsi="Times New Roman" w:cs="Times New Roman" w:hint="eastAsia"/>
-        </w:rPr>
-        <w:t>修复部分索引超过</w:t>
-      </w:r>
-      <w:r>
-        <w:rPr>
-          <w:rFonts w:ascii="Times New Roman" w:eastAsia="宋体" w:hAnsi="Times New Roman" w:cs="Times New Roman" w:hint="eastAsia"/>
-        </w:rPr>
-        <w:t>255</w:t>
-      </w:r>
-      <w:r>
-        <w:rPr>
-          <w:rFonts w:ascii="Times New Roman" w:eastAsia="宋体" w:hAnsi="Times New Roman" w:cs="Times New Roman" w:hint="eastAsia"/>
-        </w:rPr>
-        <w:t>的覆盖物的物品浏览器图标加载错误的</w:t>
-      </w:r>
-      <w:r>
-        <w:rPr>
-          <w:rFonts w:ascii="Times New Roman" w:eastAsia="宋体" w:hAnsi="Times New Roman" w:cs="Times New Roman" w:hint="eastAsia"/>
-        </w:rPr>
-        <w:t>bug</w:t>
-      </w:r>
-    </w:p>
-    <w:p>
-      <w:pPr>
-        <w:pStyle w:val="a9"/>
-        <w:numPr>
-          <w:ilvl w:val="0"/>
-          <w:numId w:val="49"/>
-        </w:numPr>
-        <w:rPr>
-          <w:rFonts w:ascii="Times New Roman" w:eastAsia="宋体" w:hAnsi="Times New Roman" w:cs="Times New Roman"/>
-        </w:rPr>
-      </w:pPr>
-      <w:r>
-        <w:rPr>
-          <w:rFonts w:ascii="Times New Roman" w:eastAsia="宋体" w:hAnsi="Times New Roman" w:cs="Times New Roman" w:hint="eastAsia"/>
-        </w:rPr>
-        <w:t>修复当地形文件不存在时，地形浏览器列表会发生错乱的</w:t>
-      </w:r>
-      <w:r>
-        <w:rPr>
-          <w:rFonts w:ascii="Times New Roman" w:eastAsia="宋体" w:hAnsi="Times New Roman" w:cs="Times New Roman" w:hint="eastAsia"/>
-        </w:rPr>
-        <w:t>bug</w:t>
-      </w:r>
-    </w:p>
-    <w:p>
-      <w:pPr>
-        <w:pStyle w:val="a9"/>
-        <w:numPr>
-          <w:ilvl w:val="0"/>
-          <w:numId w:val="49"/>
-        </w:numPr>
-        <w:rPr>
-          <w:rFonts w:ascii="Times New Roman" w:eastAsia="宋体" w:hAnsi="Times New Roman" w:cs="Times New Roman"/>
-        </w:rPr>
-      </w:pPr>
-      <w:r>
-        <w:rPr>
-          <w:rFonts w:ascii="Times New Roman" w:eastAsia="宋体" w:hAnsi="Times New Roman" w:cs="Times New Roman" w:hint="eastAsia"/>
-        </w:rPr>
-        <w:t>修复地形动画不读取</w:t>
-      </w:r>
-      <w:r>
-        <w:rPr>
-          <w:rFonts w:ascii="Times New Roman" w:eastAsia="宋体" w:hAnsi="Times New Roman" w:cs="Times New Roman" w:hint="eastAsia"/>
-        </w:rPr>
-        <w:t>art</w:t>
-      </w:r>
-      <w:r>
-        <w:rPr>
-          <w:rFonts w:ascii="Times New Roman" w:eastAsia="宋体" w:hAnsi="Times New Roman" w:cs="Times New Roman" w:hint="eastAsia"/>
-        </w:rPr>
-        <w:t>内</w:t>
-      </w:r>
-      <w:r>
-        <w:rPr>
-          <w:rFonts w:ascii="Times New Roman" w:eastAsia="宋体" w:hAnsi="Times New Roman" w:cs="Times New Roman" w:hint="eastAsia"/>
-        </w:rPr>
-        <w:t>X</w:t>
-      </w:r>
-      <w:r>
-        <w:rPr>
-          <w:rFonts w:ascii="Times New Roman" w:eastAsia="宋体" w:hAnsi="Times New Roman" w:cs="Times New Roman" w:hint="eastAsia"/>
-        </w:rPr>
-        <w:t>/Y</w:t>
-      </w:r>
-      <w:r>
-        <w:rPr>
-          <w:rFonts w:ascii="Times New Roman" w:eastAsia="宋体" w:hAnsi="Times New Roman" w:cs="Times New Roman" w:hint="eastAsia"/>
-        </w:rPr>
-        <w:t>DrawOffset</w:t>
-      </w:r>
-      <w:r>
-        <w:rPr>
-          <w:rFonts w:ascii="Times New Roman" w:eastAsia="宋体" w:hAnsi="Times New Roman" w:cs="Times New Roman" w:hint="eastAsia"/>
-        </w:rPr>
-        <w:t>的</w:t>
-      </w:r>
-      <w:r>
-        <w:rPr>
-          <w:rFonts w:ascii="Times New Roman" w:eastAsia="宋体" w:hAnsi="Times New Roman" w:cs="Times New Roman" w:hint="eastAsia"/>
-        </w:rPr>
-        <w:t>bug</w:t>
-      </w:r>
-    </w:p>
-    <w:p>
-      <w:pPr>
-        <w:pStyle w:val="a9"/>
-        <w:numPr>
-          <w:ilvl w:val="0"/>
-          <w:numId w:val="49"/>
-        </w:numPr>
-        <w:rPr>
-          <w:rFonts w:ascii="Times New Roman" w:eastAsia="宋体" w:hAnsi="Times New Roman" w:cs="Times New Roman"/>
-        </w:rPr>
-      </w:pPr>
-      <w:r>
-        <w:rPr>
-          <w:rFonts w:ascii="Times New Roman" w:eastAsia="宋体" w:hAnsi="Times New Roman" w:cs="Times New Roman" w:hint="eastAsia"/>
-        </w:rPr>
-        <w:t>可以直接拖拽地图可见边缘（蓝线）</w:t>
-      </w:r>
-    </w:p>
-    <w:p>
-      <w:pPr>
-        <w:pStyle w:val="a9"/>
-        <w:numPr>
-          <w:ilvl w:val="0"/>
-          <w:numId w:val="49"/>
-        </w:numPr>
-        <w:rPr>
-          <w:rFonts w:ascii="Times New Roman" w:eastAsia="宋体" w:hAnsi="Times New Roman" w:cs="Times New Roman"/>
-        </w:rPr>
-      </w:pPr>
-      <w:r>
-        <w:rPr>
-          <w:rFonts w:ascii="Times New Roman" w:eastAsia="宋体" w:hAnsi="Times New Roman" w:cs="Times New Roman" w:hint="eastAsia"/>
-        </w:rPr>
-        <w:t>修复部分情况下拖拽单位辅助线显示错位的</w:t>
-      </w:r>
-      <w:r>
-        <w:rPr>
-          <w:rFonts w:ascii="Times New Roman" w:eastAsia="宋体" w:hAnsi="Times New Roman" w:cs="Times New Roman" w:hint="eastAsia"/>
-        </w:rPr>
-        <w:t>bug</w:t>
-      </w:r>
-    </w:p>
-    <w:p>
-      <w:pPr>
-        <w:pStyle w:val="a9"/>
-        <w:numPr>
-          <w:ilvl w:val="0"/>
-          <w:numId w:val="49"/>
-        </w:numPr>
-        <w:rPr>
-          <w:rFonts w:ascii="Times New Roman" w:eastAsia="宋体" w:hAnsi="Times New Roman" w:cs="Times New Roman"/>
-        </w:rPr>
-      </w:pPr>
-      <w:r>
-        <w:rPr>
-          <w:rFonts w:ascii="Times New Roman" w:eastAsia="宋体" w:hAnsi="Times New Roman" w:cs="Times New Roman" w:hint="eastAsia"/>
-        </w:rPr>
-        <w:t>粘贴时可以预览建筑、车辆等游戏对象</w:t>
-      </w:r>
-    </w:p>
-    <w:p>
-      <w:pPr>
-        <w:pStyle w:val="a9"/>
-        <w:numPr>
-          <w:ilvl w:val="0"/>
-          <w:numId w:val="49"/>
-        </w:numPr>
-        <w:rPr>
-          <w:rFonts w:ascii="Times New Roman" w:eastAsia="宋体" w:hAnsi="Times New Roman" w:cs="Times New Roman"/>
-        </w:rPr>
-      </w:pPr>
-      <w:r>
-        <w:rPr>
-          <w:rFonts w:ascii="Times New Roman" w:eastAsia="宋体" w:hAnsi="Times New Roman" w:cs="Times New Roman" w:hint="eastAsia"/>
-        </w:rPr>
-        <w:t>重写基本设置、单人任务设置、特定标识窗口，优化界面，适配</w:t>
-      </w:r>
-      <w:r>
-        <w:rPr>
-          <w:rFonts w:ascii="Times New Roman" w:eastAsia="宋体" w:hAnsi="Times New Roman" w:cs="Times New Roman" w:hint="eastAsia"/>
-        </w:rPr>
-        <w:t>phobos</w:t>
-      </w:r>
-      <w:r>
-        <w:rPr>
-          <w:rFonts w:ascii="Times New Roman" w:eastAsia="宋体" w:hAnsi="Times New Roman" w:cs="Times New Roman" w:hint="eastAsia"/>
-        </w:rPr>
-        <w:t>新功能</w:t>
-      </w:r>
-    </w:p>
-    <w:p>
-      <w:pPr>
-        <w:pStyle w:val="a9"/>
-        <w:numPr>
-          <w:ilvl w:val="0"/>
-          <w:numId w:val="49"/>
-        </w:numPr>
-        <w:rPr>
-          <w:rFonts w:ascii="Times New Roman" w:eastAsia="宋体" w:hAnsi="Times New Roman" w:cs="Times New Roman"/>
-        </w:rPr>
-      </w:pPr>
-      <w:r>
-        <w:rPr>
-          <w:rFonts w:ascii="Times New Roman" w:eastAsia="宋体" w:hAnsi="Times New Roman" w:cs="Times New Roman" w:hint="eastAsia"/>
-        </w:rPr>
-        <w:t>查找引用窗口可以查找标签关联的对象</w:t>
-      </w:r>
-    </w:p>
-    <w:p>
-      <w:pPr>
-        <w:pStyle w:val="a9"/>
-        <w:numPr>
-          <w:ilvl w:val="0"/>
-          <w:numId w:val="49"/>
-        </w:numPr>
-        <w:rPr>
-          <w:rFonts w:ascii="Times New Roman" w:eastAsia="宋体" w:hAnsi="Times New Roman" w:cs="Times New Roman"/>
-        </w:rPr>
-      </w:pPr>
-      <w:r>
-        <w:rPr>
-          <w:rFonts w:ascii="Times New Roman" w:eastAsia="宋体" w:hAnsi="Times New Roman" w:cs="Times New Roman" w:hint="eastAsia"/>
-        </w:rPr>
-        <w:t>添加新</w:t>
-      </w:r>
-      <w:r>
-        <w:rPr>
-          <w:rFonts w:ascii="Times New Roman" w:eastAsia="宋体" w:hAnsi="Times New Roman" w:cs="Times New Roman" w:hint="eastAsia"/>
-        </w:rPr>
-        <w:t>lua</w:t>
-      </w:r>
-      <w:r>
-        <w:rPr>
-          <w:rFonts w:ascii="Times New Roman" w:eastAsia="宋体" w:hAnsi="Times New Roman" w:cs="Times New Roman" w:hint="eastAsia"/>
-        </w:rPr>
-        <w:t>脚本</w:t>
-      </w:r>
-    </w:p>
-    <w:p>
-      <w:pPr>
-        <w:pStyle w:val="a9"/>
-        <w:numPr>
-          <w:ilvl w:val="0"/>
-          <w:numId w:val="49"/>
-        </w:numPr>
-        <w:rPr>
-          <w:rFonts w:ascii="Times New Roman" w:eastAsia="宋体" w:hAnsi="Times New Roman" w:cs="Times New Roman"/>
-        </w:rPr>
-      </w:pPr>
-      <w:r>
-        <w:rPr>
-          <w:rFonts w:ascii="Times New Roman" w:eastAsia="宋体" w:hAnsi="Times New Roman" w:cs="Times New Roman" w:hint="eastAsia"/>
-        </w:rPr>
-        <w:t>修复部分情况下</w:t>
-      </w:r>
-      <w:r>
-        <w:rPr>
-          <w:rFonts w:ascii="Times New Roman" w:eastAsia="宋体" w:hAnsi="Times New Roman" w:cs="Times New Roman" w:hint="eastAsia"/>
-        </w:rPr>
-        <w:t>lua</w:t>
-      </w:r>
-      <w:r>
-        <w:rPr>
-          <w:rFonts w:ascii="Times New Roman" w:eastAsia="宋体" w:hAnsi="Times New Roman" w:cs="Times New Roman" w:hint="eastAsia"/>
-        </w:rPr>
-        <w:t>脚本输出窗口显示错乱的</w:t>
-      </w:r>
-      <w:r>
-        <w:rPr>
-          <w:rFonts w:ascii="Times New Roman" w:eastAsia="宋体" w:hAnsi="Times New Roman" w:cs="Times New Roman" w:hint="eastAsia"/>
-        </w:rPr>
-        <w:t>bug</w:t>
-      </w:r>
-    </w:p>
-    <w:p>
-      <w:pPr>
-        <w:pStyle w:val="a9"/>
-        <w:numPr>
-          <w:ilvl w:val="0"/>
-          <w:numId w:val="49"/>
-        </w:numPr>
-        <w:rPr>
-          <w:rFonts w:ascii="Times New Roman" w:eastAsia="宋体" w:hAnsi="Times New Roman" w:cs="Times New Roman"/>
-        </w:rPr>
-      </w:pPr>
-      <w:r>
-        <w:rPr>
-          <w:rFonts w:ascii="Times New Roman" w:eastAsia="宋体" w:hAnsi="Times New Roman" w:cs="Times New Roman" w:hint="eastAsia"/>
-        </w:rPr>
-        <w:t>新增</w:t>
-      </w:r>
-      <w:r>
-        <w:rPr>
-          <w:rFonts w:ascii="Times New Roman" w:eastAsia="宋体" w:hAnsi="Times New Roman" w:cs="Times New Roman" w:hint="eastAsia"/>
-        </w:rPr>
-        <w:t>TileSetBrowserViewCompactArrange</w:t>
-      </w:r>
-      <w:r>
-        <w:rPr>
-          <w:rFonts w:ascii="Times New Roman" w:eastAsia="宋体" w:hAnsi="Times New Roman" w:cs="Times New Roman" w:hint="eastAsia"/>
-        </w:rPr>
-        <w:t>，可以让地形浏览器的图像排列更加紧凑</w:t>
-      </w:r>
-    </w:p>
-    <w:p>
-      <w:pPr>
-        <w:pStyle w:val="a9"/>
-        <w:numPr>
-          <w:ilvl w:val="0"/>
-          <w:numId w:val="49"/>
-        </w:numPr>
-        <w:rPr>
-          <w:rFonts w:ascii="Times New Roman" w:eastAsia="宋体" w:hAnsi="Times New Roman" w:cs="Times New Roman"/>
-        </w:rPr>
-      </w:pPr>
-      <w:r>
-        <w:rPr>
-          <w:rFonts w:ascii="Times New Roman" w:eastAsia="宋体" w:hAnsi="Times New Roman" w:cs="Times New Roman" w:hint="eastAsia"/>
-        </w:rPr>
-        <w:t>修复对象查看器无法按名称搜索覆盖物的</w:t>
-      </w:r>
-      <w:r>
-        <w:rPr>
-          <w:rFonts w:ascii="Times New Roman" w:eastAsia="宋体" w:hAnsi="Times New Roman" w:cs="Times New Roman" w:hint="eastAsia"/>
-        </w:rPr>
-        <w:t>bug</w:t>
-      </w:r>
-    </w:p>
-    <w:p>
-      <w:pPr>
-        <w:pStyle w:val="a9"/>
-        <w:numPr>
-          <w:ilvl w:val="0"/>
-          <w:numId w:val="10"/>
-        </w:numPr>
-        <w:rPr>
-          <w:rFonts w:ascii="Times New Roman" w:eastAsia="宋体" w:hAnsi="Times New Roman" w:cs="Times New Roman"/>
+        <w:t>4</w:t>
+      </w:r>
+      <w:r>
+        <w:rPr>
+          <w:rFonts w:ascii="Times New Roman" w:eastAsia="宋体" w:hAnsi="Times New Roman" w:cs="Times New Roman" w:hint="eastAsia"/>
           <w:b/>
           <w:bCs/>
           <w:sz w:val="28"/>
           <w:szCs w:val="32"/>
         </w:rPr>
-      </w:pPr>
-      <w:r>
-        <w:rPr>
-          <w:rFonts w:ascii="Times New Roman" w:eastAsia="宋体" w:hAnsi="Times New Roman" w:cs="Times New Roman" w:hint="eastAsia"/>
+        <w:t>)</w:t>
+      </w:r>
+    </w:p>
+    <w:p>
+      <w:pPr>
+        <w:pStyle w:val="a9"/>
+        <w:numPr>
+          <w:ilvl w:val="0"/>
+          <w:numId w:val="49"/>
+        </w:numPr>
+        <w:rPr>
+          <w:rFonts w:ascii="Times New Roman" w:eastAsia="宋体" w:hAnsi="Times New Roman" w:cs="Times New Roman"/>
+        </w:rPr>
+      </w:pPr>
+      <w:r>
+        <w:rPr>
+          <w:rFonts w:ascii="Times New Roman" w:eastAsia="宋体" w:hAnsi="Times New Roman" w:cs="Times New Roman" w:hint="eastAsia"/>
+        </w:rPr>
+        <w:t>修复批处理渲染地图时，若开启“</w:t>
+      </w:r>
+      <w:r>
+        <w:rPr>
+          <w:rFonts w:ascii="Times New Roman" w:eastAsia="宋体" w:hAnsi="Times New Roman" w:cs="Times New Roman" w:hint="eastAsia"/>
+        </w:rPr>
+        <w:t>启用高</w:t>
+      </w:r>
+      <w:r>
+        <w:rPr>
+          <w:rFonts w:ascii="Times New Roman" w:eastAsia="宋体" w:hAnsi="Times New Roman" w:cs="Times New Roman" w:hint="eastAsia"/>
+        </w:rPr>
+        <w:t>DPI</w:t>
+      </w:r>
+      <w:r>
+        <w:rPr>
+          <w:rFonts w:ascii="Times New Roman" w:eastAsia="宋体" w:hAnsi="Times New Roman" w:cs="Times New Roman" w:hint="eastAsia"/>
+        </w:rPr>
+        <w:t>感知时，使地图视图默认匹配系统缩放比例</w:t>
+      </w:r>
+      <w:r>
+        <w:rPr>
+          <w:rFonts w:ascii="Times New Roman" w:eastAsia="宋体" w:hAnsi="Times New Roman" w:cs="Times New Roman" w:hint="eastAsia"/>
+        </w:rPr>
+        <w:t>”，会导致渲染范围不全的</w:t>
+      </w:r>
+      <w:r>
+        <w:rPr>
+          <w:rFonts w:ascii="Times New Roman" w:eastAsia="宋体" w:hAnsi="Times New Roman" w:cs="Times New Roman" w:hint="eastAsia"/>
+        </w:rPr>
+        <w:t>bug</w:t>
+      </w:r>
+    </w:p>
+    <w:p>
+      <w:pPr>
+        <w:pStyle w:val="a9"/>
+        <w:numPr>
+          <w:ilvl w:val="0"/>
+          <w:numId w:val="49"/>
+        </w:numPr>
+        <w:rPr>
+          <w:rFonts w:ascii="Times New Roman" w:eastAsia="宋体" w:hAnsi="Times New Roman" w:cs="Times New Roman"/>
+        </w:rPr>
+      </w:pPr>
+      <w:r>
+        <w:rPr>
+          <w:rFonts w:ascii="Times New Roman" w:eastAsia="宋体" w:hAnsi="Times New Roman" w:cs="Times New Roman" w:hint="eastAsia"/>
+        </w:rPr>
+        <w:t>增加</w:t>
+      </w:r>
+      <w:r>
+        <w:rPr>
+          <w:rFonts w:ascii="Times New Roman" w:eastAsia="宋体" w:hAnsi="Times New Roman" w:cs="Times New Roman" w:hint="eastAsia"/>
+        </w:rPr>
+        <w:t>OpenGL</w:t>
+      </w:r>
+      <w:r>
+        <w:rPr>
+          <w:rFonts w:ascii="Times New Roman" w:eastAsia="宋体" w:hAnsi="Times New Roman" w:cs="Times New Roman" w:hint="eastAsia"/>
+        </w:rPr>
+        <w:t>渲染后端</w:t>
+      </w:r>
+      <w:r>
+        <w:rPr>
+          <w:rFonts w:ascii="Times New Roman" w:eastAsia="宋体" w:hAnsi="Times New Roman" w:cs="Times New Roman" w:hint="eastAsia"/>
+        </w:rPr>
+        <w:t>，并设置为默认值</w:t>
+      </w:r>
+      <w:r>
+        <w:rPr>
+          <w:rFonts w:ascii="Times New Roman" w:eastAsia="宋体" w:hAnsi="Times New Roman" w:cs="Times New Roman" w:hint="eastAsia"/>
+        </w:rPr>
+        <w:t>，详见</w:t>
+      </w:r>
+      <w:r>
+        <w:rPr>
+          <w:rFonts w:ascii="Times New Roman" w:eastAsia="宋体" w:hAnsi="Times New Roman" w:cs="Times New Roman" w:hint="eastAsia"/>
+        </w:rPr>
+        <w:t>OpenGLRendering</w:t>
+      </w:r>
+    </w:p>
+    <w:p>
+      <w:pPr>
+        <w:pStyle w:val="a9"/>
+        <w:numPr>
+          <w:ilvl w:val="0"/>
+          <w:numId w:val="49"/>
+        </w:numPr>
+        <w:rPr>
+          <w:rFonts w:ascii="Times New Roman" w:eastAsia="宋体" w:hAnsi="Times New Roman" w:cs="Times New Roman"/>
+        </w:rPr>
+      </w:pPr>
+      <w:r>
+        <w:rPr>
+          <w:rFonts w:ascii="Times New Roman" w:eastAsia="宋体" w:hAnsi="Times New Roman" w:cs="Times New Roman" w:hint="eastAsia"/>
+        </w:rPr>
+        <w:t>修复开启显示地图边界外游戏对象、使用绘制连接地形等时，鼠标无法移动到地图</w:t>
+      </w:r>
+      <w:r>
+        <w:rPr>
+          <w:rFonts w:ascii="Times New Roman" w:eastAsia="宋体" w:hAnsi="Times New Roman" w:cs="Times New Roman" w:hint="eastAsia"/>
+        </w:rPr>
+        <w:t>边界</w:t>
+      </w:r>
+      <w:r>
+        <w:rPr>
+          <w:rFonts w:ascii="Times New Roman" w:eastAsia="宋体" w:hAnsi="Times New Roman" w:cs="Times New Roman" w:hint="eastAsia"/>
+        </w:rPr>
+        <w:t>外部的</w:t>
+      </w:r>
+      <w:r>
+        <w:rPr>
+          <w:rFonts w:ascii="Times New Roman" w:eastAsia="宋体" w:hAnsi="Times New Roman" w:cs="Times New Roman" w:hint="eastAsia"/>
+        </w:rPr>
+        <w:t>bug</w:t>
+      </w:r>
+    </w:p>
+    <w:p>
+      <w:pPr>
+        <w:pStyle w:val="a9"/>
+        <w:numPr>
+          <w:ilvl w:val="0"/>
+          <w:numId w:val="49"/>
+        </w:numPr>
+        <w:rPr>
+          <w:rFonts w:ascii="Times New Roman" w:eastAsia="宋体" w:hAnsi="Times New Roman" w:cs="Times New Roman"/>
+        </w:rPr>
+      </w:pPr>
+      <w:r>
+        <w:rPr>
+          <w:rFonts w:ascii="Times New Roman" w:eastAsia="宋体" w:hAnsi="Times New Roman" w:cs="Times New Roman" w:hint="eastAsia"/>
+        </w:rPr>
+        <w:t>修复高</w:t>
+      </w:r>
+      <w:r>
+        <w:rPr>
+          <w:rFonts w:ascii="Times New Roman" w:eastAsia="宋体" w:hAnsi="Times New Roman" w:cs="Times New Roman" w:hint="eastAsia"/>
+        </w:rPr>
+        <w:t>dpi</w:t>
+      </w:r>
+      <w:r>
+        <w:rPr>
+          <w:rFonts w:ascii="Times New Roman" w:eastAsia="宋体" w:hAnsi="Times New Roman" w:cs="Times New Roman" w:hint="eastAsia"/>
+        </w:rPr>
+        <w:t>时缩放小地图后，小地图内矩形框绘制错位的</w:t>
+      </w:r>
+      <w:r>
+        <w:rPr>
+          <w:rFonts w:ascii="Times New Roman" w:eastAsia="宋体" w:hAnsi="Times New Roman" w:cs="Times New Roman" w:hint="eastAsia"/>
+        </w:rPr>
+        <w:t>bug</w:t>
+      </w:r>
+    </w:p>
+    <w:p>
+      <w:pPr>
+        <w:pStyle w:val="a9"/>
+        <w:numPr>
+          <w:ilvl w:val="0"/>
+          <w:numId w:val="49"/>
+        </w:numPr>
+        <w:rPr>
+          <w:rFonts w:ascii="Times New Roman" w:eastAsia="宋体" w:hAnsi="Times New Roman" w:cs="Times New Roman"/>
+        </w:rPr>
+      </w:pPr>
+      <w:r>
+        <w:rPr>
+          <w:rFonts w:ascii="Times New Roman" w:eastAsia="宋体" w:hAnsi="Times New Roman" w:cs="Times New Roman" w:hint="eastAsia"/>
+        </w:rPr>
+        <w:t>允许在多人地图中强制设置</w:t>
+      </w:r>
+      <w:r>
+        <w:rPr>
+          <w:rFonts w:ascii="Times New Roman" w:eastAsia="宋体" w:hAnsi="Times New Roman" w:cs="Times New Roman" w:hint="eastAsia"/>
+        </w:rPr>
+        <w:t>Neutral</w:t>
+      </w:r>
+      <w:r>
+        <w:rPr>
+          <w:rFonts w:ascii="Times New Roman" w:eastAsia="宋体" w:hAnsi="Times New Roman" w:cs="Times New Roman" w:hint="eastAsia"/>
+        </w:rPr>
+        <w:t>和</w:t>
+      </w:r>
+      <w:r>
+        <w:rPr>
+          <w:rFonts w:ascii="Times New Roman" w:eastAsia="宋体" w:hAnsi="Times New Roman" w:cs="Times New Roman" w:hint="eastAsia"/>
+        </w:rPr>
+        <w:t>Special</w:t>
+      </w:r>
+      <w:r>
+        <w:rPr>
+          <w:rFonts w:ascii="Times New Roman" w:eastAsia="宋体" w:hAnsi="Times New Roman" w:cs="Times New Roman" w:hint="eastAsia"/>
+        </w:rPr>
+        <w:t>的所属色为</w:t>
+      </w:r>
+      <w:r>
+        <w:rPr>
+          <w:rFonts w:ascii="Times New Roman" w:eastAsia="宋体" w:hAnsi="Times New Roman" w:cs="Times New Roman" w:hint="eastAsia"/>
+        </w:rPr>
+        <w:t>LightGrey</w:t>
+      </w:r>
+      <w:r>
+        <w:rPr>
+          <w:rFonts w:ascii="Times New Roman" w:eastAsia="宋体" w:hAnsi="Times New Roman" w:cs="Times New Roman" w:hint="eastAsia"/>
+        </w:rPr>
+        <w:t>，以符合游戏表现。详见</w:t>
+      </w:r>
+      <w:r>
+        <w:rPr>
+          <w:rFonts w:ascii="Times New Roman" w:eastAsia="宋体" w:hAnsi="Times New Roman" w:cs="Times New Roman" w:hint="eastAsia"/>
+        </w:rPr>
+        <w:t>ForceNeutralSpecialColor</w:t>
+      </w:r>
+    </w:p>
+    <w:p>
+      <w:pPr>
+        <w:pStyle w:val="a9"/>
+        <w:numPr>
+          <w:ilvl w:val="0"/>
+          <w:numId w:val="49"/>
+        </w:numPr>
+        <w:rPr>
+          <w:rFonts w:ascii="Times New Roman" w:eastAsia="宋体" w:hAnsi="Times New Roman" w:cs="Times New Roman"/>
+        </w:rPr>
+      </w:pPr>
+      <w:r>
+        <w:rPr>
+          <w:rFonts w:ascii="Times New Roman" w:eastAsia="宋体" w:hAnsi="Times New Roman" w:cs="Times New Roman" w:hint="eastAsia"/>
+        </w:rPr>
+        <w:t>触发编辑器下拉菜单可以查看重复类型状态</w:t>
+      </w:r>
+    </w:p>
+    <w:p>
+      <w:pPr>
+        <w:pStyle w:val="a9"/>
+        <w:numPr>
+          <w:ilvl w:val="0"/>
+          <w:numId w:val="49"/>
+        </w:numPr>
+        <w:rPr>
+          <w:rFonts w:ascii="Times New Roman" w:eastAsia="宋体" w:hAnsi="Times New Roman" w:cs="Times New Roman"/>
+        </w:rPr>
+      </w:pPr>
+      <w:r>
+        <w:rPr>
+          <w:rFonts w:ascii="Times New Roman" w:eastAsia="宋体" w:hAnsi="Times New Roman" w:cs="Times New Roman" w:hint="eastAsia"/>
+        </w:rPr>
+        <w:t>优化地形浏览器其余列表的加载速度</w:t>
+      </w:r>
+    </w:p>
+    <w:p>
+      <w:pPr>
+        <w:pStyle w:val="a9"/>
+        <w:numPr>
+          <w:ilvl w:val="0"/>
+          <w:numId w:val="49"/>
+        </w:numPr>
+        <w:rPr>
+          <w:rFonts w:ascii="Times New Roman" w:eastAsia="宋体" w:hAnsi="Times New Roman" w:cs="Times New Roman"/>
+        </w:rPr>
+      </w:pPr>
+      <w:r>
+        <w:rPr>
+          <w:rFonts w:ascii="Times New Roman" w:eastAsia="宋体" w:hAnsi="Times New Roman" w:cs="Times New Roman" w:hint="eastAsia"/>
+        </w:rPr>
+        <w:t>修复部分索引超过</w:t>
+      </w:r>
+      <w:r>
+        <w:rPr>
+          <w:rFonts w:ascii="Times New Roman" w:eastAsia="宋体" w:hAnsi="Times New Roman" w:cs="Times New Roman" w:hint="eastAsia"/>
+        </w:rPr>
+        <w:t>255</w:t>
+      </w:r>
+      <w:r>
+        <w:rPr>
+          <w:rFonts w:ascii="Times New Roman" w:eastAsia="宋体" w:hAnsi="Times New Roman" w:cs="Times New Roman" w:hint="eastAsia"/>
+        </w:rPr>
+        <w:t>的覆盖物的物品浏览器图标加载错误的</w:t>
+      </w:r>
+      <w:r>
+        <w:rPr>
+          <w:rFonts w:ascii="Times New Roman" w:eastAsia="宋体" w:hAnsi="Times New Roman" w:cs="Times New Roman" w:hint="eastAsia"/>
+        </w:rPr>
+        <w:t>bug</w:t>
+      </w:r>
+    </w:p>
+    <w:p>
+      <w:pPr>
+        <w:pStyle w:val="a9"/>
+        <w:numPr>
+          <w:ilvl w:val="0"/>
+          <w:numId w:val="49"/>
+        </w:numPr>
+        <w:rPr>
+          <w:rFonts w:ascii="Times New Roman" w:eastAsia="宋体" w:hAnsi="Times New Roman" w:cs="Times New Roman"/>
+        </w:rPr>
+      </w:pPr>
+      <w:r>
+        <w:rPr>
+          <w:rFonts w:ascii="Times New Roman" w:eastAsia="宋体" w:hAnsi="Times New Roman" w:cs="Times New Roman" w:hint="eastAsia"/>
+        </w:rPr>
+        <w:t>修复当地形文件不存在时，地形浏览器列表会发生错乱的</w:t>
+      </w:r>
+      <w:r>
+        <w:rPr>
+          <w:rFonts w:ascii="Times New Roman" w:eastAsia="宋体" w:hAnsi="Times New Roman" w:cs="Times New Roman" w:hint="eastAsia"/>
+        </w:rPr>
+        <w:t>bug</w:t>
+      </w:r>
+    </w:p>
+    <w:p>
+      <w:pPr>
+        <w:pStyle w:val="a9"/>
+        <w:numPr>
+          <w:ilvl w:val="0"/>
+          <w:numId w:val="49"/>
+        </w:numPr>
+        <w:rPr>
+          <w:rFonts w:ascii="Times New Roman" w:eastAsia="宋体" w:hAnsi="Times New Roman" w:cs="Times New Roman"/>
+        </w:rPr>
+      </w:pPr>
+      <w:r>
+        <w:rPr>
+          <w:rFonts w:ascii="Times New Roman" w:eastAsia="宋体" w:hAnsi="Times New Roman" w:cs="Times New Roman" w:hint="eastAsia"/>
+        </w:rPr>
+        <w:t>修复地形动画不读取</w:t>
+      </w:r>
+      <w:r>
+        <w:rPr>
+          <w:rFonts w:ascii="Times New Roman" w:eastAsia="宋体" w:hAnsi="Times New Roman" w:cs="Times New Roman" w:hint="eastAsia"/>
+        </w:rPr>
+        <w:t>art</w:t>
+      </w:r>
+      <w:r>
+        <w:rPr>
+          <w:rFonts w:ascii="Times New Roman" w:eastAsia="宋体" w:hAnsi="Times New Roman" w:cs="Times New Roman" w:hint="eastAsia"/>
+        </w:rPr>
+        <w:t>内</w:t>
+      </w:r>
+      <w:r>
+        <w:rPr>
+          <w:rFonts w:ascii="Times New Roman" w:eastAsia="宋体" w:hAnsi="Times New Roman" w:cs="Times New Roman" w:hint="eastAsia"/>
+        </w:rPr>
+        <w:t>X</w:t>
+      </w:r>
+      <w:r>
+        <w:rPr>
+          <w:rFonts w:ascii="Times New Roman" w:eastAsia="宋体" w:hAnsi="Times New Roman" w:cs="Times New Roman" w:hint="eastAsia"/>
+        </w:rPr>
+        <w:t>/Y</w:t>
+      </w:r>
+      <w:r>
+        <w:rPr>
+          <w:rFonts w:ascii="Times New Roman" w:eastAsia="宋体" w:hAnsi="Times New Roman" w:cs="Times New Roman" w:hint="eastAsia"/>
+        </w:rPr>
+        <w:t>DrawOffset</w:t>
+      </w:r>
+      <w:r>
+        <w:rPr>
+          <w:rFonts w:ascii="Times New Roman" w:eastAsia="宋体" w:hAnsi="Times New Roman" w:cs="Times New Roman" w:hint="eastAsia"/>
+        </w:rPr>
+        <w:t>的</w:t>
+      </w:r>
+      <w:r>
+        <w:rPr>
+          <w:rFonts w:ascii="Times New Roman" w:eastAsia="宋体" w:hAnsi="Times New Roman" w:cs="Times New Roman" w:hint="eastAsia"/>
+        </w:rPr>
+        <w:t>bug</w:t>
+      </w:r>
+    </w:p>
+    <w:p>
+      <w:pPr>
+        <w:pStyle w:val="a9"/>
+        <w:numPr>
+          <w:ilvl w:val="0"/>
+          <w:numId w:val="49"/>
+        </w:numPr>
+        <w:rPr>
+          <w:rFonts w:ascii="Times New Roman" w:eastAsia="宋体" w:hAnsi="Times New Roman" w:cs="Times New Roman"/>
+        </w:rPr>
+      </w:pPr>
+      <w:r>
+        <w:rPr>
+          <w:rFonts w:ascii="Times New Roman" w:eastAsia="宋体" w:hAnsi="Times New Roman" w:cs="Times New Roman" w:hint="eastAsia"/>
+        </w:rPr>
+        <w:t>可以直接拖拽地图可见边缘（蓝线）</w:t>
+      </w:r>
+    </w:p>
+    <w:p>
+      <w:pPr>
+        <w:pStyle w:val="a9"/>
+        <w:numPr>
+          <w:ilvl w:val="0"/>
+          <w:numId w:val="49"/>
+        </w:numPr>
+        <w:rPr>
+          <w:rFonts w:ascii="Times New Roman" w:eastAsia="宋体" w:hAnsi="Times New Roman" w:cs="Times New Roman"/>
+        </w:rPr>
+      </w:pPr>
+      <w:r>
+        <w:rPr>
+          <w:rFonts w:ascii="Times New Roman" w:eastAsia="宋体" w:hAnsi="Times New Roman" w:cs="Times New Roman" w:hint="eastAsia"/>
+        </w:rPr>
+        <w:t>修复部分情况下拖拽单位辅助线显示错位的</w:t>
+      </w:r>
+      <w:r>
+        <w:rPr>
+          <w:rFonts w:ascii="Times New Roman" w:eastAsia="宋体" w:hAnsi="Times New Roman" w:cs="Times New Roman" w:hint="eastAsia"/>
+        </w:rPr>
+        <w:t>bug</w:t>
+      </w:r>
+    </w:p>
+    <w:p>
+      <w:pPr>
+        <w:pStyle w:val="a9"/>
+        <w:numPr>
+          <w:ilvl w:val="0"/>
+          <w:numId w:val="49"/>
+        </w:numPr>
+        <w:rPr>
+          <w:rFonts w:ascii="Times New Roman" w:eastAsia="宋体" w:hAnsi="Times New Roman" w:cs="Times New Roman"/>
+        </w:rPr>
+      </w:pPr>
+      <w:r>
+        <w:rPr>
+          <w:rFonts w:ascii="Times New Roman" w:eastAsia="宋体" w:hAnsi="Times New Roman" w:cs="Times New Roman" w:hint="eastAsia"/>
+        </w:rPr>
+        <w:t>粘贴时可以预览建筑、车辆等游戏对象</w:t>
+      </w:r>
+    </w:p>
+    <w:p>
+      <w:pPr>
+        <w:pStyle w:val="a9"/>
+        <w:numPr>
+          <w:ilvl w:val="0"/>
+          <w:numId w:val="49"/>
+        </w:numPr>
+        <w:rPr>
+          <w:rFonts w:ascii="Times New Roman" w:eastAsia="宋体" w:hAnsi="Times New Roman" w:cs="Times New Roman"/>
+        </w:rPr>
+      </w:pPr>
+      <w:r>
+        <w:rPr>
+          <w:rFonts w:ascii="Times New Roman" w:eastAsia="宋体" w:hAnsi="Times New Roman" w:cs="Times New Roman" w:hint="eastAsia"/>
+        </w:rPr>
+        <w:t>重写基本设置、单人任务设置、特定标识窗口，优化界面，适配</w:t>
+      </w:r>
+      <w:r>
+        <w:rPr>
+          <w:rFonts w:ascii="Times New Roman" w:eastAsia="宋体" w:hAnsi="Times New Roman" w:cs="Times New Roman" w:hint="eastAsia"/>
+        </w:rPr>
+        <w:t>phobos</w:t>
+      </w:r>
+      <w:r>
+        <w:rPr>
+          <w:rFonts w:ascii="Times New Roman" w:eastAsia="宋体" w:hAnsi="Times New Roman" w:cs="Times New Roman" w:hint="eastAsia"/>
+        </w:rPr>
+        <w:t>新功能</w:t>
+      </w:r>
+    </w:p>
+    <w:p>
+      <w:pPr>
+        <w:pStyle w:val="a9"/>
+        <w:numPr>
+          <w:ilvl w:val="0"/>
+          <w:numId w:val="49"/>
+        </w:numPr>
+        <w:rPr>
+          <w:rFonts w:ascii="Times New Roman" w:eastAsia="宋体" w:hAnsi="Times New Roman" w:cs="Times New Roman"/>
+        </w:rPr>
+      </w:pPr>
+      <w:r>
+        <w:rPr>
+          <w:rFonts w:ascii="Times New Roman" w:eastAsia="宋体" w:hAnsi="Times New Roman" w:cs="Times New Roman" w:hint="eastAsia"/>
+        </w:rPr>
+        <w:t>查找引用窗口可以查找标签关联的对象</w:t>
+      </w:r>
+    </w:p>
+    <w:p>
+      <w:pPr>
+        <w:pStyle w:val="a9"/>
+        <w:numPr>
+          <w:ilvl w:val="0"/>
+          <w:numId w:val="49"/>
+        </w:numPr>
+        <w:rPr>
+          <w:rFonts w:ascii="Times New Roman" w:eastAsia="宋体" w:hAnsi="Times New Roman" w:cs="Times New Roman"/>
+        </w:rPr>
+      </w:pPr>
+      <w:r>
+        <w:rPr>
+          <w:rFonts w:ascii="Times New Roman" w:eastAsia="宋体" w:hAnsi="Times New Roman" w:cs="Times New Roman" w:hint="eastAsia"/>
+        </w:rPr>
+        <w:t>添加新</w:t>
+      </w:r>
+      <w:r>
+        <w:rPr>
+          <w:rFonts w:ascii="Times New Roman" w:eastAsia="宋体" w:hAnsi="Times New Roman" w:cs="Times New Roman" w:hint="eastAsia"/>
+        </w:rPr>
+        <w:t>lua</w:t>
+      </w:r>
+      <w:r>
+        <w:rPr>
+          <w:rFonts w:ascii="Times New Roman" w:eastAsia="宋体" w:hAnsi="Times New Roman" w:cs="Times New Roman" w:hint="eastAsia"/>
+        </w:rPr>
+        <w:t>脚本</w:t>
+      </w:r>
+    </w:p>
+    <w:p>
+      <w:pPr>
+        <w:pStyle w:val="a9"/>
+        <w:numPr>
+          <w:ilvl w:val="0"/>
+          <w:numId w:val="49"/>
+        </w:numPr>
+        <w:rPr>
+          <w:rFonts w:ascii="Times New Roman" w:eastAsia="宋体" w:hAnsi="Times New Roman" w:cs="Times New Roman"/>
+        </w:rPr>
+      </w:pPr>
+      <w:r>
+        <w:rPr>
+          <w:rFonts w:ascii="Times New Roman" w:eastAsia="宋体" w:hAnsi="Times New Roman" w:cs="Times New Roman" w:hint="eastAsia"/>
+        </w:rPr>
+        <w:t>修复部分情况下</w:t>
+      </w:r>
+      <w:r>
+        <w:rPr>
+          <w:rFonts w:ascii="Times New Roman" w:eastAsia="宋体" w:hAnsi="Times New Roman" w:cs="Times New Roman" w:hint="eastAsia"/>
+        </w:rPr>
+        <w:t>lua</w:t>
+      </w:r>
+      <w:r>
+        <w:rPr>
+          <w:rFonts w:ascii="Times New Roman" w:eastAsia="宋体" w:hAnsi="Times New Roman" w:cs="Times New Roman" w:hint="eastAsia"/>
+        </w:rPr>
+        <w:t>脚本输出窗口显示错乱的</w:t>
+      </w:r>
+      <w:r>
+        <w:rPr>
+          <w:rFonts w:ascii="Times New Roman" w:eastAsia="宋体" w:hAnsi="Times New Roman" w:cs="Times New Roman" w:hint="eastAsia"/>
+        </w:rPr>
+        <w:t>bug</w:t>
+      </w:r>
+    </w:p>
+    <w:p>
+      <w:pPr>
+        <w:pStyle w:val="a9"/>
+        <w:numPr>
+          <w:ilvl w:val="0"/>
+          <w:numId w:val="49"/>
+        </w:numPr>
+        <w:rPr>
+          <w:rFonts w:ascii="Times New Roman" w:eastAsia="宋体" w:hAnsi="Times New Roman" w:cs="Times New Roman"/>
+        </w:rPr>
+      </w:pPr>
+      <w:r>
+        <w:rPr>
+          <w:rFonts w:ascii="Times New Roman" w:eastAsia="宋体" w:hAnsi="Times New Roman" w:cs="Times New Roman" w:hint="eastAsia"/>
+        </w:rPr>
+        <w:t>新增</w:t>
+      </w:r>
+      <w:r>
+        <w:rPr>
+          <w:rFonts w:ascii="Times New Roman" w:eastAsia="宋体" w:hAnsi="Times New Roman" w:cs="Times New Roman" w:hint="eastAsia"/>
+        </w:rPr>
+        <w:t>TileSetBrowserViewCompactArrange</w:t>
+      </w:r>
+      <w:r>
+        <w:rPr>
+          <w:rFonts w:ascii="Times New Roman" w:eastAsia="宋体" w:hAnsi="Times New Roman" w:cs="Times New Roman" w:hint="eastAsia"/>
+        </w:rPr>
+        <w:t>，可以让地形浏览器的图像排列更加紧凑</w:t>
+      </w:r>
+    </w:p>
+    <w:p>
+      <w:pPr>
+        <w:pStyle w:val="a9"/>
+        <w:numPr>
+          <w:ilvl w:val="0"/>
+          <w:numId w:val="49"/>
+        </w:numPr>
+        <w:rPr>
+          <w:rFonts w:ascii="Times New Roman" w:eastAsia="宋体" w:hAnsi="Times New Roman" w:cs="Times New Roman"/>
+        </w:rPr>
+      </w:pPr>
+      <w:r>
+        <w:rPr>
+          <w:rFonts w:ascii="Times New Roman" w:eastAsia="宋体" w:hAnsi="Times New Roman" w:cs="Times New Roman" w:hint="eastAsia"/>
+        </w:rPr>
+        <w:t>修复对象查看器无法按名称搜索覆盖物的</w:t>
+      </w:r>
+      <w:r>
+        <w:rPr>
+          <w:rFonts w:ascii="Times New Roman" w:eastAsia="宋体" w:hAnsi="Times New Roman" w:cs="Times New Roman" w:hint="eastAsia"/>
+        </w:rPr>
+        <w:t>bug</w:t>
+      </w:r>
+    </w:p>
+    <w:p>
+      <w:pPr>
+        <w:pStyle w:val="a9"/>
+        <w:numPr>
+          <w:ilvl w:val="0"/>
+          <w:numId w:val="10"/>
+        </w:numPr>
+        <w:rPr>
+          <w:rFonts w:ascii="Times New Roman" w:eastAsia="宋体" w:hAnsi="Times New Roman" w:cs="Times New Roman"/>
           <w:b/>
           <w:bCs/>
           <w:sz w:val="28"/>
           <w:szCs w:val="32"/>
         </w:rPr>
-        <w:t>1.4.</w:t>
-      </w:r>
+      </w:pPr>
       <w:r>
         <w:rPr>
           <w:rFonts w:ascii="Times New Roman" w:eastAsia="宋体" w:hAnsi="Times New Roman" w:cs="Times New Roman" w:hint="eastAsia"/>
@@ -1666,7 +1684,7 @@
           <w:sz w:val="28"/>
           <w:szCs w:val="32"/>
         </w:rPr>
-        <w:t xml:space="preserve">3 </w:t>
+        <w:t>1.4.</w:t>
       </w:r>
       <w:r>
         <w:rPr>
@@ -1676,7 +1694,7 @@
           <w:sz w:val="28"/>
           <w:szCs w:val="32"/>
         </w:rPr>
-        <w:t>(2026.0</w:t>
+        <w:t xml:space="preserve">3 </w:t>
       </w:r>
       <w:r>
         <w:rPr>
@@ -1686,7 +1704,7 @@
           <w:sz w:val="28"/>
           <w:szCs w:val="32"/>
         </w:rPr>
-        <w:t>6</w:t>
+        <w:t>(2026.0</w:t>
       </w:r>
       <w:r>
         <w:rPr>
@@ -1696,7 +1714,7 @@
           <w:sz w:val="28"/>
           <w:szCs w:val="32"/>
         </w:rPr>
-        <w:t>.</w:t>
+        <w:t>6</w:t>
       </w:r>
       <w:r>
         <w:rPr>
@@ -1706,7 +1724,7 @@
           <w:sz w:val="28"/>
           <w:szCs w:val="32"/>
         </w:rPr>
-        <w:t>0</w:t>
+        <w:t>.</w:t>
       </w:r>
       <w:r>
         <w:rPr>
@@ -1716,7 +1734,7 @@
           <w:sz w:val="28"/>
           <w:szCs w:val="32"/>
         </w:rPr>
-        <w:t>1</w:t>
+        <w:t>0</w:t>
       </w:r>
       <w:r>
         <w:rPr>
@@ -1726,6 +1744,16 @@
           <w:sz w:val="28"/>
           <w:szCs w:val="32"/>
         </w:rPr>
+        <w:t>1</w:t>
+      </w:r>
+      <w:r>
+        <w:rPr>
+          <w:rFonts w:ascii="Times New Roman" w:eastAsia="宋体" w:hAnsi="Times New Roman" w:cs="Times New Roman" w:hint="eastAsia"/>
+          <w:b/>
+          <w:bCs/>
+          <w:sz w:val="28"/>
+          <w:szCs w:val="32"/>
+        </w:rPr>
         <w:t>)</w:t>
       </w:r>
     </w:p>
@@ -2044,6 +2072,7 @@
         <w:rPr>
           <w:rFonts w:ascii="Times New Roman" w:eastAsia="宋体" w:hAnsi="Times New Roman" w:cs="Times New Roman" w:hint="eastAsia"/>
         </w:rPr>
+        <w:lastRenderedPageBreak/>
         <w:t>优化右键拖动流畅度，拖动时可以实时更新小地图</w:t>
       </w:r>
     </w:p>
@@ -2062,7 +2091,6 @@
         <w:rPr>
           <w:rFonts w:ascii="Times New Roman" w:eastAsia="宋体" w:hAnsi="Times New Roman" w:cs="Times New Roman" w:hint="eastAsia"/>
         </w:rPr>
-        <w:lastRenderedPageBreak/>
         <w:t>优化右键取消当前指令时物品浏览器不停向上切换的</w:t>
       </w:r>
       <w:r>
@@ -2894,7 +2922,14 @@
         <w:rPr>
           <w:rFonts w:ascii="Times New Roman" w:eastAsia="宋体" w:hAnsi="Times New Roman" w:cs="Times New Roman" w:hint="eastAsia"/>
         </w:rPr>
-        <w:t>优化路径点列表性能，各列表会在对应编辑器内新建、复制、删除对象时刷新</w:t>
+        <w:t>优化路径点列表性能，各列表会在对应编辑器内新建、复制、删除对象时刷</w:t>
+      </w:r>
+      <w:r>
+        <w:rPr>
+          <w:rFonts w:ascii="Times New Roman" w:eastAsia="宋体" w:hAnsi="Times New Roman" w:cs="Times New Roman" w:hint="eastAsia"/>
+        </w:rPr>
+        <w:lastRenderedPageBreak/>
+        <w:t>新</w:t>
       </w:r>
     </w:p>
     <w:p>
@@ -2912,7 +2947,6 @@
         <w:rPr>
           <w:rFonts w:ascii="Times New Roman" w:eastAsia="宋体" w:hAnsi="Times New Roman" w:cs="Times New Roman" w:hint="eastAsia"/>
         </w:rPr>
-        <w:lastRenderedPageBreak/>
         <w:t>可以在</w:t>
       </w:r>
       <w:r>

</xml_diff>

<commit_message>
fix house tree view duplicate & crash
</commit_message>
<xml_diff>
--- a/Supplementary/文档/FA2SP HDM Edition说明文档.docx
+++ b/Supplementary/文档/FA2SP HDM Edition说明文档.docx
@@ -1112,6 +1112,30 @@
         <w:pStyle w:val="a9"/>
         <w:numPr>
           <w:ilvl w:val="0"/>
+          <w:numId w:val="11"/>
+        </w:numPr>
+        <w:rPr>
+          <w:rFonts w:ascii="Times New Roman" w:eastAsia="宋体" w:hAnsi="Times New Roman" w:cs="Times New Roman"/>
+        </w:rPr>
+      </w:pPr>
+      <w:r>
+        <w:rPr>
+          <w:rFonts w:ascii="Times New Roman" w:eastAsia="宋体" w:hAnsi="Times New Roman" w:cs="Times New Roman" w:hint="eastAsia"/>
+        </w:rPr>
+        <w:t>修复部分遭遇战地图所属方选项重复的</w:t>
+      </w:r>
+      <w:r>
+        <w:rPr>
+          <w:rFonts w:ascii="Times New Roman" w:eastAsia="宋体" w:hAnsi="Times New Roman" w:cs="Times New Roman" w:hint="eastAsia"/>
+        </w:rPr>
+        <w:t>bug</w:t>
+      </w:r>
+    </w:p>
+    <w:p>
+      <w:pPr>
+        <w:pStyle w:val="a9"/>
+        <w:numPr>
+          <w:ilvl w:val="0"/>
           <w:numId w:val="10"/>
         </w:numPr>
         <w:rPr>
@@ -1994,6 +2018,7 @@
         <w:rPr>
           <w:rFonts w:ascii="Times New Roman" w:eastAsia="宋体" w:hAnsi="Times New Roman" w:cs="Times New Roman" w:hint="eastAsia"/>
         </w:rPr>
+        <w:lastRenderedPageBreak/>
         <w:t>修复在老系统上展开下拉菜单使用滚轮时，会错误触发文本框选择切换的</w:t>
       </w:r>
       <w:r>
@@ -2018,7 +2043,6 @@
         <w:rPr>
           <w:rFonts w:ascii="Times New Roman" w:eastAsia="宋体" w:hAnsi="Times New Roman" w:cs="Times New Roman" w:hint="eastAsia"/>
         </w:rPr>
-        <w:lastRenderedPageBreak/>
         <w:t>修复</w:t>
       </w:r>
       <w:r>
@@ -2910,6 +2934,7 @@
         <w:rPr>
           <w:rFonts w:ascii="Times New Roman" w:eastAsia="宋体" w:hAnsi="Times New Roman" w:cs="Times New Roman" w:hint="eastAsia"/>
         </w:rPr>
+        <w:lastRenderedPageBreak/>
         <w:t>可以记忆地形浏览器的大小</w:t>
       </w:r>
     </w:p>
@@ -2928,7 +2953,6 @@
         <w:rPr>
           <w:rFonts w:ascii="Times New Roman" w:eastAsia="宋体" w:hAnsi="Times New Roman" w:cs="Times New Roman" w:hint="eastAsia"/>
         </w:rPr>
-        <w:lastRenderedPageBreak/>
         <w:t>地形浏览器、覆盖物浏览器、对象查看器可以按住</w:t>
       </w:r>
       <w:r>
@@ -3837,6 +3861,7 @@
         <w:rPr>
           <w:rFonts w:ascii="Times New Roman" w:eastAsia="宋体" w:hAnsi="Times New Roman" w:cs="Times New Roman" w:hint="eastAsia"/>
         </w:rPr>
+        <w:lastRenderedPageBreak/>
         <w:t>AI</w:t>
       </w:r>
       <w:r>
@@ -3867,7 +3892,6 @@
         <w:rPr>
           <w:rFonts w:ascii="Times New Roman" w:eastAsia="宋体" w:hAnsi="Times New Roman" w:cs="Times New Roman" w:hint="eastAsia"/>
         </w:rPr>
-        <w:lastRenderedPageBreak/>
         <w:t>修复通用格式刷同时应用于多种不同对象时，</w:t>
       </w:r>
       <w:r>
@@ -4722,6 +4746,7 @@
         <w:rPr>
           <w:rFonts w:ascii="Times New Roman" w:eastAsia="宋体" w:hAnsi="Times New Roman" w:cs="Times New Roman" w:hint="eastAsia"/>
         </w:rPr>
+        <w:lastRenderedPageBreak/>
         <w:t>修复导入已存在的地图对话框中三个导入选项不正常的</w:t>
       </w:r>
       <w:r>
@@ -4746,7 +4771,6 @@
         <w:rPr>
           <w:rFonts w:ascii="Times New Roman" w:eastAsia="宋体" w:hAnsi="Times New Roman" w:cs="Times New Roman" w:hint="eastAsia"/>
         </w:rPr>
-        <w:lastRenderedPageBreak/>
         <w:t>地图工具</w:t>
       </w:r>
       <w:r>
@@ -5800,6 +5824,7 @@
         <w:rPr>
           <w:rFonts w:ascii="Times New Roman" w:eastAsia="宋体" w:hAnsi="Times New Roman" w:cs="Times New Roman" w:hint="eastAsia"/>
         </w:rPr>
+        <w:lastRenderedPageBreak/>
         <w:t>支持自定义气候类型的</w:t>
       </w:r>
       <w:r>
@@ -5840,7 +5865,6 @@
           <w:kern w:val="0"/>
           <w14:ligatures w14:val="none"/>
         </w:rPr>
-        <w:lastRenderedPageBreak/>
         <w:t>科技类型、</w:t>
       </w:r>
       <w:r>
@@ -6983,6 +7007,7 @@
         <w:rPr>
           <w:rFonts w:ascii="Times New Roman" w:eastAsia="宋体" w:hAnsi="Times New Roman" w:cs="Times New Roman" w:hint="eastAsia"/>
         </w:rPr>
+        <w:lastRenderedPageBreak/>
         <w:t>修复当显示缺省图像开启时，对没有影子帧的单位显示缺省阴影的</w:t>
       </w:r>
       <w:r>
@@ -7007,7 +7032,6 @@
         <w:rPr>
           <w:rFonts w:ascii="Times New Roman" w:eastAsia="宋体" w:hAnsi="Times New Roman" w:cs="Times New Roman" w:hint="eastAsia"/>
         </w:rPr>
-        <w:lastRenderedPageBreak/>
         <w:t>支持读取</w:t>
       </w:r>
       <w:r>
@@ -8004,6 +8028,7 @@
         <w:rPr>
           <w:rFonts w:ascii="Times New Roman" w:eastAsia="宋体" w:hAnsi="Times New Roman" w:cs="Times New Roman" w:hint="eastAsia"/>
         </w:rPr>
+        <w:lastRenderedPageBreak/>
         <w:t>支持车辆单位的额外炮塔和额外炮管</w:t>
       </w:r>
     </w:p>
@@ -8022,7 +8047,6 @@
         <w:rPr>
           <w:rFonts w:ascii="Times New Roman" w:eastAsia="宋体" w:hAnsi="Times New Roman" w:cs="Times New Roman"/>
         </w:rPr>
-        <w:lastRenderedPageBreak/>
         <w:t>I</w:t>
       </w:r>
       <w:r>

</xml_diff>

<commit_message>
fix tile index exceed causing untouchable cells
</commit_message>
<xml_diff>
--- a/Supplementary/文档/FA2SP HDM Edition说明文档.docx
+++ b/Supplementary/文档/FA2SP HDM Edition说明文档.docx
@@ -1225,6 +1225,30 @@
           <w:rFonts w:ascii="Times New Roman" w:eastAsia="宋体" w:hAnsi="Times New Roman" w:cs="Times New Roman" w:hint="eastAsia"/>
         </w:rPr>
         <w:t>小地图窗口可以调节透明度</w:t>
+      </w:r>
+    </w:p>
+    <w:p>
+      <w:pPr>
+        <w:pStyle w:val="a9"/>
+        <w:numPr>
+          <w:ilvl w:val="0"/>
+          <w:numId w:val="11"/>
+        </w:numPr>
+        <w:rPr>
+          <w:rFonts w:ascii="Times New Roman" w:eastAsia="宋体" w:hAnsi="Times New Roman" w:cs="Times New Roman"/>
+        </w:rPr>
+      </w:pPr>
+      <w:r>
+        <w:rPr>
+          <w:rFonts w:ascii="Times New Roman" w:eastAsia="宋体" w:hAnsi="Times New Roman" w:cs="Times New Roman" w:hint="eastAsia"/>
+        </w:rPr>
+        <w:t>修复部分情况下按工具栏擦除覆盖物等按钮不生效的</w:t>
+      </w:r>
+      <w:r>
+        <w:rPr>
+          <w:rFonts w:ascii="Times New Roman" w:eastAsia="宋体" w:hAnsi="Times New Roman" w:cs="Times New Roman" w:hint="eastAsia"/>
+        </w:rPr>
+        <w:t>bug</w:t>
       </w:r>
     </w:p>
     <w:p>
@@ -48388,7 +48412,7 @@
         <v:path o:extrusionok="f" gradientshapeok="t" o:connecttype="rect"/>
         <o:lock v:ext="edit" aspectratio="t"/>
       </v:shapetype>
-      <v:shape id="_x0000_i1029" type="#_x0000_t75" style="width:11.55pt;height:11.55pt" o:bullet="t">
+      <v:shape id="_x0000_i1030" type="#_x0000_t75" style="width:11.55pt;height:11.55pt" o:bullet="t">
         <v:imagedata r:id="rId1" o:title="mso9A9A"/>
       </v:shape>
     </w:pict>

</xml_diff>

<commit_message>
fix hide object view when tile view is hidden, adapt CSearhReference::bFollowActiveWindow
</commit_message>
<xml_diff>
--- a/Supplementary/文档/FA2SP HDM Edition说明文档.docx
+++ b/Supplementary/文档/FA2SP HDM Edition说明文档.docx
@@ -174,7 +174,7 @@
           <w:rFonts w:ascii="宋体" w:eastAsia="宋体" w:hAnsi="宋体" w:hint="eastAsia"/>
           <w:sz w:val="24"/>
         </w:rPr>
-        <w:t>1</w:t>
+        <w:t>2</w:t>
       </w:r>
     </w:p>
     <w:p>
@@ -266,7 +266,7 @@
           <w:sz w:val="28"/>
           <w:szCs w:val="32"/>
         </w:rPr>
-        <w:t>1</w:t>
+        <w:t>2</w:t>
       </w:r>
       <w:r>
         <w:rPr>
@@ -1317,6 +1317,24 @@
         <w:pStyle w:val="a9"/>
         <w:numPr>
           <w:ilvl w:val="0"/>
+          <w:numId w:val="11"/>
+        </w:numPr>
+        <w:rPr>
+          <w:rFonts w:ascii="Times New Roman" w:eastAsia="宋体" w:hAnsi="Times New Roman" w:cs="Times New Roman"/>
+        </w:rPr>
+      </w:pPr>
+      <w:r>
+        <w:rPr>
+          <w:rFonts w:ascii="Times New Roman" w:eastAsia="宋体" w:hAnsi="Times New Roman" w:cs="Times New Roman" w:hint="eastAsia"/>
+        </w:rPr>
+        <w:t>受损火焰能正确被其他单位遮挡</w:t>
+      </w:r>
+    </w:p>
+    <w:p>
+      <w:pPr>
+        <w:pStyle w:val="a9"/>
+        <w:numPr>
+          <w:ilvl w:val="0"/>
           <w:numId w:val="10"/>
         </w:numPr>
         <w:rPr>
@@ -1905,6 +1923,7 @@
         <w:rPr>
           <w:rFonts w:ascii="Times New Roman" w:eastAsia="宋体" w:hAnsi="Times New Roman" w:cs="Times New Roman" w:hint="eastAsia"/>
         </w:rPr>
+        <w:lastRenderedPageBreak/>
         <w:t>修复部分情况下</w:t>
       </w:r>
       <w:r>
@@ -1941,7 +1960,6 @@
         <w:rPr>
           <w:rFonts w:ascii="Times New Roman" w:eastAsia="宋体" w:hAnsi="Times New Roman" w:cs="Times New Roman" w:hint="eastAsia"/>
         </w:rPr>
-        <w:lastRenderedPageBreak/>
         <w:t>新增</w:t>
       </w:r>
       <w:r>
@@ -2896,6 +2914,7 @@
         <w:rPr>
           <w:rFonts w:ascii="Times New Roman" w:eastAsia="宋体" w:hAnsi="Times New Roman" w:cs="Times New Roman" w:hint="eastAsia"/>
         </w:rPr>
+        <w:lastRenderedPageBreak/>
         <w:t>修复触发列表等列表分组错误的</w:t>
       </w:r>
       <w:r>
@@ -2920,7 +2939,6 @@
         <w:rPr>
           <w:rFonts w:ascii="Times New Roman" w:eastAsia="宋体" w:hAnsi="Times New Roman" w:cs="Times New Roman" w:hint="eastAsia"/>
         </w:rPr>
-        <w:lastRenderedPageBreak/>
         <w:t>距离工具箱新增放置自由圆，可以自定义半径</w:t>
       </w:r>
     </w:p>
@@ -3832,6 +3850,7 @@
         <w:rPr>
           <w:rFonts w:ascii="Times New Roman" w:eastAsia="宋体" w:hAnsi="Times New Roman" w:cs="Times New Roman" w:hint="eastAsia"/>
         </w:rPr>
+        <w:lastRenderedPageBreak/>
         <w:t>修复双击触发编辑器行为列表的上移下移按钮时不响应的</w:t>
       </w:r>
       <w:r>
@@ -3856,7 +3875,6 @@
         <w:rPr>
           <w:rFonts w:ascii="Times New Roman" w:eastAsia="宋体" w:hAnsi="Times New Roman" w:cs="Times New Roman" w:hint="eastAsia"/>
         </w:rPr>
-        <w:lastRenderedPageBreak/>
         <w:t>优化覆盖物加载策略，即使素材文件内部标记有误，也会加载前一半图像</w:t>
       </w:r>
     </w:p>
@@ -4711,7 +4729,14 @@
         <w:rPr>
           <w:rFonts w:ascii="Times New Roman" w:eastAsia="宋体" w:hAnsi="Times New Roman" w:cs="Times New Roman" w:hint="eastAsia"/>
         </w:rPr>
-        <w:t>地形生成器新增“忽视地表类型”选项，勾选后不会对任何地表类型进行避让</w:t>
+        <w:t>地形生成器新增“忽视地表类型”选项，勾选后不会对任何地表类型进行避</w:t>
+      </w:r>
+      <w:r>
+        <w:rPr>
+          <w:rFonts w:ascii="Times New Roman" w:eastAsia="宋体" w:hAnsi="Times New Roman" w:cs="Times New Roman" w:hint="eastAsia"/>
+        </w:rPr>
+        <w:lastRenderedPageBreak/>
+        <w:t>让</w:t>
       </w:r>
     </w:p>
     <w:p>
@@ -4729,7 +4754,6 @@
         <w:rPr>
           <w:rFonts w:ascii="Times New Roman" w:eastAsia="宋体" w:hAnsi="Times New Roman" w:cs="Times New Roman" w:hint="eastAsia"/>
         </w:rPr>
-        <w:lastRenderedPageBreak/>
         <w:t>修复部分情况下启动地形生成器时崩溃的</w:t>
       </w:r>
       <w:r>
@@ -5789,6 +5813,7 @@
         <w:rPr>
           <w:rFonts w:ascii="Times New Roman" w:eastAsia="宋体" w:hAnsi="Times New Roman" w:cs="Times New Roman" w:hint="eastAsia"/>
         </w:rPr>
+        <w:lastRenderedPageBreak/>
         <w:t>修复地形浏览器</w:t>
       </w:r>
       <w:r>
@@ -5837,7 +5862,6 @@
         <w:rPr>
           <w:rFonts w:ascii="Times New Roman" w:eastAsia="宋体" w:hAnsi="Times New Roman" w:cs="Times New Roman" w:hint="eastAsia"/>
         </w:rPr>
-        <w:lastRenderedPageBreak/>
         <w:t>在</w:t>
       </w:r>
       <w:r>
@@ -7044,6 +7068,7 @@
         <w:rPr>
           <w:rFonts w:ascii="Times New Roman" w:eastAsia="宋体" w:hAnsi="Times New Roman" w:cs="Times New Roman" w:hint="eastAsia"/>
         </w:rPr>
+        <w:lastRenderedPageBreak/>
         <w:t>优化摆放单位时预览的性能</w:t>
       </w:r>
     </w:p>
@@ -7062,7 +7087,6 @@
         <w:rPr>
           <w:rFonts w:ascii="Times New Roman" w:eastAsia="宋体" w:hAnsi="Times New Roman" w:cs="Times New Roman" w:hint="eastAsia"/>
         </w:rPr>
-        <w:lastRenderedPageBreak/>
         <w:t>修复设置路径点颜色失效的</w:t>
       </w:r>
       <w:r>
@@ -8083,7 +8107,14 @@
         <w:rPr>
           <w:rFonts w:ascii="Times New Roman" w:eastAsia="宋体" w:hAnsi="Times New Roman" w:cs="Times New Roman" w:hint="eastAsia"/>
         </w:rPr>
-        <w:t>，单击绿点可以为地图上的单位设置标签</w:t>
+        <w:t>，单击绿</w:t>
+      </w:r>
+      <w:r>
+        <w:rPr>
+          <w:rFonts w:ascii="Times New Roman" w:eastAsia="宋体" w:hAnsi="Times New Roman" w:cs="Times New Roman" w:hint="eastAsia"/>
+        </w:rPr>
+        <w:lastRenderedPageBreak/>
+        <w:t>点可以为地图上的单位设置标签</w:t>
       </w:r>
     </w:p>
     <w:p>
@@ -8101,7 +8132,6 @@
         <w:rPr>
           <w:rFonts w:ascii="Times New Roman" w:eastAsia="宋体" w:hAnsi="Times New Roman" w:cs="Times New Roman" w:hint="eastAsia"/>
         </w:rPr>
-        <w:lastRenderedPageBreak/>
         <w:t>作战小队、特遣部队、动作脚本编辑器支持通过拖拽</w:t>
       </w:r>
       <w:r>
@@ -9110,6 +9140,7 @@
         <w:rPr>
           <w:rFonts w:ascii="Times New Roman" w:eastAsia="宋体" w:hAnsi="Times New Roman" w:cs="Times New Roman" w:hint="eastAsia"/>
         </w:rPr>
+        <w:lastRenderedPageBreak/>
         <w:t>支持对覆盖物进行分类，详见</w:t>
       </w:r>
       <w:r>
@@ -9134,7 +9165,6 @@
         <w:rPr>
           <w:rFonts w:ascii="Times New Roman" w:eastAsia="宋体" w:hAnsi="Times New Roman" w:cs="Times New Roman" w:hint="eastAsia"/>
         </w:rPr>
-        <w:lastRenderedPageBreak/>
         <w:t>放置铁路时，仅在物品浏览器</w:t>
       </w:r>
       <w:r>
@@ -10189,6 +10219,7 @@
         <w:rPr>
           <w:rFonts w:ascii="Times New Roman" w:eastAsia="宋体" w:hAnsi="Times New Roman" w:cs="Times New Roman" w:hint="eastAsia"/>
         </w:rPr>
+        <w:lastRenderedPageBreak/>
         <w:t>复制粘贴所使用的</w:t>
       </w:r>
       <w:r>
@@ -10207,7 +10238,6 @@
         <w:rPr>
           <w:rFonts w:ascii="Times New Roman" w:eastAsia="宋体" w:hAnsi="Times New Roman" w:cs="Times New Roman" w:hint="eastAsia"/>
         </w:rPr>
-        <w:lastRenderedPageBreak/>
         <w:t>Urb2UbnTileRules</w:t>
       </w:r>
       <w:r>
@@ -11268,6 +11298,7 @@
         <w:rPr>
           <w:rFonts w:ascii="Times New Roman" w:eastAsia="宋体" w:hAnsi="Times New Roman" w:cs="Times New Roman" w:hint="eastAsia"/>
         </w:rPr>
+        <w:lastRenderedPageBreak/>
         <w:t>修复了</w:t>
       </w:r>
       <w:r>
@@ -11310,7 +11341,6 @@
         <w:rPr>
           <w:rFonts w:ascii="Times New Roman" w:eastAsia="宋体" w:hAnsi="Times New Roman" w:cs="Times New Roman" w:hint="eastAsia"/>
         </w:rPr>
-        <w:lastRenderedPageBreak/>
         <w:t>支持在</w:t>
       </w:r>
       <w:r>
@@ -48443,7 +48473,7 @@
         <v:path o:extrusionok="f" gradientshapeok="t" o:connecttype="rect"/>
         <o:lock v:ext="edit" aspectratio="t"/>
       </v:shapetype>
-      <v:shape id="_x0000_i1031" type="#_x0000_t75" style="width:11.55pt;height:11.55pt" o:bullet="t">
+      <v:shape id="_x0000_i1030" type="#_x0000_t75" style="width:11.55pt;height:11.55pt" o:bullet="t">
         <v:imagedata r:id="rId1" o:title="mso9A9A"/>
       </v:shape>
     </w:pict>

</xml_diff>

<commit_message>
fix damage fire next=, fix some combobox bg color
</commit_message>
<xml_diff>
--- a/Supplementary/文档/FA2SP HDM Edition说明文档.docx
+++ b/Supplementary/文档/FA2SP HDM Edition说明文档.docx
@@ -174,7 +174,7 @@
           <w:rFonts w:ascii="宋体" w:eastAsia="宋体" w:hAnsi="宋体" w:hint="eastAsia"/>
           <w:sz w:val="24"/>
         </w:rPr>
-        <w:t>2</w:t>
+        <w:t>3</w:t>
       </w:r>
     </w:p>
     <w:p>
@@ -256,7 +256,7 @@
           <w:sz w:val="28"/>
           <w:szCs w:val="32"/>
         </w:rPr>
-        <w:t>1</w:t>
+        <w:t>13</w:t>
       </w:r>
       <w:r>
         <w:rPr>
@@ -266,16 +266,6 @@
           <w:sz w:val="28"/>
           <w:szCs w:val="32"/>
         </w:rPr>
-        <w:t>2</w:t>
-      </w:r>
-      <w:r>
-        <w:rPr>
-          <w:rFonts w:ascii="Times New Roman" w:eastAsia="宋体" w:hAnsi="Times New Roman" w:cs="Times New Roman" w:hint="eastAsia"/>
-          <w:b/>
-          <w:bCs/>
-          <w:sz w:val="28"/>
-          <w:szCs w:val="32"/>
-        </w:rPr>
         <w:t>)</w:t>
       </w:r>
     </w:p>
@@ -1328,6 +1318,30 @@
           <w:rFonts w:ascii="Times New Roman" w:eastAsia="宋体" w:hAnsi="Times New Roman" w:cs="Times New Roman" w:hint="eastAsia"/>
         </w:rPr>
         <w:t>受损火焰能正确被其他单位遮挡</w:t>
+      </w:r>
+      <w:r>
+        <w:rPr>
+          <w:rFonts w:ascii="Times New Roman" w:eastAsia="宋体" w:hAnsi="Times New Roman" w:cs="Times New Roman" w:hint="eastAsia"/>
+        </w:rPr>
+        <w:t>，可以读取</w:t>
+      </w:r>
+      <w:r>
+        <w:rPr>
+          <w:rFonts w:ascii="Times New Roman" w:eastAsia="宋体" w:hAnsi="Times New Roman" w:cs="Times New Roman" w:hint="eastAsia"/>
+        </w:rPr>
+        <w:t>Next=</w:t>
+      </w:r>
+      <w:r>
+        <w:rPr>
+          <w:rFonts w:ascii="Times New Roman" w:eastAsia="宋体" w:hAnsi="Times New Roman" w:cs="Times New Roman" w:hint="eastAsia"/>
+        </w:rPr>
+        <w:t>最终的</w:t>
+      </w:r>
+      <w:r>
+        <w:rPr>
+          <w:rFonts w:ascii="Times New Roman" w:eastAsia="宋体" w:hAnsi="Times New Roman" w:cs="Times New Roman" w:hint="eastAsia"/>
+        </w:rPr>
+        <w:t>图像</w:t>
       </w:r>
     </w:p>
     <w:p>
@@ -48473,7 +48487,7 @@
         <v:path o:extrusionok="f" gradientshapeok="t" o:connecttype="rect"/>
         <o:lock v:ext="edit" aspectratio="t"/>
       </v:shapetype>
-      <v:shape id="_x0000_i1030" type="#_x0000_t75" style="width:11.55pt;height:11.55pt" o:bullet="t">
+      <v:shape id="_x0000_i1032" type="#_x0000_t75" style="width:11.55pt;height:11.55pt" o:bullet="t">
         <v:imagedata r:id="rId1" o:title="mso9A9A"/>
       </v:shape>
     </w:pict>

</xml_diff>

<commit_message>
add confirm dialog in reload map
</commit_message>
<xml_diff>
--- a/Supplementary/文档/FA2SP HDM Edition说明文档.docx
+++ b/Supplementary/文档/FA2SP HDM Edition说明文档.docx
@@ -167,14 +167,7 @@
           <w:rFonts w:ascii="宋体" w:eastAsia="宋体" w:hAnsi="宋体" w:hint="eastAsia"/>
           <w:sz w:val="24"/>
         </w:rPr>
-        <w:t>1</w:t>
-      </w:r>
-      <w:r>
-        <w:rPr>
-          <w:rFonts w:ascii="宋体" w:eastAsia="宋体" w:hAnsi="宋体" w:hint="eastAsia"/>
-          <w:sz w:val="24"/>
-        </w:rPr>
-        <w:t>6</w:t>
+        <w:t>17</w:t>
       </w:r>
     </w:p>
     <w:p>
@@ -266,7 +259,7 @@
           <w:sz w:val="28"/>
           <w:szCs w:val="32"/>
         </w:rPr>
-        <w:t>6</w:t>
+        <w:t>7</w:t>
       </w:r>
       <w:r>
         <w:rPr>
@@ -1449,6 +1442,48 @@
         <w:pStyle w:val="a9"/>
         <w:numPr>
           <w:ilvl w:val="0"/>
+          <w:numId w:val="11"/>
+        </w:numPr>
+        <w:rPr>
+          <w:rFonts w:ascii="Times New Roman" w:eastAsia="宋体" w:hAnsi="Times New Roman" w:cs="Times New Roman"/>
+        </w:rPr>
+      </w:pPr>
+      <w:r>
+        <w:rPr>
+          <w:rFonts w:ascii="Times New Roman" w:eastAsia="宋体" w:hAnsi="Times New Roman" w:cs="Times New Roman" w:hint="eastAsia"/>
+        </w:rPr>
+        <w:t>修复查找引用窗口的跟随活动的窗口不随窗口大小移动的</w:t>
+      </w:r>
+      <w:r>
+        <w:rPr>
+          <w:rFonts w:ascii="Times New Roman" w:eastAsia="宋体" w:hAnsi="Times New Roman" w:cs="Times New Roman" w:hint="eastAsia"/>
+        </w:rPr>
+        <w:t>bug</w:t>
+      </w:r>
+    </w:p>
+    <w:p>
+      <w:pPr>
+        <w:pStyle w:val="a9"/>
+        <w:numPr>
+          <w:ilvl w:val="0"/>
+          <w:numId w:val="11"/>
+        </w:numPr>
+        <w:rPr>
+          <w:rFonts w:ascii="Times New Roman" w:eastAsia="宋体" w:hAnsi="Times New Roman" w:cs="Times New Roman"/>
+        </w:rPr>
+      </w:pPr>
+      <w:r>
+        <w:rPr>
+          <w:rFonts w:ascii="Times New Roman" w:eastAsia="宋体" w:hAnsi="Times New Roman" w:cs="Times New Roman" w:hint="eastAsia"/>
+        </w:rPr>
+        <w:t>为重载地图增加了确认对话框</w:t>
+      </w:r>
+    </w:p>
+    <w:p>
+      <w:pPr>
+        <w:pStyle w:val="a9"/>
+        <w:numPr>
+          <w:ilvl w:val="0"/>
           <w:numId w:val="10"/>
         </w:numPr>
         <w:rPr>
@@ -1917,6 +1952,7 @@
         <w:rPr>
           <w:rFonts w:ascii="Times New Roman" w:eastAsia="宋体" w:hAnsi="Times New Roman" w:cs="Times New Roman" w:hint="eastAsia"/>
         </w:rPr>
+        <w:lastRenderedPageBreak/>
         <w:t>修复部分情况下拖拽单位辅助线显示错位的</w:t>
       </w:r>
       <w:r>
@@ -1959,7 +1995,6 @@
         <w:rPr>
           <w:rFonts w:ascii="Times New Roman" w:eastAsia="宋体" w:hAnsi="Times New Roman" w:cs="Times New Roman" w:hint="eastAsia"/>
         </w:rPr>
-        <w:lastRenderedPageBreak/>
         <w:t>重写基本设置、单人任务设置、特定标识窗口，优化界面，适配</w:t>
       </w:r>
       <w:r>
@@ -2890,6 +2925,7 @@
         <w:rPr>
           <w:rFonts w:ascii="Times New Roman" w:eastAsia="宋体" w:hAnsi="Times New Roman" w:cs="Times New Roman" w:hint="eastAsia"/>
         </w:rPr>
+        <w:lastRenderedPageBreak/>
         <w:t>修复使用</w:t>
       </w:r>
       <w:r>
@@ -2938,14 +2974,7 @@
         <w:rPr>
           <w:rFonts w:ascii="Times New Roman" w:eastAsia="宋体" w:hAnsi="Times New Roman" w:cs="Times New Roman" w:hint="eastAsia"/>
         </w:rPr>
-        <w:t>触发编辑器的查找引用可显示当前触发的对应参数并跳转（支持小队、触发</w:t>
-      </w:r>
-      <w:r>
-        <w:rPr>
-          <w:rFonts w:ascii="Times New Roman" w:eastAsia="宋体" w:hAnsi="Times New Roman" w:cs="Times New Roman" w:hint="eastAsia"/>
-        </w:rPr>
-        <w:lastRenderedPageBreak/>
-        <w:t>和标签）</w:t>
+        <w:t>触发编辑器的查找引用可显示当前触发的对应参数并跳转（支持小队、触发和标签）</w:t>
       </w:r>
     </w:p>
     <w:p>
@@ -3784,7 +3813,14 @@
         <w:rPr>
           <w:rFonts w:ascii="Times New Roman" w:eastAsia="宋体" w:hAnsi="Times New Roman" w:cs="Times New Roman" w:hint="eastAsia"/>
         </w:rPr>
-        <w:t>修复点击触发编辑器事件和行为列表的空白部分，会将当前选项切换至最后一个的</w:t>
+        <w:t>修复点击触发编辑器事件和行为列表的空白部分，会将当前选项切换至最后</w:t>
+      </w:r>
+      <w:r>
+        <w:rPr>
+          <w:rFonts w:ascii="Times New Roman" w:eastAsia="宋体" w:hAnsi="Times New Roman" w:cs="Times New Roman" w:hint="eastAsia"/>
+        </w:rPr>
+        <w:lastRenderedPageBreak/>
+        <w:t>一个的</w:t>
       </w:r>
       <w:r>
         <w:rPr>
@@ -3832,7 +3868,6 @@
         <w:rPr>
           <w:rFonts w:ascii="Times New Roman" w:eastAsia="宋体" w:hAnsi="Times New Roman" w:cs="Times New Roman" w:hint="eastAsia"/>
         </w:rPr>
-        <w:lastRenderedPageBreak/>
         <w:t>修复在地形浏览器中切换过多次后程序无响应的</w:t>
       </w:r>
       <w:r>
@@ -4759,6 +4794,7 @@
         <w:rPr>
           <w:rFonts w:ascii="Times New Roman" w:eastAsia="宋体" w:hAnsi="Times New Roman" w:cs="Times New Roman" w:hint="eastAsia"/>
         </w:rPr>
+        <w:lastRenderedPageBreak/>
         <w:t>修复部分情况下地图下边缘的单元格无法触及的</w:t>
       </w:r>
       <w:r>
@@ -4801,7 +4837,6 @@
         <w:rPr>
           <w:rFonts w:ascii="Times New Roman" w:eastAsia="宋体" w:hAnsi="Times New Roman" w:cs="Times New Roman" w:hint="eastAsia"/>
         </w:rPr>
-        <w:lastRenderedPageBreak/>
         <w:t>绘制连接地形时，初始高度会减去当前地形的内部高度</w:t>
       </w:r>
     </w:p>
@@ -5789,6 +5824,7 @@
         <w:rPr>
           <w:rFonts w:ascii="Times New Roman" w:eastAsia="宋体" w:hAnsi="Times New Roman" w:cs="Times New Roman" w:hint="eastAsia"/>
         </w:rPr>
+        <w:lastRenderedPageBreak/>
         <w:t>将部分需要重新加载地图的偏好设置改为仅需要重新加载物品浏览器</w:t>
       </w:r>
     </w:p>
@@ -5831,7 +5867,6 @@
         <w:rPr>
           <w:rFonts w:ascii="Times New Roman" w:eastAsia="宋体" w:hAnsi="Times New Roman" w:cs="Times New Roman" w:hint="eastAsia"/>
         </w:rPr>
-        <w:lastRenderedPageBreak/>
         <w:t>可以在</w:t>
       </w:r>
       <w:r>
@@ -7056,6 +7091,7 @@
         <w:rPr>
           <w:rFonts w:ascii="Times New Roman" w:eastAsia="宋体" w:hAnsi="Times New Roman" w:cs="Times New Roman" w:hint="eastAsia"/>
         </w:rPr>
+        <w:lastRenderedPageBreak/>
         <w:t>修复</w:t>
       </w:r>
       <w:r>
@@ -7116,7 +7152,6 @@
         <w:rPr>
           <w:rFonts w:ascii="Times New Roman" w:eastAsia="宋体" w:hAnsi="Times New Roman" w:cs="Times New Roman" w:hint="eastAsia"/>
         </w:rPr>
-        <w:lastRenderedPageBreak/>
         <w:t>为基地节点渲染自定义军衔</w:t>
       </w:r>
     </w:p>
@@ -8065,6 +8100,7 @@
         <w:rPr>
           <w:rFonts w:ascii="Times New Roman" w:eastAsia="宋体" w:hAnsi="Times New Roman" w:cs="Times New Roman" w:hint="eastAsia"/>
         </w:rPr>
+        <w:lastRenderedPageBreak/>
         <w:t>修复部分</w:t>
       </w:r>
       <w:r>
@@ -8131,7 +8167,6 @@
         <w:rPr>
           <w:rFonts w:ascii="Times New Roman" w:eastAsia="宋体" w:hAnsi="Times New Roman" w:cs="Times New Roman" w:hint="eastAsia"/>
         </w:rPr>
-        <w:lastRenderedPageBreak/>
         <w:t>InGameDisplay.RemapableOverlay</w:t>
       </w:r>
     </w:p>
@@ -9050,66 +9085,6 @@
         <w:rPr>
           <w:rFonts w:ascii="Times New Roman" w:eastAsia="宋体" w:hAnsi="Times New Roman" w:cs="Times New Roman" w:hint="eastAsia"/>
         </w:rPr>
-        <w:t>物品浏览器</w:t>
-      </w:r>
-      <w:r>
-        <w:rPr>
-          <w:rFonts w:ascii="Times New Roman" w:eastAsia="宋体" w:hAnsi="Times New Roman" w:cs="Times New Roman" w:hint="eastAsia"/>
-        </w:rPr>
-        <w:t>-&gt;</w:t>
-      </w:r>
-      <w:r>
-        <w:rPr>
-          <w:rFonts w:ascii="Times New Roman" w:eastAsia="宋体" w:hAnsi="Times New Roman" w:cs="Times New Roman" w:hint="eastAsia"/>
-        </w:rPr>
-        <w:t>全部覆盖物支持笔刷大小</w:t>
-      </w:r>
-    </w:p>
-    <w:p>
-      <w:pPr>
-        <w:pStyle w:val="a9"/>
-        <w:numPr>
-          <w:ilvl w:val="0"/>
-          <w:numId w:val="41"/>
-        </w:numPr>
-        <w:rPr>
-          <w:rFonts w:ascii="Times New Roman" w:eastAsia="宋体" w:hAnsi="Times New Roman" w:cs="Times New Roman"/>
-        </w:rPr>
-      </w:pPr>
-      <w:r>
-        <w:rPr>
-          <w:rFonts w:ascii="Times New Roman" w:eastAsia="宋体" w:hAnsi="Times New Roman" w:cs="Times New Roman" w:hint="eastAsia"/>
-        </w:rPr>
-        <w:t>小队变更时会即时刷新</w:t>
-      </w:r>
-      <w:r>
-        <w:rPr>
-          <w:rFonts w:ascii="Times New Roman" w:eastAsia="宋体" w:hAnsi="Times New Roman" w:cs="Times New Roman" w:hint="eastAsia"/>
-        </w:rPr>
-        <w:t>AI</w:t>
-      </w:r>
-      <w:r>
-        <w:rPr>
-          <w:rFonts w:ascii="Times New Roman" w:eastAsia="宋体" w:hAnsi="Times New Roman" w:cs="Times New Roman" w:hint="eastAsia"/>
-        </w:rPr>
-        <w:t>触发编辑器对应菜单</w:t>
-      </w:r>
-    </w:p>
-    <w:p>
-      <w:pPr>
-        <w:pStyle w:val="a9"/>
-        <w:numPr>
-          <w:ilvl w:val="0"/>
-          <w:numId w:val="41"/>
-        </w:numPr>
-        <w:rPr>
-          <w:rFonts w:ascii="Times New Roman" w:eastAsia="宋体" w:hAnsi="Times New Roman" w:cs="Times New Roman"/>
-        </w:rPr>
-      </w:pPr>
-      <w:r>
-        <w:rPr>
-          <w:rFonts w:ascii="Times New Roman" w:eastAsia="宋体" w:hAnsi="Times New Roman" w:cs="Times New Roman" w:hint="eastAsia"/>
-        </w:rPr>
         <w:lastRenderedPageBreak/>
         <w:t>物品浏览器</w:t>
       </w:r>
@@ -9123,6 +9098,66 @@
         <w:rPr>
           <w:rFonts w:ascii="Times New Roman" w:eastAsia="宋体" w:hAnsi="Times New Roman" w:cs="Times New Roman" w:hint="eastAsia"/>
         </w:rPr>
+        <w:t>全部覆盖物支持笔刷大小</w:t>
+      </w:r>
+    </w:p>
+    <w:p>
+      <w:pPr>
+        <w:pStyle w:val="a9"/>
+        <w:numPr>
+          <w:ilvl w:val="0"/>
+          <w:numId w:val="41"/>
+        </w:numPr>
+        <w:rPr>
+          <w:rFonts w:ascii="Times New Roman" w:eastAsia="宋体" w:hAnsi="Times New Roman" w:cs="Times New Roman"/>
+        </w:rPr>
+      </w:pPr>
+      <w:r>
+        <w:rPr>
+          <w:rFonts w:ascii="Times New Roman" w:eastAsia="宋体" w:hAnsi="Times New Roman" w:cs="Times New Roman" w:hint="eastAsia"/>
+        </w:rPr>
+        <w:t>小队变更时会即时刷新</w:t>
+      </w:r>
+      <w:r>
+        <w:rPr>
+          <w:rFonts w:ascii="Times New Roman" w:eastAsia="宋体" w:hAnsi="Times New Roman" w:cs="Times New Roman" w:hint="eastAsia"/>
+        </w:rPr>
+        <w:t>AI</w:t>
+      </w:r>
+      <w:r>
+        <w:rPr>
+          <w:rFonts w:ascii="Times New Roman" w:eastAsia="宋体" w:hAnsi="Times New Roman" w:cs="Times New Roman" w:hint="eastAsia"/>
+        </w:rPr>
+        <w:t>触发编辑器对应菜单</w:t>
+      </w:r>
+    </w:p>
+    <w:p>
+      <w:pPr>
+        <w:pStyle w:val="a9"/>
+        <w:numPr>
+          <w:ilvl w:val="0"/>
+          <w:numId w:val="41"/>
+        </w:numPr>
+        <w:rPr>
+          <w:rFonts w:ascii="Times New Roman" w:eastAsia="宋体" w:hAnsi="Times New Roman" w:cs="Times New Roman"/>
+        </w:rPr>
+      </w:pPr>
+      <w:r>
+        <w:rPr>
+          <w:rFonts w:ascii="Times New Roman" w:eastAsia="宋体" w:hAnsi="Times New Roman" w:cs="Times New Roman" w:hint="eastAsia"/>
+        </w:rPr>
+        <w:t>物品浏览器</w:t>
+      </w:r>
+      <w:r>
+        <w:rPr>
+          <w:rFonts w:ascii="Times New Roman" w:eastAsia="宋体" w:hAnsi="Times New Roman" w:cs="Times New Roman" w:hint="eastAsia"/>
+        </w:rPr>
+        <w:t>-&gt;</w:t>
+      </w:r>
+      <w:r>
+        <w:rPr>
+          <w:rFonts w:ascii="Times New Roman" w:eastAsia="宋体" w:hAnsi="Times New Roman" w:cs="Times New Roman" w:hint="eastAsia"/>
+        </w:rPr>
         <w:t>绘制金矿</w:t>
       </w:r>
       <w:r>
@@ -10141,6 +10176,7 @@
         <w:rPr>
           <w:rFonts w:ascii="Times New Roman" w:eastAsia="宋体" w:hAnsi="Times New Roman" w:cs="Times New Roman" w:hint="eastAsia"/>
         </w:rPr>
+        <w:lastRenderedPageBreak/>
         <w:t>支持自定义拼接地形组</w:t>
       </w:r>
       <w:r>
@@ -10219,7 +10255,6 @@
         <w:rPr>
           <w:rFonts w:ascii="Times New Roman" w:eastAsia="宋体" w:hAnsi="Times New Roman" w:cs="Times New Roman" w:hint="eastAsia"/>
         </w:rPr>
-        <w:lastRenderedPageBreak/>
         <w:t>修复地形生成器的显示范围比划定范围宽一格的</w:t>
       </w:r>
       <w:r>
@@ -11250,6 +11285,7 @@
         <w:rPr>
           <w:rFonts w:ascii="Times New Roman" w:eastAsia="宋体" w:hAnsi="Times New Roman" w:cs="Times New Roman" w:hint="eastAsia"/>
         </w:rPr>
+        <w:lastRenderedPageBreak/>
         <w:t>微调各游戏对象渲染位置，匹配游戏内效果</w:t>
       </w:r>
     </w:p>
@@ -11304,7 +11340,6 @@
         <w:rPr>
           <w:rFonts w:ascii="Times New Roman" w:eastAsia="宋体" w:hAnsi="Times New Roman" w:cs="Times New Roman" w:hint="eastAsia"/>
         </w:rPr>
-        <w:lastRenderedPageBreak/>
         <w:t>粘贴功能支持按</w:t>
       </w:r>
       <w:r>
@@ -12347,6 +12382,7 @@
         <w:rPr>
           <w:rFonts w:ascii="Times New Roman" w:eastAsia="宋体" w:hAnsi="Times New Roman" w:cs="Times New Roman" w:hint="eastAsia"/>
         </w:rPr>
+        <w:lastRenderedPageBreak/>
         <w:t>ObjectBrowser.Ore.RandomPlacement</w:t>
       </w:r>
       <w:r>
@@ -12409,7 +12445,6 @@
           <w:sz w:val="28"/>
           <w:szCs w:val="32"/>
         </w:rPr>
-        <w:lastRenderedPageBreak/>
         <w:t>1.2.4 (2025.11.02)</w:t>
       </w:r>
     </w:p>
@@ -13525,6 +13560,7 @@
         <w:rPr>
           <w:rFonts w:ascii="Times New Roman" w:eastAsia="宋体" w:hAnsi="Times New Roman" w:cs="Times New Roman" w:hint="eastAsia"/>
         </w:rPr>
+        <w:lastRenderedPageBreak/>
         <w:t>修复了预览覆盖物时可能导致原有覆盖物被修改的</w:t>
       </w:r>
       <w:r>
@@ -13549,14 +13585,7 @@
         <w:rPr>
           <w:rFonts w:ascii="Times New Roman" w:eastAsia="宋体" w:hAnsi="Times New Roman" w:cs="Times New Roman" w:hint="eastAsia"/>
         </w:rPr>
-        <w:t>擦除覆盖物不会导致附近的围墙变为完好状态，会保持当前破损状态（但仍</w:t>
-      </w:r>
-      <w:r>
-        <w:rPr>
-          <w:rFonts w:ascii="Times New Roman" w:eastAsia="宋体" w:hAnsi="Times New Roman" w:cs="Times New Roman" w:hint="eastAsia"/>
-        </w:rPr>
-        <w:lastRenderedPageBreak/>
-        <w:t>然会重新计算连接方式）</w:t>
+        <w:t>擦除覆盖物不会导致附近的围墙变为完好状态，会保持当前破损状态（但仍然会重新计算连接方式）</w:t>
       </w:r>
     </w:p>
     <w:p>
@@ -14640,7 +14669,14 @@
         <w:rPr>
           <w:rFonts w:ascii="Times New Roman" w:eastAsia="宋体" w:hAnsi="Times New Roman" w:cs="Times New Roman" w:hint="eastAsia"/>
         </w:rPr>
-        <w:t>仅支持围墙自定义色盘）</w:t>
+        <w:t>仅支持围墙</w:t>
+      </w:r>
+      <w:r>
+        <w:rPr>
+          <w:rFonts w:ascii="Times New Roman" w:eastAsia="宋体" w:hAnsi="Times New Roman" w:cs="Times New Roman" w:hint="eastAsia"/>
+        </w:rPr>
+        <w:lastRenderedPageBreak/>
+        <w:t>自定义色盘）</w:t>
       </w:r>
     </w:p>
     <w:p>
@@ -14666,7 +14702,6 @@
           <w:sz w:val="28"/>
           <w:szCs w:val="32"/>
         </w:rPr>
-        <w:lastRenderedPageBreak/>
         <w:t>1.2.0 (2025.09.05)</w:t>
       </w:r>
     </w:p>
@@ -15709,6 +15744,7 @@
         <w:rPr>
           <w:rFonts w:ascii="Times New Roman" w:eastAsia="宋体" w:hAnsi="Times New Roman" w:cs="Times New Roman" w:hint="eastAsia"/>
         </w:rPr>
+        <w:lastRenderedPageBreak/>
         <w:t>支持设置</w:t>
       </w:r>
       <w:r>
@@ -15745,7 +15781,6 @@
         <w:rPr>
           <w:rFonts w:ascii="Times New Roman" w:eastAsia="宋体" w:hAnsi="Times New Roman" w:cs="Times New Roman" w:hint="eastAsia"/>
         </w:rPr>
-        <w:lastRenderedPageBreak/>
         <w:t>提升稳定性</w:t>
       </w:r>
     </w:p>
@@ -16718,7 +16753,14 @@
         <w:rPr>
           <w:rFonts w:ascii="Times New Roman" w:eastAsia="宋体" w:hAnsi="Times New Roman" w:cs="Times New Roman" w:hint="eastAsia"/>
         </w:rPr>
-        <w:t>，可以在小地图中显示可视地图边界，新增获取地图边界的</w:t>
+        <w:t>，可以在小地图中显示可视地图边界，新增获</w:t>
+      </w:r>
+      <w:r>
+        <w:rPr>
+          <w:rFonts w:ascii="Times New Roman" w:eastAsia="宋体" w:hAnsi="Times New Roman" w:cs="Times New Roman" w:hint="eastAsia"/>
+        </w:rPr>
+        <w:lastRenderedPageBreak/>
+        <w:t>取地图边界的</w:t>
       </w:r>
       <w:r>
         <w:rPr>
@@ -16748,7 +16790,6 @@
         <w:rPr>
           <w:rFonts w:ascii="Times New Roman" w:eastAsia="宋体" w:hAnsi="Times New Roman" w:cs="Times New Roman" w:hint="eastAsia"/>
         </w:rPr>
-        <w:lastRenderedPageBreak/>
         <w:t>修复开启</w:t>
       </w:r>
       <w:r>
@@ -48638,7 +48679,7 @@
         <v:path o:extrusionok="f" gradientshapeok="t" o:connecttype="rect"/>
         <o:lock v:ext="edit" aspectratio="t"/>
       </v:shapetype>
-      <v:shape id="_x0000_i1032" type="#_x0000_t75" style="width:11.55pt;height:11.55pt" o:bullet="t">
+      <v:shape id="_x0000_i1030" type="#_x0000_t75" style="width:11.55pt;height:11.55pt" o:bullet="t">
         <v:imagedata r:id="rId1" o:title="mso9A9A"/>
       </v:shape>
     </w:pict>

</xml_diff>

<commit_message>
adjust file loading with folder path
</commit_message>
<xml_diff>
--- a/Supplementary/文档/FA2SP HDM Edition说明文档.docx
+++ b/Supplementary/文档/FA2SP HDM Edition说明文档.docx
@@ -167,14 +167,14 @@
           <w:rFonts w:ascii="宋体" w:eastAsia="宋体" w:hAnsi="宋体" w:hint="eastAsia"/>
           <w:sz w:val="24"/>
         </w:rPr>
-        <w:t>1</w:t>
+        <w:t>2</w:t>
       </w:r>
       <w:r>
         <w:rPr>
           <w:rFonts w:ascii="宋体" w:eastAsia="宋体" w:hAnsi="宋体" w:hint="eastAsia"/>
           <w:sz w:val="24"/>
         </w:rPr>
-        <w:t>8</w:t>
+        <w:t>1</w:t>
       </w:r>
     </w:p>
     <w:p>
@@ -226,7 +226,7 @@
           <w:sz w:val="28"/>
           <w:szCs w:val="32"/>
         </w:rPr>
-        <w:t>1.4.5 (2026.0</w:t>
+        <w:t>1.</w:t>
       </w:r>
       <w:r>
         <w:rPr>
@@ -236,7 +236,7 @@
           <w:sz w:val="28"/>
           <w:szCs w:val="32"/>
         </w:rPr>
-        <w:t>7</w:t>
+        <w:t>5</w:t>
       </w:r>
       <w:r>
         <w:rPr>
@@ -256,7 +256,7 @@
           <w:sz w:val="28"/>
           <w:szCs w:val="32"/>
         </w:rPr>
-        <w:t>1</w:t>
+        <w:t>0</w:t>
       </w:r>
       <w:r>
         <w:rPr>
@@ -266,7 +266,47 @@
           <w:sz w:val="28"/>
           <w:szCs w:val="32"/>
         </w:rPr>
-        <w:t>8</w:t>
+        <w:t xml:space="preserve"> (2026.0</w:t>
+      </w:r>
+      <w:r>
+        <w:rPr>
+          <w:rFonts w:ascii="Times New Roman" w:eastAsia="宋体" w:hAnsi="Times New Roman" w:cs="Times New Roman" w:hint="eastAsia"/>
+          <w:b/>
+          <w:bCs/>
+          <w:sz w:val="28"/>
+          <w:szCs w:val="32"/>
+        </w:rPr>
+        <w:t>7</w:t>
+      </w:r>
+      <w:r>
+        <w:rPr>
+          <w:rFonts w:ascii="Times New Roman" w:eastAsia="宋体" w:hAnsi="Times New Roman" w:cs="Times New Roman" w:hint="eastAsia"/>
+          <w:b/>
+          <w:bCs/>
+          <w:sz w:val="28"/>
+          <w:szCs w:val="32"/>
+        </w:rPr>
+        <w:t>.</w:t>
+      </w:r>
+      <w:r>
+        <w:rPr>
+          <w:rFonts w:ascii="Times New Roman" w:eastAsia="宋体" w:hAnsi="Times New Roman" w:cs="Times New Roman" w:hint="eastAsia"/>
+          <w:b/>
+          <w:bCs/>
+          <w:sz w:val="28"/>
+          <w:szCs w:val="32"/>
+        </w:rPr>
+        <w:t>2</w:t>
+      </w:r>
+      <w:r>
+        <w:rPr>
+          <w:rFonts w:ascii="Times New Roman" w:eastAsia="宋体" w:hAnsi="Times New Roman" w:cs="Times New Roman" w:hint="eastAsia"/>
+          <w:b/>
+          <w:bCs/>
+          <w:sz w:val="28"/>
+          <w:szCs w:val="32"/>
+        </w:rPr>
+        <w:t>1</w:t>
       </w:r>
       <w:r>
         <w:rPr>
@@ -48741,7 +48781,7 @@
         <v:path o:extrusionok="f" gradientshapeok="t" o:connecttype="rect"/>
         <o:lock v:ext="edit" aspectratio="t"/>
       </v:shapetype>
-      <v:shape id="_x0000_i1030" type="#_x0000_t75" style="width:11.55pt;height:11.55pt" o:bullet="t">
+      <v:shape id="_x0000_i1028" type="#_x0000_t75" style="width:11.55pt;height:11.55pt" o:bullet="t">
         <v:imagedata r:id="rId1" o:title="mso9A9A"/>
       </v:shape>
     </w:pict>

</xml_diff>

<commit_message>
show script path in minimap
</commit_message>
<xml_diff>
--- a/Supplementary/文档/FA2SP HDM Edition说明文档.docx
+++ b/Supplementary/文档/FA2SP HDM Edition说明文档.docx
@@ -226,47 +226,7 @@
           <w:sz w:val="28"/>
           <w:szCs w:val="32"/>
         </w:rPr>
-        <w:t>1.5.</w:t>
-      </w:r>
-      <w:r>
-        <w:rPr>
-          <w:rFonts w:ascii="Times New Roman" w:eastAsia="宋体" w:hAnsi="Times New Roman" w:cs="Times New Roman" w:hint="eastAsia"/>
-          <w:b/>
-          <w:bCs/>
-          <w:sz w:val="28"/>
-          <w:szCs w:val="32"/>
-        </w:rPr>
-        <w:t>2</w:t>
-      </w:r>
-      <w:r>
-        <w:rPr>
-          <w:rFonts w:ascii="Times New Roman" w:eastAsia="宋体" w:hAnsi="Times New Roman" w:cs="Times New Roman" w:hint="eastAsia"/>
-          <w:b/>
-          <w:bCs/>
-          <w:sz w:val="28"/>
-          <w:szCs w:val="32"/>
-        </w:rPr>
-        <w:t xml:space="preserve"> (2026.08.2</w:t>
-      </w:r>
-      <w:r>
-        <w:rPr>
-          <w:rFonts w:ascii="Times New Roman" w:eastAsia="宋体" w:hAnsi="Times New Roman" w:cs="Times New Roman" w:hint="eastAsia"/>
-          <w:b/>
-          <w:bCs/>
-          <w:sz w:val="28"/>
-          <w:szCs w:val="32"/>
-        </w:rPr>
-        <w:t>3</w:t>
-      </w:r>
-      <w:r>
-        <w:rPr>
-          <w:rFonts w:ascii="Times New Roman" w:eastAsia="宋体" w:hAnsi="Times New Roman" w:cs="Times New Roman" w:hint="eastAsia"/>
-          <w:b/>
-          <w:bCs/>
-          <w:sz w:val="28"/>
-          <w:szCs w:val="32"/>
-        </w:rPr>
-        <w:t>)</w:t>
+        <w:t>1.5.2 (2026.08.23)</w:t>
       </w:r>
     </w:p>
     <w:p>
@@ -285,6 +245,24 @@
           <w:rFonts w:ascii="Times New Roman" w:eastAsia="宋体" w:hAnsi="Times New Roman" w:cs="Times New Roman" w:hint="eastAsia"/>
         </w:rPr>
         <w:t>距离工具箱新增寻路距离测距工具</w:t>
+      </w:r>
+    </w:p>
+    <w:p>
+      <w:pPr>
+        <w:pStyle w:val="a9"/>
+        <w:numPr>
+          <w:ilvl w:val="0"/>
+          <w:numId w:val="11"/>
+        </w:numPr>
+        <w:rPr>
+          <w:rFonts w:ascii="Times New Roman" w:eastAsia="宋体" w:hAnsi="Times New Roman" w:cs="Times New Roman"/>
+        </w:rPr>
+      </w:pPr>
+      <w:r>
+        <w:rPr>
+          <w:rFonts w:ascii="Times New Roman" w:eastAsia="宋体" w:hAnsi="Times New Roman" w:cs="Times New Roman" w:hint="eastAsia"/>
+        </w:rPr>
+        <w:t>动作脚本的渲染路径可以在小地图上同步显示</w:t>
       </w:r>
     </w:p>
     <w:p>
@@ -1019,6 +997,7 @@
         <w:rPr>
           <w:rFonts w:ascii="Times New Roman" w:eastAsia="宋体" w:hAnsi="Times New Roman" w:cs="Times New Roman" w:hint="eastAsia"/>
         </w:rPr>
+        <w:lastRenderedPageBreak/>
         <w:t>ctrl</w:t>
       </w:r>
       <w:r>
@@ -1049,7 +1028,6 @@
         <w:rPr>
           <w:rFonts w:ascii="Times New Roman" w:eastAsia="宋体" w:hAnsi="Times New Roman" w:cs="Times New Roman" w:hint="eastAsia"/>
         </w:rPr>
-        <w:lastRenderedPageBreak/>
         <w:t>优化斜坡生成效率</w:t>
       </w:r>
     </w:p>
@@ -2141,6 +2119,7 @@
         <w:rPr>
           <w:rFonts w:ascii="Times New Roman" w:eastAsia="宋体" w:hAnsi="Times New Roman" w:cs="Times New Roman" w:hint="eastAsia"/>
         </w:rPr>
+        <w:lastRenderedPageBreak/>
         <w:t>AttachedTriggerIsSelfCheck</w:t>
       </w:r>
     </w:p>
@@ -2159,7 +2138,6 @@
         <w:rPr>
           <w:rFonts w:ascii="Times New Roman" w:eastAsia="宋体" w:hAnsi="Times New Roman" w:cs="Times New Roman" w:hint="eastAsia"/>
         </w:rPr>
-        <w:lastRenderedPageBreak/>
         <w:t>修复遭遇战地图预览渲染时没有正确标记高架桥的</w:t>
       </w:r>
       <w:r>
@@ -3122,6 +3100,7 @@
         <w:rPr>
           <w:rFonts w:ascii="Times New Roman" w:eastAsia="宋体" w:hAnsi="Times New Roman" w:cs="Times New Roman" w:hint="eastAsia"/>
         </w:rPr>
+        <w:lastRenderedPageBreak/>
         <w:t>修复部分情况下拖拽单位辅助线显示错位的</w:t>
       </w:r>
       <w:r>
@@ -3146,7 +3125,6 @@
         <w:rPr>
           <w:rFonts w:ascii="Times New Roman" w:eastAsia="宋体" w:hAnsi="Times New Roman" w:cs="Times New Roman" w:hint="eastAsia"/>
         </w:rPr>
-        <w:lastRenderedPageBreak/>
         <w:t>粘贴时可以预览建筑、车辆等游戏对象</w:t>
       </w:r>
     </w:p>
@@ -4095,6 +4073,7 @@
         <w:rPr>
           <w:rFonts w:ascii="Times New Roman" w:eastAsia="宋体" w:hAnsi="Times New Roman" w:cs="Times New Roman" w:hint="eastAsia"/>
         </w:rPr>
+        <w:lastRenderedPageBreak/>
         <w:t>修复使用</w:t>
       </w:r>
       <w:r>
@@ -4143,7 +4122,6 @@
         <w:rPr>
           <w:rFonts w:ascii="Times New Roman" w:eastAsia="宋体" w:hAnsi="Times New Roman" w:cs="Times New Roman" w:hint="eastAsia"/>
         </w:rPr>
-        <w:lastRenderedPageBreak/>
         <w:t>触发编辑器的查找引用可显示当前触发的对应参数并跳转（支持小队、触发和标签）</w:t>
       </w:r>
     </w:p>
@@ -4983,7 +4961,14 @@
         <w:rPr>
           <w:rFonts w:ascii="Times New Roman" w:eastAsia="宋体" w:hAnsi="Times New Roman" w:cs="Times New Roman" w:hint="eastAsia"/>
         </w:rPr>
-        <w:t>修复点击触发编辑器事件和行为列表的空白部分，会将当前选项切换至最后一个的</w:t>
+        <w:t>修复点击触发编辑器事件和行为列表的空白部分，会将当前选项切换至最后</w:t>
+      </w:r>
+      <w:r>
+        <w:rPr>
+          <w:rFonts w:ascii="Times New Roman" w:eastAsia="宋体" w:hAnsi="Times New Roman" w:cs="Times New Roman" w:hint="eastAsia"/>
+        </w:rPr>
+        <w:lastRenderedPageBreak/>
+        <w:t>一个的</w:t>
       </w:r>
       <w:r>
         <w:rPr>
@@ -5007,7 +4992,6 @@
         <w:rPr>
           <w:rFonts w:ascii="Times New Roman" w:eastAsia="宋体" w:hAnsi="Times New Roman" w:cs="Times New Roman" w:hint="eastAsia"/>
         </w:rPr>
-        <w:lastRenderedPageBreak/>
         <w:t>修复当隧道信息不正确时崩溃的</w:t>
       </w:r>
       <w:r>
@@ -5958,6 +5942,7 @@
         <w:rPr>
           <w:rFonts w:ascii="Times New Roman" w:eastAsia="宋体" w:hAnsi="Times New Roman" w:cs="Times New Roman" w:hint="eastAsia"/>
         </w:rPr>
+        <w:lastRenderedPageBreak/>
         <w:t>修复部分情况下地图下边缘的单元格无法触及的</w:t>
       </w:r>
       <w:r>
@@ -5982,7 +5967,6 @@
         <w:rPr>
           <w:rFonts w:ascii="Times New Roman" w:eastAsia="宋体" w:hAnsi="Times New Roman" w:cs="Times New Roman" w:hint="eastAsia"/>
         </w:rPr>
-        <w:lastRenderedPageBreak/>
         <w:t>优化高架桥的遮挡表现</w:t>
       </w:r>
     </w:p>
@@ -6988,6 +6972,7 @@
         <w:rPr>
           <w:rFonts w:ascii="Times New Roman" w:eastAsia="宋体" w:hAnsi="Times New Roman" w:cs="Times New Roman" w:hint="eastAsia"/>
         </w:rPr>
+        <w:lastRenderedPageBreak/>
         <w:t>将部分需要重新加载地图的偏好设置改为仅需要重新加载物品浏览器</w:t>
       </w:r>
     </w:p>
@@ -7006,7 +6991,6 @@
         <w:rPr>
           <w:rFonts w:ascii="Times New Roman" w:eastAsia="宋体" w:hAnsi="Times New Roman" w:cs="Times New Roman" w:hint="eastAsia"/>
         </w:rPr>
-        <w:lastRenderedPageBreak/>
         <w:t>支持摆放泰伯利亚蔓孔怪物与藤蔓，详见</w:t>
       </w:r>
       <w:r>
@@ -8255,6 +8239,7 @@
         <w:rPr>
           <w:rFonts w:ascii="Times New Roman" w:eastAsia="宋体" w:hAnsi="Times New Roman" w:cs="Times New Roman" w:hint="eastAsia"/>
         </w:rPr>
+        <w:lastRenderedPageBreak/>
         <w:t>修复</w:t>
       </w:r>
       <w:r>
@@ -8291,7 +8276,6 @@
         <w:rPr>
           <w:rFonts w:ascii="Times New Roman" w:eastAsia="宋体" w:hAnsi="Times New Roman" w:cs="Times New Roman" w:hint="eastAsia"/>
         </w:rPr>
-        <w:lastRenderedPageBreak/>
         <w:t>修复附加单位绑定在建筑炮塔上时，无法跟随旋转的</w:t>
       </w:r>
       <w:r>
@@ -9264,6 +9248,7 @@
         <w:rPr>
           <w:rFonts w:ascii="Times New Roman" w:eastAsia="宋体" w:hAnsi="Times New Roman" w:cs="Times New Roman" w:hint="eastAsia"/>
         </w:rPr>
+        <w:lastRenderedPageBreak/>
         <w:t>修复部分</w:t>
       </w:r>
       <w:r>
@@ -9300,7 +9285,6 @@
         <w:rPr>
           <w:rFonts w:ascii="Times New Roman" w:eastAsia="宋体" w:hAnsi="Times New Roman" w:cs="Times New Roman" w:hint="eastAsia"/>
         </w:rPr>
-        <w:lastRenderedPageBreak/>
         <w:t>围墙覆盖物支持</w:t>
       </w:r>
       <w:r>
@@ -10249,6 +10233,7 @@
         <w:rPr>
           <w:rFonts w:ascii="Times New Roman" w:eastAsia="宋体" w:hAnsi="Times New Roman" w:cs="Times New Roman" w:hint="eastAsia"/>
         </w:rPr>
+        <w:lastRenderedPageBreak/>
         <w:t>物品浏览器</w:t>
       </w:r>
       <w:r>
@@ -10279,7 +10264,6 @@
         <w:rPr>
           <w:rFonts w:ascii="Times New Roman" w:eastAsia="宋体" w:hAnsi="Times New Roman" w:cs="Times New Roman" w:hint="eastAsia"/>
         </w:rPr>
-        <w:lastRenderedPageBreak/>
         <w:t>小队变更时会即时刷新</w:t>
       </w:r>
       <w:r>
@@ -11340,6 +11324,7 @@
         <w:rPr>
           <w:rFonts w:ascii="Times New Roman" w:eastAsia="宋体" w:hAnsi="Times New Roman" w:cs="Times New Roman" w:hint="eastAsia"/>
         </w:rPr>
+        <w:lastRenderedPageBreak/>
         <w:t>支持自定义拼接地形组</w:t>
       </w:r>
       <w:r>
@@ -11400,7 +11385,6 @@
         <w:rPr>
           <w:rFonts w:ascii="Times New Roman" w:eastAsia="宋体" w:hAnsi="Times New Roman" w:cs="Times New Roman" w:hint="eastAsia"/>
         </w:rPr>
-        <w:lastRenderedPageBreak/>
         <w:t>污染现在能正确被阴影遮挡</w:t>
       </w:r>
     </w:p>
@@ -12449,6 +12433,7 @@
         <w:rPr>
           <w:rFonts w:ascii="Times New Roman" w:eastAsia="宋体" w:hAnsi="Times New Roman" w:cs="Times New Roman" w:hint="eastAsia"/>
         </w:rPr>
+        <w:lastRenderedPageBreak/>
         <w:t>微调各游戏对象渲染位置，匹配游戏内效果</w:t>
       </w:r>
     </w:p>
@@ -12467,7 +12452,6 @@
         <w:rPr>
           <w:rFonts w:ascii="Times New Roman" w:eastAsia="宋体" w:hAnsi="Times New Roman" w:cs="Times New Roman" w:hint="eastAsia"/>
         </w:rPr>
-        <w:lastRenderedPageBreak/>
         <w:t>修复了单位“在桥梁上”为</w:t>
       </w:r>
       <w:r>
@@ -13546,6 +13530,7 @@
         <w:rPr>
           <w:rFonts w:ascii="Times New Roman" w:eastAsia="宋体" w:hAnsi="Times New Roman" w:cs="Times New Roman" w:hint="eastAsia"/>
         </w:rPr>
+        <w:lastRenderedPageBreak/>
         <w:t>ObjectBrowser.Ore.RandomPlacement</w:t>
       </w:r>
       <w:r>
@@ -13576,7 +13561,6 @@
         <w:rPr>
           <w:rFonts w:ascii="Times New Roman" w:eastAsia="宋体" w:hAnsi="Times New Roman" w:cs="Times New Roman" w:hint="eastAsia"/>
         </w:rPr>
-        <w:lastRenderedPageBreak/>
         <w:t>修复触发编辑器填写的参数为触发时不能正确截断空格的</w:t>
       </w:r>
       <w:r>
@@ -14724,6 +14708,7 @@
         <w:rPr>
           <w:rFonts w:ascii="Times New Roman" w:eastAsia="宋体" w:hAnsi="Times New Roman" w:cs="Times New Roman" w:hint="eastAsia"/>
         </w:rPr>
+        <w:lastRenderedPageBreak/>
         <w:t>修复了预览覆盖物时可能导致原有覆盖物被修改的</w:t>
       </w:r>
       <w:r>
@@ -14748,7 +14733,6 @@
         <w:rPr>
           <w:rFonts w:ascii="Times New Roman" w:eastAsia="宋体" w:hAnsi="Times New Roman" w:cs="Times New Roman" w:hint="eastAsia"/>
         </w:rPr>
-        <w:lastRenderedPageBreak/>
         <w:t>擦除覆盖物不会导致附近的围墙变为完好状态，会保持当前破损状态（但仍然会重新计算连接方式）</w:t>
       </w:r>
     </w:p>
@@ -15833,7 +15817,14 @@
         <w:rPr>
           <w:rFonts w:ascii="Times New Roman" w:eastAsia="宋体" w:hAnsi="Times New Roman" w:cs="Times New Roman" w:hint="eastAsia"/>
         </w:rPr>
-        <w:t>仅支持围墙自定义色盘）</w:t>
+        <w:t>仅支持围墙</w:t>
+      </w:r>
+      <w:r>
+        <w:rPr>
+          <w:rFonts w:ascii="Times New Roman" w:eastAsia="宋体" w:hAnsi="Times New Roman" w:cs="Times New Roman" w:hint="eastAsia"/>
+        </w:rPr>
+        <w:lastRenderedPageBreak/>
+        <w:t>自定义色盘）</w:t>
       </w:r>
     </w:p>
     <w:p>
@@ -15859,7 +15850,6 @@
           <w:sz w:val="28"/>
           <w:szCs w:val="32"/>
         </w:rPr>
-        <w:lastRenderedPageBreak/>
         <w:t>1.2.0 (2025.09.05)</w:t>
       </w:r>
     </w:p>
@@ -16902,6 +16892,7 @@
         <w:rPr>
           <w:rFonts w:ascii="Times New Roman" w:eastAsia="宋体" w:hAnsi="Times New Roman" w:cs="Times New Roman" w:hint="eastAsia"/>
         </w:rPr>
+        <w:lastRenderedPageBreak/>
         <w:t>支持设置</w:t>
       </w:r>
       <w:r>
@@ -16938,7 +16929,6 @@
         <w:rPr>
           <w:rFonts w:ascii="Times New Roman" w:eastAsia="宋体" w:hAnsi="Times New Roman" w:cs="Times New Roman" w:hint="eastAsia"/>
         </w:rPr>
-        <w:lastRenderedPageBreak/>
         <w:t>提升稳定性</w:t>
       </w:r>
     </w:p>
@@ -17911,7 +17901,14 @@
         <w:rPr>
           <w:rFonts w:ascii="Times New Roman" w:eastAsia="宋体" w:hAnsi="Times New Roman" w:cs="Times New Roman" w:hint="eastAsia"/>
         </w:rPr>
-        <w:t>，可以在小地图中显示可视地图边界，新增获取地图边界的</w:t>
+        <w:t>，可以在小地图中显示可视地图边界，新增获</w:t>
+      </w:r>
+      <w:r>
+        <w:rPr>
+          <w:rFonts w:ascii="Times New Roman" w:eastAsia="宋体" w:hAnsi="Times New Roman" w:cs="Times New Roman" w:hint="eastAsia"/>
+        </w:rPr>
+        <w:lastRenderedPageBreak/>
+        <w:t>取地图边界的</w:t>
       </w:r>
       <w:r>
         <w:rPr>
@@ -17941,7 +17938,6 @@
         <w:rPr>
           <w:rFonts w:ascii="Times New Roman" w:eastAsia="宋体" w:hAnsi="Times New Roman" w:cs="Times New Roman" w:hint="eastAsia"/>
         </w:rPr>
-        <w:lastRenderedPageBreak/>
         <w:t>修复开启</w:t>
       </w:r>
       <w:r>
@@ -50013,7 +50009,7 @@
         <v:path o:extrusionok="f" gradientshapeok="t" o:connecttype="rect"/>
         <o:lock v:ext="edit" aspectratio="t"/>
       </v:shapetype>
-      <v:shape id="_x0000_i1031" type="#_x0000_t75" style="width:11.55pt;height:11.55pt" o:bullet="t">
+      <v:shape id="_x0000_i1030" type="#_x0000_t75" style="width:11.55pt;height:11.55pt" o:bullet="t">
         <v:imagedata r:id="rId1" o:title="mso9A9A"/>
       </v:shape>
     </w:pict>

</xml_diff>

<commit_message>
fix ellipse performance issue
</commit_message>
<xml_diff>
--- a/Supplementary/文档/FA2SP HDM Edition说明文档.docx
+++ b/Supplementary/文档/FA2SP HDM Edition说明文档.docx
@@ -446,6 +446,42 @@
         <w:pStyle w:val="a9"/>
         <w:numPr>
           <w:ilvl w:val="0"/>
+          <w:numId w:val="11"/>
+        </w:numPr>
+        <w:rPr>
+          <w:rFonts w:ascii="Times New Roman" w:eastAsia="宋体" w:hAnsi="Times New Roman" w:cs="Times New Roman"/>
+        </w:rPr>
+      </w:pPr>
+      <w:r>
+        <w:rPr>
+          <w:rFonts w:ascii="Times New Roman" w:eastAsia="宋体" w:hAnsi="Times New Roman" w:cs="Times New Roman" w:hint="eastAsia"/>
+        </w:rPr>
+        <w:t>修复开启</w:t>
+      </w:r>
+      <w:r>
+        <w:rPr>
+          <w:rFonts w:ascii="Times New Roman" w:eastAsia="宋体" w:hAnsi="Times New Roman" w:cs="Times New Roman" w:hint="eastAsia"/>
+        </w:rPr>
+        <w:t>GPU</w:t>
+      </w:r>
+      <w:r>
+        <w:rPr>
+          <w:rFonts w:ascii="Times New Roman" w:eastAsia="宋体" w:hAnsi="Times New Roman" w:cs="Times New Roman" w:hint="eastAsia"/>
+        </w:rPr>
+        <w:t>绘图时绘制椭圆卡顿的</w:t>
+      </w:r>
+      <w:r>
+        <w:rPr>
+          <w:rFonts w:ascii="Times New Roman" w:eastAsia="宋体" w:hAnsi="Times New Roman" w:cs="Times New Roman" w:hint="eastAsia"/>
+        </w:rPr>
+        <w:t>bug</w:t>
+      </w:r>
+    </w:p>
+    <w:p>
+      <w:pPr>
+        <w:pStyle w:val="a9"/>
+        <w:numPr>
+          <w:ilvl w:val="0"/>
           <w:numId w:val="10"/>
         </w:numPr>
         <w:rPr>
@@ -861,6 +897,7 @@
         <w:rPr>
           <w:rFonts w:ascii="Times New Roman" w:eastAsia="宋体" w:hAnsi="Times New Roman" w:cs="Times New Roman" w:hint="eastAsia"/>
         </w:rPr>
+        <w:lastRenderedPageBreak/>
         <w:t>新增获取建筑占地面积</w:t>
       </w:r>
       <w:r>
@@ -891,14 +928,7 @@
         <w:rPr>
           <w:rFonts w:ascii="Times New Roman" w:eastAsia="宋体" w:hAnsi="Times New Roman" w:cs="Times New Roman" w:hint="eastAsia"/>
         </w:rPr>
-        <w:t>、移动到坐标、对当前地图窗口截</w:t>
-      </w:r>
-      <w:r>
-        <w:rPr>
-          <w:rFonts w:ascii="Times New Roman" w:eastAsia="宋体" w:hAnsi="Times New Roman" w:cs="Times New Roman" w:hint="eastAsia"/>
-        </w:rPr>
-        <w:lastRenderedPageBreak/>
-        <w:t>图</w:t>
+        <w:t>、移动到坐标、对当前地图窗口截图</w:t>
       </w:r>
       <w:r>
         <w:rPr>
@@ -2091,6 +2121,7 @@
         <w:rPr>
           <w:rFonts w:ascii="Times New Roman" w:eastAsia="宋体" w:hAnsi="Times New Roman" w:cs="Times New Roman" w:hint="eastAsia"/>
         </w:rPr>
+        <w:lastRenderedPageBreak/>
         <w:t>优化了绘图界面缩小时的渲染性能</w:t>
       </w:r>
     </w:p>
@@ -2109,7 +2140,6 @@
         <w:rPr>
           <w:rFonts w:ascii="Times New Roman" w:eastAsia="宋体" w:hAnsi="Times New Roman" w:cs="Times New Roman" w:hint="eastAsia"/>
         </w:rPr>
-        <w:lastRenderedPageBreak/>
         <w:t>修复使用触发编辑器拖拽小点为步兵关联标签时，已关联标记没有依据步兵子单元格显示的</w:t>
       </w:r>
       <w:r>
@@ -2976,7 +3006,14 @@
         <w:rPr>
           <w:rFonts w:ascii="Times New Roman" w:eastAsia="宋体" w:hAnsi="Times New Roman" w:cs="Times New Roman" w:hint="eastAsia"/>
         </w:rPr>
-        <w:t>修复开启显示地图边界外游戏对象、使用绘制连接地形等时，鼠标无法移动到地图</w:t>
+        <w:t>修复开启显示地图边界外游戏对象、使用绘制连接地形等时，鼠标无法移动到</w:t>
+      </w:r>
+      <w:r>
+        <w:rPr>
+          <w:rFonts w:ascii="Times New Roman" w:eastAsia="宋体" w:hAnsi="Times New Roman" w:cs="Times New Roman" w:hint="eastAsia"/>
+        </w:rPr>
+        <w:lastRenderedPageBreak/>
+        <w:t>地图</w:t>
       </w:r>
       <w:r>
         <w:rPr>
@@ -3012,7 +3049,6 @@
         <w:rPr>
           <w:rFonts w:ascii="Times New Roman" w:eastAsia="宋体" w:hAnsi="Times New Roman" w:cs="Times New Roman" w:hint="eastAsia"/>
         </w:rPr>
-        <w:lastRenderedPageBreak/>
         <w:t>修复高</w:t>
       </w:r>
       <w:r>
@@ -4069,6 +4105,7 @@
         <w:rPr>
           <w:rFonts w:ascii="Times New Roman" w:eastAsia="宋体" w:hAnsi="Times New Roman" w:cs="Times New Roman" w:hint="eastAsia"/>
         </w:rPr>
+        <w:lastRenderedPageBreak/>
         <w:t>PlaceTileSkipHide</w:t>
       </w:r>
     </w:p>
@@ -4087,7 +4124,6 @@
         <w:rPr>
           <w:rFonts w:ascii="Times New Roman" w:eastAsia="宋体" w:hAnsi="Times New Roman" w:cs="Times New Roman" w:hint="eastAsia"/>
         </w:rPr>
-        <w:lastRenderedPageBreak/>
         <w:t>支持</w:t>
       </w:r>
       <w:r>
@@ -4951,6 +4987,7 @@
         <w:rPr>
           <w:rFonts w:ascii="Times New Roman" w:eastAsia="宋体" w:hAnsi="Times New Roman" w:cs="Times New Roman" w:hint="eastAsia"/>
         </w:rPr>
+        <w:lastRenderedPageBreak/>
         <w:t>优化单位渲染顺序，优化了较大单位被地形遮挡的问题</w:t>
       </w:r>
     </w:p>
@@ -4969,7 +5006,6 @@
         <w:rPr>
           <w:rFonts w:ascii="Times New Roman" w:eastAsia="宋体" w:hAnsi="Times New Roman" w:cs="Times New Roman" w:hint="eastAsia"/>
         </w:rPr>
-        <w:lastRenderedPageBreak/>
         <w:t>修复单位与建筑重叠时，单位</w:t>
       </w:r>
       <w:r>
@@ -5896,6 +5932,7 @@
         <w:rPr>
           <w:rFonts w:ascii="Times New Roman" w:eastAsia="宋体" w:hAnsi="Times New Roman" w:cs="Times New Roman" w:hint="eastAsia"/>
         </w:rPr>
+        <w:lastRenderedPageBreak/>
         <w:t>距离工具箱支持放置圆形</w:t>
       </w:r>
       <w:r>
@@ -5914,14 +5951,7 @@
         <w:rPr>
           <w:rFonts w:ascii="Times New Roman" w:eastAsia="宋体" w:hAnsi="Times New Roman" w:cs="Times New Roman" w:hint="eastAsia"/>
         </w:rPr>
-        <w:t>，支持撤</w:t>
-      </w:r>
-      <w:r>
-        <w:rPr>
-          <w:rFonts w:ascii="Times New Roman" w:eastAsia="宋体" w:hAnsi="Times New Roman" w:cs="Times New Roman" w:hint="eastAsia"/>
-        </w:rPr>
-        <w:lastRenderedPageBreak/>
-        <w:t>销重做</w:t>
+        <w:t>，支持撤销重做</w:t>
       </w:r>
     </w:p>
     <w:p>
@@ -6842,6 +6872,7 @@
         <w:rPr>
           <w:rFonts w:ascii="Times New Roman" w:eastAsia="宋体" w:hAnsi="Times New Roman" w:cs="Times New Roman" w:hint="eastAsia"/>
         </w:rPr>
+        <w:lastRenderedPageBreak/>
         <w:t>支持以数字显示不可见的桥梁覆盖物，详见</w:t>
       </w:r>
       <w:r>
@@ -6866,7 +6897,6 @@
         <w:rPr>
           <w:rFonts w:ascii="Times New Roman" w:eastAsia="宋体" w:hAnsi="Times New Roman" w:cs="Times New Roman" w:hint="eastAsia"/>
         </w:rPr>
-        <w:lastRenderedPageBreak/>
         <w:t>修复当建筑多个动画互相无限循环时导致崩溃的</w:t>
       </w:r>
       <w:r>
@@ -8023,6 +8053,7 @@
           <w:kern w:val="0"/>
           <w14:ligatures w14:val="none"/>
         </w:rPr>
+        <w:lastRenderedPageBreak/>
         <w:t>显著提升了加载物品浏览器图标的效率</w:t>
       </w:r>
     </w:p>
@@ -8045,7 +8076,6 @@
           <w:kern w:val="0"/>
           <w14:ligatures w14:val="none"/>
         </w:rPr>
-        <w:lastRenderedPageBreak/>
         <w:t>当放置覆盖物进行预览时，不会改变扫过区域的矿石价值</w:t>
       </w:r>
     </w:p>
@@ -50205,7 +50235,7 @@
         <v:path o:extrusionok="f" gradientshapeok="t" o:connecttype="rect"/>
         <o:lock v:ext="edit" aspectratio="t"/>
       </v:shapetype>
-      <v:shape id="_x0000_i1030" type="#_x0000_t75" style="width:11.55pt;height:11.55pt" o:bullet="t">
+      <v:shape id="_x0000_i1031" type="#_x0000_t75" style="width:11.55pt;height:11.55pt" o:bullet="t">
         <v:imagedata r:id="rId1" o:title="mso9A9A"/>
       </v:shape>
     </w:pict>

</xml_diff>